<commit_message>
Add deep learning with computer vision books
</commit_message>
<xml_diff>
--- a/SikoliaThesis.docx
+++ b/SikoliaThesis.docx
@@ -1,6 +1,6 @@
 
 <file path=word/document.xml><?xml version="1.0" encoding="utf-8"?>
-<w:document xmlns:o="urn:schemas-microsoft-com:office:office" xmlns:r="http://schemas.openxmlformats.org/officeDocument/2006/relationships" xmlns:v="urn:schemas-microsoft-com:vml" xmlns:w="http://schemas.openxmlformats.org/wordprocessingml/2006/main" xmlns:w10="urn:schemas-microsoft-com:office:word" xmlns:wp="http://schemas.openxmlformats.org/drawingml/2006/wordprocessingDrawing" xmlns:wps="http://schemas.microsoft.com/office/word/2010/wordprocessingShape" xmlns:wpg="http://schemas.microsoft.com/office/word/2010/wordprocessingGroup" xmlns:mc="http://schemas.openxmlformats.org/markup-compatibility/2006" xmlns:wp14="http://schemas.microsoft.com/office/word/2010/wordprocessingDrawing" xmlns:w14="http://schemas.microsoft.com/office/word/2010/wordml" mc:Ignorable="w14 wp14">
+<w:document xmlns:o="urn:schemas-microsoft-com:office:office" xmlns:r="http://schemas.openxmlformats.org/officeDocument/2006/relationships" xmlns:v="urn:schemas-microsoft-com:vml" xmlns:w="http://schemas.openxmlformats.org/wordprocessingml/2006/main" xmlns:w10="urn:schemas-microsoft-com:office:word" xmlns:wp="http://schemas.openxmlformats.org/drawingml/2006/wordprocessingDrawing" xmlns:wps="http://schemas.microsoft.com/office/word/2010/wordprocessingShape" xmlns:wpg="http://schemas.microsoft.com/office/word/2010/wordprocessingGroup" xmlns:mc="http://schemas.openxmlformats.org/markup-compatibility/2006" xmlns:wp14="http://schemas.microsoft.com/office/word/2010/wordprocessingDrawing" xmlns:w14="http://schemas.microsoft.com/office/word/2010/wordml" xmlns:w15="http://schemas.microsoft.com/office/word/2012/wordml" mc:Ignorable="w14 wp14 w15">
   <w:body>
     <w:p>
       <w:pPr>
@@ -2145,7 +2145,43 @@
           <w:szCs w:val="24"/>
         </w:rPr>
         <w:tab/>
-        <w:t>The big data era is fueled by gadgets that emit and store huge amounts of data. Examples of such gadgets include the smartphones, laptops, desktops, and IOT devices such as smart watches, and smart refrigerators. Owing to the recent increase in the amount of such data, people today store their extra data in the cloud and external hard drives but some of people still store their data in gadgets that produce that data.  Critical to the discussion is the fact that smartphones have limited spaces implying that smartphone users at times extend their storage to the cloud. Additionally, the huge amount of storage space in smartphones is consumed by images and videos. These images and videos are mostly from social media while some of them come from pictures and videos recorded from smartphones. In short, smartphones produce a considerable amount of data that should be harnessed.</w:t>
+        <w:t xml:space="preserve">The big data era is fueled by gadgets that emit and store huge amounts of data. Examples of such gadgets include the smartphones, laptops, desktops, and IOT devices such as smart watches, and smart refrigerators. Owing to the recent increase in the amount of such data, people today store their extra data in the cloud and external hard drives but some of people still store their data in gadgets that produce that data.  Critical to the discussion is the fact that smartphones have limited </w:t>
+      </w:r>
+      <w:r>
+        <w:rPr>
+          <w:b w:val="false"/>
+          <w:bCs w:val="false"/>
+          <w:sz w:val="24"/>
+          <w:szCs w:val="24"/>
+        </w:rPr>
+        <w:t xml:space="preserve">storage </w:t>
+      </w:r>
+      <w:r>
+        <w:rPr>
+          <w:b w:val="false"/>
+          <w:bCs w:val="false"/>
+          <w:sz w:val="24"/>
+          <w:szCs w:val="24"/>
+        </w:rPr>
+        <w:t xml:space="preserve">spaces implying that smartphone users at times extend their storage to the cloud. Additionally, the huge amount of storage space in smartphones is consumed by images and videos. These images and videos are mostly from social media while some of them come from pictures and videos recorded from smartphones. In short, smartphones produce a considerable amount of data that should be harnessed </w:t>
+      </w:r>
+      <w:r>
+        <w:rPr>
+          <w:b w:val="false"/>
+          <w:bCs w:val="false"/>
+          <w:sz w:val="24"/>
+          <w:szCs w:val="24"/>
+        </w:rPr>
+        <w:t>to make the world a better place</w:t>
+      </w:r>
+      <w:r>
+        <w:rPr>
+          <w:b w:val="false"/>
+          <w:bCs w:val="false"/>
+          <w:sz w:val="24"/>
+          <w:szCs w:val="24"/>
+        </w:rPr>
+        <w:t>.</w:t>
       </w:r>
     </w:p>
     <w:p>
@@ -2218,7 +2254,25 @@
           <w:szCs w:val="24"/>
         </w:rPr>
         <w:tab/>
-        <w:t xml:space="preserve">Indeed, huge technology companies such as Google and Apple have developed world class applications that have enabled them to enjoy a competitive advantage over other companies.  These data science applications (from Google and Apple) have been made possible by techniques such as support vector machines, random forests, decision trees, and neural networks. The term neural network refers to a connection of layers comprising of units called perceptrons, which is made up of an input layer (the predictor variables), a processing unit, and an output layer. The processing unit could comprise of one or more hidden layers. That said, deep learning occurs when a neural network is created with more than one hidden layer. Having defined deep learning, it is imperative to highlight that decision trees and support vector machines were more famous than neural networks. However, the neural networks were brought to fame when Geoffrey Hinton et al (2006) developed a neural network that predicted hand written digits with an accuracy of 98%. </w:t>
+        <w:t xml:space="preserve">Indeed, huge technology companies such as Google and Apple have developed world class applications that have enabled them to enjoy a competitive advantage over other companies.  These data science applications (from Google and Apple) have been made possible by techniques such as support vector machines, random forests, decision trees, and neural networks. The term neural network refers to a connection of layers comprising of units called perceptrons, which is made up of an input layer (the predictor variables), a processing unit, and an output layer </w:t>
+      </w:r>
+      <w:r>
+        <w:rPr>
+          <w:b w:val="false"/>
+          <w:bCs w:val="false"/>
+          <w:sz w:val="24"/>
+          <w:szCs w:val="24"/>
+        </w:rPr>
+        <w:t>(the response variable)</w:t>
+      </w:r>
+      <w:r>
+        <w:rPr>
+          <w:b w:val="false"/>
+          <w:bCs w:val="false"/>
+          <w:sz w:val="24"/>
+          <w:szCs w:val="24"/>
+        </w:rPr>
+        <w:t xml:space="preserve">. The processing unit could comprise of one or more hidden layers. That said, deep learning occurs when a neural network is created with more than one hidden layer. Having defined deep learning, it is imperative to highlight that decision trees and support vector machines were more famous than neural networks. However, the neural networks were brought to fame when Geoffrey Hinton et al (2006) developed a neural network that predicted hand written digits with an accuracy of 98%. </w:t>
       </w:r>
     </w:p>
     <w:p>
@@ -2244,33 +2298,6 @@
         </w:rPr>
         <w:tab/>
         <w:t>Another field that emerged from deep learning is facial recognition.  Lately, the field of facial recognition has attracted a lot of attention from scholars and practitioners.  Some of the innovations that have emerged out of facial recognition include development of home authentication systems, attendance management systems, security surveillance systems, and emotion recognition systems. Critical to the debate is the fact that different solutions of creating facial recognition systems have been proposed. This owes to the fact that Fu (2021) mentions the facial recognitions using geometric features, facial recognition based on a template, and model based facial recognition as some of the solutions that are used to create facial recognition systems. Additionally, Ranjan et al., (2020) mentions that the traditional model based facial recognition system relies on one hundred and twenty eight predictor variables. In summary, facial recognition is a new field that emerged out of deep learning and should be researched further.</w:t>
-      </w:r>
-    </w:p>
-    <w:p>
-      <w:pPr>
-        <w:pStyle w:val="Normal"/>
-        <w:bidi w:val="0"/>
-        <w:spacing w:lineRule="auto" w:line="480"/>
-        <w:jc w:val="left"/>
-        <w:rPr>
-          <w:rFonts w:ascii="Liberation Serif" w:hAnsi="Liberation Serif"/>
-          <w:b w:val="false"/>
-          <w:b w:val="false"/>
-          <w:bCs w:val="false"/>
-          <w:sz w:val="24"/>
-          <w:szCs w:val="24"/>
-        </w:rPr>
-      </w:pPr>
-      <w:r>
-        <w:rPr>
-          <w:b w:val="false"/>
-          <w:bCs w:val="false"/>
-          <w:sz w:val="24"/>
-          <w:szCs w:val="24"/>
-        </w:rPr>
-      </w:r>
-      <w:r>
-        <w:br w:type="page"/>
       </w:r>
     </w:p>
     <w:p>
@@ -2878,9 +2905,104 @@
         <w:spacing w:lineRule="auto" w:line="480"/>
         <w:jc w:val="left"/>
         <w:rPr>
-          <w:b/>
-          <w:b/>
-          <w:bCs/>
+          <w:sz w:val="32"/>
+          <w:szCs w:val="32"/>
+        </w:rPr>
+      </w:pPr>
+      <w:r>
+        <w:rPr>
+          <w:b/>
+          <w:bCs/>
+          <w:sz w:val="32"/>
+          <w:szCs w:val="32"/>
+        </w:rPr>
+        <w:t>2.</w:t>
+      </w:r>
+      <w:r>
+        <w:rPr>
+          <w:b/>
+          <w:bCs/>
+          <w:sz w:val="32"/>
+          <w:szCs w:val="32"/>
+        </w:rPr>
+        <w:t>3</w:t>
+      </w:r>
+      <w:r>
+        <w:rPr>
+          <w:b/>
+          <w:bCs/>
+          <w:sz w:val="32"/>
+          <w:szCs w:val="32"/>
+        </w:rPr>
+        <w:t xml:space="preserve"> Face Detection</w:t>
+      </w:r>
+    </w:p>
+    <w:p>
+      <w:pPr>
+        <w:pStyle w:val="Normal"/>
+        <w:bidi w:val="0"/>
+        <w:spacing w:lineRule="auto" w:line="480"/>
+        <w:jc w:val="left"/>
+        <w:rPr/>
+      </w:pPr>
+      <w:r>
+        <w:rPr>
+          <w:b w:val="false"/>
+          <w:bCs w:val="false"/>
+          <w:sz w:val="24"/>
+          <w:szCs w:val="24"/>
+        </w:rPr>
+        <w:tab/>
+        <w:t>Given an arbitrary image, the objective of facial detection is to establish whether or not there are any faces in the image and if present, return the image location and extent of each face (</w:t>
+      </w:r>
+      <w:r>
+        <w:rPr>
+          <w:b w:val="false"/>
+          <w:bCs w:val="false"/>
+          <w:i w:val="false"/>
+          <w:iCs w:val="false"/>
+          <w:sz w:val="24"/>
+          <w:szCs w:val="24"/>
+        </w:rPr>
+        <w:t>Yang, Kriegman and Ahuja, 2002</w:t>
+      </w:r>
+      <w:r>
+        <w:rPr>
+          <w:b w:val="false"/>
+          <w:bCs w:val="false"/>
+          <w:sz w:val="24"/>
+          <w:szCs w:val="24"/>
+        </w:rPr>
+        <w:t xml:space="preserve">). It is important to highlight that there are several methods that could be used for detecting faces from images. These methods include knowledge based methods, feature invariant approaches, template matching methods, and appearance based methods. Indeed the mentioned methods are important when detecting faces from images, but all these methods are accompanied by several challenges. This owes to the reality that </w:t>
+      </w:r>
+      <w:r>
+        <w:rPr>
+          <w:b w:val="false"/>
+          <w:bCs w:val="false"/>
+          <w:i w:val="false"/>
+          <w:iCs w:val="false"/>
+          <w:sz w:val="24"/>
+          <w:szCs w:val="24"/>
+        </w:rPr>
+        <w:t>Yang, Kriegman and Ahuja (2002</w:t>
+      </w:r>
+      <w:r>
+        <w:rPr>
+          <w:b w:val="false"/>
+          <w:bCs w:val="false"/>
+          <w:sz w:val="24"/>
+          <w:szCs w:val="24"/>
+        </w:rPr>
+        <w:t>) list the following five challenges that are associated with facial detection:- pose, occlusion, aging face expression, imaging conditions and image orientation. Moreover, face expression is not only a challenge in face detection but also in face recognition. It follows that researchers on facial recognition should identify methods of tackling the mentioned challenges associated with face detection.</w:t>
+      </w:r>
+    </w:p>
+    <w:p>
+      <w:pPr>
+        <w:pStyle w:val="Normal"/>
+        <w:bidi w:val="0"/>
+        <w:spacing w:lineRule="auto" w:line="480"/>
+        <w:jc w:val="left"/>
+        <w:rPr>
           <w:sz w:val="28"/>
           <w:szCs w:val="28"/>
         </w:rPr>
@@ -2892,532 +3014,17 @@
           <w:sz w:val="28"/>
           <w:szCs w:val="28"/>
         </w:rPr>
-        <w:t>2.2.1 Face Detection</w:t>
-      </w:r>
-    </w:p>
-    <w:p>
-      <w:pPr>
-        <w:pStyle w:val="Normal"/>
-        <w:bidi w:val="0"/>
-        <w:spacing w:lineRule="auto" w:line="480"/>
-        <w:jc w:val="left"/>
-        <w:rPr/>
-      </w:pPr>
-      <w:r>
-        <w:rPr>
-          <w:b w:val="false"/>
-          <w:bCs w:val="false"/>
-          <w:sz w:val="24"/>
-          <w:szCs w:val="24"/>
-        </w:rPr>
-        <w:tab/>
-        <w:t>Given an arbitrary image, the objective of facial detection is to establish whether or not there are any faces in the image and if present, return the image location and extent of each face (</w:t>
-      </w:r>
-      <w:r>
-        <w:rPr>
-          <w:b w:val="false"/>
-          <w:bCs w:val="false"/>
-          <w:i w:val="false"/>
-          <w:iCs w:val="false"/>
-          <w:sz w:val="24"/>
-          <w:szCs w:val="24"/>
-        </w:rPr>
-        <w:t>Yang, Kriegman and Ahuja, 2002</w:t>
-      </w:r>
-      <w:r>
-        <w:rPr>
-          <w:b w:val="false"/>
-          <w:bCs w:val="false"/>
-          <w:sz w:val="24"/>
-          <w:szCs w:val="24"/>
-        </w:rPr>
-        <w:t xml:space="preserve">). It is important to highlight that there are several methods that could be used for detecting faces from images. These methods include knowledge based methods, feature invariant approaches, template matching methods, and appearance based methods. Indeed the mentioned methods are important when detecting faces from images, but all these methods are accompanied by several challenges. This owes to the reality that </w:t>
-      </w:r>
-      <w:r>
-        <w:rPr>
-          <w:b w:val="false"/>
-          <w:bCs w:val="false"/>
-          <w:i w:val="false"/>
-          <w:iCs w:val="false"/>
-          <w:sz w:val="24"/>
-          <w:szCs w:val="24"/>
-        </w:rPr>
-        <w:t>Yang, Kriegman and Ahuja (2002</w:t>
-      </w:r>
-      <w:r>
-        <w:rPr>
-          <w:b w:val="false"/>
-          <w:bCs w:val="false"/>
-          <w:sz w:val="24"/>
-          <w:szCs w:val="24"/>
-        </w:rPr>
-        <w:t xml:space="preserve">) list the following </w:t>
-      </w:r>
-      <w:r>
-        <w:rPr>
-          <w:b w:val="false"/>
-          <w:bCs w:val="false"/>
-          <w:sz w:val="24"/>
-          <w:szCs w:val="24"/>
-        </w:rPr>
-        <w:t>five</w:t>
-      </w:r>
-      <w:r>
-        <w:rPr>
-          <w:b w:val="false"/>
-          <w:bCs w:val="false"/>
-          <w:sz w:val="24"/>
-          <w:szCs w:val="24"/>
-        </w:rPr>
-        <w:t xml:space="preserve"> challenges that are associated with facial detection:- pose, occlusion, </w:t>
-      </w:r>
-      <w:r>
-        <w:rPr>
-          <w:b w:val="false"/>
-          <w:bCs w:val="false"/>
-          <w:sz w:val="24"/>
-          <w:szCs w:val="24"/>
-        </w:rPr>
-        <w:t xml:space="preserve">aging </w:t>
-      </w:r>
-      <w:r>
-        <w:rPr>
-          <w:b w:val="false"/>
-          <w:bCs w:val="false"/>
-          <w:sz w:val="24"/>
-          <w:szCs w:val="24"/>
-        </w:rPr>
-        <w:t>face expression, imaging conditions and image orientation. Moreover, face expression is not only a challenge in face detection but also in face recognition. It follows that researchers on facial recognition should identify methods of tackling the mentioned challenges associated with face detection.</w:t>
-      </w:r>
-    </w:p>
-    <w:p>
-      <w:pPr>
-        <w:pStyle w:val="Normal"/>
-        <w:bidi w:val="0"/>
-        <w:spacing w:lineRule="auto" w:line="480"/>
-        <w:jc w:val="left"/>
-        <w:rPr/>
-      </w:pPr>
-      <w:r>
-        <w:rPr>
-          <w:b/>
-          <w:bCs/>
-          <w:sz w:val="24"/>
-          <w:szCs w:val="24"/>
-        </w:rPr>
-        <w:t>2.2.1.1 Challenges in Face Detection</w:t>
-      </w:r>
-    </w:p>
-    <w:p>
-      <w:pPr>
-        <w:pStyle w:val="Normal"/>
-        <w:bidi w:val="0"/>
-        <w:spacing w:lineRule="auto" w:line="480"/>
-        <w:jc w:val="left"/>
-        <w:rPr>
-          <w:b/>
-          <w:b/>
-          <w:bCs/>
-          <w:sz w:val="24"/>
-          <w:szCs w:val="24"/>
-        </w:rPr>
-      </w:pPr>
-      <w:r>
-        <w:rPr>
-          <w:b/>
-          <w:bCs/>
-          <w:sz w:val="24"/>
-          <w:szCs w:val="24"/>
-        </w:rPr>
-        <w:t xml:space="preserve">Pose: </w:t>
-      </w:r>
-      <w:r>
-        <w:rPr>
-          <w:b w:val="false"/>
-          <w:bCs w:val="false"/>
-          <w:sz w:val="24"/>
-          <w:szCs w:val="24"/>
-        </w:rPr>
-        <w:t>A review of images databases will indicate that people like taking images in different posters. It follows that an image is likely to have a face that is twisted to the right, left, or even upside down. Moreover, some features such as the nose, eye, or ears maybe wholly or partially occluded which is an additional challenge in facial recognition.</w:t>
-      </w:r>
-      <w:r>
-        <w:rPr>
-          <w:b/>
-          <w:bCs/>
-          <w:sz w:val="24"/>
-          <w:szCs w:val="24"/>
-        </w:rPr>
-        <w:t xml:space="preserve"> </w:t>
-      </w:r>
-      <w:r>
-        <w:rPr>
-          <w:b w:val="false"/>
-          <w:bCs w:val="false"/>
-          <w:sz w:val="24"/>
-          <w:szCs w:val="24"/>
-        </w:rPr>
-        <w:t>This problem is always solved b y rotating images back to an upright position.</w:t>
-      </w:r>
-    </w:p>
-    <w:p>
-      <w:pPr>
-        <w:pStyle w:val="Normal"/>
-        <w:bidi w:val="0"/>
-        <w:spacing w:lineRule="auto" w:line="480"/>
-        <w:jc w:val="left"/>
-        <w:rPr>
-          <w:b/>
-          <w:b/>
-          <w:bCs/>
-          <w:sz w:val="24"/>
-          <w:szCs w:val="24"/>
-        </w:rPr>
-      </w:pPr>
-      <w:r>
-        <w:rPr>
-          <w:b/>
-          <w:bCs/>
-          <w:sz w:val="24"/>
-          <w:szCs w:val="24"/>
-        </w:rPr>
-        <w:t xml:space="preserve">Occlusion: </w:t>
-      </w:r>
-      <w:r>
-        <w:rPr>
-          <w:b w:val="false"/>
-          <w:bCs w:val="false"/>
-          <w:sz w:val="24"/>
-          <w:szCs w:val="24"/>
-        </w:rPr>
-        <w:t xml:space="preserve">Human beings often have features that could affect image detection. For instance, men are known to have beards, which may or may not exist in images. It also important to highlight that people at times wear spectacles, which also affects face detection. Moreover, Covid 19 forced people to wear masks, which presents a unique challenge in facial recognition. </w:t>
-      </w:r>
-    </w:p>
-    <w:p>
-      <w:pPr>
-        <w:pStyle w:val="Normal"/>
-        <w:bidi w:val="0"/>
-        <w:spacing w:lineRule="auto" w:line="480"/>
-        <w:jc w:val="left"/>
-        <w:rPr>
-          <w:b/>
-          <w:b/>
-          <w:bCs/>
-          <w:sz w:val="24"/>
-          <w:szCs w:val="24"/>
-        </w:rPr>
-      </w:pPr>
-      <w:r>
-        <w:rPr>
-          <w:b/>
-          <w:bCs/>
-          <w:sz w:val="24"/>
-          <w:szCs w:val="24"/>
-        </w:rPr>
-        <w:t>Aging</w:t>
-      </w:r>
-      <w:r>
-        <w:rPr>
-          <w:b w:val="false"/>
-          <w:bCs w:val="false"/>
-          <w:sz w:val="24"/>
-          <w:szCs w:val="24"/>
-        </w:rPr>
-        <w:t xml:space="preserve">: </w:t>
-      </w:r>
-      <w:r>
-        <w:rPr>
-          <w:b w:val="false"/>
-          <w:bCs w:val="false"/>
-          <w:sz w:val="24"/>
-          <w:szCs w:val="24"/>
-        </w:rPr>
-        <w:t xml:space="preserve">Human faces are known to change with age progression which presents a challenge in facial recognition. This implies that there would be significant difference in images if the time difference between the images is large. It is notable that aging will not be a challenge </w:t>
-      </w:r>
-      <w:r>
-        <w:rPr>
-          <w:b w:val="false"/>
-          <w:bCs w:val="false"/>
-          <w:sz w:val="24"/>
-          <w:szCs w:val="24"/>
-        </w:rPr>
-        <w:t>to this paper because people tend to change their smartphones for few years. It is notable however that Singh and Prasad (2018) propose the use of coupled auto-encoder networks and non-linear analysis as a solution to the aging problem in facial recognition.</w:t>
-      </w:r>
-    </w:p>
-    <w:p>
-      <w:pPr>
-        <w:pStyle w:val="Normal"/>
-        <w:bidi w:val="0"/>
-        <w:spacing w:lineRule="auto" w:line="480"/>
-        <w:jc w:val="left"/>
-        <w:rPr>
-          <w:b/>
-          <w:b/>
-          <w:bCs/>
-          <w:sz w:val="24"/>
-          <w:szCs w:val="24"/>
-        </w:rPr>
-      </w:pPr>
-      <w:r>
-        <w:rPr>
-          <w:b/>
-          <w:bCs/>
-          <w:sz w:val="24"/>
-          <w:szCs w:val="24"/>
-        </w:rPr>
-        <w:t>F</w:t>
-      </w:r>
-      <w:r>
-        <w:rPr>
-          <w:b/>
-          <w:bCs/>
-          <w:sz w:val="24"/>
-          <w:szCs w:val="24"/>
-        </w:rPr>
-        <w:t>acial expressions</w:t>
-      </w:r>
-      <w:r>
-        <w:rPr>
-          <w:b w:val="false"/>
-          <w:bCs w:val="false"/>
-          <w:sz w:val="24"/>
-          <w:szCs w:val="24"/>
-        </w:rPr>
-        <w:t xml:space="preserve">: Images of human faces could also be affected by their emotions because people to change their faces based o emotions they are experiencing. Critical to the discussion is the reality that </w:t>
-      </w:r>
-      <w:r>
-        <w:rPr>
-          <w:b w:val="false"/>
-          <w:bCs w:val="false"/>
-          <w:sz w:val="24"/>
-          <w:szCs w:val="24"/>
-        </w:rPr>
-        <w:t xml:space="preserve">Singh and Prasad (2018) </w:t>
-      </w:r>
-      <w:r>
-        <w:rPr>
-          <w:b w:val="false"/>
-          <w:bCs w:val="false"/>
-          <w:sz w:val="24"/>
-          <w:szCs w:val="24"/>
-        </w:rPr>
-        <w:t>cite an expression invariant 3D face recognition as a solution to the problems of facial expressions in image recognition.</w:t>
-      </w:r>
-    </w:p>
-    <w:p>
-      <w:pPr>
-        <w:pStyle w:val="Normal"/>
-        <w:bidi w:val="0"/>
-        <w:spacing w:lineRule="auto" w:line="480"/>
-        <w:jc w:val="left"/>
-        <w:rPr>
-          <w:b/>
-          <w:b/>
-          <w:bCs/>
-          <w:sz w:val="24"/>
-          <w:szCs w:val="24"/>
-        </w:rPr>
-      </w:pPr>
-      <w:r>
-        <w:rPr>
-          <w:b/>
-          <w:bCs/>
-          <w:sz w:val="24"/>
-          <w:szCs w:val="24"/>
-        </w:rPr>
-        <w:t>I</w:t>
-      </w:r>
-      <w:r>
-        <w:rPr>
-          <w:b/>
-          <w:bCs/>
-          <w:sz w:val="24"/>
-          <w:szCs w:val="24"/>
-        </w:rPr>
-        <w:t xml:space="preserve">maging conditions and image orientation: </w:t>
-      </w:r>
-      <w:r>
-        <w:rPr>
-          <w:b w:val="false"/>
-          <w:bCs w:val="false"/>
-          <w:sz w:val="24"/>
-          <w:szCs w:val="24"/>
-        </w:rPr>
-        <w:t xml:space="preserve">A huge chunk of solutions in computer vision make the assumption that there is a single illuminant lighting in an image. Regardless, that is not always the case. As evidenced, </w:t>
-      </w:r>
-      <w:r>
-        <w:rPr>
-          <w:b w:val="false"/>
-          <w:bCs w:val="false"/>
-          <w:sz w:val="24"/>
-          <w:szCs w:val="24"/>
-        </w:rPr>
-        <w:t>Finlayson and Fredembach (2007) reveal that images always contain shadows depending on the positions from different lights that affect an image. Important to the debate is the truth that Finlayson (2018) proposes a solution to the problems arising from illumination in computer vision.</w:t>
-      </w:r>
-    </w:p>
-    <w:p>
-      <w:pPr>
-        <w:pStyle w:val="Normal"/>
-        <w:bidi w:val="0"/>
-        <w:spacing w:lineRule="auto" w:line="480"/>
-        <w:jc w:val="left"/>
-        <w:rPr>
-          <w:b w:val="false"/>
-          <w:b w:val="false"/>
-          <w:bCs w:val="false"/>
-          <w:sz w:val="24"/>
-          <w:szCs w:val="24"/>
-        </w:rPr>
-      </w:pPr>
-      <w:r>
-        <w:rPr>
-          <w:b w:val="false"/>
-          <w:bCs w:val="false"/>
-          <w:sz w:val="24"/>
-          <w:szCs w:val="24"/>
-        </w:rPr>
-      </w:r>
-    </w:p>
-    <w:p>
-      <w:pPr>
-        <w:pStyle w:val="Normal"/>
-        <w:bidi w:val="0"/>
-        <w:spacing w:lineRule="auto" w:line="480"/>
-        <w:jc w:val="left"/>
-        <w:rPr>
-          <w:b/>
-          <w:b/>
-          <w:bCs/>
-          <w:sz w:val="24"/>
-          <w:szCs w:val="24"/>
-        </w:rPr>
-      </w:pPr>
-      <w:r>
-        <w:rPr>
-          <w:b/>
-          <w:bCs/>
-          <w:sz w:val="24"/>
-          <w:szCs w:val="24"/>
-        </w:rPr>
-      </w:r>
-    </w:p>
-    <w:p>
-      <w:pPr>
-        <w:pStyle w:val="Normal"/>
-        <w:bidi w:val="0"/>
-        <w:spacing w:lineRule="auto" w:line="480"/>
-        <w:jc w:val="left"/>
-        <w:rPr>
-          <w:b w:val="false"/>
-          <w:b w:val="false"/>
-          <w:bCs w:val="false"/>
-          <w:sz w:val="24"/>
-          <w:szCs w:val="24"/>
-        </w:rPr>
-      </w:pPr>
-      <w:r>
-        <w:rPr>
-          <w:b w:val="false"/>
-          <w:bCs w:val="false"/>
-          <w:sz w:val="24"/>
-          <w:szCs w:val="24"/>
-        </w:rPr>
-        <w:tab/>
-      </w:r>
-    </w:p>
-    <w:p>
-      <w:pPr>
-        <w:pStyle w:val="Normal"/>
-        <w:bidi w:val="0"/>
-        <w:spacing w:lineRule="auto" w:line="480"/>
-        <w:jc w:val="left"/>
-        <w:rPr>
-          <w:rFonts w:ascii="Liberation Serif" w:hAnsi="Liberation Serif"/>
-          <w:b w:val="false"/>
-          <w:b w:val="false"/>
-          <w:bCs w:val="false"/>
-          <w:sz w:val="24"/>
-          <w:szCs w:val="24"/>
-        </w:rPr>
-      </w:pPr>
-      <w:r>
-        <w:rPr>
-          <w:b w:val="false"/>
-          <w:bCs w:val="false"/>
-          <w:sz w:val="24"/>
-          <w:szCs w:val="24"/>
-        </w:rPr>
-      </w:r>
-    </w:p>
-    <w:p>
-      <w:pPr>
-        <w:pStyle w:val="Normal"/>
-        <w:bidi w:val="0"/>
-        <w:spacing w:lineRule="auto" w:line="480"/>
-        <w:jc w:val="left"/>
-        <w:rPr>
-          <w:sz w:val="24"/>
-        </w:rPr>
-      </w:pPr>
-      <w:r>
-        <w:rPr>
-          <w:sz w:val="24"/>
-        </w:rPr>
-      </w:r>
-    </w:p>
-    <w:p>
-      <w:pPr>
-        <w:pStyle w:val="Normal"/>
-        <w:bidi w:val="0"/>
-        <w:spacing w:lineRule="auto" w:line="480"/>
-        <w:jc w:val="left"/>
-        <w:rPr>
-          <w:sz w:val="24"/>
-        </w:rPr>
-      </w:pPr>
-      <w:r>
-        <w:rPr>
-          <w:sz w:val="24"/>
-        </w:rPr>
-      </w:r>
-    </w:p>
-    <w:p>
-      <w:pPr>
-        <w:pStyle w:val="Normal"/>
-        <w:bidi w:val="0"/>
-        <w:spacing w:lineRule="auto" w:line="480"/>
-        <w:jc w:val="left"/>
-        <w:rPr>
-          <w:b w:val="false"/>
-          <w:b w:val="false"/>
-          <w:bCs w:val="false"/>
-          <w:sz w:val="24"/>
-          <w:szCs w:val="24"/>
-        </w:rPr>
-      </w:pPr>
-      <w:r>
-        <w:rPr>
-          <w:b w:val="false"/>
-          <w:bCs w:val="false"/>
-          <w:sz w:val="24"/>
-          <w:szCs w:val="24"/>
-        </w:rPr>
-        <w:t>It is important to note that while Fu (2021) posits that there are three methods used for facial detection Priya et al., (2014) discuss four methods of facial recognition. These methods include the geometric feature approach, the holistic approach, the model based approach, and the template based approach.</w:t>
-      </w:r>
-    </w:p>
-    <w:p>
-      <w:pPr>
-        <w:pStyle w:val="Normal"/>
-        <w:bidi w:val="0"/>
-        <w:spacing w:lineRule="auto" w:line="480"/>
-        <w:jc w:val="left"/>
-        <w:rPr>
-          <w:b/>
+        <w:t>2.</w:t>
+      </w:r>
+      <w:r>
+        <w:rPr>
           <w:b/>
           <w:bCs/>
           <w:sz w:val="28"/>
           <w:szCs w:val="28"/>
         </w:rPr>
-      </w:pPr>
+        <w:t xml:space="preserve">3.1 </w:t>
+      </w:r>
       <w:r>
         <w:rPr>
           <w:b/>
@@ -3425,7 +3032,428 @@
           <w:sz w:val="28"/>
           <w:szCs w:val="28"/>
         </w:rPr>
-        <w:t>2.2.1 Geometric Approach</w:t>
+        <w:t>Challenges in Face Detection</w:t>
+      </w:r>
+    </w:p>
+    <w:p>
+      <w:pPr>
+        <w:pStyle w:val="Normal"/>
+        <w:bidi w:val="0"/>
+        <w:spacing w:lineRule="auto" w:line="480"/>
+        <w:jc w:val="left"/>
+        <w:rPr/>
+      </w:pPr>
+      <w:r>
+        <w:rPr>
+          <w:b/>
+          <w:bCs/>
+          <w:sz w:val="24"/>
+          <w:szCs w:val="24"/>
+        </w:rPr>
+        <w:t xml:space="preserve">Pose: </w:t>
+      </w:r>
+      <w:r>
+        <w:rPr>
+          <w:b w:val="false"/>
+          <w:bCs w:val="false"/>
+          <w:sz w:val="24"/>
+          <w:szCs w:val="24"/>
+        </w:rPr>
+        <w:t>A review of images databases will indicate that people like taking images in different posters. It follows that an image is likely to have a face that is twisted to the right, left, or even upside down. Moreover, some features such as the nose, eye, or ears maybe wholly or partially occluded which is an additional challenge in facial recognition.</w:t>
+      </w:r>
+      <w:r>
+        <w:rPr>
+          <w:b/>
+          <w:bCs/>
+          <w:sz w:val="24"/>
+          <w:szCs w:val="24"/>
+        </w:rPr>
+        <w:t xml:space="preserve"> </w:t>
+      </w:r>
+      <w:r>
+        <w:rPr>
+          <w:b w:val="false"/>
+          <w:bCs w:val="false"/>
+          <w:sz w:val="24"/>
+          <w:szCs w:val="24"/>
+        </w:rPr>
+        <w:t>This problem is always solved b y rotating images back to an upright position.</w:t>
+      </w:r>
+    </w:p>
+    <w:p>
+      <w:pPr>
+        <w:pStyle w:val="Normal"/>
+        <w:bidi w:val="0"/>
+        <w:spacing w:lineRule="auto" w:line="480"/>
+        <w:jc w:val="left"/>
+        <w:rPr/>
+      </w:pPr>
+      <w:r>
+        <w:rPr>
+          <w:b/>
+          <w:bCs/>
+          <w:sz w:val="24"/>
+          <w:szCs w:val="24"/>
+        </w:rPr>
+        <w:t xml:space="preserve">Occlusion: </w:t>
+      </w:r>
+      <w:r>
+        <w:rPr>
+          <w:b w:val="false"/>
+          <w:bCs w:val="false"/>
+          <w:sz w:val="24"/>
+          <w:szCs w:val="24"/>
+        </w:rPr>
+        <w:t xml:space="preserve">Human beings often have features that could affect image detection. For instance, men are known to have beards, which may or may not exist in images. It also important to highlight that people at times wear spectacles, which also affects face detection. Moreover, Covid 19 forced people to wear masks, which presents a unique challenge in facial recognition. </w:t>
+      </w:r>
+    </w:p>
+    <w:p>
+      <w:pPr>
+        <w:pStyle w:val="Normal"/>
+        <w:bidi w:val="0"/>
+        <w:spacing w:lineRule="auto" w:line="480"/>
+        <w:jc w:val="left"/>
+        <w:rPr/>
+      </w:pPr>
+      <w:r>
+        <w:rPr>
+          <w:b/>
+          <w:bCs/>
+          <w:sz w:val="24"/>
+          <w:szCs w:val="24"/>
+        </w:rPr>
+        <w:t>Aging</w:t>
+      </w:r>
+      <w:r>
+        <w:rPr>
+          <w:b w:val="false"/>
+          <w:bCs w:val="false"/>
+          <w:sz w:val="24"/>
+          <w:szCs w:val="24"/>
+        </w:rPr>
+        <w:t>: Human faces are known to change with age progression which presents a challenge in facial recognition. This implies that there would be significant difference in images if the time difference between the images is large. It is notable that aging will not be a challenge to this paper because people tend to change their smartphones for few years. It is notable however that Singh and Prasad (2018) propose the use of coupled auto-encoder networks and non-linear analysis as a solution to the aging problem in facial recognition.</w:t>
+      </w:r>
+    </w:p>
+    <w:p>
+      <w:pPr>
+        <w:pStyle w:val="Normal"/>
+        <w:bidi w:val="0"/>
+        <w:spacing w:lineRule="auto" w:line="480"/>
+        <w:jc w:val="left"/>
+        <w:rPr/>
+      </w:pPr>
+      <w:r>
+        <w:rPr>
+          <w:b/>
+          <w:bCs/>
+          <w:sz w:val="24"/>
+          <w:szCs w:val="24"/>
+        </w:rPr>
+        <w:t>Facial expressions</w:t>
+      </w:r>
+      <w:r>
+        <w:rPr>
+          <w:b w:val="false"/>
+          <w:bCs w:val="false"/>
+          <w:sz w:val="24"/>
+          <w:szCs w:val="24"/>
+        </w:rPr>
+        <w:t>: Images of human faces could also be affected by their emotions because people to change their faces based o emotions they are experiencing. Critical to the discussion is the reality that Singh and Prasad (2018) cite an expression invariant 3D face recognition as a solution to the problems of facial expressions in image recognition.</w:t>
+      </w:r>
+    </w:p>
+    <w:p>
+      <w:pPr>
+        <w:pStyle w:val="Normal"/>
+        <w:bidi w:val="0"/>
+        <w:spacing w:lineRule="auto" w:line="480"/>
+        <w:jc w:val="left"/>
+        <w:rPr/>
+      </w:pPr>
+      <w:r>
+        <w:rPr>
+          <w:b/>
+          <w:bCs/>
+          <w:sz w:val="24"/>
+          <w:szCs w:val="24"/>
+        </w:rPr>
+        <w:t xml:space="preserve">Imaging conditions and image orientation: </w:t>
+      </w:r>
+      <w:r>
+        <w:rPr>
+          <w:b w:val="false"/>
+          <w:bCs w:val="false"/>
+          <w:sz w:val="24"/>
+          <w:szCs w:val="24"/>
+        </w:rPr>
+        <w:t>A huge chunk of solutions in computer vision make the assumption that there is a single illuminant lighting in an image. Regardless, that is not always the case. As evidenced, Finlayson and Fredembach (2007) reveal that images always contain shadows depending on the positions from different lights that affect an image. Important to the debate is the truth that Finlayson (2018) proposes a solution to the problems arising from illumination in computer vision.</w:t>
+      </w:r>
+    </w:p>
+    <w:p>
+      <w:pPr>
+        <w:pStyle w:val="Normal"/>
+        <w:bidi w:val="0"/>
+        <w:spacing w:lineRule="auto" w:line="480"/>
+        <w:jc w:val="left"/>
+        <w:rPr>
+          <w:b w:val="false"/>
+          <w:b w:val="false"/>
+          <w:bCs w:val="false"/>
+          <w:sz w:val="24"/>
+          <w:szCs w:val="24"/>
+        </w:rPr>
+      </w:pPr>
+      <w:r>
+        <w:rPr>
+          <w:b/>
+          <w:bCs/>
+          <w:sz w:val="32"/>
+          <w:szCs w:val="32"/>
+        </w:rPr>
+        <w:t>2.</w:t>
+      </w:r>
+      <w:r>
+        <w:rPr>
+          <w:b/>
+          <w:bCs/>
+          <w:sz w:val="32"/>
+          <w:szCs w:val="32"/>
+        </w:rPr>
+        <w:t>4</w:t>
+      </w:r>
+      <w:r>
+        <w:rPr>
+          <w:b/>
+          <w:bCs/>
+          <w:sz w:val="32"/>
+          <w:szCs w:val="32"/>
+        </w:rPr>
+        <w:t xml:space="preserve"> </w:t>
+      </w:r>
+      <w:r>
+        <w:rPr>
+          <w:b/>
+          <w:bCs/>
+          <w:sz w:val="32"/>
+          <w:szCs w:val="32"/>
+        </w:rPr>
+        <w:t>Facial Recognition Approaches</w:t>
+      </w:r>
+    </w:p>
+    <w:p>
+      <w:pPr>
+        <w:pStyle w:val="Normal"/>
+        <w:bidi w:val="0"/>
+        <w:spacing w:lineRule="auto" w:line="480"/>
+        <w:jc w:val="left"/>
+        <w:rPr>
+          <w:b w:val="false"/>
+          <w:b w:val="false"/>
+          <w:bCs w:val="false"/>
+          <w:sz w:val="24"/>
+          <w:szCs w:val="24"/>
+        </w:rPr>
+      </w:pPr>
+      <w:r>
+        <w:rPr>
+          <w:b w:val="false"/>
+          <w:bCs w:val="false"/>
+          <w:sz w:val="24"/>
+          <w:szCs w:val="24"/>
+        </w:rPr>
+        <w:tab/>
+        <w:t>W</w:t>
+      </w:r>
+      <w:r>
+        <w:rPr>
+          <w:b w:val="false"/>
+          <w:bCs w:val="false"/>
+          <w:sz w:val="24"/>
+          <w:szCs w:val="24"/>
+        </w:rPr>
+        <w:t xml:space="preserve">hile Fu (2021) posits that facial recognitions using geometric features, facial recognition based on a template, and model based facial recognition </w:t>
+      </w:r>
+      <w:r>
+        <w:rPr>
+          <w:b w:val="false"/>
+          <w:bCs w:val="false"/>
+          <w:sz w:val="24"/>
+          <w:szCs w:val="24"/>
+        </w:rPr>
+        <w:t xml:space="preserve">are </w:t>
+      </w:r>
+      <w:r>
+        <w:rPr>
+          <w:b w:val="false"/>
+          <w:bCs w:val="false"/>
+          <w:sz w:val="24"/>
+          <w:szCs w:val="24"/>
+        </w:rPr>
+        <w:t xml:space="preserve">some of the </w:t>
+      </w:r>
+      <w:r>
+        <w:rPr>
+          <w:b w:val="false"/>
+          <w:bCs w:val="false"/>
+          <w:sz w:val="24"/>
+          <w:szCs w:val="24"/>
+        </w:rPr>
+        <w:t xml:space="preserve">existing </w:t>
+      </w:r>
+      <w:r>
+        <w:rPr>
+          <w:b w:val="false"/>
+          <w:bCs w:val="false"/>
+          <w:sz w:val="24"/>
+          <w:szCs w:val="24"/>
+        </w:rPr>
+        <w:t xml:space="preserve">solutions used </w:t>
+      </w:r>
+      <w:r>
+        <w:rPr>
+          <w:b w:val="false"/>
+          <w:bCs w:val="false"/>
+          <w:sz w:val="24"/>
+          <w:szCs w:val="24"/>
+        </w:rPr>
+        <w:t>for</w:t>
+      </w:r>
+      <w:r>
+        <w:rPr>
+          <w:b w:val="false"/>
+          <w:bCs w:val="false"/>
+          <w:sz w:val="24"/>
+          <w:szCs w:val="24"/>
+        </w:rPr>
+        <w:t xml:space="preserve"> facial recognition, Priya et al., (2014)  </w:t>
+      </w:r>
+      <w:r>
+        <w:rPr>
+          <w:b w:val="false"/>
+          <w:bCs w:val="false"/>
+          <w:sz w:val="24"/>
+          <w:szCs w:val="24"/>
+        </w:rPr>
+        <w:t>have different</w:t>
+      </w:r>
+      <w:r>
+        <w:rPr>
+          <w:b w:val="false"/>
+          <w:bCs w:val="false"/>
+          <w:sz w:val="24"/>
+          <w:szCs w:val="24"/>
+        </w:rPr>
+        <w:t xml:space="preserve"> methods </w:t>
+      </w:r>
+      <w:r>
+        <w:rPr>
+          <w:b w:val="false"/>
+          <w:bCs w:val="false"/>
+          <w:sz w:val="24"/>
+          <w:szCs w:val="24"/>
+        </w:rPr>
+        <w:t>used</w:t>
+      </w:r>
+      <w:r>
+        <w:rPr>
+          <w:b w:val="false"/>
+          <w:bCs w:val="false"/>
+          <w:sz w:val="24"/>
+          <w:szCs w:val="24"/>
+        </w:rPr>
+        <w:t xml:space="preserve"> facial recognition. These methods include </w:t>
+      </w:r>
+      <w:r>
+        <w:rPr>
+          <w:b w:val="false"/>
+          <w:bCs w:val="false"/>
+          <w:sz w:val="24"/>
+          <w:szCs w:val="24"/>
+        </w:rPr>
+        <w:t>template matching</w:t>
+      </w:r>
+      <w:r>
+        <w:rPr>
+          <w:b w:val="false"/>
+          <w:bCs w:val="false"/>
+          <w:sz w:val="24"/>
+          <w:szCs w:val="24"/>
+        </w:rPr>
+        <w:t xml:space="preserve">, </w:t>
+      </w:r>
+      <w:r>
+        <w:rPr>
+          <w:b w:val="false"/>
+          <w:bCs w:val="false"/>
+          <w:sz w:val="24"/>
+          <w:szCs w:val="24"/>
+        </w:rPr>
+        <w:t>statistical approach</w:t>
+      </w:r>
+      <w:r>
+        <w:rPr>
+          <w:b w:val="false"/>
+          <w:bCs w:val="false"/>
+          <w:sz w:val="24"/>
+          <w:szCs w:val="24"/>
+        </w:rPr>
+        <w:t xml:space="preserve"> and the </w:t>
+      </w:r>
+      <w:r>
+        <w:rPr>
+          <w:b w:val="false"/>
+          <w:bCs w:val="false"/>
+          <w:sz w:val="24"/>
+          <w:szCs w:val="24"/>
+        </w:rPr>
+        <w:t>neural networks</w:t>
+      </w:r>
+      <w:r>
+        <w:rPr>
+          <w:b w:val="false"/>
+          <w:bCs w:val="false"/>
+          <w:sz w:val="24"/>
+          <w:szCs w:val="24"/>
+        </w:rPr>
+        <w:t xml:space="preserve"> approach. </w:t>
+      </w:r>
+      <w:r>
+        <w:rPr>
+          <w:b w:val="false"/>
+          <w:bCs w:val="false"/>
+          <w:sz w:val="24"/>
+          <w:szCs w:val="24"/>
+        </w:rPr>
+        <w:t xml:space="preserve">Critical to the debate is the truth that the researcher </w:t>
+      </w:r>
+      <w:r>
+        <w:rPr>
+          <w:b w:val="false"/>
+          <w:bCs w:val="false"/>
+          <w:sz w:val="24"/>
+          <w:szCs w:val="24"/>
+        </w:rPr>
+        <w:t>will only discuss the geometric approach, the template matching approach, and the model based approach because the latter methods have enough publications that warrant a debate.</w:t>
+      </w:r>
+    </w:p>
+    <w:p>
+      <w:pPr>
+        <w:pStyle w:val="Normal"/>
+        <w:bidi w:val="0"/>
+        <w:spacing w:lineRule="auto" w:line="480"/>
+        <w:jc w:val="left"/>
+        <w:rPr>
+          <w:sz w:val="28"/>
+          <w:szCs w:val="28"/>
+        </w:rPr>
+      </w:pPr>
+      <w:r>
+        <w:rPr>
+          <w:b/>
+          <w:bCs/>
+          <w:sz w:val="28"/>
+          <w:szCs w:val="28"/>
+        </w:rPr>
+        <w:t>2.4.1 Geometric Approach</w:t>
       </w:r>
     </w:p>
     <w:p>
@@ -4330,10 +4358,85 @@
         <w:bidi w:val="0"/>
         <w:spacing w:lineRule="auto" w:line="480"/>
         <w:jc w:val="left"/>
-        <w:rPr/>
-      </w:pPr>
-      <w:r>
-        <w:rPr/>
+        <w:rPr>
+          <w:i w:val="false"/>
+          <w:i w:val="false"/>
+          <w:iCs w:val="false"/>
+          <w:sz w:val="24"/>
+          <w:szCs w:val="24"/>
+        </w:rPr>
+      </w:pPr>
+      <w:r>
+        <w:rPr>
+          <w:i w:val="false"/>
+          <w:iCs w:val="false"/>
+          <w:sz w:val="24"/>
+          <w:szCs w:val="24"/>
+        </w:rPr>
+      </w:r>
+    </w:p>
+    <w:p>
+      <w:pPr>
+        <w:pStyle w:val="Normal"/>
+        <w:bidi w:val="0"/>
+        <w:spacing w:lineRule="auto" w:line="480"/>
+        <w:jc w:val="left"/>
+        <w:rPr>
+          <w:i w:val="false"/>
+          <w:i w:val="false"/>
+          <w:iCs w:val="false"/>
+          <w:sz w:val="24"/>
+          <w:szCs w:val="24"/>
+        </w:rPr>
+      </w:pPr>
+      <w:r>
+        <w:rPr>
+          <w:i w:val="false"/>
+          <w:iCs w:val="false"/>
+          <w:sz w:val="24"/>
+          <w:szCs w:val="24"/>
+        </w:rPr>
+      </w:r>
+    </w:p>
+    <w:p>
+      <w:pPr>
+        <w:pStyle w:val="Normal"/>
+        <w:bidi w:val="0"/>
+        <w:spacing w:lineRule="auto" w:line="480"/>
+        <w:jc w:val="left"/>
+        <w:rPr>
+          <w:i w:val="false"/>
+          <w:i w:val="false"/>
+          <w:iCs w:val="false"/>
+          <w:sz w:val="24"/>
+          <w:szCs w:val="24"/>
+        </w:rPr>
+      </w:pPr>
+      <w:r>
+        <w:rPr>
+          <w:i w:val="false"/>
+          <w:iCs w:val="false"/>
+          <w:sz w:val="24"/>
+          <w:szCs w:val="24"/>
+        </w:rPr>
+        <w:t>https://ieeexplore.ieee.org/abstract/document/254061</w:t>
+      </w:r>
+    </w:p>
+    <w:p>
+      <w:pPr>
+        <w:pStyle w:val="Normal"/>
+        <w:bidi w:val="0"/>
+        <w:spacing w:lineRule="auto" w:line="480"/>
+        <w:jc w:val="left"/>
+        <w:rPr/>
+      </w:pPr>
+      <w:r>
+        <w:rPr/>
+        <w:t xml:space="preserve"> </w:t>
+      </w:r>
+      <w:r>
+        <w:rPr/>
+        <w:t>New Similarity Measurement For Face Recognition: GEOMETRIC FEATURES AS A MEASURE OF FACES SIMILARITY in digital Images</w:t>
       </w:r>
     </w:p>
     <w:sectPr>
@@ -4351,7 +4454,7 @@
 </file>
 
 <file path=word/footer1.xml><?xml version="1.0" encoding="utf-8"?>
-<w:ftr xmlns:o="urn:schemas-microsoft-com:office:office" xmlns:r="http://schemas.openxmlformats.org/officeDocument/2006/relationships" xmlns:v="urn:schemas-microsoft-com:vml" xmlns:w="http://schemas.openxmlformats.org/wordprocessingml/2006/main" xmlns:w10="urn:schemas-microsoft-com:office:word" xmlns:wp="http://schemas.openxmlformats.org/drawingml/2006/wordprocessingDrawing" xmlns:wps="http://schemas.microsoft.com/office/word/2010/wordprocessingShape" xmlns:wpg="http://schemas.microsoft.com/office/word/2010/wordprocessingGroup" xmlns:mc="http://schemas.openxmlformats.org/markup-compatibility/2006" xmlns:wp14="http://schemas.microsoft.com/office/word/2010/wordprocessingDrawing" xmlns:w14="http://schemas.microsoft.com/office/word/2010/wordml" mc:Ignorable="w14 wp14">
+<w:ftr xmlns:o="urn:schemas-microsoft-com:office:office" xmlns:r="http://schemas.openxmlformats.org/officeDocument/2006/relationships" xmlns:v="urn:schemas-microsoft-com:vml" xmlns:w="http://schemas.openxmlformats.org/wordprocessingml/2006/main" xmlns:w10="urn:schemas-microsoft-com:office:word" xmlns:wp="http://schemas.openxmlformats.org/drawingml/2006/wordprocessingDrawing" xmlns:wps="http://schemas.microsoft.com/office/word/2010/wordprocessingShape" xmlns:wpg="http://schemas.microsoft.com/office/word/2010/wordprocessingGroup" xmlns:mc="http://schemas.openxmlformats.org/markup-compatibility/2006" xmlns:wp14="http://schemas.microsoft.com/office/word/2010/wordprocessingDrawing" xmlns:w14="http://schemas.microsoft.com/office/word/2010/wordml" xmlns:w15="http://schemas.microsoft.com/office/word/2012/wordml" mc:Ignorable="w14 wp14 w15">
   <w:p>
     <w:pPr>
       <w:pStyle w:val="Footer"/>
@@ -4381,6 +4484,7 @@
         </w:tabs>
         <w:ind w:left="720" w:hanging="360"/>
       </w:pPr>
+      <w:rPr/>
     </w:lvl>
     <w:lvl w:ilvl="1">
       <w:start w:val="1"/>
@@ -4393,6 +4497,7 @@
         </w:tabs>
         <w:ind w:left="1080" w:hanging="360"/>
       </w:pPr>
+      <w:rPr/>
     </w:lvl>
     <w:lvl w:ilvl="2">
       <w:start w:val="1"/>
@@ -4405,6 +4510,7 @@
         </w:tabs>
         <w:ind w:left="1440" w:hanging="360"/>
       </w:pPr>
+      <w:rPr/>
     </w:lvl>
     <w:lvl w:ilvl="3">
       <w:start w:val="1"/>
@@ -4417,6 +4523,7 @@
         </w:tabs>
         <w:ind w:left="1800" w:hanging="360"/>
       </w:pPr>
+      <w:rPr/>
     </w:lvl>
     <w:lvl w:ilvl="4">
       <w:start w:val="1"/>
@@ -4429,6 +4536,7 @@
         </w:tabs>
         <w:ind w:left="2160" w:hanging="360"/>
       </w:pPr>
+      <w:rPr/>
     </w:lvl>
     <w:lvl w:ilvl="5">
       <w:start w:val="1"/>
@@ -4441,6 +4549,7 @@
         </w:tabs>
         <w:ind w:left="2520" w:hanging="360"/>
       </w:pPr>
+      <w:rPr/>
     </w:lvl>
     <w:lvl w:ilvl="6">
       <w:start w:val="1"/>
@@ -4453,6 +4562,7 @@
         </w:tabs>
         <w:ind w:left="2880" w:hanging="360"/>
       </w:pPr>
+      <w:rPr/>
     </w:lvl>
     <w:lvl w:ilvl="7">
       <w:start w:val="1"/>
@@ -4465,6 +4575,7 @@
         </w:tabs>
         <w:ind w:left="3240" w:hanging="360"/>
       </w:pPr>
+      <w:rPr/>
     </w:lvl>
     <w:lvl w:ilvl="8">
       <w:start w:val="1"/>
@@ -4477,6 +4588,7 @@
         </w:tabs>
         <w:ind w:left="3600" w:hanging="360"/>
       </w:pPr>
+      <w:rPr/>
     </w:lvl>
   </w:abstractNum>
   <w:abstractNum w:abstractNumId="2">
@@ -4651,6 +4763,10 @@
     <w:next w:val="TextBody"/>
     <w:qFormat/>
     <w:pPr>
+      <w:numPr>
+        <w:ilvl w:val="0"/>
+        <w:numId w:val="0"/>
+      </w:numPr>
       <w:spacing w:before="240" w:after="120"/>
       <w:outlineLvl w:val="0"/>
     </w:pPr>
@@ -4662,12 +4778,37 @@
       <w:szCs w:val="48"/>
     </w:rPr>
   </w:style>
+  <w:style w:type="paragraph" w:styleId="Heading2">
+    <w:name w:val="Heading 2"/>
+    <w:basedOn w:val="Heading"/>
+    <w:next w:val="TextBody"/>
+    <w:qFormat/>
+    <w:pPr>
+      <w:numPr>
+        <w:ilvl w:val="0"/>
+        <w:numId w:val="0"/>
+      </w:numPr>
+      <w:spacing w:before="200" w:after="120"/>
+      <w:outlineLvl w:val="1"/>
+    </w:pPr>
+    <w:rPr>
+      <w:rFonts w:ascii="Liberation Serif" w:hAnsi="Liberation Serif" w:eastAsia="Noto Serif CJK SC" w:cs="Lohit Devanagari"/>
+      <w:b/>
+      <w:bCs/>
+      <w:sz w:val="36"/>
+      <w:szCs w:val="36"/>
+    </w:rPr>
+  </w:style>
   <w:style w:type="paragraph" w:styleId="Heading3">
     <w:name w:val="Heading 3"/>
     <w:basedOn w:val="Heading"/>
     <w:next w:val="TextBody"/>
     <w:qFormat/>
     <w:pPr>
+      <w:numPr>
+        <w:ilvl w:val="0"/>
+        <w:numId w:val="0"/>
+      </w:numPr>
       <w:spacing w:before="140" w:after="120"/>
       <w:outlineLvl w:val="2"/>
     </w:pPr>

</xml_diff>

<commit_message>
start discussing papers that use the geometric approach of facial recognition
</commit_message>
<xml_diff>
--- a/SikoliaThesis.docx
+++ b/SikoliaThesis.docx
@@ -3134,7 +3134,13 @@
         <w:bidi w:val="0"/>
         <w:spacing w:lineRule="auto" w:line="480"/>
         <w:jc w:val="left"/>
-        <w:rPr/>
+        <w:rPr>
+          <w:b w:val="false"/>
+          <w:b w:val="false"/>
+          <w:bCs w:val="false"/>
+          <w:sz w:val="24"/>
+          <w:szCs w:val="24"/>
+        </w:rPr>
       </w:pPr>
       <w:r>
         <w:rPr>
@@ -3144,69 +3150,222 @@
           <w:szCs w:val="24"/>
         </w:rPr>
         <w:tab/>
-        <w:t xml:space="preserve">Fu (2021) posits that facial recognition techniques include using geometric features (or facial recognition based on a template matching), and model based facial recognition are some of the existing solutions used for facial recognition, Priya et al., (2014)  have different methods used facial recognition. The methods proposed by Priya et al., (2014)  include template matching, statistical approach and the neural networks approach. </w:t>
-      </w:r>
-      <w:r>
-        <w:rPr>
-          <w:b w:val="false"/>
-          <w:bCs w:val="false"/>
-          <w:sz w:val="24"/>
-          <w:szCs w:val="24"/>
-        </w:rPr>
-        <w:t xml:space="preserve">In a different paper, Bose and Bandyopadhyay (2020) mentions four methods use for facial recognition. These methods include feature-based methods, template-based methods, appearance-based methods, and knowledge-based methods. Even though the authors mention four methods that could be used for facial recognition, the authors used the template based method in their research </w:t>
-      </w:r>
-      <w:r>
-        <w:rPr>
-          <w:b w:val="false"/>
-          <w:bCs w:val="false"/>
-          <w:sz w:val="24"/>
-          <w:szCs w:val="24"/>
-        </w:rPr>
-        <w:t xml:space="preserve">citing </w:t>
-      </w:r>
-      <w:r>
-        <w:rPr>
-          <w:b w:val="false"/>
-          <w:bCs w:val="false"/>
-          <w:sz w:val="24"/>
-          <w:szCs w:val="24"/>
-        </w:rPr>
-        <w:t>that template matching is the best available solution for face detection.</w:t>
-      </w:r>
-    </w:p>
-    <w:p>
-      <w:pPr>
-        <w:pStyle w:val="Normal"/>
-        <w:bidi w:val="0"/>
-        <w:spacing w:lineRule="auto" w:line="480"/>
-        <w:jc w:val="left"/>
-        <w:rPr>
-          <w:b w:val="false"/>
-          <w:b w:val="false"/>
-          <w:bCs w:val="false"/>
-          <w:sz w:val="24"/>
-          <w:szCs w:val="24"/>
-        </w:rPr>
-      </w:pPr>
-      <w:r>
-        <w:rPr/>
-      </w:r>
-    </w:p>
-    <w:p>
-      <w:pPr>
-        <w:pStyle w:val="Normal"/>
-        <w:bidi w:val="0"/>
-        <w:spacing w:lineRule="auto" w:line="480"/>
-        <w:jc w:val="left"/>
-        <w:rPr/>
-      </w:pPr>
-      <w:r>
-        <w:rPr>
-          <w:b w:val="false"/>
-          <w:bCs w:val="false"/>
-          <w:sz w:val="24"/>
-          <w:szCs w:val="24"/>
-        </w:rPr>
+      </w:r>
+      <w:r>
+        <w:rPr>
+          <w:b w:val="false"/>
+          <w:bCs w:val="false"/>
+          <w:sz w:val="24"/>
+          <w:szCs w:val="24"/>
+        </w:rPr>
+        <w:t xml:space="preserve">A thorough review of literature on the subject of facial recognition reveals that there is an array of techniques that could be used for facial recognition. As evidenced, </w:t>
+      </w:r>
+      <w:r>
+        <w:rPr>
+          <w:b w:val="false"/>
+          <w:bCs w:val="false"/>
+          <w:sz w:val="24"/>
+          <w:szCs w:val="24"/>
+        </w:rPr>
+        <w:t xml:space="preserve">Fu (2021) posits that </w:t>
+      </w:r>
+      <w:r>
+        <w:rPr>
+          <w:b w:val="false"/>
+          <w:bCs w:val="false"/>
+          <w:sz w:val="24"/>
+          <w:szCs w:val="24"/>
+        </w:rPr>
+        <w:t>the</w:t>
+      </w:r>
+      <w:r>
+        <w:rPr>
+          <w:b w:val="false"/>
+          <w:bCs w:val="false"/>
+          <w:sz w:val="24"/>
+          <w:szCs w:val="24"/>
+        </w:rPr>
+        <w:t xml:space="preserve"> geometric features </w:t>
+      </w:r>
+      <w:r>
+        <w:rPr>
+          <w:b w:val="false"/>
+          <w:bCs w:val="false"/>
+          <w:sz w:val="24"/>
+          <w:szCs w:val="24"/>
+        </w:rPr>
+        <w:t xml:space="preserve">approach, the template matching approach, </w:t>
+      </w:r>
+      <w:r>
+        <w:rPr>
+          <w:b w:val="false"/>
+          <w:bCs w:val="false"/>
+          <w:sz w:val="24"/>
+          <w:szCs w:val="24"/>
+        </w:rPr>
+        <w:t xml:space="preserve">and </w:t>
+      </w:r>
+      <w:r>
+        <w:rPr>
+          <w:b w:val="false"/>
+          <w:bCs w:val="false"/>
+          <w:sz w:val="24"/>
+          <w:szCs w:val="24"/>
+        </w:rPr>
+        <w:t xml:space="preserve">the </w:t>
+      </w:r>
+      <w:r>
+        <w:rPr>
+          <w:b w:val="false"/>
+          <w:bCs w:val="false"/>
+          <w:sz w:val="24"/>
+          <w:szCs w:val="24"/>
+        </w:rPr>
+        <w:t xml:space="preserve">model based facial </w:t>
+      </w:r>
+      <w:r>
+        <w:rPr>
+          <w:b w:val="false"/>
+          <w:bCs w:val="false"/>
+          <w:sz w:val="24"/>
+          <w:szCs w:val="24"/>
+        </w:rPr>
+        <w:t xml:space="preserve">approaches of facial </w:t>
+      </w:r>
+      <w:r>
+        <w:rPr>
+          <w:b w:val="false"/>
+          <w:bCs w:val="false"/>
+          <w:sz w:val="24"/>
+          <w:szCs w:val="24"/>
+        </w:rPr>
+        <w:t xml:space="preserve">recognition are some of the existing solutions </w:t>
+      </w:r>
+      <w:r>
+        <w:rPr>
+          <w:b w:val="false"/>
+          <w:bCs w:val="false"/>
+          <w:sz w:val="24"/>
+          <w:szCs w:val="24"/>
+        </w:rPr>
+        <w:t>on</w:t>
+      </w:r>
+      <w:r>
+        <w:rPr>
+          <w:b w:val="false"/>
+          <w:bCs w:val="false"/>
+          <w:sz w:val="24"/>
+          <w:szCs w:val="24"/>
+        </w:rPr>
+        <w:t xml:space="preserve"> facial recognition. </w:t>
+      </w:r>
+      <w:r>
+        <w:rPr>
+          <w:b w:val="false"/>
+          <w:bCs w:val="false"/>
+          <w:sz w:val="24"/>
+          <w:szCs w:val="24"/>
+        </w:rPr>
+        <w:t>In a different study,</w:t>
+      </w:r>
+      <w:r>
+        <w:rPr>
+          <w:b w:val="false"/>
+          <w:bCs w:val="false"/>
+          <w:sz w:val="24"/>
+          <w:szCs w:val="24"/>
+        </w:rPr>
+        <w:t xml:space="preserve"> Priya et al., (2014)  </w:t>
+      </w:r>
+      <w:r>
+        <w:rPr>
+          <w:b w:val="false"/>
+          <w:bCs w:val="false"/>
+          <w:sz w:val="24"/>
+          <w:szCs w:val="24"/>
+        </w:rPr>
+        <w:t>mention the</w:t>
+      </w:r>
+      <w:r>
+        <w:rPr>
+          <w:b w:val="false"/>
+          <w:bCs w:val="false"/>
+          <w:sz w:val="24"/>
+          <w:szCs w:val="24"/>
+        </w:rPr>
+        <w:t xml:space="preserve"> template matching </w:t>
+      </w:r>
+      <w:r>
+        <w:rPr>
+          <w:b w:val="false"/>
+          <w:bCs w:val="false"/>
+          <w:sz w:val="24"/>
+          <w:szCs w:val="24"/>
+        </w:rPr>
+        <w:t>technique</w:t>
+      </w:r>
+      <w:r>
+        <w:rPr>
+          <w:b w:val="false"/>
+          <w:bCs w:val="false"/>
+          <w:sz w:val="24"/>
+          <w:szCs w:val="24"/>
+        </w:rPr>
+        <w:t xml:space="preserve">, </w:t>
+      </w:r>
+      <w:r>
+        <w:rPr>
+          <w:b w:val="false"/>
+          <w:bCs w:val="false"/>
+          <w:sz w:val="24"/>
+          <w:szCs w:val="24"/>
+        </w:rPr>
+        <w:t xml:space="preserve">the </w:t>
+      </w:r>
+      <w:r>
+        <w:rPr>
+          <w:b w:val="false"/>
+          <w:bCs w:val="false"/>
+          <w:sz w:val="24"/>
+          <w:szCs w:val="24"/>
+        </w:rPr>
+        <w:t xml:space="preserve">statistical approach and the neural networks approach </w:t>
+      </w:r>
+      <w:r>
+        <w:rPr>
+          <w:b w:val="false"/>
+          <w:bCs w:val="false"/>
+          <w:sz w:val="24"/>
+          <w:szCs w:val="24"/>
+        </w:rPr>
+        <w:t>as some of the solutions that could be used for facial recognition</w:t>
+      </w:r>
+      <w:r>
+        <w:rPr>
+          <w:b w:val="false"/>
+          <w:bCs w:val="false"/>
+          <w:sz w:val="24"/>
+          <w:szCs w:val="24"/>
+        </w:rPr>
+        <w:t>. In a different paper, Bose and Bandyopadhyay (2020) mentions four methods use for facial recognition. These methods include feature-based methods, template-based methods, appearance-based methods, and knowledge-based methods. Even though the authors mention four methods that could be used for facial recognition, the authors used the template based method in their research citing that template matching is the best available solution for face detection.</w:t>
+      </w:r>
+    </w:p>
+    <w:p>
+      <w:pPr>
+        <w:pStyle w:val="Normal"/>
+        <w:bidi w:val="0"/>
+        <w:spacing w:lineRule="auto" w:line="480"/>
+        <w:jc w:val="left"/>
+        <w:rPr/>
+      </w:pPr>
+      <w:r>
+        <w:rPr>
+          <w:b w:val="false"/>
+          <w:bCs w:val="false"/>
+          <w:sz w:val="24"/>
+          <w:szCs w:val="24"/>
+        </w:rPr>
+        <w:tab/>
         <w:t xml:space="preserve">Critical to the debate is the truth that the researcher will only discuss the geometric approach, the template matching approach, and the model based approach because the latter methods have enough publications that warrant a debate on the subject. For instance, Brunelli and Poggio (2013) discuss facial recognition based on geometric features, </w:t>
       </w:r>
       <w:r>
@@ -3280,16 +3439,153 @@
           <w:sz w:val="24"/>
           <w:szCs w:val="24"/>
         </w:rPr>
-        <w:t>Hidayat, Wibowo, Satria,Winursito, 2021</w:t>
-      </w:r>
-      <w:r>
-        <w:rPr>
-          <w:b w:val="false"/>
-          <w:bCs w:val="false"/>
-          <w:sz w:val="24"/>
-          <w:szCs w:val="24"/>
-        </w:rPr>
-        <w:t xml:space="preserve">). Simply put, the geometric approach transforms an image into geometric primitives like curves and points. This is done by identifying distinctive features like the eye, the nose, and the mouth before measuring their relative positions, widths and other parameters of the distinctive features. </w:t>
+        <w:t>Hidayat, Wibowo, Satria, Winursito, 2021</w:t>
+      </w:r>
+      <w:r>
+        <w:rPr>
+          <w:b w:val="false"/>
+          <w:bCs w:val="false"/>
+          <w:sz w:val="24"/>
+          <w:szCs w:val="24"/>
+        </w:rPr>
+        <w:t xml:space="preserve">). Simply put, the geometric approach transforms an image into geometric primitives like curves and points. This is done by identifying distinctive features like the eye, the nose, the chin, and the mouth before measuring their relative positions, widths and other parameters of the distinctive features. </w:t>
+      </w:r>
+      <w:r>
+        <w:rPr>
+          <w:b w:val="false"/>
+          <w:bCs w:val="false"/>
+          <w:sz w:val="24"/>
+          <w:szCs w:val="24"/>
+        </w:rPr>
+        <w:t>H</w:t>
+      </w:r>
+      <w:r>
+        <w:rPr>
+          <w:b w:val="false"/>
+          <w:bCs w:val="false"/>
+          <w:i w:val="false"/>
+          <w:iCs w:val="false"/>
+          <w:sz w:val="24"/>
+          <w:szCs w:val="24"/>
+        </w:rPr>
+        <w:t xml:space="preserve">idayat, </w:t>
+      </w:r>
+      <w:r>
+        <w:rPr>
+          <w:b w:val="false"/>
+          <w:bCs w:val="false"/>
+          <w:i w:val="false"/>
+          <w:iCs w:val="false"/>
+          <w:sz w:val="24"/>
+          <w:szCs w:val="24"/>
+        </w:rPr>
+        <w:t>et al., (</w:t>
+      </w:r>
+      <w:r>
+        <w:rPr>
+          <w:b w:val="false"/>
+          <w:bCs w:val="false"/>
+          <w:i w:val="false"/>
+          <w:iCs w:val="false"/>
+          <w:sz w:val="24"/>
+          <w:szCs w:val="24"/>
+        </w:rPr>
+        <w:t>2021</w:t>
+      </w:r>
+      <w:r>
+        <w:rPr>
+          <w:b w:val="false"/>
+          <w:bCs w:val="false"/>
+          <w:sz w:val="24"/>
+          <w:szCs w:val="24"/>
+        </w:rPr>
+        <w:t xml:space="preserve">). </w:t>
+      </w:r>
+      <w:r>
+        <w:rPr>
+          <w:b w:val="false"/>
+          <w:bCs w:val="false"/>
+          <w:i w:val="false"/>
+          <w:iCs w:val="false"/>
+          <w:sz w:val="24"/>
+          <w:szCs w:val="24"/>
+        </w:rPr>
+        <w:t>further assert that the geometric approach of facial recognition is known to have a lighter computational load than other methods because it does not require features from the entire face. Brunelli and Poggio (2013) emphasize that the geometric method of facial recognition has a lighter computational load by arguing that the method in question can recognize faces even when the details of individual features such as the nose, eyes, and mouth are no longer resolved.</w:t>
+      </w:r>
+    </w:p>
+    <w:p>
+      <w:pPr>
+        <w:pStyle w:val="Normal"/>
+        <w:bidi w:val="0"/>
+        <w:spacing w:lineRule="auto" w:line="480"/>
+        <w:jc w:val="left"/>
+        <w:rPr/>
+      </w:pPr>
+      <w:r>
+        <w:rPr>
+          <w:b w:val="false"/>
+          <w:bCs w:val="false"/>
+          <w:i w:val="false"/>
+          <w:iCs w:val="false"/>
+          <w:sz w:val="24"/>
+          <w:szCs w:val="24"/>
+        </w:rPr>
+        <w:tab/>
+      </w:r>
+      <w:r>
+        <w:rPr>
+          <w:b w:val="false"/>
+          <w:bCs w:val="false"/>
+          <w:i w:val="false"/>
+          <w:iCs w:val="false"/>
+          <w:sz w:val="24"/>
+          <w:szCs w:val="24"/>
+        </w:rPr>
+        <w:t xml:space="preserve">It is critical that several authors have applied the geometric approach of facial recognition in their studies. For example, </w:t>
+      </w:r>
+      <w:r>
+        <w:rPr>
+          <w:b w:val="false"/>
+          <w:bCs w:val="false"/>
+          <w:i w:val="false"/>
+          <w:iCs w:val="false"/>
+          <w:sz w:val="24"/>
+          <w:szCs w:val="24"/>
+        </w:rPr>
+        <w:t xml:space="preserve">Ghimire and Lee (2016) used the approach in question to predict emotions on a sequence of images that were extracted from videos. </w:t>
+      </w:r>
+      <w:r>
+        <w:rPr>
+          <w:b w:val="false"/>
+          <w:bCs w:val="false"/>
+          <w:i w:val="false"/>
+          <w:iCs w:val="false"/>
+          <w:sz w:val="24"/>
+          <w:szCs w:val="24"/>
+        </w:rPr>
+        <w:t xml:space="preserve">Specifically, </w:t>
+      </w:r>
+      <w:r>
+        <w:rPr>
+          <w:b w:val="false"/>
+          <w:bCs w:val="false"/>
+          <w:i w:val="false"/>
+          <w:iCs w:val="false"/>
+          <w:sz w:val="24"/>
+          <w:szCs w:val="24"/>
+        </w:rPr>
+        <w:t xml:space="preserve">Ghimire and Lee (2016) </w:t>
+      </w:r>
+      <w:r>
+        <w:rPr>
+          <w:b w:val="false"/>
+          <w:bCs w:val="false"/>
+          <w:i w:val="false"/>
+          <w:iCs w:val="false"/>
+          <w:sz w:val="24"/>
+          <w:szCs w:val="24"/>
+        </w:rPr>
+        <w:t xml:space="preserve">ran a multi-class AdaBoost algorithm and a support vector machines algorithm on  the Cohn-Kanade (CK+) facial expression database and obtained an accuracy of 95.17% and 97.35% respectively. </w:t>
       </w:r>
       <w:r>
         <w:br w:type="page"/>
@@ -3685,6 +3981,135 @@
         <w:t xml:space="preserve"> 11(11588): 1-16. </w:t>
         <w:tab/>
         <w:t>https://doi.org/10.3390/app112411588</w:t>
+      </w:r>
+    </w:p>
+    <w:p>
+      <w:pPr>
+        <w:pStyle w:val="Normal"/>
+        <w:bidi w:val="0"/>
+        <w:spacing w:lineRule="auto" w:line="480"/>
+        <w:jc w:val="left"/>
+        <w:rPr>
+          <w:b w:val="false"/>
+          <w:b w:val="false"/>
+          <w:bCs w:val="false"/>
+          <w:sz w:val="24"/>
+          <w:szCs w:val="24"/>
+        </w:rPr>
+      </w:pPr>
+      <w:r>
+        <w:rPr>
+          <w:b w:val="false"/>
+          <w:bCs w:val="false"/>
+          <w:sz w:val="24"/>
+          <w:szCs w:val="24"/>
+        </w:rPr>
+        <w:t>Ghimire</w:t>
+      </w:r>
+      <w:r>
+        <w:rPr>
+          <w:b w:val="false"/>
+          <w:bCs w:val="false"/>
+          <w:sz w:val="24"/>
+          <w:szCs w:val="24"/>
+        </w:rPr>
+        <w:t xml:space="preserve">, </w:t>
+      </w:r>
+      <w:r>
+        <w:rPr>
+          <w:b w:val="false"/>
+          <w:bCs w:val="false"/>
+          <w:sz w:val="24"/>
+          <w:szCs w:val="24"/>
+        </w:rPr>
+        <w:t>D</w:t>
+      </w:r>
+      <w:r>
+        <w:rPr>
+          <w:b w:val="false"/>
+          <w:bCs w:val="false"/>
+          <w:sz w:val="24"/>
+          <w:szCs w:val="24"/>
+        </w:rPr>
+        <w:t>., and L</w:t>
+      </w:r>
+      <w:r>
+        <w:rPr>
+          <w:b w:val="false"/>
+          <w:bCs w:val="false"/>
+          <w:sz w:val="24"/>
+          <w:szCs w:val="24"/>
+        </w:rPr>
+        <w:t>ee, J</w:t>
+      </w:r>
+      <w:r>
+        <w:rPr>
+          <w:b w:val="false"/>
+          <w:bCs w:val="false"/>
+          <w:sz w:val="24"/>
+          <w:szCs w:val="24"/>
+        </w:rPr>
+        <w:t xml:space="preserve">. </w:t>
+      </w:r>
+      <w:r>
+        <w:rPr>
+          <w:b w:val="false"/>
+          <w:bCs w:val="false"/>
+          <w:sz w:val="24"/>
+          <w:szCs w:val="24"/>
+        </w:rPr>
+        <w:t>(2016).  Geometric Feature-Based Facial Expression Recognition in</w:t>
+      </w:r>
+    </w:p>
+    <w:p>
+      <w:pPr>
+        <w:pStyle w:val="Normal"/>
+        <w:bidi w:val="0"/>
+        <w:spacing w:lineRule="auto" w:line="480"/>
+        <w:jc w:val="left"/>
+        <w:rPr>
+          <w:b w:val="false"/>
+          <w:b w:val="false"/>
+          <w:bCs w:val="false"/>
+          <w:sz w:val="24"/>
+          <w:szCs w:val="24"/>
+        </w:rPr>
+      </w:pPr>
+      <w:r>
+        <w:rPr>
+          <w:b w:val="false"/>
+          <w:bCs w:val="false"/>
+          <w:i w:val="false"/>
+          <w:iCs w:val="false"/>
+          <w:sz w:val="24"/>
+          <w:szCs w:val="24"/>
+        </w:rPr>
+        <w:tab/>
+        <w:t xml:space="preserve">Image Sequences Using Multi-Class AdaBoost and Support Vector Machines. </w:t>
+      </w:r>
+      <w:r>
+        <w:rPr>
+          <w:b w:val="false"/>
+          <w:bCs w:val="false"/>
+          <w:i/>
+          <w:iCs/>
+          <w:sz w:val="24"/>
+          <w:szCs w:val="24"/>
+        </w:rPr>
+        <w:t>Sensors</w:t>
+      </w:r>
+      <w:r>
+        <w:rPr>
+          <w:b w:val="false"/>
+          <w:bCs w:val="false"/>
+          <w:i w:val="false"/>
+          <w:iCs w:val="false"/>
+          <w:sz w:val="24"/>
+          <w:szCs w:val="24"/>
+        </w:rPr>
+        <w:t xml:space="preserve">, </w:t>
+        <w:tab/>
+        <w:t>13(6): 7714–7734. https://doi.org/10.3390%2Fs130607714</w:t>
       </w:r>
     </w:p>
     <w:p>
@@ -4268,89 +4693,6 @@
         <w:t xml:space="preserve">Transactions on Pattern Analysis and Machine Intelligence, 24(1): 1-25. </w:t>
         <w:tab/>
         <w:t>http://dx.doi.org/10.1109/34.982883</w:t>
-      </w:r>
-    </w:p>
-    <w:p>
-      <w:pPr>
-        <w:pStyle w:val="Normal"/>
-        <w:bidi w:val="0"/>
-        <w:spacing w:lineRule="auto" w:line="480"/>
-        <w:jc w:val="left"/>
-        <w:rPr>
-          <w:i w:val="false"/>
-          <w:i w:val="false"/>
-          <w:iCs w:val="false"/>
-          <w:sz w:val="24"/>
-          <w:szCs w:val="24"/>
-        </w:rPr>
-      </w:pPr>
-      <w:r>
-        <w:rPr>
-          <w:i w:val="false"/>
-          <w:iCs w:val="false"/>
-          <w:sz w:val="24"/>
-          <w:szCs w:val="24"/>
-        </w:rPr>
-      </w:r>
-    </w:p>
-    <w:p>
-      <w:pPr>
-        <w:pStyle w:val="Normal"/>
-        <w:bidi w:val="0"/>
-        <w:spacing w:lineRule="auto" w:line="480"/>
-        <w:jc w:val="left"/>
-        <w:rPr>
-          <w:i w:val="false"/>
-          <w:i w:val="false"/>
-          <w:iCs w:val="false"/>
-          <w:sz w:val="24"/>
-          <w:szCs w:val="24"/>
-        </w:rPr>
-      </w:pPr>
-      <w:r>
-        <w:rPr>
-          <w:i w:val="false"/>
-          <w:iCs w:val="false"/>
-          <w:sz w:val="24"/>
-          <w:szCs w:val="24"/>
-        </w:rPr>
-      </w:r>
-    </w:p>
-    <w:p>
-      <w:pPr>
-        <w:pStyle w:val="Normal"/>
-        <w:bidi w:val="0"/>
-        <w:spacing w:lineRule="auto" w:line="480"/>
-        <w:jc w:val="left"/>
-        <w:rPr>
-          <w:i w:val="false"/>
-          <w:i w:val="false"/>
-          <w:iCs w:val="false"/>
-          <w:sz w:val="24"/>
-          <w:szCs w:val="24"/>
-        </w:rPr>
-      </w:pPr>
-      <w:r>
-        <w:rPr>
-          <w:i w:val="false"/>
-          <w:iCs w:val="false"/>
-          <w:sz w:val="24"/>
-          <w:szCs w:val="24"/>
-        </w:rPr>
-        <w:t>https://ieeexplore.ieee.org/abstract/document/254061</w:t>
-      </w:r>
-    </w:p>
-    <w:p>
-      <w:pPr>
-        <w:pStyle w:val="Normal"/>
-        <w:bidi w:val="0"/>
-        <w:spacing w:lineRule="auto" w:line="480"/>
-        <w:jc w:val="left"/>
-        <w:rPr/>
-      </w:pPr>
-      <w:r>
-        <w:rPr/>
-        <w:t xml:space="preserve"> </w:t>
       </w:r>
     </w:p>
     <w:sectPr>

</xml_diff>

<commit_message>
work on gemetric features
</commit_message>
<xml_diff>
--- a/SikoliaThesis.docx
+++ b/SikoliaThesis.docx
@@ -2620,31 +2620,25 @@
           <w:sz w:val="24"/>
           <w:szCs w:val="24"/>
         </w:rPr>
-        <w:t xml:space="preserve"> century. The same author further mentions that the topical facial recognition systems are still racial biased. It is important to note that the current facial recognition systems  were created from celebrity images but none of them dared to use images collected from Smartphones. </w:t>
-      </w:r>
-    </w:p>
-    <w:p>
-      <w:pPr>
-        <w:pStyle w:val="Normal"/>
-        <w:bidi w:val="0"/>
-        <w:spacing w:lineRule="auto" w:line="480"/>
-        <w:jc w:val="left"/>
-        <w:rPr>
-          <w:b w:val="false"/>
-          <w:b w:val="false"/>
-          <w:bCs w:val="false"/>
-          <w:sz w:val="24"/>
-          <w:szCs w:val="24"/>
-        </w:rPr>
-      </w:pPr>
-      <w:r>
-        <w:rPr>
-          <w:b w:val="false"/>
-          <w:bCs w:val="false"/>
-          <w:sz w:val="24"/>
-          <w:szCs w:val="24"/>
-        </w:rPr>
-        <w:t>Moreover, the current facial recognition systems were created using one hundred and twenty eight variables. It follows that this proposal will contribute to the existing knowledge by creating a facial recognition system using forty two variables, African faces, and images taken using smartphones.</w:t>
+        <w:t xml:space="preserve"> century. The same author further mentions that the topical facial recognition systems are still racial biased. </w:t>
+      </w:r>
+      <w:r>
+        <w:rPr>
+          <w:b w:val="false"/>
+          <w:bCs w:val="false"/>
+          <w:sz w:val="24"/>
+          <w:szCs w:val="24"/>
+        </w:rPr>
+        <w:t xml:space="preserve">It is also important to note that most of the </w:t>
+      </w:r>
+      <w:r>
+        <w:rPr>
+          <w:b w:val="false"/>
+          <w:bCs w:val="false"/>
+          <w:sz w:val="24"/>
+          <w:szCs w:val="24"/>
+        </w:rPr>
+        <w:t>current facial recognition systems  were created from celebrity images but none of them dared to use images collected from Smartphones. Moreover, the current facial recognition systems were created using one hundred and twenty eight variables. It follows that this proposal will contribute to the existing knowledge by creating a facial recognition system using forty two variables, African faces, and images taken using smartphones.</w:t>
       </w:r>
     </w:p>
     <w:p>
@@ -3150,96 +3144,97 @@
           <w:szCs w:val="24"/>
         </w:rPr>
         <w:tab/>
-      </w:r>
-      <w:r>
-        <w:rPr>
-          <w:b w:val="false"/>
-          <w:bCs w:val="false"/>
-          <w:sz w:val="24"/>
-          <w:szCs w:val="24"/>
-        </w:rPr>
-        <w:t xml:space="preserve">A thorough review of literature on the subject of facial recognition reveals that there is an array of techniques that could be used for facial recognition. As evidenced, </w:t>
-      </w:r>
-      <w:r>
-        <w:rPr>
-          <w:b w:val="false"/>
-          <w:bCs w:val="false"/>
-          <w:sz w:val="24"/>
-          <w:szCs w:val="24"/>
-        </w:rPr>
-        <w:t xml:space="preserve">Fu (2021) posits that </w:t>
-      </w:r>
-      <w:r>
-        <w:rPr>
-          <w:b w:val="false"/>
-          <w:bCs w:val="false"/>
-          <w:sz w:val="24"/>
-          <w:szCs w:val="24"/>
-        </w:rPr>
-        <w:t>the</w:t>
-      </w:r>
-      <w:r>
-        <w:rPr>
-          <w:b w:val="false"/>
-          <w:bCs w:val="false"/>
-          <w:sz w:val="24"/>
-          <w:szCs w:val="24"/>
-        </w:rPr>
-        <w:t xml:space="preserve"> geometric features </w:t>
-      </w:r>
-      <w:r>
-        <w:rPr>
-          <w:b w:val="false"/>
-          <w:bCs w:val="false"/>
-          <w:sz w:val="24"/>
-          <w:szCs w:val="24"/>
-        </w:rPr>
-        <w:t xml:space="preserve">approach, the template matching approach, </w:t>
-      </w:r>
-      <w:r>
-        <w:rPr>
-          <w:b w:val="false"/>
-          <w:bCs w:val="false"/>
-          <w:sz w:val="24"/>
-          <w:szCs w:val="24"/>
-        </w:rPr>
-        <w:t xml:space="preserve">and </w:t>
-      </w:r>
-      <w:r>
-        <w:rPr>
-          <w:b w:val="false"/>
-          <w:bCs w:val="false"/>
-          <w:sz w:val="24"/>
-          <w:szCs w:val="24"/>
-        </w:rPr>
-        <w:t xml:space="preserve">the </w:t>
-      </w:r>
-      <w:r>
-        <w:rPr>
-          <w:b w:val="false"/>
-          <w:bCs w:val="false"/>
-          <w:sz w:val="24"/>
-          <w:szCs w:val="24"/>
-        </w:rPr>
-        <w:t xml:space="preserve">model based facial </w:t>
-      </w:r>
-      <w:r>
-        <w:rPr>
-          <w:b w:val="false"/>
-          <w:bCs w:val="false"/>
-          <w:sz w:val="24"/>
-          <w:szCs w:val="24"/>
-        </w:rPr>
-        <w:t xml:space="preserve">approaches of facial </w:t>
-      </w:r>
-      <w:r>
-        <w:rPr>
-          <w:b w:val="false"/>
-          <w:bCs w:val="false"/>
-          <w:sz w:val="24"/>
-          <w:szCs w:val="24"/>
-        </w:rPr>
-        <w:t xml:space="preserve">recognition are some of the existing solutions </w:t>
+        <w:t xml:space="preserve">A thorough review of literature on the subject of facial recognition reveals that there is an array of techniques that could be used for facial recognition. As evidenced, Fu (2021) </w:t>
+      </w:r>
+      <w:r>
+        <w:rPr>
+          <w:b w:val="false"/>
+          <w:bCs w:val="false"/>
+          <w:sz w:val="24"/>
+          <w:szCs w:val="24"/>
+        </w:rPr>
+        <w:t>mention</w:t>
+      </w:r>
+      <w:r>
+        <w:rPr>
+          <w:b w:val="false"/>
+          <w:bCs w:val="false"/>
+          <w:sz w:val="24"/>
+          <w:szCs w:val="24"/>
+        </w:rPr>
+        <w:t xml:space="preserve"> the geometric features approach, the template matching approach, and the model based facial approach </w:t>
+      </w:r>
+      <w:r>
+        <w:rPr>
+          <w:b w:val="false"/>
+          <w:bCs w:val="false"/>
+          <w:sz w:val="24"/>
+          <w:szCs w:val="24"/>
+        </w:rPr>
+        <w:t>as</w:t>
+      </w:r>
+      <w:r>
+        <w:rPr>
+          <w:b w:val="false"/>
+          <w:bCs w:val="false"/>
+          <w:sz w:val="24"/>
+          <w:szCs w:val="24"/>
+        </w:rPr>
+        <w:t xml:space="preserve"> some of the existing solutions on facial recognition. In a different study, Priya et al., (2014)  mention the template matching technique, the statistical approach and the neural networks approach as some of the </w:t>
+      </w:r>
+      <w:r>
+        <w:rPr>
+          <w:b w:val="false"/>
+          <w:bCs w:val="false"/>
+          <w:sz w:val="24"/>
+          <w:szCs w:val="24"/>
+        </w:rPr>
+        <w:t>techniques</w:t>
+      </w:r>
+      <w:r>
+        <w:rPr>
+          <w:b w:val="false"/>
+          <w:bCs w:val="false"/>
+          <w:sz w:val="24"/>
+          <w:szCs w:val="24"/>
+        </w:rPr>
+        <w:t xml:space="preserve"> that could be used for facial recognition. In a different paper, Bose and Bandyopadhyay (2020) mentions four methods use for facial recognition. These methods include feature-based methods, template-based methods, appearance-based methods, and knowledge-based methods. Even though </w:t>
+      </w:r>
+      <w:r>
+        <w:rPr>
+          <w:b w:val="false"/>
+          <w:bCs w:val="false"/>
+          <w:sz w:val="24"/>
+          <w:szCs w:val="24"/>
+        </w:rPr>
+        <w:t>B</w:t>
+      </w:r>
+      <w:r>
+        <w:rPr>
+          <w:b w:val="false"/>
+          <w:bCs w:val="false"/>
+          <w:sz w:val="24"/>
+          <w:szCs w:val="24"/>
+        </w:rPr>
+        <w:t>ose and Bandyopadhyay (2020)mention four methods that could be used for facial recognition, the</w:t>
+      </w:r>
+      <w:r>
+        <w:rPr>
+          <w:b w:val="false"/>
+          <w:bCs w:val="false"/>
+          <w:sz w:val="24"/>
+          <w:szCs w:val="24"/>
+        </w:rPr>
+        <w:t>y</w:t>
+      </w:r>
+      <w:r>
+        <w:rPr>
+          <w:b w:val="false"/>
+          <w:bCs w:val="false"/>
+          <w:sz w:val="24"/>
+          <w:szCs w:val="24"/>
+        </w:rPr>
+        <w:t xml:space="preserve"> used the template based method in their research citing that template matching is the best available solution </w:t>
       </w:r>
       <w:r>
         <w:rPr>
@@ -3257,97 +3252,7 @@
           <w:sz w:val="24"/>
           <w:szCs w:val="24"/>
         </w:rPr>
-        <w:t xml:space="preserve"> facial recognition. </w:t>
-      </w:r>
-      <w:r>
-        <w:rPr>
-          <w:b w:val="false"/>
-          <w:bCs w:val="false"/>
-          <w:sz w:val="24"/>
-          <w:szCs w:val="24"/>
-        </w:rPr>
-        <w:t>In a different study,</w:t>
-      </w:r>
-      <w:r>
-        <w:rPr>
-          <w:b w:val="false"/>
-          <w:bCs w:val="false"/>
-          <w:sz w:val="24"/>
-          <w:szCs w:val="24"/>
-        </w:rPr>
-        <w:t xml:space="preserve"> Priya et al., (2014)  </w:t>
-      </w:r>
-      <w:r>
-        <w:rPr>
-          <w:b w:val="false"/>
-          <w:bCs w:val="false"/>
-          <w:sz w:val="24"/>
-          <w:szCs w:val="24"/>
-        </w:rPr>
-        <w:t>mention the</w:t>
-      </w:r>
-      <w:r>
-        <w:rPr>
-          <w:b w:val="false"/>
-          <w:bCs w:val="false"/>
-          <w:sz w:val="24"/>
-          <w:szCs w:val="24"/>
-        </w:rPr>
-        <w:t xml:space="preserve"> template matching </w:t>
-      </w:r>
-      <w:r>
-        <w:rPr>
-          <w:b w:val="false"/>
-          <w:bCs w:val="false"/>
-          <w:sz w:val="24"/>
-          <w:szCs w:val="24"/>
-        </w:rPr>
-        <w:t>technique</w:t>
-      </w:r>
-      <w:r>
-        <w:rPr>
-          <w:b w:val="false"/>
-          <w:bCs w:val="false"/>
-          <w:sz w:val="24"/>
-          <w:szCs w:val="24"/>
-        </w:rPr>
-        <w:t xml:space="preserve">, </w:t>
-      </w:r>
-      <w:r>
-        <w:rPr>
-          <w:b w:val="false"/>
-          <w:bCs w:val="false"/>
-          <w:sz w:val="24"/>
-          <w:szCs w:val="24"/>
-        </w:rPr>
-        <w:t xml:space="preserve">the </w:t>
-      </w:r>
-      <w:r>
-        <w:rPr>
-          <w:b w:val="false"/>
-          <w:bCs w:val="false"/>
-          <w:sz w:val="24"/>
-          <w:szCs w:val="24"/>
-        </w:rPr>
-        <w:t xml:space="preserve">statistical approach and the neural networks approach </w:t>
-      </w:r>
-      <w:r>
-        <w:rPr>
-          <w:b w:val="false"/>
-          <w:bCs w:val="false"/>
-          <w:sz w:val="24"/>
-          <w:szCs w:val="24"/>
-        </w:rPr>
-        <w:t>as some of the solutions that could be used for facial recognition</w:t>
-      </w:r>
-      <w:r>
-        <w:rPr>
-          <w:b w:val="false"/>
-          <w:bCs w:val="false"/>
-          <w:sz w:val="24"/>
-          <w:szCs w:val="24"/>
-        </w:rPr>
-        <w:t>. In a different paper, Bose and Bandyopadhyay (2020) mentions four methods use for facial recognition. These methods include feature-based methods, template-based methods, appearance-based methods, and knowledge-based methods. Even though the authors mention four methods that could be used for facial recognition, the authors used the template based method in their research citing that template matching is the best available solution for face detection.</w:t>
+        <w:t xml:space="preserve"> face detection.</w:t>
       </w:r>
     </w:p>
     <w:p>
@@ -3366,15 +3271,15 @@
           <w:szCs w:val="24"/>
         </w:rPr>
         <w:tab/>
-        <w:t xml:space="preserve">Critical to the debate is the truth that the researcher will only discuss the geometric approach, the template matching approach, and the model based approach because the latter methods have enough publications that warrant a debate on the subject. For instance, Brunelli and Poggio (2013) discuss facial recognition based on geometric features, </w:t>
-      </w:r>
-      <w:r>
-        <w:rPr>
-          <w:b w:val="false"/>
-          <w:bCs w:val="false"/>
-          <w:sz w:val="24"/>
-          <w:szCs w:val="24"/>
-          <w:shd w:fill="FFFF00" w:val="clear"/>
+        <w:t xml:space="preserve">Critical to the debate is the truth that the researcher will only discuss the geometric approach, the template matching approach, and the model based approach because the latter methods have enough publications that warrant a debate on the subject. For instance, Brunelli and Poggio (2013) discuss facial recognition based on geometric features. </w:t>
+      </w:r>
+      <w:r>
+        <w:rPr>
+          <w:b w:val="false"/>
+          <w:bCs w:val="false"/>
+          <w:sz w:val="24"/>
+          <w:szCs w:val="24"/>
+          <w:shd w:fill="auto" w:val="clear"/>
         </w:rPr>
         <w:t>Lu and Yan (2021)</w:t>
       </w:r>
@@ -3385,7 +3290,25 @@
           <w:sz w:val="24"/>
           <w:szCs w:val="24"/>
         </w:rPr>
-        <w:t xml:space="preserve"> discuss facial recognition based on template matching, while Ge et al., (2021) discuss model based facial recognition using an improved generative confrontational network.</w:t>
+        <w:t xml:space="preserve"> </w:t>
+      </w:r>
+      <w:r>
+        <w:rPr>
+          <w:b w:val="false"/>
+          <w:bCs w:val="false"/>
+          <w:sz w:val="24"/>
+          <w:szCs w:val="24"/>
+        </w:rPr>
+        <w:t xml:space="preserve">also </w:t>
+      </w:r>
+      <w:r>
+        <w:rPr>
+          <w:b w:val="false"/>
+          <w:bCs w:val="false"/>
+          <w:sz w:val="24"/>
+          <w:szCs w:val="24"/>
+        </w:rPr>
+        <w:t xml:space="preserve">discuss facial recognition based on template matching, while Ge et al., (2021) discuss model based facial recognition using an improved generative confrontational network. </w:t>
       </w:r>
     </w:p>
     <w:p>
@@ -3409,7 +3332,34 @@
           <w:sz w:val="28"/>
           <w:szCs w:val="28"/>
         </w:rPr>
-        <w:t>2.4.1 Geometric Approach</w:t>
+        <w:t xml:space="preserve">2.4.1 </w:t>
+      </w:r>
+      <w:r>
+        <w:rPr>
+          <w:b/>
+          <w:bCs/>
+          <w:sz w:val="28"/>
+          <w:szCs w:val="28"/>
+        </w:rPr>
+        <w:t xml:space="preserve">The </w:t>
+      </w:r>
+      <w:r>
+        <w:rPr>
+          <w:b/>
+          <w:bCs/>
+          <w:sz w:val="28"/>
+          <w:szCs w:val="28"/>
+        </w:rPr>
+        <w:t xml:space="preserve">Geometric Approach </w:t>
+      </w:r>
+      <w:r>
+        <w:rPr>
+          <w:b/>
+          <w:bCs/>
+          <w:sz w:val="28"/>
+          <w:szCs w:val="28"/>
+        </w:rPr>
+        <w:t>of Facial Recognition</w:t>
       </w:r>
     </w:p>
     <w:p>
@@ -3448,38 +3398,81 @@
           <w:sz w:val="24"/>
           <w:szCs w:val="24"/>
         </w:rPr>
-        <w:t xml:space="preserve">). Simply put, the geometric approach transforms an image into geometric primitives like curves and points. This is done by identifying distinctive features like the eye, the nose, the chin, and the mouth before measuring their relative positions, widths and other parameters of the distinctive features. </w:t>
-      </w:r>
-      <w:r>
-        <w:rPr>
-          <w:b w:val="false"/>
-          <w:bCs w:val="false"/>
-          <w:sz w:val="24"/>
-          <w:szCs w:val="24"/>
-        </w:rPr>
-        <w:t>H</w:t>
-      </w:r>
-      <w:r>
-        <w:rPr>
-          <w:b w:val="false"/>
-          <w:bCs w:val="false"/>
-          <w:i w:val="false"/>
-          <w:iCs w:val="false"/>
-          <w:sz w:val="24"/>
-          <w:szCs w:val="24"/>
-        </w:rPr>
-        <w:t xml:space="preserve">idayat, </w:t>
-      </w:r>
-      <w:r>
-        <w:rPr>
-          <w:b w:val="false"/>
-          <w:bCs w:val="false"/>
-          <w:i w:val="false"/>
-          <w:iCs w:val="false"/>
-          <w:sz w:val="24"/>
-          <w:szCs w:val="24"/>
-        </w:rPr>
-        <w:t>et al., (</w:t>
+        <w:t>). Simply put, the geometric approach transforms an image into geometric primitives like curves and points. This is done by identifying distinctive features like the eye, the nose, the chin, and the mouth before measuring their relative positions, widths and other parameters of the distinctive features. H</w:t>
+      </w:r>
+      <w:r>
+        <w:rPr>
+          <w:b w:val="false"/>
+          <w:bCs w:val="false"/>
+          <w:i w:val="false"/>
+          <w:iCs w:val="false"/>
+          <w:sz w:val="24"/>
+          <w:szCs w:val="24"/>
+        </w:rPr>
+        <w:t>idayat, et al., (2021</w:t>
+      </w:r>
+      <w:r>
+        <w:rPr>
+          <w:b w:val="false"/>
+          <w:bCs w:val="false"/>
+          <w:sz w:val="24"/>
+          <w:szCs w:val="24"/>
+        </w:rPr>
+        <w:t xml:space="preserve">). </w:t>
+      </w:r>
+      <w:r>
+        <w:rPr>
+          <w:b w:val="false"/>
+          <w:bCs w:val="false"/>
+          <w:i w:val="false"/>
+          <w:iCs w:val="false"/>
+          <w:sz w:val="24"/>
+          <w:szCs w:val="24"/>
+        </w:rPr>
+        <w:t>further assert that the geometric approach of facial recognition is known to have a lighter computational load than other methods because it does not require features from the entire face. Brunelli and Poggio (2013) emphasize that the geometric method of facial recognition has a lighter computational load by arguing that the method in question can recognize faces even when the details of individual features such as the nose, eyes, and mouth are no longer resolved.</w:t>
+      </w:r>
+    </w:p>
+    <w:p>
+      <w:pPr>
+        <w:pStyle w:val="Normal"/>
+        <w:bidi w:val="0"/>
+        <w:spacing w:lineRule="auto" w:line="480"/>
+        <w:jc w:val="left"/>
+        <w:rPr/>
+      </w:pPr>
+      <w:r>
+        <w:rPr>
+          <w:b w:val="false"/>
+          <w:bCs w:val="false"/>
+          <w:i w:val="false"/>
+          <w:iCs w:val="false"/>
+          <w:sz w:val="24"/>
+          <w:szCs w:val="24"/>
+        </w:rPr>
+        <w:tab/>
+        <w:t xml:space="preserve">It is critical that several authors have applied the geometric approach of facial recognition in their studies. For example, Ghimire and Lee (2016) used the approach in question to predict emotions on a sequence of images that were extracted from videos. Specifically, Ghimire and Lee (2016) ran a multi-class AdaBoost algorithm and a support vector machines algorithm on  the Cohn-Kanade (CK+) facial expression database and obtained an accuracy of 95.17% and 97.35% respectively. </w:t>
+      </w:r>
+      <w:r>
+        <w:rPr>
+          <w:b w:val="false"/>
+          <w:bCs w:val="false"/>
+          <w:i w:val="false"/>
+          <w:iCs w:val="false"/>
+          <w:sz w:val="24"/>
+          <w:szCs w:val="24"/>
+        </w:rPr>
+        <w:t xml:space="preserve">Another example of a study that used the geometric technique of facial recognition is one by  Ayo et al., </w:t>
+      </w:r>
+      <w:r>
+        <w:rPr>
+          <w:b w:val="false"/>
+          <w:bCs w:val="false"/>
+          <w:i w:val="false"/>
+          <w:iCs w:val="false"/>
+          <w:sz w:val="24"/>
+          <w:szCs w:val="24"/>
+        </w:rPr>
+        <w:t>(</w:t>
       </w:r>
       <w:r>
         <w:rPr>
@@ -3496,96 +3489,199 @@
         <w:rPr>
           <w:b w:val="false"/>
           <w:bCs w:val="false"/>
-          <w:sz w:val="24"/>
-          <w:szCs w:val="24"/>
-        </w:rPr>
-        <w:t xml:space="preserve">). </w:t>
-      </w:r>
-      <w:r>
-        <w:rPr>
-          <w:b w:val="false"/>
-          <w:bCs w:val="false"/>
-          <w:i w:val="false"/>
-          <w:iCs w:val="false"/>
-          <w:sz w:val="24"/>
-          <w:szCs w:val="24"/>
-        </w:rPr>
-        <w:t>further assert that the geometric approach of facial recognition is known to have a lighter computational load than other methods because it does not require features from the entire face. Brunelli and Poggio (2013) emphasize that the geometric method of facial recognition has a lighter computational load by arguing that the method in question can recognize faces even when the details of individual features such as the nose, eyes, and mouth are no longer resolved.</w:t>
-      </w:r>
-    </w:p>
-    <w:p>
-      <w:pPr>
-        <w:pStyle w:val="Normal"/>
-        <w:bidi w:val="0"/>
-        <w:spacing w:lineRule="auto" w:line="480"/>
-        <w:jc w:val="left"/>
-        <w:rPr/>
-      </w:pPr>
-      <w:r>
-        <w:rPr>
-          <w:b w:val="false"/>
-          <w:bCs w:val="false"/>
-          <w:i w:val="false"/>
-          <w:iCs w:val="false"/>
-          <w:sz w:val="24"/>
-          <w:szCs w:val="24"/>
-        </w:rPr>
-        <w:tab/>
-      </w:r>
-      <w:r>
-        <w:rPr>
-          <w:b w:val="false"/>
-          <w:bCs w:val="false"/>
-          <w:i w:val="false"/>
-          <w:iCs w:val="false"/>
-          <w:sz w:val="24"/>
-          <w:szCs w:val="24"/>
-        </w:rPr>
-        <w:t xml:space="preserve">It is critical that several authors have applied the geometric approach of facial recognition in their studies. For example, </w:t>
-      </w:r>
-      <w:r>
-        <w:rPr>
-          <w:b w:val="false"/>
-          <w:bCs w:val="false"/>
-          <w:i w:val="false"/>
-          <w:iCs w:val="false"/>
-          <w:sz w:val="24"/>
-          <w:szCs w:val="24"/>
-        </w:rPr>
-        <w:t xml:space="preserve">Ghimire and Lee (2016) used the approach in question to predict emotions on a sequence of images that were extracted from videos. </w:t>
-      </w:r>
-      <w:r>
-        <w:rPr>
-          <w:b w:val="false"/>
-          <w:bCs w:val="false"/>
-          <w:i w:val="false"/>
-          <w:iCs w:val="false"/>
-          <w:sz w:val="24"/>
-          <w:szCs w:val="24"/>
-        </w:rPr>
-        <w:t xml:space="preserve">Specifically, </w:t>
-      </w:r>
-      <w:r>
-        <w:rPr>
-          <w:b w:val="false"/>
-          <w:bCs w:val="false"/>
-          <w:i w:val="false"/>
-          <w:iCs w:val="false"/>
-          <w:sz w:val="24"/>
-          <w:szCs w:val="24"/>
-        </w:rPr>
-        <w:t xml:space="preserve">Ghimire and Lee (2016) </w:t>
-      </w:r>
-      <w:r>
-        <w:rPr>
-          <w:b w:val="false"/>
-          <w:bCs w:val="false"/>
-          <w:i w:val="false"/>
-          <w:iCs w:val="false"/>
-          <w:sz w:val="24"/>
-          <w:szCs w:val="24"/>
-        </w:rPr>
-        <w:t xml:space="preserve">ran a multi-class AdaBoost algorithm and a support vector machines algorithm on  the Cohn-Kanade (CK+) facial expression database and obtained an accuracy of 95.17% and 97.35% respectively. </w:t>
+          <w:i w:val="false"/>
+          <w:iCs w:val="false"/>
+          <w:sz w:val="24"/>
+          <w:szCs w:val="24"/>
+        </w:rPr>
+        <w:t>)</w:t>
+      </w:r>
+      <w:r>
+        <w:rPr>
+          <w:b w:val="false"/>
+          <w:bCs w:val="false"/>
+          <w:i w:val="false"/>
+          <w:iCs w:val="false"/>
+          <w:sz w:val="24"/>
+          <w:szCs w:val="24"/>
+        </w:rPr>
+        <w:t xml:space="preserve">. This owes to the reality that the authors in question used the geometric approach of facial recognition together with the  you-only-look-once (YOLO) algorithm </w:t>
+      </w:r>
+      <w:r>
+        <w:rPr>
+          <w:b w:val="false"/>
+          <w:bCs w:val="false"/>
+          <w:i w:val="false"/>
+          <w:iCs w:val="false"/>
+          <w:sz w:val="24"/>
+          <w:szCs w:val="24"/>
+        </w:rPr>
+        <w:t xml:space="preserve">to predict age, gender and emotions. In their study, the authors were able to predict </w:t>
+      </w:r>
+      <w:r>
+        <w:rPr>
+          <w:b w:val="false"/>
+          <w:bCs w:val="false"/>
+          <w:i w:val="false"/>
+          <w:iCs w:val="false"/>
+          <w:sz w:val="24"/>
+          <w:szCs w:val="24"/>
+        </w:rPr>
+        <w:t xml:space="preserve"> </w:t>
+      </w:r>
+      <w:r>
+        <w:rPr>
+          <w:b w:val="false"/>
+          <w:bCs w:val="false"/>
+          <w:i w:val="false"/>
+          <w:iCs w:val="false"/>
+          <w:sz w:val="24"/>
+          <w:szCs w:val="24"/>
+        </w:rPr>
+        <w:t xml:space="preserve">gender and emotions with an 80% accuracy. Regardless, </w:t>
+      </w:r>
+      <w:r>
+        <w:rPr>
+          <w:b w:val="false"/>
+          <w:bCs w:val="false"/>
+          <w:i w:val="false"/>
+          <w:iCs w:val="false"/>
+          <w:sz w:val="24"/>
+          <w:szCs w:val="24"/>
+        </w:rPr>
+        <w:t xml:space="preserve">Ayo et al., </w:t>
+      </w:r>
+      <w:r>
+        <w:rPr>
+          <w:b w:val="false"/>
+          <w:bCs w:val="false"/>
+          <w:i w:val="false"/>
+          <w:iCs w:val="false"/>
+          <w:sz w:val="24"/>
+          <w:szCs w:val="24"/>
+        </w:rPr>
+        <w:t>(</w:t>
+      </w:r>
+      <w:r>
+        <w:rPr>
+          <w:b w:val="false"/>
+          <w:bCs w:val="false"/>
+          <w:i w:val="false"/>
+          <w:iCs w:val="false"/>
+          <w:sz w:val="24"/>
+          <w:szCs w:val="24"/>
+        </w:rPr>
+        <w:t>2021</w:t>
+      </w:r>
+      <w:r>
+        <w:rPr>
+          <w:b w:val="false"/>
+          <w:bCs w:val="false"/>
+          <w:i w:val="false"/>
+          <w:iCs w:val="false"/>
+          <w:sz w:val="24"/>
+          <w:szCs w:val="24"/>
+        </w:rPr>
+        <w:t>) were not able to predict age accurately and mentioned that accurate age prediction was hampered by the lighting conditions of an image.</w:t>
+      </w:r>
+    </w:p>
+    <w:p>
+      <w:pPr>
+        <w:pStyle w:val="Normal"/>
+        <w:bidi w:val="0"/>
+        <w:spacing w:lineRule="auto" w:line="480"/>
+        <w:jc w:val="left"/>
+        <w:rPr>
+          <w:b/>
+          <w:b/>
+          <w:bCs/>
+          <w:sz w:val="28"/>
+          <w:szCs w:val="28"/>
+        </w:rPr>
+      </w:pPr>
+      <w:r>
+        <w:rPr>
+          <w:b/>
+          <w:bCs/>
+          <w:i w:val="false"/>
+          <w:iCs w:val="false"/>
+          <w:sz w:val="28"/>
+          <w:szCs w:val="28"/>
+        </w:rPr>
+        <w:t>2.4.</w:t>
+      </w:r>
+      <w:r>
+        <w:rPr>
+          <w:b/>
+          <w:bCs/>
+          <w:i w:val="false"/>
+          <w:iCs w:val="false"/>
+          <w:sz w:val="28"/>
+          <w:szCs w:val="28"/>
+        </w:rPr>
+        <w:t>2</w:t>
+      </w:r>
+      <w:r>
+        <w:rPr>
+          <w:b/>
+          <w:bCs/>
+          <w:i w:val="false"/>
+          <w:iCs w:val="false"/>
+          <w:sz w:val="28"/>
+          <w:szCs w:val="28"/>
+        </w:rPr>
+        <w:t xml:space="preserve"> </w:t>
+      </w:r>
+      <w:r>
+        <w:rPr>
+          <w:b/>
+          <w:bCs/>
+          <w:i w:val="false"/>
+          <w:iCs w:val="false"/>
+          <w:sz w:val="28"/>
+          <w:szCs w:val="28"/>
+        </w:rPr>
+        <w:t>The Template Based Approach</w:t>
+      </w:r>
+      <w:r>
+        <w:rPr>
+          <w:b/>
+          <w:bCs/>
+          <w:i w:val="false"/>
+          <w:iCs w:val="false"/>
+          <w:sz w:val="28"/>
+          <w:szCs w:val="28"/>
+        </w:rPr>
+        <w:t xml:space="preserve"> </w:t>
+      </w:r>
+      <w:r>
+        <w:rPr>
+          <w:b/>
+          <w:bCs/>
+          <w:i w:val="false"/>
+          <w:iCs w:val="false"/>
+          <w:sz w:val="28"/>
+          <w:szCs w:val="28"/>
+        </w:rPr>
+        <w:t>of Facial Recognition</w:t>
+      </w:r>
+    </w:p>
+    <w:p>
+      <w:pPr>
+        <w:pStyle w:val="Normal"/>
+        <w:bidi w:val="0"/>
+        <w:spacing w:lineRule="auto" w:line="480"/>
+        <w:jc w:val="left"/>
+        <w:rPr>
+          <w:sz w:val="24"/>
+          <w:szCs w:val="24"/>
+        </w:rPr>
+      </w:pPr>
+      <w:r>
+        <w:rPr>
+          <w:sz w:val="24"/>
+          <w:szCs w:val="24"/>
+        </w:rPr>
       </w:r>
       <w:r>
         <w:br w:type="page"/>
@@ -3613,6 +3709,138 @@
           <w:szCs w:val="32"/>
         </w:rPr>
         <w:t>References</w:t>
+      </w:r>
+    </w:p>
+    <w:p>
+      <w:pPr>
+        <w:pStyle w:val="Normal"/>
+        <w:bidi w:val="0"/>
+        <w:spacing w:lineRule="auto" w:line="480"/>
+        <w:jc w:val="left"/>
+        <w:rPr>
+          <w:b w:val="false"/>
+          <w:b w:val="false"/>
+          <w:bCs w:val="false"/>
+          <w:sz w:val="24"/>
+          <w:szCs w:val="24"/>
+        </w:rPr>
+      </w:pPr>
+      <w:r>
+        <w:rPr>
+          <w:b w:val="false"/>
+          <w:bCs w:val="false"/>
+          <w:sz w:val="24"/>
+          <w:szCs w:val="24"/>
+        </w:rPr>
+        <w:t xml:space="preserve">Ayo, F. M., Mustapha, M. A., Braimah, A. J., and Aina, A. D. (2021). Geometric Analysis and </w:t>
+      </w:r>
+    </w:p>
+    <w:p>
+      <w:pPr>
+        <w:pStyle w:val="Normal"/>
+        <w:bidi w:val="0"/>
+        <w:spacing w:lineRule="auto" w:line="480"/>
+        <w:jc w:val="left"/>
+        <w:rPr>
+          <w:b w:val="false"/>
+          <w:b w:val="false"/>
+          <w:bCs w:val="false"/>
+          <w:sz w:val="24"/>
+          <w:szCs w:val="24"/>
+        </w:rPr>
+      </w:pPr>
+      <w:r>
+        <w:rPr>
+          <w:b w:val="false"/>
+          <w:bCs w:val="false"/>
+          <w:sz w:val="24"/>
+          <w:szCs w:val="24"/>
+        </w:rPr>
+        <w:tab/>
+        <w:t xml:space="preserve">YOLO Algorithm for Automatic Face Detection System in a Security Setting. </w:t>
+      </w:r>
+      <w:r>
+        <w:rPr>
+          <w:b w:val="false"/>
+          <w:bCs w:val="false"/>
+          <w:i/>
+          <w:iCs/>
+          <w:sz w:val="24"/>
+          <w:szCs w:val="24"/>
+        </w:rPr>
+        <w:t xml:space="preserve">Journal of </w:t>
+        <w:tab/>
+        <w:t xml:space="preserve">Physics, </w:t>
+      </w:r>
+      <w:r>
+        <w:rPr>
+          <w:b w:val="false"/>
+          <w:bCs w:val="false"/>
+          <w:i w:val="false"/>
+          <w:iCs w:val="false"/>
+          <w:sz w:val="24"/>
+          <w:szCs w:val="24"/>
+        </w:rPr>
+        <w:t xml:space="preserve">2199 (2022), </w:t>
+      </w:r>
+      <w:r>
+        <w:rPr>
+          <w:b w:val="false"/>
+          <w:bCs w:val="false"/>
+          <w:i w:val="false"/>
+          <w:iCs w:val="false"/>
+          <w:sz w:val="24"/>
+          <w:szCs w:val="24"/>
+        </w:rPr>
+        <w:t xml:space="preserve">1-10. </w:t>
+      </w:r>
+      <w:r>
+        <w:rPr>
+          <w:rFonts w:ascii="Liberation Serif" w:hAnsi="Liberation Serif"/>
+          <w:b w:val="false"/>
+          <w:bCs w:val="false"/>
+          <w:i w:val="false"/>
+          <w:iCs w:val="false"/>
+          <w:sz w:val="24"/>
+          <w:szCs w:val="24"/>
+        </w:rPr>
+        <w:t>https</w:t>
+      </w:r>
+      <w:r>
+        <w:rPr>
+          <w:rFonts w:ascii="sans-serif" w:hAnsi="sans-serif"/>
+          <w:b w:val="false"/>
+          <w:bCs w:val="false"/>
+          <w:i w:val="false"/>
+          <w:iCs w:val="false"/>
+          <w:sz w:val="24"/>
+          <w:szCs w:val="24"/>
+        </w:rPr>
+        <w:t>://</w:t>
+      </w:r>
+      <w:r>
+        <w:rPr>
+          <w:rFonts w:ascii="Liberation Serif" w:hAnsi="Liberation Serif"/>
+          <w:b w:val="false"/>
+          <w:bCs w:val="false"/>
+          <w:i w:val="false"/>
+          <w:iCs w:val="false"/>
+          <w:sz w:val="24"/>
+          <w:szCs w:val="24"/>
+        </w:rPr>
+        <w:t xml:space="preserve">doi:10.1088/1742-6596/2199/1/012010 </w:t>
+      </w:r>
+      <w:r>
+        <w:rPr>
+          <w:rFonts w:ascii="sans-serif" w:hAnsi="sans-serif"/>
+          <w:b w:val="false"/>
+          <w:bCs w:val="false"/>
+          <w:i w:val="false"/>
+          <w:iCs w:val="false"/>
+          <w:sz w:val="24"/>
+          <w:szCs w:val="24"/>
+        </w:rPr>
+        <w:t xml:space="preserve"> </w:t>
       </w:r>
     </w:p>
     <w:p>
@@ -4004,61 +4232,7 @@
           <w:sz w:val="24"/>
           <w:szCs w:val="24"/>
         </w:rPr>
-        <w:t>Ghimire</w:t>
-      </w:r>
-      <w:r>
-        <w:rPr>
-          <w:b w:val="false"/>
-          <w:bCs w:val="false"/>
-          <w:sz w:val="24"/>
-          <w:szCs w:val="24"/>
-        </w:rPr>
-        <w:t xml:space="preserve">, </w:t>
-      </w:r>
-      <w:r>
-        <w:rPr>
-          <w:b w:val="false"/>
-          <w:bCs w:val="false"/>
-          <w:sz w:val="24"/>
-          <w:szCs w:val="24"/>
-        </w:rPr>
-        <w:t>D</w:t>
-      </w:r>
-      <w:r>
-        <w:rPr>
-          <w:b w:val="false"/>
-          <w:bCs w:val="false"/>
-          <w:sz w:val="24"/>
-          <w:szCs w:val="24"/>
-        </w:rPr>
-        <w:t>., and L</w:t>
-      </w:r>
-      <w:r>
-        <w:rPr>
-          <w:b w:val="false"/>
-          <w:bCs w:val="false"/>
-          <w:sz w:val="24"/>
-          <w:szCs w:val="24"/>
-        </w:rPr>
-        <w:t>ee, J</w:t>
-      </w:r>
-      <w:r>
-        <w:rPr>
-          <w:b w:val="false"/>
-          <w:bCs w:val="false"/>
-          <w:sz w:val="24"/>
-          <w:szCs w:val="24"/>
-        </w:rPr>
-        <w:t xml:space="preserve">. </w:t>
-      </w:r>
-      <w:r>
-        <w:rPr>
-          <w:b w:val="false"/>
-          <w:bCs w:val="false"/>
-          <w:sz w:val="24"/>
-          <w:szCs w:val="24"/>
-        </w:rPr>
-        <w:t>(2016).  Geometric Feature-Based Facial Expression Recognition in</w:t>
+        <w:t>Ghimire, D., and Lee, J. (2016).  Geometric Feature-Based Facial Expression Recognition in</w:t>
       </w:r>
     </w:p>
     <w:p>
@@ -4272,6 +4446,100 @@
           <w:szCs w:val="24"/>
         </w:rPr>
         <w:t xml:space="preserve">. https://doi.org/10.5281/zenodo.4050457 </w:t>
+      </w:r>
+    </w:p>
+    <w:p>
+      <w:pPr>
+        <w:pStyle w:val="Normal"/>
+        <w:bidi w:val="0"/>
+        <w:spacing w:lineRule="auto" w:line="480"/>
+        <w:jc w:val="left"/>
+        <w:rPr>
+          <w:b w:val="false"/>
+          <w:b w:val="false"/>
+          <w:bCs w:val="false"/>
+          <w:sz w:val="24"/>
+          <w:szCs w:val="24"/>
+        </w:rPr>
+      </w:pPr>
+      <w:r>
+        <w:rPr>
+          <w:b w:val="false"/>
+          <w:bCs w:val="false"/>
+          <w:sz w:val="24"/>
+          <w:szCs w:val="24"/>
+        </w:rPr>
+        <w:t xml:space="preserve">Lu, D., and Yan, L. (2021). </w:t>
+      </w:r>
+      <w:r>
+        <w:rPr>
+          <w:b w:val="false"/>
+          <w:bCs w:val="false"/>
+          <w:sz w:val="24"/>
+          <w:szCs w:val="24"/>
+        </w:rPr>
+        <w:t xml:space="preserve">Face Detection and Recognition Algorithm in Digital Image Based on </w:t>
+      </w:r>
+    </w:p>
+    <w:p>
+      <w:pPr>
+        <w:pStyle w:val="Normal"/>
+        <w:bidi w:val="0"/>
+        <w:spacing w:lineRule="auto" w:line="480"/>
+        <w:jc w:val="left"/>
+        <w:rPr>
+          <w:b w:val="false"/>
+          <w:b w:val="false"/>
+          <w:bCs w:val="false"/>
+          <w:sz w:val="24"/>
+          <w:szCs w:val="24"/>
+        </w:rPr>
+      </w:pPr>
+      <w:r>
+        <w:rPr>
+          <w:b w:val="false"/>
+          <w:bCs w:val="false"/>
+          <w:sz w:val="24"/>
+          <w:szCs w:val="24"/>
+        </w:rPr>
+        <w:tab/>
+        <w:t xml:space="preserve">Computer Vision Sensor. </w:t>
+      </w:r>
+      <w:r>
+        <w:rPr>
+          <w:b w:val="false"/>
+          <w:bCs w:val="false"/>
+          <w:i/>
+          <w:iCs/>
+          <w:sz w:val="24"/>
+          <w:szCs w:val="24"/>
+        </w:rPr>
+        <w:t xml:space="preserve">Journal of Sensors, </w:t>
+      </w:r>
+      <w:r>
+        <w:rPr>
+          <w:b w:val="false"/>
+          <w:bCs w:val="false"/>
+          <w:i w:val="false"/>
+          <w:iCs w:val="false"/>
+          <w:sz w:val="24"/>
+          <w:szCs w:val="24"/>
+        </w:rPr>
+        <w:t>2021</w:t>
+      </w:r>
+      <w:r>
+        <w:rPr>
+          <w:rFonts w:ascii="Liberation Serif" w:hAnsi="Liberation Serif"/>
+          <w:b w:val="false"/>
+          <w:bCs w:val="false"/>
+          <w:i w:val="false"/>
+          <w:iCs w:val="false"/>
+          <w:sz w:val="24"/>
+          <w:szCs w:val="24"/>
+        </w:rPr>
+        <w:t xml:space="preserve">(4796768), 1-16. </w:t>
+        <w:tab/>
+        <w:t>https://doi.org/10.1155/2021/4796768</w:t>
       </w:r>
     </w:p>
     <w:p>
@@ -4546,6 +4814,77 @@
           <w:iCs w:val="false"/>
         </w:rPr>
         <w:t>10.1007/s41019-016-0022-0</w:t>
+      </w:r>
+    </w:p>
+    <w:p>
+      <w:pPr>
+        <w:pStyle w:val="Normal"/>
+        <w:bidi w:val="0"/>
+        <w:spacing w:lineRule="auto" w:line="480"/>
+        <w:jc w:val="left"/>
+        <w:rPr>
+          <w:b w:val="false"/>
+          <w:b w:val="false"/>
+          <w:bCs w:val="false"/>
+          <w:sz w:val="24"/>
+          <w:szCs w:val="24"/>
+        </w:rPr>
+      </w:pPr>
+      <w:r>
+        <w:rPr>
+          <w:b w:val="false"/>
+          <w:bCs w:val="false"/>
+          <w:sz w:val="24"/>
+          <w:szCs w:val="24"/>
+        </w:rPr>
+        <w:t xml:space="preserve">Shahin, R. O., Ayedi, R., Rayan, A., Rasha, M., and Ahmed, A. (2021). Human Face Recognition </w:t>
+      </w:r>
+    </w:p>
+    <w:p>
+      <w:pPr>
+        <w:pStyle w:val="Normal"/>
+        <w:bidi w:val="0"/>
+        <w:spacing w:lineRule="auto" w:line="480"/>
+        <w:jc w:val="left"/>
+        <w:rPr>
+          <w:b w:val="false"/>
+          <w:b w:val="false"/>
+          <w:bCs w:val="false"/>
+          <w:sz w:val="24"/>
+          <w:szCs w:val="24"/>
+        </w:rPr>
+      </w:pPr>
+      <w:r>
+        <w:rPr>
+          <w:b w:val="false"/>
+          <w:bCs w:val="false"/>
+          <w:sz w:val="24"/>
+          <w:szCs w:val="24"/>
+        </w:rPr>
+        <w:tab/>
+        <w:t xml:space="preserve">from Part of a Facial Image based in Image Stitching. </w:t>
+      </w:r>
+      <w:r>
+        <w:rPr>
+          <w:b w:val="false"/>
+          <w:bCs w:val="false"/>
+          <w:i/>
+          <w:iCs/>
+          <w:sz w:val="24"/>
+          <w:szCs w:val="24"/>
+        </w:rPr>
+        <w:t xml:space="preserve">International Journal of Advanced </w:t>
+        <w:tab/>
+        <w:t>Computer Science and Applications</w:t>
+      </w:r>
+      <w:r>
+        <w:rPr>
+          <w:b w:val="false"/>
+          <w:bCs w:val="false"/>
+          <w:sz w:val="24"/>
+          <w:szCs w:val="24"/>
+        </w:rPr>
+        <w:t>, 12(12) 256-463</w:t>
       </w:r>
     </w:p>
     <w:p>
@@ -4999,7 +5338,7 @@
     <w:pPr>
       <w:widowControl/>
       <w:suppressAutoHyphens w:val="true"/>
-      <w:overflowPunct w:val="true"/>
+      <w:overflowPunct w:val="false"/>
       <w:bidi w:val="0"/>
       <w:spacing w:before="0" w:after="0"/>
       <w:jc w:val="left"/>

</xml_diff>

<commit_message>
Add first paragraph in the problem statement
</commit_message>
<xml_diff>
--- a/SikoliaThesis.docx
+++ b/SikoliaThesis.docx
@@ -2289,7 +2289,94 @@
       </w:r>
       <w:r>
         <w:rPr/>
-        <w:t xml:space="preserve">As already mentioned, deep learning has enabled researchers to develop facial recognition systems. However, most of the developed solutions were created in European countries implying facial recognition based on African faces are yet to be developed. In addition, Najibi (2020) reveals that the existing technologies are subject to racial bias especially against Black Americans. This indicates that the current facial recognition systems will not work well for Africans. Imperative to the debate is the truth that some of the existing facial recognition systems use one hundred and twenty eight variables for facial recognition. According to </w:t>
+        <w:t xml:space="preserve">As already mentioned, deep learning has enabled researchers to develop facial recognition systems. </w:t>
+      </w:r>
+      <w:r>
+        <w:rPr/>
+        <w:t xml:space="preserve">For example,  Goel, Mehmood, Ugail </w:t>
+      </w:r>
+      <w:r>
+        <w:rPr/>
+        <w:t>(2021)</w:t>
+      </w:r>
+      <w:r>
+        <w:rPr/>
+        <w:t xml:space="preserve"> </w:t>
+      </w:r>
+      <w:r>
+        <w:rPr/>
+        <w:t xml:space="preserve">mention solutions such as FaceNet, VGGFACE, VGG16 and VGG19 that are used for facial recognition. </w:t>
+      </w:r>
+      <w:r>
+        <w:rPr/>
+        <w:t xml:space="preserve">In a different paper, Chandra and Reddy (2020) discuss FaceNet, OpenFace, and DeepFace as solutions that could be used for facial recognition. Critical to the discussion is the fact that the mentioned solutions are just but a fraction of solutions that could be used for facial recognition. This is because </w:t>
+      </w:r>
+      <w:r>
+        <w:rPr/>
+        <w:t xml:space="preserve">there at least thirty papers that have been published each with a different solution for facial recognition. </w:t>
+      </w:r>
+      <w:r>
+        <w:rPr/>
+        <w:t>It is imperative to mention that all the publications have been tested on databases that collect images from the west. For instance, the FaceNet algorithm was developed from the Labeled Faces in the Wild dataset which mostly comprises of faces from the West. In short, most of the existing solutions that have been developed forget to take into account that facial recognition software should also be tested on African faces.</w:t>
+      </w:r>
+    </w:p>
+    <w:p>
+      <w:pPr>
+        <w:pStyle w:val="Normal"/>
+        <w:bidi w:val="0"/>
+        <w:spacing w:lineRule="auto" w:line="480"/>
+        <w:jc w:val="left"/>
+        <w:rPr/>
+      </w:pPr>
+      <w:r>
+        <w:rPr/>
+        <w:tab/>
+      </w:r>
+    </w:p>
+    <w:p>
+      <w:pPr>
+        <w:pStyle w:val="Normal"/>
+        <w:bidi w:val="0"/>
+        <w:spacing w:lineRule="auto" w:line="480"/>
+        <w:jc w:val="left"/>
+        <w:rPr>
+          <w:rFonts w:ascii="sans-serif" w:hAnsi="sans-serif"/>
+          <w:sz w:val="21"/>
+        </w:rPr>
+      </w:pPr>
+      <w:r>
+        <w:rPr/>
+      </w:r>
+    </w:p>
+    <w:p>
+      <w:pPr>
+        <w:pStyle w:val="Normal"/>
+        <w:bidi w:val="0"/>
+        <w:spacing w:lineRule="auto" w:line="480"/>
+        <w:jc w:val="left"/>
+        <w:rPr>
+          <w:rFonts w:ascii="sans-serif" w:hAnsi="sans-serif"/>
+          <w:sz w:val="21"/>
+        </w:rPr>
+      </w:pPr>
+      <w:r>
+        <w:rPr>
+          <w:rFonts w:ascii="sans-serif" w:hAnsi="sans-serif"/>
+          <w:sz w:val="21"/>
+        </w:rPr>
+      </w:r>
+    </w:p>
+    <w:p>
+      <w:pPr>
+        <w:pStyle w:val="Normal"/>
+        <w:bidi w:val="0"/>
+        <w:spacing w:lineRule="auto" w:line="480"/>
+        <w:jc w:val="left"/>
+        <w:rPr/>
+      </w:pPr>
+      <w:r>
+        <w:rPr/>
+        <w:t xml:space="preserve">However, most of the developed solutions were created in European countries implying facial recognition based on African faces are yet to be developed. In addition, Najibi (2020) reveals that the existing technologies are subject to racial bias especially against Black Americans. This indicates that the current facial recognition systems will not work well for Africans. Imperative to the debate is the truth that some of the existing facial recognition systems use one hundred and twenty eight variables for facial recognition. According to </w:t>
       </w:r>
       <w:r>
         <w:rPr>
@@ -2620,25 +2707,7 @@
           <w:sz w:val="24"/>
           <w:szCs w:val="24"/>
         </w:rPr>
-        <w:t xml:space="preserve"> century. The same author further mentions that the topical facial recognition systems are still racial biased. </w:t>
-      </w:r>
-      <w:r>
-        <w:rPr>
-          <w:b w:val="false"/>
-          <w:bCs w:val="false"/>
-          <w:sz w:val="24"/>
-          <w:szCs w:val="24"/>
-        </w:rPr>
-        <w:t xml:space="preserve">It is also important to note that most of the </w:t>
-      </w:r>
-      <w:r>
-        <w:rPr>
-          <w:b w:val="false"/>
-          <w:bCs w:val="false"/>
-          <w:sz w:val="24"/>
-          <w:szCs w:val="24"/>
-        </w:rPr>
-        <w:t>current facial recognition systems  were created from celebrity images but none of them dared to use images collected from Smartphones. Moreover, the current facial recognition systems were created using one hundred and twenty eight variables. It follows that this proposal will contribute to the existing knowledge by creating a facial recognition system using forty two variables, African faces, and images taken using smartphones.</w:t>
+        <w:t xml:space="preserve"> century. The same author further mentions that the topical facial recognition systems are still racial biased. It is also important to note that most of the current facial recognition systems  were created from celebrity images but none of them dared to use images collected from Smartphones. Moreover, the current facial recognition systems were created using one hundred and twenty eight variables. It follows that this proposal will contribute to the existing knowledge by creating a facial recognition system using forty two variables, African faces, and images taken using smartphones.</w:t>
       </w:r>
     </w:p>
     <w:p>
@@ -3144,115 +3213,7 @@
           <w:szCs w:val="24"/>
         </w:rPr>
         <w:tab/>
-        <w:t xml:space="preserve">A thorough review of literature on the subject of facial recognition reveals that there is an array of techniques that could be used for facial recognition. As evidenced, Fu (2021) </w:t>
-      </w:r>
-      <w:r>
-        <w:rPr>
-          <w:b w:val="false"/>
-          <w:bCs w:val="false"/>
-          <w:sz w:val="24"/>
-          <w:szCs w:val="24"/>
-        </w:rPr>
-        <w:t>mention</w:t>
-      </w:r>
-      <w:r>
-        <w:rPr>
-          <w:b w:val="false"/>
-          <w:bCs w:val="false"/>
-          <w:sz w:val="24"/>
-          <w:szCs w:val="24"/>
-        </w:rPr>
-        <w:t xml:space="preserve"> the geometric features approach, the template matching approach, and the model based facial approach </w:t>
-      </w:r>
-      <w:r>
-        <w:rPr>
-          <w:b w:val="false"/>
-          <w:bCs w:val="false"/>
-          <w:sz w:val="24"/>
-          <w:szCs w:val="24"/>
-        </w:rPr>
-        <w:t>as</w:t>
-      </w:r>
-      <w:r>
-        <w:rPr>
-          <w:b w:val="false"/>
-          <w:bCs w:val="false"/>
-          <w:sz w:val="24"/>
-          <w:szCs w:val="24"/>
-        </w:rPr>
-        <w:t xml:space="preserve"> some of the existing solutions on facial recognition. In a different study, Priya et al., (2014)  mention the template matching technique, the statistical approach and the neural networks approach as some of the </w:t>
-      </w:r>
-      <w:r>
-        <w:rPr>
-          <w:b w:val="false"/>
-          <w:bCs w:val="false"/>
-          <w:sz w:val="24"/>
-          <w:szCs w:val="24"/>
-        </w:rPr>
-        <w:t>techniques</w:t>
-      </w:r>
-      <w:r>
-        <w:rPr>
-          <w:b w:val="false"/>
-          <w:bCs w:val="false"/>
-          <w:sz w:val="24"/>
-          <w:szCs w:val="24"/>
-        </w:rPr>
-        <w:t xml:space="preserve"> that could be used for facial recognition. In a different paper, Bose and Bandyopadhyay (2020) mentions four methods use for facial recognition. These methods include feature-based methods, template-based methods, appearance-based methods, and knowledge-based methods. Even though </w:t>
-      </w:r>
-      <w:r>
-        <w:rPr>
-          <w:b w:val="false"/>
-          <w:bCs w:val="false"/>
-          <w:sz w:val="24"/>
-          <w:szCs w:val="24"/>
-        </w:rPr>
-        <w:t>B</w:t>
-      </w:r>
-      <w:r>
-        <w:rPr>
-          <w:b w:val="false"/>
-          <w:bCs w:val="false"/>
-          <w:sz w:val="24"/>
-          <w:szCs w:val="24"/>
-        </w:rPr>
-        <w:t>ose and Bandyopadhyay (2020)mention four methods that could be used for facial recognition, the</w:t>
-      </w:r>
-      <w:r>
-        <w:rPr>
-          <w:b w:val="false"/>
-          <w:bCs w:val="false"/>
-          <w:sz w:val="24"/>
-          <w:szCs w:val="24"/>
-        </w:rPr>
-        <w:t>y</w:t>
-      </w:r>
-      <w:r>
-        <w:rPr>
-          <w:b w:val="false"/>
-          <w:bCs w:val="false"/>
-          <w:sz w:val="24"/>
-          <w:szCs w:val="24"/>
-        </w:rPr>
-        <w:t xml:space="preserve"> used the template based method in their research citing that template matching is the best available solution </w:t>
-      </w:r>
-      <w:r>
-        <w:rPr>
-          <w:b w:val="false"/>
-          <w:bCs w:val="false"/>
-          <w:sz w:val="24"/>
-          <w:szCs w:val="24"/>
-        </w:rPr>
-        <w:t>on</w:t>
-      </w:r>
-      <w:r>
-        <w:rPr>
-          <w:b w:val="false"/>
-          <w:bCs w:val="false"/>
-          <w:sz w:val="24"/>
-          <w:szCs w:val="24"/>
-        </w:rPr>
-        <w:t xml:space="preserve"> face detection.</w:t>
+        <w:t>A thorough review of literature on the subject of facial recognition reveals that there is an array of techniques that could be used for facial recognition. As evidenced, Fu (2021) mention the geometric features approach, the template matching approach, and the model based facial approach as some of the existing solutions on facial recognition. In a different study, Priya et al., (2014)  mention the template matching technique, the statistical approach and the neural networks approach as some of the techniques that could be used for facial recognition. In a different paper, Bose and Bandyopadhyay (2020) mentions four methods use for facial recognition. These methods include feature-based methods, template-based methods, appearance-based methods, and knowledge-based methods. Even though Bose and Bandyopadhyay (2020)mention four methods that could be used for facial recognition, they used the template based method in their research citing that template matching is the best available solution on face detection.</w:t>
       </w:r>
     </w:p>
     <w:p>
@@ -3290,25 +3251,7 @@
           <w:sz w:val="24"/>
           <w:szCs w:val="24"/>
         </w:rPr>
-        <w:t xml:space="preserve"> </w:t>
-      </w:r>
-      <w:r>
-        <w:rPr>
-          <w:b w:val="false"/>
-          <w:bCs w:val="false"/>
-          <w:sz w:val="24"/>
-          <w:szCs w:val="24"/>
-        </w:rPr>
-        <w:t xml:space="preserve">also </w:t>
-      </w:r>
-      <w:r>
-        <w:rPr>
-          <w:b w:val="false"/>
-          <w:bCs w:val="false"/>
-          <w:sz w:val="24"/>
-          <w:szCs w:val="24"/>
-        </w:rPr>
-        <w:t xml:space="preserve">discuss facial recognition based on template matching, while Ge et al., (2021) discuss model based facial recognition using an improved generative confrontational network. </w:t>
+        <w:t xml:space="preserve"> also discuss facial recognition based on template matching, while Ge et al., (2021) discuss model based facial recognition using an improved generative confrontational network. </w:t>
       </w:r>
     </w:p>
     <w:p>
@@ -3332,34 +3275,7 @@
           <w:sz w:val="28"/>
           <w:szCs w:val="28"/>
         </w:rPr>
-        <w:t xml:space="preserve">2.4.1 </w:t>
-      </w:r>
-      <w:r>
-        <w:rPr>
-          <w:b/>
-          <w:bCs/>
-          <w:sz w:val="28"/>
-          <w:szCs w:val="28"/>
-        </w:rPr>
-        <w:t xml:space="preserve">The </w:t>
-      </w:r>
-      <w:r>
-        <w:rPr>
-          <w:b/>
-          <w:bCs/>
-          <w:sz w:val="28"/>
-          <w:szCs w:val="28"/>
-        </w:rPr>
-        <w:t xml:space="preserve">Geometric Approach </w:t>
-      </w:r>
-      <w:r>
-        <w:rPr>
-          <w:b/>
-          <w:bCs/>
-          <w:sz w:val="28"/>
-          <w:szCs w:val="28"/>
-        </w:rPr>
-        <w:t>of Facial Recognition</w:t>
+        <w:t>2.4.1 The Geometric Approach of Facial Recognition</w:t>
       </w:r>
     </w:p>
     <w:p>
@@ -3450,139 +3366,7 @@
           <w:szCs w:val="24"/>
         </w:rPr>
         <w:tab/>
-        <w:t xml:space="preserve">It is critical that several authors have applied the geometric approach of facial recognition in their studies. For example, Ghimire and Lee (2016) used the approach in question to predict emotions on a sequence of images that were extracted from videos. Specifically, Ghimire and Lee (2016) ran a multi-class AdaBoost algorithm and a support vector machines algorithm on  the Cohn-Kanade (CK+) facial expression database and obtained an accuracy of 95.17% and 97.35% respectively. </w:t>
-      </w:r>
-      <w:r>
-        <w:rPr>
-          <w:b w:val="false"/>
-          <w:bCs w:val="false"/>
-          <w:i w:val="false"/>
-          <w:iCs w:val="false"/>
-          <w:sz w:val="24"/>
-          <w:szCs w:val="24"/>
-        </w:rPr>
-        <w:t xml:space="preserve">Another example of a study that used the geometric technique of facial recognition is one by  Ayo et al., </w:t>
-      </w:r>
-      <w:r>
-        <w:rPr>
-          <w:b w:val="false"/>
-          <w:bCs w:val="false"/>
-          <w:i w:val="false"/>
-          <w:iCs w:val="false"/>
-          <w:sz w:val="24"/>
-          <w:szCs w:val="24"/>
-        </w:rPr>
-        <w:t>(</w:t>
-      </w:r>
-      <w:r>
-        <w:rPr>
-          <w:b w:val="false"/>
-          <w:bCs w:val="false"/>
-          <w:i w:val="false"/>
-          <w:iCs w:val="false"/>
-          <w:sz w:val="24"/>
-          <w:szCs w:val="24"/>
-        </w:rPr>
-        <w:t>2021</w:t>
-      </w:r>
-      <w:r>
-        <w:rPr>
-          <w:b w:val="false"/>
-          <w:bCs w:val="false"/>
-          <w:i w:val="false"/>
-          <w:iCs w:val="false"/>
-          <w:sz w:val="24"/>
-          <w:szCs w:val="24"/>
-        </w:rPr>
-        <w:t>)</w:t>
-      </w:r>
-      <w:r>
-        <w:rPr>
-          <w:b w:val="false"/>
-          <w:bCs w:val="false"/>
-          <w:i w:val="false"/>
-          <w:iCs w:val="false"/>
-          <w:sz w:val="24"/>
-          <w:szCs w:val="24"/>
-        </w:rPr>
-        <w:t xml:space="preserve">. This owes to the reality that the authors in question used the geometric approach of facial recognition together with the  you-only-look-once (YOLO) algorithm </w:t>
-      </w:r>
-      <w:r>
-        <w:rPr>
-          <w:b w:val="false"/>
-          <w:bCs w:val="false"/>
-          <w:i w:val="false"/>
-          <w:iCs w:val="false"/>
-          <w:sz w:val="24"/>
-          <w:szCs w:val="24"/>
-        </w:rPr>
-        <w:t xml:space="preserve">to predict age, gender and emotions. In their study, the authors were able to predict </w:t>
-      </w:r>
-      <w:r>
-        <w:rPr>
-          <w:b w:val="false"/>
-          <w:bCs w:val="false"/>
-          <w:i w:val="false"/>
-          <w:iCs w:val="false"/>
-          <w:sz w:val="24"/>
-          <w:szCs w:val="24"/>
-        </w:rPr>
-        <w:t xml:space="preserve"> </w:t>
-      </w:r>
-      <w:r>
-        <w:rPr>
-          <w:b w:val="false"/>
-          <w:bCs w:val="false"/>
-          <w:i w:val="false"/>
-          <w:iCs w:val="false"/>
-          <w:sz w:val="24"/>
-          <w:szCs w:val="24"/>
-        </w:rPr>
-        <w:t xml:space="preserve">gender and emotions with an 80% accuracy. Regardless, </w:t>
-      </w:r>
-      <w:r>
-        <w:rPr>
-          <w:b w:val="false"/>
-          <w:bCs w:val="false"/>
-          <w:i w:val="false"/>
-          <w:iCs w:val="false"/>
-          <w:sz w:val="24"/>
-          <w:szCs w:val="24"/>
-        </w:rPr>
-        <w:t xml:space="preserve">Ayo et al., </w:t>
-      </w:r>
-      <w:r>
-        <w:rPr>
-          <w:b w:val="false"/>
-          <w:bCs w:val="false"/>
-          <w:i w:val="false"/>
-          <w:iCs w:val="false"/>
-          <w:sz w:val="24"/>
-          <w:szCs w:val="24"/>
-        </w:rPr>
-        <w:t>(</w:t>
-      </w:r>
-      <w:r>
-        <w:rPr>
-          <w:b w:val="false"/>
-          <w:bCs w:val="false"/>
-          <w:i w:val="false"/>
-          <w:iCs w:val="false"/>
-          <w:sz w:val="24"/>
-          <w:szCs w:val="24"/>
-        </w:rPr>
-        <w:t>2021</w:t>
-      </w:r>
-      <w:r>
-        <w:rPr>
-          <w:b w:val="false"/>
-          <w:bCs w:val="false"/>
-          <w:i w:val="false"/>
-          <w:iCs w:val="false"/>
-          <w:sz w:val="24"/>
-          <w:szCs w:val="24"/>
-        </w:rPr>
-        <w:t>) were not able to predict age accurately and mentioned that accurate age prediction was hampered by the lighting conditions of an image.</w:t>
+        <w:t>It is critical that several authors have applied the geometric approach of facial recognition in their studies. For example, Ghimire and Lee (2016) used the approach in question to predict emotions on a sequence of images that were extracted from videos. Specifically, Ghimire and Lee (2016) ran a multi-class AdaBoost algorithm and a support vector machines algorithm on  the Cohn-Kanade (CK+) facial expression database and obtained an accuracy of 95.17% and 97.35% respectively. Another example of a study that used the geometric technique of facial recognition is one by  Ayo et al., (2021). This owes to the reality that the authors in question used the geometric approach of facial recognition together with the  you-only-look-once (YOLO) algorithm to predict age, gender and emotions. In their study, the authors were able to predict  gender and emotions with an 80% accuracy. Regardless, Ayo et al., (2021) were not able to predict age accurately and mentioned that accurate age prediction was hampered by the lighting conditions of an image.</w:t>
       </w:r>
     </w:p>
     <w:p>
@@ -3608,62 +3392,7 @@
           <w:sz w:val="28"/>
           <w:szCs w:val="28"/>
         </w:rPr>
-        <w:t>2.4.</w:t>
-      </w:r>
-      <w:r>
-        <w:rPr>
-          <w:b/>
-          <w:bCs/>
-          <w:i w:val="false"/>
-          <w:iCs w:val="false"/>
-          <w:sz w:val="28"/>
-          <w:szCs w:val="28"/>
-        </w:rPr>
-        <w:t>2</w:t>
-      </w:r>
-      <w:r>
-        <w:rPr>
-          <w:b/>
-          <w:bCs/>
-          <w:i w:val="false"/>
-          <w:iCs w:val="false"/>
-          <w:sz w:val="28"/>
-          <w:szCs w:val="28"/>
-        </w:rPr>
-        <w:t xml:space="preserve"> </w:t>
-      </w:r>
-      <w:r>
-        <w:rPr>
-          <w:b/>
-          <w:bCs/>
-          <w:i w:val="false"/>
-          <w:iCs w:val="false"/>
-          <w:sz w:val="28"/>
-          <w:szCs w:val="28"/>
-        </w:rPr>
-        <w:t>The Template Based Approach</w:t>
-      </w:r>
-      <w:r>
-        <w:rPr>
-          <w:b/>
-          <w:bCs/>
-          <w:i w:val="false"/>
-          <w:iCs w:val="false"/>
-          <w:sz w:val="28"/>
-          <w:szCs w:val="28"/>
-        </w:rPr>
-        <w:t xml:space="preserve"> </w:t>
-      </w:r>
-      <w:r>
-        <w:rPr>
-          <w:b/>
-          <w:bCs/>
-          <w:i w:val="false"/>
-          <w:iCs w:val="false"/>
-          <w:sz w:val="28"/>
-          <w:szCs w:val="28"/>
-        </w:rPr>
-        <w:t>of Facial Recognition</w:t>
+        <w:t>2.4.2 The Template Based Approach of Facial Recognition</w:t>
       </w:r>
     </w:p>
     <w:p>
@@ -3781,7 +3510,7 @@
           <w:sz w:val="24"/>
           <w:szCs w:val="24"/>
         </w:rPr>
-        <w:t xml:space="preserve">2199 (2022), </w:t>
+        <w:t xml:space="preserve">2199 (2022), 1-10. </w:t>
       </w:r>
       <w:r>
         <w:rPr>
@@ -3792,11 +3521,11 @@
           <w:sz w:val="24"/>
           <w:szCs w:val="24"/>
         </w:rPr>
-        <w:t xml:space="preserve">1-10. </w:t>
-      </w:r>
-      <w:r>
-        <w:rPr>
-          <w:rFonts w:ascii="Liberation Serif" w:hAnsi="Liberation Serif"/>
+        <w:t>https</w:t>
+      </w:r>
+      <w:r>
+        <w:rPr>
+          <w:rFonts w:ascii="sans-serif" w:hAnsi="sans-serif"/>
           <w:b w:val="false"/>
           <w:bCs w:val="false"/>
           <w:i w:val="false"/>
@@ -3804,11 +3533,10 @@
           <w:sz w:val="24"/>
           <w:szCs w:val="24"/>
         </w:rPr>
-        <w:t>https</w:t>
-      </w:r>
-      <w:r>
-        <w:rPr>
-          <w:rFonts w:ascii="sans-serif" w:hAnsi="sans-serif"/>
+        <w:t>://</w:t>
+      </w:r>
+      <w:r>
+        <w:rPr>
           <w:b w:val="false"/>
           <w:bCs w:val="false"/>
           <w:i w:val="false"/>
@@ -3816,11 +3544,11 @@
           <w:sz w:val="24"/>
           <w:szCs w:val="24"/>
         </w:rPr>
-        <w:t>://</w:t>
-      </w:r>
-      <w:r>
-        <w:rPr>
-          <w:rFonts w:ascii="Liberation Serif" w:hAnsi="Liberation Serif"/>
+        <w:t xml:space="preserve">doi:10.1088/1742-6596/2199/1/012010 </w:t>
+      </w:r>
+      <w:r>
+        <w:rPr>
+          <w:rFonts w:ascii="sans-serif" w:hAnsi="sans-serif"/>
           <w:b w:val="false"/>
           <w:bCs w:val="false"/>
           <w:i w:val="false"/>
@@ -3828,18 +3556,6 @@
           <w:sz w:val="24"/>
           <w:szCs w:val="24"/>
         </w:rPr>
-        <w:t xml:space="preserve">doi:10.1088/1742-6596/2199/1/012010 </w:t>
-      </w:r>
-      <w:r>
-        <w:rPr>
-          <w:rFonts w:ascii="sans-serif" w:hAnsi="sans-serif"/>
-          <w:b w:val="false"/>
-          <w:bCs w:val="false"/>
-          <w:i w:val="false"/>
-          <w:iCs w:val="false"/>
-          <w:sz w:val="24"/>
-          <w:szCs w:val="24"/>
-        </w:rPr>
         <w:t xml:space="preserve"> </w:t>
       </w:r>
     </w:p>
@@ -3927,6 +3643,65 @@
           <w:szCs w:val="24"/>
         </w:rPr>
         <w:t xml:space="preserve">Brunelli, R., and Poggio, T. (2013). Face Recognition through Geometrical Features. </w:t>
+      </w:r>
+    </w:p>
+    <w:p>
+      <w:pPr>
+        <w:pStyle w:val="Normal"/>
+        <w:bidi w:val="0"/>
+        <w:spacing w:lineRule="auto" w:line="480"/>
+        <w:jc w:val="left"/>
+        <w:rPr/>
+      </w:pPr>
+      <w:r>
+        <w:rPr>
+          <w:b w:val="false"/>
+          <w:bCs w:val="false"/>
+          <w:sz w:val="24"/>
+          <w:szCs w:val="24"/>
+        </w:rPr>
+        <w:t>Chandra, B. Y. and Reddy G. K. (2020). A Comparative Analysis Of Face Recognition</w:t>
+      </w:r>
+    </w:p>
+    <w:p>
+      <w:pPr>
+        <w:pStyle w:val="Normal"/>
+        <w:bidi w:val="0"/>
+        <w:spacing w:lineRule="auto" w:line="480"/>
+        <w:jc w:val="left"/>
+        <w:rPr/>
+      </w:pPr>
+      <w:r>
+        <w:rPr>
+          <w:b w:val="false"/>
+          <w:bCs w:val="false"/>
+          <w:sz w:val="24"/>
+          <w:szCs w:val="24"/>
+        </w:rPr>
+        <w:tab/>
+        <w:t xml:space="preserve">Models On Masked Faces. </w:t>
+      </w:r>
+      <w:r>
+        <w:rPr>
+          <w:b w:val="false"/>
+          <w:bCs w:val="false"/>
+          <w:i/>
+          <w:iCs/>
+          <w:sz w:val="24"/>
+          <w:szCs w:val="24"/>
+        </w:rPr>
+        <w:t>International Journal of Scientific &amp; Technology Research</w:t>
+      </w:r>
+      <w:r>
+        <w:rPr>
+          <w:b w:val="false"/>
+          <w:bCs w:val="false"/>
+          <w:sz w:val="24"/>
+          <w:szCs w:val="24"/>
+        </w:rPr>
+        <w:t xml:space="preserve">, </w:t>
+        <w:tab/>
+        <w:t xml:space="preserve">9(10):175-178. </w:t>
       </w:r>
     </w:p>
     <w:p>
@@ -4299,6 +4074,60 @@
         </w:rPr>
       </w:pPr>
       <w:r>
+        <w:rPr/>
+        <w:t xml:space="preserve">Goel, R., Mehmood, I., Ugail, H. </w:t>
+      </w:r>
+      <w:r>
+        <w:rPr/>
+        <w:t xml:space="preserve">(2021). A Study of Deep Learning-Based Face Recognition </w:t>
+      </w:r>
+    </w:p>
+    <w:p>
+      <w:pPr>
+        <w:pStyle w:val="Normal"/>
+        <w:bidi w:val="0"/>
+        <w:spacing w:lineRule="auto" w:line="480"/>
+        <w:jc w:val="left"/>
+        <w:rPr>
+          <w:i w:val="false"/>
+          <w:i w:val="false"/>
+          <w:iCs w:val="false"/>
+        </w:rPr>
+      </w:pPr>
+      <w:r>
+        <w:rPr/>
+        <w:tab/>
+        <w:t xml:space="preserve">Models </w:t>
+      </w:r>
+      <w:r>
+        <w:rPr/>
+        <w:t xml:space="preserve">for Sibling Identification. </w:t>
+      </w:r>
+      <w:r>
+        <w:rPr>
+          <w:i/>
+          <w:iCs/>
+        </w:rPr>
+        <w:t>Sensors</w:t>
+      </w:r>
+      <w:r>
+        <w:rPr/>
+        <w:t>, 21(5068): n.p. https://doi.org/10.3390/s21155068</w:t>
+      </w:r>
+    </w:p>
+    <w:p>
+      <w:pPr>
+        <w:pStyle w:val="Normal"/>
+        <w:bidi w:val="0"/>
+        <w:spacing w:lineRule="auto" w:line="480"/>
+        <w:jc w:val="left"/>
+        <w:rPr>
+          <w:i w:val="false"/>
+          <w:i w:val="false"/>
+          <w:iCs w:val="false"/>
+        </w:rPr>
+      </w:pPr>
+      <w:r>
         <w:rPr>
           <w:i w:val="false"/>
           <w:iCs w:val="false"/>
@@ -4469,16 +4298,7 @@
           <w:sz w:val="24"/>
           <w:szCs w:val="24"/>
         </w:rPr>
-        <w:t xml:space="preserve">Lu, D., and Yan, L. (2021). </w:t>
-      </w:r>
-      <w:r>
-        <w:rPr>
-          <w:b w:val="false"/>
-          <w:bCs w:val="false"/>
-          <w:sz w:val="24"/>
-          <w:szCs w:val="24"/>
-        </w:rPr>
-        <w:t xml:space="preserve">Face Detection and Recognition Algorithm in Digital Image Based on </w:t>
+        <w:t xml:space="preserve">Lu, D., and Yan, L. (2021). Face Detection and Recognition Algorithm in Digital Image Based on </w:t>
       </w:r>
     </w:p>
     <w:p>
@@ -4529,7 +4349,6 @@
       </w:r>
       <w:r>
         <w:rPr>
-          <w:rFonts w:ascii="Liberation Serif" w:hAnsi="Liberation Serif"/>
           <w:b w:val="false"/>
           <w:bCs w:val="false"/>
           <w:i w:val="false"/>
@@ -5338,7 +5157,7 @@
     <w:pPr>
       <w:widowControl/>
       <w:suppressAutoHyphens w:val="true"/>
-      <w:overflowPunct w:val="false"/>
+      <w:overflowPunct w:val="true"/>
       <w:bidi w:val="0"/>
       <w:spacing w:before="0" w:after="0"/>
       <w:jc w:val="left"/>

</xml_diff>

<commit_message>
Add research on racial bias
</commit_message>
<xml_diff>
--- a/SikoliaThesis.docx
+++ b/SikoliaThesis.docx
@@ -2289,94 +2289,123 @@
       </w:r>
       <w:r>
         <w:rPr/>
-        <w:t xml:space="preserve">As already mentioned, deep learning has enabled researchers to develop facial recognition systems. </w:t>
-      </w:r>
-      <w:r>
-        <w:rPr/>
-        <w:t xml:space="preserve">For example,  Goel, Mehmood, Ugail </w:t>
-      </w:r>
-      <w:r>
-        <w:rPr/>
-        <w:t>(2021)</w:t>
-      </w:r>
-      <w:r>
-        <w:rPr/>
-        <w:t xml:space="preserve"> </w:t>
-      </w:r>
-      <w:r>
-        <w:rPr/>
-        <w:t xml:space="preserve">mention solutions such as FaceNet, VGGFACE, VGG16 and VGG19 that are used for facial recognition. </w:t>
-      </w:r>
-      <w:r>
-        <w:rPr/>
-        <w:t xml:space="preserve">In a different paper, Chandra and Reddy (2020) discuss FaceNet, OpenFace, and DeepFace as solutions that could be used for facial recognition. Critical to the discussion is the fact that the mentioned solutions are just but a fraction of solutions that could be used for facial recognition. This is because </w:t>
-      </w:r>
-      <w:r>
-        <w:rPr/>
-        <w:t xml:space="preserve">there at least thirty papers that have been published each with a different solution for facial recognition. </w:t>
-      </w:r>
-      <w:r>
-        <w:rPr/>
-        <w:t>It is imperative to mention that all the publications have been tested on databases that collect images from the west. For instance, the FaceNet algorithm was developed from the Labeled Faces in the Wild dataset which mostly comprises of faces from the West. In short, most of the existing solutions that have been developed forget to take into account that facial recognition software should also be tested on African faces.</w:t>
-      </w:r>
-    </w:p>
-    <w:p>
-      <w:pPr>
-        <w:pStyle w:val="Normal"/>
-        <w:bidi w:val="0"/>
-        <w:spacing w:lineRule="auto" w:line="480"/>
-        <w:jc w:val="left"/>
-        <w:rPr/>
-      </w:pPr>
-      <w:r>
-        <w:rPr/>
-        <w:tab/>
-      </w:r>
-    </w:p>
-    <w:p>
-      <w:pPr>
-        <w:pStyle w:val="Normal"/>
-        <w:bidi w:val="0"/>
-        <w:spacing w:lineRule="auto" w:line="480"/>
-        <w:jc w:val="left"/>
-        <w:rPr>
-          <w:rFonts w:ascii="sans-serif" w:hAnsi="sans-serif"/>
-          <w:sz w:val="21"/>
-        </w:rPr>
-      </w:pPr>
-      <w:r>
-        <w:rPr/>
-      </w:r>
-    </w:p>
-    <w:p>
-      <w:pPr>
-        <w:pStyle w:val="Normal"/>
-        <w:bidi w:val="0"/>
-        <w:spacing w:lineRule="auto" w:line="480"/>
-        <w:jc w:val="left"/>
-        <w:rPr>
-          <w:rFonts w:ascii="sans-serif" w:hAnsi="sans-serif"/>
-          <w:sz w:val="21"/>
-        </w:rPr>
-      </w:pPr>
-      <w:r>
-        <w:rPr>
-          <w:rFonts w:ascii="sans-serif" w:hAnsi="sans-serif"/>
-          <w:sz w:val="21"/>
-        </w:rPr>
-      </w:r>
-    </w:p>
-    <w:p>
-      <w:pPr>
-        <w:pStyle w:val="Normal"/>
-        <w:bidi w:val="0"/>
-        <w:spacing w:lineRule="auto" w:line="480"/>
-        <w:jc w:val="left"/>
-        <w:rPr/>
-      </w:pPr>
-      <w:r>
-        <w:rPr/>
-        <w:t xml:space="preserve">However, most of the developed solutions were created in European countries implying facial recognition based on African faces are yet to be developed. In addition, Najibi (2020) reveals that the existing technologies are subject to racial bias especially against Black Americans. This indicates that the current facial recognition systems will not work well for Africans. Imperative to the debate is the truth that some of the existing facial recognition systems use one hundred and twenty eight variables for facial recognition. According to </w:t>
+        <w:t xml:space="preserve">As already mentioned, deep learning has enabled researchers to develop facial recognition systems. For example,  Goel, Mehmood, Ugail (2021) mention solutions such as FaceNet, VGGFACE, VGG16 and VGG19 that are used for facial recognition. In a different paper, Chandra and Reddy (2020) discuss FaceNet, OpenFace, and DeepFace as solutions that could be used for facial recognition. Critical to the discussion is the fact that the mentioned solutions are just but a fraction of solutions that could be used for facial recognition. This is because there at least thirty papers that have been published each with a different solution for facial recognition. It is imperative to mention that all the publications have been tested on databases that collect images from the west. For instance, the FaceNet algorithm was developed from the Labeled Faces in the Wild dataset which mostly comprises of faces from the West. </w:t>
+      </w:r>
+      <w:r>
+        <w:rPr/>
+        <w:t xml:space="preserve">Likewise, the VGGFACE algorithm was developed using the VGG Face Dataset, which the authors caution may not be representative of the global human population </w:t>
+      </w:r>
+      <w:r>
+        <w:rPr/>
+        <w:t>(</w:t>
+      </w:r>
+      <w:r>
+        <w:rPr>
+          <w:b w:val="false"/>
+          <w:bCs w:val="false"/>
+          <w:sz w:val="24"/>
+          <w:szCs w:val="24"/>
+        </w:rPr>
+        <w:t>Parkhi, Vedaldi, and Ziseerman, 2015)</w:t>
+      </w:r>
+      <w:r>
+        <w:rPr/>
+        <w:t>.</w:t>
+      </w:r>
+    </w:p>
+    <w:p>
+      <w:pPr>
+        <w:pStyle w:val="Normal"/>
+        <w:bidi w:val="0"/>
+        <w:spacing w:lineRule="auto" w:line="480"/>
+        <w:jc w:val="left"/>
+        <w:rPr/>
+      </w:pPr>
+      <w:r>
+        <w:rPr/>
+        <w:tab/>
+      </w:r>
+      <w:r>
+        <w:rPr/>
+        <w:t xml:space="preserve">Apparently, most of the facial recognition systems that have been developed ignore the fact that Africans and Black Americans need to be included in the development of such systems. This is a crucial point because developing facial recognition systems that include Africans and black Americans would add value to the field of facial recognition. As an evidence of this, </w:t>
+      </w:r>
+      <w:r>
+        <w:rPr/>
+        <w:t xml:space="preserve">Najibi (2020) reveals that the existing technologies are subject to racial bias especially against Black Americans. </w:t>
+      </w:r>
+      <w:r>
+        <w:rPr/>
+        <w:t>Moreover</w:t>
+      </w:r>
+      <w:r>
+        <w:rPr/>
+        <w:t xml:space="preserve">, Krishnapriya, </w:t>
+      </w:r>
+      <w:r>
+        <w:rPr/>
+        <w:t xml:space="preserve">et al., (2019) conducted a study on racial bias </w:t>
+      </w:r>
+      <w:r>
+        <w:rPr/>
+        <w:t>and</w:t>
+      </w:r>
+      <w:r>
+        <w:rPr/>
+        <w:t xml:space="preserve"> facial recognition systems and concluded that there is a significant false match rate on faces from Black Americans. </w:t>
+      </w:r>
+      <w:r>
+        <w:rPr/>
+        <w:t>Vital to the debate is the reality</w:t>
+      </w:r>
+      <w:r>
+        <w:rPr/>
+        <w:t xml:space="preserve"> that some media sources highlight the fact that racial bias in facial recognition is a problem in most facial recognition software. Specifically, </w:t>
+      </w:r>
+      <w:r>
+        <w:rPr/>
+        <w:t xml:space="preserve">Lohr (2018) posits that Google had to apologize because their facial recognition system identified black Americans as gorillas.  </w:t>
+      </w:r>
+      <w:r>
+        <w:rPr/>
+        <w:t>This indicates that the existing software on facial recognition should be revolutionized to include black faces when developing such software.</w:t>
+      </w:r>
+    </w:p>
+    <w:p>
+      <w:pPr>
+        <w:pStyle w:val="Normal"/>
+        <w:bidi w:val="0"/>
+        <w:spacing w:lineRule="auto" w:line="480"/>
+        <w:jc w:val="left"/>
+        <w:rPr/>
+      </w:pPr>
+      <w:r>
+        <w:rPr/>
+        <w:tab/>
+      </w:r>
+    </w:p>
+    <w:p>
+      <w:pPr>
+        <w:pStyle w:val="Normal"/>
+        <w:bidi w:val="0"/>
+        <w:spacing w:lineRule="auto" w:line="480"/>
+        <w:jc w:val="left"/>
+        <w:rPr/>
+      </w:pPr>
+      <w:r>
+        <w:rPr/>
+      </w:r>
+    </w:p>
+    <w:p>
+      <w:pPr>
+        <w:pStyle w:val="Normal"/>
+        <w:bidi w:val="0"/>
+        <w:spacing w:lineRule="auto" w:line="480"/>
+        <w:jc w:val="left"/>
+        <w:rPr/>
+      </w:pPr>
+      <w:r>
+        <w:rPr/>
+        <w:t xml:space="preserve">Imperative to the debate is the truth that some of the existing facial recognition systems use one hundred and twenty eight variables for facial recognition. According to </w:t>
       </w:r>
       <w:r>
         <w:rPr>
@@ -2541,7 +2570,7 @@
         <w:pStyle w:val="Normal"/>
         <w:numPr>
           <w:ilvl w:val="0"/>
-          <w:numId w:val="1"/>
+          <w:numId w:val="2"/>
         </w:numPr>
         <w:bidi w:val="0"/>
         <w:spacing w:lineRule="auto" w:line="480"/>
@@ -2569,7 +2598,7 @@
         <w:pStyle w:val="Normal"/>
         <w:numPr>
           <w:ilvl w:val="0"/>
-          <w:numId w:val="1"/>
+          <w:numId w:val="2"/>
         </w:numPr>
         <w:bidi w:val="0"/>
         <w:spacing w:lineRule="auto" w:line="480"/>
@@ -2597,7 +2626,7 @@
         <w:pStyle w:val="Normal"/>
         <w:numPr>
           <w:ilvl w:val="0"/>
-          <w:numId w:val="1"/>
+          <w:numId w:val="2"/>
         </w:numPr>
         <w:bidi w:val="0"/>
         <w:spacing w:lineRule="auto" w:line="480"/>
@@ -2625,7 +2654,7 @@
         <w:pStyle w:val="Normal"/>
         <w:numPr>
           <w:ilvl w:val="0"/>
-          <w:numId w:val="1"/>
+          <w:numId w:val="2"/>
         </w:numPr>
         <w:bidi w:val="0"/>
         <w:spacing w:lineRule="auto" w:line="480"/>
@@ -2815,23 +2844,35 @@
         <w:bidi w:val="0"/>
         <w:spacing w:lineRule="auto" w:line="480"/>
         <w:jc w:val="left"/>
-        <w:rPr>
-          <w:b w:val="false"/>
-          <w:b w:val="false"/>
-          <w:bCs w:val="false"/>
-          <w:sz w:val="24"/>
-          <w:szCs w:val="24"/>
-        </w:rPr>
-      </w:pPr>
-      <w:r>
-        <w:rPr>
-          <w:b w:val="false"/>
-          <w:bCs w:val="false"/>
-          <w:sz w:val="24"/>
-          <w:szCs w:val="24"/>
-        </w:rPr>
-        <w:tab/>
-        <w:t>This section surveys previous works done  on facial recognition with a bias towards the objectives of this work. It begins with examining different types of methodologies that have been used for facial recognition before delving into how different types of neural networks have been used for facial recognition. Specifically, this proposal discusses how convolution neural networks,  recurrent neural networks, and long short term memory neural networks have been used for facial recognition. Finally, the proposal examines machine learning workflows from previous publications and how those workflows can be applied on facial recognition.</w:t>
+        <w:rPr/>
+      </w:pPr>
+      <w:r>
+        <w:rPr>
+          <w:b w:val="false"/>
+          <w:bCs w:val="false"/>
+          <w:sz w:val="24"/>
+          <w:szCs w:val="24"/>
+        </w:rPr>
+        <w:tab/>
+        <w:t xml:space="preserve">This section surveys previous works done  on facial recognition with a bias towards the objectives of this work. It begins with examining different types of methodologies that have been used for facial recognition before delving into how different types of neural networks have been used for facial recognition. Specifically, this proposal discusses how convolution neural networks,  recurrent neural networks, and long short term memory neural networks have been used for facial recognition. Finally, the proposal examines machine learning workflows from previous publications and how those workflows can be applied </w:t>
+      </w:r>
+      <w:r>
+        <w:rPr>
+          <w:b w:val="false"/>
+          <w:bCs w:val="false"/>
+          <w:sz w:val="24"/>
+          <w:szCs w:val="24"/>
+        </w:rPr>
+        <w:t>to</w:t>
+      </w:r>
+      <w:r>
+        <w:rPr>
+          <w:b w:val="false"/>
+          <w:bCs w:val="false"/>
+          <w:sz w:val="24"/>
+          <w:szCs w:val="24"/>
+        </w:rPr>
+        <w:t xml:space="preserve"> facial recognition.</w:t>
       </w:r>
     </w:p>
     <w:p>
@@ -3197,13 +3238,7 @@
         <w:bidi w:val="0"/>
         <w:spacing w:lineRule="auto" w:line="480"/>
         <w:jc w:val="left"/>
-        <w:rPr>
-          <w:b w:val="false"/>
-          <w:b w:val="false"/>
-          <w:bCs w:val="false"/>
-          <w:sz w:val="24"/>
-          <w:szCs w:val="24"/>
-        </w:rPr>
+        <w:rPr/>
       </w:pPr>
       <w:r>
         <w:rPr>
@@ -3379,19 +3414,22 @@
           <w:b/>
           <w:b/>
           <w:bCs/>
-          <w:sz w:val="28"/>
-          <w:szCs w:val="28"/>
-        </w:rPr>
-      </w:pPr>
-      <w:r>
-        <w:rPr>
-          <w:b/>
-          <w:bCs/>
+          <w:i w:val="false"/>
           <w:i w:val="false"/>
           <w:iCs w:val="false"/>
           <w:sz w:val="28"/>
           <w:szCs w:val="28"/>
         </w:rPr>
+      </w:pPr>
+      <w:r>
+        <w:rPr>
+          <w:b/>
+          <w:bCs/>
+          <w:i w:val="false"/>
+          <w:iCs w:val="false"/>
+          <w:sz w:val="28"/>
+          <w:szCs w:val="28"/>
+        </w:rPr>
         <w:t>2.4.2 The Template Based Approach of Facial Recognition</w:t>
       </w:r>
     </w:p>
@@ -3470,13 +3508,7 @@
         <w:bidi w:val="0"/>
         <w:spacing w:lineRule="auto" w:line="480"/>
         <w:jc w:val="left"/>
-        <w:rPr>
-          <w:b w:val="false"/>
-          <w:b w:val="false"/>
-          <w:bCs w:val="false"/>
-          <w:sz w:val="24"/>
-          <w:szCs w:val="24"/>
-        </w:rPr>
+        <w:rPr/>
       </w:pPr>
       <w:r>
         <w:rPr>
@@ -3510,10 +3542,11 @@
           <w:sz w:val="24"/>
           <w:szCs w:val="24"/>
         </w:rPr>
-        <w:t xml:space="preserve">2199 (2022), 1-10. </w:t>
-      </w:r>
-      <w:r>
-        <w:rPr>
+        <w:t>2199 (2022), 1-10. https</w:t>
+      </w:r>
+      <w:r>
+        <w:rPr>
+          <w:rFonts w:ascii="sans-serif" w:hAnsi="sans-serif"/>
           <w:b w:val="false"/>
           <w:bCs w:val="false"/>
           <w:i w:val="false"/>
@@ -3521,11 +3554,10 @@
           <w:sz w:val="24"/>
           <w:szCs w:val="24"/>
         </w:rPr>
-        <w:t>https</w:t>
-      </w:r>
-      <w:r>
-        <w:rPr>
-          <w:rFonts w:ascii="sans-serif" w:hAnsi="sans-serif"/>
+        <w:t>://</w:t>
+      </w:r>
+      <w:r>
+        <w:rPr>
           <w:b w:val="false"/>
           <w:bCs w:val="false"/>
           <w:i w:val="false"/>
@@ -3533,10 +3565,11 @@
           <w:sz w:val="24"/>
           <w:szCs w:val="24"/>
         </w:rPr>
-        <w:t>://</w:t>
-      </w:r>
-      <w:r>
-        <w:rPr>
+        <w:t xml:space="preserve">doi:10.1088/1742-6596/2199/1/012010 </w:t>
+      </w:r>
+      <w:r>
+        <w:rPr>
+          <w:rFonts w:ascii="sans-serif" w:hAnsi="sans-serif"/>
           <w:b w:val="false"/>
           <w:bCs w:val="false"/>
           <w:i w:val="false"/>
@@ -3544,18 +3577,6 @@
           <w:sz w:val="24"/>
           <w:szCs w:val="24"/>
         </w:rPr>
-        <w:t xml:space="preserve">doi:10.1088/1742-6596/2199/1/012010 </w:t>
-      </w:r>
-      <w:r>
-        <w:rPr>
-          <w:rFonts w:ascii="sans-serif" w:hAnsi="sans-serif"/>
-          <w:b w:val="false"/>
-          <w:bCs w:val="false"/>
-          <w:i w:val="false"/>
-          <w:iCs w:val="false"/>
-          <w:sz w:val="24"/>
-          <w:szCs w:val="24"/>
-        </w:rPr>
         <w:t xml:space="preserve"> </w:t>
       </w:r>
     </w:p>
@@ -3651,7 +3672,13 @@
         <w:bidi w:val="0"/>
         <w:spacing w:lineRule="auto" w:line="480"/>
         <w:jc w:val="left"/>
-        <w:rPr/>
+        <w:rPr>
+          <w:b w:val="false"/>
+          <w:b w:val="false"/>
+          <w:bCs w:val="false"/>
+          <w:sz w:val="24"/>
+          <w:szCs w:val="24"/>
+        </w:rPr>
       </w:pPr>
       <w:r>
         <w:rPr>
@@ -4016,13 +4043,7 @@
         <w:bidi w:val="0"/>
         <w:spacing w:lineRule="auto" w:line="480"/>
         <w:jc w:val="left"/>
-        <w:rPr>
-          <w:b w:val="false"/>
-          <w:b w:val="false"/>
-          <w:bCs w:val="false"/>
-          <w:sz w:val="24"/>
-          <w:szCs w:val="24"/>
-        </w:rPr>
+        <w:rPr/>
       </w:pPr>
       <w:r>
         <w:rPr>
@@ -4059,6 +4080,44 @@
         <w:t xml:space="preserve">, </w:t>
         <w:tab/>
         <w:t>13(6): 7714–7734. https://doi.org/10.3390%2Fs130607714</w:t>
+      </w:r>
+    </w:p>
+    <w:p>
+      <w:pPr>
+        <w:pStyle w:val="Normal"/>
+        <w:bidi w:val="0"/>
+        <w:spacing w:lineRule="auto" w:line="480"/>
+        <w:jc w:val="left"/>
+        <w:rPr/>
+      </w:pPr>
+      <w:r>
+        <w:rPr/>
+        <w:t xml:space="preserve">Goel, R., Mehmood, I., Ugail, H. (2021). A Study of Deep Learning-Based Face Recognition </w:t>
+      </w:r>
+    </w:p>
+    <w:p>
+      <w:pPr>
+        <w:pStyle w:val="Normal"/>
+        <w:bidi w:val="0"/>
+        <w:spacing w:lineRule="auto" w:line="480"/>
+        <w:jc w:val="left"/>
+        <w:rPr/>
+      </w:pPr>
+      <w:r>
+        <w:rPr/>
+        <w:tab/>
+        <w:t xml:space="preserve">Models for Sibling Identification. </w:t>
+      </w:r>
+      <w:r>
+        <w:rPr>
+          <w:i/>
+          <w:iCs/>
+        </w:rPr>
+        <w:t>Sensors</w:t>
+      </w:r>
+      <w:r>
+        <w:rPr/>
+        <w:t>, 21(5068): n.p. https://doi.org/10.3390/s21155068</w:t>
       </w:r>
     </w:p>
     <w:p>
@@ -4074,12 +4133,44 @@
         </w:rPr>
       </w:pPr>
       <w:r>
-        <w:rPr/>
-        <w:t xml:space="preserve">Goel, R., Mehmood, I., Ugail, H. </w:t>
-      </w:r>
-      <w:r>
-        <w:rPr/>
-        <w:t xml:space="preserve">(2021). A Study of Deep Learning-Based Face Recognition </w:t>
+        <w:rPr>
+          <w:i w:val="false"/>
+          <w:iCs w:val="false"/>
+        </w:rPr>
+        <w:t xml:space="preserve">Hidayat, R., Wibowo, B, M., Satria, R. B., Winursito, A. (2021). Implementation of Face </w:t>
+      </w:r>
+    </w:p>
+    <w:p>
+      <w:pPr>
+        <w:pStyle w:val="Normal"/>
+        <w:bidi w:val="0"/>
+        <w:spacing w:lineRule="auto" w:line="480"/>
+        <w:jc w:val="left"/>
+        <w:rPr/>
+      </w:pPr>
+      <w:r>
+        <w:rPr>
+          <w:i w:val="false"/>
+          <w:iCs w:val="false"/>
+        </w:rPr>
+        <w:tab/>
+        <w:t xml:space="preserve">Recognition Using Geometric Features Extraction. </w:t>
+      </w:r>
+      <w:r>
+        <w:rPr>
+          <w:i/>
+          <w:iCs/>
+        </w:rPr>
+        <w:t>Jurnal Lmiah Kursor</w:t>
+      </w:r>
+      <w:r>
+        <w:rPr>
+          <w:i w:val="false"/>
+          <w:iCs w:val="false"/>
+        </w:rPr>
+        <w:t xml:space="preserve">, 11(2): 83-90. </w:t>
+        <w:tab/>
+        <w:t>https://doi.org/10.21107/kursor.v11i2.284</w:t>
       </w:r>
     </w:p>
     <w:p>
@@ -4095,543 +4186,566 @@
         </w:rPr>
       </w:pPr>
       <w:r>
-        <w:rPr/>
-        <w:tab/>
-        <w:t xml:space="preserve">Models </w:t>
-      </w:r>
-      <w:r>
-        <w:rPr/>
-        <w:t xml:space="preserve">for Sibling Identification. </w:t>
+        <w:rPr>
+          <w:i w:val="false"/>
+          <w:iCs w:val="false"/>
+        </w:rPr>
+        <w:t xml:space="preserve">Hinton, E. G., Osindero, O., and Teh, Y. (2006). A Fast Learning Algorithm for Deep Belief Nets. </w:t>
+      </w:r>
+    </w:p>
+    <w:p>
+      <w:pPr>
+        <w:pStyle w:val="Normal"/>
+        <w:bidi w:val="0"/>
+        <w:spacing w:lineRule="auto" w:line="480"/>
+        <w:jc w:val="left"/>
+        <w:rPr/>
+      </w:pPr>
+      <w:r>
+        <w:rPr>
+          <w:i w:val="false"/>
+          <w:iCs w:val="false"/>
+        </w:rPr>
+        <w:tab/>
       </w:r>
       <w:r>
         <w:rPr>
           <w:i/>
           <w:iCs/>
         </w:rPr>
-        <w:t>Sensors</w:t>
-      </w:r>
-      <w:r>
-        <w:rPr/>
-        <w:t>, 21(5068): n.p. https://doi.org/10.3390/s21155068</w:t>
-      </w:r>
-    </w:p>
-    <w:p>
-      <w:pPr>
-        <w:pStyle w:val="Normal"/>
-        <w:bidi w:val="0"/>
-        <w:spacing w:lineRule="auto" w:line="480"/>
-        <w:jc w:val="left"/>
-        <w:rPr>
-          <w:i w:val="false"/>
+        <w:t xml:space="preserve">Neural Computation, </w:t>
+      </w:r>
+      <w:r>
+        <w:rPr>
           <w:i w:val="false"/>
           <w:iCs w:val="false"/>
         </w:rPr>
-      </w:pPr>
-      <w:r>
-        <w:rPr>
+        <w:t>18(7): 1527-54. https://doi:10.1162/neco.2006.18.7.1527</w:t>
+      </w:r>
+    </w:p>
+    <w:p>
+      <w:pPr>
+        <w:pStyle w:val="Normal"/>
+        <w:bidi w:val="0"/>
+        <w:spacing w:lineRule="auto" w:line="480"/>
+        <w:jc w:val="left"/>
+        <w:rPr/>
+      </w:pPr>
+      <w:r>
+        <w:rPr>
+          <w:b w:val="false"/>
+          <w:bCs w:val="false"/>
+          <w:sz w:val="24"/>
+          <w:szCs w:val="24"/>
+        </w:rPr>
+        <w:t xml:space="preserve">KrishnapriyaK., S., Vangara, K., King, M.C., Albiero, V., &amp; Bowyer, K. (2019). </w:t>
+      </w:r>
+      <w:r>
+        <w:rPr>
+          <w:b w:val="false"/>
+          <w:bCs w:val="false"/>
+          <w:i/>
+          <w:iCs/>
+          <w:sz w:val="24"/>
+          <w:szCs w:val="24"/>
+        </w:rPr>
+        <w:t xml:space="preserve">Characterizing the </w:t>
+      </w:r>
+    </w:p>
+    <w:p>
+      <w:pPr>
+        <w:pStyle w:val="Normal"/>
+        <w:bidi w:val="0"/>
+        <w:spacing w:lineRule="auto" w:line="480"/>
+        <w:jc w:val="left"/>
+        <w:rPr/>
+      </w:pPr>
+      <w:r>
+        <w:rPr>
+          <w:b w:val="false"/>
+          <w:bCs w:val="false"/>
+          <w:i/>
+          <w:iCs/>
+          <w:sz w:val="24"/>
+          <w:szCs w:val="24"/>
+        </w:rPr>
+        <w:tab/>
+        <w:t>Variability in Face Recognition Accuracy Relative to Race</w:t>
+      </w:r>
+      <w:r>
+        <w:rPr>
+          <w:b w:val="false"/>
+          <w:bCs w:val="false"/>
+          <w:sz w:val="24"/>
+          <w:szCs w:val="24"/>
+        </w:rPr>
+        <w:t xml:space="preserve">. 2019 IEEE/CVF Conference on </w:t>
+        <w:tab/>
+        <w:t xml:space="preserve">Computer Vision and Pattern Recognition Workshops (CVPRW), 2278-2285. </w:t>
+        <w:tab/>
+        <w:t>https://arxiv.org/pdf/1904.07325.pdf</w:t>
+      </w:r>
+    </w:p>
+    <w:p>
+      <w:pPr>
+        <w:pStyle w:val="Normal"/>
+        <w:bidi w:val="0"/>
+        <w:spacing w:lineRule="auto" w:line="480"/>
+        <w:jc w:val="left"/>
+        <w:rPr/>
+      </w:pPr>
+      <w:r>
+        <w:rPr>
+          <w:b w:val="false"/>
+          <w:bCs w:val="false"/>
+          <w:sz w:val="24"/>
+          <w:szCs w:val="24"/>
+        </w:rPr>
+        <w:t xml:space="preserve">Leslie, D. (2020). Understanding bias in facial recognition technologies: an explainer. </w:t>
+      </w:r>
+      <w:r>
+        <w:rPr>
+          <w:b w:val="false"/>
+          <w:bCs w:val="false"/>
+          <w:i/>
+          <w:iCs/>
+          <w:sz w:val="24"/>
+          <w:szCs w:val="24"/>
+        </w:rPr>
+        <w:t xml:space="preserve">The Alan </w:t>
+      </w:r>
+    </w:p>
+    <w:p>
+      <w:pPr>
+        <w:pStyle w:val="Normal"/>
+        <w:bidi w:val="0"/>
+        <w:spacing w:lineRule="auto" w:line="480"/>
+        <w:jc w:val="left"/>
+        <w:rPr/>
+      </w:pPr>
+      <w:r>
+        <w:rPr>
+          <w:b w:val="false"/>
+          <w:bCs w:val="false"/>
+          <w:i/>
+          <w:iCs/>
+          <w:sz w:val="24"/>
+          <w:szCs w:val="24"/>
+        </w:rPr>
+        <w:tab/>
+        <w:t>Turing Institute</w:t>
+      </w:r>
+      <w:r>
+        <w:rPr>
+          <w:b w:val="false"/>
+          <w:bCs w:val="false"/>
+          <w:sz w:val="24"/>
+          <w:szCs w:val="24"/>
+        </w:rPr>
+        <w:t xml:space="preserve">. https://doi.org/10.5281/zenodo.4050457 </w:t>
+      </w:r>
+    </w:p>
+    <w:p>
+      <w:pPr>
+        <w:pStyle w:val="Normal"/>
+        <w:bidi w:val="0"/>
+        <w:spacing w:lineRule="auto" w:line="480"/>
+        <w:jc w:val="left"/>
+        <w:rPr>
+          <w:b w:val="false"/>
+          <w:b w:val="false"/>
+          <w:bCs w:val="false"/>
+          <w:sz w:val="24"/>
+          <w:szCs w:val="24"/>
+        </w:rPr>
+      </w:pPr>
+      <w:r>
+        <w:rPr>
+          <w:b w:val="false"/>
+          <w:bCs w:val="false"/>
+          <w:sz w:val="24"/>
+          <w:szCs w:val="24"/>
+        </w:rPr>
+        <w:t xml:space="preserve">Lu, D., and Yan, L. (2021). Face Detection and Recognition Algorithm in Digital Image Based on </w:t>
+      </w:r>
+    </w:p>
+    <w:p>
+      <w:pPr>
+        <w:pStyle w:val="Normal"/>
+        <w:bidi w:val="0"/>
+        <w:spacing w:lineRule="auto" w:line="480"/>
+        <w:jc w:val="left"/>
+        <w:rPr/>
+      </w:pPr>
+      <w:r>
+        <w:rPr>
+          <w:b w:val="false"/>
+          <w:bCs w:val="false"/>
+          <w:sz w:val="24"/>
+          <w:szCs w:val="24"/>
+        </w:rPr>
+        <w:tab/>
+        <w:t xml:space="preserve">Computer Vision Sensor. </w:t>
+      </w:r>
+      <w:r>
+        <w:rPr>
+          <w:b w:val="false"/>
+          <w:bCs w:val="false"/>
+          <w:i/>
+          <w:iCs/>
+          <w:sz w:val="24"/>
+          <w:szCs w:val="24"/>
+        </w:rPr>
+        <w:t xml:space="preserve">Journal of Sensors, </w:t>
+      </w:r>
+      <w:r>
+        <w:rPr>
+          <w:b w:val="false"/>
+          <w:bCs w:val="false"/>
           <w:i w:val="false"/>
           <w:iCs w:val="false"/>
-        </w:rPr>
-        <w:t xml:space="preserve">Hidayat, R., Wibowo, B, M., Satria, R. B., Winursito, A. (2021). Implementation of Face </w:t>
-      </w:r>
-    </w:p>
-    <w:p>
-      <w:pPr>
-        <w:pStyle w:val="Normal"/>
-        <w:bidi w:val="0"/>
-        <w:spacing w:lineRule="auto" w:line="480"/>
-        <w:jc w:val="left"/>
-        <w:rPr/>
-      </w:pPr>
-      <w:r>
-        <w:rPr>
+          <w:sz w:val="24"/>
+          <w:szCs w:val="24"/>
+        </w:rPr>
+        <w:t xml:space="preserve">2021(4796768), 1-16. </w:t>
+        <w:tab/>
+        <w:t>https://doi.org/10.1155/2021/4796768</w:t>
+      </w:r>
+    </w:p>
+    <w:p>
+      <w:pPr>
+        <w:pStyle w:val="Normal"/>
+        <w:bidi w:val="0"/>
+        <w:spacing w:lineRule="auto" w:line="480"/>
+        <w:jc w:val="left"/>
+        <w:rPr>
+          <w:b w:val="false"/>
+          <w:b w:val="false"/>
+          <w:bCs w:val="false"/>
+          <w:sz w:val="24"/>
+          <w:szCs w:val="24"/>
+        </w:rPr>
+      </w:pPr>
+      <w:r>
+        <w:rPr>
+          <w:b w:val="false"/>
+          <w:bCs w:val="false"/>
+          <w:sz w:val="24"/>
+          <w:szCs w:val="24"/>
+        </w:rPr>
+        <w:t>Marks, P. (2021).Can the Biases in Facial Recognition Be Fixed;  Also, Should They?</w:t>
+      </w:r>
+    </w:p>
+    <w:p>
+      <w:pPr>
+        <w:pStyle w:val="Normal"/>
+        <w:bidi w:val="0"/>
+        <w:spacing w:lineRule="auto" w:line="480"/>
+        <w:jc w:val="left"/>
+        <w:rPr>
+          <w:b w:val="false"/>
+          <w:b w:val="false"/>
+          <w:bCs w:val="false"/>
+          <w:sz w:val="24"/>
+          <w:szCs w:val="24"/>
+        </w:rPr>
+      </w:pPr>
+      <w:r>
+        <w:rPr>
+          <w:b w:val="false"/>
+          <w:bCs w:val="false"/>
+          <w:sz w:val="24"/>
+          <w:szCs w:val="24"/>
+        </w:rPr>
+        <w:tab/>
+        <w:t>Communications of The ACM, 64(3): 20-22. https://dx.doi.org/10.1145/3446877</w:t>
+      </w:r>
+    </w:p>
+    <w:p>
+      <w:pPr>
+        <w:pStyle w:val="Normal"/>
+        <w:bidi w:val="0"/>
+        <w:spacing w:lineRule="auto" w:line="480"/>
+        <w:jc w:val="left"/>
+        <w:rPr/>
+      </w:pPr>
+      <w:r>
+        <w:rPr>
+          <w:b w:val="false"/>
+          <w:bCs w:val="false"/>
+          <w:sz w:val="24"/>
+          <w:szCs w:val="24"/>
+        </w:rPr>
+        <w:t xml:space="preserve">Najibi, A. (2020). </w:t>
+      </w:r>
+      <w:r>
+        <w:rPr>
+          <w:b w:val="false"/>
+          <w:bCs w:val="false"/>
+          <w:i/>
+          <w:iCs/>
+          <w:sz w:val="24"/>
+          <w:szCs w:val="24"/>
+        </w:rPr>
+        <w:t>Racial Discrimination in Face Recognition Technology</w:t>
+      </w:r>
+      <w:r>
+        <w:rPr>
+          <w:b w:val="false"/>
+          <w:bCs w:val="false"/>
+          <w:sz w:val="24"/>
+          <w:szCs w:val="24"/>
+        </w:rPr>
+        <w:t xml:space="preserve">. Retrieved from </w:t>
+        <w:tab/>
+        <w:t>https://sitn.hms.harvard.edu/flash/2020/racial-discrimination-in-face-recognition-</w:t>
+        <w:tab/>
+        <w:t>technology/</w:t>
+      </w:r>
+    </w:p>
+    <w:p>
+      <w:pPr>
+        <w:pStyle w:val="Normal"/>
+        <w:bidi w:val="0"/>
+        <w:spacing w:lineRule="auto" w:line="480"/>
+        <w:jc w:val="left"/>
+        <w:rPr/>
+      </w:pPr>
+      <w:r>
+        <w:rPr>
+          <w:b w:val="false"/>
+          <w:bCs w:val="false"/>
+          <w:sz w:val="24"/>
+          <w:szCs w:val="24"/>
+        </w:rPr>
+        <w:t xml:space="preserve">Parkhi, M. O., Vedaldi, A., and Ziseerman, A.  (2015). </w:t>
+      </w:r>
+      <w:r>
+        <w:rPr>
+          <w:b w:val="false"/>
+          <w:bCs w:val="false"/>
+          <w:i/>
+          <w:iCs/>
+          <w:sz w:val="24"/>
+          <w:szCs w:val="24"/>
+        </w:rPr>
+        <w:t>VGG Face Dataset</w:t>
+      </w:r>
+      <w:r>
+        <w:rPr>
+          <w:b w:val="false"/>
+          <w:bCs w:val="false"/>
+          <w:sz w:val="24"/>
+          <w:szCs w:val="24"/>
+        </w:rPr>
+        <w:t xml:space="preserve">. Retrieved from: </w:t>
+      </w:r>
+    </w:p>
+    <w:p>
+      <w:pPr>
+        <w:pStyle w:val="Normal"/>
+        <w:bidi w:val="0"/>
+        <w:spacing w:lineRule="auto" w:line="480"/>
+        <w:jc w:val="left"/>
+        <w:rPr>
+          <w:b w:val="false"/>
+          <w:b w:val="false"/>
+          <w:bCs w:val="false"/>
+          <w:sz w:val="24"/>
+          <w:szCs w:val="24"/>
+        </w:rPr>
+      </w:pPr>
+      <w:r>
+        <w:rPr>
+          <w:b w:val="false"/>
+          <w:bCs w:val="false"/>
+          <w:sz w:val="24"/>
+          <w:szCs w:val="24"/>
+        </w:rPr>
+        <w:tab/>
+        <w:t>https://www.robots.ox.ac.uk/~vgg/data/vgg_face/</w:t>
+      </w:r>
+    </w:p>
+    <w:p>
+      <w:pPr>
+        <w:pStyle w:val="Normal"/>
+        <w:bidi w:val="0"/>
+        <w:spacing w:lineRule="auto" w:line="480"/>
+        <w:jc w:val="left"/>
+        <w:rPr>
+          <w:b w:val="false"/>
+          <w:b w:val="false"/>
+          <w:bCs w:val="false"/>
+          <w:sz w:val="24"/>
+          <w:szCs w:val="24"/>
+        </w:rPr>
+      </w:pPr>
+      <w:r>
+        <w:rPr>
+          <w:b w:val="false"/>
+          <w:bCs w:val="false"/>
+          <w:sz w:val="24"/>
+          <w:szCs w:val="24"/>
+        </w:rPr>
+        <w:t xml:space="preserve">Priya, G. A., Rekha, P. A., Sarabya, K. R., and Thanuganesh, M. (2014). Face Recognition with </w:t>
+      </w:r>
+    </w:p>
+    <w:p>
+      <w:pPr>
+        <w:pStyle w:val="Normal"/>
+        <w:bidi w:val="0"/>
+        <w:spacing w:lineRule="auto" w:line="480"/>
+        <w:jc w:val="left"/>
+        <w:rPr/>
+      </w:pPr>
+      <w:r>
+        <w:rPr>
+          <w:b w:val="false"/>
+          <w:bCs w:val="false"/>
+          <w:sz w:val="24"/>
+          <w:szCs w:val="24"/>
+        </w:rPr>
+        <w:tab/>
+        <w:t>Different Approaches: A Survey. I</w:t>
+      </w:r>
+      <w:r>
+        <w:rPr>
+          <w:b w:val="false"/>
+          <w:bCs w:val="false"/>
+          <w:i/>
+          <w:iCs/>
+          <w:sz w:val="24"/>
+          <w:szCs w:val="24"/>
+        </w:rPr>
+        <w:t xml:space="preserve">nternational Journal of Emerging Engineering Research </w:t>
+        <w:tab/>
+        <w:t>and Technology</w:t>
+      </w:r>
+      <w:r>
+        <w:rPr>
+          <w:b w:val="false"/>
+          <w:bCs w:val="false"/>
+          <w:sz w:val="24"/>
+          <w:szCs w:val="24"/>
+        </w:rPr>
+        <w:t>, 2(7): 288-293. Retrieved from: http://www.ijeert.org/pdf/v2-i7/39.pdf</w:t>
+      </w:r>
+    </w:p>
+    <w:p>
+      <w:pPr>
+        <w:pStyle w:val="Normal"/>
+        <w:bidi w:val="0"/>
+        <w:spacing w:lineRule="auto" w:line="480"/>
+        <w:jc w:val="left"/>
+        <w:rPr/>
+      </w:pPr>
+      <w:r>
+        <w:rPr>
+          <w:b w:val="false"/>
+          <w:bCs w:val="false"/>
+          <w:sz w:val="24"/>
+          <w:szCs w:val="24"/>
+        </w:rPr>
+        <w:t xml:space="preserve">Ranjan, A., Behera, N. J., and Reza. M. (2020). </w:t>
+      </w:r>
+      <w:r>
+        <w:rPr>
+          <w:b w:val="false"/>
+          <w:bCs w:val="false"/>
+          <w:i/>
+          <w:iCs/>
+          <w:sz w:val="24"/>
+          <w:szCs w:val="24"/>
+        </w:rPr>
+        <w:t>A Parallel Approach for Real-Time Face</w:t>
+      </w:r>
+    </w:p>
+    <w:p>
+      <w:pPr>
+        <w:pStyle w:val="Normal"/>
+        <w:bidi w:val="0"/>
+        <w:spacing w:lineRule="auto" w:line="480"/>
+        <w:jc w:val="left"/>
+        <w:rPr/>
+      </w:pPr>
+      <w:r>
+        <w:rPr>
+          <w:b w:val="false"/>
+          <w:bCs w:val="false"/>
+          <w:i/>
+          <w:iCs/>
+          <w:sz w:val="24"/>
+          <w:szCs w:val="24"/>
+        </w:rPr>
+        <w:tab/>
+        <w:t>Recognition from a Large Database</w:t>
+      </w:r>
+      <w:r>
+        <w:rPr>
+          <w:b w:val="false"/>
+          <w:bCs w:val="false"/>
+          <w:sz w:val="24"/>
+          <w:szCs w:val="24"/>
+        </w:rPr>
+        <w:t>. Retrieved from: https://arxiv.org/pdf/2011.00443.pdf</w:t>
+      </w:r>
+    </w:p>
+    <w:p>
+      <w:pPr>
+        <w:pStyle w:val="Normal"/>
+        <w:bidi w:val="0"/>
+        <w:spacing w:lineRule="auto" w:line="480"/>
+        <w:jc w:val="left"/>
+        <w:rPr/>
+      </w:pPr>
+      <w:r>
+        <w:rPr>
+          <w:b w:val="false"/>
+          <w:bCs w:val="false"/>
+          <w:sz w:val="24"/>
+          <w:szCs w:val="24"/>
+        </w:rPr>
+        <w:t xml:space="preserve">Rehman, H. M., Liew, S. C., Abbas, A., Jayaraman, P. P., Wah, Y. T., and Khan U. S. (2016). Big </w:t>
+        <w:tab/>
+        <w:t xml:space="preserve">Data Reduction Methods: A Survey. </w:t>
+      </w:r>
+      <w:r>
+        <w:rPr>
+          <w:b w:val="false"/>
+          <w:bCs w:val="false"/>
+          <w:i/>
+          <w:iCs/>
+          <w:sz w:val="24"/>
+          <w:szCs w:val="24"/>
+        </w:rPr>
+        <w:t>Data Science and Engineering</w:t>
+      </w:r>
+      <w:r>
+        <w:rPr>
+          <w:b w:val="false"/>
+          <w:bCs w:val="false"/>
+          <w:sz w:val="24"/>
+          <w:szCs w:val="24"/>
+        </w:rPr>
+        <w:t xml:space="preserve">, (2016) 1:265–284, </w:t>
+        <w:tab/>
+      </w:r>
+      <w:r>
+        <w:rPr>
+          <w:b w:val="false"/>
+          <w:bCs w:val="false"/>
           <w:i w:val="false"/>
           <w:iCs w:val="false"/>
-        </w:rPr>
-        <w:tab/>
-        <w:t xml:space="preserve">Recognition Using Geometric Features Extraction. </w:t>
-      </w:r>
-      <w:r>
-        <w:rPr>
-          <w:i/>
-          <w:iCs/>
-        </w:rPr>
-        <w:t>Jurnal Lmiah Kursor</w:t>
+          <w:sz w:val="24"/>
+          <w:szCs w:val="24"/>
+        </w:rPr>
+        <w:t>https://doi:</w:t>
       </w:r>
       <w:r>
         <w:rPr>
           <w:i w:val="false"/>
           <w:iCs w:val="false"/>
         </w:rPr>
-        <w:t xml:space="preserve">, 11(2): 83-90. </w:t>
-        <w:tab/>
-        <w:t>https://doi.org/10.21107/kursor.v11i2.284</w:t>
-      </w:r>
-    </w:p>
-    <w:p>
-      <w:pPr>
-        <w:pStyle w:val="Normal"/>
-        <w:bidi w:val="0"/>
-        <w:spacing w:lineRule="auto" w:line="480"/>
-        <w:jc w:val="left"/>
-        <w:rPr>
-          <w:i w:val="false"/>
-          <w:i w:val="false"/>
-          <w:iCs w:val="false"/>
-        </w:rPr>
-      </w:pPr>
-      <w:r>
-        <w:rPr>
-          <w:i w:val="false"/>
-          <w:iCs w:val="false"/>
-        </w:rPr>
-        <w:t xml:space="preserve">Hinton, E. G., Osindero, O., and Teh, Y. (2006). A Fast Learning Algorithm for Deep Belief Nets. </w:t>
-      </w:r>
-    </w:p>
-    <w:p>
-      <w:pPr>
-        <w:pStyle w:val="Normal"/>
-        <w:bidi w:val="0"/>
-        <w:spacing w:lineRule="auto" w:line="480"/>
-        <w:jc w:val="left"/>
-        <w:rPr/>
-      </w:pPr>
-      <w:r>
-        <w:rPr>
-          <w:i w:val="false"/>
-          <w:iCs w:val="false"/>
-        </w:rPr>
-        <w:tab/>
-      </w:r>
-      <w:r>
-        <w:rPr>
-          <w:i/>
-          <w:iCs/>
-        </w:rPr>
-        <w:t xml:space="preserve">Neural Computation, </w:t>
-      </w:r>
-      <w:r>
-        <w:rPr>
-          <w:i w:val="false"/>
-          <w:iCs w:val="false"/>
-        </w:rPr>
-        <w:t>18(7): 1527-54. https://doi:10.1162/neco.2006.18.7.1527</w:t>
-      </w:r>
-    </w:p>
-    <w:p>
-      <w:pPr>
-        <w:pStyle w:val="Normal"/>
-        <w:bidi w:val="0"/>
-        <w:spacing w:lineRule="auto" w:line="480"/>
-        <w:jc w:val="left"/>
-        <w:rPr/>
-      </w:pPr>
-      <w:r>
-        <w:rPr>
-          <w:b w:val="false"/>
-          <w:bCs w:val="false"/>
-          <w:sz w:val="24"/>
-          <w:szCs w:val="24"/>
-        </w:rPr>
-        <w:t xml:space="preserve">Leslie, D. (2020). Understanding bias in facial recognition technologies: an explainer. </w:t>
-      </w:r>
-      <w:r>
-        <w:rPr>
-          <w:b w:val="false"/>
-          <w:bCs w:val="false"/>
-          <w:i/>
-          <w:iCs/>
-          <w:sz w:val="24"/>
-          <w:szCs w:val="24"/>
-        </w:rPr>
-        <w:t xml:space="preserve">The Alan </w:t>
-      </w:r>
-    </w:p>
-    <w:p>
-      <w:pPr>
-        <w:pStyle w:val="Normal"/>
-        <w:bidi w:val="0"/>
-        <w:spacing w:lineRule="auto" w:line="480"/>
-        <w:jc w:val="left"/>
-        <w:rPr/>
-      </w:pPr>
-      <w:r>
-        <w:rPr>
-          <w:b w:val="false"/>
-          <w:bCs w:val="false"/>
-          <w:i/>
-          <w:iCs/>
-          <w:sz w:val="24"/>
-          <w:szCs w:val="24"/>
-        </w:rPr>
-        <w:tab/>
-        <w:t>Turing Institute</w:t>
-      </w:r>
-      <w:r>
-        <w:rPr>
-          <w:b w:val="false"/>
-          <w:bCs w:val="false"/>
-          <w:sz w:val="24"/>
-          <w:szCs w:val="24"/>
-        </w:rPr>
-        <w:t xml:space="preserve">. https://doi.org/10.5281/zenodo.4050457 </w:t>
-      </w:r>
-    </w:p>
-    <w:p>
-      <w:pPr>
-        <w:pStyle w:val="Normal"/>
-        <w:bidi w:val="0"/>
-        <w:spacing w:lineRule="auto" w:line="480"/>
-        <w:jc w:val="left"/>
-        <w:rPr>
-          <w:b w:val="false"/>
-          <w:b w:val="false"/>
-          <w:bCs w:val="false"/>
-          <w:sz w:val="24"/>
-          <w:szCs w:val="24"/>
-        </w:rPr>
-      </w:pPr>
-      <w:r>
-        <w:rPr>
-          <w:b w:val="false"/>
-          <w:bCs w:val="false"/>
-          <w:sz w:val="24"/>
-          <w:szCs w:val="24"/>
-        </w:rPr>
-        <w:t xml:space="preserve">Lu, D., and Yan, L. (2021). Face Detection and Recognition Algorithm in Digital Image Based on </w:t>
-      </w:r>
-    </w:p>
-    <w:p>
-      <w:pPr>
-        <w:pStyle w:val="Normal"/>
-        <w:bidi w:val="0"/>
-        <w:spacing w:lineRule="auto" w:line="480"/>
-        <w:jc w:val="left"/>
-        <w:rPr>
-          <w:b w:val="false"/>
-          <w:b w:val="false"/>
-          <w:bCs w:val="false"/>
-          <w:sz w:val="24"/>
-          <w:szCs w:val="24"/>
-        </w:rPr>
-      </w:pPr>
-      <w:r>
-        <w:rPr>
-          <w:b w:val="false"/>
-          <w:bCs w:val="false"/>
-          <w:sz w:val="24"/>
-          <w:szCs w:val="24"/>
-        </w:rPr>
-        <w:tab/>
-        <w:t xml:space="preserve">Computer Vision Sensor. </w:t>
-      </w:r>
-      <w:r>
-        <w:rPr>
-          <w:b w:val="false"/>
-          <w:bCs w:val="false"/>
-          <w:i/>
-          <w:iCs/>
-          <w:sz w:val="24"/>
-          <w:szCs w:val="24"/>
-        </w:rPr>
-        <w:t xml:space="preserve">Journal of Sensors, </w:t>
-      </w:r>
-      <w:r>
-        <w:rPr>
-          <w:b w:val="false"/>
-          <w:bCs w:val="false"/>
-          <w:i w:val="false"/>
-          <w:iCs w:val="false"/>
-          <w:sz w:val="24"/>
-          <w:szCs w:val="24"/>
-        </w:rPr>
-        <w:t>2021</w:t>
-      </w:r>
-      <w:r>
-        <w:rPr>
-          <w:b w:val="false"/>
-          <w:bCs w:val="false"/>
-          <w:i w:val="false"/>
-          <w:iCs w:val="false"/>
-          <w:sz w:val="24"/>
-          <w:szCs w:val="24"/>
-        </w:rPr>
-        <w:t xml:space="preserve">(4796768), 1-16. </w:t>
-        <w:tab/>
-        <w:t>https://doi.org/10.1155/2021/4796768</w:t>
-      </w:r>
-    </w:p>
-    <w:p>
-      <w:pPr>
-        <w:pStyle w:val="Normal"/>
-        <w:bidi w:val="0"/>
-        <w:spacing w:lineRule="auto" w:line="480"/>
-        <w:jc w:val="left"/>
-        <w:rPr>
-          <w:b w:val="false"/>
-          <w:b w:val="false"/>
-          <w:bCs w:val="false"/>
-          <w:sz w:val="24"/>
-          <w:szCs w:val="24"/>
-        </w:rPr>
-      </w:pPr>
-      <w:r>
-        <w:rPr>
-          <w:b w:val="false"/>
-          <w:bCs w:val="false"/>
-          <w:sz w:val="24"/>
-          <w:szCs w:val="24"/>
-        </w:rPr>
-        <w:t>Marks, P. (2021).Can the Biases in Facial Recognition Be Fixed;  Also, Should They?</w:t>
-      </w:r>
-    </w:p>
-    <w:p>
-      <w:pPr>
-        <w:pStyle w:val="Normal"/>
-        <w:bidi w:val="0"/>
-        <w:spacing w:lineRule="auto" w:line="480"/>
-        <w:jc w:val="left"/>
-        <w:rPr>
-          <w:b w:val="false"/>
-          <w:b w:val="false"/>
-          <w:bCs w:val="false"/>
-          <w:sz w:val="24"/>
-          <w:szCs w:val="24"/>
-        </w:rPr>
-      </w:pPr>
-      <w:r>
-        <w:rPr>
-          <w:b w:val="false"/>
-          <w:bCs w:val="false"/>
-          <w:sz w:val="24"/>
-          <w:szCs w:val="24"/>
-        </w:rPr>
-        <w:tab/>
-        <w:t>Communications of The ACM, 64(3): 20-22. https://dx.doi.org/10.1145/3446877</w:t>
-      </w:r>
-    </w:p>
-    <w:p>
-      <w:pPr>
-        <w:pStyle w:val="Normal"/>
-        <w:bidi w:val="0"/>
-        <w:spacing w:lineRule="auto" w:line="480"/>
-        <w:jc w:val="left"/>
-        <w:rPr/>
-      </w:pPr>
-      <w:r>
-        <w:rPr>
-          <w:b w:val="false"/>
-          <w:bCs w:val="false"/>
-          <w:sz w:val="24"/>
-          <w:szCs w:val="24"/>
-        </w:rPr>
-        <w:t xml:space="preserve">Najibi, A. (2020). </w:t>
-      </w:r>
-      <w:r>
-        <w:rPr>
-          <w:b w:val="false"/>
-          <w:bCs w:val="false"/>
-          <w:i/>
-          <w:iCs/>
-          <w:sz w:val="24"/>
-          <w:szCs w:val="24"/>
-        </w:rPr>
-        <w:t>Racial Discrimination in Face Recognition Technology</w:t>
-      </w:r>
-      <w:r>
-        <w:rPr>
-          <w:b w:val="false"/>
-          <w:bCs w:val="false"/>
-          <w:sz w:val="24"/>
-          <w:szCs w:val="24"/>
-        </w:rPr>
-        <w:t xml:space="preserve">. Retrieved from </w:t>
-        <w:tab/>
-        <w:t>https://sitn.hms.harvard.edu/flash/2020/racial-discrimination-in-face-recognition-</w:t>
-        <w:tab/>
-        <w:t>technology/</w:t>
-      </w:r>
-    </w:p>
-    <w:p>
-      <w:pPr>
-        <w:pStyle w:val="Normal"/>
-        <w:bidi w:val="0"/>
-        <w:spacing w:lineRule="auto" w:line="480"/>
-        <w:jc w:val="left"/>
-        <w:rPr>
-          <w:b w:val="false"/>
-          <w:b w:val="false"/>
-          <w:bCs w:val="false"/>
-          <w:sz w:val="24"/>
-          <w:szCs w:val="24"/>
-        </w:rPr>
-      </w:pPr>
-      <w:r>
-        <w:rPr>
-          <w:b w:val="false"/>
-          <w:bCs w:val="false"/>
-          <w:sz w:val="24"/>
-          <w:szCs w:val="24"/>
-        </w:rPr>
-        <w:t xml:space="preserve">Priya, G. A., Rekha, P. A., Sarabya, K. R., and Thanuganesh, M. (2014). Face Recognition with </w:t>
-      </w:r>
-    </w:p>
-    <w:p>
-      <w:pPr>
-        <w:pStyle w:val="Normal"/>
-        <w:bidi w:val="0"/>
-        <w:spacing w:lineRule="auto" w:line="480"/>
-        <w:jc w:val="left"/>
-        <w:rPr/>
-      </w:pPr>
-      <w:r>
-        <w:rPr>
-          <w:b w:val="false"/>
-          <w:bCs w:val="false"/>
-          <w:sz w:val="24"/>
-          <w:szCs w:val="24"/>
-        </w:rPr>
-        <w:tab/>
-        <w:t>Different Approaches: A Survey. I</w:t>
-      </w:r>
-      <w:r>
-        <w:rPr>
-          <w:b w:val="false"/>
-          <w:bCs w:val="false"/>
-          <w:i/>
-          <w:iCs/>
-          <w:sz w:val="24"/>
-          <w:szCs w:val="24"/>
-        </w:rPr>
-        <w:t xml:space="preserve">nternational Journal of Emerging Engineering Research </w:t>
-        <w:tab/>
-        <w:t>and Technology</w:t>
-      </w:r>
-      <w:r>
-        <w:rPr>
-          <w:b w:val="false"/>
-          <w:bCs w:val="false"/>
-          <w:sz w:val="24"/>
-          <w:szCs w:val="24"/>
-        </w:rPr>
-        <w:t>, 2(7): 288-293. Retrieved from: http://www.ijeert.org/pdf/v2-i7/39.pdf</w:t>
-      </w:r>
-    </w:p>
-    <w:p>
-      <w:pPr>
-        <w:pStyle w:val="Normal"/>
-        <w:bidi w:val="0"/>
-        <w:spacing w:lineRule="auto" w:line="480"/>
-        <w:jc w:val="left"/>
-        <w:rPr/>
-      </w:pPr>
-      <w:r>
-        <w:rPr>
-          <w:b w:val="false"/>
-          <w:bCs w:val="false"/>
-          <w:sz w:val="24"/>
-          <w:szCs w:val="24"/>
-        </w:rPr>
-        <w:t xml:space="preserve">Ranjan, A., Behera, N. J., and Reza. M. (2020). </w:t>
-      </w:r>
-      <w:r>
-        <w:rPr>
-          <w:b w:val="false"/>
-          <w:bCs w:val="false"/>
-          <w:i/>
-          <w:iCs/>
-          <w:sz w:val="24"/>
-          <w:szCs w:val="24"/>
-        </w:rPr>
-        <w:t>A Parallel Approach for Real-Time Face</w:t>
-      </w:r>
-    </w:p>
-    <w:p>
-      <w:pPr>
-        <w:pStyle w:val="Normal"/>
-        <w:bidi w:val="0"/>
-        <w:spacing w:lineRule="auto" w:line="480"/>
-        <w:jc w:val="left"/>
-        <w:rPr/>
-      </w:pPr>
-      <w:r>
-        <w:rPr>
-          <w:b w:val="false"/>
-          <w:bCs w:val="false"/>
-          <w:i/>
-          <w:iCs/>
-          <w:sz w:val="24"/>
-          <w:szCs w:val="24"/>
-        </w:rPr>
-        <w:tab/>
-        <w:t>Recognition from a Large Database</w:t>
-      </w:r>
-      <w:r>
-        <w:rPr>
-          <w:b w:val="false"/>
-          <w:bCs w:val="false"/>
-          <w:sz w:val="24"/>
-          <w:szCs w:val="24"/>
-        </w:rPr>
-        <w:t>. Retrieved from: https://arxiv.org/pdf/2011.00443.pdf</w:t>
-      </w:r>
-    </w:p>
-    <w:p>
-      <w:pPr>
-        <w:pStyle w:val="Normal"/>
-        <w:bidi w:val="0"/>
-        <w:spacing w:lineRule="auto" w:line="480"/>
-        <w:jc w:val="left"/>
-        <w:rPr/>
-      </w:pPr>
-      <w:r>
-        <w:rPr>
-          <w:b w:val="false"/>
-          <w:bCs w:val="false"/>
-          <w:sz w:val="24"/>
-          <w:szCs w:val="24"/>
-        </w:rPr>
-        <w:t xml:space="preserve">Rehman, H. M., Liew, S. C., Abbas, A., Jayaraman, P. P., Wah, Y. T., and Khan U. S. (2016). Big </w:t>
-        <w:tab/>
-        <w:t xml:space="preserve">Data Reduction Methods: A Survey. </w:t>
-      </w:r>
-      <w:r>
-        <w:rPr>
-          <w:b w:val="false"/>
-          <w:bCs w:val="false"/>
-          <w:i/>
-          <w:iCs/>
-          <w:sz w:val="24"/>
-          <w:szCs w:val="24"/>
-        </w:rPr>
-        <w:t>Data Science and Engineering</w:t>
-      </w:r>
-      <w:r>
-        <w:rPr>
-          <w:b w:val="false"/>
-          <w:bCs w:val="false"/>
-          <w:sz w:val="24"/>
-          <w:szCs w:val="24"/>
-        </w:rPr>
-        <w:t xml:space="preserve">, (2016) 1:265–284, </w:t>
-        <w:tab/>
-      </w:r>
-      <w:r>
-        <w:rPr>
-          <w:b w:val="false"/>
-          <w:bCs w:val="false"/>
-          <w:i w:val="false"/>
-          <w:iCs w:val="false"/>
-          <w:sz w:val="24"/>
-          <w:szCs w:val="24"/>
-        </w:rPr>
-        <w:t>https://doi:</w:t>
-      </w:r>
-      <w:r>
-        <w:rPr>
-          <w:i w:val="false"/>
-          <w:iCs w:val="false"/>
-        </w:rPr>
         <w:t>10.1007/s41019-016-0022-0</w:t>
       </w:r>
     </w:p>
@@ -4665,13 +4779,7 @@
         <w:bidi w:val="0"/>
         <w:spacing w:lineRule="auto" w:line="480"/>
         <w:jc w:val="left"/>
-        <w:rPr>
-          <w:b w:val="false"/>
-          <w:b w:val="false"/>
-          <w:bCs w:val="false"/>
-          <w:sz w:val="24"/>
-          <w:szCs w:val="24"/>
-        </w:rPr>
+        <w:rPr/>
       </w:pPr>
       <w:r>
         <w:rPr>
@@ -4889,6 +4997,125 @@
   <w:abstractNum w:abstractNumId="1">
     <w:lvl w:ilvl="0">
       <w:start w:val="1"/>
+      <w:numFmt w:val="none"/>
+      <w:suff w:val="nothing"/>
+      <w:lvlText w:val="%1"/>
+      <w:lvlJc w:val="left"/>
+      <w:pPr>
+        <w:tabs>
+          <w:tab w:val="num" w:pos="0"/>
+        </w:tabs>
+        <w:ind w:left="0" w:hanging="0"/>
+      </w:pPr>
+    </w:lvl>
+    <w:lvl w:ilvl="1">
+      <w:start w:val="1"/>
+      <w:numFmt w:val="none"/>
+      <w:suff w:val="nothing"/>
+      <w:lvlText w:val="%2"/>
+      <w:lvlJc w:val="left"/>
+      <w:pPr>
+        <w:tabs>
+          <w:tab w:val="num" w:pos="0"/>
+        </w:tabs>
+        <w:ind w:left="0" w:hanging="0"/>
+      </w:pPr>
+    </w:lvl>
+    <w:lvl w:ilvl="2">
+      <w:start w:val="1"/>
+      <w:numFmt w:val="none"/>
+      <w:suff w:val="nothing"/>
+      <w:lvlText w:val="%3"/>
+      <w:lvlJc w:val="left"/>
+      <w:pPr>
+        <w:tabs>
+          <w:tab w:val="num" w:pos="0"/>
+        </w:tabs>
+        <w:ind w:left="0" w:hanging="0"/>
+      </w:pPr>
+    </w:lvl>
+    <w:lvl w:ilvl="3">
+      <w:start w:val="1"/>
+      <w:numFmt w:val="none"/>
+      <w:suff w:val="nothing"/>
+      <w:lvlText w:val="%4"/>
+      <w:lvlJc w:val="left"/>
+      <w:pPr>
+        <w:tabs>
+          <w:tab w:val="num" w:pos="0"/>
+        </w:tabs>
+        <w:ind w:left="0" w:hanging="0"/>
+      </w:pPr>
+    </w:lvl>
+    <w:lvl w:ilvl="4">
+      <w:start w:val="1"/>
+      <w:numFmt w:val="none"/>
+      <w:suff w:val="nothing"/>
+      <w:lvlText w:val="%5"/>
+      <w:lvlJc w:val="left"/>
+      <w:pPr>
+        <w:tabs>
+          <w:tab w:val="num" w:pos="0"/>
+        </w:tabs>
+        <w:ind w:left="0" w:hanging="0"/>
+      </w:pPr>
+    </w:lvl>
+    <w:lvl w:ilvl="5">
+      <w:start w:val="1"/>
+      <w:numFmt w:val="none"/>
+      <w:suff w:val="nothing"/>
+      <w:lvlText w:val="%6"/>
+      <w:lvlJc w:val="left"/>
+      <w:pPr>
+        <w:tabs>
+          <w:tab w:val="num" w:pos="0"/>
+        </w:tabs>
+        <w:ind w:left="0" w:hanging="0"/>
+      </w:pPr>
+    </w:lvl>
+    <w:lvl w:ilvl="6">
+      <w:start w:val="1"/>
+      <w:numFmt w:val="none"/>
+      <w:suff w:val="nothing"/>
+      <w:lvlText w:val="%7"/>
+      <w:lvlJc w:val="left"/>
+      <w:pPr>
+        <w:tabs>
+          <w:tab w:val="num" w:pos="0"/>
+        </w:tabs>
+        <w:ind w:left="0" w:hanging="0"/>
+      </w:pPr>
+    </w:lvl>
+    <w:lvl w:ilvl="7">
+      <w:start w:val="1"/>
+      <w:numFmt w:val="none"/>
+      <w:suff w:val="nothing"/>
+      <w:lvlText w:val="%8"/>
+      <w:lvlJc w:val="left"/>
+      <w:pPr>
+        <w:tabs>
+          <w:tab w:val="num" w:pos="0"/>
+        </w:tabs>
+        <w:ind w:left="0" w:hanging="0"/>
+      </w:pPr>
+    </w:lvl>
+    <w:lvl w:ilvl="8">
+      <w:start w:val="1"/>
+      <w:numFmt w:val="none"/>
+      <w:suff w:val="nothing"/>
+      <w:lvlText w:val="%9"/>
+      <w:lvlJc w:val="left"/>
+      <w:pPr>
+        <w:tabs>
+          <w:tab w:val="num" w:pos="0"/>
+        </w:tabs>
+        <w:ind w:left="0" w:hanging="0"/>
+      </w:pPr>
+    </w:lvl>
+  </w:abstractNum>
+  <w:abstractNum w:abstractNumId="2">
+    <w:lvl w:ilvl="0">
+      <w:start w:val="1"/>
       <w:numFmt w:val="decimal"/>
       <w:lvlText w:val="%1."/>
       <w:lvlJc w:val="left"/>
@@ -5003,125 +5230,6 @@
         <w:ind w:left="3600" w:hanging="360"/>
       </w:pPr>
       <w:rPr/>
-    </w:lvl>
-  </w:abstractNum>
-  <w:abstractNum w:abstractNumId="2">
-    <w:lvl w:ilvl="0">
-      <w:start w:val="1"/>
-      <w:numFmt w:val="none"/>
-      <w:suff w:val="nothing"/>
-      <w:lvlText w:val=""/>
-      <w:lvlJc w:val="left"/>
-      <w:pPr>
-        <w:tabs>
-          <w:tab w:val="num" w:pos="0"/>
-        </w:tabs>
-        <w:ind w:left="0" w:hanging="0"/>
-      </w:pPr>
-    </w:lvl>
-    <w:lvl w:ilvl="1">
-      <w:start w:val="1"/>
-      <w:numFmt w:val="none"/>
-      <w:suff w:val="nothing"/>
-      <w:lvlText w:val=""/>
-      <w:lvlJc w:val="left"/>
-      <w:pPr>
-        <w:tabs>
-          <w:tab w:val="num" w:pos="0"/>
-        </w:tabs>
-        <w:ind w:left="0" w:hanging="0"/>
-      </w:pPr>
-    </w:lvl>
-    <w:lvl w:ilvl="2">
-      <w:start w:val="1"/>
-      <w:numFmt w:val="none"/>
-      <w:suff w:val="nothing"/>
-      <w:lvlText w:val=""/>
-      <w:lvlJc w:val="left"/>
-      <w:pPr>
-        <w:tabs>
-          <w:tab w:val="num" w:pos="0"/>
-        </w:tabs>
-        <w:ind w:left="0" w:hanging="0"/>
-      </w:pPr>
-    </w:lvl>
-    <w:lvl w:ilvl="3">
-      <w:start w:val="1"/>
-      <w:numFmt w:val="none"/>
-      <w:suff w:val="nothing"/>
-      <w:lvlText w:val=""/>
-      <w:lvlJc w:val="left"/>
-      <w:pPr>
-        <w:tabs>
-          <w:tab w:val="num" w:pos="0"/>
-        </w:tabs>
-        <w:ind w:left="0" w:hanging="0"/>
-      </w:pPr>
-    </w:lvl>
-    <w:lvl w:ilvl="4">
-      <w:start w:val="1"/>
-      <w:numFmt w:val="none"/>
-      <w:suff w:val="nothing"/>
-      <w:lvlText w:val=""/>
-      <w:lvlJc w:val="left"/>
-      <w:pPr>
-        <w:tabs>
-          <w:tab w:val="num" w:pos="0"/>
-        </w:tabs>
-        <w:ind w:left="0" w:hanging="0"/>
-      </w:pPr>
-    </w:lvl>
-    <w:lvl w:ilvl="5">
-      <w:start w:val="1"/>
-      <w:numFmt w:val="none"/>
-      <w:suff w:val="nothing"/>
-      <w:lvlText w:val=""/>
-      <w:lvlJc w:val="left"/>
-      <w:pPr>
-        <w:tabs>
-          <w:tab w:val="num" w:pos="0"/>
-        </w:tabs>
-        <w:ind w:left="0" w:hanging="0"/>
-      </w:pPr>
-    </w:lvl>
-    <w:lvl w:ilvl="6">
-      <w:start w:val="1"/>
-      <w:numFmt w:val="none"/>
-      <w:suff w:val="nothing"/>
-      <w:lvlText w:val=""/>
-      <w:lvlJc w:val="left"/>
-      <w:pPr>
-        <w:tabs>
-          <w:tab w:val="num" w:pos="0"/>
-        </w:tabs>
-        <w:ind w:left="0" w:hanging="0"/>
-      </w:pPr>
-    </w:lvl>
-    <w:lvl w:ilvl="7">
-      <w:start w:val="1"/>
-      <w:numFmt w:val="none"/>
-      <w:suff w:val="nothing"/>
-      <w:lvlText w:val=""/>
-      <w:lvlJc w:val="left"/>
-      <w:pPr>
-        <w:tabs>
-          <w:tab w:val="num" w:pos="0"/>
-        </w:tabs>
-        <w:ind w:left="0" w:hanging="0"/>
-      </w:pPr>
-    </w:lvl>
-    <w:lvl w:ilvl="8">
-      <w:start w:val="1"/>
-      <w:numFmt w:val="none"/>
-      <w:suff w:val="nothing"/>
-      <w:lvlText w:val=""/>
-      <w:lvlJc w:val="left"/>
-      <w:pPr>
-        <w:tabs>
-          <w:tab w:val="num" w:pos="0"/>
-        </w:tabs>
-        <w:ind w:left="0" w:hanging="0"/>
-      </w:pPr>
     </w:lvl>
   </w:abstractNum>
   <w:num w:numId="1">
@@ -5157,7 +5265,9 @@
     <w:pPr>
       <w:widowControl/>
       <w:suppressAutoHyphens w:val="true"/>
-      <w:overflowPunct w:val="true"/>
+      <w:kinsoku w:val="true"/>
+      <w:overflowPunct w:val="false"/>
+      <w:autoSpaceDE w:val="true"/>
       <w:bidi w:val="0"/>
       <w:spacing w:before="0" w:after="0"/>
       <w:jc w:val="left"/>

</xml_diff>

<commit_message>
Add smartphones to problem statement
</commit_message>
<xml_diff>
--- a/SikoliaThesis.docx
+++ b/SikoliaThesis.docx
@@ -2289,11 +2289,51 @@
       </w:r>
       <w:r>
         <w:rPr/>
-        <w:t xml:space="preserve">As already mentioned, deep learning has enabled researchers to develop facial recognition systems. For example,  Goel, Mehmood, Ugail (2021) mention solutions such as FaceNet, VGGFACE, VGG16 and VGG19 that are used for facial recognition. In a different paper, Chandra and Reddy (2020) discuss FaceNet, OpenFace, and DeepFace as solutions that could be used for facial recognition. Critical to the discussion is the fact that the mentioned solutions are just but a fraction of solutions that could be used for facial recognition. This is because there at least thirty papers that have been published each with a different solution for facial recognition. It is imperative to mention that all the publications have been tested on databases that collect images from the west. For instance, the FaceNet algorithm was developed from the Labeled Faces in the Wild dataset which mostly comprises of faces from the West. </w:t>
-      </w:r>
-      <w:r>
-        <w:rPr/>
-        <w:t xml:space="preserve">Likewise, the VGGFACE algorithm was developed using the VGG Face Dataset, which the authors caution may not be representative of the global human population </w:t>
+        <w:t>As already mentioned, deep learning has enabled researchers to develop facial recognition systems. For example,  Goel, Mehmood, Ugail (2021) mention solutions such as FaceNet, VGGFACE, VGG16 and VGG19 that are used for facial recognition. In a different paper, Chandra and Reddy (2020) discuss FaceNet, OpenFace, and DeepFace as solutions that could be used for facial recognition. Critical to the discussion is the fact that the mentioned solutions are just but a fraction of solutions that could be used for facial recognition. This is because there at least thirty papers that have been published each with a different solution for facial recognition. It is imperative to mention that all the publications have been tested on databases that collect images from the west. For instance, the FaceNet algorithm was developed from the Labeled Faces in the Wild dataset which mostly comprises of faces from the West. Likewise, the VGGFACE algorithm was developed using the VGG Face Dataset, which the authors caution may not be representative of the global human population (</w:t>
+      </w:r>
+      <w:r>
+        <w:rPr>
+          <w:b w:val="false"/>
+          <w:bCs w:val="false"/>
+          <w:sz w:val="24"/>
+          <w:szCs w:val="24"/>
+        </w:rPr>
+        <w:t>Parkhi, Vedaldi, and Ziseerman, 2015)</w:t>
+      </w:r>
+      <w:r>
+        <w:rPr/>
+        <w:t>.</w:t>
+      </w:r>
+    </w:p>
+    <w:p>
+      <w:pPr>
+        <w:pStyle w:val="Normal"/>
+        <w:bidi w:val="0"/>
+        <w:spacing w:lineRule="auto" w:line="480"/>
+        <w:jc w:val="left"/>
+        <w:rPr/>
+      </w:pPr>
+      <w:r>
+        <w:rPr/>
+        <w:tab/>
+        <w:t>Apparently, most of the facial recognition systems that have been developed ignore the fact that Africans and Black Americans need to be included in the development of such systems. This is a crucial point because developing facial recognition systems that include Africans and black Americans would add value to the field of facial recognition. As an evidence of this, Najibi (2020) reveals that the existing technologies are subject to racial bias especially against Black Americans. Moreover, Krishnapriya, et al., (2019) conducted a study on racial bias and facial recognition systems and concluded that there is a significant false match rate on faces from Black Americans. Vital to the debate is the reality that some media sources highlight the fact that racial bias in facial recognition is a problem in most facial recognition software. Specifically, Lohr (2018) posits that Google had to apologize because their facial recognition system identified black Americans as gorillas.  This indicates that the existing software on facial recognition should be revolutionized to include black faces when developing such software.</w:t>
+      </w:r>
+    </w:p>
+    <w:p>
+      <w:pPr>
+        <w:pStyle w:val="Normal"/>
+        <w:bidi w:val="0"/>
+        <w:spacing w:lineRule="auto" w:line="480"/>
+        <w:jc w:val="left"/>
+        <w:rPr/>
+      </w:pPr>
+      <w:r>
+        <w:rPr/>
+        <w:tab/>
+      </w:r>
+      <w:r>
+        <w:rPr/>
+        <w:t xml:space="preserve">Clearly, most of the solutions that have been developed have focused of faces of people form the west but that is not all. This owes to the reality that none of the solutions that have been developed focused on images that have been extracted from smartphones. For example, the FaceNet  was developed using the labeled faces in the wild dataset, whose images were collected from the internet </w:t>
       </w:r>
       <w:r>
         <w:rPr/>
@@ -2306,115 +2346,60 @@
           <w:sz w:val="24"/>
           <w:szCs w:val="24"/>
         </w:rPr>
-        <w:t>Parkhi, Vedaldi, and Ziseerman, 2015)</w:t>
-      </w:r>
-      <w:r>
-        <w:rPr/>
-        <w:t>.</w:t>
-      </w:r>
-    </w:p>
-    <w:p>
-      <w:pPr>
-        <w:pStyle w:val="Normal"/>
-        <w:bidi w:val="0"/>
-        <w:spacing w:lineRule="auto" w:line="480"/>
-        <w:jc w:val="left"/>
-        <w:rPr/>
-      </w:pPr>
-      <w:r>
-        <w:rPr/>
-        <w:tab/>
-      </w:r>
-      <w:r>
-        <w:rPr/>
-        <w:t xml:space="preserve">Apparently, most of the facial recognition systems that have been developed ignore the fact that Africans and Black Americans need to be included in the development of such systems. This is a crucial point because developing facial recognition systems that include Africans and black Americans would add value to the field of facial recognition. As an evidence of this, </w:t>
-      </w:r>
-      <w:r>
-        <w:rPr/>
-        <w:t xml:space="preserve">Najibi (2020) reveals that the existing technologies are subject to racial bias especially against Black Americans. </w:t>
-      </w:r>
-      <w:r>
-        <w:rPr/>
-        <w:t>Moreover</w:t>
-      </w:r>
-      <w:r>
-        <w:rPr/>
-        <w:t xml:space="preserve">, Krishnapriya, </w:t>
-      </w:r>
-      <w:r>
-        <w:rPr/>
-        <w:t xml:space="preserve">et al., (2019) conducted a study on racial bias </w:t>
-      </w:r>
-      <w:r>
-        <w:rPr/>
-        <w:t>and</w:t>
-      </w:r>
-      <w:r>
-        <w:rPr/>
-        <w:t xml:space="preserve"> facial recognition systems and concluded that there is a significant false match rate on faces from Black Americans. </w:t>
-      </w:r>
-      <w:r>
-        <w:rPr/>
-        <w:t>Vital to the debate is the reality</w:t>
-      </w:r>
-      <w:r>
-        <w:rPr/>
-        <w:t xml:space="preserve"> that some media sources highlight the fact that racial bias in facial recognition is a problem in most facial recognition software. Specifically, </w:t>
-      </w:r>
-      <w:r>
-        <w:rPr/>
-        <w:t xml:space="preserve">Lohr (2018) posits that Google had to apologize because their facial recognition system identified black Americans as gorillas.  </w:t>
-      </w:r>
-      <w:r>
-        <w:rPr/>
-        <w:t>This indicates that the existing software on facial recognition should be revolutionized to include black faces when developing such software.</w:t>
-      </w:r>
-    </w:p>
-    <w:p>
-      <w:pPr>
-        <w:pStyle w:val="Normal"/>
-        <w:bidi w:val="0"/>
-        <w:spacing w:lineRule="auto" w:line="480"/>
-        <w:jc w:val="left"/>
-        <w:rPr/>
-      </w:pPr>
-      <w:r>
-        <w:rPr/>
-        <w:tab/>
-      </w:r>
-    </w:p>
-    <w:p>
-      <w:pPr>
-        <w:pStyle w:val="Normal"/>
-        <w:bidi w:val="0"/>
-        <w:spacing w:lineRule="auto" w:line="480"/>
-        <w:jc w:val="left"/>
-        <w:rPr/>
-      </w:pPr>
-      <w:r>
-        <w:rPr/>
-      </w:r>
-    </w:p>
-    <w:p>
-      <w:pPr>
-        <w:pStyle w:val="Normal"/>
-        <w:bidi w:val="0"/>
-        <w:spacing w:lineRule="auto" w:line="480"/>
-        <w:jc w:val="left"/>
-        <w:rPr/>
-      </w:pPr>
-      <w:r>
-        <w:rPr/>
-        <w:t xml:space="preserve">Imperative to the debate is the truth that some of the existing facial recognition systems use one hundred and twenty eight variables for facial recognition. According to </w:t>
-      </w:r>
-      <w:r>
-        <w:rPr>
-          <w:b w:val="false"/>
-          <w:bCs w:val="false"/>
-          <w:sz w:val="24"/>
-          <w:szCs w:val="24"/>
-        </w:rPr>
-        <w:t>Rehman et al., (2016) using a lot of variables in a machine learning model could result in the curse of dimensionality, which often results in overfitting. The same author also argues that a high number of predictor variables in a model always increases the accuracy of the resulting model. This paper proposes using forty two variables in the hope of examining whether the reduction from the traditional one hundred and twenty eight variables will result in a more efficient and accurate model.</w:t>
+        <w:t xml:space="preserve">Schroff, Kalenichenko, and Phiblin, </w:t>
+      </w:r>
+      <w:r>
+        <w:rPr>
+          <w:b w:val="false"/>
+          <w:bCs w:val="false"/>
+          <w:sz w:val="24"/>
+          <w:szCs w:val="24"/>
+        </w:rPr>
+        <w:t>2015)</w:t>
+      </w:r>
+      <w:r>
+        <w:rPr/>
+        <w:t xml:space="preserve">. </w:t>
+      </w:r>
+      <w:r>
+        <w:rPr/>
+        <w:t xml:space="preserve">Similarly, the DeepFace algorithm was developed using three different datasets:- the </w:t>
+      </w:r>
+      <w:r>
+        <w:rPr/>
+        <w:t xml:space="preserve">labeled faces in the wild dataset, </w:t>
+      </w:r>
+      <w:r>
+        <w:rPr/>
+        <w:t xml:space="preserve">the </w:t>
+      </w:r>
+      <w:r>
+        <w:rPr/>
+        <w:t>social face classification dataset (</w:t>
+      </w:r>
+      <w:r>
+        <w:rPr>
+          <w:rStyle w:val="Quotation"/>
+          <w:b w:val="false"/>
+          <w:bCs w:val="false"/>
+          <w:i w:val="false"/>
+          <w:iCs w:val="false"/>
+          <w:sz w:val="24"/>
+          <w:szCs w:val="24"/>
+        </w:rPr>
+        <w:t xml:space="preserve">Balaban, 2019), and the YouTube faces dataset (Ferrari, Berretti, and Del Bimbo, 2018). </w:t>
+      </w:r>
+      <w:r>
+        <w:rPr>
+          <w:rStyle w:val="Quotation"/>
+          <w:b w:val="false"/>
+          <w:bCs w:val="false"/>
+          <w:i w:val="false"/>
+          <w:iCs w:val="false"/>
+          <w:sz w:val="24"/>
+          <w:szCs w:val="24"/>
+        </w:rPr>
+        <w:t>Critical to the debate is the fact that the author did not find any facial recognition solution that was solely developed using smartphone images. In short, there is an array of publications on facial recognition but none of the papers based their solution on images that have been developed from Smartphone images.</w:t>
       </w:r>
     </w:p>
     <w:p>
@@ -2570,7 +2555,7 @@
         <w:pStyle w:val="Normal"/>
         <w:numPr>
           <w:ilvl w:val="0"/>
-          <w:numId w:val="2"/>
+          <w:numId w:val="1"/>
         </w:numPr>
         <w:bidi w:val="0"/>
         <w:spacing w:lineRule="auto" w:line="480"/>
@@ -2598,7 +2583,7 @@
         <w:pStyle w:val="Normal"/>
         <w:numPr>
           <w:ilvl w:val="0"/>
-          <w:numId w:val="2"/>
+          <w:numId w:val="1"/>
         </w:numPr>
         <w:bidi w:val="0"/>
         <w:spacing w:lineRule="auto" w:line="480"/>
@@ -2626,7 +2611,7 @@
         <w:pStyle w:val="Normal"/>
         <w:numPr>
           <w:ilvl w:val="0"/>
-          <w:numId w:val="2"/>
+          <w:numId w:val="1"/>
         </w:numPr>
         <w:bidi w:val="0"/>
         <w:spacing w:lineRule="auto" w:line="480"/>
@@ -2654,7 +2639,7 @@
         <w:pStyle w:val="Normal"/>
         <w:numPr>
           <w:ilvl w:val="0"/>
-          <w:numId w:val="2"/>
+          <w:numId w:val="1"/>
         </w:numPr>
         <w:bidi w:val="0"/>
         <w:spacing w:lineRule="auto" w:line="480"/>
@@ -2854,25 +2839,7 @@
           <w:szCs w:val="24"/>
         </w:rPr>
         <w:tab/>
-        <w:t xml:space="preserve">This section surveys previous works done  on facial recognition with a bias towards the objectives of this work. It begins with examining different types of methodologies that have been used for facial recognition before delving into how different types of neural networks have been used for facial recognition. Specifically, this proposal discusses how convolution neural networks,  recurrent neural networks, and long short term memory neural networks have been used for facial recognition. Finally, the proposal examines machine learning workflows from previous publications and how those workflows can be applied </w:t>
-      </w:r>
-      <w:r>
-        <w:rPr>
-          <w:b w:val="false"/>
-          <w:bCs w:val="false"/>
-          <w:sz w:val="24"/>
-          <w:szCs w:val="24"/>
-        </w:rPr>
-        <w:t>to</w:t>
-      </w:r>
-      <w:r>
-        <w:rPr>
-          <w:b w:val="false"/>
-          <w:bCs w:val="false"/>
-          <w:sz w:val="24"/>
-          <w:szCs w:val="24"/>
-        </w:rPr>
-        <w:t xml:space="preserve"> facial recognition.</w:t>
+        <w:t>This section surveys previous works done  on facial recognition with a bias towards the objectives of this work. It begins with examining different types of methodologies that have been used for facial recognition before delving into how different types of neural networks have been used for facial recognition. Specifically, this proposal discusses how convolution neural networks,  recurrent neural networks, and long short term memory neural networks have been used for facial recognition. Finally, the proposal examines machine learning workflows from previous publications and how those workflows can be applied to facial recognition.</w:t>
       </w:r>
     </w:p>
     <w:p>
@@ -3596,6 +3563,107 @@
       </w:pPr>
       <w:r>
         <w:rPr>
+          <w:rStyle w:val="Quotation"/>
+          <w:b w:val="false"/>
+          <w:bCs w:val="false"/>
+          <w:i w:val="false"/>
+          <w:iCs w:val="false"/>
+          <w:sz w:val="24"/>
+          <w:szCs w:val="24"/>
+        </w:rPr>
+        <w:t>Balaban, S. (201</w:t>
+      </w:r>
+      <w:r>
+        <w:rPr>
+          <w:rStyle w:val="Quotation"/>
+          <w:b w:val="false"/>
+          <w:bCs w:val="false"/>
+          <w:i w:val="false"/>
+          <w:iCs w:val="false"/>
+          <w:sz w:val="24"/>
+          <w:szCs w:val="24"/>
+        </w:rPr>
+        <w:t>9</w:t>
+      </w:r>
+      <w:r>
+        <w:rPr>
+          <w:rStyle w:val="Quotation"/>
+          <w:b w:val="false"/>
+          <w:bCs w:val="false"/>
+          <w:i w:val="false"/>
+          <w:iCs w:val="false"/>
+          <w:sz w:val="24"/>
+          <w:szCs w:val="24"/>
+        </w:rPr>
+        <w:t>).</w:t>
+      </w:r>
+      <w:r>
+        <w:rPr>
+          <w:rStyle w:val="Quotation"/>
+          <w:b w:val="false"/>
+          <w:bCs w:val="false"/>
+          <w:sz w:val="24"/>
+          <w:szCs w:val="24"/>
+        </w:rPr>
+        <w:t xml:space="preserve"> Deep learning and face recognition: the state of the art. </w:t>
+      </w:r>
+      <w:r>
+        <w:rPr>
+          <w:rStyle w:val="Quotation"/>
+          <w:b w:val="false"/>
+          <w:bCs w:val="false"/>
+          <w:i w:val="false"/>
+          <w:iCs w:val="false"/>
+          <w:sz w:val="24"/>
+          <w:szCs w:val="24"/>
+        </w:rPr>
+        <w:t xml:space="preserve">Retrieved from: </w:t>
+      </w:r>
+    </w:p>
+    <w:p>
+      <w:pPr>
+        <w:pStyle w:val="Normal"/>
+        <w:bidi w:val="0"/>
+        <w:spacing w:lineRule="auto" w:line="480"/>
+        <w:jc w:val="left"/>
+        <w:rPr>
+          <w:b w:val="false"/>
+          <w:b w:val="false"/>
+          <w:bCs w:val="false"/>
+          <w:sz w:val="24"/>
+          <w:szCs w:val="24"/>
+        </w:rPr>
+      </w:pPr>
+      <w:r>
+        <w:rPr>
+          <w:rStyle w:val="Quotation"/>
+          <w:b w:val="false"/>
+          <w:bCs w:val="false"/>
+          <w:i w:val="false"/>
+          <w:iCs w:val="false"/>
+          <w:sz w:val="24"/>
+          <w:szCs w:val="24"/>
+        </w:rPr>
+        <w:tab/>
+        <w:t>https://arxiv.org/pdf/1902.03524v1.pdf</w:t>
+      </w:r>
+    </w:p>
+    <w:p>
+      <w:pPr>
+        <w:pStyle w:val="Normal"/>
+        <w:bidi w:val="0"/>
+        <w:spacing w:lineRule="auto" w:line="480"/>
+        <w:jc w:val="left"/>
+        <w:rPr>
+          <w:b w:val="false"/>
+          <w:b w:val="false"/>
+          <w:bCs w:val="false"/>
+          <w:sz w:val="24"/>
+          <w:szCs w:val="24"/>
+        </w:rPr>
+      </w:pPr>
+      <w:r>
+        <w:rPr>
           <w:b w:val="false"/>
           <w:bCs w:val="false"/>
           <w:sz w:val="24"/>
@@ -3860,6 +3928,49 @@
       <w:r>
         <w:rPr/>
         <w:t>13(02): 4-12. https://doi:10.3991/ijim.v13i02.6726</w:t>
+      </w:r>
+    </w:p>
+    <w:p>
+      <w:pPr>
+        <w:pStyle w:val="Normal"/>
+        <w:bidi w:val="0"/>
+        <w:spacing w:lineRule="auto" w:line="480"/>
+        <w:jc w:val="left"/>
+        <w:rPr/>
+      </w:pPr>
+      <w:r>
+        <w:rPr/>
+        <w:t xml:space="preserve">Ferrari, C., Berretti, S., &amp; Del Bimbo, A. (2018). </w:t>
+      </w:r>
+      <w:r>
+        <w:rPr>
+          <w:i/>
+          <w:iCs/>
+        </w:rPr>
+        <w:t xml:space="preserve">Extended YouTube Faces: a Dataset for </w:t>
+      </w:r>
+    </w:p>
+    <w:p>
+      <w:pPr>
+        <w:pStyle w:val="Normal"/>
+        <w:bidi w:val="0"/>
+        <w:spacing w:lineRule="auto" w:line="480"/>
+        <w:jc w:val="left"/>
+        <w:rPr/>
+      </w:pPr>
+      <w:r>
+        <w:rPr>
+          <w:i/>
+          <w:iCs/>
+        </w:rPr>
+        <w:tab/>
+        <w:t>Heterogeneous Open-Set Face Identification</w:t>
+      </w:r>
+      <w:r>
+        <w:rPr/>
+        <w:t xml:space="preserve">. 2018 24th International Conference on Pattern </w:t>
+        <w:tab/>
+        <w:t>Recognition (ICPR), 3408–3413. doi:10.1109/ICPR.2018.8545642</w:t>
       </w:r>
     </w:p>
     <w:p>
@@ -4747,6 +4858,135 @@
           <w:iCs w:val="false"/>
         </w:rPr>
         <w:t>10.1007/s41019-016-0022-0</w:t>
+      </w:r>
+    </w:p>
+    <w:p>
+      <w:pPr>
+        <w:pStyle w:val="Normal"/>
+        <w:bidi w:val="0"/>
+        <w:spacing w:lineRule="auto" w:line="480"/>
+        <w:jc w:val="left"/>
+        <w:rPr>
+          <w:b w:val="false"/>
+          <w:b w:val="false"/>
+          <w:bCs w:val="false"/>
+          <w:sz w:val="24"/>
+          <w:szCs w:val="24"/>
+        </w:rPr>
+      </w:pPr>
+      <w:r>
+        <w:rPr>
+          <w:b w:val="false"/>
+          <w:bCs w:val="false"/>
+          <w:sz w:val="24"/>
+          <w:szCs w:val="24"/>
+        </w:rPr>
+        <w:t>Schroff, F., Kalenichenko, D., and Phiblin, J. (2015-</w:t>
+      </w:r>
+      <w:r>
+        <w:rPr>
+          <w:b w:val="false"/>
+          <w:bCs w:val="false"/>
+          <w:sz w:val="24"/>
+          <w:szCs w:val="24"/>
+        </w:rPr>
+        <w:t>07-12</w:t>
+      </w:r>
+      <w:r>
+        <w:rPr>
+          <w:b w:val="false"/>
+          <w:bCs w:val="false"/>
+          <w:sz w:val="24"/>
+          <w:szCs w:val="24"/>
+        </w:rPr>
+        <w:t xml:space="preserve">). </w:t>
+      </w:r>
+      <w:r>
+        <w:rPr>
+          <w:b w:val="false"/>
+          <w:bCs w:val="false"/>
+          <w:i/>
+          <w:iCs/>
+          <w:sz w:val="24"/>
+          <w:szCs w:val="24"/>
+        </w:rPr>
+        <w:t xml:space="preserve">FaceNet: A unified embedding for face </w:t>
+      </w:r>
+    </w:p>
+    <w:p>
+      <w:pPr>
+        <w:pStyle w:val="Normal"/>
+        <w:bidi w:val="0"/>
+        <w:spacing w:lineRule="auto" w:line="480"/>
+        <w:jc w:val="left"/>
+        <w:rPr>
+          <w:b w:val="false"/>
+          <w:b w:val="false"/>
+          <w:bCs w:val="false"/>
+          <w:sz w:val="24"/>
+          <w:szCs w:val="24"/>
+        </w:rPr>
+      </w:pPr>
+      <w:r>
+        <w:rPr>
+          <w:b w:val="false"/>
+          <w:bCs w:val="false"/>
+          <w:i/>
+          <w:iCs/>
+          <w:sz w:val="24"/>
+          <w:szCs w:val="24"/>
+        </w:rPr>
+        <w:tab/>
+        <w:t>recognition and clustering</w:t>
+      </w:r>
+      <w:r>
+        <w:rPr>
+          <w:b w:val="false"/>
+          <w:bCs w:val="false"/>
+          <w:sz w:val="24"/>
+          <w:szCs w:val="24"/>
+        </w:rPr>
+        <w:t xml:space="preserve">, 2015 IEEE Conference on Computer Vision and Pattern </w:t>
+        <w:tab/>
+        <w:t xml:space="preserve">Recognition,  </w:t>
+      </w:r>
+      <w:r>
+        <w:rPr>
+          <w:b w:val="false"/>
+          <w:bCs w:val="false"/>
+          <w:sz w:val="24"/>
+          <w:szCs w:val="24"/>
+        </w:rPr>
+        <w:t>Boston, MA, USA.</w:t>
+      </w:r>
+      <w:r>
+        <w:rPr>
+          <w:b w:val="false"/>
+          <w:bCs w:val="false"/>
+          <w:sz w:val="24"/>
+          <w:szCs w:val="24"/>
+        </w:rPr>
+        <w:t xml:space="preserve"> </w:t>
+      </w:r>
+      <w:r>
+        <w:rPr>
+          <w:b w:val="false"/>
+          <w:bCs w:val="false"/>
+          <w:i w:val="false"/>
+          <w:iCs w:val="false"/>
+          <w:sz w:val="24"/>
+          <w:szCs w:val="24"/>
+        </w:rPr>
+        <w:t>https://</w:t>
+      </w:r>
+      <w:r>
+        <w:rPr>
+          <w:b w:val="false"/>
+          <w:bCs w:val="false"/>
+          <w:sz w:val="24"/>
+          <w:szCs w:val="24"/>
+        </w:rPr>
+        <w:t>doi: 10.1109/CVPR.2015.7298682.</w:t>
       </w:r>
     </w:p>
     <w:p>
@@ -4997,125 +5237,6 @@
   <w:abstractNum w:abstractNumId="1">
     <w:lvl w:ilvl="0">
       <w:start w:val="1"/>
-      <w:numFmt w:val="none"/>
-      <w:suff w:val="nothing"/>
-      <w:lvlText w:val="%1"/>
-      <w:lvlJc w:val="left"/>
-      <w:pPr>
-        <w:tabs>
-          <w:tab w:val="num" w:pos="0"/>
-        </w:tabs>
-        <w:ind w:left="0" w:hanging="0"/>
-      </w:pPr>
-    </w:lvl>
-    <w:lvl w:ilvl="1">
-      <w:start w:val="1"/>
-      <w:numFmt w:val="none"/>
-      <w:suff w:val="nothing"/>
-      <w:lvlText w:val="%2"/>
-      <w:lvlJc w:val="left"/>
-      <w:pPr>
-        <w:tabs>
-          <w:tab w:val="num" w:pos="0"/>
-        </w:tabs>
-        <w:ind w:left="0" w:hanging="0"/>
-      </w:pPr>
-    </w:lvl>
-    <w:lvl w:ilvl="2">
-      <w:start w:val="1"/>
-      <w:numFmt w:val="none"/>
-      <w:suff w:val="nothing"/>
-      <w:lvlText w:val="%3"/>
-      <w:lvlJc w:val="left"/>
-      <w:pPr>
-        <w:tabs>
-          <w:tab w:val="num" w:pos="0"/>
-        </w:tabs>
-        <w:ind w:left="0" w:hanging="0"/>
-      </w:pPr>
-    </w:lvl>
-    <w:lvl w:ilvl="3">
-      <w:start w:val="1"/>
-      <w:numFmt w:val="none"/>
-      <w:suff w:val="nothing"/>
-      <w:lvlText w:val="%4"/>
-      <w:lvlJc w:val="left"/>
-      <w:pPr>
-        <w:tabs>
-          <w:tab w:val="num" w:pos="0"/>
-        </w:tabs>
-        <w:ind w:left="0" w:hanging="0"/>
-      </w:pPr>
-    </w:lvl>
-    <w:lvl w:ilvl="4">
-      <w:start w:val="1"/>
-      <w:numFmt w:val="none"/>
-      <w:suff w:val="nothing"/>
-      <w:lvlText w:val="%5"/>
-      <w:lvlJc w:val="left"/>
-      <w:pPr>
-        <w:tabs>
-          <w:tab w:val="num" w:pos="0"/>
-        </w:tabs>
-        <w:ind w:left="0" w:hanging="0"/>
-      </w:pPr>
-    </w:lvl>
-    <w:lvl w:ilvl="5">
-      <w:start w:val="1"/>
-      <w:numFmt w:val="none"/>
-      <w:suff w:val="nothing"/>
-      <w:lvlText w:val="%6"/>
-      <w:lvlJc w:val="left"/>
-      <w:pPr>
-        <w:tabs>
-          <w:tab w:val="num" w:pos="0"/>
-        </w:tabs>
-        <w:ind w:left="0" w:hanging="0"/>
-      </w:pPr>
-    </w:lvl>
-    <w:lvl w:ilvl="6">
-      <w:start w:val="1"/>
-      <w:numFmt w:val="none"/>
-      <w:suff w:val="nothing"/>
-      <w:lvlText w:val="%7"/>
-      <w:lvlJc w:val="left"/>
-      <w:pPr>
-        <w:tabs>
-          <w:tab w:val="num" w:pos="0"/>
-        </w:tabs>
-        <w:ind w:left="0" w:hanging="0"/>
-      </w:pPr>
-    </w:lvl>
-    <w:lvl w:ilvl="7">
-      <w:start w:val="1"/>
-      <w:numFmt w:val="none"/>
-      <w:suff w:val="nothing"/>
-      <w:lvlText w:val="%8"/>
-      <w:lvlJc w:val="left"/>
-      <w:pPr>
-        <w:tabs>
-          <w:tab w:val="num" w:pos="0"/>
-        </w:tabs>
-        <w:ind w:left="0" w:hanging="0"/>
-      </w:pPr>
-    </w:lvl>
-    <w:lvl w:ilvl="8">
-      <w:start w:val="1"/>
-      <w:numFmt w:val="none"/>
-      <w:suff w:val="nothing"/>
-      <w:lvlText w:val="%9"/>
-      <w:lvlJc w:val="left"/>
-      <w:pPr>
-        <w:tabs>
-          <w:tab w:val="num" w:pos="0"/>
-        </w:tabs>
-        <w:ind w:left="0" w:hanging="0"/>
-      </w:pPr>
-    </w:lvl>
-  </w:abstractNum>
-  <w:abstractNum w:abstractNumId="2">
-    <w:lvl w:ilvl="0">
-      <w:start w:val="1"/>
       <w:numFmt w:val="decimal"/>
       <w:lvlText w:val="%1."/>
       <w:lvlJc w:val="left"/>
@@ -5230,6 +5351,125 @@
         <w:ind w:left="3600" w:hanging="360"/>
       </w:pPr>
       <w:rPr/>
+    </w:lvl>
+  </w:abstractNum>
+  <w:abstractNum w:abstractNumId="2">
+    <w:lvl w:ilvl="0">
+      <w:start w:val="1"/>
+      <w:numFmt w:val="none"/>
+      <w:suff w:val="nothing"/>
+      <w:lvlText w:val=""/>
+      <w:lvlJc w:val="left"/>
+      <w:pPr>
+        <w:tabs>
+          <w:tab w:val="num" w:pos="0"/>
+        </w:tabs>
+        <w:ind w:left="0" w:hanging="0"/>
+      </w:pPr>
+    </w:lvl>
+    <w:lvl w:ilvl="1">
+      <w:start w:val="1"/>
+      <w:numFmt w:val="none"/>
+      <w:suff w:val="nothing"/>
+      <w:lvlText w:val=""/>
+      <w:lvlJc w:val="left"/>
+      <w:pPr>
+        <w:tabs>
+          <w:tab w:val="num" w:pos="0"/>
+        </w:tabs>
+        <w:ind w:left="0" w:hanging="0"/>
+      </w:pPr>
+    </w:lvl>
+    <w:lvl w:ilvl="2">
+      <w:start w:val="1"/>
+      <w:numFmt w:val="none"/>
+      <w:suff w:val="nothing"/>
+      <w:lvlText w:val=""/>
+      <w:lvlJc w:val="left"/>
+      <w:pPr>
+        <w:tabs>
+          <w:tab w:val="num" w:pos="0"/>
+        </w:tabs>
+        <w:ind w:left="0" w:hanging="0"/>
+      </w:pPr>
+    </w:lvl>
+    <w:lvl w:ilvl="3">
+      <w:start w:val="1"/>
+      <w:numFmt w:val="none"/>
+      <w:suff w:val="nothing"/>
+      <w:lvlText w:val=""/>
+      <w:lvlJc w:val="left"/>
+      <w:pPr>
+        <w:tabs>
+          <w:tab w:val="num" w:pos="0"/>
+        </w:tabs>
+        <w:ind w:left="0" w:hanging="0"/>
+      </w:pPr>
+    </w:lvl>
+    <w:lvl w:ilvl="4">
+      <w:start w:val="1"/>
+      <w:numFmt w:val="none"/>
+      <w:suff w:val="nothing"/>
+      <w:lvlText w:val=""/>
+      <w:lvlJc w:val="left"/>
+      <w:pPr>
+        <w:tabs>
+          <w:tab w:val="num" w:pos="0"/>
+        </w:tabs>
+        <w:ind w:left="0" w:hanging="0"/>
+      </w:pPr>
+    </w:lvl>
+    <w:lvl w:ilvl="5">
+      <w:start w:val="1"/>
+      <w:numFmt w:val="none"/>
+      <w:suff w:val="nothing"/>
+      <w:lvlText w:val=""/>
+      <w:lvlJc w:val="left"/>
+      <w:pPr>
+        <w:tabs>
+          <w:tab w:val="num" w:pos="0"/>
+        </w:tabs>
+        <w:ind w:left="0" w:hanging="0"/>
+      </w:pPr>
+    </w:lvl>
+    <w:lvl w:ilvl="6">
+      <w:start w:val="1"/>
+      <w:numFmt w:val="none"/>
+      <w:suff w:val="nothing"/>
+      <w:lvlText w:val=""/>
+      <w:lvlJc w:val="left"/>
+      <w:pPr>
+        <w:tabs>
+          <w:tab w:val="num" w:pos="0"/>
+        </w:tabs>
+        <w:ind w:left="0" w:hanging="0"/>
+      </w:pPr>
+    </w:lvl>
+    <w:lvl w:ilvl="7">
+      <w:start w:val="1"/>
+      <w:numFmt w:val="none"/>
+      <w:suff w:val="nothing"/>
+      <w:lvlText w:val=""/>
+      <w:lvlJc w:val="left"/>
+      <w:pPr>
+        <w:tabs>
+          <w:tab w:val="num" w:pos="0"/>
+        </w:tabs>
+        <w:ind w:left="0" w:hanging="0"/>
+      </w:pPr>
+    </w:lvl>
+    <w:lvl w:ilvl="8">
+      <w:start w:val="1"/>
+      <w:numFmt w:val="none"/>
+      <w:suff w:val="nothing"/>
+      <w:lvlText w:val=""/>
+      <w:lvlJc w:val="left"/>
+      <w:pPr>
+        <w:tabs>
+          <w:tab w:val="num" w:pos="0"/>
+        </w:tabs>
+        <w:ind w:left="0" w:hanging="0"/>
+      </w:pPr>
     </w:lvl>
   </w:abstractNum>
   <w:num w:numId="1">
@@ -5265,9 +5505,7 @@
     <w:pPr>
       <w:widowControl/>
       <w:suppressAutoHyphens w:val="true"/>
-      <w:kinsoku w:val="true"/>
-      <w:overflowPunct w:val="false"/>
-      <w:autoSpaceDE w:val="true"/>
+      <w:overflowPunct w:val="true"/>
       <w:bidi w:val="0"/>
       <w:spacing w:before="0" w:after="0"/>
       <w:jc w:val="left"/>
@@ -5375,6 +5613,22 @@
     <w:qFormat/>
     <w:rPr/>
   </w:style>
+  <w:style w:type="character" w:styleId="Quotation">
+    <w:name w:val="Quotation"/>
+    <w:qFormat/>
+    <w:rPr>
+      <w:i/>
+      <w:iCs/>
+    </w:rPr>
+  </w:style>
+  <w:style w:type="character" w:styleId="Emphasis">
+    <w:name w:val="Emphasis"/>
+    <w:qFormat/>
+    <w:rPr>
+      <w:i/>
+      <w:iCs/>
+    </w:rPr>
+  </w:style>
   <w:style w:type="paragraph" w:styleId="Heading">
     <w:name w:val="Heading"/>
     <w:basedOn w:val="Normal"/>

</xml_diff>

<commit_message>
Add update justification of the study
</commit_message>
<xml_diff>
--- a/SikoliaThesis.docx
+++ b/SikoliaThesis.docx
@@ -2330,52 +2330,20 @@
       <w:r>
         <w:rPr/>
         <w:tab/>
-      </w:r>
-      <w:r>
-        <w:rPr/>
-        <w:t xml:space="preserve">Clearly, most of the solutions that have been developed have focused of faces of people form the west but that is not all. This owes to the reality that none of the solutions that have been developed focused on images that have been extracted from smartphones. For example, the FaceNet  was developed using the labeled faces in the wild dataset, whose images were collected from the internet </w:t>
-      </w:r>
-      <w:r>
-        <w:rPr/>
-        <w:t>(</w:t>
-      </w:r>
-      <w:r>
-        <w:rPr>
-          <w:b w:val="false"/>
-          <w:bCs w:val="false"/>
-          <w:sz w:val="24"/>
-          <w:szCs w:val="24"/>
-        </w:rPr>
-        <w:t xml:space="preserve">Schroff, Kalenichenko, and Phiblin, </w:t>
-      </w:r>
-      <w:r>
-        <w:rPr>
-          <w:b w:val="false"/>
-          <w:bCs w:val="false"/>
-          <w:sz w:val="24"/>
-          <w:szCs w:val="24"/>
-        </w:rPr>
-        <w:t>2015)</w:t>
-      </w:r>
-      <w:r>
-        <w:rPr/>
-        <w:t xml:space="preserve">. </w:t>
-      </w:r>
-      <w:r>
-        <w:rPr/>
-        <w:t xml:space="preserve">Similarly, the DeepFace algorithm was developed using three different datasets:- the </w:t>
-      </w:r>
-      <w:r>
-        <w:rPr/>
-        <w:t xml:space="preserve">labeled faces in the wild dataset, </w:t>
-      </w:r>
-      <w:r>
-        <w:rPr/>
-        <w:t xml:space="preserve">the </w:t>
-      </w:r>
-      <w:r>
-        <w:rPr/>
-        <w:t>social face classification dataset (</w:t>
+        <w:t>Clearly, most of the solutions that have been developed have focused of faces of people form the west but that is not all. This owes to the reality that none of the solutions that have been developed focused on images that have been extracted from smartphones. For example, the FaceNet  was developed using the labeled faces in the wild dataset, whose images were collected from the internet (</w:t>
+      </w:r>
+      <w:r>
+        <w:rPr>
+          <w:b w:val="false"/>
+          <w:bCs w:val="false"/>
+          <w:sz w:val="24"/>
+          <w:szCs w:val="24"/>
+        </w:rPr>
+        <w:t>Schroff, Kalenichenko, and Phiblin, 2015)</w:t>
+      </w:r>
+      <w:r>
+        <w:rPr/>
+        <w:t>. Similarly, the DeepFace algorithm was developed using three different datasets:- the labeled faces in the wild dataset, the social face classification dataset (</w:t>
       </w:r>
       <w:r>
         <w:rPr>
@@ -2387,19 +2355,7 @@
           <w:sz w:val="24"/>
           <w:szCs w:val="24"/>
         </w:rPr>
-        <w:t xml:space="preserve">Balaban, 2019), and the YouTube faces dataset (Ferrari, Berretti, and Del Bimbo, 2018). </w:t>
-      </w:r>
-      <w:r>
-        <w:rPr>
-          <w:rStyle w:val="Quotation"/>
-          <w:b w:val="false"/>
-          <w:bCs w:val="false"/>
-          <w:i w:val="false"/>
-          <w:iCs w:val="false"/>
-          <w:sz w:val="24"/>
-          <w:szCs w:val="24"/>
-        </w:rPr>
-        <w:t>Critical to the debate is the fact that the author did not find any facial recognition solution that was solely developed using smartphone images. In short, there is an array of publications on facial recognition but none of the papers based their solution on images that have been developed from Smartphone images.</w:t>
+        <w:t>Balaban, 2019), and the YouTube faces dataset (Ferrari, Berretti, and Del Bimbo, 2018). Critical to the debate is the fact that the author did not find any facial recognition solution that was solely developed using smartphone images. In short, there is an array of publications on facial recognition but none of the papers based their solution on images that have been developed from Smartphone images.</w:t>
       </w:r>
     </w:p>
     <w:p>
@@ -2448,6 +2404,323 @@
           <w:szCs w:val="24"/>
         </w:rPr>
         <w:tab/>
+      </w:r>
+      <w:r>
+        <w:rPr>
+          <w:b w:val="false"/>
+          <w:bCs w:val="false"/>
+          <w:sz w:val="24"/>
+          <w:szCs w:val="24"/>
+        </w:rPr>
+        <w:t xml:space="preserve">A smartphone could be elucidated as a phone with advanced features such internet connectivity, software usage, and connection to a cellular network. Critical to the debate is the reality that the advanced features on smartphones have made smartphones a household item today. </w:t>
+      </w:r>
+    </w:p>
+    <w:p>
+      <w:pPr>
+        <w:pStyle w:val="Normal"/>
+        <w:bidi w:val="0"/>
+        <w:spacing w:lineRule="auto" w:line="480"/>
+        <w:jc w:val="left"/>
+        <w:rPr>
+          <w:b w:val="false"/>
+          <w:b w:val="false"/>
+          <w:bCs w:val="false"/>
+          <w:sz w:val="24"/>
+          <w:szCs w:val="24"/>
+        </w:rPr>
+      </w:pPr>
+      <w:r>
+        <w:rPr>
+          <w:b w:val="false"/>
+          <w:bCs w:val="false"/>
+          <w:sz w:val="24"/>
+          <w:szCs w:val="24"/>
+        </w:rPr>
+        <w:t>It is because t</w:t>
+      </w:r>
+      <w:r>
+        <w:rPr>
+          <w:b w:val="false"/>
+          <w:bCs w:val="false"/>
+          <w:sz w:val="24"/>
+          <w:szCs w:val="24"/>
+        </w:rPr>
+        <w:t>hese features have s</w:t>
+      </w:r>
+      <w:r>
+        <w:rPr>
+          <w:b w:val="false"/>
+          <w:bCs w:val="false"/>
+          <w:sz w:val="24"/>
+          <w:szCs w:val="24"/>
+        </w:rPr>
+        <w:t xml:space="preserve">martphones </w:t>
+      </w:r>
+      <w:r>
+        <w:rPr>
+          <w:b w:val="false"/>
+          <w:bCs w:val="false"/>
+          <w:sz w:val="24"/>
+          <w:szCs w:val="24"/>
+        </w:rPr>
+        <w:t>applicable cases such as</w:t>
+      </w:r>
+      <w:r>
+        <w:rPr>
+          <w:b w:val="false"/>
+          <w:bCs w:val="false"/>
+          <w:sz w:val="24"/>
+          <w:szCs w:val="24"/>
+        </w:rPr>
+        <w:t xml:space="preserve"> interpersonal communication, entertainment, learning, and </w:t>
+      </w:r>
+      <w:r>
+        <w:rPr>
+          <w:b w:val="false"/>
+          <w:bCs w:val="false"/>
+          <w:sz w:val="24"/>
+          <w:szCs w:val="24"/>
+        </w:rPr>
+        <w:t xml:space="preserve">even making business transactions. </w:t>
+      </w:r>
+      <w:r>
+        <w:rPr>
+          <w:b w:val="false"/>
+          <w:bCs w:val="false"/>
+          <w:sz w:val="24"/>
+          <w:szCs w:val="24"/>
+        </w:rPr>
+        <w:t>U</w:t>
+      </w:r>
+      <w:r>
+        <w:rPr>
+          <w:b w:val="false"/>
+          <w:bCs w:val="false"/>
+          <w:sz w:val="24"/>
+          <w:szCs w:val="24"/>
+        </w:rPr>
+        <w:t>nlike desktop computer</w:t>
+      </w:r>
+      <w:r>
+        <w:rPr>
+          <w:b w:val="false"/>
+          <w:bCs w:val="false"/>
+          <w:sz w:val="24"/>
+          <w:szCs w:val="24"/>
+        </w:rPr>
+        <w:t>s</w:t>
+      </w:r>
+      <w:r>
+        <w:rPr>
+          <w:b w:val="false"/>
+          <w:bCs w:val="false"/>
+          <w:sz w:val="24"/>
+          <w:szCs w:val="24"/>
+        </w:rPr>
+        <w:t xml:space="preserve"> or a laptop</w:t>
+      </w:r>
+      <w:r>
+        <w:rPr>
+          <w:b w:val="false"/>
+          <w:bCs w:val="false"/>
+          <w:sz w:val="24"/>
+          <w:szCs w:val="24"/>
+        </w:rPr>
+        <w:t>s</w:t>
+      </w:r>
+      <w:r>
+        <w:rPr>
+          <w:b w:val="false"/>
+          <w:bCs w:val="false"/>
+          <w:sz w:val="24"/>
+          <w:szCs w:val="24"/>
+        </w:rPr>
+        <w:t xml:space="preserve">, a smartphone is portable because it can fit into a pocket comfortably. As a result, smartphones have penetrated the global market like no other device. This owes to the truth that </w:t>
+      </w:r>
+      <w:r>
+        <w:rPr>
+          <w:b w:val="false"/>
+          <w:bCs w:val="false"/>
+          <w:sz w:val="24"/>
+          <w:szCs w:val="24"/>
+        </w:rPr>
+        <w:t>T</w:t>
+      </w:r>
+      <w:r>
+        <w:rPr>
+          <w:b w:val="false"/>
+          <w:bCs w:val="false"/>
+          <w:sz w:val="24"/>
+          <w:szCs w:val="24"/>
+        </w:rPr>
+        <w:t xml:space="preserve">he United Nations (2021) argues that </w:t>
+      </w:r>
+      <w:r>
+        <w:rPr>
+          <w:b w:val="false"/>
+          <w:bCs w:val="false"/>
+          <w:sz w:val="24"/>
+          <w:szCs w:val="24"/>
+        </w:rPr>
+        <w:t xml:space="preserve">the current market for laptops is estimated at </w:t>
+      </w:r>
+      <w:r>
+        <w:rPr>
+          <w:b w:val="false"/>
+          <w:bCs w:val="false"/>
+          <w:sz w:val="24"/>
+          <w:szCs w:val="24"/>
+        </w:rPr>
+        <w:t xml:space="preserve">$102 billion and </w:t>
+      </w:r>
+      <w:r>
+        <w:rPr>
+          <w:b w:val="false"/>
+          <w:bCs w:val="false"/>
+          <w:sz w:val="24"/>
+          <w:szCs w:val="24"/>
+        </w:rPr>
+        <w:t>while that of</w:t>
+      </w:r>
+      <w:r>
+        <w:rPr>
+          <w:b w:val="false"/>
+          <w:bCs w:val="false"/>
+          <w:sz w:val="24"/>
+          <w:szCs w:val="24"/>
+        </w:rPr>
+        <w:t xml:space="preserve"> smartphones is </w:t>
+      </w:r>
+      <w:r>
+        <w:rPr>
+          <w:b w:val="false"/>
+          <w:bCs w:val="false"/>
+          <w:sz w:val="24"/>
+          <w:szCs w:val="24"/>
+        </w:rPr>
+        <w:t xml:space="preserve">estimated at </w:t>
+      </w:r>
+      <w:r>
+        <w:rPr>
+          <w:b w:val="false"/>
+          <w:bCs w:val="false"/>
+          <w:sz w:val="24"/>
+          <w:szCs w:val="24"/>
+        </w:rPr>
+        <w:t xml:space="preserve">$522 billion. </w:t>
+      </w:r>
+      <w:r>
+        <w:rPr>
+          <w:b w:val="false"/>
+          <w:bCs w:val="false"/>
+          <w:sz w:val="24"/>
+          <w:szCs w:val="24"/>
+        </w:rPr>
+        <w:t xml:space="preserve">In a different, paper </w:t>
+      </w:r>
+      <w:r>
+        <w:rPr>
+          <w:b w:val="false"/>
+          <w:bCs w:val="false"/>
+          <w:sz w:val="24"/>
+          <w:szCs w:val="24"/>
+        </w:rPr>
+        <w:t>Liu and Ellis (2021) argue that an estimated 6.4 billion people in the entire globe own a smartphone. T</w:t>
+      </w:r>
+      <w:r>
+        <w:rPr>
+          <w:b w:val="false"/>
+          <w:bCs w:val="false"/>
+          <w:sz w:val="24"/>
+          <w:szCs w:val="24"/>
+        </w:rPr>
+        <w:t xml:space="preserve">he United Nations (2021) </w:t>
+      </w:r>
+      <w:r>
+        <w:rPr>
+          <w:b w:val="false"/>
+          <w:bCs w:val="false"/>
+          <w:sz w:val="24"/>
+          <w:szCs w:val="24"/>
+        </w:rPr>
+        <w:t>also argues that the number of smartphone usage in Sub Saharan Africa rose by 28 percentage points between 2014 and 2018. This is a clear indicator that Smartphones are used by a majority of people from the entire world.</w:t>
+      </w:r>
+    </w:p>
+    <w:p>
+      <w:pPr>
+        <w:pStyle w:val="Normal"/>
+        <w:bidi w:val="0"/>
+        <w:spacing w:lineRule="auto" w:line="480"/>
+        <w:jc w:val="left"/>
+        <w:rPr>
+          <w:b w:val="false"/>
+          <w:b w:val="false"/>
+          <w:bCs w:val="false"/>
+          <w:sz w:val="24"/>
+          <w:szCs w:val="24"/>
+        </w:rPr>
+      </w:pPr>
+      <w:r>
+        <w:rPr/>
+      </w:r>
+    </w:p>
+    <w:p>
+      <w:pPr>
+        <w:pStyle w:val="Normal"/>
+        <w:bidi w:val="0"/>
+        <w:spacing w:lineRule="auto" w:line="480"/>
+        <w:jc w:val="left"/>
+        <w:rPr>
+          <w:b w:val="false"/>
+          <w:b w:val="false"/>
+          <w:bCs w:val="false"/>
+          <w:sz w:val="24"/>
+          <w:szCs w:val="24"/>
+        </w:rPr>
+      </w:pPr>
+      <w:r>
+        <w:rPr/>
+      </w:r>
+    </w:p>
+    <w:p>
+      <w:pPr>
+        <w:pStyle w:val="Normal"/>
+        <w:bidi w:val="0"/>
+        <w:spacing w:lineRule="auto" w:line="480"/>
+        <w:jc w:val="left"/>
+        <w:rPr>
+          <w:b w:val="false"/>
+          <w:b w:val="false"/>
+          <w:bCs w:val="false"/>
+          <w:sz w:val="24"/>
+          <w:szCs w:val="24"/>
+        </w:rPr>
+      </w:pPr>
+      <w:r>
+        <w:rPr/>
+      </w:r>
+    </w:p>
+    <w:p>
+      <w:pPr>
+        <w:pStyle w:val="Normal"/>
+        <w:bidi w:val="0"/>
+        <w:spacing w:lineRule="auto" w:line="480"/>
+        <w:jc w:val="left"/>
+        <w:rPr>
+          <w:b w:val="false"/>
+          <w:b w:val="false"/>
+          <w:bCs w:val="false"/>
+          <w:sz w:val="24"/>
+          <w:szCs w:val="24"/>
+        </w:rPr>
+      </w:pPr>
+      <w:r>
+        <w:rPr>
+          <w:b w:val="false"/>
+          <w:bCs w:val="false"/>
+          <w:sz w:val="24"/>
+          <w:szCs w:val="24"/>
+        </w:rPr>
         <w:t>Blahnik and Schindelbeck (2021) argue that some 2 trillion pictures will likely be taken every year, which is twice as much compared with five years ago and an upwards of 90% of them are taken using a smartphones. In another study, Dermawi and Tolle (2019) reveal that most downloaded applications from Google Play Store as of August 2018 were in the photography category.  It follows that managing and perusing through images and videos stored in a smartphone could be a daunting task. For instance, consider a smartphone user with an estimated 5 gigabytes of images and videos, such a person will find it frustrating to scroll through the images and videos looking for pictures and videos belonging to a particular person. Moreover, smartphone users tend to have images and videos of their close family members stored. Critical to the discussion is the truth that close family members tend to have resembling faces. Thus, researchers should develop tools that can help smartphone users peruse through images and videos efficiently.</w:t>
       </w:r>
     </w:p>
@@ -3571,31 +3844,7 @@
           <w:sz w:val="24"/>
           <w:szCs w:val="24"/>
         </w:rPr>
-        <w:t>Balaban, S. (201</w:t>
-      </w:r>
-      <w:r>
-        <w:rPr>
-          <w:rStyle w:val="Quotation"/>
-          <w:b w:val="false"/>
-          <w:bCs w:val="false"/>
-          <w:i w:val="false"/>
-          <w:iCs w:val="false"/>
-          <w:sz w:val="24"/>
-          <w:szCs w:val="24"/>
-        </w:rPr>
-        <w:t>9</w:t>
-      </w:r>
-      <w:r>
-        <w:rPr>
-          <w:rStyle w:val="Quotation"/>
-          <w:b w:val="false"/>
-          <w:bCs w:val="false"/>
-          <w:i w:val="false"/>
-          <w:iCs w:val="false"/>
-          <w:sz w:val="24"/>
-          <w:szCs w:val="24"/>
-        </w:rPr>
-        <w:t>).</w:t>
+        <w:t>Balaban, S. (2019).</w:t>
       </w:r>
       <w:r>
         <w:rPr>
@@ -4477,26 +4726,32 @@
           <w:sz w:val="24"/>
           <w:szCs w:val="24"/>
         </w:rPr>
-        <w:t xml:space="preserve">Lu, D., and Yan, L. (2021). Face Detection and Recognition Algorithm in Digital Image Based on </w:t>
-      </w:r>
-    </w:p>
-    <w:p>
-      <w:pPr>
-        <w:pStyle w:val="Normal"/>
-        <w:bidi w:val="0"/>
-        <w:spacing w:lineRule="auto" w:line="480"/>
-        <w:jc w:val="left"/>
-        <w:rPr/>
-      </w:pPr>
-      <w:r>
-        <w:rPr>
-          <w:b w:val="false"/>
-          <w:bCs w:val="false"/>
-          <w:sz w:val="24"/>
-          <w:szCs w:val="24"/>
-        </w:rPr>
-        <w:tab/>
-        <w:t xml:space="preserve">Computer Vision Sensor. </w:t>
+        <w:t xml:space="preserve">Liu, C. J., and Ellisa, A. D. (2021). Editorial: Eating in the Age of Smartphones: The Good, the Bad, </w:t>
+      </w:r>
+    </w:p>
+    <w:p>
+      <w:pPr>
+        <w:pStyle w:val="Normal"/>
+        <w:bidi w:val="0"/>
+        <w:spacing w:lineRule="auto" w:line="480"/>
+        <w:jc w:val="left"/>
+        <w:rPr>
+          <w:b w:val="false"/>
+          <w:b w:val="false"/>
+          <w:bCs w:val="false"/>
+          <w:sz w:val="24"/>
+          <w:szCs w:val="24"/>
+        </w:rPr>
+      </w:pPr>
+      <w:r>
+        <w:rPr>
+          <w:b w:val="false"/>
+          <w:bCs w:val="false"/>
+          <w:sz w:val="24"/>
+          <w:szCs w:val="24"/>
+        </w:rPr>
+        <w:tab/>
+        <w:t xml:space="preserve">and the Neutral. </w:t>
       </w:r>
       <w:r>
         <w:rPr>
@@ -4507,7 +4762,7 @@
           <w:sz w:val="24"/>
           <w:szCs w:val="24"/>
         </w:rPr>
-        <w:t xml:space="preserve">Journal of Sensors, </w:t>
+        <w:t xml:space="preserve">Frontiers in Psychology, </w:t>
       </w:r>
       <w:r>
         <w:rPr>
@@ -4518,76 +4773,81 @@
           <w:sz w:val="24"/>
           <w:szCs w:val="24"/>
         </w:rPr>
-        <w:t xml:space="preserve">2021(4796768), 1-16. </w:t>
-        <w:tab/>
-        <w:t>https://doi.org/10.1155/2021/4796768</w:t>
-      </w:r>
-    </w:p>
-    <w:p>
-      <w:pPr>
-        <w:pStyle w:val="Normal"/>
-        <w:bidi w:val="0"/>
-        <w:spacing w:lineRule="auto" w:line="480"/>
-        <w:jc w:val="left"/>
-        <w:rPr>
-          <w:b w:val="false"/>
-          <w:b w:val="false"/>
-          <w:bCs w:val="false"/>
-          <w:sz w:val="24"/>
-          <w:szCs w:val="24"/>
-        </w:rPr>
-      </w:pPr>
-      <w:r>
-        <w:rPr>
-          <w:b w:val="false"/>
-          <w:bCs w:val="false"/>
-          <w:sz w:val="24"/>
-          <w:szCs w:val="24"/>
-        </w:rPr>
-        <w:t>Marks, P. (2021).Can the Biases in Facial Recognition Be Fixed;  Also, Should They?</w:t>
-      </w:r>
-    </w:p>
-    <w:p>
-      <w:pPr>
-        <w:pStyle w:val="Normal"/>
-        <w:bidi w:val="0"/>
-        <w:spacing w:lineRule="auto" w:line="480"/>
-        <w:jc w:val="left"/>
-        <w:rPr>
-          <w:b w:val="false"/>
-          <w:b w:val="false"/>
-          <w:bCs w:val="false"/>
-          <w:sz w:val="24"/>
-          <w:szCs w:val="24"/>
-        </w:rPr>
-      </w:pPr>
-      <w:r>
-        <w:rPr>
-          <w:b w:val="false"/>
-          <w:bCs w:val="false"/>
-          <w:sz w:val="24"/>
-          <w:szCs w:val="24"/>
-        </w:rPr>
-        <w:tab/>
-        <w:t>Communications of The ACM, 64(3): 20-22. https://dx.doi.org/10.1145/3446877</w:t>
-      </w:r>
-    </w:p>
-    <w:p>
-      <w:pPr>
-        <w:pStyle w:val="Normal"/>
-        <w:bidi w:val="0"/>
-        <w:spacing w:lineRule="auto" w:line="480"/>
-        <w:jc w:val="left"/>
-        <w:rPr/>
-      </w:pPr>
-      <w:r>
-        <w:rPr>
-          <w:b w:val="false"/>
-          <w:bCs w:val="false"/>
-          <w:sz w:val="24"/>
-          <w:szCs w:val="24"/>
-        </w:rPr>
-        <w:t xml:space="preserve">Najibi, A. (2020). </w:t>
+        <w:t>12(796899</w:t>
+      </w:r>
+      <w:r>
+        <w:rPr>
+          <w:b w:val="false"/>
+          <w:bCs w:val="false"/>
+          <w:sz w:val="24"/>
+          <w:szCs w:val="24"/>
+        </w:rPr>
+        <w:t xml:space="preserve">): 1-2. </w:t>
+      </w:r>
+      <w:r>
+        <w:rPr>
+          <w:b w:val="false"/>
+          <w:bCs w:val="false"/>
+          <w:i w:val="false"/>
+          <w:iCs w:val="false"/>
+          <w:sz w:val="24"/>
+          <w:szCs w:val="24"/>
+        </w:rPr>
+        <w:t>https://</w:t>
+      </w:r>
+      <w:r>
+        <w:rPr>
+          <w:b w:val="false"/>
+          <w:bCs w:val="false"/>
+          <w:sz w:val="24"/>
+          <w:szCs w:val="24"/>
+        </w:rPr>
+        <w:t xml:space="preserve">doi: </w:t>
+        <w:tab/>
+        <w:t>10.3389/fpsyg.2021.796899</w:t>
+      </w:r>
+    </w:p>
+    <w:p>
+      <w:pPr>
+        <w:pStyle w:val="Normal"/>
+        <w:bidi w:val="0"/>
+        <w:spacing w:lineRule="auto" w:line="480"/>
+        <w:jc w:val="left"/>
+        <w:rPr>
+          <w:b w:val="false"/>
+          <w:b w:val="false"/>
+          <w:bCs w:val="false"/>
+          <w:sz w:val="24"/>
+          <w:szCs w:val="24"/>
+        </w:rPr>
+      </w:pPr>
+      <w:r>
+        <w:rPr>
+          <w:b w:val="false"/>
+          <w:bCs w:val="false"/>
+          <w:sz w:val="24"/>
+          <w:szCs w:val="24"/>
+        </w:rPr>
+        <w:t xml:space="preserve">Lu, D., and Yan, L. (2021). Face Detection and Recognition Algorithm in Digital Image Based on </w:t>
+      </w:r>
+    </w:p>
+    <w:p>
+      <w:pPr>
+        <w:pStyle w:val="Normal"/>
+        <w:bidi w:val="0"/>
+        <w:spacing w:lineRule="auto" w:line="480"/>
+        <w:jc w:val="left"/>
+        <w:rPr/>
+      </w:pPr>
+      <w:r>
+        <w:rPr>
+          <w:b w:val="false"/>
+          <w:bCs w:val="false"/>
+          <w:sz w:val="24"/>
+          <w:szCs w:val="24"/>
+        </w:rPr>
+        <w:tab/>
+        <w:t xml:space="preserve">Computer Vision Sensor. </w:t>
       </w:r>
       <w:r>
         <w:rPr>
@@ -4598,38 +4858,87 @@
           <w:sz w:val="24"/>
           <w:szCs w:val="24"/>
         </w:rPr>
-        <w:t>Racial Discrimination in Face Recognition Technology</w:t>
-      </w:r>
-      <w:r>
-        <w:rPr>
-          <w:b w:val="false"/>
-          <w:bCs w:val="false"/>
-          <w:sz w:val="24"/>
-          <w:szCs w:val="24"/>
-        </w:rPr>
-        <w:t xml:space="preserve">. Retrieved from </w:t>
-        <w:tab/>
-        <w:t>https://sitn.hms.harvard.edu/flash/2020/racial-discrimination-in-face-recognition-</w:t>
-        <w:tab/>
-        <w:t>technology/</w:t>
-      </w:r>
-    </w:p>
-    <w:p>
-      <w:pPr>
-        <w:pStyle w:val="Normal"/>
-        <w:bidi w:val="0"/>
-        <w:spacing w:lineRule="auto" w:line="480"/>
-        <w:jc w:val="left"/>
-        <w:rPr/>
-      </w:pPr>
-      <w:r>
-        <w:rPr>
-          <w:b w:val="false"/>
-          <w:bCs w:val="false"/>
-          <w:sz w:val="24"/>
-          <w:szCs w:val="24"/>
-        </w:rPr>
-        <w:t xml:space="preserve">Parkhi, M. O., Vedaldi, A., and Ziseerman, A.  (2015). </w:t>
+        <w:t xml:space="preserve">Journal of Sensors, </w:t>
+      </w:r>
+      <w:r>
+        <w:rPr>
+          <w:b w:val="false"/>
+          <w:bCs w:val="false"/>
+          <w:i w:val="false"/>
+          <w:iCs w:val="false"/>
+          <w:sz w:val="24"/>
+          <w:szCs w:val="24"/>
+        </w:rPr>
+        <w:t xml:space="preserve">2021(4796768), 1-16. </w:t>
+        <w:tab/>
+        <w:t>https://doi.org/10.1155/2021/4796768</w:t>
+      </w:r>
+    </w:p>
+    <w:p>
+      <w:pPr>
+        <w:pStyle w:val="Normal"/>
+        <w:bidi w:val="0"/>
+        <w:spacing w:lineRule="auto" w:line="480"/>
+        <w:jc w:val="left"/>
+        <w:rPr>
+          <w:b w:val="false"/>
+          <w:b w:val="false"/>
+          <w:bCs w:val="false"/>
+          <w:sz w:val="24"/>
+          <w:szCs w:val="24"/>
+        </w:rPr>
+      </w:pPr>
+      <w:r>
+        <w:rPr>
+          <w:b w:val="false"/>
+          <w:bCs w:val="false"/>
+          <w:sz w:val="24"/>
+          <w:szCs w:val="24"/>
+        </w:rPr>
+        <w:t>Marks, P. (2021).Can the Biases in Facial Recognition Be Fixed;  Also, Should They?</w:t>
+      </w:r>
+    </w:p>
+    <w:p>
+      <w:pPr>
+        <w:pStyle w:val="Normal"/>
+        <w:bidi w:val="0"/>
+        <w:spacing w:lineRule="auto" w:line="480"/>
+        <w:jc w:val="left"/>
+        <w:rPr>
+          <w:b w:val="false"/>
+          <w:b w:val="false"/>
+          <w:bCs w:val="false"/>
+          <w:sz w:val="24"/>
+          <w:szCs w:val="24"/>
+        </w:rPr>
+      </w:pPr>
+      <w:r>
+        <w:rPr>
+          <w:b w:val="false"/>
+          <w:bCs w:val="false"/>
+          <w:sz w:val="24"/>
+          <w:szCs w:val="24"/>
+        </w:rPr>
+        <w:tab/>
+        <w:t>Communications of The ACM, 64(3): 20-22. https://dx.doi.org/10.1145/3446877</w:t>
+      </w:r>
+    </w:p>
+    <w:p>
+      <w:pPr>
+        <w:pStyle w:val="Normal"/>
+        <w:bidi w:val="0"/>
+        <w:spacing w:lineRule="auto" w:line="480"/>
+        <w:jc w:val="left"/>
+        <w:rPr/>
+      </w:pPr>
+      <w:r>
+        <w:rPr>
+          <w:b w:val="false"/>
+          <w:bCs w:val="false"/>
+          <w:sz w:val="24"/>
+          <w:szCs w:val="24"/>
+        </w:rPr>
+        <w:t xml:space="preserve">Najibi, A. (2020). </w:t>
       </w:r>
       <w:r>
         <w:rPr>
@@ -4640,84 +4949,38 @@
           <w:sz w:val="24"/>
           <w:szCs w:val="24"/>
         </w:rPr>
-        <w:t>VGG Face Dataset</w:t>
-      </w:r>
-      <w:r>
-        <w:rPr>
-          <w:b w:val="false"/>
-          <w:bCs w:val="false"/>
-          <w:sz w:val="24"/>
-          <w:szCs w:val="24"/>
-        </w:rPr>
-        <w:t xml:space="preserve">. Retrieved from: </w:t>
-      </w:r>
-    </w:p>
-    <w:p>
-      <w:pPr>
-        <w:pStyle w:val="Normal"/>
-        <w:bidi w:val="0"/>
-        <w:spacing w:lineRule="auto" w:line="480"/>
-        <w:jc w:val="left"/>
-        <w:rPr>
-          <w:b w:val="false"/>
-          <w:b w:val="false"/>
-          <w:bCs w:val="false"/>
-          <w:sz w:val="24"/>
-          <w:szCs w:val="24"/>
-        </w:rPr>
-      </w:pPr>
-      <w:r>
-        <w:rPr>
-          <w:b w:val="false"/>
-          <w:bCs w:val="false"/>
-          <w:sz w:val="24"/>
-          <w:szCs w:val="24"/>
-        </w:rPr>
-        <w:tab/>
-        <w:t>https://www.robots.ox.ac.uk/~vgg/data/vgg_face/</w:t>
-      </w:r>
-    </w:p>
-    <w:p>
-      <w:pPr>
-        <w:pStyle w:val="Normal"/>
-        <w:bidi w:val="0"/>
-        <w:spacing w:lineRule="auto" w:line="480"/>
-        <w:jc w:val="left"/>
-        <w:rPr>
-          <w:b w:val="false"/>
-          <w:b w:val="false"/>
-          <w:bCs w:val="false"/>
-          <w:sz w:val="24"/>
-          <w:szCs w:val="24"/>
-        </w:rPr>
-      </w:pPr>
-      <w:r>
-        <w:rPr>
-          <w:b w:val="false"/>
-          <w:bCs w:val="false"/>
-          <w:sz w:val="24"/>
-          <w:szCs w:val="24"/>
-        </w:rPr>
-        <w:t xml:space="preserve">Priya, G. A., Rekha, P. A., Sarabya, K. R., and Thanuganesh, M. (2014). Face Recognition with </w:t>
-      </w:r>
-    </w:p>
-    <w:p>
-      <w:pPr>
-        <w:pStyle w:val="Normal"/>
-        <w:bidi w:val="0"/>
-        <w:spacing w:lineRule="auto" w:line="480"/>
-        <w:jc w:val="left"/>
-        <w:rPr/>
-      </w:pPr>
-      <w:r>
-        <w:rPr>
-          <w:b w:val="false"/>
-          <w:bCs w:val="false"/>
-          <w:sz w:val="24"/>
-          <w:szCs w:val="24"/>
-        </w:rPr>
-        <w:tab/>
-        <w:t>Different Approaches: A Survey. I</w:t>
+        <w:t>Racial Discrimination in Face Recognition Technology</w:t>
+      </w:r>
+      <w:r>
+        <w:rPr>
+          <w:b w:val="false"/>
+          <w:bCs w:val="false"/>
+          <w:sz w:val="24"/>
+          <w:szCs w:val="24"/>
+        </w:rPr>
+        <w:t xml:space="preserve">. Retrieved from </w:t>
+        <w:tab/>
+        <w:t>https://sitn.hms.harvard.edu/flash/2020/racial-discrimination-in-face-recognition-</w:t>
+        <w:tab/>
+        <w:t>technology/</w:t>
+      </w:r>
+    </w:p>
+    <w:p>
+      <w:pPr>
+        <w:pStyle w:val="Normal"/>
+        <w:bidi w:val="0"/>
+        <w:spacing w:lineRule="auto" w:line="480"/>
+        <w:jc w:val="left"/>
+        <w:rPr/>
+      </w:pPr>
+      <w:r>
+        <w:rPr>
+          <w:b w:val="false"/>
+          <w:bCs w:val="false"/>
+          <w:sz w:val="24"/>
+          <w:szCs w:val="24"/>
+        </w:rPr>
+        <w:t xml:space="preserve">Parkhi, M. O., Vedaldi, A., and Ziseerman, A.  (2015). </w:t>
       </w:r>
       <w:r>
         <w:rPr>
@@ -4728,36 +4991,84 @@
           <w:sz w:val="24"/>
           <w:szCs w:val="24"/>
         </w:rPr>
-        <w:t xml:space="preserve">nternational Journal of Emerging Engineering Research </w:t>
-        <w:tab/>
-        <w:t>and Technology</w:t>
-      </w:r>
-      <w:r>
-        <w:rPr>
-          <w:b w:val="false"/>
-          <w:bCs w:val="false"/>
-          <w:sz w:val="24"/>
-          <w:szCs w:val="24"/>
-        </w:rPr>
-        <w:t>, 2(7): 288-293. Retrieved from: http://www.ijeert.org/pdf/v2-i7/39.pdf</w:t>
-      </w:r>
-    </w:p>
-    <w:p>
-      <w:pPr>
-        <w:pStyle w:val="Normal"/>
-        <w:bidi w:val="0"/>
-        <w:spacing w:lineRule="auto" w:line="480"/>
-        <w:jc w:val="left"/>
-        <w:rPr/>
-      </w:pPr>
-      <w:r>
-        <w:rPr>
-          <w:b w:val="false"/>
-          <w:bCs w:val="false"/>
-          <w:sz w:val="24"/>
-          <w:szCs w:val="24"/>
-        </w:rPr>
-        <w:t xml:space="preserve">Ranjan, A., Behera, N. J., and Reza. M. (2020). </w:t>
+        <w:t>VGG Face Dataset</w:t>
+      </w:r>
+      <w:r>
+        <w:rPr>
+          <w:b w:val="false"/>
+          <w:bCs w:val="false"/>
+          <w:sz w:val="24"/>
+          <w:szCs w:val="24"/>
+        </w:rPr>
+        <w:t xml:space="preserve">. Retrieved from: </w:t>
+      </w:r>
+    </w:p>
+    <w:p>
+      <w:pPr>
+        <w:pStyle w:val="Normal"/>
+        <w:bidi w:val="0"/>
+        <w:spacing w:lineRule="auto" w:line="480"/>
+        <w:jc w:val="left"/>
+        <w:rPr>
+          <w:b w:val="false"/>
+          <w:b w:val="false"/>
+          <w:bCs w:val="false"/>
+          <w:sz w:val="24"/>
+          <w:szCs w:val="24"/>
+        </w:rPr>
+      </w:pPr>
+      <w:r>
+        <w:rPr>
+          <w:b w:val="false"/>
+          <w:bCs w:val="false"/>
+          <w:sz w:val="24"/>
+          <w:szCs w:val="24"/>
+        </w:rPr>
+        <w:tab/>
+        <w:t>https://www.robots.ox.ac.uk/~vgg/data/vgg_face/</w:t>
+      </w:r>
+    </w:p>
+    <w:p>
+      <w:pPr>
+        <w:pStyle w:val="Normal"/>
+        <w:bidi w:val="0"/>
+        <w:spacing w:lineRule="auto" w:line="480"/>
+        <w:jc w:val="left"/>
+        <w:rPr>
+          <w:b w:val="false"/>
+          <w:b w:val="false"/>
+          <w:bCs w:val="false"/>
+          <w:sz w:val="24"/>
+          <w:szCs w:val="24"/>
+        </w:rPr>
+      </w:pPr>
+      <w:r>
+        <w:rPr>
+          <w:b w:val="false"/>
+          <w:bCs w:val="false"/>
+          <w:sz w:val="24"/>
+          <w:szCs w:val="24"/>
+        </w:rPr>
+        <w:t xml:space="preserve">Priya, G. A., Rekha, P. A., Sarabya, K. R., and Thanuganesh, M. (2014). Face Recognition with </w:t>
+      </w:r>
+    </w:p>
+    <w:p>
+      <w:pPr>
+        <w:pStyle w:val="Normal"/>
+        <w:bidi w:val="0"/>
+        <w:spacing w:lineRule="auto" w:line="480"/>
+        <w:jc w:val="left"/>
+        <w:rPr/>
+      </w:pPr>
+      <w:r>
+        <w:rPr>
+          <w:b w:val="false"/>
+          <w:bCs w:val="false"/>
+          <w:sz w:val="24"/>
+          <w:szCs w:val="24"/>
+        </w:rPr>
+        <w:tab/>
+        <w:t>Different Approaches: A Survey. I</w:t>
       </w:r>
       <w:r>
         <w:rPr>
@@ -4768,17 +5079,37 @@
           <w:sz w:val="24"/>
           <w:szCs w:val="24"/>
         </w:rPr>
-        <w:t>A Parallel Approach for Real-Time Face</w:t>
-      </w:r>
-    </w:p>
-    <w:p>
-      <w:pPr>
-        <w:pStyle w:val="Normal"/>
-        <w:bidi w:val="0"/>
-        <w:spacing w:lineRule="auto" w:line="480"/>
-        <w:jc w:val="left"/>
-        <w:rPr/>
-      </w:pPr>
+        <w:t xml:space="preserve">nternational Journal of Emerging Engineering Research </w:t>
+        <w:tab/>
+        <w:t>and Technology</w:t>
+      </w:r>
+      <w:r>
+        <w:rPr>
+          <w:b w:val="false"/>
+          <w:bCs w:val="false"/>
+          <w:sz w:val="24"/>
+          <w:szCs w:val="24"/>
+        </w:rPr>
+        <w:t>, 2(7): 288-293. Retrieved from: http://www.ijeert.org/pdf/v2-i7/39.pdf</w:t>
+      </w:r>
+    </w:p>
+    <w:p>
+      <w:pPr>
+        <w:pStyle w:val="Normal"/>
+        <w:bidi w:val="0"/>
+        <w:spacing w:lineRule="auto" w:line="480"/>
+        <w:jc w:val="left"/>
+        <w:rPr/>
+      </w:pPr>
+      <w:r>
+        <w:rPr>
+          <w:b w:val="false"/>
+          <w:bCs w:val="false"/>
+          <w:sz w:val="24"/>
+          <w:szCs w:val="24"/>
+        </w:rPr>
+        <w:t xml:space="preserve">Ranjan, A., Behera, N. J., and Reza. M. (2020). </w:t>
+      </w:r>
       <w:r>
         <w:rPr>
           <w:b w:val="false"/>
@@ -4788,38 +5119,17 @@
           <w:sz w:val="24"/>
           <w:szCs w:val="24"/>
         </w:rPr>
-        <w:tab/>
-        <w:t>Recognition from a Large Database</w:t>
-      </w:r>
-      <w:r>
-        <w:rPr>
-          <w:b w:val="false"/>
-          <w:bCs w:val="false"/>
-          <w:sz w:val="24"/>
-          <w:szCs w:val="24"/>
-        </w:rPr>
-        <w:t>. Retrieved from: https://arxiv.org/pdf/2011.00443.pdf</w:t>
-      </w:r>
-    </w:p>
-    <w:p>
-      <w:pPr>
-        <w:pStyle w:val="Normal"/>
-        <w:bidi w:val="0"/>
-        <w:spacing w:lineRule="auto" w:line="480"/>
-        <w:jc w:val="left"/>
-        <w:rPr/>
-      </w:pPr>
-      <w:r>
-        <w:rPr>
-          <w:b w:val="false"/>
-          <w:bCs w:val="false"/>
-          <w:sz w:val="24"/>
-          <w:szCs w:val="24"/>
-        </w:rPr>
-        <w:t xml:space="preserve">Rehman, H. M., Liew, S. C., Abbas, A., Jayaraman, P. P., Wah, Y. T., and Khan U. S. (2016). Big </w:t>
-        <w:tab/>
-        <w:t xml:space="preserve">Data Reduction Methods: A Survey. </w:t>
-      </w:r>
+        <w:t>A Parallel Approach for Real-Time Face</w:t>
+      </w:r>
+    </w:p>
+    <w:p>
+      <w:pPr>
+        <w:pStyle w:val="Normal"/>
+        <w:bidi w:val="0"/>
+        <w:spacing w:lineRule="auto" w:line="480"/>
+        <w:jc w:val="left"/>
+        <w:rPr/>
+      </w:pPr>
       <w:r>
         <w:rPr>
           <w:b w:val="false"/>
@@ -4829,6 +5139,47 @@
           <w:sz w:val="24"/>
           <w:szCs w:val="24"/>
         </w:rPr>
+        <w:tab/>
+        <w:t>Recognition from a Large Database</w:t>
+      </w:r>
+      <w:r>
+        <w:rPr>
+          <w:b w:val="false"/>
+          <w:bCs w:val="false"/>
+          <w:sz w:val="24"/>
+          <w:szCs w:val="24"/>
+        </w:rPr>
+        <w:t>. Retrieved from: https://arxiv.org/pdf/2011.00443.pdf</w:t>
+      </w:r>
+    </w:p>
+    <w:p>
+      <w:pPr>
+        <w:pStyle w:val="Normal"/>
+        <w:bidi w:val="0"/>
+        <w:spacing w:lineRule="auto" w:line="480"/>
+        <w:jc w:val="left"/>
+        <w:rPr/>
+      </w:pPr>
+      <w:r>
+        <w:rPr>
+          <w:b w:val="false"/>
+          <w:bCs w:val="false"/>
+          <w:sz w:val="24"/>
+          <w:szCs w:val="24"/>
+        </w:rPr>
+        <w:t xml:space="preserve">Rehman, H. M., Liew, S. C., Abbas, A., Jayaraman, P. P., Wah, Y. T., and Khan U. S. (2016). Big </w:t>
+        <w:tab/>
+        <w:t xml:space="preserve">Data Reduction Methods: A Survey. </w:t>
+      </w:r>
+      <w:r>
+        <w:rPr>
+          <w:b w:val="false"/>
+          <w:bCs w:val="false"/>
+          <w:i/>
+          <w:iCs/>
+          <w:sz w:val="24"/>
+          <w:szCs w:val="24"/>
+        </w:rPr>
         <w:t>Data Science and Engineering</w:t>
       </w:r>
       <w:r>
@@ -4881,25 +5232,7 @@
           <w:sz w:val="24"/>
           <w:szCs w:val="24"/>
         </w:rPr>
-        <w:t>Schroff, F., Kalenichenko, D., and Phiblin, J. (2015-</w:t>
-      </w:r>
-      <w:r>
-        <w:rPr>
-          <w:b w:val="false"/>
-          <w:bCs w:val="false"/>
-          <w:sz w:val="24"/>
-          <w:szCs w:val="24"/>
-        </w:rPr>
-        <w:t>07-12</w:t>
-      </w:r>
-      <w:r>
-        <w:rPr>
-          <w:b w:val="false"/>
-          <w:bCs w:val="false"/>
-          <w:sz w:val="24"/>
-          <w:szCs w:val="24"/>
-        </w:rPr>
-        <w:t xml:space="preserve">). </w:t>
+        <w:t xml:space="preserve">Schroff, F., Kalenichenko, D., and Phiblin, J. (2015-07-12). </w:t>
       </w:r>
       <w:r>
         <w:rPr>
@@ -4948,25 +5281,7 @@
         </w:rPr>
         <w:t xml:space="preserve">, 2015 IEEE Conference on Computer Vision and Pattern </w:t>
         <w:tab/>
-        <w:t xml:space="preserve">Recognition,  </w:t>
-      </w:r>
-      <w:r>
-        <w:rPr>
-          <w:b w:val="false"/>
-          <w:bCs w:val="false"/>
-          <w:sz w:val="24"/>
-          <w:szCs w:val="24"/>
-        </w:rPr>
-        <w:t>Boston, MA, USA.</w:t>
-      </w:r>
-      <w:r>
-        <w:rPr>
-          <w:b w:val="false"/>
-          <w:bCs w:val="false"/>
-          <w:sz w:val="24"/>
-          <w:szCs w:val="24"/>
-        </w:rPr>
-        <w:t xml:space="preserve"> </w:t>
+        <w:t xml:space="preserve">Recognition,  Boston, MA, USA. </w:t>
       </w:r>
       <w:r>
         <w:rPr>
@@ -5052,6 +5367,55 @@
           <w:szCs w:val="24"/>
         </w:rPr>
         <w:t>, 12(12) 256-463</w:t>
+      </w:r>
+    </w:p>
+    <w:p>
+      <w:pPr>
+        <w:pStyle w:val="Normal"/>
+        <w:bidi w:val="0"/>
+        <w:spacing w:lineRule="auto" w:line="480"/>
+        <w:jc w:val="left"/>
+        <w:rPr>
+          <w:b w:val="false"/>
+          <w:b w:val="false"/>
+          <w:bCs w:val="false"/>
+          <w:sz w:val="24"/>
+          <w:szCs w:val="24"/>
+        </w:rPr>
+      </w:pPr>
+      <w:r>
+        <w:rPr>
+          <w:b w:val="false"/>
+          <w:bCs w:val="false"/>
+          <w:sz w:val="24"/>
+          <w:szCs w:val="24"/>
+        </w:rPr>
+        <w:t xml:space="preserve">The United Nations. (2021). Technology and Innovation Report 2021. Retrieved from </w:t>
+      </w:r>
+    </w:p>
+    <w:p>
+      <w:pPr>
+        <w:pStyle w:val="Normal"/>
+        <w:bidi w:val="0"/>
+        <w:spacing w:lineRule="auto" w:line="480"/>
+        <w:jc w:val="left"/>
+        <w:rPr>
+          <w:b w:val="false"/>
+          <w:b w:val="false"/>
+          <w:bCs w:val="false"/>
+          <w:sz w:val="24"/>
+          <w:szCs w:val="24"/>
+        </w:rPr>
+      </w:pPr>
+      <w:r>
+        <w:rPr>
+          <w:b w:val="false"/>
+          <w:bCs w:val="false"/>
+          <w:sz w:val="24"/>
+          <w:szCs w:val="24"/>
+        </w:rPr>
+        <w:tab/>
+        <w:t>https://unctad.org/system/files/official-document/tir2020_en.pdf</w:t>
       </w:r>
     </w:p>
     <w:p>
@@ -5505,7 +5869,7 @@
     <w:pPr>
       <w:widowControl/>
       <w:suppressAutoHyphens w:val="true"/>
-      <w:overflowPunct w:val="true"/>
+      <w:overflowPunct w:val="false"/>
       <w:bidi w:val="0"/>
       <w:spacing w:before="0" w:after="0"/>
       <w:jc w:val="left"/>

</xml_diff>

<commit_message>
complete justification of the study
</commit_message>
<xml_diff>
--- a/SikoliaThesis.docx
+++ b/SikoliaThesis.docx
@@ -2404,14 +2404,6 @@
           <w:szCs w:val="24"/>
         </w:rPr>
         <w:tab/>
-      </w:r>
-      <w:r>
-        <w:rPr>
-          <w:b w:val="false"/>
-          <w:bCs w:val="false"/>
-          <w:sz w:val="24"/>
-          <w:szCs w:val="24"/>
-        </w:rPr>
         <w:t xml:space="preserve">A smartphone could be elucidated as a phone with advanced features such internet connectivity, software usage, and connection to a cellular network. Critical to the debate is the reality that the advanced features on smartphones have made smartphones a household item today. </w:t>
       </w:r>
     </w:p>
@@ -2436,70 +2428,43 @@
           <w:sz w:val="24"/>
           <w:szCs w:val="24"/>
         </w:rPr>
-        <w:t>It is because t</w:t>
-      </w:r>
-      <w:r>
-        <w:rPr>
-          <w:b w:val="false"/>
-          <w:bCs w:val="false"/>
-          <w:sz w:val="24"/>
-          <w:szCs w:val="24"/>
-        </w:rPr>
-        <w:t>hese features have s</w:t>
-      </w:r>
-      <w:r>
-        <w:rPr>
-          <w:b w:val="false"/>
-          <w:bCs w:val="false"/>
-          <w:sz w:val="24"/>
-          <w:szCs w:val="24"/>
-        </w:rPr>
-        <w:t xml:space="preserve">martphones </w:t>
-      </w:r>
-      <w:r>
-        <w:rPr>
-          <w:b w:val="false"/>
-          <w:bCs w:val="false"/>
-          <w:sz w:val="24"/>
-          <w:szCs w:val="24"/>
-        </w:rPr>
-        <w:t>applicable cases such as</w:t>
-      </w:r>
-      <w:r>
-        <w:rPr>
-          <w:b w:val="false"/>
-          <w:bCs w:val="false"/>
-          <w:sz w:val="24"/>
-          <w:szCs w:val="24"/>
-        </w:rPr>
-        <w:t xml:space="preserve"> interpersonal communication, entertainment, learning, and </w:t>
-      </w:r>
-      <w:r>
-        <w:rPr>
-          <w:b w:val="false"/>
-          <w:bCs w:val="false"/>
-          <w:sz w:val="24"/>
-          <w:szCs w:val="24"/>
-        </w:rPr>
-        <w:t xml:space="preserve">even making business transactions. </w:t>
-      </w:r>
-      <w:r>
-        <w:rPr>
-          <w:b w:val="false"/>
-          <w:bCs w:val="false"/>
-          <w:sz w:val="24"/>
-          <w:szCs w:val="24"/>
-        </w:rPr>
-        <w:t>U</w:t>
-      </w:r>
-      <w:r>
-        <w:rPr>
-          <w:b w:val="false"/>
-          <w:bCs w:val="false"/>
-          <w:sz w:val="24"/>
-          <w:szCs w:val="24"/>
-        </w:rPr>
-        <w:t>nlike desktop computer</w:t>
+        <w:t xml:space="preserve">It is because these features have smartphones applicable cases such as learning, interpersonal communication, entertainment,  and even business transactions. </w:t>
+      </w:r>
+      <w:r>
+        <w:rPr>
+          <w:b w:val="false"/>
+          <w:bCs w:val="false"/>
+          <w:sz w:val="24"/>
+          <w:szCs w:val="24"/>
+        </w:rPr>
+        <w:t>It is notable that u</w:t>
+      </w:r>
+      <w:r>
+        <w:rPr>
+          <w:b w:val="false"/>
+          <w:bCs w:val="false"/>
+          <w:sz w:val="24"/>
+          <w:szCs w:val="24"/>
+        </w:rPr>
+        <w:t xml:space="preserve">nlike desktop computers </w:t>
+      </w:r>
+      <w:r>
+        <w:rPr>
+          <w:b w:val="false"/>
+          <w:bCs w:val="false"/>
+          <w:sz w:val="24"/>
+          <w:szCs w:val="24"/>
+        </w:rPr>
+        <w:t xml:space="preserve">and </w:t>
+      </w:r>
+      <w:r>
+        <w:rPr>
+          <w:b w:val="false"/>
+          <w:bCs w:val="false"/>
+          <w:sz w:val="24"/>
+          <w:szCs w:val="24"/>
+        </w:rPr>
+        <w:t xml:space="preserve"> laptops, smartphone</w:t>
       </w:r>
       <w:r>
         <w:rPr>
@@ -2517,211 +2482,471 @@
           <w:sz w:val="24"/>
           <w:szCs w:val="24"/>
         </w:rPr>
-        <w:t xml:space="preserve"> or a laptop</w:t>
-      </w:r>
-      <w:r>
-        <w:rPr>
-          <w:b w:val="false"/>
-          <w:bCs w:val="false"/>
-          <w:sz w:val="24"/>
-          <w:szCs w:val="24"/>
-        </w:rPr>
-        <w:t>s</w:t>
-      </w:r>
-      <w:r>
-        <w:rPr>
-          <w:b w:val="false"/>
-          <w:bCs w:val="false"/>
-          <w:sz w:val="24"/>
-          <w:szCs w:val="24"/>
-        </w:rPr>
-        <w:t xml:space="preserve">, a smartphone is portable because it can fit into a pocket comfortably. As a result, smartphones have penetrated the global market like no other device. This owes to the truth that </w:t>
-      </w:r>
-      <w:r>
-        <w:rPr>
-          <w:b w:val="false"/>
-          <w:bCs w:val="false"/>
-          <w:sz w:val="24"/>
-          <w:szCs w:val="24"/>
-        </w:rPr>
-        <w:t>T</w:t>
-      </w:r>
-      <w:r>
-        <w:rPr>
-          <w:b w:val="false"/>
-          <w:bCs w:val="false"/>
-          <w:sz w:val="24"/>
-          <w:szCs w:val="24"/>
-        </w:rPr>
-        <w:t xml:space="preserve">he United Nations (2021) argues that </w:t>
-      </w:r>
-      <w:r>
-        <w:rPr>
-          <w:b w:val="false"/>
-          <w:bCs w:val="false"/>
-          <w:sz w:val="24"/>
-          <w:szCs w:val="24"/>
-        </w:rPr>
-        <w:t xml:space="preserve">the current market for laptops is estimated at </w:t>
-      </w:r>
-      <w:r>
-        <w:rPr>
-          <w:b w:val="false"/>
-          <w:bCs w:val="false"/>
-          <w:sz w:val="24"/>
-          <w:szCs w:val="24"/>
-        </w:rPr>
-        <w:t xml:space="preserve">$102 billion and </w:t>
-      </w:r>
-      <w:r>
-        <w:rPr>
-          <w:b w:val="false"/>
-          <w:bCs w:val="false"/>
-          <w:sz w:val="24"/>
-          <w:szCs w:val="24"/>
-        </w:rPr>
-        <w:t>while that of</w:t>
-      </w:r>
-      <w:r>
-        <w:rPr>
-          <w:b w:val="false"/>
-          <w:bCs w:val="false"/>
-          <w:sz w:val="24"/>
-          <w:szCs w:val="24"/>
-        </w:rPr>
-        <w:t xml:space="preserve"> smartphones is </w:t>
-      </w:r>
-      <w:r>
-        <w:rPr>
-          <w:b w:val="false"/>
-          <w:bCs w:val="false"/>
-          <w:sz w:val="24"/>
-          <w:szCs w:val="24"/>
-        </w:rPr>
-        <w:t xml:space="preserve">estimated at </w:t>
-      </w:r>
-      <w:r>
-        <w:rPr>
-          <w:b w:val="false"/>
-          <w:bCs w:val="false"/>
-          <w:sz w:val="24"/>
-          <w:szCs w:val="24"/>
-        </w:rPr>
-        <w:t xml:space="preserve">$522 billion. </w:t>
-      </w:r>
-      <w:r>
-        <w:rPr>
-          <w:b w:val="false"/>
-          <w:bCs w:val="false"/>
-          <w:sz w:val="24"/>
-          <w:szCs w:val="24"/>
-        </w:rPr>
-        <w:t xml:space="preserve">In a different, paper </w:t>
-      </w:r>
-      <w:r>
-        <w:rPr>
-          <w:b w:val="false"/>
-          <w:bCs w:val="false"/>
-          <w:sz w:val="24"/>
-          <w:szCs w:val="24"/>
-        </w:rPr>
-        <w:t>Liu and Ellis (2021) argue that an estimated 6.4 billion people in the entire globe own a smartphone. T</w:t>
-      </w:r>
-      <w:r>
-        <w:rPr>
-          <w:b w:val="false"/>
-          <w:bCs w:val="false"/>
-          <w:sz w:val="24"/>
-          <w:szCs w:val="24"/>
-        </w:rPr>
-        <w:t xml:space="preserve">he United Nations (2021) </w:t>
-      </w:r>
-      <w:r>
-        <w:rPr>
-          <w:b w:val="false"/>
-          <w:bCs w:val="false"/>
-          <w:sz w:val="24"/>
-          <w:szCs w:val="24"/>
-        </w:rPr>
-        <w:t>also argues that the number of smartphone usage in Sub Saharan Africa rose by 28 percentage points between 2014 and 2018. This is a clear indicator that Smartphones are used by a majority of people from the entire world.</w:t>
-      </w:r>
-    </w:p>
-    <w:p>
-      <w:pPr>
-        <w:pStyle w:val="Normal"/>
-        <w:bidi w:val="0"/>
-        <w:spacing w:lineRule="auto" w:line="480"/>
-        <w:jc w:val="left"/>
-        <w:rPr>
-          <w:b w:val="false"/>
-          <w:b w:val="false"/>
-          <w:bCs w:val="false"/>
-          <w:sz w:val="24"/>
-          <w:szCs w:val="24"/>
-        </w:rPr>
-      </w:pPr>
-      <w:r>
-        <w:rPr/>
-      </w:r>
-    </w:p>
-    <w:p>
-      <w:pPr>
-        <w:pStyle w:val="Normal"/>
-        <w:bidi w:val="0"/>
-        <w:spacing w:lineRule="auto" w:line="480"/>
-        <w:jc w:val="left"/>
-        <w:rPr>
-          <w:b w:val="false"/>
-          <w:b w:val="false"/>
-          <w:bCs w:val="false"/>
-          <w:sz w:val="24"/>
-          <w:szCs w:val="24"/>
-        </w:rPr>
-      </w:pPr>
-      <w:r>
-        <w:rPr/>
-      </w:r>
-    </w:p>
-    <w:p>
-      <w:pPr>
-        <w:pStyle w:val="Normal"/>
-        <w:bidi w:val="0"/>
-        <w:spacing w:lineRule="auto" w:line="480"/>
-        <w:jc w:val="left"/>
-        <w:rPr>
-          <w:b w:val="false"/>
-          <w:b w:val="false"/>
-          <w:bCs w:val="false"/>
-          <w:sz w:val="24"/>
-          <w:szCs w:val="24"/>
-        </w:rPr>
-      </w:pPr>
-      <w:r>
-        <w:rPr/>
-      </w:r>
-    </w:p>
-    <w:p>
-      <w:pPr>
-        <w:pStyle w:val="Normal"/>
-        <w:bidi w:val="0"/>
-        <w:spacing w:lineRule="auto" w:line="480"/>
-        <w:jc w:val="left"/>
-        <w:rPr>
-          <w:b w:val="false"/>
-          <w:b w:val="false"/>
-          <w:bCs w:val="false"/>
-          <w:sz w:val="24"/>
-          <w:szCs w:val="24"/>
-        </w:rPr>
-      </w:pPr>
-      <w:r>
-        <w:rPr>
-          <w:b w:val="false"/>
-          <w:bCs w:val="false"/>
-          <w:sz w:val="24"/>
-          <w:szCs w:val="24"/>
-        </w:rPr>
-        <w:t>Blahnik and Schindelbeck (2021) argue that some 2 trillion pictures will likely be taken every year, which is twice as much compared with five years ago and an upwards of 90% of them are taken using a smartphones. In another study, Dermawi and Tolle (2019) reveal that most downloaded applications from Google Play Store as of August 2018 were in the photography category.  It follows that managing and perusing through images and videos stored in a smartphone could be a daunting task. For instance, consider a smartphone user with an estimated 5 gigabytes of images and videos, such a person will find it frustrating to scroll through the images and videos looking for pictures and videos belonging to a particular person. Moreover, smartphone users tend to have images and videos of their close family members stored. Critical to the discussion is the truth that close family members tend to have resembling faces. Thus, researchers should develop tools that can help smartphone users peruse through images and videos efficiently.</w:t>
+        <w:t xml:space="preserve"> </w:t>
+      </w:r>
+      <w:r>
+        <w:rPr>
+          <w:b w:val="false"/>
+          <w:bCs w:val="false"/>
+          <w:sz w:val="24"/>
+          <w:szCs w:val="24"/>
+        </w:rPr>
+        <w:t>are</w:t>
+      </w:r>
+      <w:r>
+        <w:rPr>
+          <w:b w:val="false"/>
+          <w:bCs w:val="false"/>
+          <w:sz w:val="24"/>
+          <w:szCs w:val="24"/>
+        </w:rPr>
+        <w:t xml:space="preserve"> portable, </w:t>
+      </w:r>
+      <w:r>
+        <w:rPr>
+          <w:b w:val="false"/>
+          <w:bCs w:val="false"/>
+          <w:sz w:val="24"/>
+          <w:szCs w:val="24"/>
+        </w:rPr>
+        <w:t>which makes them convenient to use</w:t>
+      </w:r>
+      <w:r>
+        <w:rPr>
+          <w:b w:val="false"/>
+          <w:bCs w:val="false"/>
+          <w:sz w:val="24"/>
+          <w:szCs w:val="24"/>
+        </w:rPr>
+        <w:t xml:space="preserve">. As a result, smartphones have penetrated the global market like no other device. This owes to the truth that The United Nations (2021) argues that the current market for laptops is estimated at $102 billion and while that of smartphones is estimated at $522 billion. In a different, paper Liu and Ellis (2021) argue that an estimated 6.4 billion people in the entire globe own a smartphone. </w:t>
+      </w:r>
+      <w:r>
+        <w:rPr>
+          <w:b w:val="false"/>
+          <w:bCs w:val="false"/>
+          <w:sz w:val="24"/>
+          <w:szCs w:val="24"/>
+        </w:rPr>
+        <w:t xml:space="preserve">Moreover, </w:t>
+      </w:r>
+      <w:r>
+        <w:rPr>
+          <w:b w:val="false"/>
+          <w:bCs w:val="false"/>
+          <w:sz w:val="24"/>
+          <w:szCs w:val="24"/>
+        </w:rPr>
+        <w:t xml:space="preserve">The United Nations (2021)  argues that the number of smartphone usage in Sub Saharan Africa rose by 28 percentage points between 2014 and 2018. </w:t>
+      </w:r>
+    </w:p>
+    <w:p>
+      <w:pPr>
+        <w:pStyle w:val="Normal"/>
+        <w:bidi w:val="0"/>
+        <w:spacing w:lineRule="auto" w:line="480"/>
+        <w:jc w:val="left"/>
+        <w:rPr>
+          <w:b w:val="false"/>
+          <w:b w:val="false"/>
+          <w:bCs w:val="false"/>
+          <w:sz w:val="24"/>
+          <w:szCs w:val="24"/>
+        </w:rPr>
+      </w:pPr>
+      <w:r>
+        <w:rPr>
+          <w:b w:val="false"/>
+          <w:bCs w:val="false"/>
+          <w:sz w:val="24"/>
+          <w:szCs w:val="24"/>
+        </w:rPr>
+        <w:tab/>
+      </w:r>
+      <w:r>
+        <w:rPr>
+          <w:b w:val="false"/>
+          <w:bCs w:val="false"/>
+          <w:sz w:val="24"/>
+          <w:szCs w:val="24"/>
+        </w:rPr>
+        <w:t xml:space="preserve">It is important to highlight that topical smartphones have cameras that are used by their consumers for photography. This owes to the fact that a smartphone is more affordable and portable than a camera. It follows that smartphone users have the ability of taking pictures without a camera.    </w:t>
+      </w:r>
+      <w:r>
+        <w:rPr>
+          <w:b w:val="false"/>
+          <w:bCs w:val="false"/>
+          <w:sz w:val="24"/>
+          <w:szCs w:val="24"/>
+        </w:rPr>
+        <w:t xml:space="preserve">As evidenced, </w:t>
+      </w:r>
+      <w:r>
+        <w:rPr>
+          <w:rStyle w:val="Quotation"/>
+          <w:b w:val="false"/>
+          <w:bCs w:val="false"/>
+          <w:i w:val="false"/>
+          <w:iCs w:val="false"/>
+          <w:sz w:val="24"/>
+          <w:szCs w:val="24"/>
+        </w:rPr>
+        <w:t xml:space="preserve">Saraswathi </w:t>
+      </w:r>
+      <w:r>
+        <w:rPr>
+          <w:rStyle w:val="Quotation"/>
+          <w:b w:val="false"/>
+          <w:bCs w:val="false"/>
+          <w:i w:val="false"/>
+          <w:iCs w:val="false"/>
+          <w:sz w:val="24"/>
+          <w:szCs w:val="24"/>
+        </w:rPr>
+        <w:t xml:space="preserve">(2017) conducted a study on smartphone usage among students and established that students like taking pictures using smartphones. </w:t>
+      </w:r>
+      <w:r>
+        <w:rPr>
+          <w:rStyle w:val="Quotation"/>
+          <w:b w:val="false"/>
+          <w:bCs w:val="false"/>
+          <w:i w:val="false"/>
+          <w:iCs w:val="false"/>
+          <w:sz w:val="24"/>
+          <w:szCs w:val="24"/>
+        </w:rPr>
+        <w:t xml:space="preserve">Moreover, </w:t>
+      </w:r>
+      <w:r>
+        <w:rPr>
+          <w:rStyle w:val="Quotation"/>
+          <w:b w:val="false"/>
+          <w:bCs w:val="false"/>
+          <w:i w:val="false"/>
+          <w:iCs w:val="false"/>
+          <w:sz w:val="24"/>
+          <w:szCs w:val="24"/>
+        </w:rPr>
+        <w:t xml:space="preserve">a study conducted  by Mother et al., (2013) reveals that </w:t>
+      </w:r>
+      <w:r>
+        <w:rPr>
+          <w:rStyle w:val="Quotation"/>
+          <w:b w:val="false"/>
+          <w:bCs w:val="false"/>
+          <w:i w:val="false"/>
+          <w:iCs w:val="false"/>
+          <w:sz w:val="24"/>
+          <w:szCs w:val="24"/>
+        </w:rPr>
+        <w:t xml:space="preserve">the </w:t>
+      </w:r>
+      <w:r>
+        <w:rPr>
+          <w:rStyle w:val="Quotation"/>
+          <w:b w:val="false"/>
+          <w:bCs w:val="false"/>
+          <w:i w:val="false"/>
+          <w:iCs w:val="false"/>
+          <w:sz w:val="24"/>
+          <w:szCs w:val="24"/>
+        </w:rPr>
+        <w:t xml:space="preserve">study population </w:t>
+      </w:r>
+      <w:r>
+        <w:rPr>
+          <w:rStyle w:val="Quotation"/>
+          <w:b w:val="false"/>
+          <w:bCs w:val="false"/>
+          <w:i w:val="false"/>
+          <w:iCs w:val="false"/>
+          <w:sz w:val="24"/>
+          <w:szCs w:val="24"/>
+        </w:rPr>
+        <w:t xml:space="preserve">used smartphones </w:t>
+      </w:r>
+      <w:r>
+        <w:rPr>
+          <w:rStyle w:val="Quotation"/>
+          <w:b w:val="false"/>
+          <w:bCs w:val="false"/>
+          <w:i w:val="false"/>
+          <w:iCs w:val="false"/>
+          <w:sz w:val="24"/>
+          <w:szCs w:val="24"/>
+        </w:rPr>
+        <w:t>mostly to send and receive</w:t>
+      </w:r>
+    </w:p>
+    <w:p>
+      <w:pPr>
+        <w:pStyle w:val="Normal"/>
+        <w:bidi w:val="0"/>
+        <w:spacing w:lineRule="auto" w:line="480"/>
+        <w:jc w:val="left"/>
+        <w:rPr>
+          <w:b w:val="false"/>
+          <w:b w:val="false"/>
+          <w:bCs w:val="false"/>
+          <w:sz w:val="24"/>
+          <w:szCs w:val="24"/>
+        </w:rPr>
+      </w:pPr>
+      <w:r>
+        <w:rPr>
+          <w:rStyle w:val="Quotation"/>
+          <w:b w:val="false"/>
+          <w:bCs w:val="false"/>
+          <w:i w:val="false"/>
+          <w:iCs w:val="false"/>
+          <w:sz w:val="24"/>
+          <w:szCs w:val="24"/>
+        </w:rPr>
+        <w:t xml:space="preserve">text messages (97.9%), take pictures (97.1%), play music (96.1%), setting the alarm (95.8%), referring to the calendar (94.5%), recording videos (92.5%), play games (91.9%), and exchanging pictures via Bluetooth(91.7%). </w:t>
+      </w:r>
+      <w:r>
+        <w:rPr>
+          <w:rStyle w:val="Quotation"/>
+          <w:b w:val="false"/>
+          <w:bCs w:val="false"/>
+          <w:i w:val="false"/>
+          <w:iCs w:val="false"/>
+          <w:sz w:val="24"/>
+          <w:szCs w:val="24"/>
+        </w:rPr>
+        <w:t>This</w:t>
+      </w:r>
+      <w:r>
+        <w:rPr>
+          <w:rStyle w:val="Quotation"/>
+          <w:b w:val="false"/>
+          <w:bCs w:val="false"/>
+          <w:i w:val="false"/>
+          <w:iCs w:val="false"/>
+          <w:sz w:val="24"/>
+          <w:szCs w:val="24"/>
+        </w:rPr>
+        <w:t xml:space="preserve"> indicates that </w:t>
+      </w:r>
+      <w:r>
+        <w:rPr>
+          <w:rStyle w:val="Quotation"/>
+          <w:b w:val="false"/>
+          <w:bCs w:val="false"/>
+          <w:i w:val="false"/>
+          <w:iCs w:val="false"/>
+          <w:sz w:val="24"/>
+          <w:szCs w:val="24"/>
+        </w:rPr>
+        <w:t>there is an upsurge in the number of people who are relying on Smartphones to take pictures.</w:t>
+      </w:r>
+    </w:p>
+    <w:p>
+      <w:pPr>
+        <w:pStyle w:val="Normal"/>
+        <w:bidi w:val="0"/>
+        <w:spacing w:lineRule="auto" w:line="480"/>
+        <w:jc w:val="left"/>
+        <w:rPr>
+          <w:b w:val="false"/>
+          <w:b w:val="false"/>
+          <w:bCs w:val="false"/>
+          <w:sz w:val="24"/>
+          <w:szCs w:val="24"/>
+        </w:rPr>
+      </w:pPr>
+      <w:r>
+        <w:rPr>
+          <w:rStyle w:val="Quotation"/>
+          <w:b w:val="false"/>
+          <w:bCs w:val="false"/>
+          <w:i w:val="false"/>
+          <w:iCs w:val="false"/>
+          <w:sz w:val="24"/>
+          <w:szCs w:val="24"/>
+        </w:rPr>
+        <w:tab/>
+        <w:t xml:space="preserve">Earlier studies already established that people rely smartphones for taking pictures but that is not all. This owes to the truth that recent studies also affirm the reality that human beings rely on smartphones for taking pictures. As an evidence of this, Dermawi and Tolle (2019) reveal that most downloaded applications from Google Play Store as of August 2018 were in the photography category. </w:t>
+      </w:r>
+      <w:r>
+        <w:rPr>
+          <w:rStyle w:val="Quotation"/>
+          <w:b w:val="false"/>
+          <w:bCs w:val="false"/>
+          <w:i w:val="false"/>
+          <w:iCs w:val="false"/>
+          <w:sz w:val="24"/>
+          <w:szCs w:val="24"/>
+        </w:rPr>
+        <w:t>Imperative to the debate is the truth</w:t>
+      </w:r>
+      <w:r>
+        <w:rPr>
+          <w:rStyle w:val="Quotation"/>
+          <w:b w:val="false"/>
+          <w:bCs w:val="false"/>
+          <w:i w:val="false"/>
+          <w:iCs w:val="false"/>
+          <w:sz w:val="24"/>
+          <w:szCs w:val="24"/>
+        </w:rPr>
+        <w:t xml:space="preserve"> that the amount of data that is generated from smartphone pictures and videos is quickly increasing.  </w:t>
+      </w:r>
+      <w:r>
+        <w:rPr>
+          <w:rStyle w:val="Quotation"/>
+          <w:b w:val="false"/>
+          <w:bCs w:val="false"/>
+          <w:i w:val="false"/>
+          <w:iCs w:val="false"/>
+          <w:sz w:val="24"/>
+          <w:szCs w:val="24"/>
+        </w:rPr>
+        <w:t>This is supported by</w:t>
+      </w:r>
+      <w:r>
+        <w:rPr>
+          <w:rStyle w:val="Quotation"/>
+          <w:b w:val="false"/>
+          <w:bCs w:val="false"/>
+          <w:i w:val="false"/>
+          <w:iCs w:val="false"/>
+          <w:sz w:val="24"/>
+          <w:szCs w:val="24"/>
+        </w:rPr>
+        <w:t xml:space="preserve"> </w:t>
+      </w:r>
+      <w:r>
+        <w:rPr>
+          <w:b w:val="false"/>
+          <w:bCs w:val="false"/>
+          <w:sz w:val="24"/>
+          <w:szCs w:val="24"/>
+        </w:rPr>
+        <w:t xml:space="preserve">Blahnik and Schindelbeck (2021) </w:t>
+      </w:r>
+      <w:r>
+        <w:rPr>
+          <w:b w:val="false"/>
+          <w:bCs w:val="false"/>
+          <w:sz w:val="24"/>
+          <w:szCs w:val="24"/>
+        </w:rPr>
+        <w:t xml:space="preserve">who </w:t>
+      </w:r>
+      <w:r>
+        <w:rPr>
+          <w:b w:val="false"/>
+          <w:bCs w:val="false"/>
+          <w:sz w:val="24"/>
+          <w:szCs w:val="24"/>
+        </w:rPr>
+        <w:t xml:space="preserve">argue that some 2 trillion pictures will likely be taken every year, which is twice as much compared with five years ago and an upwards of 90% of them are taken using a smartphones. </w:t>
+      </w:r>
+    </w:p>
+    <w:p>
+      <w:pPr>
+        <w:pStyle w:val="Normal"/>
+        <w:bidi w:val="0"/>
+        <w:spacing w:lineRule="auto" w:line="480"/>
+        <w:jc w:val="left"/>
+        <w:rPr>
+          <w:b w:val="false"/>
+          <w:b w:val="false"/>
+          <w:bCs w:val="false"/>
+          <w:sz w:val="24"/>
+          <w:szCs w:val="24"/>
+        </w:rPr>
+      </w:pPr>
+      <w:r>
+        <w:rPr>
+          <w:b w:val="false"/>
+          <w:bCs w:val="false"/>
+          <w:sz w:val="24"/>
+          <w:szCs w:val="24"/>
+        </w:rPr>
+        <w:tab/>
+        <w:t xml:space="preserve">As already mentioned, the estimated number of Smartphone owners as of 2021 is 6.4 billion and the estimated number of pictures that was taken by smartphones is 2 trillion. Dividing these two figures results in an estimated 312.5 pictures per smartphone. This number is relatively high. </w:t>
+      </w:r>
+      <w:r>
+        <w:rPr>
+          <w:b w:val="false"/>
+          <w:bCs w:val="false"/>
+          <w:sz w:val="24"/>
+          <w:szCs w:val="24"/>
+        </w:rPr>
+        <w:t xml:space="preserve">It follows that managing and perusing through images and videos stored in a smartphone could be a daunting task. </w:t>
+      </w:r>
+      <w:r>
+        <w:rPr>
+          <w:b w:val="false"/>
+          <w:bCs w:val="false"/>
+          <w:sz w:val="24"/>
+          <w:szCs w:val="24"/>
+        </w:rPr>
+        <w:t>C</w:t>
+      </w:r>
+      <w:r>
+        <w:rPr>
+          <w:b w:val="false"/>
+          <w:bCs w:val="false"/>
+          <w:sz w:val="24"/>
+          <w:szCs w:val="24"/>
+        </w:rPr>
+        <w:t xml:space="preserve">onsider a smartphone user with an estimated 5 gigabytes of images and videos, such a person will find it frustrating to scroll through the images and videos looking for pictures and videos belonging to a particular person. Moreover, smartphone users tend to have images and videos of their close family members stored. </w:t>
+      </w:r>
+      <w:r>
+        <w:rPr>
+          <w:b w:val="false"/>
+          <w:bCs w:val="false"/>
+          <w:sz w:val="24"/>
+          <w:szCs w:val="24"/>
+        </w:rPr>
+        <w:t>Considering that</w:t>
+      </w:r>
+      <w:r>
+        <w:rPr>
+          <w:b w:val="false"/>
+          <w:bCs w:val="false"/>
+          <w:sz w:val="24"/>
+          <w:szCs w:val="24"/>
+        </w:rPr>
+        <w:t xml:space="preserve"> close family members tend to have resembling faces, </w:t>
+      </w:r>
+      <w:r>
+        <w:rPr>
+          <w:b w:val="false"/>
+          <w:bCs w:val="false"/>
+          <w:sz w:val="24"/>
+          <w:szCs w:val="24"/>
+        </w:rPr>
+        <w:t>it could be difficult to scroll through all pictures of a smartphone looking for a picture of a particular person using a naked eye.</w:t>
+      </w:r>
+      <w:r>
+        <w:rPr>
+          <w:b w:val="false"/>
+          <w:bCs w:val="false"/>
+          <w:sz w:val="24"/>
+          <w:szCs w:val="24"/>
+        </w:rPr>
+        <w:t xml:space="preserve"> </w:t>
+      </w:r>
+      <w:r>
+        <w:rPr>
+          <w:b w:val="false"/>
+          <w:bCs w:val="false"/>
+          <w:sz w:val="24"/>
+          <w:szCs w:val="24"/>
+        </w:rPr>
+        <w:t>In short</w:t>
+      </w:r>
+      <w:r>
+        <w:rPr>
+          <w:b w:val="false"/>
+          <w:bCs w:val="false"/>
+          <w:sz w:val="24"/>
+          <w:szCs w:val="24"/>
+        </w:rPr>
+        <w:t>, researchers should develop tools that can help smartphone users peruse through images and videos efficiently.</w:t>
       </w:r>
     </w:p>
     <w:p>
@@ -4938,7 +5163,46 @@
           <w:sz w:val="24"/>
           <w:szCs w:val="24"/>
         </w:rPr>
-        <w:t xml:space="preserve">Najibi, A. (2020). </w:t>
+        <w:t xml:space="preserve">Mothar, M. N., Hassan, A. M., Hassan, H. S., and Osman, N. M. </w:t>
+      </w:r>
+      <w:r>
+        <w:rPr>
+          <w:b w:val="false"/>
+          <w:bCs w:val="false"/>
+          <w:sz w:val="24"/>
+          <w:szCs w:val="24"/>
+        </w:rPr>
+        <w:t xml:space="preserve">(2013). </w:t>
+      </w:r>
+      <w:r>
+        <w:rPr>
+          <w:b w:val="false"/>
+          <w:bCs w:val="false"/>
+          <w:sz w:val="24"/>
+          <w:szCs w:val="24"/>
+        </w:rPr>
+        <w:t xml:space="preserve">The Importance of </w:t>
+      </w:r>
+    </w:p>
+    <w:p>
+      <w:pPr>
+        <w:pStyle w:val="Normal"/>
+        <w:bidi w:val="0"/>
+        <w:spacing w:lineRule="auto" w:line="480"/>
+        <w:jc w:val="left"/>
+        <w:rPr/>
+      </w:pPr>
+      <w:r>
+        <w:rPr>
+          <w:b w:val="false"/>
+          <w:bCs w:val="false"/>
+          <w:sz w:val="24"/>
+          <w:szCs w:val="24"/>
+        </w:rPr>
+        <w:tab/>
+        <w:t xml:space="preserve">Smartphone’s </w:t>
+        <w:tab/>
+        <w:t xml:space="preserve">Usage Among Malaysian Undergraduates. </w:t>
       </w:r>
       <w:r>
         <w:rPr>
@@ -4949,38 +5213,40 @@
           <w:sz w:val="24"/>
           <w:szCs w:val="24"/>
         </w:rPr>
-        <w:t>Racial Discrimination in Face Recognition Technology</w:t>
-      </w:r>
-      <w:r>
-        <w:rPr>
-          <w:b w:val="false"/>
-          <w:bCs w:val="false"/>
-          <w:sz w:val="24"/>
-          <w:szCs w:val="24"/>
-        </w:rPr>
-        <w:t xml:space="preserve">. Retrieved from </w:t>
-        <w:tab/>
-        <w:t>https://sitn.hms.harvard.edu/flash/2020/racial-discrimination-in-face-recognition-</w:t>
-        <w:tab/>
-        <w:t>technology/</w:t>
-      </w:r>
-    </w:p>
-    <w:p>
-      <w:pPr>
-        <w:pStyle w:val="Normal"/>
-        <w:bidi w:val="0"/>
-        <w:spacing w:lineRule="auto" w:line="480"/>
-        <w:jc w:val="left"/>
-        <w:rPr/>
-      </w:pPr>
-      <w:r>
-        <w:rPr>
-          <w:b w:val="false"/>
-          <w:bCs w:val="false"/>
-          <w:sz w:val="24"/>
-          <w:szCs w:val="24"/>
-        </w:rPr>
-        <w:t xml:space="preserve">Parkhi, M. O., Vedaldi, A., and Ziseerman, A.  (2015). </w:t>
+        <w:t xml:space="preserve">Journal Of Humanities And Social </w:t>
+        <w:tab/>
+        <w:t>Science</w:t>
+      </w:r>
+      <w:r>
+        <w:rPr>
+          <w:b w:val="false"/>
+          <w:bCs w:val="false"/>
+          <w:i w:val="false"/>
+          <w:iCs w:val="false"/>
+          <w:sz w:val="24"/>
+          <w:szCs w:val="24"/>
+        </w:rPr>
+        <w:t xml:space="preserve">, 14(3): 112-118. Retrieved from: </w:t>
+        <w:tab/>
+        <w:t>https://www.iosrjournals.org/iosr-jhss/papers/Vol14-issue3/S0143112118.pdf</w:t>
+      </w:r>
+    </w:p>
+    <w:p>
+      <w:pPr>
+        <w:pStyle w:val="Normal"/>
+        <w:bidi w:val="0"/>
+        <w:spacing w:lineRule="auto" w:line="480"/>
+        <w:jc w:val="left"/>
+        <w:rPr/>
+      </w:pPr>
+      <w:r>
+        <w:rPr>
+          <w:b w:val="false"/>
+          <w:bCs w:val="false"/>
+          <w:sz w:val="24"/>
+          <w:szCs w:val="24"/>
+        </w:rPr>
+        <w:t xml:space="preserve">Najibi, A. (2020). </w:t>
       </w:r>
       <w:r>
         <w:rPr>
@@ -4991,84 +5257,38 @@
           <w:sz w:val="24"/>
           <w:szCs w:val="24"/>
         </w:rPr>
-        <w:t>VGG Face Dataset</w:t>
-      </w:r>
-      <w:r>
-        <w:rPr>
-          <w:b w:val="false"/>
-          <w:bCs w:val="false"/>
-          <w:sz w:val="24"/>
-          <w:szCs w:val="24"/>
-        </w:rPr>
-        <w:t xml:space="preserve">. Retrieved from: </w:t>
-      </w:r>
-    </w:p>
-    <w:p>
-      <w:pPr>
-        <w:pStyle w:val="Normal"/>
-        <w:bidi w:val="0"/>
-        <w:spacing w:lineRule="auto" w:line="480"/>
-        <w:jc w:val="left"/>
-        <w:rPr>
-          <w:b w:val="false"/>
-          <w:b w:val="false"/>
-          <w:bCs w:val="false"/>
-          <w:sz w:val="24"/>
-          <w:szCs w:val="24"/>
-        </w:rPr>
-      </w:pPr>
-      <w:r>
-        <w:rPr>
-          <w:b w:val="false"/>
-          <w:bCs w:val="false"/>
-          <w:sz w:val="24"/>
-          <w:szCs w:val="24"/>
-        </w:rPr>
-        <w:tab/>
-        <w:t>https://www.robots.ox.ac.uk/~vgg/data/vgg_face/</w:t>
-      </w:r>
-    </w:p>
-    <w:p>
-      <w:pPr>
-        <w:pStyle w:val="Normal"/>
-        <w:bidi w:val="0"/>
-        <w:spacing w:lineRule="auto" w:line="480"/>
-        <w:jc w:val="left"/>
-        <w:rPr>
-          <w:b w:val="false"/>
-          <w:b w:val="false"/>
-          <w:bCs w:val="false"/>
-          <w:sz w:val="24"/>
-          <w:szCs w:val="24"/>
-        </w:rPr>
-      </w:pPr>
-      <w:r>
-        <w:rPr>
-          <w:b w:val="false"/>
-          <w:bCs w:val="false"/>
-          <w:sz w:val="24"/>
-          <w:szCs w:val="24"/>
-        </w:rPr>
-        <w:t xml:space="preserve">Priya, G. A., Rekha, P. A., Sarabya, K. R., and Thanuganesh, M. (2014). Face Recognition with </w:t>
-      </w:r>
-    </w:p>
-    <w:p>
-      <w:pPr>
-        <w:pStyle w:val="Normal"/>
-        <w:bidi w:val="0"/>
-        <w:spacing w:lineRule="auto" w:line="480"/>
-        <w:jc w:val="left"/>
-        <w:rPr/>
-      </w:pPr>
-      <w:r>
-        <w:rPr>
-          <w:b w:val="false"/>
-          <w:bCs w:val="false"/>
-          <w:sz w:val="24"/>
-          <w:szCs w:val="24"/>
-        </w:rPr>
-        <w:tab/>
-        <w:t>Different Approaches: A Survey. I</w:t>
+        <w:t>Racial Discrimination in Face Recognition Technology</w:t>
+      </w:r>
+      <w:r>
+        <w:rPr>
+          <w:b w:val="false"/>
+          <w:bCs w:val="false"/>
+          <w:sz w:val="24"/>
+          <w:szCs w:val="24"/>
+        </w:rPr>
+        <w:t xml:space="preserve">. Retrieved from </w:t>
+        <w:tab/>
+        <w:t>https://sitn.hms.harvard.edu/flash/2020/racial-discrimination-in-face-recognition-</w:t>
+        <w:tab/>
+        <w:t>technology/</w:t>
+      </w:r>
+    </w:p>
+    <w:p>
+      <w:pPr>
+        <w:pStyle w:val="Normal"/>
+        <w:bidi w:val="0"/>
+        <w:spacing w:lineRule="auto" w:line="480"/>
+        <w:jc w:val="left"/>
+        <w:rPr/>
+      </w:pPr>
+      <w:r>
+        <w:rPr>
+          <w:b w:val="false"/>
+          <w:bCs w:val="false"/>
+          <w:sz w:val="24"/>
+          <w:szCs w:val="24"/>
+        </w:rPr>
+        <w:t xml:space="preserve">Parkhi, M. O., Vedaldi, A., and Ziseerman, A.  (2015). </w:t>
       </w:r>
       <w:r>
         <w:rPr>
@@ -5079,36 +5299,84 @@
           <w:sz w:val="24"/>
           <w:szCs w:val="24"/>
         </w:rPr>
-        <w:t xml:space="preserve">nternational Journal of Emerging Engineering Research </w:t>
-        <w:tab/>
-        <w:t>and Technology</w:t>
-      </w:r>
-      <w:r>
-        <w:rPr>
-          <w:b w:val="false"/>
-          <w:bCs w:val="false"/>
-          <w:sz w:val="24"/>
-          <w:szCs w:val="24"/>
-        </w:rPr>
-        <w:t>, 2(7): 288-293. Retrieved from: http://www.ijeert.org/pdf/v2-i7/39.pdf</w:t>
-      </w:r>
-    </w:p>
-    <w:p>
-      <w:pPr>
-        <w:pStyle w:val="Normal"/>
-        <w:bidi w:val="0"/>
-        <w:spacing w:lineRule="auto" w:line="480"/>
-        <w:jc w:val="left"/>
-        <w:rPr/>
-      </w:pPr>
-      <w:r>
-        <w:rPr>
-          <w:b w:val="false"/>
-          <w:bCs w:val="false"/>
-          <w:sz w:val="24"/>
-          <w:szCs w:val="24"/>
-        </w:rPr>
-        <w:t xml:space="preserve">Ranjan, A., Behera, N. J., and Reza. M. (2020). </w:t>
+        <w:t>VGG Face Dataset</w:t>
+      </w:r>
+      <w:r>
+        <w:rPr>
+          <w:b w:val="false"/>
+          <w:bCs w:val="false"/>
+          <w:sz w:val="24"/>
+          <w:szCs w:val="24"/>
+        </w:rPr>
+        <w:t xml:space="preserve">. Retrieved from: </w:t>
+      </w:r>
+    </w:p>
+    <w:p>
+      <w:pPr>
+        <w:pStyle w:val="Normal"/>
+        <w:bidi w:val="0"/>
+        <w:spacing w:lineRule="auto" w:line="480"/>
+        <w:jc w:val="left"/>
+        <w:rPr>
+          <w:b w:val="false"/>
+          <w:b w:val="false"/>
+          <w:bCs w:val="false"/>
+          <w:sz w:val="24"/>
+          <w:szCs w:val="24"/>
+        </w:rPr>
+      </w:pPr>
+      <w:r>
+        <w:rPr>
+          <w:b w:val="false"/>
+          <w:bCs w:val="false"/>
+          <w:sz w:val="24"/>
+          <w:szCs w:val="24"/>
+        </w:rPr>
+        <w:tab/>
+        <w:t>https://www.robots.ox.ac.uk/~vgg/data/vgg_face/</w:t>
+      </w:r>
+    </w:p>
+    <w:p>
+      <w:pPr>
+        <w:pStyle w:val="Normal"/>
+        <w:bidi w:val="0"/>
+        <w:spacing w:lineRule="auto" w:line="480"/>
+        <w:jc w:val="left"/>
+        <w:rPr>
+          <w:b w:val="false"/>
+          <w:b w:val="false"/>
+          <w:bCs w:val="false"/>
+          <w:sz w:val="24"/>
+          <w:szCs w:val="24"/>
+        </w:rPr>
+      </w:pPr>
+      <w:r>
+        <w:rPr>
+          <w:b w:val="false"/>
+          <w:bCs w:val="false"/>
+          <w:sz w:val="24"/>
+          <w:szCs w:val="24"/>
+        </w:rPr>
+        <w:t xml:space="preserve">Priya, G. A., Rekha, P. A., Sarabya, K. R., and Thanuganesh, M. (2014). Face Recognition with </w:t>
+      </w:r>
+    </w:p>
+    <w:p>
+      <w:pPr>
+        <w:pStyle w:val="Normal"/>
+        <w:bidi w:val="0"/>
+        <w:spacing w:lineRule="auto" w:line="480"/>
+        <w:jc w:val="left"/>
+        <w:rPr/>
+      </w:pPr>
+      <w:r>
+        <w:rPr>
+          <w:b w:val="false"/>
+          <w:bCs w:val="false"/>
+          <w:sz w:val="24"/>
+          <w:szCs w:val="24"/>
+        </w:rPr>
+        <w:tab/>
+        <w:t>Different Approaches: A Survey. I</w:t>
       </w:r>
       <w:r>
         <w:rPr>
@@ -5119,17 +5387,37 @@
           <w:sz w:val="24"/>
           <w:szCs w:val="24"/>
         </w:rPr>
-        <w:t>A Parallel Approach for Real-Time Face</w:t>
-      </w:r>
-    </w:p>
-    <w:p>
-      <w:pPr>
-        <w:pStyle w:val="Normal"/>
-        <w:bidi w:val="0"/>
-        <w:spacing w:lineRule="auto" w:line="480"/>
-        <w:jc w:val="left"/>
-        <w:rPr/>
-      </w:pPr>
+        <w:t xml:space="preserve">nternational Journal of Emerging Engineering Research </w:t>
+        <w:tab/>
+        <w:t>and Technology</w:t>
+      </w:r>
+      <w:r>
+        <w:rPr>
+          <w:b w:val="false"/>
+          <w:bCs w:val="false"/>
+          <w:sz w:val="24"/>
+          <w:szCs w:val="24"/>
+        </w:rPr>
+        <w:t>, 2(7): 288-293. Retrieved from: http://www.ijeert.org/pdf/v2-i7/39.pdf</w:t>
+      </w:r>
+    </w:p>
+    <w:p>
+      <w:pPr>
+        <w:pStyle w:val="Normal"/>
+        <w:bidi w:val="0"/>
+        <w:spacing w:lineRule="auto" w:line="480"/>
+        <w:jc w:val="left"/>
+        <w:rPr/>
+      </w:pPr>
+      <w:r>
+        <w:rPr>
+          <w:b w:val="false"/>
+          <w:bCs w:val="false"/>
+          <w:sz w:val="24"/>
+          <w:szCs w:val="24"/>
+        </w:rPr>
+        <w:t xml:space="preserve">Ranjan, A., Behera, N. J., and Reza. M. (2020). </w:t>
+      </w:r>
       <w:r>
         <w:rPr>
           <w:b w:val="false"/>
@@ -5139,38 +5427,17 @@
           <w:sz w:val="24"/>
           <w:szCs w:val="24"/>
         </w:rPr>
-        <w:tab/>
-        <w:t>Recognition from a Large Database</w:t>
-      </w:r>
-      <w:r>
-        <w:rPr>
-          <w:b w:val="false"/>
-          <w:bCs w:val="false"/>
-          <w:sz w:val="24"/>
-          <w:szCs w:val="24"/>
-        </w:rPr>
-        <w:t>. Retrieved from: https://arxiv.org/pdf/2011.00443.pdf</w:t>
-      </w:r>
-    </w:p>
-    <w:p>
-      <w:pPr>
-        <w:pStyle w:val="Normal"/>
-        <w:bidi w:val="0"/>
-        <w:spacing w:lineRule="auto" w:line="480"/>
-        <w:jc w:val="left"/>
-        <w:rPr/>
-      </w:pPr>
-      <w:r>
-        <w:rPr>
-          <w:b w:val="false"/>
-          <w:bCs w:val="false"/>
-          <w:sz w:val="24"/>
-          <w:szCs w:val="24"/>
-        </w:rPr>
-        <w:t xml:space="preserve">Rehman, H. M., Liew, S. C., Abbas, A., Jayaraman, P. P., Wah, Y. T., and Khan U. S. (2016). Big </w:t>
-        <w:tab/>
-        <w:t xml:space="preserve">Data Reduction Methods: A Survey. </w:t>
-      </w:r>
+        <w:t>A Parallel Approach for Real-Time Face</w:t>
+      </w:r>
+    </w:p>
+    <w:p>
+      <w:pPr>
+        <w:pStyle w:val="Normal"/>
+        <w:bidi w:val="0"/>
+        <w:spacing w:lineRule="auto" w:line="480"/>
+        <w:jc w:val="left"/>
+        <w:rPr/>
+      </w:pPr>
       <w:r>
         <w:rPr>
           <w:b w:val="false"/>
@@ -5180,59 +5447,37 @@
           <w:sz w:val="24"/>
           <w:szCs w:val="24"/>
         </w:rPr>
-        <w:t>Data Science and Engineering</w:t>
-      </w:r>
-      <w:r>
-        <w:rPr>
-          <w:b w:val="false"/>
-          <w:bCs w:val="false"/>
-          <w:sz w:val="24"/>
-          <w:szCs w:val="24"/>
-        </w:rPr>
-        <w:t xml:space="preserve">, (2016) 1:265–284, </w:t>
-        <w:tab/>
-      </w:r>
-      <w:r>
-        <w:rPr>
-          <w:b w:val="false"/>
-          <w:bCs w:val="false"/>
-          <w:i w:val="false"/>
-          <w:iCs w:val="false"/>
-          <w:sz w:val="24"/>
-          <w:szCs w:val="24"/>
-        </w:rPr>
-        <w:t>https://doi:</w:t>
-      </w:r>
-      <w:r>
-        <w:rPr>
-          <w:i w:val="false"/>
-          <w:iCs w:val="false"/>
-        </w:rPr>
-        <w:t>10.1007/s41019-016-0022-0</w:t>
-      </w:r>
-    </w:p>
-    <w:p>
-      <w:pPr>
-        <w:pStyle w:val="Normal"/>
-        <w:bidi w:val="0"/>
-        <w:spacing w:lineRule="auto" w:line="480"/>
-        <w:jc w:val="left"/>
-        <w:rPr>
-          <w:b w:val="false"/>
-          <w:b w:val="false"/>
-          <w:bCs w:val="false"/>
-          <w:sz w:val="24"/>
-          <w:szCs w:val="24"/>
-        </w:rPr>
-      </w:pPr>
-      <w:r>
-        <w:rPr>
-          <w:b w:val="false"/>
-          <w:bCs w:val="false"/>
-          <w:sz w:val="24"/>
-          <w:szCs w:val="24"/>
-        </w:rPr>
-        <w:t xml:space="preserve">Schroff, F., Kalenichenko, D., and Phiblin, J. (2015-07-12). </w:t>
+        <w:tab/>
+        <w:t>Recognition from a Large Database</w:t>
+      </w:r>
+      <w:r>
+        <w:rPr>
+          <w:b w:val="false"/>
+          <w:bCs w:val="false"/>
+          <w:sz w:val="24"/>
+          <w:szCs w:val="24"/>
+        </w:rPr>
+        <w:t>. Retrieved from: https://arxiv.org/pdf/2011.00443.pdf</w:t>
+      </w:r>
+    </w:p>
+    <w:p>
+      <w:pPr>
+        <w:pStyle w:val="Normal"/>
+        <w:bidi w:val="0"/>
+        <w:spacing w:lineRule="auto" w:line="480"/>
+        <w:jc w:val="left"/>
+        <w:rPr/>
+      </w:pPr>
+      <w:r>
+        <w:rPr>
+          <w:b w:val="false"/>
+          <w:bCs w:val="false"/>
+          <w:sz w:val="24"/>
+          <w:szCs w:val="24"/>
+        </w:rPr>
+        <w:t xml:space="preserve">Rehman, H. M., Liew, S. C., Abbas, A., Jayaraman, P. P., Wah, Y. T., and Khan U. S. (2016). Big </w:t>
+        <w:tab/>
+        <w:t xml:space="preserve">Data Reduction Methods: A Survey. </w:t>
       </w:r>
       <w:r>
         <w:rPr>
@@ -5243,23 +5488,60 @@
           <w:sz w:val="24"/>
           <w:szCs w:val="24"/>
         </w:rPr>
-        <w:t xml:space="preserve">FaceNet: A unified embedding for face </w:t>
-      </w:r>
-    </w:p>
-    <w:p>
-      <w:pPr>
-        <w:pStyle w:val="Normal"/>
-        <w:bidi w:val="0"/>
-        <w:spacing w:lineRule="auto" w:line="480"/>
-        <w:jc w:val="left"/>
-        <w:rPr>
-          <w:b w:val="false"/>
-          <w:b w:val="false"/>
-          <w:bCs w:val="false"/>
-          <w:sz w:val="24"/>
-          <w:szCs w:val="24"/>
-        </w:rPr>
-      </w:pPr>
+        <w:t>Data Science and Engineering</w:t>
+      </w:r>
+      <w:r>
+        <w:rPr>
+          <w:b w:val="false"/>
+          <w:bCs w:val="false"/>
+          <w:sz w:val="24"/>
+          <w:szCs w:val="24"/>
+        </w:rPr>
+        <w:t xml:space="preserve">, (2016) 1:265–284, </w:t>
+        <w:tab/>
+      </w:r>
+      <w:r>
+        <w:rPr>
+          <w:b w:val="false"/>
+          <w:bCs w:val="false"/>
+          <w:i w:val="false"/>
+          <w:iCs w:val="false"/>
+          <w:sz w:val="24"/>
+          <w:szCs w:val="24"/>
+        </w:rPr>
+        <w:t>https://doi:</w:t>
+      </w:r>
+      <w:r>
+        <w:rPr>
+          <w:i w:val="false"/>
+          <w:iCs w:val="false"/>
+        </w:rPr>
+        <w:t>10.1007/s41019-016-0022-0</w:t>
+      </w:r>
+    </w:p>
+    <w:p>
+      <w:pPr>
+        <w:pStyle w:val="Normal"/>
+        <w:bidi w:val="0"/>
+        <w:spacing w:lineRule="auto" w:line="480"/>
+        <w:jc w:val="left"/>
+        <w:rPr>
+          <w:b w:val="false"/>
+          <w:b w:val="false"/>
+          <w:bCs w:val="false"/>
+          <w:sz w:val="24"/>
+          <w:szCs w:val="24"/>
+        </w:rPr>
+      </w:pPr>
+      <w:r>
+        <w:rPr>
+          <w:b w:val="false"/>
+          <w:bCs w:val="false"/>
+          <w:sz w:val="24"/>
+          <w:szCs w:val="24"/>
+        </w:rPr>
+        <w:t xml:space="preserve">Schroff, F., Kalenichenko, D., and Phiblin, J. (2015-07-12). </w:t>
+      </w:r>
       <w:r>
         <w:rPr>
           <w:b w:val="false"/>
@@ -5269,83 +5551,23 @@
           <w:sz w:val="24"/>
           <w:szCs w:val="24"/>
         </w:rPr>
-        <w:tab/>
-        <w:t>recognition and clustering</w:t>
-      </w:r>
-      <w:r>
-        <w:rPr>
-          <w:b w:val="false"/>
-          <w:bCs w:val="false"/>
-          <w:sz w:val="24"/>
-          <w:szCs w:val="24"/>
-        </w:rPr>
-        <w:t xml:space="preserve">, 2015 IEEE Conference on Computer Vision and Pattern </w:t>
-        <w:tab/>
-        <w:t xml:space="preserve">Recognition,  Boston, MA, USA. </w:t>
-      </w:r>
-      <w:r>
-        <w:rPr>
-          <w:b w:val="false"/>
-          <w:bCs w:val="false"/>
-          <w:i w:val="false"/>
-          <w:iCs w:val="false"/>
-          <w:sz w:val="24"/>
-          <w:szCs w:val="24"/>
-        </w:rPr>
-        <w:t>https://</w:t>
-      </w:r>
-      <w:r>
-        <w:rPr>
-          <w:b w:val="false"/>
-          <w:bCs w:val="false"/>
-          <w:sz w:val="24"/>
-          <w:szCs w:val="24"/>
-        </w:rPr>
-        <w:t>doi: 10.1109/CVPR.2015.7298682.</w:t>
-      </w:r>
-    </w:p>
-    <w:p>
-      <w:pPr>
-        <w:pStyle w:val="Normal"/>
-        <w:bidi w:val="0"/>
-        <w:spacing w:lineRule="auto" w:line="480"/>
-        <w:jc w:val="left"/>
-        <w:rPr>
-          <w:b w:val="false"/>
-          <w:b w:val="false"/>
-          <w:bCs w:val="false"/>
-          <w:sz w:val="24"/>
-          <w:szCs w:val="24"/>
-        </w:rPr>
-      </w:pPr>
-      <w:r>
-        <w:rPr>
-          <w:b w:val="false"/>
-          <w:bCs w:val="false"/>
-          <w:sz w:val="24"/>
-          <w:szCs w:val="24"/>
-        </w:rPr>
-        <w:t xml:space="preserve">Shahin, R. O., Ayedi, R., Rayan, A., Rasha, M., and Ahmed, A. (2021). Human Face Recognition </w:t>
-      </w:r>
-    </w:p>
-    <w:p>
-      <w:pPr>
-        <w:pStyle w:val="Normal"/>
-        <w:bidi w:val="0"/>
-        <w:spacing w:lineRule="auto" w:line="480"/>
-        <w:jc w:val="left"/>
-        <w:rPr/>
-      </w:pPr>
-      <w:r>
-        <w:rPr>
-          <w:b w:val="false"/>
-          <w:bCs w:val="false"/>
-          <w:sz w:val="24"/>
-          <w:szCs w:val="24"/>
-        </w:rPr>
-        <w:tab/>
-        <w:t xml:space="preserve">from Part of a Facial Image based in Image Stitching. </w:t>
-      </w:r>
+        <w:t xml:space="preserve">FaceNet: A unified embedding for face </w:t>
+      </w:r>
+    </w:p>
+    <w:p>
+      <w:pPr>
+        <w:pStyle w:val="Normal"/>
+        <w:bidi w:val="0"/>
+        <w:spacing w:lineRule="auto" w:line="480"/>
+        <w:jc w:val="left"/>
+        <w:rPr>
+          <w:b w:val="false"/>
+          <w:b w:val="false"/>
+          <w:bCs w:val="false"/>
+          <w:sz w:val="24"/>
+          <w:szCs w:val="24"/>
+        </w:rPr>
+      </w:pPr>
       <w:r>
         <w:rPr>
           <w:b w:val="false"/>
@@ -5355,6 +5577,92 @@
           <w:sz w:val="24"/>
           <w:szCs w:val="24"/>
         </w:rPr>
+        <w:tab/>
+        <w:t>recognition and clustering</w:t>
+      </w:r>
+      <w:r>
+        <w:rPr>
+          <w:b w:val="false"/>
+          <w:bCs w:val="false"/>
+          <w:sz w:val="24"/>
+          <w:szCs w:val="24"/>
+        </w:rPr>
+        <w:t xml:space="preserve">, 2015 IEEE Conference on Computer Vision and Pattern </w:t>
+        <w:tab/>
+        <w:t xml:space="preserve">Recognition,  Boston, MA, USA. </w:t>
+      </w:r>
+      <w:r>
+        <w:rPr>
+          <w:b w:val="false"/>
+          <w:bCs w:val="false"/>
+          <w:i w:val="false"/>
+          <w:iCs w:val="false"/>
+          <w:sz w:val="24"/>
+          <w:szCs w:val="24"/>
+        </w:rPr>
+        <w:t>https://</w:t>
+      </w:r>
+      <w:r>
+        <w:rPr>
+          <w:b w:val="false"/>
+          <w:bCs w:val="false"/>
+          <w:sz w:val="24"/>
+          <w:szCs w:val="24"/>
+        </w:rPr>
+        <w:t>doi: 10.1109/CVPR.2015.7298682.</w:t>
+      </w:r>
+    </w:p>
+    <w:p>
+      <w:pPr>
+        <w:pStyle w:val="Normal"/>
+        <w:bidi w:val="0"/>
+        <w:spacing w:lineRule="auto" w:line="480"/>
+        <w:jc w:val="left"/>
+        <w:rPr>
+          <w:b w:val="false"/>
+          <w:b w:val="false"/>
+          <w:bCs w:val="false"/>
+          <w:sz w:val="24"/>
+          <w:szCs w:val="24"/>
+        </w:rPr>
+      </w:pPr>
+      <w:r>
+        <w:rPr>
+          <w:b w:val="false"/>
+          <w:bCs w:val="false"/>
+          <w:sz w:val="24"/>
+          <w:szCs w:val="24"/>
+        </w:rPr>
+        <w:t xml:space="preserve">Shahin, R. O., Ayedi, R., Rayan, A., Rasha, M., and Ahmed, A. (2021). Human Face Recognition </w:t>
+      </w:r>
+    </w:p>
+    <w:p>
+      <w:pPr>
+        <w:pStyle w:val="Normal"/>
+        <w:bidi w:val="0"/>
+        <w:spacing w:lineRule="auto" w:line="480"/>
+        <w:jc w:val="left"/>
+        <w:rPr/>
+      </w:pPr>
+      <w:r>
+        <w:rPr>
+          <w:b w:val="false"/>
+          <w:bCs w:val="false"/>
+          <w:sz w:val="24"/>
+          <w:szCs w:val="24"/>
+        </w:rPr>
+        <w:tab/>
+        <w:t xml:space="preserve">from Part of a Facial Image based in Image Stitching. </w:t>
+      </w:r>
+      <w:r>
+        <w:rPr>
+          <w:b w:val="false"/>
+          <w:bCs w:val="false"/>
+          <w:i/>
+          <w:iCs/>
+          <w:sz w:val="24"/>
+          <w:szCs w:val="24"/>
+        </w:rPr>
         <w:t xml:space="preserve">International Journal of Advanced </w:t>
         <w:tab/>
         <w:t>Computer Science and Applications</w:t>
@@ -5367,6 +5675,153 @@
           <w:szCs w:val="24"/>
         </w:rPr>
         <w:t>, 12(12) 256-463</w:t>
+      </w:r>
+    </w:p>
+    <w:p>
+      <w:pPr>
+        <w:pStyle w:val="Normal"/>
+        <w:bidi w:val="0"/>
+        <w:spacing w:lineRule="auto" w:line="480"/>
+        <w:jc w:val="left"/>
+        <w:rPr>
+          <w:b w:val="false"/>
+          <w:b w:val="false"/>
+          <w:bCs w:val="false"/>
+          <w:sz w:val="24"/>
+          <w:szCs w:val="24"/>
+        </w:rPr>
+      </w:pPr>
+      <w:r>
+        <w:rPr>
+          <w:rStyle w:val="Quotation"/>
+          <w:b w:val="false"/>
+          <w:bCs w:val="false"/>
+          <w:i w:val="false"/>
+          <w:iCs w:val="false"/>
+          <w:sz w:val="24"/>
+          <w:szCs w:val="24"/>
+        </w:rPr>
+        <w:t>Saraswathi</w:t>
+      </w:r>
+      <w:r>
+        <w:rPr>
+          <w:rStyle w:val="Quotation"/>
+          <w:b w:val="false"/>
+          <w:bCs w:val="false"/>
+          <w:sz w:val="24"/>
+          <w:szCs w:val="24"/>
+        </w:rPr>
+        <w:t xml:space="preserve">, </w:t>
+      </w:r>
+      <w:r>
+        <w:rPr>
+          <w:rStyle w:val="Quotation"/>
+          <w:b w:val="false"/>
+          <w:bCs w:val="false"/>
+          <w:i w:val="false"/>
+          <w:iCs w:val="false"/>
+          <w:sz w:val="24"/>
+          <w:szCs w:val="24"/>
+        </w:rPr>
+        <w:t xml:space="preserve">S. (2017). </w:t>
+      </w:r>
+      <w:r>
+        <w:rPr>
+          <w:rStyle w:val="Quotation"/>
+          <w:b w:val="false"/>
+          <w:bCs w:val="false"/>
+          <w:i w:val="false"/>
+          <w:iCs w:val="false"/>
+          <w:sz w:val="24"/>
+          <w:szCs w:val="24"/>
+        </w:rPr>
+        <w:t>Smartphone Usage Among Students</w:t>
+      </w:r>
+      <w:r>
+        <w:rPr>
+          <w:rStyle w:val="Quotation"/>
+          <w:b w:val="false"/>
+          <w:bCs w:val="false"/>
+          <w:i w:val="false"/>
+          <w:iCs w:val="false"/>
+          <w:sz w:val="24"/>
+          <w:szCs w:val="24"/>
+        </w:rPr>
+        <w:t xml:space="preserve">. </w:t>
+      </w:r>
+      <w:r>
+        <w:rPr>
+          <w:rStyle w:val="Emphasis"/>
+          <w:b w:val="false"/>
+          <w:bCs w:val="false"/>
+          <w:sz w:val="24"/>
+          <w:szCs w:val="24"/>
+        </w:rPr>
+        <w:t xml:space="preserve">International Education and Research </w:t>
+      </w:r>
+    </w:p>
+    <w:p>
+      <w:pPr>
+        <w:pStyle w:val="Normal"/>
+        <w:bidi w:val="0"/>
+        <w:spacing w:lineRule="auto" w:line="480"/>
+        <w:jc w:val="left"/>
+        <w:rPr>
+          <w:b w:val="false"/>
+          <w:b w:val="false"/>
+          <w:bCs w:val="false"/>
+          <w:sz w:val="24"/>
+          <w:szCs w:val="24"/>
+        </w:rPr>
+      </w:pPr>
+      <w:r>
+        <w:rPr>
+          <w:rStyle w:val="Emphasis"/>
+          <w:b w:val="false"/>
+          <w:bCs w:val="false"/>
+          <w:sz w:val="24"/>
+          <w:szCs w:val="24"/>
+        </w:rPr>
+        <w:tab/>
+        <w:t xml:space="preserve">Journal, </w:t>
+      </w:r>
+      <w:r>
+        <w:rPr>
+          <w:rStyle w:val="Emphasis"/>
+          <w:b w:val="false"/>
+          <w:bCs w:val="false"/>
+          <w:i w:val="false"/>
+          <w:iCs w:val="false"/>
+          <w:sz w:val="24"/>
+          <w:szCs w:val="24"/>
+        </w:rPr>
+        <w:t>3</w:t>
+      </w:r>
+      <w:r>
+        <w:rPr>
+          <w:rStyle w:val="Emphasis"/>
+          <w:b w:val="false"/>
+          <w:bCs w:val="false"/>
+          <w:i w:val="false"/>
+          <w:iCs w:val="false"/>
+          <w:sz w:val="24"/>
+          <w:szCs w:val="24"/>
+        </w:rPr>
+        <w:t xml:space="preserve">(6), 195-197. Retrieved from </w:t>
+        <w:tab/>
+        <w:t>https://www.academia.edu/45200359/s</w:t>
+      </w:r>
+      <w:r>
+        <w:rPr>
+          <w:rStyle w:val="Quotation"/>
+          <w:b w:val="false"/>
+          <w:bCs w:val="false"/>
+          <w:i w:val="false"/>
+          <w:iCs w:val="false"/>
+          <w:sz w:val="24"/>
+          <w:szCs w:val="24"/>
+        </w:rPr>
+        <w:t>martphone_usage_among_students</w:t>
       </w:r>
     </w:p>
     <w:p>
@@ -5869,7 +6324,7 @@
     <w:pPr>
       <w:widowControl/>
       <w:suppressAutoHyphens w:val="true"/>
-      <w:overflowPunct w:val="false"/>
+      <w:overflowPunct w:val="true"/>
       <w:bidi w:val="0"/>
       <w:spacing w:before="0" w:after="0"/>
       <w:jc w:val="left"/>

</xml_diff>

<commit_message>
Start working on Template Matching
</commit_message>
<xml_diff>
--- a/SikoliaThesis.docx
+++ b/SikoliaThesis.docx
@@ -2428,157 +2428,26 @@
           <w:sz w:val="24"/>
           <w:szCs w:val="24"/>
         </w:rPr>
-        <w:t xml:space="preserve">It is because these features have smartphones applicable cases such as learning, interpersonal communication, entertainment,  and even business transactions. </w:t>
-      </w:r>
-      <w:r>
-        <w:rPr>
-          <w:b w:val="false"/>
-          <w:bCs w:val="false"/>
-          <w:sz w:val="24"/>
-          <w:szCs w:val="24"/>
-        </w:rPr>
-        <w:t>It is notable that u</w:t>
-      </w:r>
-      <w:r>
-        <w:rPr>
-          <w:b w:val="false"/>
-          <w:bCs w:val="false"/>
-          <w:sz w:val="24"/>
-          <w:szCs w:val="24"/>
-        </w:rPr>
-        <w:t xml:space="preserve">nlike desktop computers </w:t>
-      </w:r>
-      <w:r>
-        <w:rPr>
-          <w:b w:val="false"/>
-          <w:bCs w:val="false"/>
-          <w:sz w:val="24"/>
-          <w:szCs w:val="24"/>
-        </w:rPr>
-        <w:t xml:space="preserve">and </w:t>
-      </w:r>
-      <w:r>
-        <w:rPr>
-          <w:b w:val="false"/>
-          <w:bCs w:val="false"/>
-          <w:sz w:val="24"/>
-          <w:szCs w:val="24"/>
-        </w:rPr>
-        <w:t xml:space="preserve"> laptops, smartphone</w:t>
-      </w:r>
-      <w:r>
-        <w:rPr>
-          <w:b w:val="false"/>
-          <w:bCs w:val="false"/>
-          <w:sz w:val="24"/>
-          <w:szCs w:val="24"/>
-        </w:rPr>
-        <w:t>s</w:t>
-      </w:r>
-      <w:r>
-        <w:rPr>
-          <w:b w:val="false"/>
-          <w:bCs w:val="false"/>
-          <w:sz w:val="24"/>
-          <w:szCs w:val="24"/>
-        </w:rPr>
-        <w:t xml:space="preserve"> </w:t>
-      </w:r>
-      <w:r>
-        <w:rPr>
-          <w:b w:val="false"/>
-          <w:bCs w:val="false"/>
-          <w:sz w:val="24"/>
-          <w:szCs w:val="24"/>
-        </w:rPr>
-        <w:t>are</w:t>
-      </w:r>
-      <w:r>
-        <w:rPr>
-          <w:b w:val="false"/>
-          <w:bCs w:val="false"/>
-          <w:sz w:val="24"/>
-          <w:szCs w:val="24"/>
-        </w:rPr>
-        <w:t xml:space="preserve"> portable, </w:t>
-      </w:r>
-      <w:r>
-        <w:rPr>
-          <w:b w:val="false"/>
-          <w:bCs w:val="false"/>
-          <w:sz w:val="24"/>
-          <w:szCs w:val="24"/>
-        </w:rPr>
-        <w:t>which makes them convenient to use</w:t>
-      </w:r>
-      <w:r>
-        <w:rPr>
-          <w:b w:val="false"/>
-          <w:bCs w:val="false"/>
-          <w:sz w:val="24"/>
-          <w:szCs w:val="24"/>
-        </w:rPr>
-        <w:t xml:space="preserve">. As a result, smartphones have penetrated the global market like no other device. This owes to the truth that The United Nations (2021) argues that the current market for laptops is estimated at $102 billion and while that of smartphones is estimated at $522 billion. In a different, paper Liu and Ellis (2021) argue that an estimated 6.4 billion people in the entire globe own a smartphone. </w:t>
-      </w:r>
-      <w:r>
-        <w:rPr>
-          <w:b w:val="false"/>
-          <w:bCs w:val="false"/>
-          <w:sz w:val="24"/>
-          <w:szCs w:val="24"/>
-        </w:rPr>
-        <w:t xml:space="preserve">Moreover, </w:t>
-      </w:r>
-      <w:r>
-        <w:rPr>
-          <w:b w:val="false"/>
-          <w:bCs w:val="false"/>
-          <w:sz w:val="24"/>
-          <w:szCs w:val="24"/>
-        </w:rPr>
-        <w:t xml:space="preserve">The United Nations (2021)  argues that the number of smartphone usage in Sub Saharan Africa rose by 28 percentage points between 2014 and 2018. </w:t>
-      </w:r>
-    </w:p>
-    <w:p>
-      <w:pPr>
-        <w:pStyle w:val="Normal"/>
-        <w:bidi w:val="0"/>
-        <w:spacing w:lineRule="auto" w:line="480"/>
-        <w:jc w:val="left"/>
-        <w:rPr>
-          <w:b w:val="false"/>
-          <w:b w:val="false"/>
-          <w:bCs w:val="false"/>
-          <w:sz w:val="24"/>
-          <w:szCs w:val="24"/>
-        </w:rPr>
-      </w:pPr>
-      <w:r>
-        <w:rPr>
-          <w:b w:val="false"/>
-          <w:bCs w:val="false"/>
-          <w:sz w:val="24"/>
-          <w:szCs w:val="24"/>
-        </w:rPr>
-        <w:tab/>
-      </w:r>
-      <w:r>
-        <w:rPr>
-          <w:b w:val="false"/>
-          <w:bCs w:val="false"/>
-          <w:sz w:val="24"/>
-          <w:szCs w:val="24"/>
-        </w:rPr>
-        <w:t xml:space="preserve">It is important to highlight that topical smartphones have cameras that are used by their consumers for photography. This owes to the fact that a smartphone is more affordable and portable than a camera. It follows that smartphone users have the ability of taking pictures without a camera.    </w:t>
-      </w:r>
-      <w:r>
-        <w:rPr>
-          <w:b w:val="false"/>
-          <w:bCs w:val="false"/>
-          <w:sz w:val="24"/>
-          <w:szCs w:val="24"/>
-        </w:rPr>
-        <w:t xml:space="preserve">As evidenced, </w:t>
+        <w:t xml:space="preserve">It is because these features have smartphones applicable cases such as learning, interpersonal communication, entertainment,  and even business transactions. It is notable that unlike desktop computers and  laptops, smartphones are portable, which makes them convenient to use. As a result, smartphones have penetrated the global market like no other device. This owes to the truth that The United Nations (2021) argues that the current market for laptops is estimated at $102 billion and while that of smartphones is estimated at $522 billion. In a different, paper Liu and Ellis (2021) argue that an estimated 6.4 billion people in the entire globe own a smartphone. Moreover, The United Nations (2021)  argues that the number of smartphone usage in Sub Saharan Africa rose by 28 percentage points between 2014 and 2018. </w:t>
+      </w:r>
+    </w:p>
+    <w:p>
+      <w:pPr>
+        <w:pStyle w:val="Normal"/>
+        <w:bidi w:val="0"/>
+        <w:spacing w:lineRule="auto" w:line="480"/>
+        <w:jc w:val="left"/>
+        <w:rPr/>
+      </w:pPr>
+      <w:r>
+        <w:rPr>
+          <w:b w:val="false"/>
+          <w:bCs w:val="false"/>
+          <w:sz w:val="24"/>
+          <w:szCs w:val="24"/>
+        </w:rPr>
+        <w:tab/>
+        <w:t xml:space="preserve">It is important to highlight that topical smartphones have cameras that are used by their consumers for photography. This owes to the fact that a smartphone is more affordable and portable than a camera. It follows that smartphone users have the ability of taking pictures without a camera.    As evidenced, </w:t>
       </w:r>
       <w:r>
         <w:rPr>
@@ -2590,8 +2459,17 @@
           <w:sz w:val="24"/>
           <w:szCs w:val="24"/>
         </w:rPr>
-        <w:t xml:space="preserve">Saraswathi </w:t>
-      </w:r>
+        <w:t>Saraswathi (2017) conducted a study on smartphone usage among students and established that students like taking pictures using smartphones. Moreover, a study conducted  by Mother et al., (2013) reveals that the study population used smartphones mostly to send and receive</w:t>
+      </w:r>
+    </w:p>
+    <w:p>
+      <w:pPr>
+        <w:pStyle w:val="Normal"/>
+        <w:bidi w:val="0"/>
+        <w:spacing w:lineRule="auto" w:line="480"/>
+        <w:jc w:val="left"/>
+        <w:rPr/>
+      </w:pPr>
       <w:r>
         <w:rPr>
           <w:rStyle w:val="Quotation"/>
@@ -2602,8 +2480,17 @@
           <w:sz w:val="24"/>
           <w:szCs w:val="24"/>
         </w:rPr>
-        <w:t xml:space="preserve">(2017) conducted a study on smartphone usage among students and established that students like taking pictures using smartphones. </w:t>
-      </w:r>
+        <w:t>text messages (97.9%), take pictures (97.1%), play music (96.1%), setting the alarm (95.8%), referring to the calendar (94.5%), recording videos (92.5%), play games (91.9%), and exchanging pictures via Bluetooth(91.7%). This indicates that there is an upsurge in the number of people who are relying on Smartphones to take pictures.</w:t>
+      </w:r>
+    </w:p>
+    <w:p>
+      <w:pPr>
+        <w:pStyle w:val="Normal"/>
+        <w:bidi w:val="0"/>
+        <w:spacing w:lineRule="auto" w:line="480"/>
+        <w:jc w:val="left"/>
+        <w:rPr/>
+      </w:pPr>
       <w:r>
         <w:rPr>
           <w:rStyle w:val="Quotation"/>
@@ -2614,339 +2501,36 @@
           <w:sz w:val="24"/>
           <w:szCs w:val="24"/>
         </w:rPr>
-        <w:t xml:space="preserve">Moreover, </w:t>
-      </w:r>
-      <w:r>
-        <w:rPr>
-          <w:rStyle w:val="Quotation"/>
-          <w:b w:val="false"/>
-          <w:bCs w:val="false"/>
-          <w:i w:val="false"/>
-          <w:iCs w:val="false"/>
-          <w:sz w:val="24"/>
-          <w:szCs w:val="24"/>
-        </w:rPr>
-        <w:t xml:space="preserve">a study conducted  by Mother et al., (2013) reveals that </w:t>
-      </w:r>
-      <w:r>
-        <w:rPr>
-          <w:rStyle w:val="Quotation"/>
-          <w:b w:val="false"/>
-          <w:bCs w:val="false"/>
-          <w:i w:val="false"/>
-          <w:iCs w:val="false"/>
-          <w:sz w:val="24"/>
-          <w:szCs w:val="24"/>
-        </w:rPr>
-        <w:t xml:space="preserve">the </w:t>
-      </w:r>
-      <w:r>
-        <w:rPr>
-          <w:rStyle w:val="Quotation"/>
-          <w:b w:val="false"/>
-          <w:bCs w:val="false"/>
-          <w:i w:val="false"/>
-          <w:iCs w:val="false"/>
-          <w:sz w:val="24"/>
-          <w:szCs w:val="24"/>
-        </w:rPr>
-        <w:t xml:space="preserve">study population </w:t>
-      </w:r>
-      <w:r>
-        <w:rPr>
-          <w:rStyle w:val="Quotation"/>
-          <w:b w:val="false"/>
-          <w:bCs w:val="false"/>
-          <w:i w:val="false"/>
-          <w:iCs w:val="false"/>
-          <w:sz w:val="24"/>
-          <w:szCs w:val="24"/>
-        </w:rPr>
-        <w:t xml:space="preserve">used smartphones </w:t>
-      </w:r>
-      <w:r>
-        <w:rPr>
-          <w:rStyle w:val="Quotation"/>
-          <w:b w:val="false"/>
-          <w:bCs w:val="false"/>
-          <w:i w:val="false"/>
-          <w:iCs w:val="false"/>
-          <w:sz w:val="24"/>
-          <w:szCs w:val="24"/>
-        </w:rPr>
-        <w:t>mostly to send and receive</w:t>
-      </w:r>
-    </w:p>
-    <w:p>
-      <w:pPr>
-        <w:pStyle w:val="Normal"/>
-        <w:bidi w:val="0"/>
-        <w:spacing w:lineRule="auto" w:line="480"/>
-        <w:jc w:val="left"/>
-        <w:rPr>
-          <w:b w:val="false"/>
-          <w:b w:val="false"/>
-          <w:bCs w:val="false"/>
-          <w:sz w:val="24"/>
-          <w:szCs w:val="24"/>
-        </w:rPr>
-      </w:pPr>
-      <w:r>
-        <w:rPr>
-          <w:rStyle w:val="Quotation"/>
-          <w:b w:val="false"/>
-          <w:bCs w:val="false"/>
-          <w:i w:val="false"/>
-          <w:iCs w:val="false"/>
-          <w:sz w:val="24"/>
-          <w:szCs w:val="24"/>
-        </w:rPr>
-        <w:t xml:space="preserve">text messages (97.9%), take pictures (97.1%), play music (96.1%), setting the alarm (95.8%), referring to the calendar (94.5%), recording videos (92.5%), play games (91.9%), and exchanging pictures via Bluetooth(91.7%). </w:t>
-      </w:r>
-      <w:r>
-        <w:rPr>
-          <w:rStyle w:val="Quotation"/>
-          <w:b w:val="false"/>
-          <w:bCs w:val="false"/>
-          <w:i w:val="false"/>
-          <w:iCs w:val="false"/>
-          <w:sz w:val="24"/>
-          <w:szCs w:val="24"/>
-        </w:rPr>
-        <w:t>This</w:t>
-      </w:r>
-      <w:r>
-        <w:rPr>
-          <w:rStyle w:val="Quotation"/>
-          <w:b w:val="false"/>
-          <w:bCs w:val="false"/>
-          <w:i w:val="false"/>
-          <w:iCs w:val="false"/>
-          <w:sz w:val="24"/>
-          <w:szCs w:val="24"/>
-        </w:rPr>
-        <w:t xml:space="preserve"> indicates that </w:t>
-      </w:r>
-      <w:r>
-        <w:rPr>
-          <w:rStyle w:val="Quotation"/>
-          <w:b w:val="false"/>
-          <w:bCs w:val="false"/>
-          <w:i w:val="false"/>
-          <w:iCs w:val="false"/>
-          <w:sz w:val="24"/>
-          <w:szCs w:val="24"/>
-        </w:rPr>
-        <w:t>there is an upsurge in the number of people who are relying on Smartphones to take pictures.</w:t>
-      </w:r>
-    </w:p>
-    <w:p>
-      <w:pPr>
-        <w:pStyle w:val="Normal"/>
-        <w:bidi w:val="0"/>
-        <w:spacing w:lineRule="auto" w:line="480"/>
-        <w:jc w:val="left"/>
-        <w:rPr>
-          <w:b w:val="false"/>
-          <w:b w:val="false"/>
-          <w:bCs w:val="false"/>
-          <w:sz w:val="24"/>
-          <w:szCs w:val="24"/>
-        </w:rPr>
-      </w:pPr>
-      <w:r>
-        <w:rPr>
-          <w:rStyle w:val="Quotation"/>
-          <w:b w:val="false"/>
-          <w:bCs w:val="false"/>
-          <w:i w:val="false"/>
-          <w:iCs w:val="false"/>
-          <w:sz w:val="24"/>
-          <w:szCs w:val="24"/>
-        </w:rPr>
-        <w:tab/>
-        <w:t xml:space="preserve">Earlier studies already established that people rely smartphones for taking pictures but that is not all. This owes to the truth that recent studies also affirm the reality that human beings rely on smartphones for taking pictures. As an evidence of this, Dermawi and Tolle (2019) reveal that most downloaded applications from Google Play Store as of August 2018 were in the photography category. </w:t>
-      </w:r>
-      <w:r>
-        <w:rPr>
-          <w:rStyle w:val="Quotation"/>
-          <w:b w:val="false"/>
-          <w:bCs w:val="false"/>
-          <w:i w:val="false"/>
-          <w:iCs w:val="false"/>
-          <w:sz w:val="24"/>
-          <w:szCs w:val="24"/>
-        </w:rPr>
-        <w:t>Imperative to the debate is the truth</w:t>
-      </w:r>
-      <w:r>
-        <w:rPr>
-          <w:rStyle w:val="Quotation"/>
-          <w:b w:val="false"/>
-          <w:bCs w:val="false"/>
-          <w:i w:val="false"/>
-          <w:iCs w:val="false"/>
-          <w:sz w:val="24"/>
-          <w:szCs w:val="24"/>
-        </w:rPr>
-        <w:t xml:space="preserve"> that the amount of data that is generated from smartphone pictures and videos is quickly increasing.  </w:t>
-      </w:r>
-      <w:r>
-        <w:rPr>
-          <w:rStyle w:val="Quotation"/>
-          <w:b w:val="false"/>
-          <w:bCs w:val="false"/>
-          <w:i w:val="false"/>
-          <w:iCs w:val="false"/>
-          <w:sz w:val="24"/>
-          <w:szCs w:val="24"/>
-        </w:rPr>
-        <w:t>This is supported by</w:t>
-      </w:r>
-      <w:r>
-        <w:rPr>
-          <w:rStyle w:val="Quotation"/>
-          <w:b w:val="false"/>
-          <w:bCs w:val="false"/>
-          <w:i w:val="false"/>
-          <w:iCs w:val="false"/>
-          <w:sz w:val="24"/>
-          <w:szCs w:val="24"/>
-        </w:rPr>
-        <w:t xml:space="preserve"> </w:t>
-      </w:r>
-      <w:r>
-        <w:rPr>
-          <w:b w:val="false"/>
-          <w:bCs w:val="false"/>
-          <w:sz w:val="24"/>
-          <w:szCs w:val="24"/>
-        </w:rPr>
-        <w:t xml:space="preserve">Blahnik and Schindelbeck (2021) </w:t>
-      </w:r>
-      <w:r>
-        <w:rPr>
-          <w:b w:val="false"/>
-          <w:bCs w:val="false"/>
-          <w:sz w:val="24"/>
-          <w:szCs w:val="24"/>
-        </w:rPr>
-        <w:t xml:space="preserve">who </w:t>
-      </w:r>
-      <w:r>
-        <w:rPr>
-          <w:b w:val="false"/>
-          <w:bCs w:val="false"/>
-          <w:sz w:val="24"/>
-          <w:szCs w:val="24"/>
-        </w:rPr>
-        <w:t xml:space="preserve">argue that some 2 trillion pictures will likely be taken every year, which is twice as much compared with five years ago and an upwards of 90% of them are taken using a smartphones. </w:t>
-      </w:r>
-    </w:p>
-    <w:p>
-      <w:pPr>
-        <w:pStyle w:val="Normal"/>
-        <w:bidi w:val="0"/>
-        <w:spacing w:lineRule="auto" w:line="480"/>
-        <w:jc w:val="left"/>
-        <w:rPr>
-          <w:b w:val="false"/>
-          <w:b w:val="false"/>
-          <w:bCs w:val="false"/>
-          <w:sz w:val="24"/>
-          <w:szCs w:val="24"/>
-        </w:rPr>
-      </w:pPr>
-      <w:r>
-        <w:rPr>
-          <w:b w:val="false"/>
-          <w:bCs w:val="false"/>
-          <w:sz w:val="24"/>
-          <w:szCs w:val="24"/>
-        </w:rPr>
-        <w:tab/>
-        <w:t xml:space="preserve">As already mentioned, the estimated number of Smartphone owners as of 2021 is 6.4 billion and the estimated number of pictures that was taken by smartphones is 2 trillion. Dividing these two figures results in an estimated 312.5 pictures per smartphone. This number is relatively high. </w:t>
-      </w:r>
-      <w:r>
-        <w:rPr>
-          <w:b w:val="false"/>
-          <w:bCs w:val="false"/>
-          <w:sz w:val="24"/>
-          <w:szCs w:val="24"/>
-        </w:rPr>
-        <w:t xml:space="preserve">It follows that managing and perusing through images and videos stored in a smartphone could be a daunting task. </w:t>
-      </w:r>
-      <w:r>
-        <w:rPr>
-          <w:b w:val="false"/>
-          <w:bCs w:val="false"/>
-          <w:sz w:val="24"/>
-          <w:szCs w:val="24"/>
-        </w:rPr>
-        <w:t>C</w:t>
-      </w:r>
-      <w:r>
-        <w:rPr>
-          <w:b w:val="false"/>
-          <w:bCs w:val="false"/>
-          <w:sz w:val="24"/>
-          <w:szCs w:val="24"/>
-        </w:rPr>
-        <w:t xml:space="preserve">onsider a smartphone user with an estimated 5 gigabytes of images and videos, such a person will find it frustrating to scroll through the images and videos looking for pictures and videos belonging to a particular person. Moreover, smartphone users tend to have images and videos of their close family members stored. </w:t>
-      </w:r>
-      <w:r>
-        <w:rPr>
-          <w:b w:val="false"/>
-          <w:bCs w:val="false"/>
-          <w:sz w:val="24"/>
-          <w:szCs w:val="24"/>
-        </w:rPr>
-        <w:t>Considering that</w:t>
-      </w:r>
-      <w:r>
-        <w:rPr>
-          <w:b w:val="false"/>
-          <w:bCs w:val="false"/>
-          <w:sz w:val="24"/>
-          <w:szCs w:val="24"/>
-        </w:rPr>
-        <w:t xml:space="preserve"> close family members tend to have resembling faces, </w:t>
-      </w:r>
-      <w:r>
-        <w:rPr>
-          <w:b w:val="false"/>
-          <w:bCs w:val="false"/>
-          <w:sz w:val="24"/>
-          <w:szCs w:val="24"/>
-        </w:rPr>
-        <w:t>it could be difficult to scroll through all pictures of a smartphone looking for a picture of a particular person using a naked eye.</w:t>
-      </w:r>
-      <w:r>
-        <w:rPr>
-          <w:b w:val="false"/>
-          <w:bCs w:val="false"/>
-          <w:sz w:val="24"/>
-          <w:szCs w:val="24"/>
-        </w:rPr>
-        <w:t xml:space="preserve"> </w:t>
-      </w:r>
-      <w:r>
-        <w:rPr>
-          <w:b w:val="false"/>
-          <w:bCs w:val="false"/>
-          <w:sz w:val="24"/>
-          <w:szCs w:val="24"/>
-        </w:rPr>
-        <w:t>In short</w:t>
-      </w:r>
-      <w:r>
-        <w:rPr>
-          <w:b w:val="false"/>
-          <w:bCs w:val="false"/>
-          <w:sz w:val="24"/>
-          <w:szCs w:val="24"/>
-        </w:rPr>
-        <w:t>, researchers should develop tools that can help smartphone users peruse through images and videos efficiently.</w:t>
+        <w:tab/>
+        <w:t xml:space="preserve">Earlier studies already established that people rely smartphones for taking pictures but that is not all. This owes to the truth that recent studies also affirm the reality that human beings rely on smartphones for taking pictures. As an evidence of this, Dermawi and Tolle (2019) reveal that most downloaded applications from Google Play Store as of August 2018 were in the photography category. Imperative to the debate is the truth that the amount of data that is generated from smartphone pictures and videos is quickly increasing.  This is supported by </w:t>
+      </w:r>
+      <w:r>
+        <w:rPr>
+          <w:b w:val="false"/>
+          <w:bCs w:val="false"/>
+          <w:sz w:val="24"/>
+          <w:szCs w:val="24"/>
+        </w:rPr>
+        <w:t xml:space="preserve">Blahnik and Schindelbeck (2021) who argue that some 2 trillion pictures will likely be taken every year, which is twice as much compared with five years ago and an upwards of 90% of them are taken using a smartphones. </w:t>
+      </w:r>
+    </w:p>
+    <w:p>
+      <w:pPr>
+        <w:pStyle w:val="Normal"/>
+        <w:bidi w:val="0"/>
+        <w:spacing w:lineRule="auto" w:line="480"/>
+        <w:jc w:val="left"/>
+        <w:rPr/>
+      </w:pPr>
+      <w:r>
+        <w:rPr>
+          <w:b w:val="false"/>
+          <w:bCs w:val="false"/>
+          <w:sz w:val="24"/>
+          <w:szCs w:val="24"/>
+        </w:rPr>
+        <w:tab/>
+        <w:t>As already mentioned, the estimated number of Smartphone owners as of 2021 is 6.4 billion and the estimated number of pictures that was taken by smartphones is 2 trillion. Dividing these two figures results in an estimated 312.5 pictures per smartphone. This number is relatively high. It follows that managing and perusing through images and videos stored in a smartphone could be a daunting task. Consider a smartphone user with an estimated 5 gigabytes of images and videos, such a person will find it frustrating to scroll through the images and videos looking for pictures and videos belonging to a particular person. Moreover, smartphone users tend to have images and videos of their close family members stored. Considering that close family members tend to have resembling faces, it could be difficult to scroll through all pictures of a smartphone looking for a picture of a particular person using a naked eye. In short, researchers should develop tools that can help smartphone users peruse through images and videos efficiently.</w:t>
       </w:r>
     </w:p>
     <w:p>
@@ -3053,7 +2637,7 @@
         <w:pStyle w:val="Normal"/>
         <w:numPr>
           <w:ilvl w:val="0"/>
-          <w:numId w:val="1"/>
+          <w:numId w:val="2"/>
         </w:numPr>
         <w:bidi w:val="0"/>
         <w:spacing w:lineRule="auto" w:line="480"/>
@@ -3081,7 +2665,7 @@
         <w:pStyle w:val="Normal"/>
         <w:numPr>
           <w:ilvl w:val="0"/>
-          <w:numId w:val="1"/>
+          <w:numId w:val="2"/>
         </w:numPr>
         <w:bidi w:val="0"/>
         <w:spacing w:lineRule="auto" w:line="480"/>
@@ -3109,7 +2693,7 @@
         <w:pStyle w:val="Normal"/>
         <w:numPr>
           <w:ilvl w:val="0"/>
-          <w:numId w:val="1"/>
+          <w:numId w:val="2"/>
         </w:numPr>
         <w:bidi w:val="0"/>
         <w:spacing w:lineRule="auto" w:line="480"/>
@@ -3137,7 +2721,7 @@
         <w:pStyle w:val="Normal"/>
         <w:numPr>
           <w:ilvl w:val="0"/>
-          <w:numId w:val="1"/>
+          <w:numId w:val="2"/>
         </w:numPr>
         <w:bidi w:val="0"/>
         <w:spacing w:lineRule="auto" w:line="480"/>
@@ -3327,7 +2911,13 @@
         <w:bidi w:val="0"/>
         <w:spacing w:lineRule="auto" w:line="480"/>
         <w:jc w:val="left"/>
-        <w:rPr/>
+        <w:rPr>
+          <w:b w:val="false"/>
+          <w:b w:val="false"/>
+          <w:bCs w:val="false"/>
+          <w:sz w:val="24"/>
+          <w:szCs w:val="24"/>
+        </w:rPr>
       </w:pPr>
       <w:r>
         <w:rPr>
@@ -3386,7 +2976,7 @@
           <w:szCs w:val="24"/>
         </w:rPr>
         <w:tab/>
-        <w:t>Facial recognition is a biometric technique used to identify faces and match those faces to a database of faces with an aim of identifying a human being from an image. From the definition, it is clear that face recognition is a two-step process with the first step being face detection and the second step being face identification. The first step of facial recognition (or the face detection step) is identifying and extracting human faces from an image. In this step, all objects in an image are extracted and checked to confirm if a picture contains a human face. If any human face is present in the image, the face is extracted from the image before step two begins. In the second step or the image identification step, an image is compared to faces stored in a database to identify if the face matches the face of a known person. At this point, it is clear that there is a difference between facial detection and facial recognition and that facial recognition begins with facial detection and finalizes with facial identification.</w:t>
+        <w:t>Facial recognition is a biometric technique used to identify faces and match those faces to a database of faces with an aim of identifying a human being from an image. From the definition, it is clear that face recognition is a two-step process with the first step being face detection and the second step being face identification. The first step of facial recognition (or the face detection step) is identifying and extracting human faces from an image. In this step, all objects in an image are extracted and checked to confirm if a picture contains a human face. If any human face is present in the image, the face is extracted from the image before step two begins. In the second step or the image identification step, an image is compared to faces stored in a database to identify if the face matches the face of a known person. In short, there is a difference between facial detection and facial recognition and that facial recognition begins with facial detection and finalizes with facial identification.</w:t>
       </w:r>
     </w:p>
     <w:p>
@@ -3589,7 +3179,7 @@
           <w:sz w:val="24"/>
           <w:szCs w:val="24"/>
         </w:rPr>
-        <w:t xml:space="preserve">Human beings often have features that could affect image detection. For instance, men are known to have beards, which may or may not exist in images. It also important to highlight that people at times wear spectacles, which also affects face detection. Moreover, Covid 19 forced people to wear masks, which presents a unique challenge in facial recognition. </w:t>
+        <w:t xml:space="preserve">Human beings often have features that could affect image detection. For instance, men are known to have beards, which may or may not exist in images. It also important to highlight that people at times wear spectacles, which also affects face detection. Moreover, COVID 19 forced people to wear masks, which presents a unique challenge in facial recognition. </w:t>
       </w:r>
     </w:p>
     <w:p>
@@ -3713,45 +3303,43 @@
           <w:szCs w:val="24"/>
         </w:rPr>
         <w:tab/>
-        <w:t>A thorough review of literature on the subject of facial recognition reveals that there is an array of techniques that could be used for facial recognition. As evidenced, Fu (2021) mention the geometric features approach, the template matching approach, and the model based facial approach as some of the existing solutions on facial recognition. In a different study, Priya et al., (2014)  mention the template matching technique, the statistical approach and the neural networks approach as some of the techniques that could be used for facial recognition. In a different paper, Bose and Bandyopadhyay (2020) mentions four methods use for facial recognition. These methods include feature-based methods, template-based methods, appearance-based methods, and knowledge-based methods. Even though Bose and Bandyopadhyay (2020)mention four methods that could be used for facial recognition, they used the template based method in their research citing that template matching is the best available solution on face detection.</w:t>
-      </w:r>
-    </w:p>
-    <w:p>
-      <w:pPr>
-        <w:pStyle w:val="Normal"/>
-        <w:bidi w:val="0"/>
-        <w:spacing w:lineRule="auto" w:line="480"/>
-        <w:jc w:val="left"/>
-        <w:rPr/>
-      </w:pPr>
-      <w:r>
-        <w:rPr>
-          <w:b w:val="false"/>
-          <w:bCs w:val="false"/>
-          <w:sz w:val="24"/>
-          <w:szCs w:val="24"/>
-        </w:rPr>
-        <w:tab/>
-        <w:t xml:space="preserve">Critical to the debate is the truth that the researcher will only discuss the geometric approach, the template matching approach, and the model based approach because the latter methods have enough publications that warrant a debate on the subject. For instance, Brunelli and Poggio (2013) discuss facial recognition based on geometric features. </w:t>
-      </w:r>
-      <w:r>
-        <w:rPr>
-          <w:b w:val="false"/>
-          <w:bCs w:val="false"/>
-          <w:sz w:val="24"/>
-          <w:szCs w:val="24"/>
-          <w:shd w:fill="auto" w:val="clear"/>
-        </w:rPr>
-        <w:t>Lu and Yan (2021)</w:t>
-      </w:r>
-      <w:r>
-        <w:rPr>
-          <w:b w:val="false"/>
-          <w:bCs w:val="false"/>
-          <w:sz w:val="24"/>
-          <w:szCs w:val="24"/>
-        </w:rPr>
-        <w:t xml:space="preserve"> also discuss facial recognition based on template matching, while Ge et al., (2021) discuss model based facial recognition using an improved generative confrontational network. </w:t>
+        <w:t>A thorough review of literature on the subject of facial recognition reveals that there is an array of techniques that could be used for facial recognition. As evidenced, Fu (2021) mention the geometric features approach, the template matching approach, and the model based facial approach as some of the existing solutions on facial recognition. In a different study, Priya et al., (2014)  mention the template matching technique, the statistical approach and the neural networks approach as some of the techniques that could be used for facial recognition. In a different paper, Bose and Bandyopadhyay (2020) mentions four methods use</w:t>
+      </w:r>
+      <w:r>
+        <w:rPr>
+          <w:b w:val="false"/>
+          <w:bCs w:val="false"/>
+          <w:sz w:val="24"/>
+          <w:szCs w:val="24"/>
+        </w:rPr>
+        <w:t>d</w:t>
+      </w:r>
+      <w:r>
+        <w:rPr>
+          <w:b w:val="false"/>
+          <w:bCs w:val="false"/>
+          <w:sz w:val="24"/>
+          <w:szCs w:val="24"/>
+        </w:rPr>
+        <w:t xml:space="preserve"> for facial recognition. These methods include feature-based methods, template-based methods, appearance-based methods, and knowledge-based methods. Even though Bose and Bandyopadhyay (2020) mention four methods that could be used for facial recognition, they used the template based method in their research citing that template matching is the best available solution </w:t>
+      </w:r>
+      <w:r>
+        <w:rPr>
+          <w:b w:val="false"/>
+          <w:bCs w:val="false"/>
+          <w:sz w:val="24"/>
+          <w:szCs w:val="24"/>
+        </w:rPr>
+        <w:t>for</w:t>
+      </w:r>
+      <w:r>
+        <w:rPr>
+          <w:b w:val="false"/>
+          <w:bCs w:val="false"/>
+          <w:sz w:val="24"/>
+          <w:szCs w:val="24"/>
+        </w:rPr>
+        <w:t xml:space="preserve"> face detection.</w:t>
       </w:r>
     </w:p>
     <w:p>
@@ -3814,7 +3402,7 @@
           <w:sz w:val="24"/>
           <w:szCs w:val="24"/>
         </w:rPr>
-        <w:t>). Simply put, the geometric approach transforms an image into geometric primitives like curves and points. This is done by identifying distinctive features like the eye, the nose, the chin, and the mouth before measuring their relative positions, widths and other parameters of the distinctive features. H</w:t>
+        <w:t>). Simply put, the geometric approach transforms an image into geometric primitives like curves and points. This is done by identifying distinctive features like the eye, the nose, the chin, and the mouth before measuring their relative positions, widths and other parameters of the distinctive features. It is vital to note that H</w:t>
       </w:r>
       <w:r>
         <w:rPr>
@@ -3834,7 +3422,7 @@
           <w:sz w:val="24"/>
           <w:szCs w:val="24"/>
         </w:rPr>
-        <w:t xml:space="preserve">). </w:t>
+        <w:t xml:space="preserve">) </w:t>
       </w:r>
       <w:r>
         <w:rPr>
@@ -3845,16 +3433,69 @@
           <w:sz w:val="24"/>
           <w:szCs w:val="24"/>
         </w:rPr>
-        <w:t>further assert that the geometric approach of facial recognition is known to have a lighter computational load than other methods because it does not require features from the entire face. Brunelli and Poggio (2013) emphasize that the geometric method of facial recognition has a lighter computational load by arguing that the method in question can recognize faces even when the details of individual features such as the nose, eyes, and mouth are no longer resolved.</w:t>
-      </w:r>
-    </w:p>
-    <w:p>
-      <w:pPr>
-        <w:pStyle w:val="Normal"/>
-        <w:bidi w:val="0"/>
-        <w:spacing w:lineRule="auto" w:line="480"/>
-        <w:jc w:val="left"/>
-        <w:rPr/>
+        <w:t xml:space="preserve">assert that the geometric approach of facial recognition is known to have a lighter computational load than other methods because it does not require features from the entire face. </w:t>
+      </w:r>
+      <w:r>
+        <w:rPr>
+          <w:b w:val="false"/>
+          <w:bCs w:val="false"/>
+          <w:i w:val="false"/>
+          <w:iCs w:val="false"/>
+          <w:sz w:val="24"/>
+          <w:szCs w:val="24"/>
+        </w:rPr>
+        <w:t>Similarly</w:t>
+      </w:r>
+      <w:r>
+        <w:rPr>
+          <w:b w:val="false"/>
+          <w:bCs w:val="false"/>
+          <w:i w:val="false"/>
+          <w:iCs w:val="false"/>
+          <w:sz w:val="24"/>
+          <w:szCs w:val="24"/>
+        </w:rPr>
+        <w:t>, Brunelli and Poggio (2013) emphasize that the geometric method of facial recognition has a lighter computational load by arguing that the method in question can recognize faces even wh</w:t>
+      </w:r>
+      <w:r>
+        <w:rPr>
+          <w:b w:val="false"/>
+          <w:bCs w:val="false"/>
+          <w:i w:val="false"/>
+          <w:iCs w:val="false"/>
+          <w:sz w:val="24"/>
+          <w:szCs w:val="24"/>
+        </w:rPr>
+        <w:t>n</w:t>
+      </w:r>
+      <w:r>
+        <w:rPr>
+          <w:b w:val="false"/>
+          <w:bCs w:val="false"/>
+          <w:i w:val="false"/>
+          <w:iCs w:val="false"/>
+          <w:sz w:val="24"/>
+          <w:szCs w:val="24"/>
+        </w:rPr>
+        <w:t>en the details of individual features such as the nose, eyes, and mouth are no longer resolved.</w:t>
+      </w:r>
+    </w:p>
+    <w:p>
+      <w:pPr>
+        <w:pStyle w:val="Normal"/>
+        <w:bidi w:val="0"/>
+        <w:spacing w:lineRule="auto" w:line="480"/>
+        <w:jc w:val="left"/>
+        <w:rPr>
+          <w:b w:val="false"/>
+          <w:b w:val="false"/>
+          <w:bCs w:val="false"/>
+          <w:i w:val="false"/>
+          <w:i w:val="false"/>
+          <w:iCs w:val="false"/>
+          <w:sz w:val="24"/>
+          <w:szCs w:val="24"/>
+        </w:rPr>
       </w:pPr>
       <w:r>
         <w:rPr>
@@ -4051,13 +3692,7 @@
         <w:bidi w:val="0"/>
         <w:spacing w:lineRule="auto" w:line="480"/>
         <w:jc w:val="left"/>
-        <w:rPr>
-          <w:b w:val="false"/>
-          <w:b w:val="false"/>
-          <w:bCs w:val="false"/>
-          <w:sz w:val="24"/>
-          <w:szCs w:val="24"/>
-        </w:rPr>
+        <w:rPr/>
       </w:pPr>
       <w:r>
         <w:rPr>
@@ -4100,13 +3735,7 @@
         <w:bidi w:val="0"/>
         <w:spacing w:lineRule="auto" w:line="480"/>
         <w:jc w:val="left"/>
-        <w:rPr>
-          <w:b w:val="false"/>
-          <w:b w:val="false"/>
-          <w:bCs w:val="false"/>
-          <w:sz w:val="24"/>
-          <w:szCs w:val="24"/>
-        </w:rPr>
+        <w:rPr/>
       </w:pPr>
       <w:r>
         <w:rPr>
@@ -4205,7 +3834,32 @@
           <w:sz w:val="24"/>
           <w:szCs w:val="24"/>
         </w:rPr>
-        <w:t xml:space="preserve">Brunelli, R., and Poggio, T. (2013). Face Recognition through Geometrical Features. </w:t>
+        <w:t xml:space="preserve">Brunelli, R., and Poggio, T. (2013). Face Recognition through Geometrical Features. Retrieved </w:t>
+      </w:r>
+    </w:p>
+    <w:p>
+      <w:pPr>
+        <w:pStyle w:val="Normal"/>
+        <w:bidi w:val="0"/>
+        <w:spacing w:lineRule="auto" w:line="480"/>
+        <w:jc w:val="left"/>
+        <w:rPr>
+          <w:b w:val="false"/>
+          <w:b w:val="false"/>
+          <w:bCs w:val="false"/>
+          <w:sz w:val="24"/>
+          <w:szCs w:val="24"/>
+        </w:rPr>
+      </w:pPr>
+      <w:r>
+        <w:rPr>
+          <w:b w:val="false"/>
+          <w:bCs w:val="false"/>
+          <w:sz w:val="24"/>
+          <w:szCs w:val="24"/>
+        </w:rPr>
+        <w:tab/>
+        <w:t xml:space="preserve">from: </w:t>
       </w:r>
     </w:p>
     <w:p>
@@ -4960,13 +4614,7 @@
         <w:bidi w:val="0"/>
         <w:spacing w:lineRule="auto" w:line="480"/>
         <w:jc w:val="left"/>
-        <w:rPr>
-          <w:b w:val="false"/>
-          <w:b w:val="false"/>
-          <w:bCs w:val="false"/>
-          <w:sz w:val="24"/>
-          <w:szCs w:val="24"/>
-        </w:rPr>
+        <w:rPr/>
       </w:pPr>
       <w:r>
         <w:rPr>
@@ -5154,34 +4802,22 @@
         <w:bidi w:val="0"/>
         <w:spacing w:lineRule="auto" w:line="480"/>
         <w:jc w:val="left"/>
-        <w:rPr/>
-      </w:pPr>
-      <w:r>
-        <w:rPr>
-          <w:b w:val="false"/>
-          <w:bCs w:val="false"/>
-          <w:sz w:val="24"/>
-          <w:szCs w:val="24"/>
-        </w:rPr>
-        <w:t xml:space="preserve">Mothar, M. N., Hassan, A. M., Hassan, H. S., and Osman, N. M. </w:t>
-      </w:r>
-      <w:r>
-        <w:rPr>
-          <w:b w:val="false"/>
-          <w:bCs w:val="false"/>
-          <w:sz w:val="24"/>
-          <w:szCs w:val="24"/>
-        </w:rPr>
-        <w:t xml:space="preserve">(2013). </w:t>
-      </w:r>
-      <w:r>
-        <w:rPr>
-          <w:b w:val="false"/>
-          <w:bCs w:val="false"/>
-          <w:sz w:val="24"/>
-          <w:szCs w:val="24"/>
-        </w:rPr>
-        <w:t xml:space="preserve">The Importance of </w:t>
+        <w:rPr>
+          <w:b w:val="false"/>
+          <w:b w:val="false"/>
+          <w:bCs w:val="false"/>
+          <w:sz w:val="24"/>
+          <w:szCs w:val="24"/>
+        </w:rPr>
+      </w:pPr>
+      <w:r>
+        <w:rPr>
+          <w:b w:val="false"/>
+          <w:bCs w:val="false"/>
+          <w:sz w:val="24"/>
+          <w:szCs w:val="24"/>
+        </w:rPr>
+        <w:t xml:space="preserve">Mothar, M. N., Hassan, A. M., Hassan, H. S., and Osman, N. M. (2013). The Importance of </w:t>
       </w:r>
     </w:p>
     <w:p>
@@ -5525,13 +5161,7 @@
         <w:bidi w:val="0"/>
         <w:spacing w:lineRule="auto" w:line="480"/>
         <w:jc w:val="left"/>
-        <w:rPr>
-          <w:b w:val="false"/>
-          <w:b w:val="false"/>
-          <w:bCs w:val="false"/>
-          <w:sz w:val="24"/>
-          <w:szCs w:val="24"/>
-        </w:rPr>
+        <w:rPr/>
       </w:pPr>
       <w:r>
         <w:rPr>
@@ -5560,13 +5190,7 @@
         <w:bidi w:val="0"/>
         <w:spacing w:lineRule="auto" w:line="480"/>
         <w:jc w:val="left"/>
-        <w:rPr>
-          <w:b w:val="false"/>
-          <w:b w:val="false"/>
-          <w:bCs w:val="false"/>
-          <w:sz w:val="24"/>
-          <w:szCs w:val="24"/>
-        </w:rPr>
+        <w:rPr/>
       </w:pPr>
       <w:r>
         <w:rPr>
@@ -5683,13 +5307,7 @@
         <w:bidi w:val="0"/>
         <w:spacing w:lineRule="auto" w:line="480"/>
         <w:jc w:val="left"/>
-        <w:rPr>
-          <w:b w:val="false"/>
-          <w:b w:val="false"/>
-          <w:bCs w:val="false"/>
-          <w:sz w:val="24"/>
-          <w:szCs w:val="24"/>
-        </w:rPr>
+        <w:rPr/>
       </w:pPr>
       <w:r>
         <w:rPr>
@@ -5723,11 +5341,41 @@
           <w:sz w:val="24"/>
           <w:szCs w:val="24"/>
         </w:rPr>
-        <w:t xml:space="preserve">S. (2017). </w:t>
-      </w:r>
-      <w:r>
-        <w:rPr>
-          <w:rStyle w:val="Quotation"/>
+        <w:t xml:space="preserve">S. (2017). Smartphone Usage Among Students. </w:t>
+      </w:r>
+      <w:r>
+        <w:rPr>
+          <w:rStyle w:val="Emphasis"/>
+          <w:b w:val="false"/>
+          <w:bCs w:val="false"/>
+          <w:sz w:val="24"/>
+          <w:szCs w:val="24"/>
+        </w:rPr>
+        <w:t xml:space="preserve">International Education and Research </w:t>
+      </w:r>
+    </w:p>
+    <w:p>
+      <w:pPr>
+        <w:pStyle w:val="Normal"/>
+        <w:bidi w:val="0"/>
+        <w:spacing w:lineRule="auto" w:line="480"/>
+        <w:jc w:val="left"/>
+        <w:rPr/>
+      </w:pPr>
+      <w:r>
+        <w:rPr>
+          <w:rStyle w:val="Emphasis"/>
+          <w:b w:val="false"/>
+          <w:bCs w:val="false"/>
+          <w:sz w:val="24"/>
+          <w:szCs w:val="24"/>
+        </w:rPr>
+        <w:tab/>
+        <w:t xml:space="preserve">Journal, </w:t>
+      </w:r>
+      <w:r>
+        <w:rPr>
+          <w:rStyle w:val="Emphasis"/>
           <w:b w:val="false"/>
           <w:bCs w:val="false"/>
           <w:i w:val="false"/>
@@ -5735,79 +5383,7 @@
           <w:sz w:val="24"/>
           <w:szCs w:val="24"/>
         </w:rPr>
-        <w:t>Smartphone Usage Among Students</w:t>
-      </w:r>
-      <w:r>
-        <w:rPr>
-          <w:rStyle w:val="Quotation"/>
-          <w:b w:val="false"/>
-          <w:bCs w:val="false"/>
-          <w:i w:val="false"/>
-          <w:iCs w:val="false"/>
-          <w:sz w:val="24"/>
-          <w:szCs w:val="24"/>
-        </w:rPr>
-        <w:t xml:space="preserve">. </w:t>
-      </w:r>
-      <w:r>
-        <w:rPr>
-          <w:rStyle w:val="Emphasis"/>
-          <w:b w:val="false"/>
-          <w:bCs w:val="false"/>
-          <w:sz w:val="24"/>
-          <w:szCs w:val="24"/>
-        </w:rPr>
-        <w:t xml:space="preserve">International Education and Research </w:t>
-      </w:r>
-    </w:p>
-    <w:p>
-      <w:pPr>
-        <w:pStyle w:val="Normal"/>
-        <w:bidi w:val="0"/>
-        <w:spacing w:lineRule="auto" w:line="480"/>
-        <w:jc w:val="left"/>
-        <w:rPr>
-          <w:b w:val="false"/>
-          <w:b w:val="false"/>
-          <w:bCs w:val="false"/>
-          <w:sz w:val="24"/>
-          <w:szCs w:val="24"/>
-        </w:rPr>
-      </w:pPr>
-      <w:r>
-        <w:rPr>
-          <w:rStyle w:val="Emphasis"/>
-          <w:b w:val="false"/>
-          <w:bCs w:val="false"/>
-          <w:sz w:val="24"/>
-          <w:szCs w:val="24"/>
-        </w:rPr>
-        <w:tab/>
-        <w:t xml:space="preserve">Journal, </w:t>
-      </w:r>
-      <w:r>
-        <w:rPr>
-          <w:rStyle w:val="Emphasis"/>
-          <w:b w:val="false"/>
-          <w:bCs w:val="false"/>
-          <w:i w:val="false"/>
-          <w:iCs w:val="false"/>
-          <w:sz w:val="24"/>
-          <w:szCs w:val="24"/>
-        </w:rPr>
-        <w:t>3</w:t>
-      </w:r>
-      <w:r>
-        <w:rPr>
-          <w:rStyle w:val="Emphasis"/>
-          <w:b w:val="false"/>
-          <w:bCs w:val="false"/>
-          <w:i w:val="false"/>
-          <w:iCs w:val="false"/>
-          <w:sz w:val="24"/>
-          <w:szCs w:val="24"/>
-        </w:rPr>
-        <w:t xml:space="preserve">(6), 195-197. Retrieved from </w:t>
+        <w:t xml:space="preserve">3(6), 195-197. Retrieved from </w:t>
         <w:tab/>
         <w:t>https://www.academia.edu/45200359/s</w:t>
       </w:r>
@@ -6056,6 +5632,125 @@
   <w:abstractNum w:abstractNumId="1">
     <w:lvl w:ilvl="0">
       <w:start w:val="1"/>
+      <w:numFmt w:val="none"/>
+      <w:suff w:val="nothing"/>
+      <w:lvlText w:val="%1"/>
+      <w:lvlJc w:val="left"/>
+      <w:pPr>
+        <w:tabs>
+          <w:tab w:val="num" w:pos="0"/>
+        </w:tabs>
+        <w:ind w:left="0" w:hanging="0"/>
+      </w:pPr>
+    </w:lvl>
+    <w:lvl w:ilvl="1">
+      <w:start w:val="1"/>
+      <w:numFmt w:val="none"/>
+      <w:suff w:val="nothing"/>
+      <w:lvlText w:val="%2"/>
+      <w:lvlJc w:val="left"/>
+      <w:pPr>
+        <w:tabs>
+          <w:tab w:val="num" w:pos="0"/>
+        </w:tabs>
+        <w:ind w:left="0" w:hanging="0"/>
+      </w:pPr>
+    </w:lvl>
+    <w:lvl w:ilvl="2">
+      <w:start w:val="1"/>
+      <w:numFmt w:val="none"/>
+      <w:suff w:val="nothing"/>
+      <w:lvlText w:val="%3"/>
+      <w:lvlJc w:val="left"/>
+      <w:pPr>
+        <w:tabs>
+          <w:tab w:val="num" w:pos="0"/>
+        </w:tabs>
+        <w:ind w:left="0" w:hanging="0"/>
+      </w:pPr>
+    </w:lvl>
+    <w:lvl w:ilvl="3">
+      <w:start w:val="1"/>
+      <w:numFmt w:val="none"/>
+      <w:suff w:val="nothing"/>
+      <w:lvlText w:val="%4"/>
+      <w:lvlJc w:val="left"/>
+      <w:pPr>
+        <w:tabs>
+          <w:tab w:val="num" w:pos="0"/>
+        </w:tabs>
+        <w:ind w:left="0" w:hanging="0"/>
+      </w:pPr>
+    </w:lvl>
+    <w:lvl w:ilvl="4">
+      <w:start w:val="1"/>
+      <w:numFmt w:val="none"/>
+      <w:suff w:val="nothing"/>
+      <w:lvlText w:val="%5"/>
+      <w:lvlJc w:val="left"/>
+      <w:pPr>
+        <w:tabs>
+          <w:tab w:val="num" w:pos="0"/>
+        </w:tabs>
+        <w:ind w:left="0" w:hanging="0"/>
+      </w:pPr>
+    </w:lvl>
+    <w:lvl w:ilvl="5">
+      <w:start w:val="1"/>
+      <w:numFmt w:val="none"/>
+      <w:suff w:val="nothing"/>
+      <w:lvlText w:val="%6"/>
+      <w:lvlJc w:val="left"/>
+      <w:pPr>
+        <w:tabs>
+          <w:tab w:val="num" w:pos="0"/>
+        </w:tabs>
+        <w:ind w:left="0" w:hanging="0"/>
+      </w:pPr>
+    </w:lvl>
+    <w:lvl w:ilvl="6">
+      <w:start w:val="1"/>
+      <w:numFmt w:val="none"/>
+      <w:suff w:val="nothing"/>
+      <w:lvlText w:val="%7"/>
+      <w:lvlJc w:val="left"/>
+      <w:pPr>
+        <w:tabs>
+          <w:tab w:val="num" w:pos="0"/>
+        </w:tabs>
+        <w:ind w:left="0" w:hanging="0"/>
+      </w:pPr>
+    </w:lvl>
+    <w:lvl w:ilvl="7">
+      <w:start w:val="1"/>
+      <w:numFmt w:val="none"/>
+      <w:suff w:val="nothing"/>
+      <w:lvlText w:val="%8"/>
+      <w:lvlJc w:val="left"/>
+      <w:pPr>
+        <w:tabs>
+          <w:tab w:val="num" w:pos="0"/>
+        </w:tabs>
+        <w:ind w:left="0" w:hanging="0"/>
+      </w:pPr>
+    </w:lvl>
+    <w:lvl w:ilvl="8">
+      <w:start w:val="1"/>
+      <w:numFmt w:val="none"/>
+      <w:suff w:val="nothing"/>
+      <w:lvlText w:val="%9"/>
+      <w:lvlJc w:val="left"/>
+      <w:pPr>
+        <w:tabs>
+          <w:tab w:val="num" w:pos="0"/>
+        </w:tabs>
+        <w:ind w:left="0" w:hanging="0"/>
+      </w:pPr>
+    </w:lvl>
+  </w:abstractNum>
+  <w:abstractNum w:abstractNumId="2">
+    <w:lvl w:ilvl="0">
+      <w:start w:val="1"/>
       <w:numFmt w:val="decimal"/>
       <w:lvlText w:val="%1."/>
       <w:lvlJc w:val="left"/>
@@ -6170,125 +5865,6 @@
         <w:ind w:left="3600" w:hanging="360"/>
       </w:pPr>
       <w:rPr/>
-    </w:lvl>
-  </w:abstractNum>
-  <w:abstractNum w:abstractNumId="2">
-    <w:lvl w:ilvl="0">
-      <w:start w:val="1"/>
-      <w:numFmt w:val="none"/>
-      <w:suff w:val="nothing"/>
-      <w:lvlText w:val=""/>
-      <w:lvlJc w:val="left"/>
-      <w:pPr>
-        <w:tabs>
-          <w:tab w:val="num" w:pos="0"/>
-        </w:tabs>
-        <w:ind w:left="0" w:hanging="0"/>
-      </w:pPr>
-    </w:lvl>
-    <w:lvl w:ilvl="1">
-      <w:start w:val="1"/>
-      <w:numFmt w:val="none"/>
-      <w:suff w:val="nothing"/>
-      <w:lvlText w:val=""/>
-      <w:lvlJc w:val="left"/>
-      <w:pPr>
-        <w:tabs>
-          <w:tab w:val="num" w:pos="0"/>
-        </w:tabs>
-        <w:ind w:left="0" w:hanging="0"/>
-      </w:pPr>
-    </w:lvl>
-    <w:lvl w:ilvl="2">
-      <w:start w:val="1"/>
-      <w:numFmt w:val="none"/>
-      <w:suff w:val="nothing"/>
-      <w:lvlText w:val=""/>
-      <w:lvlJc w:val="left"/>
-      <w:pPr>
-        <w:tabs>
-          <w:tab w:val="num" w:pos="0"/>
-        </w:tabs>
-        <w:ind w:left="0" w:hanging="0"/>
-      </w:pPr>
-    </w:lvl>
-    <w:lvl w:ilvl="3">
-      <w:start w:val="1"/>
-      <w:numFmt w:val="none"/>
-      <w:suff w:val="nothing"/>
-      <w:lvlText w:val=""/>
-      <w:lvlJc w:val="left"/>
-      <w:pPr>
-        <w:tabs>
-          <w:tab w:val="num" w:pos="0"/>
-        </w:tabs>
-        <w:ind w:left="0" w:hanging="0"/>
-      </w:pPr>
-    </w:lvl>
-    <w:lvl w:ilvl="4">
-      <w:start w:val="1"/>
-      <w:numFmt w:val="none"/>
-      <w:suff w:val="nothing"/>
-      <w:lvlText w:val=""/>
-      <w:lvlJc w:val="left"/>
-      <w:pPr>
-        <w:tabs>
-          <w:tab w:val="num" w:pos="0"/>
-        </w:tabs>
-        <w:ind w:left="0" w:hanging="0"/>
-      </w:pPr>
-    </w:lvl>
-    <w:lvl w:ilvl="5">
-      <w:start w:val="1"/>
-      <w:numFmt w:val="none"/>
-      <w:suff w:val="nothing"/>
-      <w:lvlText w:val=""/>
-      <w:lvlJc w:val="left"/>
-      <w:pPr>
-        <w:tabs>
-          <w:tab w:val="num" w:pos="0"/>
-        </w:tabs>
-        <w:ind w:left="0" w:hanging="0"/>
-      </w:pPr>
-    </w:lvl>
-    <w:lvl w:ilvl="6">
-      <w:start w:val="1"/>
-      <w:numFmt w:val="none"/>
-      <w:suff w:val="nothing"/>
-      <w:lvlText w:val=""/>
-      <w:lvlJc w:val="left"/>
-      <w:pPr>
-        <w:tabs>
-          <w:tab w:val="num" w:pos="0"/>
-        </w:tabs>
-        <w:ind w:left="0" w:hanging="0"/>
-      </w:pPr>
-    </w:lvl>
-    <w:lvl w:ilvl="7">
-      <w:start w:val="1"/>
-      <w:numFmt w:val="none"/>
-      <w:suff w:val="nothing"/>
-      <w:lvlText w:val=""/>
-      <w:lvlJc w:val="left"/>
-      <w:pPr>
-        <w:tabs>
-          <w:tab w:val="num" w:pos="0"/>
-        </w:tabs>
-        <w:ind w:left="0" w:hanging="0"/>
-      </w:pPr>
-    </w:lvl>
-    <w:lvl w:ilvl="8">
-      <w:start w:val="1"/>
-      <w:numFmt w:val="none"/>
-      <w:suff w:val="nothing"/>
-      <w:lvlText w:val=""/>
-      <w:lvlJc w:val="left"/>
-      <w:pPr>
-        <w:tabs>
-          <w:tab w:val="num" w:pos="0"/>
-        </w:tabs>
-        <w:ind w:left="0" w:hanging="0"/>
-      </w:pPr>
     </w:lvl>
   </w:abstractNum>
   <w:num w:numId="1">
@@ -6324,7 +5900,9 @@
     <w:pPr>
       <w:widowControl/>
       <w:suppressAutoHyphens w:val="true"/>
-      <w:overflowPunct w:val="true"/>
+      <w:kinsoku w:val="true"/>
+      <w:overflowPunct w:val="false"/>
+      <w:autoSpaceDE w:val="true"/>
       <w:bidi w:val="0"/>
       <w:spacing w:before="0" w:after="0"/>
       <w:jc w:val="left"/>

</xml_diff>

<commit_message>
start working on appearance based methods
</commit_message>
<xml_diff>
--- a/SikoliaThesis.docx
+++ b/SikoliaThesis.docx
@@ -3269,14 +3269,17 @@
         <w:bidi w:val="0"/>
         <w:spacing w:lineRule="auto" w:line="480"/>
         <w:jc w:val="left"/>
-        <w:rPr>
-          <w:b/>
+        <w:rPr/>
+      </w:pPr>
+      <w:r>
+        <w:rPr>
           <w:b/>
           <w:bCs/>
           <w:sz w:val="32"/>
           <w:szCs w:val="32"/>
         </w:rPr>
-      </w:pPr>
+        <w:t>2.</w:t>
+      </w:r>
       <w:r>
         <w:rPr>
           <w:b/>
@@ -3284,44 +3287,89 @@
           <w:sz w:val="32"/>
           <w:szCs w:val="32"/>
         </w:rPr>
-        <w:t>2.4 Facial Recognition Approaches</w:t>
-      </w:r>
-    </w:p>
-    <w:p>
-      <w:pPr>
-        <w:pStyle w:val="Normal"/>
-        <w:bidi w:val="0"/>
-        <w:spacing w:lineRule="auto" w:line="480"/>
-        <w:jc w:val="left"/>
-        <w:rPr/>
-      </w:pPr>
-      <w:r>
-        <w:rPr>
-          <w:b w:val="false"/>
-          <w:bCs w:val="false"/>
-          <w:sz w:val="24"/>
-          <w:szCs w:val="24"/>
-        </w:rPr>
-        <w:tab/>
-        <w:t>A thorough review of literature on the subject of facial recognition reveals that there is an array of techniques that could be used for facial recognition. As evidenced, Fu (2021) mention the geometric features approach, the template matching approach, and the model based facial approach as some of the existing solutions on facial recognition. In a different study, Priya et al., (2014)  mention the template matching technique, the statistical approach and the neural networks approach as some of the techniques that could be used for facial recognition. In a different paper, Bose and Bandyopadhyay (2020) mentions four methods use</w:t>
-      </w:r>
-      <w:r>
-        <w:rPr>
-          <w:b w:val="false"/>
-          <w:bCs w:val="false"/>
-          <w:sz w:val="24"/>
-          <w:szCs w:val="24"/>
-        </w:rPr>
-        <w:t>d</w:t>
-      </w:r>
-      <w:r>
-        <w:rPr>
-          <w:b w:val="false"/>
-          <w:bCs w:val="false"/>
-          <w:sz w:val="24"/>
-          <w:szCs w:val="24"/>
-        </w:rPr>
-        <w:t xml:space="preserve"> for facial recognition. These methods include feature-based methods, template-based methods, appearance-based methods, and knowledge-based methods. Even though Bose and Bandyopadhyay (2020) mention four methods that could be used for facial recognition, they used the template based method in their research citing that template matching is the best available solution </w:t>
+        <w:t>3.2</w:t>
+      </w:r>
+      <w:r>
+        <w:rPr>
+          <w:b/>
+          <w:bCs/>
+          <w:sz w:val="32"/>
+          <w:szCs w:val="32"/>
+        </w:rPr>
+        <w:t xml:space="preserve"> Fac</w:t>
+      </w:r>
+      <w:r>
+        <w:rPr>
+          <w:b/>
+          <w:bCs/>
+          <w:sz w:val="32"/>
+          <w:szCs w:val="32"/>
+        </w:rPr>
+        <w:t>e</w:t>
+      </w:r>
+      <w:r>
+        <w:rPr>
+          <w:b/>
+          <w:bCs/>
+          <w:sz w:val="32"/>
+          <w:szCs w:val="32"/>
+        </w:rPr>
+        <w:t xml:space="preserve"> </w:t>
+      </w:r>
+      <w:r>
+        <w:rPr>
+          <w:b/>
+          <w:bCs/>
+          <w:sz w:val="32"/>
+          <w:szCs w:val="32"/>
+        </w:rPr>
+        <w:t>Detection</w:t>
+      </w:r>
+      <w:r>
+        <w:rPr>
+          <w:b/>
+          <w:bCs/>
+          <w:sz w:val="32"/>
+          <w:szCs w:val="32"/>
+        </w:rPr>
+        <w:t xml:space="preserve"> Approaches</w:t>
+      </w:r>
+    </w:p>
+    <w:p>
+      <w:pPr>
+        <w:pStyle w:val="Normal"/>
+        <w:bidi w:val="0"/>
+        <w:spacing w:lineRule="auto" w:line="480"/>
+        <w:jc w:val="left"/>
+        <w:rPr/>
+      </w:pPr>
+      <w:r>
+        <w:rPr>
+          <w:b w:val="false"/>
+          <w:bCs w:val="false"/>
+          <w:sz w:val="24"/>
+          <w:szCs w:val="24"/>
+        </w:rPr>
+        <w:tab/>
+        <w:t>A thorough review of literature on the subject of facial recognition reveals that there is an array of techniques that could be used for fac</w:t>
+      </w:r>
+      <w:r>
+        <w:rPr>
+          <w:b w:val="false"/>
+          <w:bCs w:val="false"/>
+          <w:sz w:val="24"/>
+          <w:szCs w:val="24"/>
+        </w:rPr>
+        <w:t>e detection</w:t>
+      </w:r>
+      <w:r>
+        <w:rPr>
+          <w:b w:val="false"/>
+          <w:bCs w:val="false"/>
+          <w:sz w:val="24"/>
+          <w:szCs w:val="24"/>
+        </w:rPr>
+        <w:t xml:space="preserve">. As evidenced, Fu (2021) mention the geometric features approach, the template matching approach, and the model based facial approach as some of the existing solutions </w:t>
       </w:r>
       <w:r>
         <w:rPr>
@@ -3339,23 +3387,231 @@
           <w:sz w:val="24"/>
           <w:szCs w:val="24"/>
         </w:rPr>
-        <w:t xml:space="preserve"> face detection.</w:t>
-      </w:r>
-    </w:p>
-    <w:p>
-      <w:pPr>
-        <w:pStyle w:val="Normal"/>
-        <w:bidi w:val="0"/>
-        <w:spacing w:lineRule="auto" w:line="480"/>
-        <w:jc w:val="left"/>
-        <w:rPr>
-          <w:b/>
+        <w:t xml:space="preserve"> fac</w:t>
+      </w:r>
+      <w:r>
+        <w:rPr>
+          <w:b w:val="false"/>
+          <w:bCs w:val="false"/>
+          <w:sz w:val="24"/>
+          <w:szCs w:val="24"/>
+        </w:rPr>
+        <w:t>e</w:t>
+      </w:r>
+      <w:r>
+        <w:rPr>
+          <w:b w:val="false"/>
+          <w:bCs w:val="false"/>
+          <w:sz w:val="24"/>
+          <w:szCs w:val="24"/>
+        </w:rPr>
+        <w:t xml:space="preserve"> </w:t>
+      </w:r>
+      <w:r>
+        <w:rPr>
+          <w:b w:val="false"/>
+          <w:bCs w:val="false"/>
+          <w:sz w:val="24"/>
+          <w:szCs w:val="24"/>
+        </w:rPr>
+        <w:t>detection</w:t>
+      </w:r>
+      <w:r>
+        <w:rPr>
+          <w:b w:val="false"/>
+          <w:bCs w:val="false"/>
+          <w:sz w:val="24"/>
+          <w:szCs w:val="24"/>
+        </w:rPr>
+        <w:t xml:space="preserve">. In a different study, Priya et al., (2014)  mention the </w:t>
+      </w:r>
+      <w:r>
+        <w:rPr>
+          <w:b w:val="false"/>
+          <w:bCs w:val="false"/>
+          <w:sz w:val="24"/>
+          <w:szCs w:val="24"/>
+          <w:shd w:fill="FFFF00" w:val="clear"/>
+        </w:rPr>
+        <w:t>template matching technique</w:t>
+      </w:r>
+      <w:r>
+        <w:rPr>
+          <w:b w:val="false"/>
+          <w:bCs w:val="false"/>
+          <w:sz w:val="24"/>
+          <w:szCs w:val="24"/>
+        </w:rPr>
+        <w:t xml:space="preserve">, the </w:t>
+      </w:r>
+      <w:r>
+        <w:rPr>
+          <w:b w:val="false"/>
+          <w:bCs w:val="false"/>
+          <w:sz w:val="24"/>
+          <w:szCs w:val="24"/>
+          <w:shd w:fill="FFFF00" w:val="clear"/>
+        </w:rPr>
+        <w:t>statistical approach</w:t>
+      </w:r>
+      <w:r>
+        <w:rPr>
+          <w:b w:val="false"/>
+          <w:bCs w:val="false"/>
+          <w:sz w:val="24"/>
+          <w:szCs w:val="24"/>
+        </w:rPr>
+        <w:t xml:space="preserve"> and the</w:t>
+      </w:r>
+      <w:r>
+        <w:rPr>
+          <w:b w:val="false"/>
+          <w:bCs w:val="false"/>
+          <w:sz w:val="24"/>
+          <w:szCs w:val="24"/>
+          <w:shd w:fill="FFFF00" w:val="clear"/>
+        </w:rPr>
+        <w:t xml:space="preserve"> neural networks approach</w:t>
+      </w:r>
+      <w:r>
+        <w:rPr>
+          <w:b w:val="false"/>
+          <w:bCs w:val="false"/>
+          <w:sz w:val="24"/>
+          <w:szCs w:val="24"/>
+        </w:rPr>
+        <w:t xml:space="preserve"> as some of the techniques that could be used for fac</w:t>
+      </w:r>
+      <w:r>
+        <w:rPr>
+          <w:b w:val="false"/>
+          <w:bCs w:val="false"/>
+          <w:sz w:val="24"/>
+          <w:szCs w:val="24"/>
+        </w:rPr>
+        <w:t>e detection.</w:t>
+      </w:r>
+      <w:r>
+        <w:rPr>
+          <w:b w:val="false"/>
+          <w:bCs w:val="false"/>
+          <w:sz w:val="24"/>
+          <w:szCs w:val="24"/>
+        </w:rPr>
+        <w:t xml:space="preserve"> In a different paper, Bose and Bandyopadhyay (2020) mentions four methods used for fac</w:t>
+      </w:r>
+      <w:r>
+        <w:rPr>
+          <w:b w:val="false"/>
+          <w:bCs w:val="false"/>
+          <w:sz w:val="24"/>
+          <w:szCs w:val="24"/>
+        </w:rPr>
+        <w:t>e detection</w:t>
+      </w:r>
+      <w:r>
+        <w:rPr>
+          <w:b w:val="false"/>
+          <w:bCs w:val="false"/>
+          <w:sz w:val="24"/>
+          <w:szCs w:val="24"/>
+        </w:rPr>
+        <w:t xml:space="preserve">. These methods include </w:t>
+      </w:r>
+      <w:r>
+        <w:rPr>
+          <w:b w:val="false"/>
+          <w:bCs w:val="false"/>
+          <w:sz w:val="24"/>
+          <w:szCs w:val="24"/>
+          <w:shd w:fill="FFFF00" w:val="clear"/>
+        </w:rPr>
+        <w:t>feature-based methods</w:t>
+      </w:r>
+      <w:r>
+        <w:rPr>
+          <w:b w:val="false"/>
+          <w:bCs w:val="false"/>
+          <w:sz w:val="24"/>
+          <w:szCs w:val="24"/>
+        </w:rPr>
+        <w:t xml:space="preserve">, </w:t>
+      </w:r>
+      <w:r>
+        <w:rPr>
+          <w:b w:val="false"/>
+          <w:bCs w:val="false"/>
+          <w:sz w:val="24"/>
+          <w:szCs w:val="24"/>
+          <w:shd w:fill="FFFF00" w:val="clear"/>
+        </w:rPr>
+        <w:t>template-based methods</w:t>
+      </w:r>
+      <w:r>
+        <w:rPr>
+          <w:b w:val="false"/>
+          <w:bCs w:val="false"/>
+          <w:sz w:val="24"/>
+          <w:szCs w:val="24"/>
+        </w:rPr>
+        <w:t xml:space="preserve">, </w:t>
+      </w:r>
+      <w:r>
+        <w:rPr>
+          <w:b w:val="false"/>
+          <w:bCs w:val="false"/>
+          <w:sz w:val="24"/>
+          <w:szCs w:val="24"/>
+          <w:shd w:fill="FFFF00" w:val="clear"/>
+        </w:rPr>
+        <w:t>appearance-based methods</w:t>
+      </w:r>
+      <w:r>
+        <w:rPr>
+          <w:b w:val="false"/>
+          <w:bCs w:val="false"/>
+          <w:sz w:val="24"/>
+          <w:szCs w:val="24"/>
+        </w:rPr>
+        <w:t xml:space="preserve">, and </w:t>
+      </w:r>
+      <w:r>
+        <w:rPr>
+          <w:b w:val="false"/>
+          <w:bCs w:val="false"/>
+          <w:sz w:val="24"/>
+          <w:szCs w:val="24"/>
+          <w:shd w:fill="FFFF00" w:val="clear"/>
+        </w:rPr>
+        <w:t>knowledge-based</w:t>
+      </w:r>
+      <w:r>
+        <w:rPr>
+          <w:b w:val="false"/>
+          <w:bCs w:val="false"/>
+          <w:sz w:val="24"/>
+          <w:szCs w:val="24"/>
+        </w:rPr>
+        <w:t xml:space="preserve"> methods. Even though Bose and Bandyopadhyay (2020) mention four methods that could be used for facial recognition, they used the template based method in their research citing that template matching is the best available solution for face detection.</w:t>
+      </w:r>
+    </w:p>
+    <w:p>
+      <w:pPr>
+        <w:pStyle w:val="Normal"/>
+        <w:bidi w:val="0"/>
+        <w:spacing w:lineRule="auto" w:line="480"/>
+        <w:jc w:val="left"/>
+        <w:rPr/>
+      </w:pPr>
+      <w:r>
+        <w:rPr>
           <w:b/>
           <w:bCs/>
           <w:sz w:val="28"/>
           <w:szCs w:val="28"/>
         </w:rPr>
-      </w:pPr>
+        <w:t>2.</w:t>
+      </w:r>
       <w:r>
         <w:rPr>
           <w:b/>
@@ -3363,46 +3619,73 @@
           <w:sz w:val="28"/>
           <w:szCs w:val="28"/>
         </w:rPr>
-        <w:t>2.4.1 The Geometric Approach of Facial Recognition</w:t>
-      </w:r>
-    </w:p>
-    <w:p>
-      <w:pPr>
-        <w:pStyle w:val="Normal"/>
-        <w:bidi w:val="0"/>
-        <w:spacing w:lineRule="auto" w:line="480"/>
-        <w:jc w:val="left"/>
-        <w:rPr/>
-      </w:pPr>
-      <w:r>
-        <w:rPr>
-          <w:b w:val="false"/>
-          <w:bCs w:val="false"/>
-          <w:sz w:val="24"/>
-          <w:szCs w:val="24"/>
-        </w:rPr>
-        <w:tab/>
-        <w:t>This method functions to extract facial image features to gain the Euclidean distance value served as input face comparison value of the users’ faces stored in the database (</w:t>
-      </w:r>
-      <w:r>
-        <w:rPr>
-          <w:b w:val="false"/>
-          <w:bCs w:val="false"/>
+        <w:t>3.</w:t>
+      </w:r>
+      <w:r>
+        <w:rPr>
+          <w:b/>
+          <w:bCs/>
+          <w:sz w:val="28"/>
+          <w:szCs w:val="28"/>
+        </w:rPr>
+        <w:t>2.1</w:t>
+      </w:r>
+      <w:r>
+        <w:rPr>
+          <w:b/>
+          <w:bCs/>
+          <w:sz w:val="28"/>
+          <w:szCs w:val="28"/>
+        </w:rPr>
+        <w:t xml:space="preserve"> The </w:t>
+      </w:r>
+      <w:r>
+        <w:rPr>
+          <w:b/>
+          <w:bCs/>
           <w:i w:val="false"/>
           <w:iCs w:val="false"/>
-          <w:sz w:val="24"/>
-          <w:szCs w:val="24"/>
-        </w:rPr>
-        <w:t>Hidayat, Wibowo, Satria, Winursito, 2021</w:t>
-      </w:r>
-      <w:r>
-        <w:rPr>
-          <w:b w:val="false"/>
-          <w:bCs w:val="false"/>
-          <w:sz w:val="24"/>
-          <w:szCs w:val="24"/>
-        </w:rPr>
-        <w:t>). Simply put, the geometric approach transforms an image into geometric primitives like curves and points. This is done by identifying distinctive features like the eye, the nose, the chin, and the mouth before measuring their relative positions, widths and other parameters of the distinctive features. It is vital to note that H</w:t>
+          <w:sz w:val="28"/>
+          <w:szCs w:val="28"/>
+        </w:rPr>
+        <w:t>Template Based/</w:t>
+      </w:r>
+      <w:r>
+        <w:rPr>
+          <w:b/>
+          <w:bCs/>
+          <w:sz w:val="28"/>
+          <w:szCs w:val="28"/>
+        </w:rPr>
+        <w:t>Geometric Approach of Fac</w:t>
+      </w:r>
+      <w:r>
+        <w:rPr>
+          <w:b/>
+          <w:bCs/>
+          <w:sz w:val="28"/>
+          <w:szCs w:val="28"/>
+        </w:rPr>
+        <w:t>e Detection</w:t>
+      </w:r>
+    </w:p>
+    <w:p>
+      <w:pPr>
+        <w:pStyle w:val="Normal"/>
+        <w:bidi w:val="0"/>
+        <w:spacing w:lineRule="auto" w:line="480"/>
+        <w:jc w:val="left"/>
+        <w:rPr/>
+      </w:pPr>
+      <w:r>
+        <w:rPr>
+          <w:b w:val="false"/>
+          <w:bCs w:val="false"/>
+          <w:sz w:val="24"/>
+          <w:szCs w:val="24"/>
+        </w:rPr>
+        <w:tab/>
+        <w:t>This method functions to extract facial image features to gain the Euclidean distance value served as input face comparison value of the users’ faces stored in the database (</w:t>
       </w:r>
       <w:r>
         <w:rPr>
@@ -3413,16 +3696,16 @@
           <w:sz w:val="24"/>
           <w:szCs w:val="24"/>
         </w:rPr>
-        <w:t>idayat, et al., (2021</w:t>
-      </w:r>
-      <w:r>
-        <w:rPr>
-          <w:b w:val="false"/>
-          <w:bCs w:val="false"/>
-          <w:sz w:val="24"/>
-          <w:szCs w:val="24"/>
-        </w:rPr>
-        <w:t xml:space="preserve">) </w:t>
+        <w:t>Hidayat, Wibowo, Satria, Winursito, 2021</w:t>
+      </w:r>
+      <w:r>
+        <w:rPr>
+          <w:b w:val="false"/>
+          <w:bCs w:val="false"/>
+          <w:sz w:val="24"/>
+          <w:szCs w:val="24"/>
+        </w:rPr>
+        <w:t>). Simply put, the geometric approach transforms an image into geometric primitives like curves and points. This is done by identifying distinctive features like the eye, the nose, the chin, and the mouth before measuring their relative positions, widths and other parameters of the distinctive features. It is vital to note that H</w:t>
       </w:r>
       <w:r>
         <w:rPr>
@@ -3433,7 +3716,16 @@
           <w:sz w:val="24"/>
           <w:szCs w:val="24"/>
         </w:rPr>
-        <w:t xml:space="preserve">assert that the geometric approach of facial recognition is known to have a lighter computational load than other methods because it does not require features from the entire face. </w:t>
+        <w:t>idayat, et al., (2021</w:t>
+      </w:r>
+      <w:r>
+        <w:rPr>
+          <w:b w:val="false"/>
+          <w:bCs w:val="false"/>
+          <w:sz w:val="24"/>
+          <w:szCs w:val="24"/>
+        </w:rPr>
+        <w:t xml:space="preserve">) </w:t>
       </w:r>
       <w:r>
         <w:rPr>
@@ -3444,40 +3736,7 @@
           <w:sz w:val="24"/>
           <w:szCs w:val="24"/>
         </w:rPr>
-        <w:t>Similarly</w:t>
-      </w:r>
-      <w:r>
-        <w:rPr>
-          <w:b w:val="false"/>
-          <w:bCs w:val="false"/>
-          <w:i w:val="false"/>
-          <w:iCs w:val="false"/>
-          <w:sz w:val="24"/>
-          <w:szCs w:val="24"/>
-        </w:rPr>
-        <w:t>, Brunelli and Poggio (2013) emphasize that the geometric method of facial recognition has a lighter computational load by arguing that the method in question can recognize faces even wh</w:t>
-      </w:r>
-      <w:r>
-        <w:rPr>
-          <w:b w:val="false"/>
-          <w:bCs w:val="false"/>
-          <w:i w:val="false"/>
-          <w:iCs w:val="false"/>
-          <w:sz w:val="24"/>
-          <w:szCs w:val="24"/>
-        </w:rPr>
-        <w:t>n</w:t>
-      </w:r>
-      <w:r>
-        <w:rPr>
-          <w:b w:val="false"/>
-          <w:bCs w:val="false"/>
-          <w:i w:val="false"/>
-          <w:iCs w:val="false"/>
-          <w:sz w:val="24"/>
-          <w:szCs w:val="24"/>
-        </w:rPr>
-        <w:t>en the details of individual features such as the nose, eyes, and mouth are no longer resolved.</w:t>
+        <w:t>assert that the geometric approach of facial recognition is known to have a lighter computational load than other methods because it does not require features from the entire face. Similarly, Brunelli and Poggio (2013) emphasize that the geometric method of facial recognition has a lighter computational load by arguing that the method in question can recognize faces even when the details of individual features such as the nose, eyes, and mouth are no longer resolved.</w:t>
       </w:r>
     </w:p>
     <w:p>
@@ -3536,7 +3795,185 @@
           <w:sz w:val="28"/>
           <w:szCs w:val="28"/>
         </w:rPr>
-        <w:t>2.4.2 The Template Based Approach of Facial Recognition</w:t>
+        <w:t xml:space="preserve">2.4.2 The </w:t>
+      </w:r>
+      <w:r>
+        <w:rPr>
+          <w:b/>
+          <w:bCs/>
+          <w:i w:val="false"/>
+          <w:iCs w:val="false"/>
+          <w:sz w:val="28"/>
+          <w:szCs w:val="28"/>
+        </w:rPr>
+        <w:t>Appearance Based</w:t>
+      </w:r>
+      <w:r>
+        <w:rPr>
+          <w:b/>
+          <w:bCs/>
+          <w:i w:val="false"/>
+          <w:iCs w:val="false"/>
+          <w:sz w:val="28"/>
+          <w:szCs w:val="28"/>
+        </w:rPr>
+        <w:t xml:space="preserve"> Approach of Facial </w:t>
+      </w:r>
+      <w:r>
+        <w:rPr>
+          <w:b/>
+          <w:bCs/>
+          <w:i w:val="false"/>
+          <w:iCs w:val="false"/>
+          <w:sz w:val="28"/>
+          <w:szCs w:val="28"/>
+        </w:rPr>
+        <w:t>Detection</w:t>
+      </w:r>
+    </w:p>
+    <w:p>
+      <w:pPr>
+        <w:pStyle w:val="Normal"/>
+        <w:bidi w:val="0"/>
+        <w:spacing w:lineRule="auto" w:line="480"/>
+        <w:jc w:val="left"/>
+        <w:rPr>
+          <w:sz w:val="24"/>
+          <w:szCs w:val="24"/>
+        </w:rPr>
+      </w:pPr>
+      <w:r>
+        <w:rPr>
+          <w:sz w:val="24"/>
+          <w:szCs w:val="24"/>
+        </w:rPr>
+        <w:tab/>
+      </w:r>
+      <w:r>
+        <w:rPr>
+          <w:sz w:val="24"/>
+          <w:szCs w:val="24"/>
+        </w:rPr>
+        <w:t xml:space="preserve">The idea behind using Appearance methods for face detection relies on the linear algebra concept of subspaces. What is a subspace in linear algebra? </w:t>
+      </w:r>
+      <w:r>
+        <w:rPr>
+          <w:sz w:val="24"/>
+          <w:szCs w:val="24"/>
+        </w:rPr>
+        <w:t xml:space="preserve">A  subspace of a vector space V is a subset H of V that has the following three </w:t>
+      </w:r>
+      <w:r>
+        <w:rPr>
+          <w:sz w:val="24"/>
+          <w:szCs w:val="24"/>
+        </w:rPr>
+        <w:t>properties:</w:t>
+      </w:r>
+    </w:p>
+    <w:p>
+      <w:pPr>
+        <w:pStyle w:val="Normal"/>
+        <w:numPr>
+          <w:ilvl w:val="0"/>
+          <w:numId w:val="3"/>
+        </w:numPr>
+        <w:bidi w:val="0"/>
+        <w:spacing w:lineRule="auto" w:line="480"/>
+        <w:jc w:val="left"/>
+        <w:rPr>
+          <w:sz w:val="24"/>
+          <w:szCs w:val="24"/>
+        </w:rPr>
+      </w:pPr>
+      <w:r>
+        <w:rPr>
+          <w:sz w:val="24"/>
+          <w:szCs w:val="24"/>
+        </w:rPr>
+        <w:t>The zero vector of V is in H.</w:t>
+      </w:r>
+    </w:p>
+    <w:p>
+      <w:pPr>
+        <w:pStyle w:val="Normal"/>
+        <w:numPr>
+          <w:ilvl w:val="0"/>
+          <w:numId w:val="3"/>
+        </w:numPr>
+        <w:bidi w:val="0"/>
+        <w:spacing w:lineRule="auto" w:line="480"/>
+        <w:jc w:val="left"/>
+        <w:rPr>
+          <w:sz w:val="24"/>
+          <w:szCs w:val="24"/>
+        </w:rPr>
+      </w:pPr>
+      <w:r>
+        <w:rPr>
+          <w:sz w:val="24"/>
+          <w:szCs w:val="24"/>
+        </w:rPr>
+        <w:t>For each u and v are in H, u + v is in H. (In this case we say H is closed under vector addition.)</w:t>
+      </w:r>
+    </w:p>
+    <w:p>
+      <w:pPr>
+        <w:pStyle w:val="Normal"/>
+        <w:numPr>
+          <w:ilvl w:val="0"/>
+          <w:numId w:val="3"/>
+        </w:numPr>
+        <w:bidi w:val="0"/>
+        <w:spacing w:lineRule="auto" w:line="480"/>
+        <w:jc w:val="left"/>
+        <w:rPr>
+          <w:sz w:val="24"/>
+          <w:szCs w:val="24"/>
+        </w:rPr>
+      </w:pPr>
+      <w:r>
+        <w:rPr>
+          <w:sz w:val="24"/>
+          <w:szCs w:val="24"/>
+        </w:rPr>
+        <w:t>For each u in H and each scalar c, cu is in H. (In this case we say H is closed under scalar multiplication.)</w:t>
+      </w:r>
+    </w:p>
+    <w:p>
+      <w:pPr>
+        <w:pStyle w:val="Normal"/>
+        <w:bidi w:val="0"/>
+        <w:spacing w:lineRule="auto" w:line="480"/>
+        <w:jc w:val="left"/>
+        <w:rPr>
+          <w:sz w:val="24"/>
+          <w:szCs w:val="24"/>
+        </w:rPr>
+      </w:pPr>
+      <w:r>
+        <w:rPr>
+          <w:sz w:val="24"/>
+          <w:szCs w:val="24"/>
+        </w:rPr>
+      </w:r>
+    </w:p>
+    <w:p>
+      <w:pPr>
+        <w:pStyle w:val="Normal"/>
+        <w:bidi w:val="0"/>
+        <w:spacing w:lineRule="auto" w:line="480"/>
+        <w:jc w:val="left"/>
+        <w:rPr>
+          <w:sz w:val="24"/>
+          <w:szCs w:val="24"/>
+        </w:rPr>
+      </w:pPr>
+      <w:r>
+        <w:rPr>
+          <w:sz w:val="24"/>
+          <w:szCs w:val="24"/>
+        </w:rPr>
       </w:r>
     </w:p>
     <w:p>
@@ -5867,11 +6304,124 @@
       <w:rPr/>
     </w:lvl>
   </w:abstractNum>
+  <w:abstractNum w:abstractNumId="3">
+    <w:lvl w:ilvl="0">
+      <w:start w:val="1"/>
+      <w:numFmt w:val="decimal"/>
+      <w:lvlText w:val="%1."/>
+      <w:lvlJc w:val="left"/>
+      <w:pPr>
+        <w:tabs>
+          <w:tab w:val="num" w:pos="720"/>
+        </w:tabs>
+        <w:ind w:left="720" w:hanging="360"/>
+      </w:pPr>
+    </w:lvl>
+    <w:lvl w:ilvl="1">
+      <w:start w:val="1"/>
+      <w:numFmt w:val="decimal"/>
+      <w:lvlText w:val="%2."/>
+      <w:lvlJc w:val="left"/>
+      <w:pPr>
+        <w:tabs>
+          <w:tab w:val="num" w:pos="1080"/>
+        </w:tabs>
+        <w:ind w:left="1080" w:hanging="360"/>
+      </w:pPr>
+    </w:lvl>
+    <w:lvl w:ilvl="2">
+      <w:start w:val="1"/>
+      <w:numFmt w:val="decimal"/>
+      <w:lvlText w:val="%3."/>
+      <w:lvlJc w:val="left"/>
+      <w:pPr>
+        <w:tabs>
+          <w:tab w:val="num" w:pos="1440"/>
+        </w:tabs>
+        <w:ind w:left="1440" w:hanging="360"/>
+      </w:pPr>
+    </w:lvl>
+    <w:lvl w:ilvl="3">
+      <w:start w:val="1"/>
+      <w:numFmt w:val="decimal"/>
+      <w:lvlText w:val="%4."/>
+      <w:lvlJc w:val="left"/>
+      <w:pPr>
+        <w:tabs>
+          <w:tab w:val="num" w:pos="1800"/>
+        </w:tabs>
+        <w:ind w:left="1800" w:hanging="360"/>
+      </w:pPr>
+    </w:lvl>
+    <w:lvl w:ilvl="4">
+      <w:start w:val="1"/>
+      <w:numFmt w:val="decimal"/>
+      <w:lvlText w:val="%5."/>
+      <w:lvlJc w:val="left"/>
+      <w:pPr>
+        <w:tabs>
+          <w:tab w:val="num" w:pos="2160"/>
+        </w:tabs>
+        <w:ind w:left="2160" w:hanging="360"/>
+      </w:pPr>
+    </w:lvl>
+    <w:lvl w:ilvl="5">
+      <w:start w:val="1"/>
+      <w:numFmt w:val="decimal"/>
+      <w:lvlText w:val="%6."/>
+      <w:lvlJc w:val="left"/>
+      <w:pPr>
+        <w:tabs>
+          <w:tab w:val="num" w:pos="2520"/>
+        </w:tabs>
+        <w:ind w:left="2520" w:hanging="360"/>
+      </w:pPr>
+    </w:lvl>
+    <w:lvl w:ilvl="6">
+      <w:start w:val="1"/>
+      <w:numFmt w:val="decimal"/>
+      <w:lvlText w:val="%7."/>
+      <w:lvlJc w:val="left"/>
+      <w:pPr>
+        <w:tabs>
+          <w:tab w:val="num" w:pos="2880"/>
+        </w:tabs>
+        <w:ind w:left="2880" w:hanging="360"/>
+      </w:pPr>
+    </w:lvl>
+    <w:lvl w:ilvl="7">
+      <w:start w:val="1"/>
+      <w:numFmt w:val="decimal"/>
+      <w:lvlText w:val="%8."/>
+      <w:lvlJc w:val="left"/>
+      <w:pPr>
+        <w:tabs>
+          <w:tab w:val="num" w:pos="3240"/>
+        </w:tabs>
+        <w:ind w:left="3240" w:hanging="360"/>
+      </w:pPr>
+    </w:lvl>
+    <w:lvl w:ilvl="8">
+      <w:start w:val="1"/>
+      <w:numFmt w:val="decimal"/>
+      <w:lvlText w:val="%9."/>
+      <w:lvlJc w:val="left"/>
+      <w:pPr>
+        <w:tabs>
+          <w:tab w:val="num" w:pos="3600"/>
+        </w:tabs>
+        <w:ind w:left="3600" w:hanging="360"/>
+      </w:pPr>
+    </w:lvl>
+  </w:abstractNum>
   <w:num w:numId="1">
     <w:abstractNumId w:val="1"/>
   </w:num>
   <w:num w:numId="2">
     <w:abstractNumId w:val="2"/>
+  </w:num>
+  <w:num w:numId="3">
+    <w:abstractNumId w:val="3"/>
   </w:num>
 </w:numbering>
 </file>
@@ -5901,7 +6451,7 @@
       <w:widowControl/>
       <w:suppressAutoHyphens w:val="true"/>
       <w:kinsoku w:val="true"/>
-      <w:overflowPunct w:val="false"/>
+      <w:overflowPunct w:val="true"/>
       <w:autoSpaceDE w:val="true"/>
       <w:bidi w:val="0"/>
       <w:spacing w:before="0" w:after="0"/>

</xml_diff>

<commit_message>
complete Appearance based methods
</commit_message>
<xml_diff>
--- a/SikoliaThesis.docx
+++ b/SikoliaThesis.docx
@@ -2637,7 +2637,7 @@
         <w:pStyle w:val="Normal"/>
         <w:numPr>
           <w:ilvl w:val="0"/>
-          <w:numId w:val="2"/>
+          <w:numId w:val="1"/>
         </w:numPr>
         <w:bidi w:val="0"/>
         <w:spacing w:lineRule="auto" w:line="480"/>
@@ -2665,7 +2665,7 @@
         <w:pStyle w:val="Normal"/>
         <w:numPr>
           <w:ilvl w:val="0"/>
-          <w:numId w:val="2"/>
+          <w:numId w:val="1"/>
         </w:numPr>
         <w:bidi w:val="0"/>
         <w:spacing w:lineRule="auto" w:line="480"/>
@@ -2693,7 +2693,7 @@
         <w:pStyle w:val="Normal"/>
         <w:numPr>
           <w:ilvl w:val="0"/>
-          <w:numId w:val="2"/>
+          <w:numId w:val="1"/>
         </w:numPr>
         <w:bidi w:val="0"/>
         <w:spacing w:lineRule="auto" w:line="480"/>
@@ -2721,7 +2721,7 @@
         <w:pStyle w:val="Normal"/>
         <w:numPr>
           <w:ilvl w:val="0"/>
-          <w:numId w:val="2"/>
+          <w:numId w:val="1"/>
         </w:numPr>
         <w:bidi w:val="0"/>
         <w:spacing w:lineRule="auto" w:line="480"/>
@@ -3278,253 +3278,120 @@
           <w:sz w:val="32"/>
           <w:szCs w:val="32"/>
         </w:rPr>
-        <w:t>2.</w:t>
-      </w:r>
-      <w:r>
-        <w:rPr>
-          <w:b/>
-          <w:bCs/>
-          <w:sz w:val="32"/>
-          <w:szCs w:val="32"/>
-        </w:rPr>
-        <w:t>3.2</w:t>
-      </w:r>
-      <w:r>
-        <w:rPr>
-          <w:b/>
-          <w:bCs/>
-          <w:sz w:val="32"/>
-          <w:szCs w:val="32"/>
-        </w:rPr>
-        <w:t xml:space="preserve"> Fac</w:t>
-      </w:r>
-      <w:r>
-        <w:rPr>
-          <w:b/>
-          <w:bCs/>
-          <w:sz w:val="32"/>
-          <w:szCs w:val="32"/>
-        </w:rPr>
-        <w:t>e</w:t>
-      </w:r>
-      <w:r>
-        <w:rPr>
-          <w:b/>
-          <w:bCs/>
-          <w:sz w:val="32"/>
-          <w:szCs w:val="32"/>
+        <w:t>2.3.2 Face Detection Approaches</w:t>
+      </w:r>
+    </w:p>
+    <w:p>
+      <w:pPr>
+        <w:pStyle w:val="Normal"/>
+        <w:bidi w:val="0"/>
+        <w:spacing w:lineRule="auto" w:line="480"/>
+        <w:jc w:val="left"/>
+        <w:rPr/>
+      </w:pPr>
+      <w:r>
+        <w:rPr>
+          <w:b w:val="false"/>
+          <w:bCs w:val="false"/>
+          <w:sz w:val="24"/>
+          <w:szCs w:val="24"/>
+        </w:rPr>
+        <w:tab/>
+        <w:t xml:space="preserve">A thorough review of literature on the subject of facial recognition reveals that there is an array of techniques that could be used for face detection. As evidenced, Fu (2021) mention the geometric features approach, the template matching approach, and the </w:t>
+      </w:r>
+      <w:r>
+        <w:rPr>
+          <w:b w:val="false"/>
+          <w:bCs w:val="false"/>
+          <w:sz w:val="24"/>
+          <w:szCs w:val="24"/>
+          <w:shd w:fill="auto" w:val="clear"/>
+        </w:rPr>
+        <w:t>model based facial</w:t>
+      </w:r>
+      <w:r>
+        <w:rPr>
+          <w:b w:val="false"/>
+          <w:bCs w:val="false"/>
+          <w:sz w:val="24"/>
+          <w:szCs w:val="24"/>
+        </w:rPr>
+        <w:t xml:space="preserve"> approach as some of the existing solutions for face detection. In a different study, Priya et al., (2014)  mention the </w:t>
+      </w:r>
+      <w:r>
+        <w:rPr>
+          <w:b w:val="false"/>
+          <w:bCs w:val="false"/>
+          <w:sz w:val="24"/>
+          <w:szCs w:val="24"/>
+          <w:shd w:fill="auto" w:val="clear"/>
+        </w:rPr>
+        <w:t>template matching technique</w:t>
+      </w:r>
+      <w:r>
+        <w:rPr>
+          <w:b w:val="false"/>
+          <w:bCs w:val="false"/>
+          <w:sz w:val="24"/>
+          <w:szCs w:val="24"/>
+        </w:rPr>
+        <w:t xml:space="preserve">, the </w:t>
+      </w:r>
+      <w:r>
+        <w:rPr>
+          <w:b w:val="false"/>
+          <w:bCs w:val="false"/>
+          <w:sz w:val="24"/>
+          <w:szCs w:val="24"/>
+          <w:shd w:fill="auto" w:val="clear"/>
+        </w:rPr>
+        <w:t>statistical approach</w:t>
+      </w:r>
+      <w:r>
+        <w:rPr>
+          <w:b w:val="false"/>
+          <w:bCs w:val="false"/>
+          <w:sz w:val="24"/>
+          <w:szCs w:val="24"/>
+        </w:rPr>
+        <w:t xml:space="preserve"> and the</w:t>
+      </w:r>
+      <w:r>
+        <w:rPr>
+          <w:b w:val="false"/>
+          <w:bCs w:val="false"/>
+          <w:sz w:val="24"/>
+          <w:szCs w:val="24"/>
+          <w:shd w:fill="auto" w:val="clear"/>
         </w:rPr>
         <w:t xml:space="preserve"> </w:t>
       </w:r>
       <w:r>
         <w:rPr>
-          <w:b/>
-          <w:bCs/>
-          <w:sz w:val="32"/>
-          <w:szCs w:val="32"/>
-        </w:rPr>
-        <w:t>Detection</w:t>
-      </w:r>
-      <w:r>
-        <w:rPr>
-          <w:b/>
-          <w:bCs/>
-          <w:sz w:val="32"/>
-          <w:szCs w:val="32"/>
-        </w:rPr>
-        <w:t xml:space="preserve"> Approaches</w:t>
-      </w:r>
-    </w:p>
-    <w:p>
-      <w:pPr>
-        <w:pStyle w:val="Normal"/>
-        <w:bidi w:val="0"/>
-        <w:spacing w:lineRule="auto" w:line="480"/>
-        <w:jc w:val="left"/>
-        <w:rPr/>
-      </w:pPr>
-      <w:r>
-        <w:rPr>
-          <w:b w:val="false"/>
-          <w:bCs w:val="false"/>
-          <w:sz w:val="24"/>
-          <w:szCs w:val="24"/>
-        </w:rPr>
-        <w:tab/>
-        <w:t>A thorough review of literature on the subject of facial recognition reveals that there is an array of techniques that could be used for fac</w:t>
-      </w:r>
-      <w:r>
-        <w:rPr>
-          <w:b w:val="false"/>
-          <w:bCs w:val="false"/>
-          <w:sz w:val="24"/>
-          <w:szCs w:val="24"/>
-        </w:rPr>
-        <w:t>e detection</w:t>
-      </w:r>
-      <w:r>
-        <w:rPr>
-          <w:b w:val="false"/>
-          <w:bCs w:val="false"/>
-          <w:sz w:val="24"/>
-          <w:szCs w:val="24"/>
-        </w:rPr>
-        <w:t xml:space="preserve">. As evidenced, Fu (2021) mention the geometric features approach, the template matching approach, and the model based facial approach as some of the existing solutions </w:t>
-      </w:r>
-      <w:r>
-        <w:rPr>
-          <w:b w:val="false"/>
-          <w:bCs w:val="false"/>
-          <w:sz w:val="24"/>
-          <w:szCs w:val="24"/>
-        </w:rPr>
-        <w:t>for</w:t>
-      </w:r>
-      <w:r>
-        <w:rPr>
-          <w:b w:val="false"/>
-          <w:bCs w:val="false"/>
-          <w:sz w:val="24"/>
-          <w:szCs w:val="24"/>
-        </w:rPr>
-        <w:t xml:space="preserve"> fac</w:t>
-      </w:r>
-      <w:r>
-        <w:rPr>
-          <w:b w:val="false"/>
-          <w:bCs w:val="false"/>
-          <w:sz w:val="24"/>
-          <w:szCs w:val="24"/>
-        </w:rPr>
-        <w:t>e</w:t>
-      </w:r>
-      <w:r>
-        <w:rPr>
-          <w:b w:val="false"/>
-          <w:bCs w:val="false"/>
-          <w:sz w:val="24"/>
-          <w:szCs w:val="24"/>
-        </w:rPr>
-        <w:t xml:space="preserve"> </w:t>
-      </w:r>
-      <w:r>
-        <w:rPr>
-          <w:b w:val="false"/>
-          <w:bCs w:val="false"/>
-          <w:sz w:val="24"/>
-          <w:szCs w:val="24"/>
-        </w:rPr>
-        <w:t>detection</w:t>
-      </w:r>
-      <w:r>
-        <w:rPr>
-          <w:b w:val="false"/>
-          <w:bCs w:val="false"/>
-          <w:sz w:val="24"/>
-          <w:szCs w:val="24"/>
-        </w:rPr>
-        <w:t xml:space="preserve">. In a different study, Priya et al., (2014)  mention the </w:t>
-      </w:r>
-      <w:r>
-        <w:rPr>
-          <w:b w:val="false"/>
-          <w:bCs w:val="false"/>
-          <w:sz w:val="24"/>
-          <w:szCs w:val="24"/>
-          <w:shd w:fill="FFFF00" w:val="clear"/>
-        </w:rPr>
-        <w:t>template matching technique</w:t>
-      </w:r>
-      <w:r>
-        <w:rPr>
-          <w:b w:val="false"/>
-          <w:bCs w:val="false"/>
-          <w:sz w:val="24"/>
-          <w:szCs w:val="24"/>
-        </w:rPr>
-        <w:t xml:space="preserve">, the </w:t>
-      </w:r>
-      <w:r>
-        <w:rPr>
-          <w:b w:val="false"/>
-          <w:bCs w:val="false"/>
-          <w:sz w:val="24"/>
-          <w:szCs w:val="24"/>
-          <w:shd w:fill="FFFF00" w:val="clear"/>
-        </w:rPr>
-        <w:t>statistical approach</w:t>
-      </w:r>
-      <w:r>
-        <w:rPr>
-          <w:b w:val="false"/>
-          <w:bCs w:val="false"/>
-          <w:sz w:val="24"/>
-          <w:szCs w:val="24"/>
-        </w:rPr>
-        <w:t xml:space="preserve"> and the</w:t>
-      </w:r>
-      <w:r>
-        <w:rPr>
-          <w:b w:val="false"/>
-          <w:bCs w:val="false"/>
-          <w:sz w:val="24"/>
-          <w:szCs w:val="24"/>
-          <w:shd w:fill="FFFF00" w:val="clear"/>
-        </w:rPr>
-        <w:t xml:space="preserve"> neural networks approach</w:t>
-      </w:r>
-      <w:r>
-        <w:rPr>
-          <w:b w:val="false"/>
-          <w:bCs w:val="false"/>
-          <w:sz w:val="24"/>
-          <w:szCs w:val="24"/>
-        </w:rPr>
-        <w:t xml:space="preserve"> as some of the techniques that could be used for fac</w:t>
-      </w:r>
-      <w:r>
-        <w:rPr>
-          <w:b w:val="false"/>
-          <w:bCs w:val="false"/>
-          <w:sz w:val="24"/>
-          <w:szCs w:val="24"/>
-        </w:rPr>
-        <w:t>e detection.</w:t>
-      </w:r>
-      <w:r>
-        <w:rPr>
-          <w:b w:val="false"/>
-          <w:bCs w:val="false"/>
-          <w:sz w:val="24"/>
-          <w:szCs w:val="24"/>
-        </w:rPr>
-        <w:t xml:space="preserve"> In a different paper, Bose and Bandyopadhyay (2020) mentions four methods used for fac</w:t>
-      </w:r>
-      <w:r>
-        <w:rPr>
-          <w:b w:val="false"/>
-          <w:bCs w:val="false"/>
-          <w:sz w:val="24"/>
-          <w:szCs w:val="24"/>
-        </w:rPr>
-        <w:t>e detection</w:t>
-      </w:r>
-      <w:r>
-        <w:rPr>
-          <w:b w:val="false"/>
-          <w:bCs w:val="false"/>
-          <w:sz w:val="24"/>
-          <w:szCs w:val="24"/>
-        </w:rPr>
-        <w:t xml:space="preserve">. These methods include </w:t>
-      </w:r>
-      <w:r>
-        <w:rPr>
-          <w:b w:val="false"/>
-          <w:bCs w:val="false"/>
-          <w:sz w:val="24"/>
-          <w:szCs w:val="24"/>
-          <w:shd w:fill="FFFF00" w:val="clear"/>
+          <w:b w:val="false"/>
+          <w:bCs w:val="false"/>
+          <w:sz w:val="24"/>
+          <w:szCs w:val="24"/>
+          <w:shd w:fill="auto" w:val="clear"/>
+        </w:rPr>
+        <w:t>neural networks approach</w:t>
+      </w:r>
+      <w:r>
+        <w:rPr>
+          <w:b w:val="false"/>
+          <w:bCs w:val="false"/>
+          <w:sz w:val="24"/>
+          <w:szCs w:val="24"/>
+        </w:rPr>
+        <w:t xml:space="preserve"> as some of the techniques that could be used for face detection. In a different paper, Bose and Bandyopadhyay (2020) mentions four methods used for face detection. These methods include </w:t>
+      </w:r>
+      <w:r>
+        <w:rPr>
+          <w:b w:val="false"/>
+          <w:bCs w:val="false"/>
+          <w:sz w:val="24"/>
+          <w:szCs w:val="24"/>
+          <w:shd w:fill="auto" w:val="clear"/>
         </w:rPr>
         <w:t>feature-based methods</w:t>
       </w:r>
@@ -3543,7 +3410,7 @@
           <w:bCs w:val="false"/>
           <w:sz w:val="24"/>
           <w:szCs w:val="24"/>
-          <w:shd w:fill="FFFF00" w:val="clear"/>
+          <w:shd w:fill="auto" w:val="clear"/>
         </w:rPr>
         <w:t>template-based methods</w:t>
       </w:r>
@@ -3562,7 +3429,7 @@
           <w:bCs w:val="false"/>
           <w:sz w:val="24"/>
           <w:szCs w:val="24"/>
-          <w:shd w:fill="FFFF00" w:val="clear"/>
+          <w:shd w:fill="auto" w:val="clear"/>
         </w:rPr>
         <w:t>appearance-based methods</w:t>
       </w:r>
@@ -3581,7 +3448,7 @@
           <w:bCs w:val="false"/>
           <w:sz w:val="24"/>
           <w:szCs w:val="24"/>
-          <w:shd w:fill="FFFF00" w:val="clear"/>
+          <w:shd w:fill="auto" w:val="clear"/>
         </w:rPr>
         <w:t>knowledge-based</w:t>
       </w:r>
@@ -3593,6 +3460,230 @@
           <w:szCs w:val="24"/>
         </w:rPr>
         <w:t xml:space="preserve"> methods. Even though Bose and Bandyopadhyay (2020) mention four methods that could be used for facial recognition, they used the template based method in their research citing that template matching is the best available solution for face detection.</w:t>
+      </w:r>
+    </w:p>
+    <w:p>
+      <w:pPr>
+        <w:pStyle w:val="Normal"/>
+        <w:bidi w:val="0"/>
+        <w:spacing w:lineRule="auto" w:line="480"/>
+        <w:jc w:val="left"/>
+        <w:rPr/>
+      </w:pPr>
+      <w:r>
+        <w:rPr>
+          <w:b w:val="false"/>
+          <w:bCs w:val="false"/>
+          <w:sz w:val="24"/>
+          <w:szCs w:val="24"/>
+        </w:rPr>
+        <w:tab/>
+      </w:r>
+      <w:r>
+        <w:rPr>
+          <w:b w:val="false"/>
+          <w:bCs w:val="false"/>
+          <w:sz w:val="24"/>
+          <w:szCs w:val="24"/>
+        </w:rPr>
+        <w:t xml:space="preserve">Pertinent literature on the subject of facial recognition indicates that the aforementioned techniques </w:t>
+      </w:r>
+      <w:r>
+        <w:rPr>
+          <w:b w:val="false"/>
+          <w:bCs w:val="false"/>
+          <w:sz w:val="24"/>
+          <w:szCs w:val="24"/>
+        </w:rPr>
+        <w:t xml:space="preserve">could be used for solving problems on facial recognition. However, a deep dive into the methods reveals that the main of methods used in facial recognition include  </w:t>
+      </w:r>
+      <w:r>
+        <w:rPr>
+          <w:b w:val="false"/>
+          <w:bCs w:val="false"/>
+          <w:sz w:val="24"/>
+          <w:szCs w:val="24"/>
+          <w:shd w:fill="auto" w:val="clear"/>
+        </w:rPr>
+        <w:t>feature-based methods</w:t>
+      </w:r>
+      <w:r>
+        <w:rPr>
+          <w:b w:val="false"/>
+          <w:bCs w:val="false"/>
+          <w:sz w:val="24"/>
+          <w:szCs w:val="24"/>
+        </w:rPr>
+        <w:t xml:space="preserve">, </w:t>
+      </w:r>
+      <w:r>
+        <w:rPr>
+          <w:b w:val="false"/>
+          <w:bCs w:val="false"/>
+          <w:sz w:val="24"/>
+          <w:szCs w:val="24"/>
+          <w:shd w:fill="auto" w:val="clear"/>
+        </w:rPr>
+        <w:t>template-based methods</w:t>
+      </w:r>
+      <w:r>
+        <w:rPr>
+          <w:b w:val="false"/>
+          <w:bCs w:val="false"/>
+          <w:sz w:val="24"/>
+          <w:szCs w:val="24"/>
+        </w:rPr>
+        <w:t xml:space="preserve">, </w:t>
+      </w:r>
+      <w:r>
+        <w:rPr>
+          <w:b w:val="false"/>
+          <w:bCs w:val="false"/>
+          <w:sz w:val="24"/>
+          <w:szCs w:val="24"/>
+          <w:shd w:fill="auto" w:val="clear"/>
+        </w:rPr>
+        <w:t>appearance-based methods</w:t>
+      </w:r>
+      <w:r>
+        <w:rPr>
+          <w:b w:val="false"/>
+          <w:bCs w:val="false"/>
+          <w:sz w:val="24"/>
+          <w:szCs w:val="24"/>
+        </w:rPr>
+        <w:t xml:space="preserve">, and </w:t>
+      </w:r>
+      <w:r>
+        <w:rPr>
+          <w:b w:val="false"/>
+          <w:bCs w:val="false"/>
+          <w:sz w:val="24"/>
+          <w:szCs w:val="24"/>
+          <w:shd w:fill="auto" w:val="clear"/>
+        </w:rPr>
+        <w:t>knowledge-based</w:t>
+      </w:r>
+      <w:r>
+        <w:rPr>
+          <w:b w:val="false"/>
+          <w:bCs w:val="false"/>
+          <w:sz w:val="24"/>
+          <w:szCs w:val="24"/>
+        </w:rPr>
+        <w:t xml:space="preserve"> methods. For example, </w:t>
+      </w:r>
+      <w:r>
+        <w:rPr>
+          <w:b w:val="false"/>
+          <w:bCs w:val="false"/>
+          <w:sz w:val="24"/>
+          <w:szCs w:val="24"/>
+        </w:rPr>
+        <w:t xml:space="preserve">the model based, statistical and neural network approaches all refer to the same method (statistical approach) yet different authors used different names to refer to the </w:t>
+      </w:r>
+      <w:r>
+        <w:rPr>
+          <w:b w:val="false"/>
+          <w:bCs w:val="false"/>
+          <w:sz w:val="24"/>
+          <w:szCs w:val="24"/>
+        </w:rPr>
+        <w:t xml:space="preserve">same  </w:t>
+      </w:r>
+      <w:r>
+        <w:rPr>
+          <w:b w:val="false"/>
+          <w:bCs w:val="false"/>
+          <w:sz w:val="24"/>
+          <w:szCs w:val="24"/>
+        </w:rPr>
+        <w:t xml:space="preserve">approach. </w:t>
+      </w:r>
+      <w:r>
+        <w:rPr>
+          <w:b w:val="false"/>
+          <w:bCs w:val="false"/>
+          <w:sz w:val="24"/>
+          <w:szCs w:val="24"/>
+        </w:rPr>
+        <w:t xml:space="preserve">This is supported by the reality that Agrawal and Singh (2015) mentions that statistical methods are usually applied in the  appearance based method of facial recognition. Similarly, the same methodology is applied on the template matching and geometric method implying that these two methods of face detection refer to the same technique. It follows that the author will discuss the four main approaches (of face detection), which include  </w:t>
+      </w:r>
+      <w:r>
+        <w:rPr>
+          <w:b w:val="false"/>
+          <w:bCs w:val="false"/>
+          <w:sz w:val="24"/>
+          <w:szCs w:val="24"/>
+          <w:shd w:fill="auto" w:val="clear"/>
+        </w:rPr>
+        <w:t>feature-based methods</w:t>
+      </w:r>
+      <w:r>
+        <w:rPr>
+          <w:b w:val="false"/>
+          <w:bCs w:val="false"/>
+          <w:sz w:val="24"/>
+          <w:szCs w:val="24"/>
+        </w:rPr>
+        <w:t xml:space="preserve">, </w:t>
+      </w:r>
+      <w:r>
+        <w:rPr>
+          <w:b w:val="false"/>
+          <w:bCs w:val="false"/>
+          <w:sz w:val="24"/>
+          <w:szCs w:val="24"/>
+          <w:shd w:fill="auto" w:val="clear"/>
+        </w:rPr>
+        <w:t>template-based methods</w:t>
+      </w:r>
+      <w:r>
+        <w:rPr>
+          <w:b w:val="false"/>
+          <w:bCs w:val="false"/>
+          <w:sz w:val="24"/>
+          <w:szCs w:val="24"/>
+        </w:rPr>
+        <w:t xml:space="preserve">, </w:t>
+      </w:r>
+      <w:r>
+        <w:rPr>
+          <w:b w:val="false"/>
+          <w:bCs w:val="false"/>
+          <w:sz w:val="24"/>
+          <w:szCs w:val="24"/>
+          <w:shd w:fill="auto" w:val="clear"/>
+        </w:rPr>
+        <w:t>appearance-based methods</w:t>
+      </w:r>
+      <w:r>
+        <w:rPr>
+          <w:b w:val="false"/>
+          <w:bCs w:val="false"/>
+          <w:sz w:val="24"/>
+          <w:szCs w:val="24"/>
+        </w:rPr>
+        <w:t xml:space="preserve">, and </w:t>
+      </w:r>
+      <w:r>
+        <w:rPr>
+          <w:b w:val="false"/>
+          <w:bCs w:val="false"/>
+          <w:sz w:val="24"/>
+          <w:szCs w:val="24"/>
+          <w:shd w:fill="auto" w:val="clear"/>
+        </w:rPr>
+        <w:t>knowledge-based</w:t>
+      </w:r>
+      <w:r>
+        <w:rPr>
+          <w:b w:val="false"/>
+          <w:bCs w:val="false"/>
+          <w:sz w:val="24"/>
+          <w:szCs w:val="24"/>
+        </w:rPr>
+        <w:t xml:space="preserve"> methods.</w:t>
       </w:r>
     </w:p>
     <w:p>
@@ -3610,34 +3701,7 @@
           <w:sz w:val="28"/>
           <w:szCs w:val="28"/>
         </w:rPr>
-        <w:t>2.</w:t>
-      </w:r>
-      <w:r>
-        <w:rPr>
-          <w:b/>
-          <w:bCs/>
-          <w:sz w:val="28"/>
-          <w:szCs w:val="28"/>
-        </w:rPr>
-        <w:t>3.</w:t>
-      </w:r>
-      <w:r>
-        <w:rPr>
-          <w:b/>
-          <w:bCs/>
-          <w:sz w:val="28"/>
-          <w:szCs w:val="28"/>
-        </w:rPr>
-        <w:t>2.1</w:t>
-      </w:r>
-      <w:r>
-        <w:rPr>
-          <w:b/>
-          <w:bCs/>
-          <w:sz w:val="28"/>
-          <w:szCs w:val="28"/>
-        </w:rPr>
-        <w:t xml:space="preserve"> The </w:t>
+        <w:t xml:space="preserve">2.3.2.1 The </w:t>
       </w:r>
       <w:r>
         <w:rPr>
@@ -3657,16 +3721,7 @@
           <w:sz w:val="28"/>
           <w:szCs w:val="28"/>
         </w:rPr>
-        <w:t>Geometric Approach of Fac</w:t>
-      </w:r>
-      <w:r>
-        <w:rPr>
-          <w:b/>
-          <w:bCs/>
-          <w:sz w:val="28"/>
-          <w:szCs w:val="28"/>
-        </w:rPr>
-        <w:t>e Detection</w:t>
+        <w:t>Geometric Approach of Face Detection</w:t>
       </w:r>
     </w:p>
     <w:p>
@@ -3795,80 +3850,27 @@
           <w:sz w:val="28"/>
           <w:szCs w:val="28"/>
         </w:rPr>
-        <w:t xml:space="preserve">2.4.2 The </w:t>
-      </w:r>
-      <w:r>
-        <w:rPr>
-          <w:b/>
-          <w:bCs/>
-          <w:i w:val="false"/>
-          <w:iCs w:val="false"/>
-          <w:sz w:val="28"/>
-          <w:szCs w:val="28"/>
-        </w:rPr>
-        <w:t>Appearance Based</w:t>
-      </w:r>
-      <w:r>
-        <w:rPr>
-          <w:b/>
-          <w:bCs/>
-          <w:i w:val="false"/>
-          <w:iCs w:val="false"/>
-          <w:sz w:val="28"/>
-          <w:szCs w:val="28"/>
-        </w:rPr>
-        <w:t xml:space="preserve"> Approach of Facial </w:t>
-      </w:r>
-      <w:r>
-        <w:rPr>
-          <w:b/>
-          <w:bCs/>
-          <w:i w:val="false"/>
-          <w:iCs w:val="false"/>
-          <w:sz w:val="28"/>
-          <w:szCs w:val="28"/>
-        </w:rPr>
-        <w:t>Detection</w:t>
-      </w:r>
-    </w:p>
-    <w:p>
-      <w:pPr>
-        <w:pStyle w:val="Normal"/>
-        <w:bidi w:val="0"/>
-        <w:spacing w:lineRule="auto" w:line="480"/>
-        <w:jc w:val="left"/>
-        <w:rPr>
-          <w:sz w:val="24"/>
-          <w:szCs w:val="24"/>
-        </w:rPr>
-      </w:pPr>
-      <w:r>
-        <w:rPr>
-          <w:sz w:val="24"/>
-          <w:szCs w:val="24"/>
-        </w:rPr>
-        <w:tab/>
-      </w:r>
-      <w:r>
-        <w:rPr>
-          <w:sz w:val="24"/>
-          <w:szCs w:val="24"/>
-        </w:rPr>
-        <w:t xml:space="preserve">The idea behind using Appearance methods for face detection relies on the linear algebra concept of subspaces. What is a subspace in linear algebra? </w:t>
-      </w:r>
-      <w:r>
-        <w:rPr>
-          <w:sz w:val="24"/>
-          <w:szCs w:val="24"/>
-        </w:rPr>
-        <w:t xml:space="preserve">A  subspace of a vector space V is a subset H of V that has the following three </w:t>
-      </w:r>
-      <w:r>
-        <w:rPr>
-          <w:sz w:val="24"/>
-          <w:szCs w:val="24"/>
-        </w:rPr>
-        <w:t>properties:</w:t>
+        <w:t>2.4.2 The Appearance Based Approach of Facial Detection</w:t>
+      </w:r>
+    </w:p>
+    <w:p>
+      <w:pPr>
+        <w:pStyle w:val="Normal"/>
+        <w:bidi w:val="0"/>
+        <w:spacing w:lineRule="auto" w:line="480"/>
+        <w:jc w:val="left"/>
+        <w:rPr>
+          <w:sz w:val="24"/>
+          <w:szCs w:val="24"/>
+        </w:rPr>
+      </w:pPr>
+      <w:r>
+        <w:rPr>
+          <w:sz w:val="24"/>
+          <w:szCs w:val="24"/>
+        </w:rPr>
+        <w:tab/>
+        <w:t>The idea behind using Appearance methods for face detection relies on the linear algebra concept of subspaces. What is a subspace in linear algebra? A  subspace of a vector space V is a subset H of V that has the following three properties:</w:t>
       </w:r>
     </w:p>
     <w:p>
@@ -3876,7 +3878,7 @@
         <w:pStyle w:val="Normal"/>
         <w:numPr>
           <w:ilvl w:val="0"/>
-          <w:numId w:val="3"/>
+          <w:numId w:val="2"/>
         </w:numPr>
         <w:bidi w:val="0"/>
         <w:spacing w:lineRule="auto" w:line="480"/>
@@ -3899,7 +3901,7 @@
         <w:pStyle w:val="Normal"/>
         <w:numPr>
           <w:ilvl w:val="0"/>
-          <w:numId w:val="3"/>
+          <w:numId w:val="2"/>
         </w:numPr>
         <w:bidi w:val="0"/>
         <w:spacing w:lineRule="auto" w:line="480"/>
@@ -3922,7 +3924,7 @@
         <w:pStyle w:val="Normal"/>
         <w:numPr>
           <w:ilvl w:val="0"/>
-          <w:numId w:val="3"/>
+          <w:numId w:val="2"/>
         </w:numPr>
         <w:bidi w:val="0"/>
         <w:spacing w:lineRule="auto" w:line="480"/>
@@ -3956,24 +3958,117 @@
           <w:sz w:val="24"/>
           <w:szCs w:val="24"/>
         </w:rPr>
-      </w:r>
-    </w:p>
-    <w:p>
-      <w:pPr>
-        <w:pStyle w:val="Normal"/>
-        <w:bidi w:val="0"/>
-        <w:spacing w:lineRule="auto" w:line="480"/>
-        <w:jc w:val="left"/>
-        <w:rPr>
-          <w:sz w:val="24"/>
-          <w:szCs w:val="24"/>
-        </w:rPr>
-      </w:pPr>
-      <w:r>
-        <w:rPr>
-          <w:sz w:val="24"/>
-          <w:szCs w:val="24"/>
-        </w:rPr>
+        <w:t xml:space="preserve">Having defined a subspace, it is vital to point out that unlike the template matching algorithm, the appearance based method detects a face taking into the account the entire face. As evidenced, </w:t>
+      </w:r>
+      <w:r>
+        <w:rPr>
+          <w:sz w:val="24"/>
+          <w:szCs w:val="24"/>
+        </w:rPr>
+        <w:t xml:space="preserve">Viegas, et al, (2019) mentions that the entire face is used as a raw input. Simply put, an image is converted into a two dimensional data set before subjecting it into a subspace analysis to extract features that are later used to detect faces. Critical to the discussion is the fact that the resulting subspace is reduced dimensionally using dimensional reduction techniques such as </w:t>
+      </w:r>
+      <w:r>
+        <w:rPr>
+          <w:sz w:val="24"/>
+          <w:szCs w:val="24"/>
+        </w:rPr>
+        <w:t>principal components analysis, independent component analysis, linear discriminant analysis, and the kernel principal c</w:t>
+      </w:r>
+      <w:r>
+        <w:rPr>
+          <w:sz w:val="24"/>
+          <w:szCs w:val="24"/>
+        </w:rPr>
+        <w:t xml:space="preserve">omponent </w:t>
+      </w:r>
+      <w:r>
+        <w:rPr>
+          <w:sz w:val="24"/>
+          <w:szCs w:val="24"/>
+        </w:rPr>
+        <w:t>a</w:t>
+      </w:r>
+      <w:r>
+        <w:rPr>
+          <w:sz w:val="24"/>
+          <w:szCs w:val="24"/>
+        </w:rPr>
+        <w:t xml:space="preserve">nalysis. </w:t>
+      </w:r>
+    </w:p>
+    <w:p>
+      <w:pPr>
+        <w:pStyle w:val="Normal"/>
+        <w:bidi w:val="0"/>
+        <w:spacing w:lineRule="auto" w:line="480"/>
+        <w:jc w:val="left"/>
+        <w:rPr>
+          <w:sz w:val="24"/>
+          <w:szCs w:val="24"/>
+        </w:rPr>
+      </w:pPr>
+      <w:r>
+        <w:rPr>
+          <w:sz w:val="24"/>
+          <w:szCs w:val="24"/>
+        </w:rPr>
+        <w:tab/>
+      </w:r>
+      <w:r>
+        <w:rPr>
+          <w:sz w:val="24"/>
+          <w:szCs w:val="24"/>
+        </w:rPr>
+        <w:t xml:space="preserve">It is imperative to mention that several authors have investigated the appearance based method </w:t>
+      </w:r>
+      <w:r>
+        <w:rPr>
+          <w:sz w:val="24"/>
+          <w:szCs w:val="24"/>
+        </w:rPr>
+        <w:t>for</w:t>
+      </w:r>
+      <w:r>
+        <w:rPr>
+          <w:sz w:val="24"/>
+          <w:szCs w:val="24"/>
+        </w:rPr>
+        <w:t xml:space="preserve"> facial recognition. For instance, </w:t>
+      </w:r>
+      <w:r>
+        <w:rPr>
+          <w:sz w:val="24"/>
+          <w:szCs w:val="24"/>
+        </w:rPr>
+        <w:t xml:space="preserve">Struc and Pavesic (2009) examine the performance of appearance based methods subject to different environmental factors and conclude that the linear discriminant analysis produces the best results across different environmental conditions. </w:t>
+      </w:r>
+      <w:r>
+        <w:rPr>
+          <w:sz w:val="24"/>
+          <w:szCs w:val="24"/>
+        </w:rPr>
+        <w:t xml:space="preserve">Wu et al., (2018) also debate appearance based method of facial recognition by examining facial expressions using the technique in question. </w:t>
+      </w:r>
+      <w:r>
+        <w:rPr>
+          <w:sz w:val="24"/>
+          <w:szCs w:val="24"/>
+        </w:rPr>
+        <w:t xml:space="preserve">The authors controlled for lighting conditions using a histogram equalization technique and a brightness preserving technique and concluded that the brightness preserving technique performs better than the histogram equalization technique. It is also important to highlight that Broti (2019) also examine appearance based method of facial recognition by discussing the principal components analysis, independent component analysis, linear discriminant analysis methods used in facial recognition. A drawback for this method is that </w:t>
+      </w:r>
+      <w:r>
+        <w:rPr>
+          <w:sz w:val="24"/>
+          <w:szCs w:val="24"/>
+        </w:rPr>
+        <w:t xml:space="preserve">it is challenging to find out an efficient combination of </w:t>
+      </w:r>
+      <w:r>
+        <w:rPr>
+          <w:sz w:val="24"/>
+          <w:szCs w:val="24"/>
+        </w:rPr>
+        <w:t xml:space="preserve">dimensionality reduction technique and classifier. </w:t>
       </w:r>
     </w:p>
     <w:p>
@@ -4042,7 +4137,60 @@
           <w:sz w:val="24"/>
           <w:szCs w:val="24"/>
         </w:rPr>
-        <w:t xml:space="preserve">Ayo, F. M., Mustapha, M. A., Braimah, A. J., and Aina, A. D. (2021). Geometric Analysis and </w:t>
+        <w:t>Agrawal, A. K., Singh, N. Y. (2015). Evaluation of Face Recognition Methods in Unconstrained</w:t>
+      </w:r>
+    </w:p>
+    <w:p>
+      <w:pPr>
+        <w:pStyle w:val="Normal"/>
+        <w:bidi w:val="0"/>
+        <w:spacing w:lineRule="auto" w:line="480"/>
+        <w:jc w:val="left"/>
+        <w:rPr>
+          <w:b w:val="false"/>
+          <w:b w:val="false"/>
+          <w:bCs w:val="false"/>
+          <w:sz w:val="24"/>
+          <w:szCs w:val="24"/>
+        </w:rPr>
+      </w:pPr>
+      <w:r>
+        <w:rPr>
+          <w:b w:val="false"/>
+          <w:bCs w:val="false"/>
+          <w:sz w:val="24"/>
+          <w:szCs w:val="24"/>
+        </w:rPr>
+        <w:tab/>
+        <w:t xml:space="preserve">Environments. International Conference on Intelligent Computing, Communication &amp; </w:t>
+        <w:tab/>
+        <w:t xml:space="preserve">Convergence. Bhubaneswar, Odisha, India. </w:t>
+        <w:tab/>
+        <w:t>https://www.sciencedirect.com/science/article/pii/S1877050915006560</w:t>
+      </w:r>
+    </w:p>
+    <w:p>
+      <w:pPr>
+        <w:pStyle w:val="Normal"/>
+        <w:bidi w:val="0"/>
+        <w:spacing w:lineRule="auto" w:line="480"/>
+        <w:jc w:val="left"/>
+        <w:rPr>
+          <w:b w:val="false"/>
+          <w:b w:val="false"/>
+          <w:bCs w:val="false"/>
+          <w:sz w:val="24"/>
+          <w:szCs w:val="24"/>
+        </w:rPr>
+      </w:pPr>
+      <w:r>
+        <w:rPr>
+          <w:b w:val="false"/>
+          <w:bCs w:val="false"/>
+          <w:sz w:val="24"/>
+          <w:szCs w:val="24"/>
+        </w:rPr>
+        <w:t xml:space="preserve">Ayo, F. M., Mustapha, M. Procedia Computer Science 48 ( 2015 ) 644 – 651A., Braimah, A. J., and Aina, A. D. (2021). Geometric Analysis and </w:t>
       </w:r>
     </w:p>
     <w:p>
@@ -5602,6 +5750,105 @@
       </w:pPr>
       <w:r>
         <w:rPr>
+          <w:rStyle w:val="Quotation"/>
+          <w:b w:val="false"/>
+          <w:bCs w:val="false"/>
+          <w:i w:val="false"/>
+          <w:iCs w:val="false"/>
+          <w:sz w:val="24"/>
+          <w:szCs w:val="24"/>
+        </w:rPr>
+        <w:t>Saraswathi</w:t>
+      </w:r>
+      <w:r>
+        <w:rPr>
+          <w:rStyle w:val="Quotation"/>
+          <w:b w:val="false"/>
+          <w:bCs w:val="false"/>
+          <w:sz w:val="24"/>
+          <w:szCs w:val="24"/>
+        </w:rPr>
+        <w:t xml:space="preserve">, </w:t>
+      </w:r>
+      <w:r>
+        <w:rPr>
+          <w:rStyle w:val="Quotation"/>
+          <w:b w:val="false"/>
+          <w:bCs w:val="false"/>
+          <w:i w:val="false"/>
+          <w:iCs w:val="false"/>
+          <w:sz w:val="24"/>
+          <w:szCs w:val="24"/>
+        </w:rPr>
+        <w:t xml:space="preserve">S. (2017). Smartphone Usage Among Students. </w:t>
+      </w:r>
+      <w:r>
+        <w:rPr>
+          <w:rStyle w:val="Emphasis"/>
+          <w:b w:val="false"/>
+          <w:bCs w:val="false"/>
+          <w:sz w:val="24"/>
+          <w:szCs w:val="24"/>
+        </w:rPr>
+        <w:t xml:space="preserve">International Education and Research </w:t>
+      </w:r>
+    </w:p>
+    <w:p>
+      <w:pPr>
+        <w:pStyle w:val="Normal"/>
+        <w:bidi w:val="0"/>
+        <w:spacing w:lineRule="auto" w:line="480"/>
+        <w:jc w:val="left"/>
+        <w:rPr/>
+      </w:pPr>
+      <w:r>
+        <w:rPr>
+          <w:rStyle w:val="Emphasis"/>
+          <w:b w:val="false"/>
+          <w:bCs w:val="false"/>
+          <w:sz w:val="24"/>
+          <w:szCs w:val="24"/>
+        </w:rPr>
+        <w:tab/>
+        <w:t xml:space="preserve">Journal, </w:t>
+      </w:r>
+      <w:r>
+        <w:rPr>
+          <w:rStyle w:val="Emphasis"/>
+          <w:b w:val="false"/>
+          <w:bCs w:val="false"/>
+          <w:i w:val="false"/>
+          <w:iCs w:val="false"/>
+          <w:sz w:val="24"/>
+          <w:szCs w:val="24"/>
+        </w:rPr>
+        <w:t xml:space="preserve">3(6), 195-197. Retrieved from </w:t>
+        <w:tab/>
+        <w:t>https://www.academia.edu/45200359/s</w:t>
+      </w:r>
+      <w:r>
+        <w:rPr>
+          <w:rStyle w:val="Quotation"/>
+          <w:b w:val="false"/>
+          <w:bCs w:val="false"/>
+          <w:i w:val="false"/>
+          <w:iCs w:val="false"/>
+          <w:sz w:val="24"/>
+          <w:szCs w:val="24"/>
+        </w:rPr>
+        <w:t>martphone_usage_among_students</w:t>
+      </w:r>
+    </w:p>
+    <w:p>
+      <w:pPr>
+        <w:pStyle w:val="Normal"/>
+        <w:bidi w:val="0"/>
+        <w:spacing w:lineRule="auto" w:line="480"/>
+        <w:jc w:val="left"/>
+        <w:rPr/>
+      </w:pPr>
+      <w:r>
+        <w:rPr>
           <w:b w:val="false"/>
           <w:bCs w:val="false"/>
           <w:sz w:val="24"/>
@@ -5735,251 +5982,325 @@
           <w:sz w:val="24"/>
           <w:szCs w:val="24"/>
         </w:rPr>
-        <w:t>, 12(12) 256-463</w:t>
-      </w:r>
-    </w:p>
-    <w:p>
-      <w:pPr>
-        <w:pStyle w:val="Normal"/>
-        <w:bidi w:val="0"/>
-        <w:spacing w:lineRule="auto" w:line="480"/>
-        <w:jc w:val="left"/>
-        <w:rPr/>
-      </w:pPr>
-      <w:r>
-        <w:rPr>
-          <w:rStyle w:val="Quotation"/>
-          <w:b w:val="false"/>
-          <w:bCs w:val="false"/>
+        <w:t>, 12(12) 256-463.</w:t>
+      </w:r>
+    </w:p>
+    <w:p>
+      <w:pPr>
+        <w:pStyle w:val="Normal"/>
+        <w:bidi w:val="0"/>
+        <w:spacing w:lineRule="auto" w:line="480"/>
+        <w:jc w:val="left"/>
+        <w:rPr/>
+      </w:pPr>
+      <w:r>
+        <w:rPr>
+          <w:b w:val="false"/>
+          <w:bCs w:val="false"/>
+          <w:sz w:val="24"/>
+          <w:szCs w:val="24"/>
+        </w:rPr>
+        <w:t xml:space="preserve">Struc, v. and Pavesic, N. (2009). A Case Study on Appearance Based Feature Extraction Techniques </w:t>
+      </w:r>
+    </w:p>
+    <w:p>
+      <w:pPr>
+        <w:pStyle w:val="Normal"/>
+        <w:bidi w:val="0"/>
+        <w:spacing w:lineRule="auto" w:line="480"/>
+        <w:jc w:val="left"/>
+        <w:rPr/>
+      </w:pPr>
+      <w:r>
+        <w:rPr>
+          <w:b w:val="false"/>
+          <w:bCs w:val="false"/>
+          <w:sz w:val="24"/>
+          <w:szCs w:val="24"/>
+        </w:rPr>
+        <w:tab/>
+        <w:t>and Their Susceptibility to Image Degradations for The Task of Face Recognition. W</w:t>
+      </w:r>
+      <w:r>
+        <w:rPr>
+          <w:b w:val="false"/>
+          <w:bCs w:val="false"/>
+          <w:i/>
+          <w:iCs/>
+          <w:sz w:val="24"/>
+          <w:szCs w:val="24"/>
+        </w:rPr>
+        <w:t xml:space="preserve">orld </w:t>
+        <w:tab/>
+        <w:t>Academy of Science, Engineering and Technology,</w:t>
+      </w:r>
+      <w:r>
+        <w:rPr>
+          <w:b w:val="false"/>
+          <w:bCs w:val="false"/>
+          <w:sz w:val="24"/>
+          <w:szCs w:val="24"/>
+        </w:rPr>
+        <w:t xml:space="preserve"> 30(2009): 806-814.</w:t>
+      </w:r>
+    </w:p>
+    <w:p>
+      <w:pPr>
+        <w:pStyle w:val="Normal"/>
+        <w:bidi w:val="0"/>
+        <w:spacing w:lineRule="auto" w:line="480"/>
+        <w:jc w:val="left"/>
+        <w:rPr>
+          <w:b w:val="false"/>
+          <w:b w:val="false"/>
+          <w:bCs w:val="false"/>
+          <w:sz w:val="24"/>
+          <w:szCs w:val="24"/>
+        </w:rPr>
+      </w:pPr>
+      <w:r>
+        <w:rPr>
+          <w:b w:val="false"/>
+          <w:bCs w:val="false"/>
+          <w:sz w:val="24"/>
+          <w:szCs w:val="24"/>
+        </w:rPr>
+        <w:t xml:space="preserve">The United Nations. (2021). Technology and Innovation Report 2021. Retrieved from </w:t>
+      </w:r>
+    </w:p>
+    <w:p>
+      <w:pPr>
+        <w:pStyle w:val="Normal"/>
+        <w:bidi w:val="0"/>
+        <w:spacing w:lineRule="auto" w:line="480"/>
+        <w:jc w:val="left"/>
+        <w:rPr>
+          <w:b w:val="false"/>
+          <w:b w:val="false"/>
+          <w:bCs w:val="false"/>
+          <w:sz w:val="24"/>
+          <w:szCs w:val="24"/>
+        </w:rPr>
+      </w:pPr>
+      <w:r>
+        <w:rPr>
+          <w:b w:val="false"/>
+          <w:bCs w:val="false"/>
+          <w:sz w:val="24"/>
+          <w:szCs w:val="24"/>
+        </w:rPr>
+        <w:tab/>
+        <w:t>https://unctad.org/system/files/official-document/tir2020_en.pdf</w:t>
+      </w:r>
+    </w:p>
+    <w:p>
+      <w:pPr>
+        <w:pStyle w:val="Normal"/>
+        <w:bidi w:val="0"/>
+        <w:spacing w:lineRule="auto" w:line="480"/>
+        <w:jc w:val="left"/>
+        <w:rPr>
+          <w:b w:val="false"/>
+          <w:b w:val="false"/>
+          <w:bCs w:val="false"/>
+          <w:sz w:val="24"/>
+          <w:szCs w:val="24"/>
+        </w:rPr>
+      </w:pPr>
+      <w:r>
+        <w:rPr>
+          <w:b w:val="false"/>
+          <w:bCs w:val="false"/>
+          <w:sz w:val="24"/>
+          <w:szCs w:val="24"/>
+        </w:rPr>
+        <w:t xml:space="preserve">Vicario, G., and Coleman, S. (2018). A Review of Data Science in Business and Industry and a </w:t>
+      </w:r>
+    </w:p>
+    <w:p>
+      <w:pPr>
+        <w:pStyle w:val="Normal"/>
+        <w:bidi w:val="0"/>
+        <w:spacing w:lineRule="auto" w:line="480"/>
+        <w:jc w:val="left"/>
+        <w:rPr/>
+      </w:pPr>
+      <w:r>
+        <w:rPr>
+          <w:b w:val="false"/>
+          <w:bCs w:val="false"/>
+          <w:sz w:val="24"/>
+          <w:szCs w:val="24"/>
+        </w:rPr>
+        <w:tab/>
+        <w:t xml:space="preserve">Future Review. </w:t>
+      </w:r>
+      <w:r>
+        <w:rPr>
+          <w:i/>
+          <w:iCs/>
+        </w:rPr>
+        <w:t xml:space="preserve">Applied Stochastic Models in Business and Industry, </w:t>
+      </w:r>
+      <w:r>
+        <w:rPr>
           <w:i w:val="false"/>
           <w:iCs w:val="false"/>
-          <w:sz w:val="24"/>
-          <w:szCs w:val="24"/>
-        </w:rPr>
-        <w:t>Saraswathi</w:t>
-      </w:r>
-      <w:r>
-        <w:rPr>
-          <w:rStyle w:val="Quotation"/>
-          <w:b w:val="false"/>
-          <w:bCs w:val="false"/>
-          <w:sz w:val="24"/>
-          <w:szCs w:val="24"/>
-        </w:rPr>
-        <w:t xml:space="preserve">, </w:t>
-      </w:r>
-      <w:r>
-        <w:rPr>
-          <w:rStyle w:val="Quotation"/>
-          <w:b w:val="false"/>
-          <w:bCs w:val="false"/>
+        </w:rPr>
+        <w:t>36(1), 6-18</w:t>
+      </w:r>
+      <w:r>
+        <w:rPr>
+          <w:i/>
+          <w:iCs/>
+        </w:rPr>
+        <w:t xml:space="preserve">. </w:t>
+      </w:r>
+    </w:p>
+    <w:p>
+      <w:pPr>
+        <w:pStyle w:val="Normal"/>
+        <w:bidi w:val="0"/>
+        <w:spacing w:lineRule="auto" w:line="480"/>
+        <w:jc w:val="left"/>
+        <w:rPr/>
+      </w:pPr>
+      <w:r>
+        <w:rPr>
+          <w:i/>
+          <w:iCs/>
+        </w:rPr>
+        <w:tab/>
+      </w:r>
+      <w:r>
+        <w:rPr>
           <w:i w:val="false"/>
           <w:iCs w:val="false"/>
-          <w:sz w:val="24"/>
-          <w:szCs w:val="24"/>
-        </w:rPr>
-        <w:t xml:space="preserve">S. (2017). Smartphone Usage Among Students. </w:t>
-      </w:r>
-      <w:r>
-        <w:rPr>
-          <w:rStyle w:val="Emphasis"/>
-          <w:b w:val="false"/>
-          <w:bCs w:val="false"/>
-          <w:sz w:val="24"/>
-          <w:szCs w:val="24"/>
-        </w:rPr>
-        <w:t xml:space="preserve">International Education and Research </w:t>
-      </w:r>
-    </w:p>
-    <w:p>
-      <w:pPr>
-        <w:pStyle w:val="Normal"/>
-        <w:bidi w:val="0"/>
-        <w:spacing w:lineRule="auto" w:line="480"/>
-        <w:jc w:val="left"/>
-        <w:rPr/>
-      </w:pPr>
-      <w:r>
-        <w:rPr>
-          <w:rStyle w:val="Emphasis"/>
-          <w:b w:val="false"/>
-          <w:bCs w:val="false"/>
-          <w:sz w:val="24"/>
-          <w:szCs w:val="24"/>
-        </w:rPr>
-        <w:tab/>
-        <w:t xml:space="preserve">Journal, </w:t>
-      </w:r>
-      <w:r>
-        <w:rPr>
-          <w:rStyle w:val="Emphasis"/>
-          <w:b w:val="false"/>
-          <w:bCs w:val="false"/>
+        </w:rPr>
+        <w:t>https://doi</w:t>
+      </w:r>
+      <w:r>
+        <w:rPr>
           <w:i w:val="false"/>
           <w:iCs w:val="false"/>
           <w:sz w:val="24"/>
           <w:szCs w:val="24"/>
         </w:rPr>
-        <w:t xml:space="preserve">3(6), 195-197. Retrieved from </w:t>
-        <w:tab/>
-        <w:t>https://www.academia.edu/45200359/s</w:t>
-      </w:r>
-      <w:r>
-        <w:rPr>
-          <w:rStyle w:val="Quotation"/>
-          <w:b w:val="false"/>
-          <w:bCs w:val="false"/>
+        <w:t>:10.1002/asmb.2488</w:t>
+      </w:r>
+    </w:p>
+    <w:p>
+      <w:pPr>
+        <w:pStyle w:val="Normal"/>
+        <w:bidi w:val="0"/>
+        <w:spacing w:lineRule="auto" w:line="480"/>
+        <w:jc w:val="left"/>
+        <w:rPr/>
+      </w:pPr>
+      <w:r>
+        <w:rPr>
           <w:i w:val="false"/>
           <w:iCs w:val="false"/>
           <w:sz w:val="24"/>
           <w:szCs w:val="24"/>
         </w:rPr>
-        <w:t>martphone_usage_among_students</w:t>
-      </w:r>
-    </w:p>
-    <w:p>
-      <w:pPr>
-        <w:pStyle w:val="Normal"/>
-        <w:bidi w:val="0"/>
-        <w:spacing w:lineRule="auto" w:line="480"/>
-        <w:jc w:val="left"/>
-        <w:rPr>
-          <w:b w:val="false"/>
-          <w:b w:val="false"/>
-          <w:bCs w:val="false"/>
-          <w:sz w:val="24"/>
-          <w:szCs w:val="24"/>
-        </w:rPr>
-      </w:pPr>
-      <w:r>
-        <w:rPr>
-          <w:b w:val="false"/>
-          <w:bCs w:val="false"/>
-          <w:sz w:val="24"/>
-          <w:szCs w:val="24"/>
-        </w:rPr>
-        <w:t xml:space="preserve">The United Nations. (2021). Technology and Innovation Report 2021. Retrieved from </w:t>
-      </w:r>
-    </w:p>
-    <w:p>
-      <w:pPr>
-        <w:pStyle w:val="Normal"/>
-        <w:bidi w:val="0"/>
-        <w:spacing w:lineRule="auto" w:line="480"/>
-        <w:jc w:val="left"/>
-        <w:rPr>
-          <w:b w:val="false"/>
-          <w:b w:val="false"/>
-          <w:bCs w:val="false"/>
-          <w:sz w:val="24"/>
-          <w:szCs w:val="24"/>
-        </w:rPr>
-      </w:pPr>
-      <w:r>
-        <w:rPr>
-          <w:b w:val="false"/>
-          <w:bCs w:val="false"/>
-          <w:sz w:val="24"/>
-          <w:szCs w:val="24"/>
-        </w:rPr>
-        <w:tab/>
-        <w:t>https://unctad.org/system/files/official-document/tir2020_en.pdf</w:t>
-      </w:r>
-    </w:p>
-    <w:p>
-      <w:pPr>
-        <w:pStyle w:val="Normal"/>
-        <w:bidi w:val="0"/>
-        <w:spacing w:lineRule="auto" w:line="480"/>
-        <w:jc w:val="left"/>
-        <w:rPr>
-          <w:b w:val="false"/>
-          <w:b w:val="false"/>
-          <w:bCs w:val="false"/>
-          <w:sz w:val="24"/>
-          <w:szCs w:val="24"/>
-        </w:rPr>
-      </w:pPr>
-      <w:r>
-        <w:rPr>
-          <w:b w:val="false"/>
-          <w:bCs w:val="false"/>
-          <w:sz w:val="24"/>
-          <w:szCs w:val="24"/>
-        </w:rPr>
-        <w:t xml:space="preserve">Vicario, G., and Coleman, S. (2018). A Review of Data Science in Business and Industry and a </w:t>
-      </w:r>
-    </w:p>
-    <w:p>
-      <w:pPr>
-        <w:pStyle w:val="Normal"/>
-        <w:bidi w:val="0"/>
-        <w:spacing w:lineRule="auto" w:line="480"/>
-        <w:jc w:val="left"/>
-        <w:rPr/>
-      </w:pPr>
-      <w:r>
-        <w:rPr>
-          <w:b w:val="false"/>
-          <w:bCs w:val="false"/>
-          <w:sz w:val="24"/>
-          <w:szCs w:val="24"/>
-        </w:rPr>
-        <w:tab/>
-        <w:t xml:space="preserve">Future Review. </w:t>
+        <w:t xml:space="preserve">Viegas, M. A., Simoes, R., Thanekar, N., Barnerjee, S., Dicholkar, R. (2019). Different Approaches </w:t>
+      </w:r>
+    </w:p>
+    <w:p>
+      <w:pPr>
+        <w:pStyle w:val="Normal"/>
+        <w:bidi w:val="0"/>
+        <w:spacing w:lineRule="auto" w:line="480"/>
+        <w:jc w:val="left"/>
+        <w:rPr/>
+      </w:pPr>
+      <w:r>
+        <w:rPr>
+          <w:i w:val="false"/>
+          <w:iCs w:val="false"/>
+          <w:sz w:val="24"/>
+          <w:szCs w:val="24"/>
+        </w:rPr>
+        <w:tab/>
+        <w:t>of Face Recognition. I</w:t>
       </w:r>
       <w:r>
         <w:rPr>
           <w:i/>
           <w:iCs/>
-        </w:rPr>
-        <w:t xml:space="preserve">Applied Stochastic Models in Business and Industry, </w:t>
+          <w:sz w:val="24"/>
+          <w:szCs w:val="24"/>
+        </w:rPr>
+        <w:t xml:space="preserve">nternational Journal of Engineering Research &amp; Technology, </w:t>
       </w:r>
       <w:r>
         <w:rPr>
           <w:i w:val="false"/>
           <w:iCs w:val="false"/>
-        </w:rPr>
-        <w:t>36(1), 6-18</w:t>
+          <w:sz w:val="24"/>
+          <w:szCs w:val="24"/>
+        </w:rPr>
+        <w:t xml:space="preserve">8(6): </w:t>
+        <w:tab/>
+        <w:t xml:space="preserve">933-934. </w:t>
+      </w:r>
+    </w:p>
+    <w:p>
+      <w:pPr>
+        <w:pStyle w:val="Normal"/>
+        <w:bidi w:val="0"/>
+        <w:spacing w:lineRule="auto" w:line="480"/>
+        <w:jc w:val="left"/>
+        <w:rPr/>
+      </w:pPr>
+      <w:r>
+        <w:rPr>
+          <w:i w:val="false"/>
+          <w:iCs w:val="false"/>
+          <w:sz w:val="24"/>
+          <w:szCs w:val="24"/>
+        </w:rPr>
+        <w:t xml:space="preserve">Wu, Z., Xiamixiding, R. Sjjanhar, A., Chen, J., and Wen, Q. (2018). Image Appearance-Based </w:t>
+      </w:r>
+    </w:p>
+    <w:p>
+      <w:pPr>
+        <w:pStyle w:val="Normal"/>
+        <w:bidi w:val="0"/>
+        <w:spacing w:lineRule="auto" w:line="480"/>
+        <w:jc w:val="left"/>
+        <w:rPr/>
+      </w:pPr>
+      <w:r>
+        <w:rPr>
+          <w:i w:val="false"/>
+          <w:iCs w:val="false"/>
+          <w:sz w:val="24"/>
+          <w:szCs w:val="24"/>
+        </w:rPr>
+        <w:tab/>
+        <w:t xml:space="preserve">Facial Expression Recognition. </w:t>
       </w:r>
       <w:r>
         <w:rPr>
           <w:i/>
           <w:iCs/>
-        </w:rPr>
-        <w:t xml:space="preserve">. </w:t>
-      </w:r>
-    </w:p>
-    <w:p>
-      <w:pPr>
-        <w:pStyle w:val="Normal"/>
-        <w:bidi w:val="0"/>
-        <w:spacing w:lineRule="auto" w:line="480"/>
-        <w:jc w:val="left"/>
-        <w:rPr/>
-      </w:pPr>
-      <w:r>
-        <w:rPr>
-          <w:i/>
-          <w:iCs/>
-        </w:rPr>
-        <w:tab/>
+          <w:sz w:val="24"/>
+          <w:szCs w:val="24"/>
+        </w:rPr>
+        <w:t>International Journal of Image and Graphics</w:t>
       </w:r>
       <w:r>
         <w:rPr>
           <w:i w:val="false"/>
           <w:iCs w:val="false"/>
-        </w:rPr>
-        <w:t>https://doi</w:t>
-      </w:r>
-      <w:r>
-        <w:rPr>
-          <w:i w:val="false"/>
-          <w:iCs w:val="false"/>
-          <w:sz w:val="24"/>
-          <w:szCs w:val="24"/>
-        </w:rPr>
-        <w:t>:10.1002/asmb.2488</w:t>
+          <w:sz w:val="24"/>
+          <w:szCs w:val="24"/>
+        </w:rPr>
+        <w:t xml:space="preserve"> 18(2): 1 -12. </w:t>
+        <w:tab/>
+        <w:t>http://doi: 10.1142/S0219467818500122</w:t>
       </w:r>
     </w:p>
     <w:p>
@@ -6069,120 +6390,120 @@
   <w:abstractNum w:abstractNumId="1">
     <w:lvl w:ilvl="0">
       <w:start w:val="1"/>
-      <w:numFmt w:val="none"/>
-      <w:suff w:val="nothing"/>
-      <w:lvlText w:val="%1"/>
+      <w:numFmt w:val="decimal"/>
+      <w:lvlText w:val="%1."/>
       <w:lvlJc w:val="left"/>
       <w:pPr>
         <w:tabs>
-          <w:tab w:val="num" w:pos="0"/>
+          <w:tab w:val="num" w:pos="720"/>
         </w:tabs>
-        <w:ind w:left="0" w:hanging="0"/>
-      </w:pPr>
+        <w:ind w:left="720" w:hanging="360"/>
+      </w:pPr>
+      <w:rPr/>
     </w:lvl>
     <w:lvl w:ilvl="1">
       <w:start w:val="1"/>
-      <w:numFmt w:val="none"/>
-      <w:suff w:val="nothing"/>
-      <w:lvlText w:val="%2"/>
+      <w:numFmt w:val="decimal"/>
+      <w:lvlText w:val="%2."/>
       <w:lvlJc w:val="left"/>
       <w:pPr>
         <w:tabs>
-          <w:tab w:val="num" w:pos="0"/>
+          <w:tab w:val="num" w:pos="1080"/>
         </w:tabs>
-        <w:ind w:left="0" w:hanging="0"/>
-      </w:pPr>
+        <w:ind w:left="1080" w:hanging="360"/>
+      </w:pPr>
+      <w:rPr/>
     </w:lvl>
     <w:lvl w:ilvl="2">
       <w:start w:val="1"/>
-      <w:numFmt w:val="none"/>
-      <w:suff w:val="nothing"/>
-      <w:lvlText w:val="%3"/>
+      <w:numFmt w:val="decimal"/>
+      <w:lvlText w:val="%3."/>
       <w:lvlJc w:val="left"/>
       <w:pPr>
         <w:tabs>
-          <w:tab w:val="num" w:pos="0"/>
+          <w:tab w:val="num" w:pos="1440"/>
         </w:tabs>
-        <w:ind w:left="0" w:hanging="0"/>
-      </w:pPr>
+        <w:ind w:left="1440" w:hanging="360"/>
+      </w:pPr>
+      <w:rPr/>
     </w:lvl>
     <w:lvl w:ilvl="3">
       <w:start w:val="1"/>
-      <w:numFmt w:val="none"/>
-      <w:suff w:val="nothing"/>
-      <w:lvlText w:val="%4"/>
+      <w:numFmt w:val="decimal"/>
+      <w:lvlText w:val="%4."/>
       <w:lvlJc w:val="left"/>
       <w:pPr>
         <w:tabs>
-          <w:tab w:val="num" w:pos="0"/>
+          <w:tab w:val="num" w:pos="1800"/>
         </w:tabs>
-        <w:ind w:left="0" w:hanging="0"/>
-      </w:pPr>
+        <w:ind w:left="1800" w:hanging="360"/>
+      </w:pPr>
+      <w:rPr/>
     </w:lvl>
     <w:lvl w:ilvl="4">
       <w:start w:val="1"/>
-      <w:numFmt w:val="none"/>
-      <w:suff w:val="nothing"/>
-      <w:lvlText w:val="%5"/>
+      <w:numFmt w:val="decimal"/>
+      <w:lvlText w:val="%5."/>
       <w:lvlJc w:val="left"/>
       <w:pPr>
         <w:tabs>
-          <w:tab w:val="num" w:pos="0"/>
+          <w:tab w:val="num" w:pos="2160"/>
         </w:tabs>
-        <w:ind w:left="0" w:hanging="0"/>
-      </w:pPr>
+        <w:ind w:left="2160" w:hanging="360"/>
+      </w:pPr>
+      <w:rPr/>
     </w:lvl>
     <w:lvl w:ilvl="5">
       <w:start w:val="1"/>
-      <w:numFmt w:val="none"/>
-      <w:suff w:val="nothing"/>
-      <w:lvlText w:val="%6"/>
+      <w:numFmt w:val="decimal"/>
+      <w:lvlText w:val="%6."/>
       <w:lvlJc w:val="left"/>
       <w:pPr>
         <w:tabs>
-          <w:tab w:val="num" w:pos="0"/>
+          <w:tab w:val="num" w:pos="2520"/>
         </w:tabs>
-        <w:ind w:left="0" w:hanging="0"/>
-      </w:pPr>
+        <w:ind w:left="2520" w:hanging="360"/>
+      </w:pPr>
+      <w:rPr/>
     </w:lvl>
     <w:lvl w:ilvl="6">
       <w:start w:val="1"/>
-      <w:numFmt w:val="none"/>
-      <w:suff w:val="nothing"/>
-      <w:lvlText w:val="%7"/>
+      <w:numFmt w:val="decimal"/>
+      <w:lvlText w:val="%7."/>
       <w:lvlJc w:val="left"/>
       <w:pPr>
         <w:tabs>
-          <w:tab w:val="num" w:pos="0"/>
+          <w:tab w:val="num" w:pos="2880"/>
         </w:tabs>
-        <w:ind w:left="0" w:hanging="0"/>
-      </w:pPr>
+        <w:ind w:left="2880" w:hanging="360"/>
+      </w:pPr>
+      <w:rPr/>
     </w:lvl>
     <w:lvl w:ilvl="7">
       <w:start w:val="1"/>
-      <w:numFmt w:val="none"/>
-      <w:suff w:val="nothing"/>
-      <w:lvlText w:val="%8"/>
+      <w:numFmt w:val="decimal"/>
+      <w:lvlText w:val="%8."/>
       <w:lvlJc w:val="left"/>
       <w:pPr>
         <w:tabs>
-          <w:tab w:val="num" w:pos="0"/>
+          <w:tab w:val="num" w:pos="3240"/>
         </w:tabs>
-        <w:ind w:left="0" w:hanging="0"/>
-      </w:pPr>
+        <w:ind w:left="3240" w:hanging="360"/>
+      </w:pPr>
+      <w:rPr/>
     </w:lvl>
     <w:lvl w:ilvl="8">
       <w:start w:val="1"/>
-      <w:numFmt w:val="none"/>
-      <w:suff w:val="nothing"/>
-      <w:lvlText w:val="%9"/>
+      <w:numFmt w:val="decimal"/>
+      <w:lvlText w:val="%9."/>
       <w:lvlJc w:val="left"/>
       <w:pPr>
         <w:tabs>
-          <w:tab w:val="num" w:pos="0"/>
+          <w:tab w:val="num" w:pos="3600"/>
         </w:tabs>
-        <w:ind w:left="0" w:hanging="0"/>
-      </w:pPr>
+        <w:ind w:left="3600" w:hanging="360"/>
+      </w:pPr>
+      <w:rPr/>
     </w:lvl>
   </w:abstractNum>
   <w:abstractNum w:abstractNumId="2">
@@ -6307,110 +6628,119 @@
   <w:abstractNum w:abstractNumId="3">
     <w:lvl w:ilvl="0">
       <w:start w:val="1"/>
-      <w:numFmt w:val="decimal"/>
-      <w:lvlText w:val="%1."/>
+      <w:numFmt w:val="none"/>
+      <w:suff w:val="nothing"/>
+      <w:lvlText w:val=""/>
       <w:lvlJc w:val="left"/>
       <w:pPr>
         <w:tabs>
-          <w:tab w:val="num" w:pos="720"/>
+          <w:tab w:val="num" w:pos="0"/>
         </w:tabs>
-        <w:ind w:left="720" w:hanging="360"/>
+        <w:ind w:left="0" w:hanging="0"/>
       </w:pPr>
     </w:lvl>
     <w:lvl w:ilvl="1">
       <w:start w:val="1"/>
-      <w:numFmt w:val="decimal"/>
-      <w:lvlText w:val="%2."/>
+      <w:numFmt w:val="none"/>
+      <w:suff w:val="nothing"/>
+      <w:lvlText w:val=""/>
       <w:lvlJc w:val="left"/>
       <w:pPr>
         <w:tabs>
-          <w:tab w:val="num" w:pos="1080"/>
+          <w:tab w:val="num" w:pos="0"/>
         </w:tabs>
-        <w:ind w:left="1080" w:hanging="360"/>
+        <w:ind w:left="0" w:hanging="0"/>
       </w:pPr>
     </w:lvl>
     <w:lvl w:ilvl="2">
       <w:start w:val="1"/>
-      <w:numFmt w:val="decimal"/>
-      <w:lvlText w:val="%3."/>
+      <w:numFmt w:val="none"/>
+      <w:suff w:val="nothing"/>
+      <w:lvlText w:val=""/>
       <w:lvlJc w:val="left"/>
       <w:pPr>
         <w:tabs>
-          <w:tab w:val="num" w:pos="1440"/>
+          <w:tab w:val="num" w:pos="0"/>
         </w:tabs>
-        <w:ind w:left="1440" w:hanging="360"/>
+        <w:ind w:left="0" w:hanging="0"/>
       </w:pPr>
     </w:lvl>
     <w:lvl w:ilvl="3">
       <w:start w:val="1"/>
-      <w:numFmt w:val="decimal"/>
-      <w:lvlText w:val="%4."/>
+      <w:numFmt w:val="none"/>
+      <w:suff w:val="nothing"/>
+      <w:lvlText w:val=""/>
       <w:lvlJc w:val="left"/>
       <w:pPr>
         <w:tabs>
-          <w:tab w:val="num" w:pos="1800"/>
+          <w:tab w:val="num" w:pos="0"/>
         </w:tabs>
-        <w:ind w:left="1800" w:hanging="360"/>
+        <w:ind w:left="0" w:hanging="0"/>
       </w:pPr>
     </w:lvl>
     <w:lvl w:ilvl="4">
       <w:start w:val="1"/>
-      <w:numFmt w:val="decimal"/>
-      <w:lvlText w:val="%5."/>
+      <w:numFmt w:val="none"/>
+      <w:suff w:val="nothing"/>
+      <w:lvlText w:val=""/>
       <w:lvlJc w:val="left"/>
       <w:pPr>
         <w:tabs>
-          <w:tab w:val="num" w:pos="2160"/>
+          <w:tab w:val="num" w:pos="0"/>
         </w:tabs>
-        <w:ind w:left="2160" w:hanging="360"/>
+        <w:ind w:left="0" w:hanging="0"/>
       </w:pPr>
     </w:lvl>
     <w:lvl w:ilvl="5">
       <w:start w:val="1"/>
-      <w:numFmt w:val="decimal"/>
-      <w:lvlText w:val="%6."/>
+      <w:numFmt w:val="none"/>
+      <w:suff w:val="nothing"/>
+      <w:lvlText w:val=""/>
       <w:lvlJc w:val="left"/>
       <w:pPr>
         <w:tabs>
-          <w:tab w:val="num" w:pos="2520"/>
+          <w:tab w:val="num" w:pos="0"/>
         </w:tabs>
-        <w:ind w:left="2520" w:hanging="360"/>
+        <w:ind w:left="0" w:hanging="0"/>
       </w:pPr>
     </w:lvl>
     <w:lvl w:ilvl="6">
       <w:start w:val="1"/>
-      <w:numFmt w:val="decimal"/>
-      <w:lvlText w:val="%7."/>
+      <w:numFmt w:val="none"/>
+      <w:suff w:val="nothing"/>
+      <w:lvlText w:val=""/>
       <w:lvlJc w:val="left"/>
       <w:pPr>
         <w:tabs>
-          <w:tab w:val="num" w:pos="2880"/>
+          <w:tab w:val="num" w:pos="0"/>
         </w:tabs>
-        <w:ind w:left="2880" w:hanging="360"/>
+        <w:ind w:left="0" w:hanging="0"/>
       </w:pPr>
     </w:lvl>
     <w:lvl w:ilvl="7">
       <w:start w:val="1"/>
-      <w:numFmt w:val="decimal"/>
-      <w:lvlText w:val="%8."/>
+      <w:numFmt w:val="none"/>
+      <w:suff w:val="nothing"/>
+      <w:lvlText w:val=""/>
       <w:lvlJc w:val="left"/>
       <w:pPr>
         <w:tabs>
-          <w:tab w:val="num" w:pos="3240"/>
+          <w:tab w:val="num" w:pos="0"/>
         </w:tabs>
-        <w:ind w:left="3240" w:hanging="360"/>
+        <w:ind w:left="0" w:hanging="0"/>
       </w:pPr>
     </w:lvl>
     <w:lvl w:ilvl="8">
       <w:start w:val="1"/>
-      <w:numFmt w:val="decimal"/>
-      <w:lvlText w:val="%9."/>
+      <w:numFmt w:val="none"/>
+      <w:suff w:val="nothing"/>
+      <w:lvlText w:val=""/>
       <w:lvlJc w:val="left"/>
       <w:pPr>
         <w:tabs>
-          <w:tab w:val="num" w:pos="3600"/>
+          <w:tab w:val="num" w:pos="0"/>
         </w:tabs>
-        <w:ind w:left="3600" w:hanging="360"/>
+        <w:ind w:left="0" w:hanging="0"/>
       </w:pPr>
     </w:lvl>
   </w:abstractNum>
@@ -6450,9 +6780,7 @@
     <w:pPr>
       <w:widowControl/>
       <w:suppressAutoHyphens w:val="true"/>
-      <w:kinsoku w:val="true"/>
-      <w:overflowPunct w:val="true"/>
-      <w:autoSpaceDE w:val="true"/>
+      <w:overflowPunct w:val="false"/>
       <w:bidi w:val="0"/>
       <w:spacing w:before="0" w:after="0"/>
       <w:jc w:val="left"/>

</xml_diff>

<commit_message>
Identify difference between face detection and face recognition
</commit_message>
<xml_diff>
--- a/SikoliaThesis.docx
+++ b/SikoliaThesis.docx
@@ -3364,7 +3364,16 @@
           <w:szCs w:val="24"/>
           <w:shd w:fill="auto" w:val="clear"/>
         </w:rPr>
-        <w:t xml:space="preserve"> </w:t>
+        <w:t xml:space="preserve"> neural networks approach</w:t>
+      </w:r>
+      <w:r>
+        <w:rPr>
+          <w:b w:val="false"/>
+          <w:bCs w:val="false"/>
+          <w:sz w:val="24"/>
+          <w:szCs w:val="24"/>
+        </w:rPr>
+        <w:t xml:space="preserve"> as some of the techniques that could be used for face detection. In a different paper, Bose and Bandyopadhyay (2020) mentions four methods used for face detection. These methods include </w:t>
       </w:r>
       <w:r>
         <w:rPr>
@@ -3374,16 +3383,16 @@
           <w:szCs w:val="24"/>
           <w:shd w:fill="auto" w:val="clear"/>
         </w:rPr>
-        <w:t>neural networks approach</w:t>
-      </w:r>
-      <w:r>
-        <w:rPr>
-          <w:b w:val="false"/>
-          <w:bCs w:val="false"/>
-          <w:sz w:val="24"/>
-          <w:szCs w:val="24"/>
-        </w:rPr>
-        <w:t xml:space="preserve"> as some of the techniques that could be used for face detection. In a different paper, Bose and Bandyopadhyay (2020) mentions four methods used for face detection. These methods include </w:t>
+        <w:t>feature-based methods</w:t>
+      </w:r>
+      <w:r>
+        <w:rPr>
+          <w:b w:val="false"/>
+          <w:bCs w:val="false"/>
+          <w:sz w:val="24"/>
+          <w:szCs w:val="24"/>
+        </w:rPr>
+        <w:t xml:space="preserve">, </w:t>
       </w:r>
       <w:r>
         <w:rPr>
@@ -3393,6 +3402,82 @@
           <w:szCs w:val="24"/>
           <w:shd w:fill="auto" w:val="clear"/>
         </w:rPr>
+        <w:t>template-based methods</w:t>
+      </w:r>
+      <w:r>
+        <w:rPr>
+          <w:b w:val="false"/>
+          <w:bCs w:val="false"/>
+          <w:sz w:val="24"/>
+          <w:szCs w:val="24"/>
+        </w:rPr>
+        <w:t xml:space="preserve">, </w:t>
+      </w:r>
+      <w:r>
+        <w:rPr>
+          <w:b w:val="false"/>
+          <w:bCs w:val="false"/>
+          <w:sz w:val="24"/>
+          <w:szCs w:val="24"/>
+          <w:shd w:fill="auto" w:val="clear"/>
+        </w:rPr>
+        <w:t>appearance-based methods</w:t>
+      </w:r>
+      <w:r>
+        <w:rPr>
+          <w:b w:val="false"/>
+          <w:bCs w:val="false"/>
+          <w:sz w:val="24"/>
+          <w:szCs w:val="24"/>
+        </w:rPr>
+        <w:t xml:space="preserve">, and </w:t>
+      </w:r>
+      <w:r>
+        <w:rPr>
+          <w:b w:val="false"/>
+          <w:bCs w:val="false"/>
+          <w:sz w:val="24"/>
+          <w:szCs w:val="24"/>
+          <w:shd w:fill="auto" w:val="clear"/>
+        </w:rPr>
+        <w:t>knowledge-based</w:t>
+      </w:r>
+      <w:r>
+        <w:rPr>
+          <w:b w:val="false"/>
+          <w:bCs w:val="false"/>
+          <w:sz w:val="24"/>
+          <w:szCs w:val="24"/>
+        </w:rPr>
+        <w:t xml:space="preserve"> methods. Even though Bose and Bandyopadhyay (2020) mention four methods that could be used for facial recognition, they used the template based method in their research citing that template matching is the best available solution for face detection.</w:t>
+      </w:r>
+    </w:p>
+    <w:p>
+      <w:pPr>
+        <w:pStyle w:val="Normal"/>
+        <w:bidi w:val="0"/>
+        <w:spacing w:lineRule="auto" w:line="480"/>
+        <w:jc w:val="left"/>
+        <w:rPr/>
+      </w:pPr>
+      <w:r>
+        <w:rPr>
+          <w:b w:val="false"/>
+          <w:bCs w:val="false"/>
+          <w:sz w:val="24"/>
+          <w:szCs w:val="24"/>
+        </w:rPr>
+        <w:tab/>
+        <w:t xml:space="preserve">Pertinent literature on the subject of facial recognition indicates that the aforementioned techniques could be used for solving problems on facial recognition. However, a deep dive into the methods reveals that the main of methods used in facial recognition include  </w:t>
+      </w:r>
+      <w:r>
+        <w:rPr>
+          <w:b w:val="false"/>
+          <w:bCs w:val="false"/>
+          <w:sz w:val="24"/>
+          <w:szCs w:val="24"/>
+          <w:shd w:fill="auto" w:val="clear"/>
+        </w:rPr>
         <w:t>feature-based methods</w:t>
       </w:r>
       <w:r>
@@ -3459,155 +3544,7 @@
           <w:sz w:val="24"/>
           <w:szCs w:val="24"/>
         </w:rPr>
-        <w:t xml:space="preserve"> methods. Even though Bose and Bandyopadhyay (2020) mention four methods that could be used for facial recognition, they used the template based method in their research citing that template matching is the best available solution for face detection.</w:t>
-      </w:r>
-    </w:p>
-    <w:p>
-      <w:pPr>
-        <w:pStyle w:val="Normal"/>
-        <w:bidi w:val="0"/>
-        <w:spacing w:lineRule="auto" w:line="480"/>
-        <w:jc w:val="left"/>
-        <w:rPr/>
-      </w:pPr>
-      <w:r>
-        <w:rPr>
-          <w:b w:val="false"/>
-          <w:bCs w:val="false"/>
-          <w:sz w:val="24"/>
-          <w:szCs w:val="24"/>
-        </w:rPr>
-        <w:tab/>
-      </w:r>
-      <w:r>
-        <w:rPr>
-          <w:b w:val="false"/>
-          <w:bCs w:val="false"/>
-          <w:sz w:val="24"/>
-          <w:szCs w:val="24"/>
-        </w:rPr>
-        <w:t xml:space="preserve">Pertinent literature on the subject of facial recognition indicates that the aforementioned techniques </w:t>
-      </w:r>
-      <w:r>
-        <w:rPr>
-          <w:b w:val="false"/>
-          <w:bCs w:val="false"/>
-          <w:sz w:val="24"/>
-          <w:szCs w:val="24"/>
-        </w:rPr>
-        <w:t xml:space="preserve">could be used for solving problems on facial recognition. However, a deep dive into the methods reveals that the main of methods used in facial recognition include  </w:t>
-      </w:r>
-      <w:r>
-        <w:rPr>
-          <w:b w:val="false"/>
-          <w:bCs w:val="false"/>
-          <w:sz w:val="24"/>
-          <w:szCs w:val="24"/>
-          <w:shd w:fill="auto" w:val="clear"/>
-        </w:rPr>
-        <w:t>feature-based methods</w:t>
-      </w:r>
-      <w:r>
-        <w:rPr>
-          <w:b w:val="false"/>
-          <w:bCs w:val="false"/>
-          <w:sz w:val="24"/>
-          <w:szCs w:val="24"/>
-        </w:rPr>
-        <w:t xml:space="preserve">, </w:t>
-      </w:r>
-      <w:r>
-        <w:rPr>
-          <w:b w:val="false"/>
-          <w:bCs w:val="false"/>
-          <w:sz w:val="24"/>
-          <w:szCs w:val="24"/>
-          <w:shd w:fill="auto" w:val="clear"/>
-        </w:rPr>
-        <w:t>template-based methods</w:t>
-      </w:r>
-      <w:r>
-        <w:rPr>
-          <w:b w:val="false"/>
-          <w:bCs w:val="false"/>
-          <w:sz w:val="24"/>
-          <w:szCs w:val="24"/>
-        </w:rPr>
-        <w:t xml:space="preserve">, </w:t>
-      </w:r>
-      <w:r>
-        <w:rPr>
-          <w:b w:val="false"/>
-          <w:bCs w:val="false"/>
-          <w:sz w:val="24"/>
-          <w:szCs w:val="24"/>
-          <w:shd w:fill="auto" w:val="clear"/>
-        </w:rPr>
-        <w:t>appearance-based methods</w:t>
-      </w:r>
-      <w:r>
-        <w:rPr>
-          <w:b w:val="false"/>
-          <w:bCs w:val="false"/>
-          <w:sz w:val="24"/>
-          <w:szCs w:val="24"/>
-        </w:rPr>
-        <w:t xml:space="preserve">, and </w:t>
-      </w:r>
-      <w:r>
-        <w:rPr>
-          <w:b w:val="false"/>
-          <w:bCs w:val="false"/>
-          <w:sz w:val="24"/>
-          <w:szCs w:val="24"/>
-          <w:shd w:fill="auto" w:val="clear"/>
-        </w:rPr>
-        <w:t>knowledge-based</w:t>
-      </w:r>
-      <w:r>
-        <w:rPr>
-          <w:b w:val="false"/>
-          <w:bCs w:val="false"/>
-          <w:sz w:val="24"/>
-          <w:szCs w:val="24"/>
-        </w:rPr>
-        <w:t xml:space="preserve"> methods. For example, </w:t>
-      </w:r>
-      <w:r>
-        <w:rPr>
-          <w:b w:val="false"/>
-          <w:bCs w:val="false"/>
-          <w:sz w:val="24"/>
-          <w:szCs w:val="24"/>
-        </w:rPr>
-        <w:t xml:space="preserve">the model based, statistical and neural network approaches all refer to the same method (statistical approach) yet different authors used different names to refer to the </w:t>
-      </w:r>
-      <w:r>
-        <w:rPr>
-          <w:b w:val="false"/>
-          <w:bCs w:val="false"/>
-          <w:sz w:val="24"/>
-          <w:szCs w:val="24"/>
-        </w:rPr>
-        <w:t xml:space="preserve">same  </w:t>
-      </w:r>
-      <w:r>
-        <w:rPr>
-          <w:b w:val="false"/>
-          <w:bCs w:val="false"/>
-          <w:sz w:val="24"/>
-          <w:szCs w:val="24"/>
-        </w:rPr>
-        <w:t xml:space="preserve">approach. </w:t>
-      </w:r>
-      <w:r>
-        <w:rPr>
-          <w:b w:val="false"/>
-          <w:bCs w:val="false"/>
-          <w:sz w:val="24"/>
-          <w:szCs w:val="24"/>
-        </w:rPr>
-        <w:t xml:space="preserve">This is supported by the reality that Agrawal and Singh (2015) mentions that statistical methods are usually applied in the  appearance based method of facial recognition. Similarly, the same methodology is applied on the template matching and geometric method implying that these two methods of face detection refer to the same technique. It follows that the author will discuss the four main approaches (of face detection), which include  </w:t>
+        <w:t xml:space="preserve"> methods. For example, the model based, statistical and neural network approaches all refer to the same method (statistical approach) yet different authors used different names to refer to the same  approach. This is supported by the reality that Agrawal and Singh (2015) mentions that statistical methods are usually applied in the  appearance based method of facial recognition. Similarly, the same methodology is applied on the template matching and geometric method implying that these two methods of face detection refer to the same technique. It follows that the author will discuss the four main approaches (of face detection), which include  </w:t>
       </w:r>
       <w:r>
         <w:rPr>
@@ -3712,7 +3649,7 @@
           <w:sz w:val="28"/>
           <w:szCs w:val="28"/>
         </w:rPr>
-        <w:t>Template Based/</w:t>
+        <w:t>Template Based</w:t>
       </w:r>
       <w:r>
         <w:rPr>
@@ -3721,7 +3658,7 @@
           <w:sz w:val="28"/>
           <w:szCs w:val="28"/>
         </w:rPr>
-        <w:t>Geometric Approach of Face Detection</w:t>
+        <w:t xml:space="preserve"> Approach of Face Detection</w:t>
       </w:r>
     </w:p>
     <w:p>
@@ -3958,135 +3895,120 @@
           <w:sz w:val="24"/>
           <w:szCs w:val="24"/>
         </w:rPr>
-        <w:t xml:space="preserve">Having defined a subspace, it is vital to point out that unlike the template matching algorithm, the appearance based method detects a face taking into the account the entire face. As evidenced, </w:t>
-      </w:r>
-      <w:r>
-        <w:rPr>
-          <w:sz w:val="24"/>
-          <w:szCs w:val="24"/>
-        </w:rPr>
-        <w:t xml:space="preserve">Viegas, et al, (2019) mentions that the entire face is used as a raw input. Simply put, an image is converted into a two dimensional data set before subjecting it into a subspace analysis to extract features that are later used to detect faces. Critical to the discussion is the fact that the resulting subspace is reduced dimensionally using dimensional reduction techniques such as </w:t>
-      </w:r>
-      <w:r>
-        <w:rPr>
-          <w:sz w:val="24"/>
-          <w:szCs w:val="24"/>
-        </w:rPr>
-        <w:t>principal components analysis, independent component analysis, linear discriminant analysis, and the kernel principal c</w:t>
-      </w:r>
-      <w:r>
-        <w:rPr>
-          <w:sz w:val="24"/>
-          <w:szCs w:val="24"/>
-        </w:rPr>
-        <w:t xml:space="preserve">omponent </w:t>
-      </w:r>
-      <w:r>
-        <w:rPr>
-          <w:sz w:val="24"/>
-          <w:szCs w:val="24"/>
-        </w:rPr>
-        <w:t>a</w:t>
-      </w:r>
-      <w:r>
-        <w:rPr>
-          <w:sz w:val="24"/>
-          <w:szCs w:val="24"/>
-        </w:rPr>
-        <w:t xml:space="preserve">nalysis. </w:t>
-      </w:r>
-    </w:p>
-    <w:p>
-      <w:pPr>
-        <w:pStyle w:val="Normal"/>
-        <w:bidi w:val="0"/>
-        <w:spacing w:lineRule="auto" w:line="480"/>
-        <w:jc w:val="left"/>
-        <w:rPr>
-          <w:sz w:val="24"/>
-          <w:szCs w:val="24"/>
-        </w:rPr>
-      </w:pPr>
-      <w:r>
-        <w:rPr>
-          <w:sz w:val="24"/>
-          <w:szCs w:val="24"/>
-        </w:rPr>
-        <w:tab/>
-      </w:r>
-      <w:r>
-        <w:rPr>
-          <w:sz w:val="24"/>
-          <w:szCs w:val="24"/>
-        </w:rPr>
-        <w:t xml:space="preserve">It is imperative to mention that several authors have investigated the appearance based method </w:t>
-      </w:r>
-      <w:r>
-        <w:rPr>
-          <w:sz w:val="24"/>
-          <w:szCs w:val="24"/>
-        </w:rPr>
-        <w:t>for</w:t>
-      </w:r>
-      <w:r>
-        <w:rPr>
-          <w:sz w:val="24"/>
-          <w:szCs w:val="24"/>
-        </w:rPr>
-        <w:t xml:space="preserve"> facial recognition. For instance, </w:t>
-      </w:r>
-      <w:r>
-        <w:rPr>
-          <w:sz w:val="24"/>
-          <w:szCs w:val="24"/>
-        </w:rPr>
-        <w:t xml:space="preserve">Struc and Pavesic (2009) examine the performance of appearance based methods subject to different environmental factors and conclude that the linear discriminant analysis produces the best results across different environmental conditions. </w:t>
-      </w:r>
-      <w:r>
-        <w:rPr>
-          <w:sz w:val="24"/>
-          <w:szCs w:val="24"/>
-        </w:rPr>
-        <w:t xml:space="preserve">Wu et al., (2018) also debate appearance based method of facial recognition by examining facial expressions using the technique in question. </w:t>
-      </w:r>
-      <w:r>
-        <w:rPr>
-          <w:sz w:val="24"/>
-          <w:szCs w:val="24"/>
-        </w:rPr>
-        <w:t xml:space="preserve">The authors controlled for lighting conditions using a histogram equalization technique and a brightness preserving technique and concluded that the brightness preserving technique performs better than the histogram equalization technique. It is also important to highlight that Broti (2019) also examine appearance based method of facial recognition by discussing the principal components analysis, independent component analysis, linear discriminant analysis methods used in facial recognition. A drawback for this method is that </w:t>
-      </w:r>
-      <w:r>
-        <w:rPr>
-          <w:sz w:val="24"/>
-          <w:szCs w:val="24"/>
-        </w:rPr>
-        <w:t xml:space="preserve">it is challenging to find out an efficient combination of </w:t>
-      </w:r>
-      <w:r>
-        <w:rPr>
-          <w:sz w:val="24"/>
-          <w:szCs w:val="24"/>
-        </w:rPr>
-        <w:t xml:space="preserve">dimensionality reduction technique and classifier. </w:t>
-      </w:r>
-    </w:p>
-    <w:p>
-      <w:pPr>
-        <w:pStyle w:val="Normal"/>
-        <w:bidi w:val="0"/>
-        <w:spacing w:lineRule="auto" w:line="480"/>
-        <w:jc w:val="left"/>
-        <w:rPr>
-          <w:sz w:val="24"/>
-          <w:szCs w:val="24"/>
-        </w:rPr>
-      </w:pPr>
-      <w:r>
-        <w:rPr>
-          <w:sz w:val="24"/>
-          <w:szCs w:val="24"/>
-        </w:rPr>
+        <w:t xml:space="preserve">Having defined a subspace, it is vital to point out that unlike the template matching algorithm, the appearance based method detects a face taking into the account the entire face. As evidenced, Viegas, et al, (2019) mentions that the entire face is used as a raw input. Simply put, an image is converted into a two dimensional data set before subjecting it into a subspace analysis to extract features that are later used to detect faces. Critical to the discussion is the fact that the resulting subspace is reduced dimensionally using dimensional reduction techniques such as principal components analysis, independent component analysis, linear discriminant analysis, and the kernel principal component analysis. </w:t>
+      </w:r>
+    </w:p>
+    <w:p>
+      <w:pPr>
+        <w:pStyle w:val="Normal"/>
+        <w:bidi w:val="0"/>
+        <w:spacing w:lineRule="auto" w:line="480"/>
+        <w:jc w:val="left"/>
+        <w:rPr>
+          <w:sz w:val="24"/>
+          <w:szCs w:val="24"/>
+        </w:rPr>
+      </w:pPr>
+      <w:r>
+        <w:rPr>
+          <w:sz w:val="24"/>
+          <w:szCs w:val="24"/>
+        </w:rPr>
+        <w:tab/>
+        <w:t xml:space="preserve">It is imperative to mention that several authors have investigated the appearance based method for facial recognition. For instance, Struc and Pavesic (2009) examine the performance of appearance based methods subject to different environmental factors and conclude that the linear discriminant analysis produces the best results across different environmental conditions. Wu et al., (2018) also debate appearance based method of facial recognition by examining facial expressions using the technique in question. The authors controlled for lighting conditions using a histogram equalization technique and a brightness preserving technique and concluded that the brightness preserving technique performs better than the histogram equalization technique. It is also important to highlight that Broti (2019) also examine appearance based method of facial recognition by discussing the principal components analysis, independent component analysis, linear discriminant analysis methods used in facial recognition. A drawback for this method is that it is challenging to find out an efficient combination of dimensionality reduction technique and classifier. </w:t>
+      </w:r>
+    </w:p>
+    <w:p>
+      <w:pPr>
+        <w:pStyle w:val="Normal"/>
+        <w:bidi w:val="0"/>
+        <w:spacing w:lineRule="auto" w:line="480"/>
+        <w:jc w:val="left"/>
+        <w:rPr>
+          <w:sz w:val="24"/>
+          <w:szCs w:val="24"/>
+        </w:rPr>
+      </w:pPr>
+      <w:r>
+        <w:rPr>
+          <w:sz w:val="24"/>
+          <w:szCs w:val="24"/>
+        </w:rPr>
+      </w:r>
+    </w:p>
+    <w:p>
+      <w:pPr>
+        <w:pStyle w:val="Normal"/>
+        <w:bidi w:val="0"/>
+        <w:spacing w:lineRule="auto" w:line="480"/>
+        <w:jc w:val="left"/>
+        <w:rPr>
+          <w:sz w:val="24"/>
+          <w:szCs w:val="24"/>
+        </w:rPr>
+      </w:pPr>
+      <w:r>
+        <w:rPr>
+          <w:sz w:val="24"/>
+          <w:szCs w:val="24"/>
+        </w:rPr>
+      </w:r>
+    </w:p>
+    <w:p>
+      <w:pPr>
+        <w:pStyle w:val="Normal"/>
+        <w:bidi w:val="0"/>
+        <w:spacing w:lineRule="auto" w:line="480"/>
+        <w:jc w:val="left"/>
+        <w:rPr>
+          <w:sz w:val="24"/>
+          <w:szCs w:val="24"/>
+        </w:rPr>
+      </w:pPr>
+      <w:r>
+        <w:rPr>
+          <w:sz w:val="24"/>
+          <w:szCs w:val="24"/>
+        </w:rPr>
+        <w:t>The moment of truth: Face Recognition Algorithms</w:t>
+      </w:r>
+    </w:p>
+    <w:p>
+      <w:pPr>
+        <w:pStyle w:val="Normal"/>
+        <w:bidi w:val="0"/>
+        <w:spacing w:lineRule="auto" w:line="480"/>
+        <w:jc w:val="left"/>
+        <w:rPr>
+          <w:sz w:val="24"/>
+          <w:szCs w:val="24"/>
+        </w:rPr>
+      </w:pPr>
+      <w:r>
+        <w:rPr>
+          <w:sz w:val="24"/>
+          <w:szCs w:val="24"/>
+        </w:rPr>
+        <w:t>Proyecto Fin de Carrera</w:t>
+      </w:r>
+    </w:p>
+    <w:p>
+      <w:pPr>
+        <w:pStyle w:val="Normal"/>
+        <w:bidi w:val="0"/>
+        <w:spacing w:lineRule="auto" w:line="480"/>
+        <w:jc w:val="left"/>
+        <w:rPr>
+          <w:sz w:val="24"/>
+          <w:szCs w:val="24"/>
+        </w:rPr>
+      </w:pPr>
+      <w:r>
+        <w:rPr>
+          <w:sz w:val="24"/>
+          <w:szCs w:val="24"/>
+        </w:rPr>
+        <w:t>June 16, 2010</w:t>
       </w:r>
       <w:r>
         <w:br w:type="page"/>
@@ -4162,9 +4084,29 @@
           <w:szCs w:val="24"/>
         </w:rPr>
         <w:tab/>
-        <w:t xml:space="preserve">Environments. International Conference on Intelligent Computing, Communication &amp; </w:t>
-        <w:tab/>
-        <w:t xml:space="preserve">Convergence. Bhubaneswar, Odisha, India. </w:t>
+        <w:t xml:space="preserve">Environments. </w:t>
+      </w:r>
+      <w:r>
+        <w:rPr>
+          <w:b w:val="false"/>
+          <w:bCs w:val="false"/>
+          <w:i/>
+          <w:iCs/>
+          <w:sz w:val="24"/>
+          <w:szCs w:val="24"/>
+        </w:rPr>
+        <w:t xml:space="preserve">International Conference on Intelligent Computing, Communication &amp; </w:t>
+        <w:tab/>
+        <w:t>Convergence</w:t>
+      </w:r>
+      <w:r>
+        <w:rPr>
+          <w:b w:val="false"/>
+          <w:bCs w:val="false"/>
+          <w:sz w:val="24"/>
+          <w:szCs w:val="24"/>
+        </w:rPr>
+        <w:t xml:space="preserve">. Bhubaneswar, Odisha, India. </w:t>
         <w:tab/>
         <w:t>https://www.sciencedirect.com/science/article/pii/S1877050915006560</w:t>
       </w:r>
@@ -4190,7 +4132,7 @@
           <w:sz w:val="24"/>
           <w:szCs w:val="24"/>
         </w:rPr>
-        <w:t xml:space="preserve">Ayo, F. M., Mustapha, M. Procedia Computer Science 48 ( 2015 ) 644 – 651A., Braimah, A. J., and Aina, A. D. (2021). Geometric Analysis and </w:t>
+        <w:t xml:space="preserve">Ayo, F. M., Mustapha, M., Braimah, A. J., and Aina, A. D. (2021). Geometric Analysis and </w:t>
       </w:r>
     </w:p>
     <w:p>
@@ -6780,7 +6722,7 @@
     <w:pPr>
       <w:widowControl/>
       <w:suppressAutoHyphens w:val="true"/>
-      <w:overflowPunct w:val="false"/>
+      <w:overflowPunct w:val="true"/>
       <w:bidi w:val="0"/>
       <w:spacing w:before="0" w:after="0"/>
       <w:jc w:val="left"/>

</xml_diff>

<commit_message>
start working on neural networks
</commit_message>
<xml_diff>
--- a/SikoliaThesis.docx
+++ b/SikoliaThesis.docx
@@ -3572,7 +3572,25 @@
           <w:sz w:val="32"/>
           <w:szCs w:val="32"/>
         </w:rPr>
-        <w:t>2.3 Face Detection</w:t>
+        <w:t>2.</w:t>
+      </w:r>
+      <w:r>
+        <w:rPr>
+          <w:b/>
+          <w:bCs/>
+          <w:sz w:val="32"/>
+          <w:szCs w:val="32"/>
+        </w:rPr>
+        <w:t>2.1</w:t>
+      </w:r>
+      <w:r>
+        <w:rPr>
+          <w:b/>
+          <w:bCs/>
+          <w:sz w:val="32"/>
+          <w:szCs w:val="32"/>
+        </w:rPr>
+        <w:t xml:space="preserve"> Face Detection</w:t>
       </w:r>
     </w:p>
     <w:p>
@@ -3674,7 +3692,43 @@
           <w:sz w:val="28"/>
           <w:szCs w:val="28"/>
         </w:rPr>
-        <w:t>2.3.1 Challenges in Face Detection</w:t>
+        <w:t>2.</w:t>
+      </w:r>
+      <w:r>
+        <w:rPr>
+          <w:b/>
+          <w:bCs/>
+          <w:sz w:val="28"/>
+          <w:szCs w:val="28"/>
+        </w:rPr>
+        <w:t>2</w:t>
+      </w:r>
+      <w:r>
+        <w:rPr>
+          <w:b/>
+          <w:bCs/>
+          <w:sz w:val="28"/>
+          <w:szCs w:val="28"/>
+        </w:rPr>
+        <w:t>.1.</w:t>
+      </w:r>
+      <w:r>
+        <w:rPr>
+          <w:b/>
+          <w:bCs/>
+          <w:sz w:val="28"/>
+          <w:szCs w:val="28"/>
+        </w:rPr>
+        <w:t>1</w:t>
+      </w:r>
+      <w:r>
+        <w:rPr>
+          <w:b/>
+          <w:bCs/>
+          <w:sz w:val="28"/>
+          <w:szCs w:val="28"/>
+        </w:rPr>
+        <w:t xml:space="preserve"> Challenges in Face Detection</w:t>
       </w:r>
     </w:p>
     <w:p>
@@ -3851,7 +3905,43 @@
           <w:sz w:val="32"/>
           <w:szCs w:val="32"/>
         </w:rPr>
-        <w:t>2.3.2 Face Detection Approaches</w:t>
+        <w:t>2.</w:t>
+      </w:r>
+      <w:r>
+        <w:rPr>
+          <w:b/>
+          <w:bCs/>
+          <w:sz w:val="32"/>
+          <w:szCs w:val="32"/>
+        </w:rPr>
+        <w:t>2</w:t>
+      </w:r>
+      <w:r>
+        <w:rPr>
+          <w:b/>
+          <w:bCs/>
+          <w:sz w:val="32"/>
+          <w:szCs w:val="32"/>
+        </w:rPr>
+        <w:t>.</w:t>
+      </w:r>
+      <w:r>
+        <w:rPr>
+          <w:b/>
+          <w:bCs/>
+          <w:sz w:val="32"/>
+          <w:szCs w:val="32"/>
+        </w:rPr>
+        <w:t>2</w:t>
+      </w:r>
+      <w:r>
+        <w:rPr>
+          <w:b/>
+          <w:bCs/>
+          <w:sz w:val="32"/>
+          <w:szCs w:val="32"/>
+        </w:rPr>
+        <w:t xml:space="preserve"> Face Detection Approaches</w:t>
       </w:r>
     </w:p>
     <w:p>
@@ -3875,48 +3965,17 @@
           <w:sz w:val="28"/>
           <w:szCs w:val="28"/>
         </w:rPr>
-        <w:t>2.3.2.1 Knowledge Based Methods of Facial Detection</w:t>
-      </w:r>
-    </w:p>
-    <w:p>
-      <w:pPr>
-        <w:pStyle w:val="Normal"/>
-        <w:bidi w:val="0"/>
-        <w:spacing w:lineRule="auto" w:line="480"/>
-        <w:jc w:val="left"/>
-        <w:rPr>
-          <w:b w:val="false"/>
-          <w:b w:val="false"/>
-          <w:bCs w:val="false"/>
-          <w:sz w:val="24"/>
-          <w:szCs w:val="24"/>
-        </w:rPr>
-      </w:pPr>
-      <w:r>
-        <w:rPr>
-          <w:b w:val="false"/>
-          <w:bCs w:val="false"/>
-          <w:sz w:val="24"/>
-          <w:szCs w:val="24"/>
-        </w:rPr>
-        <w:tab/>
-        <w:t>This method relies on a set of rules to detect whether there is a human face in an a image. The method captures the human knowledge of faces and interprets the knowledge into a set of rules. For instance, the face has two symmetric eyes, the eye ares is darker than the cheeks, the distance between eyes, and the difference in colors between the eyes and cheeks. It is notable that using the knowledge base method for face detection could be difficult because it is difficult to develop a set of rules that can correctly identify a human face. This owes to the fact that there could be very many false positives if the  rules are to general. Likewise, There could be many false negatives if the rules are too strict. This drawback has hampered researcher from using this technique. However, Chen et al., (2001) used the knowledge based method to detect faces in an image with an accuracy of 94%.</w:t>
-      </w:r>
-    </w:p>
-    <w:p>
-      <w:pPr>
-        <w:pStyle w:val="Normal"/>
-        <w:bidi w:val="0"/>
-        <w:spacing w:lineRule="auto" w:line="480"/>
-        <w:jc w:val="left"/>
-        <w:rPr>
-          <w:b/>
+        <w:t>2.</w:t>
+      </w:r>
+      <w:r>
+        <w:rPr>
           <w:b/>
           <w:bCs/>
           <w:sz w:val="28"/>
           <w:szCs w:val="28"/>
         </w:rPr>
-      </w:pPr>
+        <w:t>2</w:t>
+      </w:r>
       <w:r>
         <w:rPr>
           <w:b/>
@@ -3924,60 +3983,145 @@
           <w:sz w:val="28"/>
           <w:szCs w:val="28"/>
         </w:rPr>
-        <w:t>2.3.2.2 The Feature Invariant Approach of Face Detection</w:t>
-      </w:r>
-    </w:p>
-    <w:p>
-      <w:pPr>
-        <w:pStyle w:val="Normal"/>
-        <w:bidi w:val="0"/>
-        <w:spacing w:lineRule="auto" w:line="480"/>
-        <w:jc w:val="left"/>
-        <w:rPr>
-          <w:b w:val="false"/>
-          <w:b w:val="false"/>
-          <w:bCs w:val="false"/>
-          <w:sz w:val="24"/>
-          <w:szCs w:val="24"/>
-        </w:rPr>
-      </w:pPr>
-      <w:r>
-        <w:rPr>
-          <w:b w:val="false"/>
-          <w:bCs w:val="false"/>
-          <w:sz w:val="24"/>
-          <w:szCs w:val="24"/>
-        </w:rPr>
-        <w:tab/>
-        <w:t xml:space="preserve">The feature invariant method of face detection is a little bit different from the knowledge based method because it uses statistical methods on facial landmarks. Celiktutan, Ulukaya,  and Sankur (2013) </w:t>
-      </w:r>
-      <w:r>
-        <w:rPr>
-          <w:b w:val="false"/>
-          <w:bCs w:val="false"/>
-          <w:sz w:val="24"/>
-          <w:szCs w:val="24"/>
-          <w:shd w:fill="auto" w:val="clear"/>
-        </w:rPr>
-        <w:t>define a face landmark as a prominent feature that can play a discriminative role or can serve as anchor points in face detection. Examples of such landmarks include the eye corners, the nose tip, the nostril corners, the mouth corners, the end points of the eyebrow arcs, ear lobes, and chin. This approach works by detecting facial landmarks, texture and skin color before using a statistical model to identify the presence of a face in an image. Critical to the discussion is the reality that different authors have used the feature invariant approach for face detection. For instance, Kapil and Jain (2013) compared texture based to the structure and shape based feature invariant based methods and concluded that the texture based method is more accurate. However, the authors argue that feature invariant based methods are computationally expensive.</w:t>
-      </w:r>
-    </w:p>
-    <w:p>
-      <w:pPr>
-        <w:pStyle w:val="Normal"/>
-        <w:bidi w:val="0"/>
-        <w:spacing w:lineRule="auto" w:line="480"/>
-        <w:jc w:val="left"/>
-        <w:rPr/>
-      </w:pPr>
-      <w:r>
-        <w:rPr>
+        <w:t>.1 Knowledge Based Methods of Facial Detection</w:t>
+      </w:r>
+    </w:p>
+    <w:p>
+      <w:pPr>
+        <w:pStyle w:val="Normal"/>
+        <w:bidi w:val="0"/>
+        <w:spacing w:lineRule="auto" w:line="480"/>
+        <w:jc w:val="left"/>
+        <w:rPr>
+          <w:b w:val="false"/>
+          <w:b w:val="false"/>
+          <w:bCs w:val="false"/>
+          <w:sz w:val="24"/>
+          <w:szCs w:val="24"/>
+        </w:rPr>
+      </w:pPr>
+      <w:r>
+        <w:rPr>
+          <w:b w:val="false"/>
+          <w:bCs w:val="false"/>
+          <w:sz w:val="24"/>
+          <w:szCs w:val="24"/>
+        </w:rPr>
+        <w:tab/>
+        <w:t>This method relies on a set of rules to detect whether there is a human face in an a image. The method captures the human knowledge of faces and interprets the knowledge into a set of rules. For instance, the face has two symmetric eyes, the eye ares is darker than the cheeks, the distance between eyes, and the difference in colors between the eyes and cheeks. It is notable that using the knowledge base method for face detection could be difficult because it is difficult to develop a set of rules that can correctly identify a human face. This owes to the fact that there could be very many false positives if the  rules are to general. Likewise, There could be many false negatives if the rules are too strict. This drawback has hampered researcher from using this technique. However, Chen et al., (2001) used the knowledge based method to detect faces in an image with an accuracy of 94%.</w:t>
+      </w:r>
+    </w:p>
+    <w:p>
+      <w:pPr>
+        <w:pStyle w:val="Normal"/>
+        <w:bidi w:val="0"/>
+        <w:spacing w:lineRule="auto" w:line="480"/>
+        <w:jc w:val="left"/>
+        <w:rPr>
+          <w:b/>
           <w:b/>
           <w:bCs/>
           <w:sz w:val="28"/>
           <w:szCs w:val="28"/>
         </w:rPr>
-        <w:t xml:space="preserve">2.3.2.3 The </w:t>
+      </w:pPr>
+      <w:r>
+        <w:rPr>
+          <w:b/>
+          <w:bCs/>
+          <w:sz w:val="28"/>
+          <w:szCs w:val="28"/>
+        </w:rPr>
+        <w:t>2.</w:t>
+      </w:r>
+      <w:r>
+        <w:rPr>
+          <w:b/>
+          <w:bCs/>
+          <w:sz w:val="28"/>
+          <w:szCs w:val="28"/>
+        </w:rPr>
+        <w:t>2</w:t>
+      </w:r>
+      <w:r>
+        <w:rPr>
+          <w:b/>
+          <w:bCs/>
+          <w:sz w:val="28"/>
+          <w:szCs w:val="28"/>
+        </w:rPr>
+        <w:t>.2.2 The Feature Invariant Approach of Face Detection</w:t>
+      </w:r>
+    </w:p>
+    <w:p>
+      <w:pPr>
+        <w:pStyle w:val="Normal"/>
+        <w:bidi w:val="0"/>
+        <w:spacing w:lineRule="auto" w:line="480"/>
+        <w:jc w:val="left"/>
+        <w:rPr>
+          <w:b w:val="false"/>
+          <w:b w:val="false"/>
+          <w:bCs w:val="false"/>
+          <w:sz w:val="24"/>
+          <w:szCs w:val="24"/>
+        </w:rPr>
+      </w:pPr>
+      <w:r>
+        <w:rPr>
+          <w:b w:val="false"/>
+          <w:bCs w:val="false"/>
+          <w:sz w:val="24"/>
+          <w:szCs w:val="24"/>
+        </w:rPr>
+        <w:tab/>
+        <w:t xml:space="preserve">The feature invariant method of face detection is a little bit different from the knowledge based method because it uses statistical methods on facial landmarks. Celiktutan, Ulukaya,  and Sankur (2013) </w:t>
+      </w:r>
+      <w:r>
+        <w:rPr>
+          <w:b w:val="false"/>
+          <w:bCs w:val="false"/>
+          <w:sz w:val="24"/>
+          <w:szCs w:val="24"/>
+          <w:shd w:fill="auto" w:val="clear"/>
+        </w:rPr>
+        <w:t>define a face landmark as a prominent feature that can play a discriminative role or can serve as anchor points in face detection. Examples of such landmarks include the eye corners, the nose tip, the nostril corners, the mouth corners, the end points of the eyebrow arcs, ear lobes, and chin. This approach works by detecting facial landmarks, texture and skin color before using a statistical model to identify the presence of a face in an image. Critical to the discussion is the reality that different authors have used the feature invariant approach for face detection. For instance, Kapil and Jain (2013) compared texture based to the structure and shape based feature invariant based methods and concluded that the texture based method is more accurate. However, the authors argue that feature invariant based methods are computationally expensive.</w:t>
+      </w:r>
+    </w:p>
+    <w:p>
+      <w:pPr>
+        <w:pStyle w:val="Normal"/>
+        <w:bidi w:val="0"/>
+        <w:spacing w:lineRule="auto" w:line="480"/>
+        <w:jc w:val="left"/>
+        <w:rPr/>
+      </w:pPr>
+      <w:r>
+        <w:rPr>
+          <w:b/>
+          <w:bCs/>
+          <w:sz w:val="28"/>
+          <w:szCs w:val="28"/>
+        </w:rPr>
+        <w:t>2.</w:t>
+      </w:r>
+      <w:r>
+        <w:rPr>
+          <w:b/>
+          <w:bCs/>
+          <w:sz w:val="28"/>
+          <w:szCs w:val="28"/>
+        </w:rPr>
+        <w:t>2</w:t>
+      </w:r>
+      <w:r>
+        <w:rPr>
+          <w:b/>
+          <w:bCs/>
+          <w:sz w:val="28"/>
+          <w:szCs w:val="28"/>
+        </w:rPr>
+        <w:t xml:space="preserve">.2.3 The </w:t>
       </w:r>
       <w:r>
         <w:rPr>
@@ -4096,7 +4240,29 @@
           <w:sz w:val="28"/>
           <w:szCs w:val="28"/>
         </w:rPr>
-        <w:t>2.3.2.4 The Appearance Based Approach of Facial Detection</w:t>
+        <w:t>2.</w:t>
+      </w:r>
+      <w:r>
+        <w:rPr>
+          <w:b/>
+          <w:bCs/>
+          <w:i w:val="false"/>
+          <w:iCs w:val="false"/>
+          <w:sz w:val="28"/>
+          <w:szCs w:val="28"/>
+        </w:rPr>
+        <w:t>2</w:t>
+      </w:r>
+      <w:r>
+        <w:rPr>
+          <w:b/>
+          <w:bCs/>
+          <w:i w:val="false"/>
+          <w:iCs w:val="false"/>
+          <w:sz w:val="28"/>
+          <w:szCs w:val="28"/>
+        </w:rPr>
+        <w:t>.2.4 The Appearance Based Approach of Facial Detection</w:t>
       </w:r>
     </w:p>
     <w:p>
@@ -4233,7 +4399,7 @@
           <w:sz w:val="32"/>
           <w:szCs w:val="32"/>
         </w:rPr>
-        <w:t>2.3.3 Face Identification Approaches</w:t>
+        <w:t>2.3 Face Identification Approaches</w:t>
       </w:r>
     </w:p>
     <w:p>
@@ -4534,7 +4700,21 @@
           <w:szCs w:val="24"/>
         </w:rPr>
         <w:tab/>
-        <w:t>In this method, the objective is to create a model that would use a set of variables to predict whether or not a face belongs to a known person. This is done by converting an image into a set of features that are later used for building a statistical models. To further the debate, the number of features that are used for creating models is usually high. It follows that the right statistical tool should be used in order to control for the high number of variables. According to Proyecto (2010) a combination of different tools are at times used in order to create a good model for facial recognition. It is imperative to highlight that Some of the existing solutions that are used to predict the faces include neural networks with gabor filters, neural networks with hidden markov models, and fuzzy neural networks. That is not all. At times, principal components analysis, linear discriminant analysis, independent component analysis are used together with other tools in order to control for the number of features used to create a model.</w:t>
+        <w:t xml:space="preserve">In this method, the objective is to create a model that would use a set of variables to predict whether or not a face belongs to a known person. This is done by converting an image into a set of features that are later used for building a statistical models. To further the debate, the number of features that are used for creating models is usually high. It follows that the right statistical tool should be used in order to control for the high number of variables. According to Proyecto (2010) a combination of different tools are at times used in order to create a good model for facial recognition. It is </w:t>
+      </w:r>
+      <w:r>
+        <w:rPr>
+          <w:sz w:val="24"/>
+          <w:szCs w:val="24"/>
+        </w:rPr>
+        <w:t>notable</w:t>
+      </w:r>
+      <w:r>
+        <w:rPr>
+          <w:sz w:val="24"/>
+          <w:szCs w:val="24"/>
+        </w:rPr>
+        <w:t xml:space="preserve"> that Some of the existing solutions that are used to predict the faces include neural networks with gabor filters, neural networks with hidden markov models, and fuzzy neural networks. That is not all. At times, principal components analysis, linear discriminant analysis, independent component analysis are used together with other tools in order to control for the number of features used to create a model.</w:t>
       </w:r>
     </w:p>
     <w:p>
@@ -4592,7 +4772,35 @@
           <w:sz w:val="24"/>
           <w:szCs w:val="24"/>
         </w:rPr>
-        <w:t>used the gabor wavelet transform for extracting features and neural networks for model creation and concluded that dimension reduction should be used to reduce execution time and memory space. Saxena et al., (2018) used artificial neural networks with the hidden markov model and demonstrated that the combination of hidden markov models with neural networks performs better than a pure hidden markov model. In a different paper, Soni and Shukla (2020) used convolutional neural networks with hidden markov model and created a facial recognition model that is 99.5% accurate. Finally, Pankaj and Wilsey used a fuzzy neural network for facial recognition on the AT &amp; T and the Yale database and obtained an accuracy of 98.75% and 99.39% respectively.</w:t>
+        <w:t>used the gabor wavelet transform for extracting features and neural networks for model creation and concluded that dimension reduction should be used to reduce execution time and memory space. Saxena et al., (2018) used artificial neural networks with the hidden markov model and demonstrated that the combination of hidden markov models with neural networks performs better than a pure hidden markov model. In a different paper, Soni and Shukla (2020) used convolutional neural networks with hidden markov model and created a facial recognition model that is 99.5% accurate. Finally, Pankaj and Wils</w:t>
+      </w:r>
+      <w:r>
+        <w:rPr>
+          <w:sz w:val="24"/>
+          <w:szCs w:val="24"/>
+        </w:rPr>
+        <w:t>c</w:t>
+      </w:r>
+      <w:r>
+        <w:rPr>
+          <w:sz w:val="24"/>
+          <w:szCs w:val="24"/>
+        </w:rPr>
+        <w:t xml:space="preserve">y </w:t>
+      </w:r>
+      <w:r>
+        <w:rPr>
+          <w:sz w:val="24"/>
+          <w:szCs w:val="24"/>
+        </w:rPr>
+        <w:t xml:space="preserve">(2011) </w:t>
+      </w:r>
+      <w:r>
+        <w:rPr>
+          <w:sz w:val="24"/>
+          <w:szCs w:val="24"/>
+        </w:rPr>
+        <w:t>used a fuzzy neural network for facial recognition on the AT &amp; T and the Yale database and obtained an accuracy of 98.75% and 99.39% respectively.</w:t>
       </w:r>
     </w:p>
     <w:p>
@@ -6452,6 +6660,43 @@
           <w:sz w:val="24"/>
           <w:szCs w:val="24"/>
         </w:rPr>
+        <w:t xml:space="preserve">Pankaj, S. D., and Wilscy, M. (2011). Face Recognition Using Fuzzy Neural Network Classifier. </w:t>
+      </w:r>
+    </w:p>
+    <w:p>
+      <w:pPr>
+        <w:pStyle w:val="Normal"/>
+        <w:bidi w:val="0"/>
+        <w:spacing w:lineRule="auto" w:line="480"/>
+        <w:jc w:val="left"/>
+        <w:rPr/>
+      </w:pPr>
+      <w:r>
+        <w:rPr>
+          <w:b w:val="false"/>
+          <w:bCs w:val="false"/>
+          <w:sz w:val="24"/>
+          <w:szCs w:val="24"/>
+        </w:rPr>
+        <w:tab/>
+        <w:t>Retrived from: https://sci-hub.se/10.1007/978-3-642-24037-9_6</w:t>
+      </w:r>
+    </w:p>
+    <w:p>
+      <w:pPr>
+        <w:pStyle w:val="Normal"/>
+        <w:bidi w:val="0"/>
+        <w:spacing w:lineRule="auto" w:line="480"/>
+        <w:jc w:val="left"/>
+        <w:rPr/>
+      </w:pPr>
+      <w:r>
+        <w:rPr>
+          <w:b w:val="false"/>
+          <w:bCs w:val="false"/>
+          <w:sz w:val="24"/>
+          <w:szCs w:val="24"/>
+        </w:rPr>
         <w:t xml:space="preserve">Parkhi, M. O., Vedaldi, A., and Ziseerman, A.  (2015). </w:t>
       </w:r>
       <w:r>
@@ -7072,6 +7317,77 @@
           <w:szCs w:val="24"/>
         </w:rPr>
         <w:t>, 12(12) 256-463.</w:t>
+      </w:r>
+    </w:p>
+    <w:p>
+      <w:pPr>
+        <w:pStyle w:val="Normal"/>
+        <w:bidi w:val="0"/>
+        <w:spacing w:lineRule="auto" w:line="480"/>
+        <w:jc w:val="left"/>
+        <w:rPr>
+          <w:b w:val="false"/>
+          <w:b w:val="false"/>
+          <w:bCs w:val="false"/>
+          <w:sz w:val="24"/>
+          <w:szCs w:val="24"/>
+        </w:rPr>
+      </w:pPr>
+      <w:r>
+        <w:rPr>
+          <w:b w:val="false"/>
+          <w:bCs w:val="false"/>
+          <w:sz w:val="24"/>
+          <w:szCs w:val="24"/>
+        </w:rPr>
+        <w:t xml:space="preserve">Soni, M., and Shukla, S. (2020). Convolutional Neural Network and Hidden Markov Model Based </w:t>
+      </w:r>
+    </w:p>
+    <w:p>
+      <w:pPr>
+        <w:pStyle w:val="Normal"/>
+        <w:bidi w:val="0"/>
+        <w:spacing w:lineRule="auto" w:line="480"/>
+        <w:jc w:val="left"/>
+        <w:rPr>
+          <w:b w:val="false"/>
+          <w:b w:val="false"/>
+          <w:bCs w:val="false"/>
+          <w:sz w:val="24"/>
+          <w:szCs w:val="24"/>
+        </w:rPr>
+      </w:pPr>
+      <w:r>
+        <w:rPr>
+          <w:b w:val="false"/>
+          <w:bCs w:val="false"/>
+          <w:sz w:val="24"/>
+          <w:szCs w:val="24"/>
+        </w:rPr>
+        <w:tab/>
+        <w:t xml:space="preserve">Face Recognition. </w:t>
+      </w:r>
+      <w:r>
+        <w:rPr>
+          <w:b w:val="false"/>
+          <w:bCs w:val="false"/>
+          <w:i/>
+          <w:iCs/>
+          <w:sz w:val="24"/>
+          <w:szCs w:val="24"/>
+        </w:rPr>
+        <w:t xml:space="preserve">International Journal of Electrical, Electronics and Data </w:t>
+        <w:tab/>
+        <w:t>Communication</w:t>
+      </w:r>
+      <w:r>
+        <w:rPr>
+          <w:b w:val="false"/>
+          <w:bCs w:val="false"/>
+          <w:sz w:val="24"/>
+          <w:szCs w:val="24"/>
+        </w:rPr>
+        <w:t>, 8(2): 26-30.</w:t>
       </w:r>
     </w:p>
     <w:p>
@@ -7966,7 +8282,7 @@
     <w:pPr>
       <w:widowControl/>
       <w:suppressAutoHyphens w:val="true"/>
-      <w:overflowPunct w:val="false"/>
+      <w:overflowPunct w:val="true"/>
       <w:bidi w:val="0"/>
       <w:spacing w:before="0" w:after="0"/>
       <w:jc w:val="left"/>

</xml_diff>

<commit_message>
Find thesis for neural networks
</commit_message>
<xml_diff>
--- a/SikoliaThesis.docx
+++ b/SikoliaThesis.docx
@@ -2,6 +2,10 @@
 <file path=word/document.xml><?xml version="1.0" encoding="utf-8"?>
 <w:document xmlns:wpc="http://schemas.microsoft.com/office/word/2010/wordprocessingCanvas" xmlns:cx="http://schemas.microsoft.com/office/drawing/2014/chartex" xmlns:cx1="http://schemas.microsoft.com/office/drawing/2015/9/8/chartex" xmlns:mc="http://schemas.openxmlformats.org/markup-compatibility/2006" xmlns:o="urn:schemas-microsoft-com:office:office" xmlns:r="http://schemas.openxmlformats.org/officeDocument/2006/relationships" xmlns:m="http://schemas.openxmlformats.org/officeDocument/2006/math" xmlns:v="urn:schemas-microsoft-com:vml" xmlns:wp14="http://schemas.microsoft.com/office/word/2010/wordprocessingDrawing" xmlns:wp="http://schemas.openxmlformats.org/drawingml/2006/wordprocessingDrawing" xmlns:w10="urn:schemas-microsoft-com:office:word" xmlns:w="http://schemas.openxmlformats.org/wordprocessingml/2006/main" xmlns:w14="http://schemas.microsoft.com/office/word/2010/wordml" xmlns:w15="http://schemas.microsoft.com/office/word/2012/wordml" xmlns:w16se="http://schemas.microsoft.com/office/word/2015/wordml/symex" xmlns:wpg="http://schemas.microsoft.com/office/word/2010/wordprocessingGroup" xmlns:wpi="http://schemas.microsoft.com/office/word/2010/wordprocessingInk" xmlns:wne="http://schemas.microsoft.com/office/word/2006/wordml" xmlns:wps="http://schemas.microsoft.com/office/word/2010/wordprocessingShape" mc:Ignorable="w14 w15 w16se wp14">
   <w:body>
+    <w:p>
+      <w:bookmarkStart w:id="0" w:name="_GoBack"/>
+      <w:bookmarkEnd w:id="0"/>
+    </w:p>
     <w:p/>
     <w:p/>
     <w:p/>
@@ -19,7 +23,6 @@
     <w:p/>
     <w:p/>
     <w:p/>
-    <w:p/>
     <w:p>
       <w:pPr>
         <w:pStyle w:val="HeaderandFooter"/>
@@ -130,12 +133,12 @@
       <w:pPr>
         <w:pStyle w:val="Heading1"/>
       </w:pPr>
-      <w:bookmarkStart w:id="0" w:name="_Toc123819399"/>
+      <w:bookmarkStart w:id="1" w:name="_Toc123819399"/>
       <w:r>
         <w:lastRenderedPageBreak/>
         <w:t>DECLARATION</w:t>
       </w:r>
-      <w:bookmarkEnd w:id="0"/>
+      <w:bookmarkEnd w:id="1"/>
     </w:p>
     <w:p>
       <w:pPr>
@@ -315,12 +318,12 @@
       <w:pPr>
         <w:pStyle w:val="Heading1"/>
       </w:pPr>
-      <w:bookmarkStart w:id="1" w:name="_Toc123819400"/>
+      <w:bookmarkStart w:id="2" w:name="_Toc123819400"/>
       <w:r>
         <w:lastRenderedPageBreak/>
         <w:t>DEDICATION</w:t>
       </w:r>
-      <w:bookmarkEnd w:id="1"/>
+      <w:bookmarkEnd w:id="2"/>
     </w:p>
     <w:p>
       <w:pPr>
@@ -407,12 +410,12 @@
       <w:pPr>
         <w:pStyle w:val="Heading1"/>
       </w:pPr>
-      <w:bookmarkStart w:id="2" w:name="_Toc123819401"/>
+      <w:bookmarkStart w:id="3" w:name="_Toc123819401"/>
       <w:r>
         <w:lastRenderedPageBreak/>
         <w:t>ACKNOWLEDGMENT</w:t>
       </w:r>
-      <w:bookmarkEnd w:id="2"/>
+      <w:bookmarkEnd w:id="3"/>
     </w:p>
     <w:p>
       <w:pPr>
@@ -464,12 +467,12 @@
       <w:pPr>
         <w:pStyle w:val="Heading1"/>
       </w:pPr>
-      <w:bookmarkStart w:id="3" w:name="_Toc123819402"/>
+      <w:bookmarkStart w:id="4" w:name="_Toc123819402"/>
       <w:r>
         <w:lastRenderedPageBreak/>
         <w:t>ABSTRACT</w:t>
       </w:r>
-      <w:bookmarkEnd w:id="3"/>
+      <w:bookmarkEnd w:id="4"/>
     </w:p>
     <w:p>
       <w:pPr>
@@ -2205,12 +2208,12 @@
       <w:pPr>
         <w:pStyle w:val="Heading1"/>
       </w:pPr>
-      <w:bookmarkStart w:id="4" w:name="_Toc123819403"/>
+      <w:bookmarkStart w:id="5" w:name="_Toc123819403"/>
       <w:r>
         <w:lastRenderedPageBreak/>
         <w:t>List of Tables</w:t>
       </w:r>
-      <w:bookmarkEnd w:id="4"/>
+      <w:bookmarkEnd w:id="5"/>
     </w:p>
     <w:p>
       <w:pPr>
@@ -2274,12 +2277,12 @@
       <w:pPr>
         <w:pStyle w:val="Heading1"/>
       </w:pPr>
-      <w:bookmarkStart w:id="5" w:name="_Toc123819404"/>
+      <w:bookmarkStart w:id="6" w:name="_Toc123819404"/>
       <w:r>
         <w:lastRenderedPageBreak/>
         <w:t>List of Figures</w:t>
       </w:r>
-      <w:bookmarkEnd w:id="5"/>
+      <w:bookmarkEnd w:id="6"/>
     </w:p>
     <w:p>
       <w:pPr>
@@ -2334,28 +2337,28 @@
       <w:pPr>
         <w:pStyle w:val="Heading1"/>
       </w:pPr>
-      <w:bookmarkStart w:id="6" w:name="_Toc123819405"/>
+      <w:bookmarkStart w:id="7" w:name="_Toc123819405"/>
       <w:r>
         <w:lastRenderedPageBreak/>
         <w:t>Chapter One</w:t>
       </w:r>
-      <w:bookmarkEnd w:id="6"/>
+      <w:bookmarkEnd w:id="7"/>
     </w:p>
     <w:p>
       <w:pPr>
         <w:pStyle w:val="Heading2"/>
       </w:pPr>
-      <w:bookmarkStart w:id="7" w:name="_Toc123819406"/>
+      <w:bookmarkStart w:id="8" w:name="_Toc123819406"/>
       <w:r>
         <w:t>Introduction</w:t>
       </w:r>
-      <w:bookmarkEnd w:id="7"/>
+      <w:bookmarkEnd w:id="8"/>
     </w:p>
     <w:p>
       <w:pPr>
         <w:pStyle w:val="Heading2"/>
       </w:pPr>
-      <w:bookmarkStart w:id="8" w:name="_Toc123819407"/>
+      <w:bookmarkStart w:id="9" w:name="_Toc123819407"/>
       <w:r>
         <w:t xml:space="preserve">1.1 </w:t>
       </w:r>
@@ -2365,20 +2368,15 @@
       <w:r>
         <w:t xml:space="preserve"> of Study</w:t>
       </w:r>
-      <w:bookmarkEnd w:id="8"/>
-    </w:p>
-    <w:p>
-      <w:pPr>
-        <w:spacing w:line="480" w:lineRule="auto"/>
-      </w:pPr>
-      <w:r>
-        <w:tab/>
-        <w:t>The emergence of big data has disrupted technology. Critical to the discussion is the fact that the data science is one of the best professions of the big data era. As evidenced, Davenport and Patil</w:t>
-      </w:r>
-      <w:bookmarkStart w:id="9" w:name="_GoBack"/>
       <w:bookmarkEnd w:id="9"/>
-      <w:r>
-        <w:t xml:space="preserve"> (2012) published an article arguing that data science is the sexiest job of the century. In a different publication, Vicario and Coleman (2018) mention that data scientists work in industries such as technology, production industries, e-commerce, and even agriculture. Clearly, the need for skilled personnel in data science is growing at an alarming rate, which has resulted in a lot of competition among giant companies in technology. This has led to innovations such as speech </w:t>
+    </w:p>
+    <w:p>
+      <w:pPr>
+        <w:spacing w:line="480" w:lineRule="auto"/>
+      </w:pPr>
+      <w:r>
+        <w:tab/>
+        <w:t xml:space="preserve">The emergence of big data has disrupted technology. Critical to the discussion is the fact that the data science is one of the best professions of the big data era. As evidenced, Davenport and Patil (2012) published an article arguing that data science is the sexiest job of the century. In a different publication, Vicario and Coleman (2018) mention that data scientists work in industries such as technology, production industries, e-commerce, and even agriculture. Clearly, the need for skilled personnel in data science is growing at an alarming rate, which has resulted in a lot of competition among giant companies in technology. This has led to innovations such as speech </w:t>
       </w:r>
       <w:r>
         <w:t>recognition (</w:t>
@@ -3191,7 +3189,6 @@
         <w:lastRenderedPageBreak/>
         <w:t xml:space="preserve">detection step is to identify whether an object in an image is a human face or not. Like in the face detection step, features like the eye, the nose, the chin, and the mouth are extracted from a human face before matching the features in question to a known face. Consider a face </w:t>
       </w:r>
-      <w:proofErr w:type="gramStart"/>
       <w:r>
         <w:rPr>
           <w:i/>
@@ -3199,7 +3196,6 @@
         </w:rPr>
         <w:t>A</w:t>
       </w:r>
-      <w:proofErr w:type="gramEnd"/>
       <w:r>
         <w:t xml:space="preserve"> belonging to a person B and a face C belonging to an unknown person. The template matching approach will collect facial characteristics from faces A and C. These characteristics from the unknown face C will be compared to characteristics from the known face A. If a match is found, then the decision will be that the unknown face C belongs to the person B.</w:t>
       </w:r>
@@ -3353,7 +3349,7 @@
     </w:p>
     <w:p>
       <w:pPr>
-        <w:pStyle w:val="Heading2"/>
+        <w:pStyle w:val="Heading1"/>
       </w:pPr>
       <w:bookmarkStart w:id="22" w:name="_Toc123819420"/>
       <w:r>
@@ -3373,14 +3369,64 @@
     <w:p>
       <w:pPr>
         <w:spacing w:line="480" w:lineRule="auto"/>
-      </w:pPr>
-    </w:p>
-    <w:p>
-      <w:pPr>
-        <w:spacing w:line="480" w:lineRule="auto"/>
-      </w:pPr>
-      <w:r>
-        <w:t>Image of a biological neuron and an artificial neural network</w:t>
+        <w:jc w:val="center"/>
+      </w:pPr>
+      <w:r>
+        <w:lastRenderedPageBreak/>
+        <w:drawing>
+          <wp:inline distT="0" distB="0" distL="0" distR="0" wp14:anchorId="5B0FD793" wp14:editId="0F45A017">
+            <wp:extent cx="4663844" cy="2072820"/>
+            <wp:effectExtent l="0" t="0" r="3810" b="3810"/>
+            <wp:docPr id="1" name="Picture 1"/>
+            <wp:cNvGraphicFramePr>
+              <a:graphicFrameLocks xmlns:a="http://schemas.openxmlformats.org/drawingml/2006/main" noChangeAspect="1"/>
+            </wp:cNvGraphicFramePr>
+            <a:graphic xmlns:a="http://schemas.openxmlformats.org/drawingml/2006/main">
+              <a:graphicData uri="http://schemas.openxmlformats.org/drawingml/2006/picture">
+                <pic:pic xmlns:pic="http://schemas.openxmlformats.org/drawingml/2006/picture">
+                  <pic:nvPicPr>
+                    <pic:cNvPr id="1" name=""/>
+                    <pic:cNvPicPr/>
+                  </pic:nvPicPr>
+                  <pic:blipFill>
+                    <a:blip r:embed="rId9"/>
+                    <a:stretch>
+                      <a:fillRect/>
+                    </a:stretch>
+                  </pic:blipFill>
+                  <pic:spPr>
+                    <a:xfrm>
+                      <a:off x="0" y="0"/>
+                      <a:ext cx="4663844" cy="2072820"/>
+                    </a:xfrm>
+                    <a:prstGeom prst="rect">
+                      <a:avLst/>
+                    </a:prstGeom>
+                  </pic:spPr>
+                </pic:pic>
+              </a:graphicData>
+            </a:graphic>
+          </wp:inline>
+        </w:drawing>
+      </w:r>
+    </w:p>
+    <w:p>
+      <w:pPr>
+        <w:spacing w:line="480" w:lineRule="auto"/>
+      </w:pPr>
+      <w:r>
+        <w:t>Figure 1.1</w:t>
+      </w:r>
+      <w:r>
+        <w:t xml:space="preserve"> Basic Structure of a Neural Network</w:t>
+      </w:r>
+    </w:p>
+    <w:p>
+      <w:pPr>
+        <w:spacing w:line="480" w:lineRule="auto"/>
+      </w:pPr>
+      <w:r>
+        <w:tab/>
       </w:r>
     </w:p>
     <w:p>
@@ -3486,6 +3532,7 @@
         <w:spacing w:line="480" w:lineRule="auto"/>
       </w:pPr>
       <w:r>
+        <w:lastRenderedPageBreak/>
         <w:t>https://towardsdatascience.com/how-to-define-a-neural-network-as-a-mathematical-function-f7b820cde3f</w:t>
       </w:r>
       <w:r>
@@ -3519,6 +3566,23 @@
         <w:spacing w:line="480" w:lineRule="auto"/>
       </w:pPr>
       <w:r>
+        <w:t>Aggarwal, C. C. (2018). Neural Networks and Deep Learning. Cham: Springer. ISBN: 978-3-319-</w:t>
+      </w:r>
+    </w:p>
+    <w:p>
+      <w:pPr>
+        <w:spacing w:line="480" w:lineRule="auto"/>
+        <w:ind w:firstLine="709"/>
+      </w:pPr>
+      <w:r>
+        <w:t>94462-3</w:t>
+      </w:r>
+    </w:p>
+    <w:p>
+      <w:pPr>
+        <w:spacing w:line="480" w:lineRule="auto"/>
+      </w:pPr>
+      <w:r>
         <w:t>Agrawal, A. K., Singh, N. Y. (2015). Evaluation of Face Recognition Methods in Unconstrained</w:t>
       </w:r>
     </w:p>
@@ -3558,15 +3622,7 @@
         <w:spacing w:line="480" w:lineRule="auto"/>
       </w:pPr>
       <w:r>
-        <w:t xml:space="preserve">Ayo, F. M., Mustapha, M., Braimah, A. J., and </w:t>
-      </w:r>
-      <w:proofErr w:type="spellStart"/>
-      <w:r>
-        <w:t>Aina</w:t>
-      </w:r>
-      <w:proofErr w:type="spellEnd"/>
-      <w:r>
-        <w:t xml:space="preserve">, A. D. (2021). Geometric Analysis and </w:t>
+        <w:t xml:space="preserve">Ayo, F. M., Mustapha, M., Braimah, A. J., and Aina, A. D. (2021). Geometric Analysis and </w:t>
       </w:r>
     </w:p>
     <w:p>
@@ -3682,37 +3738,17 @@
       <w:pPr>
         <w:spacing w:line="480" w:lineRule="auto"/>
       </w:pPr>
-      <w:proofErr w:type="spellStart"/>
-      <w:r>
-        <w:t>Brunelli</w:t>
-      </w:r>
-      <w:proofErr w:type="spellEnd"/>
-      <w:r>
-        <w:t xml:space="preserve">, R., and </w:t>
-      </w:r>
-      <w:proofErr w:type="spellStart"/>
-      <w:r>
-        <w:t>Poggio</w:t>
-      </w:r>
-      <w:proofErr w:type="spellEnd"/>
-      <w:r>
-        <w:t xml:space="preserve">, T. (2013). Face Recognition through Geometrical Features. Retrieved </w:t>
-      </w:r>
-    </w:p>
-    <w:p>
-      <w:pPr>
-        <w:spacing w:line="480" w:lineRule="auto"/>
-      </w:pPr>
-      <w:r>
-        <w:tab/>
-      </w:r>
-      <w:proofErr w:type="gramStart"/>
-      <w:r>
-        <w:t>from</w:t>
-      </w:r>
-      <w:proofErr w:type="gramEnd"/>
-      <w:r>
-        <w:t>: https://www.semanticscholar.org/paper/Face-Recognition-through-Geometrical-</w:t>
+      <w:r>
+        <w:t xml:space="preserve">Brunelli, R., and Poggio, T. (2013). Face Recognition through Geometrical Features. Retrieved </w:t>
+      </w:r>
+    </w:p>
+    <w:p>
+      <w:pPr>
+        <w:spacing w:line="480" w:lineRule="auto"/>
+      </w:pPr>
+      <w:r>
+        <w:tab/>
+        <w:t>from: https://www.semanticscholar.org/paper/Face-Recognition-through-Geometrical-</w:t>
       </w:r>
       <w:hyperlink>
         <w:r>
@@ -3726,15 +3762,7 @@
         <w:spacing w:line="480" w:lineRule="auto"/>
       </w:pPr>
       <w:r>
-        <w:t xml:space="preserve">Celiktutan, O., Ulukaya, S., and Sankur, B. (2013). A Comparative Study of Face </w:t>
-      </w:r>
-      <w:proofErr w:type="spellStart"/>
-      <w:r>
-        <w:t>Landmarking</w:t>
-      </w:r>
-      <w:proofErr w:type="spellEnd"/>
-      <w:r>
-        <w:t xml:space="preserve"> </w:t>
+        <w:t xml:space="preserve">Celiktutan, O., Ulukaya, S., and Sankur, B. (2013). A Comparative Study of Face Landmarking </w:t>
       </w:r>
     </w:p>
     <w:p>
@@ -3752,7 +3780,6 @@
         </w:rPr>
         <w:t xml:space="preserve">EURASIP Journal on Image and Video </w:t>
       </w:r>
-      <w:proofErr w:type="gramStart"/>
       <w:r>
         <w:rPr>
           <w:i/>
@@ -3761,9 +3788,8 @@
         <w:t>Processing</w:t>
       </w:r>
       <w:r>
-        <w:t xml:space="preserve"> ,</w:t>
-      </w:r>
-      <w:proofErr w:type="gramEnd"/>
+        <w:t>,</w:t>
+      </w:r>
       <w:r>
         <w:t xml:space="preserve"> 3(2013). </w:t>
       </w:r>
@@ -3779,11 +3805,9 @@
       <w:r>
         <w:t xml:space="preserve">Chandra, B. Y. and Reddy G. K. (2020). A Comparative Analysis </w:t>
       </w:r>
-      <w:proofErr w:type="gramStart"/>
-      <w:r>
-        <w:t>Of</w:t>
-      </w:r>
-      <w:proofErr w:type="gramEnd"/>
+      <w:r>
+        <w:t>of</w:t>
+      </w:r>
       <w:r>
         <w:t xml:space="preserve"> Face Recognition</w:t>
       </w:r>
@@ -3796,11 +3820,9 @@
         <w:tab/>
         <w:t xml:space="preserve">Models </w:t>
       </w:r>
-      <w:proofErr w:type="gramStart"/>
-      <w:r>
-        <w:t>On</w:t>
-      </w:r>
-      <w:proofErr w:type="gramEnd"/>
+      <w:r>
+        <w:t>on</w:t>
+      </w:r>
       <w:r>
         <w:t xml:space="preserve"> Masked Faces. </w:t>
       </w:r>
@@ -3832,14 +3854,13 @@
         <w:spacing w:line="480" w:lineRule="auto"/>
       </w:pPr>
       <w:r>
+        <w:lastRenderedPageBreak/>
         <w:tab/>
         <w:t xml:space="preserve">Recognition System Should be </w:t>
       </w:r>
-      <w:proofErr w:type="gramStart"/>
-      <w:r>
-        <w:t>Based</w:t>
-      </w:r>
-      <w:proofErr w:type="gramEnd"/>
+      <w:r>
+        <w:t>based</w:t>
+      </w:r>
       <w:r>
         <w:t xml:space="preserve"> on The Pure Face Portion: A Probabilistic Decision-</w:t>
       </w:r>
@@ -3867,19 +3888,11 @@
         <w:spacing w:line="480" w:lineRule="auto"/>
       </w:pPr>
       <w:r>
-        <w:lastRenderedPageBreak/>
         <w:t xml:space="preserve">Davenport, H. T., and Patil, J. D. (2012). Data </w:t>
       </w:r>
-      <w:proofErr w:type="spellStart"/>
-      <w:r>
-        <w:t>Scientist</w:t>
-      </w:r>
-      <w:proofErr w:type="gramStart"/>
-      <w:r>
-        <w:t>:The</w:t>
-      </w:r>
-      <w:proofErr w:type="spellEnd"/>
-      <w:proofErr w:type="gramEnd"/>
+      <w:r>
+        <w:t>Scientist: The</w:t>
+      </w:r>
       <w:r>
         <w:t xml:space="preserve"> Sexiest Job of the 21</w:t>
       </w:r>
@@ -3890,19 +3903,24 @@
         <w:t>st</w:t>
       </w:r>
       <w:r>
-        <w:t xml:space="preserve"> Century. Harvard </w:t>
-      </w:r>
-    </w:p>
-    <w:p>
-      <w:pPr>
-        <w:spacing w:line="480" w:lineRule="auto"/>
-      </w:pPr>
-      <w:r>
-        <w:tab/>
-        <w:t>Business Review. Retrieved from: https://hbr.org/2012/10/data-scientist-the-sexiest-job-of-t</w:t>
-      </w:r>
-      <w:r>
-        <w:tab/>
+        <w:t xml:space="preserve"> Century. </w:t>
+      </w:r>
+    </w:p>
+    <w:p>
+      <w:pPr>
+        <w:spacing w:line="480" w:lineRule="auto"/>
+        <w:ind w:left="709"/>
+      </w:pPr>
+      <w:r>
+        <w:t xml:space="preserve">Harvard Business Review. Retrieved from: </w:t>
+      </w:r>
+      <w:r>
+        <w:t>https://hbr.org/2012/10/data-scientist-the-sexiest-</w:t>
+      </w:r>
+      <w:r>
+        <w:t>job-of-t</w:t>
+      </w:r>
+      <w:r>
         <w:t>he-21st-century.</w:t>
       </w:r>
     </w:p>
@@ -3981,15 +3999,7 @@
         <w:spacing w:line="480" w:lineRule="auto"/>
       </w:pPr>
       <w:r>
-        <w:t xml:space="preserve">Finlayson G. D. (2018). </w:t>
-      </w:r>
-      <w:proofErr w:type="spellStart"/>
-      <w:r>
-        <w:t>Colour</w:t>
-      </w:r>
-      <w:proofErr w:type="spellEnd"/>
-      <w:r>
-        <w:t xml:space="preserve"> and illumination in computer vision. </w:t>
+        <w:t xml:space="preserve">Finlayson G. D. (2018). Colour and illumination in computer vision. </w:t>
       </w:r>
       <w:r>
         <w:rPr>
@@ -4068,11 +4078,9 @@
       <w:r>
         <w:tab/>
       </w:r>
-      <w:proofErr w:type="gramStart"/>
-      <w:r>
-        <w:t>Improved  Generative</w:t>
-      </w:r>
-      <w:proofErr w:type="gramEnd"/>
+      <w:r>
+        <w:t>Improved Generative</w:t>
+      </w:r>
       <w:r>
         <w:t xml:space="preserve"> Confrontation Network. </w:t>
       </w:r>
@@ -4127,6 +4135,7 @@
         <w:spacing w:line="480" w:lineRule="auto"/>
       </w:pPr>
       <w:r>
+        <w:lastRenderedPageBreak/>
         <w:t xml:space="preserve">Goel, R., Mehmood, I., Ugail, H. (2021). A Study of Deep Learning-Based Face Recognition </w:t>
       </w:r>
     </w:p>
@@ -4146,17 +4155,7 @@
         <w:t>Sensors</w:t>
       </w:r>
       <w:r>
-        <w:t xml:space="preserve">, 21(5068): </w:t>
-      </w:r>
-      <w:proofErr w:type="spellStart"/>
-      <w:proofErr w:type="gramStart"/>
-      <w:r>
-        <w:t>n.p</w:t>
-      </w:r>
-      <w:proofErr w:type="spellEnd"/>
-      <w:proofErr w:type="gramEnd"/>
-      <w:r>
-        <w:t>. https://doi.org/10.3390/s21155068</w:t>
+        <w:t>, 21(5068): n.p. https://doi.org/10.3390/s21155068</w:t>
       </w:r>
     </w:p>
     <w:p>
@@ -4172,613 +4171,490 @@
         <w:spacing w:line="480" w:lineRule="auto"/>
       </w:pPr>
       <w:r>
-        <w:lastRenderedPageBreak/>
         <w:tab/>
         <w:t xml:space="preserve">Recognition Using Geometric Features Extraction. </w:t>
       </w:r>
-      <w:proofErr w:type="spellStart"/>
       <w:r>
         <w:rPr>
           <w:i/>
           <w:iCs/>
         </w:rPr>
-        <w:t>Jurnal</w:t>
-      </w:r>
-      <w:proofErr w:type="spellEnd"/>
+        <w:t>Jurnal Lmiah Kursor</w:t>
+      </w:r>
+      <w:r>
+        <w:t xml:space="preserve">, 11(2): 83-90. </w:t>
+      </w:r>
+      <w:r>
+        <w:tab/>
+        <w:t>https://doi.org/10.21107/kursor.v11i2.284</w:t>
+      </w:r>
+    </w:p>
+    <w:p>
+      <w:pPr>
+        <w:spacing w:line="480" w:lineRule="auto"/>
+      </w:pPr>
+      <w:r>
+        <w:t xml:space="preserve">Hinton, E. G., Osindero, O., and Teh, Y. (2006). A Fast Learning Algorithm for Deep Belief Nets. </w:t>
+      </w:r>
+    </w:p>
+    <w:p>
+      <w:pPr>
+        <w:spacing w:line="480" w:lineRule="auto"/>
+      </w:pPr>
+      <w:r>
+        <w:tab/>
+      </w:r>
       <w:r>
         <w:rPr>
           <w:i/>
           <w:iCs/>
         </w:rPr>
-        <w:t xml:space="preserve"> </w:t>
-      </w:r>
-      <w:proofErr w:type="spellStart"/>
+        <w:t xml:space="preserve">Neural Computation, </w:t>
+      </w:r>
+      <w:r>
+        <w:t>18(7): 1527-54. https://doi:10.1162/neco.2006.18.7.1527</w:t>
+      </w:r>
+    </w:p>
+    <w:p>
+      <w:pPr>
+        <w:spacing w:line="480" w:lineRule="auto"/>
+      </w:pPr>
+      <w:r>
+        <w:t xml:space="preserve">Kapil, D., and Jain A. (2013). A Brief Review on Feature Based Approaches for Face Recognition. </w:t>
+      </w:r>
+    </w:p>
+    <w:p>
+      <w:pPr>
+        <w:spacing w:line="480" w:lineRule="auto"/>
+        <w:ind w:firstLine="709"/>
+      </w:pPr>
       <w:r>
         <w:rPr>
           <w:i/>
           <w:iCs/>
         </w:rPr>
-        <w:t>Lmiah</w:t>
-      </w:r>
-      <w:proofErr w:type="spellEnd"/>
+        <w:t>International Journal of Science and Research</w:t>
+      </w:r>
+      <w:r>
+        <w:t>, 6(14): 273-27.</w:t>
+      </w:r>
+    </w:p>
+    <w:p>
+      <w:pPr>
+        <w:spacing w:line="480" w:lineRule="auto"/>
+      </w:pPr>
+      <w:r>
+        <w:t>Krishnapriya, K.</w:t>
+      </w:r>
+      <w:r>
+        <w:t xml:space="preserve"> S., Vangara, K., King, M.C., Albiero, V., &amp; Bowyer, K. (2019). </w:t>
+      </w:r>
       <w:r>
         <w:rPr>
           <w:i/>
           <w:iCs/>
         </w:rPr>
-        <w:t xml:space="preserve"> </w:t>
-      </w:r>
-      <w:proofErr w:type="spellStart"/>
+        <w:t xml:space="preserve">Characterizing the </w:t>
+      </w:r>
+    </w:p>
+    <w:p>
+      <w:pPr>
+        <w:spacing w:line="480" w:lineRule="auto"/>
+      </w:pPr>
       <w:r>
         <w:rPr>
           <w:i/>
           <w:iCs/>
         </w:rPr>
-        <w:t>Kursor</w:t>
-      </w:r>
-      <w:proofErr w:type="spellEnd"/>
-      <w:r>
-        <w:t xml:space="preserve">, 11(2): 83-90. </w:t>
-      </w:r>
-      <w:r>
-        <w:tab/>
-        <w:t>https://doi.org/10.21107/kursor.v11i2.284</w:t>
-      </w:r>
-    </w:p>
-    <w:p>
-      <w:pPr>
-        <w:spacing w:line="480" w:lineRule="auto"/>
-      </w:pPr>
-      <w:r>
-        <w:t xml:space="preserve">Hinton, E. G., </w:t>
-      </w:r>
-      <w:proofErr w:type="spellStart"/>
-      <w:r>
-        <w:t>Osindero</w:t>
-      </w:r>
-      <w:proofErr w:type="spellEnd"/>
-      <w:r>
-        <w:t xml:space="preserve">, O., and </w:t>
-      </w:r>
-      <w:proofErr w:type="spellStart"/>
-      <w:r>
-        <w:t>Teh</w:t>
-      </w:r>
-      <w:proofErr w:type="spellEnd"/>
-      <w:r>
-        <w:t xml:space="preserve">, Y. (2006). A Fast Learning Algorithm for Deep Belief Nets. </w:t>
-      </w:r>
-    </w:p>
-    <w:p>
-      <w:pPr>
-        <w:spacing w:line="480" w:lineRule="auto"/>
-      </w:pPr>
-      <w:r>
-        <w:tab/>
+        <w:tab/>
+        <w:t>Variability in Face Recognition Accuracy Relative to Race</w:t>
+      </w:r>
+      <w:r>
+        <w:t xml:space="preserve">. 2019 IEEE/CVF Conference on </w:t>
+      </w:r>
+      <w:r>
+        <w:tab/>
+        <w:t xml:space="preserve">Computer Vision and Pattern Recognition Workshops (CVPRW), 2278-2285. </w:t>
+      </w:r>
+      <w:r>
+        <w:tab/>
+        <w:t>https://arxiv.org/pdf/1904.07325.pdf</w:t>
+      </w:r>
+    </w:p>
+    <w:p>
+      <w:pPr>
+        <w:spacing w:line="480" w:lineRule="auto"/>
+      </w:pPr>
+      <w:r>
+        <w:t xml:space="preserve">Leslie, D. (2020). Understanding bias in facial recognition technologies: an explainer. </w:t>
       </w:r>
       <w:r>
         <w:rPr>
           <w:i/>
           <w:iCs/>
         </w:rPr>
-        <w:t xml:space="preserve">Neural Computation, </w:t>
-      </w:r>
-      <w:r>
-        <w:t>18(7): 1527-54. https://doi:10.1162/neco.2006.18.7.1527</w:t>
-      </w:r>
-    </w:p>
-    <w:p>
-      <w:pPr>
-        <w:spacing w:line="480" w:lineRule="auto"/>
-      </w:pPr>
-      <w:r>
-        <w:t xml:space="preserve">Kapil, D., and Jain A. (2013). A Brief Review on Feature Based Approaches for Face Recognition. </w:t>
-      </w:r>
+        <w:t xml:space="preserve">The Alan </w:t>
+      </w:r>
+    </w:p>
+    <w:p>
+      <w:pPr>
+        <w:spacing w:line="480" w:lineRule="auto"/>
+      </w:pPr>
       <w:r>
         <w:rPr>
           <w:i/>
           <w:iCs/>
         </w:rPr>
-        <w:t>International Journal of Science and Research</w:t>
-      </w:r>
-      <w:r>
-        <w:t>, 6(14): 273-27.</w:t>
-      </w:r>
-    </w:p>
-    <w:p>
-      <w:pPr>
-        <w:spacing w:line="480" w:lineRule="auto"/>
-      </w:pPr>
-      <w:proofErr w:type="spellStart"/>
-      <w:proofErr w:type="gramStart"/>
-      <w:r>
-        <w:t>KrishnapriyaK</w:t>
-      </w:r>
-      <w:proofErr w:type="spellEnd"/>
-      <w:r>
-        <w:t>.,</w:t>
-      </w:r>
-      <w:proofErr w:type="gramEnd"/>
-      <w:r>
-        <w:t xml:space="preserve"> S., </w:t>
-      </w:r>
-      <w:proofErr w:type="spellStart"/>
-      <w:r>
-        <w:t>Vangara</w:t>
-      </w:r>
-      <w:proofErr w:type="spellEnd"/>
-      <w:r>
-        <w:t xml:space="preserve">, K., King, M.C., </w:t>
-      </w:r>
-      <w:proofErr w:type="spellStart"/>
-      <w:r>
-        <w:t>Albiero</w:t>
-      </w:r>
-      <w:proofErr w:type="spellEnd"/>
-      <w:r>
-        <w:t xml:space="preserve">, V., &amp; Bowyer, K. (2019). </w:t>
+        <w:tab/>
+        <w:t>Turing Institute</w:t>
+      </w:r>
+      <w:r>
+        <w:t xml:space="preserve">. https://doi.org/10.5281/zenodo.4050457 </w:t>
+      </w:r>
+    </w:p>
+    <w:p>
+      <w:pPr>
+        <w:spacing w:line="480" w:lineRule="auto"/>
+      </w:pPr>
+      <w:r>
+        <w:t xml:space="preserve">Liu, C. J., and Ellisa, A. D. (2021). Editorial: Eating in the Age of Smartphones: The Good, the Bad, </w:t>
+      </w:r>
+    </w:p>
+    <w:p>
+      <w:pPr>
+        <w:spacing w:line="480" w:lineRule="auto"/>
+      </w:pPr>
+      <w:r>
+        <w:tab/>
+        <w:t xml:space="preserve">and the Neutral. </w:t>
       </w:r>
       <w:r>
         <w:rPr>
           <w:i/>
           <w:iCs/>
         </w:rPr>
-        <w:t xml:space="preserve">Characterizing the </w:t>
-      </w:r>
-    </w:p>
-    <w:p>
-      <w:pPr>
-        <w:spacing w:line="480" w:lineRule="auto"/>
-      </w:pPr>
+        <w:t xml:space="preserve">Frontiers in Psychology, </w:t>
+      </w:r>
+      <w:r>
+        <w:t xml:space="preserve">12(796899): 1-2. https://doi: </w:t>
+      </w:r>
+      <w:r>
+        <w:tab/>
+        <w:t>10.3389/fpsyg.2021.796899</w:t>
+      </w:r>
+    </w:p>
+    <w:p>
+      <w:pPr>
+        <w:spacing w:line="480" w:lineRule="auto"/>
+      </w:pPr>
+      <w:r>
+        <w:t xml:space="preserve">Lu, D., and Yan, L. (2021). Face Detection and Recognition Algorithm in Digital Image Based on </w:t>
+      </w:r>
+    </w:p>
+    <w:p>
+      <w:pPr>
+        <w:spacing w:line="480" w:lineRule="auto"/>
+      </w:pPr>
+      <w:r>
+        <w:tab/>
+        <w:t xml:space="preserve">Computer Vision Sensor. </w:t>
+      </w:r>
       <w:r>
         <w:rPr>
           <w:i/>
           <w:iCs/>
         </w:rPr>
-        <w:tab/>
-        <w:t>Variability in Face Recognition Accuracy Relative to Race</w:t>
-      </w:r>
-      <w:r>
-        <w:t xml:space="preserve">. 2019 IEEE/CVF Conference on </w:t>
-      </w:r>
-      <w:r>
-        <w:tab/>
-        <w:t xml:space="preserve">Computer Vision and Pattern Recognition Workshops (CVPRW), 2278-2285. </w:t>
-      </w:r>
-      <w:r>
-        <w:tab/>
-        <w:t>https://arxiv.org/pdf/1904.07325.pdf</w:t>
-      </w:r>
-    </w:p>
-    <w:p>
-      <w:pPr>
-        <w:spacing w:line="480" w:lineRule="auto"/>
-      </w:pPr>
-      <w:r>
-        <w:t xml:space="preserve">Leslie, D. (2020). Understanding bias in facial recognition technologies: an explainer. </w:t>
+        <w:t xml:space="preserve">Journal of Sensors, </w:t>
+      </w:r>
+      <w:r>
+        <w:t xml:space="preserve">2021(4796768), 1-16. </w:t>
+      </w:r>
+      <w:r>
+        <w:tab/>
+        <w:t>https://doi.org/10.1155/2021/4796768</w:t>
+      </w:r>
+    </w:p>
+    <w:p>
+      <w:pPr>
+        <w:spacing w:line="480" w:lineRule="auto"/>
+      </w:pPr>
+      <w:r>
+        <w:t>Marks, P. (2021).Can the Biases in Facial Recognition Be Fixed</w:t>
+      </w:r>
+      <w:r>
+        <w:t>; Also</w:t>
+      </w:r>
+      <w:r>
+        <w:t>, Should They?</w:t>
+      </w:r>
+    </w:p>
+    <w:p>
+      <w:pPr>
+        <w:spacing w:line="480" w:lineRule="auto"/>
+      </w:pPr>
+      <w:r>
+        <w:tab/>
       </w:r>
       <w:r>
         <w:rPr>
           <w:i/>
           <w:iCs/>
         </w:rPr>
-        <w:t xml:space="preserve">The Alan </w:t>
-      </w:r>
-    </w:p>
-    <w:p>
-      <w:pPr>
-        <w:spacing w:line="480" w:lineRule="auto"/>
-      </w:pPr>
+        <w:t xml:space="preserve">Communications of </w:t>
+      </w:r>
       <w:r>
         <w:rPr>
           <w:i/>
           <w:iCs/>
         </w:rPr>
-        <w:tab/>
-        <w:t>Turing Institute</w:t>
-      </w:r>
-      <w:r>
-        <w:t xml:space="preserve">. https://doi.org/10.5281/zenodo.4050457 </w:t>
-      </w:r>
-    </w:p>
-    <w:p>
-      <w:pPr>
-        <w:spacing w:line="480" w:lineRule="auto"/>
-      </w:pPr>
-      <w:r>
-        <w:t xml:space="preserve">Liu, C. J., and </w:t>
-      </w:r>
-      <w:proofErr w:type="spellStart"/>
-      <w:r>
-        <w:t>Ellisa</w:t>
-      </w:r>
-      <w:proofErr w:type="spellEnd"/>
-      <w:r>
-        <w:t xml:space="preserve">, A. D. (2021). Editorial: Eating in the Age of Smartphones: The Good, the Bad, </w:t>
-      </w:r>
-    </w:p>
-    <w:p>
-      <w:pPr>
-        <w:spacing w:line="480" w:lineRule="auto"/>
-      </w:pPr>
-      <w:r>
-        <w:tab/>
-      </w:r>
-      <w:proofErr w:type="gramStart"/>
-      <w:r>
-        <w:t>and</w:t>
-      </w:r>
-      <w:proofErr w:type="gramEnd"/>
-      <w:r>
-        <w:t xml:space="preserve"> the Neutral. </w:t>
+        <w:t>the</w:t>
       </w:r>
       <w:r>
         <w:rPr>
           <w:i/>
           <w:iCs/>
         </w:rPr>
-        <w:t xml:space="preserve">Frontiers in Psychology, </w:t>
-      </w:r>
-      <w:r>
-        <w:t xml:space="preserve">12(796899): 1-2. https://doi: </w:t>
-      </w:r>
-      <w:r>
-        <w:tab/>
-        <w:t>10.3389/fpsyg.2021.796899</w:t>
-      </w:r>
-    </w:p>
-    <w:p>
-      <w:pPr>
-        <w:spacing w:line="480" w:lineRule="auto"/>
-      </w:pPr>
-      <w:r>
-        <w:t xml:space="preserve">Lu, D., and Yan, L. (2021). Face Detection and Recognition Algorithm in Digital Image Based on </w:t>
-      </w:r>
-    </w:p>
-    <w:p>
-      <w:pPr>
-        <w:spacing w:line="480" w:lineRule="auto"/>
-      </w:pPr>
-      <w:r>
-        <w:tab/>
-        <w:t xml:space="preserve">Computer Vision Sensor. </w:t>
+        <w:t xml:space="preserve"> ACM,</w:t>
+      </w:r>
+      <w:r>
+        <w:t xml:space="preserve"> 64(3): 20-22. https://dx.doi.org/10.1145/3446877</w:t>
+      </w:r>
+    </w:p>
+    <w:p>
+      <w:pPr>
+        <w:spacing w:line="480" w:lineRule="auto"/>
+      </w:pPr>
+      <w:r>
+        <w:t xml:space="preserve">Mothar, M. N., Hassan, A. M., Hassan, H. S., and Osman, N. M. (2013). The Importance of </w:t>
+      </w:r>
+    </w:p>
+    <w:p>
+      <w:pPr>
+        <w:spacing w:line="480" w:lineRule="auto"/>
+      </w:pPr>
+      <w:r>
+        <w:lastRenderedPageBreak/>
+        <w:tab/>
+        <w:t xml:space="preserve">Smartphone’s </w:t>
+      </w:r>
+      <w:r>
+        <w:tab/>
+        <w:t xml:space="preserve">Usage </w:t>
+      </w:r>
+      <w:r>
+        <w:t>among</w:t>
+      </w:r>
+      <w:r>
+        <w:t xml:space="preserve"> Malaysian Undergraduates. </w:t>
       </w:r>
       <w:r>
         <w:rPr>
           <w:i/>
           <w:iCs/>
         </w:rPr>
-        <w:t xml:space="preserve">Journal of Sensors, </w:t>
-      </w:r>
-      <w:r>
-        <w:t xml:space="preserve">2021(4796768), 1-16. </w:t>
-      </w:r>
-      <w:r>
-        <w:tab/>
-        <w:t>https://doi.org/10.1155/2021/4796768</w:t>
-      </w:r>
-    </w:p>
-    <w:p>
-      <w:pPr>
-        <w:spacing w:line="480" w:lineRule="auto"/>
-      </w:pPr>
-      <w:r>
-        <w:t>Marks, P. (2021).Can the Biases in Facial Recognition Be Fixed</w:t>
-      </w:r>
-      <w:proofErr w:type="gramStart"/>
-      <w:r>
-        <w:t>;  Also</w:t>
-      </w:r>
-      <w:proofErr w:type="gramEnd"/>
-      <w:r>
-        <w:t>, Should They?</w:t>
-      </w:r>
-    </w:p>
-    <w:p>
-      <w:pPr>
-        <w:spacing w:line="480" w:lineRule="auto"/>
-      </w:pPr>
-      <w:r>
-        <w:tab/>
+        <w:t xml:space="preserve">Journal </w:t>
       </w:r>
       <w:r>
         <w:rPr>
           <w:i/>
           <w:iCs/>
         </w:rPr>
-        <w:t xml:space="preserve">Communications of </w:t>
-      </w:r>
-      <w:proofErr w:type="gramStart"/>
+        <w:t>of</w:t>
+      </w:r>
       <w:r>
         <w:rPr>
           <w:i/>
           <w:iCs/>
         </w:rPr>
-        <w:t>The</w:t>
-      </w:r>
-      <w:proofErr w:type="gramEnd"/>
+        <w:t xml:space="preserve"> Humanities </w:t>
+      </w:r>
       <w:r>
         <w:rPr>
           <w:i/>
           <w:iCs/>
         </w:rPr>
-        <w:t xml:space="preserve"> ACM,</w:t>
-      </w:r>
-      <w:r>
-        <w:t xml:space="preserve"> 64(3): 20-22. https://dx.doi.org/10.1145/3446877</w:t>
-      </w:r>
-    </w:p>
-    <w:p>
-      <w:pPr>
-        <w:spacing w:line="480" w:lineRule="auto"/>
-      </w:pPr>
-      <w:proofErr w:type="spellStart"/>
-      <w:r>
-        <w:t>Mothar</w:t>
-      </w:r>
-      <w:proofErr w:type="spellEnd"/>
-      <w:r>
-        <w:t xml:space="preserve">, M. N., Hassan, A. M., Hassan, H. S., and Osman, N. M. (2013). The Importance of </w:t>
-      </w:r>
-    </w:p>
-    <w:p>
-      <w:pPr>
-        <w:spacing w:line="480" w:lineRule="auto"/>
-      </w:pPr>
-      <w:r>
-        <w:tab/>
-        <w:t xml:space="preserve">Smartphone’s </w:t>
-      </w:r>
-      <w:r>
-        <w:tab/>
-        <w:t xml:space="preserve">Usage </w:t>
-      </w:r>
-      <w:proofErr w:type="gramStart"/>
-      <w:r>
-        <w:t>Among</w:t>
-      </w:r>
-      <w:proofErr w:type="gramEnd"/>
-      <w:r>
-        <w:t xml:space="preserve"> Malaysian Undergraduates. </w:t>
+        <w:t>and</w:t>
       </w:r>
       <w:r>
         <w:rPr>
           <w:i/>
           <w:iCs/>
         </w:rPr>
-        <w:t xml:space="preserve">Journal </w:t>
-      </w:r>
-      <w:proofErr w:type="gramStart"/>
+        <w:t xml:space="preserve"> Social </w:t>
+      </w:r>
       <w:r>
         <w:rPr>
           <w:i/>
           <w:iCs/>
         </w:rPr>
-        <w:t>Of</w:t>
-      </w:r>
-      <w:proofErr w:type="gramEnd"/>
+        <w:tab/>
+        <w:t>Science</w:t>
+      </w:r>
+      <w:r>
+        <w:t>, 1</w:t>
+      </w:r>
+      <w:r>
+        <w:t xml:space="preserve">4(3): 112-118. Retrieved from: </w:t>
+      </w:r>
+      <w:r>
+        <w:t>https://www.iosrjournals.org/iosr-jhss/papers/Vol14-issue3/S0143112118.pdf</w:t>
+      </w:r>
+    </w:p>
+    <w:p>
+      <w:pPr>
+        <w:spacing w:line="480" w:lineRule="auto"/>
+      </w:pPr>
+      <w:r>
+        <w:t xml:space="preserve">Najibi, A. (2020). </w:t>
+      </w:r>
       <w:r>
         <w:rPr>
           <w:i/>
           <w:iCs/>
         </w:rPr>
-        <w:t xml:space="preserve"> Humanities And Social </w:t>
+        <w:t>Racial Discrimination in Face Recognition Technology</w:t>
+      </w:r>
+      <w:r>
+        <w:t xml:space="preserve">. Retrieved from </w:t>
+      </w:r>
+      <w:r>
+        <w:tab/>
+        <w:t>https://sitn.hms.harvard.edu/flash/2020/racial-discrimination-in-face-recognition-</w:t>
+      </w:r>
+      <w:r>
+        <w:tab/>
+        <w:t>technology/</w:t>
+      </w:r>
+    </w:p>
+    <w:p>
+      <w:pPr>
+        <w:spacing w:line="480" w:lineRule="auto"/>
+      </w:pPr>
+      <w:r>
+        <w:t xml:space="preserve">Pankaj, S. D., and Wilscy, M. (2011). Face Recognition Using Fuzzy Neural Network Classifier. </w:t>
+      </w:r>
+    </w:p>
+    <w:p>
+      <w:pPr>
+        <w:spacing w:line="480" w:lineRule="auto"/>
+      </w:pPr>
+      <w:r>
+        <w:tab/>
+      </w:r>
+      <w:r>
+        <w:t>Retrieved</w:t>
+      </w:r>
+      <w:r>
+        <w:t xml:space="preserve"> from: https://sci-hub.se/10.1007/978-3-642-24037-9_6</w:t>
+      </w:r>
+    </w:p>
+    <w:p>
+      <w:pPr>
+        <w:spacing w:line="480" w:lineRule="auto"/>
+      </w:pPr>
+      <w:r>
+        <w:t xml:space="preserve">Parkhi, M. O., Vedaldi, A., and Ziseerman, A.  (2015). </w:t>
       </w:r>
       <w:r>
         <w:rPr>
           <w:i/>
           <w:iCs/>
         </w:rPr>
-        <w:tab/>
-        <w:t>Science</w:t>
-      </w:r>
-      <w:r>
-        <w:t xml:space="preserve">, 14(3): 112-118. Retrieved from: </w:t>
-      </w:r>
-      <w:r>
-        <w:tab/>
-        <w:t>https://www.iosrjournals.org/iosr-jhss/papers/Vol14-issue3/S0143112118.pdf</w:t>
-      </w:r>
-    </w:p>
-    <w:p>
-      <w:pPr>
-        <w:spacing w:line="480" w:lineRule="auto"/>
-      </w:pPr>
-      <w:r>
-        <w:lastRenderedPageBreak/>
-        <w:t xml:space="preserve">Najibi, A. (2020). </w:t>
+        <w:t>VGG Face Dataset</w:t>
+      </w:r>
+      <w:r>
+        <w:t xml:space="preserve">. Retrieved from: </w:t>
+      </w:r>
+    </w:p>
+    <w:p>
+      <w:pPr>
+        <w:spacing w:line="480" w:lineRule="auto"/>
+      </w:pPr>
+      <w:r>
+        <w:tab/>
+        <w:t>https://www.robots.ox.ac.uk/~vgg/data/vgg_face/</w:t>
+      </w:r>
+    </w:p>
+    <w:p>
+      <w:pPr>
+        <w:spacing w:line="480" w:lineRule="auto"/>
+      </w:pPr>
+      <w:r>
+        <w:t xml:space="preserve">Priya, G. A., Rekha, P. A., Sarabya, K. R., and Thanuganesh, M. (2014). Face Recognition with </w:t>
+      </w:r>
+    </w:p>
+    <w:p>
+      <w:pPr>
+        <w:spacing w:line="480" w:lineRule="auto"/>
+      </w:pPr>
+      <w:r>
+        <w:tab/>
+        <w:t>Different Approaches: A Survey. I</w:t>
       </w:r>
       <w:r>
         <w:rPr>
           <w:i/>
           <w:iCs/>
         </w:rPr>
-        <w:t>Racial Discrimination in Face Recognition Technology</w:t>
-      </w:r>
-      <w:r>
-        <w:t xml:space="preserve">. Retrieved from </w:t>
-      </w:r>
-      <w:r>
-        <w:tab/>
-        <w:t>https://sitn.hms.harvard.edu/flash/2020/racial-discrimination-in-face-recognition-</w:t>
-      </w:r>
-      <w:r>
-        <w:tab/>
-        <w:t>technology/</w:t>
-      </w:r>
-    </w:p>
-    <w:p>
-      <w:pPr>
-        <w:spacing w:line="480" w:lineRule="auto"/>
-      </w:pPr>
-      <w:r>
-        <w:t xml:space="preserve">Pankaj, S. D., and Wilscy, M. (2011). Face Recognition Using Fuzzy Neural Network Classifier. </w:t>
-      </w:r>
-    </w:p>
-    <w:p>
-      <w:pPr>
-        <w:spacing w:line="480" w:lineRule="auto"/>
-      </w:pPr>
-      <w:r>
-        <w:tab/>
-      </w:r>
-      <w:proofErr w:type="spellStart"/>
-      <w:r>
-        <w:t>Retrived</w:t>
-      </w:r>
-      <w:proofErr w:type="spellEnd"/>
-      <w:r>
-        <w:t xml:space="preserve"> from: https://sci-hub.se/10.1007/978-3-642-24037-9_6</w:t>
-      </w:r>
-    </w:p>
-    <w:p>
-      <w:pPr>
-        <w:spacing w:line="480" w:lineRule="auto"/>
-      </w:pPr>
-      <w:r>
-        <w:t xml:space="preserve">Parkhi, M. O., Vedaldi, A., and Ziseerman, A.  (2015). </w:t>
+        <w:t xml:space="preserve">nternational Journal of Emerging Engineering Research </w:t>
       </w:r>
       <w:r>
         <w:rPr>
           <w:i/>
           <w:iCs/>
         </w:rPr>
-        <w:t>VGG Face Dataset</w:t>
-      </w:r>
-      <w:r>
-        <w:t xml:space="preserve">. Retrieved from: </w:t>
-      </w:r>
-    </w:p>
-    <w:p>
-      <w:pPr>
-        <w:spacing w:line="480" w:lineRule="auto"/>
-      </w:pPr>
-      <w:r>
-        <w:tab/>
-        <w:t>https://www.robots.ox.ac.uk/~vgg/data/vgg_face/</w:t>
-      </w:r>
-    </w:p>
-    <w:p>
-      <w:pPr>
-        <w:spacing w:line="480" w:lineRule="auto"/>
-      </w:pPr>
-      <w:proofErr w:type="spellStart"/>
-      <w:r>
-        <w:t>Priya</w:t>
-      </w:r>
-      <w:proofErr w:type="spellEnd"/>
-      <w:r>
-        <w:t xml:space="preserve">, G. A., </w:t>
-      </w:r>
-      <w:proofErr w:type="spellStart"/>
-      <w:r>
-        <w:t>Rekha</w:t>
-      </w:r>
-      <w:proofErr w:type="spellEnd"/>
-      <w:r>
-        <w:t xml:space="preserve">, P. A., </w:t>
-      </w:r>
-      <w:proofErr w:type="spellStart"/>
-      <w:r>
-        <w:t>Sarabya</w:t>
-      </w:r>
-      <w:proofErr w:type="spellEnd"/>
-      <w:r>
-        <w:t xml:space="preserve">, K. R., and </w:t>
-      </w:r>
-      <w:proofErr w:type="spellStart"/>
-      <w:r>
-        <w:t>Thanuganesh</w:t>
-      </w:r>
-      <w:proofErr w:type="spellEnd"/>
-      <w:r>
-        <w:t xml:space="preserve">, M. (2014). Face Recognition with </w:t>
-      </w:r>
-    </w:p>
-    <w:p>
-      <w:pPr>
-        <w:spacing w:line="480" w:lineRule="auto"/>
-      </w:pPr>
-      <w:r>
-        <w:tab/>
-        <w:t>Different Approaches: A Survey. I</w:t>
+        <w:tab/>
+        <w:t>and Technology</w:t>
+      </w:r>
+      <w:r>
+        <w:t>, 2(7): 288-293. Retrieved from: http://www.ijeert.org/pdf/v2-i7/39.pdf</w:t>
+      </w:r>
+    </w:p>
+    <w:p>
+      <w:pPr>
+        <w:spacing w:line="480" w:lineRule="auto"/>
+      </w:pPr>
+      <w:r>
+        <w:t xml:space="preserve">Proyecto, F., C. (2010). Face Recognition Algorithms. University of the Basque Country. Retrieved </w:t>
+      </w:r>
+    </w:p>
+    <w:p>
+      <w:pPr>
+        <w:spacing w:line="480" w:lineRule="auto"/>
+      </w:pPr>
+      <w:r>
+        <w:tab/>
+        <w:t xml:space="preserve">from: </w:t>
+      </w:r>
+      <w:r>
+        <w:t>https://www.ehu.eus/ccwintco/uploads/e/eb/PFC-IonMarques.pdf</w:t>
+      </w:r>
+    </w:p>
+    <w:p>
+      <w:pPr>
+        <w:spacing w:line="480" w:lineRule="auto"/>
+      </w:pPr>
+      <w:r>
+        <w:t xml:space="preserve">Ranjan, A., Behera, N. J., and Reza. M. (2020). </w:t>
       </w:r>
       <w:r>
         <w:rPr>
           <w:i/>
           <w:iCs/>
         </w:rPr>
-        <w:t xml:space="preserve">nternational Journal of Emerging Engineering Research </w:t>
-      </w:r>
+        <w:t>A Parallel Approach for Real-Time Face</w:t>
+      </w:r>
+    </w:p>
+    <w:p>
+      <w:pPr>
+        <w:spacing w:line="480" w:lineRule="auto"/>
+      </w:pPr>
       <w:r>
         <w:rPr>
           <w:i/>
           <w:iCs/>
         </w:rPr>
         <w:tab/>
-        <w:t>and Technology</w:t>
-      </w:r>
-      <w:r>
-        <w:t>, 2(7): 288-293. Retrieved from: http://www.ijeert.org/pdf/v2-i7/39.pdf</w:t>
-      </w:r>
-    </w:p>
-    <w:p>
-      <w:pPr>
-        <w:spacing w:line="480" w:lineRule="auto"/>
-      </w:pPr>
-      <w:r>
-        <w:t xml:space="preserve">Proyecto, F., C. (2010). Face Recognition Algorithms. University of the Basque Country. Retrieved </w:t>
-      </w:r>
-    </w:p>
-    <w:p>
-      <w:pPr>
-        <w:spacing w:line="480" w:lineRule="auto"/>
-      </w:pPr>
-      <w:r>
-        <w:tab/>
-      </w:r>
-      <w:proofErr w:type="gramStart"/>
-      <w:r>
-        <w:t>from</w:t>
-      </w:r>
-      <w:proofErr w:type="gramEnd"/>
-      <w:r>
-        <w:t>:   https://www.ehu.eus/ccwintco/uploads/e/eb/PFC-IonMarques.pdf</w:t>
-      </w:r>
-    </w:p>
-    <w:p>
-      <w:pPr>
-        <w:spacing w:line="480" w:lineRule="auto"/>
-      </w:pPr>
-      <w:r>
-        <w:t xml:space="preserve">Ranjan, A., </w:t>
-      </w:r>
-      <w:proofErr w:type="spellStart"/>
-      <w:r>
-        <w:t>Behera</w:t>
-      </w:r>
-      <w:proofErr w:type="spellEnd"/>
-      <w:r>
-        <w:t xml:space="preserve">, N. J., and Reza. M. (2020). </w:t>
-      </w:r>
-      <w:r>
-        <w:rPr>
-          <w:i/>
-          <w:iCs/>
-        </w:rPr>
-        <w:t>A Parallel Approach for Real-Time Face</w:t>
-      </w:r>
-    </w:p>
-    <w:p>
-      <w:pPr>
-        <w:spacing w:line="480" w:lineRule="auto"/>
-      </w:pPr>
-      <w:r>
-        <w:rPr>
-          <w:i/>
-          <w:iCs/>
-        </w:rPr>
-        <w:tab/>
         <w:t>Recognition from a Large Database</w:t>
       </w:r>
       <w:r>
@@ -4789,37 +4665,8 @@
       <w:pPr>
         <w:spacing w:line="480" w:lineRule="auto"/>
       </w:pPr>
-      <w:proofErr w:type="spellStart"/>
-      <w:r>
-        <w:t>Rehman</w:t>
-      </w:r>
-      <w:proofErr w:type="spellEnd"/>
-      <w:r>
-        <w:t xml:space="preserve">, H. M., </w:t>
-      </w:r>
-      <w:proofErr w:type="spellStart"/>
-      <w:r>
-        <w:t>Liew</w:t>
-      </w:r>
-      <w:proofErr w:type="spellEnd"/>
-      <w:r>
-        <w:t xml:space="preserve">, S. C., Abbas, A., </w:t>
-      </w:r>
-      <w:proofErr w:type="spellStart"/>
-      <w:r>
-        <w:t>Jayaraman</w:t>
-      </w:r>
-      <w:proofErr w:type="spellEnd"/>
-      <w:r>
-        <w:t xml:space="preserve">, P. P., </w:t>
-      </w:r>
-      <w:proofErr w:type="spellStart"/>
-      <w:r>
-        <w:t>Wah</w:t>
-      </w:r>
-      <w:proofErr w:type="spellEnd"/>
-      <w:r>
-        <w:t xml:space="preserve">, Y. T., and Khan U. S. (2016). Big </w:t>
+      <w:r>
+        <w:t xml:space="preserve">Rehman, H. M., Liew, S. C., Abbas, A., Jayaraman, P. P., Wah, Y. T., and Khan U. S. (2016). Big </w:t>
       </w:r>
       <w:r>
         <w:tab/>
@@ -4866,16 +4713,14 @@
         </w:rPr>
         <w:t xml:space="preserve">S. (2017). Smartphone Usage </w:t>
       </w:r>
-      <w:proofErr w:type="gramStart"/>
       <w:r>
         <w:rPr>
           <w:rStyle w:val="Quotation"/>
           <w:i w:val="0"/>
           <w:iCs w:val="0"/>
         </w:rPr>
-        <w:t>Among</w:t>
-      </w:r>
-      <w:proofErr w:type="gramEnd"/>
+        <w:t>among</w:t>
+      </w:r>
       <w:r>
         <w:rPr>
           <w:rStyle w:val="Quotation"/>
@@ -4933,40 +4778,29 @@
         <w:spacing w:line="480" w:lineRule="auto"/>
       </w:pPr>
       <w:r>
-        <w:t xml:space="preserve">Saxena, S., </w:t>
-      </w:r>
-      <w:proofErr w:type="spellStart"/>
-      <w:r>
-        <w:t>Alam</w:t>
-      </w:r>
-      <w:proofErr w:type="spellEnd"/>
-      <w:r>
-        <w:t xml:space="preserve">, M., </w:t>
-      </w:r>
-      <w:proofErr w:type="spellStart"/>
-      <w:r>
-        <w:t>Jabarullah</w:t>
-      </w:r>
-      <w:proofErr w:type="spellEnd"/>
-      <w:r>
-        <w:t xml:space="preserve">, M., and Yadav, R. (2018). Face Recognition Using Coupled the </w:t>
-      </w:r>
-    </w:p>
-    <w:p>
-      <w:pPr>
-        <w:spacing w:line="480" w:lineRule="auto"/>
-      </w:pPr>
-      <w:r>
+        <w:t xml:space="preserve">Saxena, S., Alam, M., Jabarullah, M., and Yadav, R. (2018). Face Recognition Using Coupled the </w:t>
+      </w:r>
+    </w:p>
+    <w:p>
+      <w:pPr>
+        <w:spacing w:line="480" w:lineRule="auto"/>
+      </w:pPr>
+      <w:r>
+        <w:lastRenderedPageBreak/>
         <w:tab/>
         <w:t xml:space="preserve">Hidden Markov Model </w:t>
       </w:r>
-      <w:proofErr w:type="gramStart"/>
-      <w:r>
-        <w:t>With</w:t>
-      </w:r>
-      <w:proofErr w:type="gramEnd"/>
-      <w:r>
-        <w:t xml:space="preserve"> An Artificial Neural Network. </w:t>
+      <w:r>
+        <w:t>with</w:t>
+      </w:r>
+      <w:r>
+        <w:t xml:space="preserve"> </w:t>
+      </w:r>
+      <w:r>
+        <w:t>an</w:t>
+      </w:r>
+      <w:r>
+        <w:t xml:space="preserve"> Artificial Neural Network. </w:t>
       </w:r>
       <w:r>
         <w:rPr>
@@ -4992,7 +4826,6 @@
         <w:spacing w:line="480" w:lineRule="auto"/>
       </w:pPr>
       <w:r>
-        <w:lastRenderedPageBreak/>
         <w:t xml:space="preserve">Singh S., and Singh R. (2014). Face Recognition Using Gabor Wavelet Transform and Feed </w:t>
       </w:r>
       <w:r>
@@ -5006,443 +4839,364 @@
         </w:rPr>
         <w:t xml:space="preserve">International Journal of Advance Research </w:t>
       </w:r>
-      <w:proofErr w:type="gramStart"/>
       <w:r>
         <w:rPr>
           <w:i/>
           <w:iCs/>
         </w:rPr>
-        <w:t>In</w:t>
-      </w:r>
-      <w:proofErr w:type="gramEnd"/>
+        <w:t>in</w:t>
+      </w:r>
       <w:r>
         <w:rPr>
           <w:i/>
           <w:iCs/>
         </w:rPr>
-        <w:t xml:space="preserve"> Science And </w:t>
+        <w:t xml:space="preserve"> Science </w:t>
       </w:r>
       <w:r>
         <w:rPr>
           <w:i/>
           <w:iCs/>
         </w:rPr>
-        <w:tab/>
-        <w:t xml:space="preserve">Engineering, </w:t>
-      </w:r>
-      <w:r>
-        <w:t xml:space="preserve">3(11): 370-377. </w:t>
-      </w:r>
-    </w:p>
-    <w:p>
-      <w:pPr>
-        <w:spacing w:line="480" w:lineRule="auto"/>
-      </w:pPr>
-      <w:r>
-        <w:t xml:space="preserve">Schroff, F., Kalenichenko, D., and Phiblin, J. (2015-07-12). </w:t>
+        <w:t>and</w:t>
       </w:r>
       <w:r>
         <w:rPr>
           <w:i/>
           <w:iCs/>
         </w:rPr>
-        <w:t xml:space="preserve">FaceNet: A unified embedding for face </w:t>
-      </w:r>
-    </w:p>
-    <w:p>
-      <w:pPr>
-        <w:spacing w:line="480" w:lineRule="auto"/>
-      </w:pPr>
+        <w:t xml:space="preserve"> </w:t>
+      </w:r>
       <w:r>
         <w:rPr>
           <w:i/>
           <w:iCs/>
         </w:rPr>
         <w:tab/>
-      </w:r>
-      <w:proofErr w:type="gramStart"/>
-      <w:r>
+        <w:t xml:space="preserve">Engineering, </w:t>
+      </w:r>
+      <w:r>
+        <w:t xml:space="preserve">3(11): 370-377. </w:t>
+      </w:r>
+    </w:p>
+    <w:p>
+      <w:pPr>
+        <w:spacing w:line="480" w:lineRule="auto"/>
         <w:rPr>
           <w:i/>
           <w:iCs/>
         </w:rPr>
-        <w:t>recognition</w:t>
-      </w:r>
-      <w:proofErr w:type="gramEnd"/>
+      </w:pPr>
+      <w:r>
+        <w:t xml:space="preserve">Schroff, F., Kalenichenko, D., and Phiblin, J. (2015-07-12). </w:t>
+      </w:r>
       <w:r>
         <w:rPr>
           <w:i/>
           <w:iCs/>
         </w:rPr>
-        <w:t xml:space="preserve"> and clustering</w:t>
-      </w:r>
-      <w:r>
-        <w:t xml:space="preserve">, 2015 IEEE Conference on Computer Vision and Pattern </w:t>
-      </w:r>
-      <w:r>
-        <w:tab/>
-        <w:t>Recognition,  Boston, MA, USA. https://doi: 10.1109/CVPR.2015.7298682.</w:t>
-      </w:r>
-    </w:p>
-    <w:p>
-      <w:pPr>
-        <w:spacing w:line="480" w:lineRule="auto"/>
-      </w:pPr>
-      <w:proofErr w:type="spellStart"/>
-      <w:r>
-        <w:t>Shahin</w:t>
-      </w:r>
-      <w:proofErr w:type="spellEnd"/>
-      <w:r>
-        <w:t xml:space="preserve">, R. O., </w:t>
-      </w:r>
-      <w:proofErr w:type="spellStart"/>
-      <w:r>
-        <w:t>Ayedi</w:t>
-      </w:r>
-      <w:proofErr w:type="spellEnd"/>
-      <w:r>
-        <w:t xml:space="preserve">, R., Rayan, A., </w:t>
-      </w:r>
-      <w:proofErr w:type="spellStart"/>
-      <w:r>
-        <w:t>Rasha</w:t>
-      </w:r>
-      <w:proofErr w:type="spellEnd"/>
-      <w:r>
-        <w:t xml:space="preserve">, M., and Ahmed, A. (2021). Human Face Recognition </w:t>
-      </w:r>
-    </w:p>
-    <w:p>
-      <w:pPr>
-        <w:spacing w:line="480" w:lineRule="auto"/>
-      </w:pPr>
-      <w:r>
-        <w:tab/>
-      </w:r>
-      <w:proofErr w:type="gramStart"/>
-      <w:r>
-        <w:t>from</w:t>
-      </w:r>
-      <w:proofErr w:type="gramEnd"/>
-      <w:r>
-        <w:t xml:space="preserve"> Part of a Facial Image based in Image Stitching. </w:t>
-      </w:r>
+        <w:t xml:space="preserve">FaceNet: A unified embedding for face </w:t>
+      </w:r>
+    </w:p>
+    <w:p>
+      <w:pPr>
+        <w:spacing w:line="480" w:lineRule="auto"/>
+        <w:ind w:firstLine="709"/>
+      </w:pPr>
       <w:r>
         <w:rPr>
           <w:i/>
           <w:iCs/>
         </w:rPr>
-        <w:t xml:space="preserve">International Journal of Advanced </w:t>
+        <w:t>recognition and clustering</w:t>
+      </w:r>
+      <w:r>
+        <w:t xml:space="preserve">, 2015 IEEE Conference on Computer Vision and Pattern </w:t>
+      </w:r>
+      <w:r>
+        <w:tab/>
+        <w:t>Recognition</w:t>
+      </w:r>
+      <w:r>
+        <w:t>, Boston</w:t>
+      </w:r>
+      <w:r>
+        <w:t>, MA, USA. https://doi: 10.1109/CVPR.2015.7298682.</w:t>
+      </w:r>
+    </w:p>
+    <w:p>
+      <w:pPr>
+        <w:spacing w:line="480" w:lineRule="auto"/>
+      </w:pPr>
+      <w:r>
+        <w:t xml:space="preserve">Shahin, R. O., Ayedi, R., Rayan, A., Rasha, M., and Ahmed, A. (2021). Human Face Recognition </w:t>
+      </w:r>
+    </w:p>
+    <w:p>
+      <w:pPr>
+        <w:spacing w:line="480" w:lineRule="auto"/>
+      </w:pPr>
+      <w:r>
+        <w:tab/>
+        <w:t xml:space="preserve">from Part of a Facial Image based in Image Stitching. </w:t>
       </w:r>
       <w:r>
         <w:rPr>
           <w:i/>
           <w:iCs/>
         </w:rPr>
-        <w:tab/>
-        <w:t>Computer Science and Applications</w:t>
-      </w:r>
-      <w:r>
-        <w:t>, 12(12) 256-463.</w:t>
-      </w:r>
-    </w:p>
-    <w:p>
-      <w:pPr>
-        <w:spacing w:line="480" w:lineRule="auto"/>
-      </w:pPr>
-      <w:r>
-        <w:t xml:space="preserve">Soni, M., and Shukla, S. (2020). Convolutional Neural Network and Hidden Markov Model Based </w:t>
-      </w:r>
-    </w:p>
-    <w:p>
-      <w:pPr>
-        <w:spacing w:line="480" w:lineRule="auto"/>
-      </w:pPr>
-      <w:r>
-        <w:tab/>
-        <w:t xml:space="preserve">Face Recognition. </w:t>
+        <w:t xml:space="preserve">International Journal of Advanced </w:t>
       </w:r>
       <w:r>
         <w:rPr>
           <w:i/>
           <w:iCs/>
         </w:rPr>
-        <w:t xml:space="preserve">International Journal of Electrical, Electronics and Data </w:t>
+        <w:tab/>
+        <w:t>Computer Science and Applications</w:t>
+      </w:r>
+      <w:r>
+        <w:t>, 12(12) 256-463.</w:t>
+      </w:r>
+    </w:p>
+    <w:p>
+      <w:pPr>
+        <w:spacing w:line="480" w:lineRule="auto"/>
+      </w:pPr>
+      <w:r>
+        <w:t xml:space="preserve">Soni, M., and Shukla, S. (2020). Convolutional Neural Network and Hidden Markov Model Based </w:t>
+      </w:r>
+    </w:p>
+    <w:p>
+      <w:pPr>
+        <w:spacing w:line="480" w:lineRule="auto"/>
+      </w:pPr>
+      <w:r>
+        <w:tab/>
+        <w:t xml:space="preserve">Face Recognition. </w:t>
       </w:r>
       <w:r>
         <w:rPr>
           <w:i/>
           <w:iCs/>
         </w:rPr>
-        <w:tab/>
-        <w:t>Communication</w:t>
-      </w:r>
-      <w:r>
-        <w:t>, 8(2): 26-30.</w:t>
-      </w:r>
-    </w:p>
-    <w:p>
-      <w:pPr>
-        <w:spacing w:line="480" w:lineRule="auto"/>
-      </w:pPr>
-      <w:r>
-        <w:t xml:space="preserve">Struc, v. and Pavesic, N. (2009). A Case Study on Appearance Based Feature Extraction Techniques </w:t>
-      </w:r>
-    </w:p>
-    <w:p>
-      <w:pPr>
-        <w:spacing w:line="480" w:lineRule="auto"/>
-      </w:pPr>
-      <w:r>
-        <w:tab/>
-      </w:r>
-      <w:proofErr w:type="gramStart"/>
-      <w:r>
-        <w:t>and</w:t>
-      </w:r>
-      <w:proofErr w:type="gramEnd"/>
-      <w:r>
-        <w:t xml:space="preserve"> Their Susceptibility to Image Degradations for The Task of Face Recognition. W</w:t>
+        <w:t xml:space="preserve">International Journal of Electrical, Electronics and Data </w:t>
       </w:r>
       <w:r>
         <w:rPr>
           <w:i/>
           <w:iCs/>
         </w:rPr>
-        <w:t xml:space="preserve">orld </w:t>
+        <w:tab/>
+        <w:t>Communication</w:t>
+      </w:r>
+      <w:r>
+        <w:t>, 8(2): 26-30.</w:t>
+      </w:r>
+    </w:p>
+    <w:p>
+      <w:pPr>
+        <w:spacing w:line="480" w:lineRule="auto"/>
+      </w:pPr>
+      <w:r>
+        <w:t xml:space="preserve">Struc, v. and Pavesic, N. (2009). A Case Study on Appearance Based Feature Extraction Techniques </w:t>
+      </w:r>
+    </w:p>
+    <w:p>
+      <w:pPr>
+        <w:spacing w:line="480" w:lineRule="auto"/>
+      </w:pPr>
+      <w:r>
+        <w:tab/>
+        <w:t xml:space="preserve">and Their Susceptibility to Image Degradations for </w:t>
+      </w:r>
+      <w:r>
+        <w:t>the</w:t>
+      </w:r>
+      <w:r>
+        <w:t xml:space="preserve"> Task of Face Recognition. W</w:t>
       </w:r>
       <w:r>
         <w:rPr>
           <w:i/>
           <w:iCs/>
         </w:rPr>
-        <w:tab/>
-        <w:t>Academy of Science, Engineering and Technology,</w:t>
-      </w:r>
-      <w:r>
-        <w:t xml:space="preserve"> 30(2009): 806-814.</w:t>
-      </w:r>
-    </w:p>
-    <w:p>
-      <w:pPr>
-        <w:spacing w:line="480" w:lineRule="auto"/>
-      </w:pPr>
-      <w:r>
-        <w:t xml:space="preserve">The United Nations. (2021). Technology and Innovation Report 2021. Retrieved from </w:t>
-      </w:r>
-    </w:p>
-    <w:p>
-      <w:pPr>
-        <w:spacing w:line="480" w:lineRule="auto"/>
-      </w:pPr>
-      <w:r>
-        <w:tab/>
-        <w:t>https://unctad.org/system/files/official-document/tir2020_en.pdf</w:t>
-      </w:r>
-    </w:p>
-    <w:p>
-      <w:pPr>
-        <w:spacing w:line="480" w:lineRule="auto"/>
-      </w:pPr>
-      <w:r>
-        <w:t xml:space="preserve">Vicario, G., and Coleman, S. (2018). A Review of Data Science in Business and Industry and a </w:t>
-      </w:r>
-    </w:p>
-    <w:p>
-      <w:pPr>
-        <w:spacing w:line="480" w:lineRule="auto"/>
-      </w:pPr>
-      <w:r>
-        <w:tab/>
-        <w:t xml:space="preserve">Future Review. </w:t>
+        <w:t xml:space="preserve">orld </w:t>
       </w:r>
       <w:r>
         <w:rPr>
           <w:i/>
           <w:iCs/>
         </w:rPr>
-        <w:t xml:space="preserve">Applied Stochastic Models in Business and Industry, </w:t>
-      </w:r>
-      <w:r>
-        <w:t>36(1), 6-18</w:t>
+        <w:tab/>
+        <w:t>Academy of Science, Engineering and Technology,</w:t>
+      </w:r>
+      <w:r>
+        <w:t xml:space="preserve"> 30(2009): 806-814.</w:t>
+      </w:r>
+    </w:p>
+    <w:p>
+      <w:pPr>
+        <w:spacing w:line="480" w:lineRule="auto"/>
+      </w:pPr>
+      <w:r>
+        <w:t xml:space="preserve">The United Nations. (2021). Technology and Innovation Report 2021. Retrieved from </w:t>
+      </w:r>
+    </w:p>
+    <w:p>
+      <w:pPr>
+        <w:spacing w:line="480" w:lineRule="auto"/>
+      </w:pPr>
+      <w:r>
+        <w:tab/>
+        <w:t>https://unctad.org/system/files/official-document/tir2020_en.pdf</w:t>
+      </w:r>
+    </w:p>
+    <w:p>
+      <w:pPr>
+        <w:spacing w:line="480" w:lineRule="auto"/>
+      </w:pPr>
+      <w:r>
+        <w:t xml:space="preserve">Vicario, G., and Coleman, S. (2018). A Review of Data Science in Business and Industry and a </w:t>
+      </w:r>
+    </w:p>
+    <w:p>
+      <w:pPr>
+        <w:spacing w:line="480" w:lineRule="auto"/>
+      </w:pPr>
+      <w:r>
+        <w:tab/>
+        <w:t xml:space="preserve">Future Review. </w:t>
       </w:r>
       <w:r>
         <w:rPr>
           <w:i/>
           <w:iCs/>
         </w:rPr>
-        <w:t xml:space="preserve">. </w:t>
-      </w:r>
-    </w:p>
-    <w:p>
-      <w:pPr>
-        <w:spacing w:line="480" w:lineRule="auto"/>
-      </w:pPr>
+        <w:t xml:space="preserve">Applied Stochastic Models in Business and Industry, </w:t>
+      </w:r>
+      <w:r>
+        <w:t>36(1), 6-18</w:t>
+      </w:r>
       <w:r>
         <w:rPr>
           <w:i/>
           <w:iCs/>
         </w:rPr>
-        <w:tab/>
-      </w:r>
-      <w:r>
-        <w:t>https://doi:10.1002/asmb.2488</w:t>
-      </w:r>
-    </w:p>
-    <w:p>
-      <w:pPr>
-        <w:spacing w:line="480" w:lineRule="auto"/>
-      </w:pPr>
-      <w:r>
-        <w:t xml:space="preserve">Viegas, M. A., </w:t>
-      </w:r>
-      <w:proofErr w:type="spellStart"/>
-      <w:r>
-        <w:t>Simoes</w:t>
-      </w:r>
-      <w:proofErr w:type="spellEnd"/>
-      <w:r>
-        <w:t xml:space="preserve">, R., </w:t>
-      </w:r>
-      <w:proofErr w:type="spellStart"/>
-      <w:r>
-        <w:t>Thanekar</w:t>
-      </w:r>
-      <w:proofErr w:type="spellEnd"/>
-      <w:r>
-        <w:t xml:space="preserve">, N., </w:t>
-      </w:r>
-      <w:proofErr w:type="spellStart"/>
-      <w:r>
-        <w:t>Barnerjee</w:t>
-      </w:r>
-      <w:proofErr w:type="spellEnd"/>
-      <w:r>
-        <w:t xml:space="preserve">, S., </w:t>
-      </w:r>
-      <w:proofErr w:type="spellStart"/>
-      <w:r>
-        <w:t>Dicholkar</w:t>
-      </w:r>
-      <w:proofErr w:type="spellEnd"/>
-      <w:r>
-        <w:t xml:space="preserve">, R. (2019). Different Approaches </w:t>
-      </w:r>
-    </w:p>
-    <w:p>
-      <w:pPr>
-        <w:spacing w:line="480" w:lineRule="auto"/>
-      </w:pPr>
-      <w:r>
-        <w:tab/>
-      </w:r>
-      <w:proofErr w:type="gramStart"/>
-      <w:r>
-        <w:t>of</w:t>
-      </w:r>
-      <w:proofErr w:type="gramEnd"/>
-      <w:r>
-        <w:t xml:space="preserve"> Face Recognition. I</w:t>
-      </w:r>
+        <w:t xml:space="preserve">. </w:t>
+      </w:r>
+    </w:p>
+    <w:p>
+      <w:pPr>
+        <w:spacing w:line="480" w:lineRule="auto"/>
+      </w:pPr>
       <w:r>
         <w:rPr>
           <w:i/>
           <w:iCs/>
         </w:rPr>
-        <w:t xml:space="preserve">nternational Journal of Engineering Research &amp; Technology, </w:t>
-      </w:r>
-      <w:r>
-        <w:t xml:space="preserve">8(6): </w:t>
-      </w:r>
-      <w:r>
-        <w:tab/>
-        <w:t xml:space="preserve">933-934. </w:t>
-      </w:r>
-    </w:p>
-    <w:p>
-      <w:pPr>
-        <w:spacing w:line="480" w:lineRule="auto"/>
-      </w:pPr>
-      <w:r>
-        <w:t xml:space="preserve">Wu, Z., </w:t>
-      </w:r>
-      <w:proofErr w:type="spellStart"/>
-      <w:r>
-        <w:t>Xiamixiding</w:t>
-      </w:r>
-      <w:proofErr w:type="spellEnd"/>
-      <w:r>
-        <w:t xml:space="preserve">, R. </w:t>
-      </w:r>
-      <w:proofErr w:type="spellStart"/>
-      <w:r>
-        <w:t>Sjjanhar</w:t>
-      </w:r>
-      <w:proofErr w:type="spellEnd"/>
-      <w:r>
-        <w:t xml:space="preserve">, A., Chen, J., and Wen, Q. (2018). Image Appearance-Based </w:t>
-      </w:r>
-    </w:p>
-    <w:p>
-      <w:pPr>
-        <w:spacing w:line="480" w:lineRule="auto"/>
-      </w:pPr>
-      <w:r>
-        <w:lastRenderedPageBreak/>
-        <w:tab/>
-        <w:t xml:space="preserve">Facial Expression Recognition. </w:t>
+        <w:tab/>
+      </w:r>
+      <w:r>
+        <w:t>https://doi:10.1002/asmb.2488</w:t>
+      </w:r>
+    </w:p>
+    <w:p>
+      <w:pPr>
+        <w:spacing w:line="480" w:lineRule="auto"/>
+      </w:pPr>
+      <w:r>
+        <w:t xml:space="preserve">Viegas, M. A., Simoes, R., Thanekar, N., Barnerjee, S., Dicholkar, R. (2019). Different Approaches </w:t>
+      </w:r>
+    </w:p>
+    <w:p>
+      <w:pPr>
+        <w:spacing w:line="480" w:lineRule="auto"/>
+      </w:pPr>
+      <w:r>
+        <w:tab/>
+        <w:t>of Face Recognition. I</w:t>
       </w:r>
       <w:r>
         <w:rPr>
           <w:i/>
           <w:iCs/>
         </w:rPr>
-        <w:t>International Journal of Image and Graphics</w:t>
-      </w:r>
-      <w:r>
-        <w:t xml:space="preserve"> 18(2): 1 -12. </w:t>
-      </w:r>
-      <w:r>
-        <w:tab/>
-        <w:t>http://doi: 10.1142/S0219467818500122</w:t>
-      </w:r>
-    </w:p>
-    <w:p>
-      <w:pPr>
-        <w:spacing w:line="480" w:lineRule="auto"/>
-      </w:pPr>
-      <w:r>
-        <w:t>Xu</w:t>
-      </w:r>
-      <w:proofErr w:type="gramStart"/>
-      <w:r>
-        <w:t>,  Y</w:t>
-      </w:r>
-      <w:proofErr w:type="gramEnd"/>
-      <w:r>
-        <w:t>., Liang, F., Zhang, G., and Xu, H. (2016). Image Intelligent Detection Based on the Gabor</w:t>
-      </w:r>
-    </w:p>
-    <w:p>
-      <w:pPr>
-        <w:spacing w:line="480" w:lineRule="auto"/>
-      </w:pPr>
-      <w:r>
-        <w:tab/>
-        <w:t xml:space="preserve">Wavelet and the Neural Network. </w:t>
+        <w:t xml:space="preserve">nternational Journal of Engineering Research &amp; Technology, </w:t>
+      </w:r>
+      <w:r>
+        <w:t xml:space="preserve">8(6): </w:t>
+      </w:r>
+      <w:r>
+        <w:tab/>
+        <w:t xml:space="preserve">933-934. </w:t>
+      </w:r>
+    </w:p>
+    <w:p>
+      <w:pPr>
+        <w:spacing w:line="480" w:lineRule="auto"/>
+      </w:pPr>
+      <w:r>
+        <w:lastRenderedPageBreak/>
+        <w:t xml:space="preserve">Wu, Z., Xiamixiding, R. Sjjanhar, A., Chen, J., and Wen, Q. (2018). Image Appearance-Based </w:t>
+      </w:r>
+    </w:p>
+    <w:p>
+      <w:pPr>
+        <w:spacing w:line="480" w:lineRule="auto"/>
+      </w:pPr>
+      <w:r>
+        <w:tab/>
+        <w:t xml:space="preserve">Facial Expression Recognition. </w:t>
       </w:r>
       <w:r>
         <w:rPr>
           <w:i/>
           <w:iCs/>
         </w:rPr>
+        <w:t>International Journal of Image and Graphics</w:t>
+      </w:r>
+      <w:r>
+        <w:t xml:space="preserve"> 18(2): 1 -12. </w:t>
+      </w:r>
+      <w:r>
+        <w:tab/>
+        <w:t>http://doi: 10.1142/S0219467818500122</w:t>
+      </w:r>
+    </w:p>
+    <w:p>
+      <w:pPr>
+        <w:spacing w:line="480" w:lineRule="auto"/>
+      </w:pPr>
+      <w:r>
+        <w:t>Xu</w:t>
+      </w:r>
+      <w:r>
+        <w:t>, Y</w:t>
+      </w:r>
+      <w:r>
+        <w:t>., Liang, F., Zhang, G., and Xu, H. (2016). Image Intelligent Detection Based on the Gabor</w:t>
+      </w:r>
+    </w:p>
+    <w:p>
+      <w:pPr>
+        <w:spacing w:line="480" w:lineRule="auto"/>
+      </w:pPr>
+      <w:r>
+        <w:tab/>
+        <w:t xml:space="preserve">Wavelet and the Neural Network. </w:t>
+      </w:r>
+      <w:r>
+        <w:rPr>
+          <w:i/>
+          <w:iCs/>
+        </w:rPr>
         <w:t>Symmetry</w:t>
       </w:r>
       <w:r>
         <w:t xml:space="preserve"> 8(11): 1-11. </w:t>
       </w:r>
-      <w:hyperlink r:id="rId9">
+      <w:hyperlink r:id="rId10">
         <w:r>
           <w:tab/>
           <w:t>https://doi.org/10.3390/sym8110130</w:t>
@@ -5535,7 +5289,7 @@
           <w:rPr>
             <w:noProof/>
           </w:rPr>
-          <w:t>13</w:t>
+          <w:t>22</w:t>
         </w:r>
         <w:r>
           <w:rPr>
@@ -6438,7 +6192,6 @@
   <w:style w:type="character" w:default="1" w:styleId="DefaultParagraphFont">
     <w:name w:val="Default Paragraph Font"/>
     <w:uiPriority w:val="1"/>
-    <w:semiHidden/>
     <w:unhideWhenUsed/>
   </w:style>
   <w:style w:type="table" w:default="1" w:styleId="TableNormal">
@@ -6991,7 +6744,7 @@
 </file>
 
 <file path=customXml/itemProps1.xml><?xml version="1.0" encoding="utf-8"?>
-<ds:datastoreItem xmlns:ds="http://schemas.openxmlformats.org/officeDocument/2006/customXml" ds:itemID="{126353A6-9566-4CA3-906E-431143107CA2}">
+<ds:datastoreItem xmlns:ds="http://schemas.openxmlformats.org/officeDocument/2006/customXml" ds:itemID="{CFF603EF-84FF-4AEE-80B4-2337D2721DB9}">
   <ds:schemaRefs>
     <ds:schemaRef ds:uri="http://schemas.openxmlformats.org/officeDocument/2006/bibliography"/>
   </ds:schemaRefs>

</xml_diff>

<commit_message>
I don't know what changed
</commit_message>
<xml_diff>
--- a/SikoliaThesis.docx
+++ b/SikoliaThesis.docx
@@ -2,10 +2,6 @@
 <file path=word/document.xml><?xml version="1.0" encoding="utf-8"?>
 <w:document xmlns:wpc="http://schemas.microsoft.com/office/word/2010/wordprocessingCanvas" xmlns:cx="http://schemas.microsoft.com/office/drawing/2014/chartex" xmlns:cx1="http://schemas.microsoft.com/office/drawing/2015/9/8/chartex" xmlns:mc="http://schemas.openxmlformats.org/markup-compatibility/2006" xmlns:o="urn:schemas-microsoft-com:office:office" xmlns:r="http://schemas.openxmlformats.org/officeDocument/2006/relationships" xmlns:m="http://schemas.openxmlformats.org/officeDocument/2006/math" xmlns:v="urn:schemas-microsoft-com:vml" xmlns:wp14="http://schemas.microsoft.com/office/word/2010/wordprocessingDrawing" xmlns:wp="http://schemas.openxmlformats.org/drawingml/2006/wordprocessingDrawing" xmlns:w10="urn:schemas-microsoft-com:office:word" xmlns:w="http://schemas.openxmlformats.org/wordprocessingml/2006/main" xmlns:w14="http://schemas.microsoft.com/office/word/2010/wordml" xmlns:w15="http://schemas.microsoft.com/office/word/2012/wordml" xmlns:w16se="http://schemas.microsoft.com/office/word/2015/wordml/symex" xmlns:wpg="http://schemas.microsoft.com/office/word/2010/wordprocessingGroup" xmlns:wpi="http://schemas.microsoft.com/office/word/2010/wordprocessingInk" xmlns:wne="http://schemas.microsoft.com/office/word/2006/wordml" xmlns:wps="http://schemas.microsoft.com/office/word/2010/wordprocessingShape" mc:Ignorable="w14 w15 w16se wp14">
   <w:body>
-    <w:p>
-      <w:bookmarkStart w:id="0" w:name="_GoBack"/>
-      <w:bookmarkEnd w:id="0"/>
-    </w:p>
     <w:p/>
     <w:p/>
     <w:p/>
@@ -23,6 +19,7 @@
     <w:p/>
     <w:p/>
     <w:p/>
+    <w:p/>
     <w:p>
       <w:pPr>
         <w:pStyle w:val="HeaderandFooter"/>
@@ -101,7 +98,15 @@
         <w:jc w:val="center"/>
       </w:pPr>
       <w:r>
-        <w:t>A research proposal submitted to the Department of Statistics and Actuarial Science in partial fulfillment of the requirement for the award of the degree of a Post Graduate Diploma in Applied Statistics of Jomo Kenyatta University of Agriculture and Technology.</w:t>
+        <w:t xml:space="preserve">A research proposal submitted to the Department of Statistics and Actuarial Science in partial fulfillment of the requirement for the award of the degree of a Post Graduate Diploma in Applied Statistics of </w:t>
+      </w:r>
+      <w:proofErr w:type="spellStart"/>
+      <w:r>
+        <w:t>Jomo</w:t>
+      </w:r>
+      <w:proofErr w:type="spellEnd"/>
+      <w:r>
+        <w:t xml:space="preserve"> Kenyatta University of Agriculture and Technology.</w:t>
       </w:r>
     </w:p>
     <w:p>
@@ -133,12 +138,12 @@
       <w:pPr>
         <w:pStyle w:val="Heading1"/>
       </w:pPr>
-      <w:bookmarkStart w:id="1" w:name="_Toc123819399"/>
+      <w:bookmarkStart w:id="0" w:name="_Toc123819399"/>
       <w:r>
         <w:lastRenderedPageBreak/>
         <w:t>DECLARATION</w:t>
       </w:r>
-      <w:bookmarkEnd w:id="1"/>
+      <w:bookmarkEnd w:id="0"/>
     </w:p>
     <w:p>
       <w:pPr>
@@ -230,8 +235,21 @@
         <w:spacing w:line="480" w:lineRule="auto"/>
       </w:pPr>
       <w:r>
-        <w:t>Professor Anthony Gichuhi Waititu</w:t>
-      </w:r>
+        <w:t xml:space="preserve">Professor Anthony </w:t>
+      </w:r>
+      <w:proofErr w:type="spellStart"/>
+      <w:r>
+        <w:t>Gichuhi</w:t>
+      </w:r>
+      <w:proofErr w:type="spellEnd"/>
+      <w:r>
+        <w:t xml:space="preserve"> </w:t>
+      </w:r>
+      <w:proofErr w:type="spellStart"/>
+      <w:r>
+        <w:t>Waititu</w:t>
+      </w:r>
+      <w:proofErr w:type="spellEnd"/>
     </w:p>
     <w:p>
       <w:pPr>
@@ -245,8 +263,13 @@
       <w:pPr>
         <w:spacing w:line="480" w:lineRule="auto"/>
       </w:pPr>
-      <w:r>
-        <w:t>Jomo Kenyatta University of Agriculture and Technology</w:t>
+      <w:proofErr w:type="spellStart"/>
+      <w:r>
+        <w:t>Jomo</w:t>
+      </w:r>
+      <w:proofErr w:type="spellEnd"/>
+      <w:r>
+        <w:t xml:space="preserve"> Kenyatta University of Agriculture and Technology</w:t>
       </w:r>
     </w:p>
     <w:p>
@@ -267,8 +290,21 @@
         <w:spacing w:line="480" w:lineRule="auto"/>
       </w:pPr>
       <w:r>
-        <w:t>Dr. Anthony Kibera Wanjoya</w:t>
-      </w:r>
+        <w:t xml:space="preserve">Dr. Anthony </w:t>
+      </w:r>
+      <w:proofErr w:type="spellStart"/>
+      <w:r>
+        <w:t>Kibera</w:t>
+      </w:r>
+      <w:proofErr w:type="spellEnd"/>
+      <w:r>
+        <w:t xml:space="preserve"> </w:t>
+      </w:r>
+      <w:proofErr w:type="spellStart"/>
+      <w:r>
+        <w:t>Wanjoya</w:t>
+      </w:r>
+      <w:proofErr w:type="spellEnd"/>
     </w:p>
     <w:p>
       <w:pPr>
@@ -282,8 +318,13 @@
       <w:pPr>
         <w:spacing w:line="480" w:lineRule="auto"/>
       </w:pPr>
-      <w:r>
-        <w:t>Jomo Kenyatta University of Agriculture and Technology</w:t>
+      <w:proofErr w:type="spellStart"/>
+      <w:r>
+        <w:t>Jomo</w:t>
+      </w:r>
+      <w:proofErr w:type="spellEnd"/>
+      <w:r>
+        <w:t xml:space="preserve"> Kenyatta University of Agriculture and Technology</w:t>
       </w:r>
     </w:p>
     <w:p>
@@ -318,19 +359,51 @@
       <w:pPr>
         <w:pStyle w:val="Heading1"/>
       </w:pPr>
-      <w:bookmarkStart w:id="2" w:name="_Toc123819400"/>
+      <w:bookmarkStart w:id="1" w:name="_Toc123819400"/>
       <w:r>
         <w:lastRenderedPageBreak/>
         <w:t>DEDICATION</w:t>
       </w:r>
-      <w:bookmarkEnd w:id="2"/>
-    </w:p>
-    <w:p>
-      <w:pPr>
-        <w:spacing w:line="480" w:lineRule="auto"/>
-      </w:pPr>
-      <w:r>
-        <w:t xml:space="preserve">I dedicate my proposal to my family and friends. I am particularly grateful to my father whose moral support has been instrumental in my studies. My parents financial support and constant encouragement has been key to getting this far. My brothers Melchizedek Emmanuel Makuto, Hassan Chebkos, and Felix Imani have also been encouraging me all the way. I remember visiting them and calling them to laugh my stress of during my studies. My Dad, Dr. Stephen Sikolia’s moral support and my friend Ken Macharia’s words of positive affirmation gave me the spirit to keep going. My church also played a crucial role in my studies because the church strengthening me spiritually and emotionally. Above all I thank God for giving keeping me healthy and giving me the knowledge to complete my studies. </w:t>
+      <w:bookmarkEnd w:id="1"/>
+    </w:p>
+    <w:p>
+      <w:pPr>
+        <w:spacing w:line="480" w:lineRule="auto"/>
+      </w:pPr>
+      <w:r>
+        <w:t xml:space="preserve">I dedicate my proposal to my family and friends. I am particularly grateful to my father whose moral support has been instrumental in my studies. My parents financial support and constant encouragement has been key to getting this far. My brothers Melchizedek Emmanuel </w:t>
+      </w:r>
+      <w:proofErr w:type="spellStart"/>
+      <w:r>
+        <w:t>Makuto</w:t>
+      </w:r>
+      <w:proofErr w:type="spellEnd"/>
+      <w:r>
+        <w:t xml:space="preserve">, Hassan </w:t>
+      </w:r>
+      <w:proofErr w:type="spellStart"/>
+      <w:r>
+        <w:t>Chebkos</w:t>
+      </w:r>
+      <w:proofErr w:type="spellEnd"/>
+      <w:r>
+        <w:t xml:space="preserve">, and Felix Imani have also been encouraging me all the way. I remember visiting them and calling them to laugh my stress of during my studies. My Dad, Dr. Stephen </w:t>
+      </w:r>
+      <w:proofErr w:type="spellStart"/>
+      <w:r>
+        <w:t>Sikolia’s</w:t>
+      </w:r>
+      <w:proofErr w:type="spellEnd"/>
+      <w:r>
+        <w:t xml:space="preserve"> moral support and my friend Ken </w:t>
+      </w:r>
+      <w:proofErr w:type="spellStart"/>
+      <w:r>
+        <w:t>Macharia’s</w:t>
+      </w:r>
+      <w:proofErr w:type="spellEnd"/>
+      <w:r>
+        <w:t xml:space="preserve"> words of positive affirmation gave me the spirit to keep going. My church also played a crucial role in my studies because the church strengthening me spiritually and emotionally. Above all I thank God for giving keeping me healthy and giving me the knowledge to complete my studies. </w:t>
       </w:r>
     </w:p>
     <w:p>
@@ -410,19 +483,59 @@
       <w:pPr>
         <w:pStyle w:val="Heading1"/>
       </w:pPr>
-      <w:bookmarkStart w:id="3" w:name="_Toc123819401"/>
+      <w:bookmarkStart w:id="2" w:name="_Toc123819401"/>
       <w:r>
         <w:lastRenderedPageBreak/>
         <w:t>ACKNOWLEDGMENT</w:t>
       </w:r>
-      <w:bookmarkEnd w:id="3"/>
-    </w:p>
-    <w:p>
-      <w:pPr>
-        <w:spacing w:line="480" w:lineRule="auto"/>
-      </w:pPr>
-      <w:r>
-        <w:t>Special regards to my supervisors professor Anthony Gichuhi Waititu and Dr. Anthony Kibera Wanjoya for believing in me. Their continuous support, insightful comments, and immense knowledge have played a crucial role in this work. Their demand for excellence drove me to give my best in this thesis. My friend Festus Were has also been instrumental because he kept on checking up on me and my work. Our social meetings with Festus gave me several ideas on possible research topics for this proposal. I would also like to thank members of the department of statistics and actuarial sciences from the Jomo Kenyatta University of Agriculture and Technology for their support in my studies.</w:t>
+      <w:bookmarkEnd w:id="2"/>
+    </w:p>
+    <w:p>
+      <w:pPr>
+        <w:spacing w:line="480" w:lineRule="auto"/>
+      </w:pPr>
+      <w:r>
+        <w:t xml:space="preserve">Special regards to my supervisors professor Anthony </w:t>
+      </w:r>
+      <w:proofErr w:type="spellStart"/>
+      <w:r>
+        <w:t>Gichuhi</w:t>
+      </w:r>
+      <w:proofErr w:type="spellEnd"/>
+      <w:r>
+        <w:t xml:space="preserve"> </w:t>
+      </w:r>
+      <w:proofErr w:type="spellStart"/>
+      <w:r>
+        <w:t>Waititu</w:t>
+      </w:r>
+      <w:proofErr w:type="spellEnd"/>
+      <w:r>
+        <w:t xml:space="preserve"> and Dr. Anthony </w:t>
+      </w:r>
+      <w:proofErr w:type="spellStart"/>
+      <w:r>
+        <w:t>Kibera</w:t>
+      </w:r>
+      <w:proofErr w:type="spellEnd"/>
+      <w:r>
+        <w:t xml:space="preserve"> </w:t>
+      </w:r>
+      <w:proofErr w:type="spellStart"/>
+      <w:r>
+        <w:t>Wanjoya</w:t>
+      </w:r>
+      <w:proofErr w:type="spellEnd"/>
+      <w:r>
+        <w:t xml:space="preserve"> for believing in me. Their continuous support, insightful comments, and immense knowledge have played a crucial role in this work. Their demand for excellence drove me to give my best in this thesis. My friend Festus Were has also been instrumental because he kept on checking up on me and my work. Our social meetings with Festus gave me several ideas on possible research topics for this proposal. I would also like to thank members of the department of statistics and actuarial sciences from the </w:t>
+      </w:r>
+      <w:proofErr w:type="spellStart"/>
+      <w:r>
+        <w:t>Jomo</w:t>
+      </w:r>
+      <w:proofErr w:type="spellEnd"/>
+      <w:r>
+        <w:t xml:space="preserve"> Kenyatta University of Agriculture and Technology for their support in my studies.</w:t>
       </w:r>
     </w:p>
     <w:p>
@@ -467,12 +580,12 @@
       <w:pPr>
         <w:pStyle w:val="Heading1"/>
       </w:pPr>
-      <w:bookmarkStart w:id="4" w:name="_Toc123819402"/>
+      <w:bookmarkStart w:id="3" w:name="_Toc123819402"/>
       <w:r>
         <w:lastRenderedPageBreak/>
         <w:t>ABSTRACT</w:t>
       </w:r>
-      <w:bookmarkEnd w:id="4"/>
+      <w:bookmarkEnd w:id="3"/>
     </w:p>
     <w:p>
       <w:pPr>
@@ -2208,12 +2321,12 @@
       <w:pPr>
         <w:pStyle w:val="Heading1"/>
       </w:pPr>
-      <w:bookmarkStart w:id="5" w:name="_Toc123819403"/>
+      <w:bookmarkStart w:id="4" w:name="_Toc123819403"/>
       <w:r>
         <w:lastRenderedPageBreak/>
         <w:t>List of Tables</w:t>
       </w:r>
-      <w:bookmarkEnd w:id="5"/>
+      <w:bookmarkEnd w:id="4"/>
     </w:p>
     <w:p>
       <w:pPr>
@@ -2277,12 +2390,12 @@
       <w:pPr>
         <w:pStyle w:val="Heading1"/>
       </w:pPr>
-      <w:bookmarkStart w:id="6" w:name="_Toc123819404"/>
+      <w:bookmarkStart w:id="5" w:name="_Toc123819404"/>
       <w:r>
         <w:lastRenderedPageBreak/>
         <w:t>List of Figures</w:t>
       </w:r>
-      <w:bookmarkEnd w:id="6"/>
+      <w:bookmarkEnd w:id="5"/>
     </w:p>
     <w:p>
       <w:pPr>
@@ -2337,98 +2450,127 @@
       <w:pPr>
         <w:pStyle w:val="Heading1"/>
       </w:pPr>
-      <w:bookmarkStart w:id="7" w:name="_Toc123819405"/>
+      <w:bookmarkStart w:id="6" w:name="_Toc123819405"/>
       <w:r>
         <w:lastRenderedPageBreak/>
         <w:t>Chapter One</w:t>
       </w:r>
+      <w:bookmarkEnd w:id="6"/>
+    </w:p>
+    <w:p>
+      <w:pPr>
+        <w:pStyle w:val="Heading2"/>
+      </w:pPr>
+      <w:bookmarkStart w:id="7" w:name="_Toc123819406"/>
+      <w:r>
+        <w:t>Introduction</w:t>
+      </w:r>
       <w:bookmarkEnd w:id="7"/>
     </w:p>
     <w:p>
       <w:pPr>
         <w:pStyle w:val="Heading2"/>
       </w:pPr>
-      <w:bookmarkStart w:id="8" w:name="_Toc123819406"/>
-      <w:r>
-        <w:t>Introduction</w:t>
+      <w:bookmarkStart w:id="8" w:name="_Toc123819407"/>
+      <w:r>
+        <w:t xml:space="preserve">1.1 </w:t>
+      </w:r>
+      <w:r>
+        <w:t>Background</w:t>
+      </w:r>
+      <w:r>
+        <w:t xml:space="preserve"> of Study</w:t>
       </w:r>
       <w:bookmarkEnd w:id="8"/>
     </w:p>
     <w:p>
       <w:pPr>
+        <w:spacing w:line="480" w:lineRule="auto"/>
+      </w:pPr>
+      <w:r>
+        <w:tab/>
+        <w:t xml:space="preserve">The emergence of big data has disrupted technology. Critical to the discussion is the fact that the data science is one of the best professions of the big data era. As evidenced, Davenport and </w:t>
+      </w:r>
+      <w:proofErr w:type="spellStart"/>
+      <w:r>
+        <w:t>Patil</w:t>
+      </w:r>
+      <w:proofErr w:type="spellEnd"/>
+      <w:r>
+        <w:t xml:space="preserve"> (2012) published an article arguing that data science is the sexiest job of the century. In a different publication, Vicario and Coleman (2018) mention that data scientists work in industries such as technology, production industries, e-commerce, and even agriculture. Clearly, the need for skilled personnel in data science is growing at an alarming rate, which has resulted in a lot of competition among giant companies in technology. This has led to innovations such as speech </w:t>
+      </w:r>
+      <w:r>
+        <w:t>recognition (</w:t>
+      </w:r>
+      <w:proofErr w:type="spellStart"/>
+      <w:r>
+        <w:t>siri</w:t>
+      </w:r>
+      <w:proofErr w:type="spellEnd"/>
+      <w:r>
+        <w:t xml:space="preserve">) by apple, image detection by Google, and video recommendation from YouTube. Indeed, giant technology companies are consuming big data to create applications that are revolutionizing the world. These recent innovations prove that data science is growing rapidly and that the world is </w:t>
+      </w:r>
+      <w:r>
+        <w:t>yet to</w:t>
+      </w:r>
+      <w:r>
+        <w:t xml:space="preserve"> see additional applications that will consume big data. </w:t>
+      </w:r>
+    </w:p>
+    <w:p>
+      <w:pPr>
+        <w:spacing w:line="480" w:lineRule="auto"/>
+      </w:pPr>
+      <w:r>
+        <w:tab/>
+        <w:t>The big data era is fueled by gadgets that emit and store huge amounts of data. Examples of such gadgets include the smartphones, laptops, desktops, and IOT devices such as smart watches, and smart refrigerators. Owing to the recent increase in the amount of such data, people today store their extra data in the cloud and external hard drives but some of people still store their data in gadgets that produce that data.  Critical to the discussion is the fact that smartphones have limited storage spaces implying that smartphone users at times extend their storage to the cloud. Additionally, the huge amount of storage space in smartphones is consumed by images and videos. These images and videos are mostly from social media while some of them come from pictures and videos recorded from smartphones. In short, smartphones produce a considerable amount of data that should be harnessed to make the world a better place.</w:t>
+      </w:r>
+    </w:p>
+    <w:p>
+      <w:pPr>
+        <w:spacing w:line="480" w:lineRule="auto"/>
+      </w:pPr>
+      <w:r>
+        <w:lastRenderedPageBreak/>
+        <w:tab/>
+        <w:t xml:space="preserve">Indeed, huge technology companies such as Google and Apple have developed world class applications that have enabled them to enjoy a competitive advantage over other companies.  These data science applications (from Google and Apple) have been made possible by techniques such as support vector machines, random forests, decision trees, and neural networks. The term neural network refers to a connection of layers comprising of units called </w:t>
+      </w:r>
+      <w:proofErr w:type="spellStart"/>
+      <w:r>
+        <w:t>perceptrons</w:t>
+      </w:r>
+      <w:proofErr w:type="spellEnd"/>
+      <w:r>
+        <w:t xml:space="preserve">, which is made up of an input layer (the predictor variables), a processing unit, and an output layer (the response variable). The processing unit could comprise of one or more hidden layers. That said, deep learning occurs when a neural network is created with more than one hidden layer. Having defined deep learning, it is imperative to highlight that decision trees and support vector machines were more famous than neural networks. However, the neural networks were brought to fame when Geoffrey Hinton et al (2006) developed a neural network that predicted hand written digits with an accuracy of 98%. </w:t>
+      </w:r>
+    </w:p>
+    <w:p>
+      <w:pPr>
+        <w:spacing w:line="480" w:lineRule="auto"/>
+      </w:pPr>
+      <w:r>
+        <w:tab/>
+        <w:t xml:space="preserve">Another field that emerged from deep learning is facial recognition.  Lately, the field of facial recognition has attracted a lot of attention from scholars and practitioners.  Some of the innovations that have emerged out of facial recognition include development of home authentication systems, attendance management systems, security surveillance systems, and emotion recognition systems. Critical to the debate is the fact that different solutions of creating facial recognition systems have been proposed. This owes to the fact that Fu (2021) mentions the facial recognitions using geometric features, facial recognition based on a template, and model based facial recognition as some of the solutions that are used to create facial recognition systems. Additionally, </w:t>
+      </w:r>
+      <w:proofErr w:type="spellStart"/>
+      <w:r>
+        <w:t>Ranjan</w:t>
+      </w:r>
+      <w:proofErr w:type="spellEnd"/>
+      <w:r>
+        <w:t xml:space="preserve"> et al., (2020) mentions that the traditional model based facial recognition system relies on one hundred and twenty eight predictor variables. In summary, facial recognition is a new field that emerged out of deep learning and should be researched further.</w:t>
+      </w:r>
+    </w:p>
+    <w:p>
+      <w:pPr>
         <w:pStyle w:val="Heading2"/>
       </w:pPr>
-      <w:bookmarkStart w:id="9" w:name="_Toc123819407"/>
-      <w:r>
-        <w:t xml:space="preserve">1.1 </w:t>
-      </w:r>
-      <w:r>
-        <w:t>Background</w:t>
-      </w:r>
-      <w:r>
-        <w:t xml:space="preserve"> of Study</w:t>
-      </w:r>
-      <w:bookmarkEnd w:id="9"/>
-    </w:p>
-    <w:p>
-      <w:pPr>
-        <w:spacing w:line="480" w:lineRule="auto"/>
-      </w:pPr>
-      <w:r>
-        <w:tab/>
-        <w:t xml:space="preserve">The emergence of big data has disrupted technology. Critical to the discussion is the fact that the data science is one of the best professions of the big data era. As evidenced, Davenport and Patil (2012) published an article arguing that data science is the sexiest job of the century. In a different publication, Vicario and Coleman (2018) mention that data scientists work in industries such as technology, production industries, e-commerce, and even agriculture. Clearly, the need for skilled personnel in data science is growing at an alarming rate, which has resulted in a lot of competition among giant companies in technology. This has led to innovations such as speech </w:t>
-      </w:r>
-      <w:r>
-        <w:t>recognition (</w:t>
-      </w:r>
-      <w:r>
-        <w:t xml:space="preserve">siri) by apple, image detection by Google, and video recommendation from YouTube. Indeed, giant technology companies are consuming big data to create applications that are revolutionizing the world. These recent innovations prove that data science is growing rapidly and that the world is </w:t>
-      </w:r>
-      <w:r>
-        <w:t>yet to</w:t>
-      </w:r>
-      <w:r>
-        <w:t xml:space="preserve"> see additional applications that will consume big data. </w:t>
-      </w:r>
-    </w:p>
-    <w:p>
-      <w:pPr>
-        <w:spacing w:line="480" w:lineRule="auto"/>
-      </w:pPr>
-      <w:r>
-        <w:tab/>
-        <w:t>The big data era is fueled by gadgets that emit and store huge amounts of data. Examples of such gadgets include the smartphones, laptops, desktops, and IOT devices such as smart watches, and smart refrigerators. Owing to the recent increase in the amount of such data, people today store their extra data in the cloud and external hard drives but some of people still store their data in gadgets that produce that data.  Critical to the discussion is the fact that smartphones have limited storage spaces implying that smartphone users at times extend their storage to the cloud. Additionally, the huge amount of storage space in smartphones is consumed by images and videos. These images and videos are mostly from social media while some of them come from pictures and videos recorded from smartphones. In short, smartphones produce a considerable amount of data that should be harnessed to make the world a better place.</w:t>
-      </w:r>
-    </w:p>
-    <w:p>
-      <w:pPr>
-        <w:spacing w:line="480" w:lineRule="auto"/>
-      </w:pPr>
-      <w:r>
-        <w:lastRenderedPageBreak/>
-        <w:tab/>
-        <w:t xml:space="preserve">Indeed, huge technology companies such as Google and Apple have developed world class applications that have enabled them to enjoy a competitive advantage over other companies.  These data science applications (from Google and Apple) have been made possible by techniques such as support vector machines, random forests, decision trees, and neural networks. The term neural network refers to a connection of layers comprising of units called perceptrons, which is made up of an input layer (the predictor variables), a processing unit, and an output layer (the response variable). The processing unit could comprise of one or more hidden layers. That said, deep learning occurs when a neural network is created with more than one hidden layer. Having defined deep learning, it is imperative to highlight that decision trees and support vector machines were more famous than neural networks. However, the neural networks were brought to fame when Geoffrey Hinton et al (2006) developed a neural network that predicted hand written digits with an accuracy of 98%. </w:t>
-      </w:r>
-    </w:p>
-    <w:p>
-      <w:pPr>
-        <w:spacing w:line="480" w:lineRule="auto"/>
-      </w:pPr>
-      <w:r>
-        <w:tab/>
-        <w:t>Another field that emerged from deep learning is facial recognition.  Lately, the field of facial recognition has attracted a lot of attention from scholars and practitioners.  Some of the innovations that have emerged out of facial recognition include development of home authentication systems, attendance management systems, security surveillance systems, and emotion recognition systems. Critical to the debate is the fact that different solutions of creating facial recognition systems have been proposed. This owes to the fact that Fu (2021) mentions the facial recognitions using geometric features, facial recognition based on a template, and model based facial recognition as some of the solutions that are used to create facial recognition systems. Additionally, Ranjan et al., (2020) mentions that the traditional model based facial recognition system relies on one hundred and twenty eight predictor variables. In summary, facial recognition is a new field that emerged out of deep learning and should be researched further.</w:t>
-      </w:r>
-    </w:p>
-    <w:p>
-      <w:pPr>
-        <w:pStyle w:val="Heading2"/>
-      </w:pPr>
-      <w:bookmarkStart w:id="10" w:name="_Toc123819408"/>
+      <w:bookmarkStart w:id="9" w:name="_Toc123819408"/>
       <w:r>
         <w:lastRenderedPageBreak/>
         <w:t>1.2 Problem Statement</w:t>
       </w:r>
-      <w:bookmarkEnd w:id="10"/>
+      <w:bookmarkEnd w:id="9"/>
     </w:p>
     <w:p>
       <w:pPr>
@@ -2441,17 +2583,126 @@
       <w:r>
         <w:t xml:space="preserve">ognition systems. For example, </w:t>
       </w:r>
-      <w:r>
-        <w:t>Goel, Mehmood, Ugail (2021) mention solutions such as FaceNet, VGGFACE, VGG16 and VGG19 that are used for facial recognition. In a different paper, Chandra and Reddy (2020) discuss FaceNet, OpenFace, and DeepFace as solutions that could be used for facial recognition. Critical to the discussion is the fact that the mentioned solutions are just but a fraction of solutions that could be used for facial recognition. This is because there at least thirty papers that have been published each with a different solution for facial recognition. It is imperative to mention that all the publications have been tested on databases that collect images from the west. For instance, the FaceNet algorithm was developed from the Labeled Faces in the Wild dataset which mostly comprises of faces from the West. Likewise, the VGGFACE algorithm was developed using the VGG Face Dataset, which the authors caution may not be representative of the global human population (Parkhi, Vedaldi, and Ziseerman, 2015).</w:t>
-      </w:r>
-    </w:p>
-    <w:p>
-      <w:pPr>
-        <w:spacing w:line="480" w:lineRule="auto"/>
-      </w:pPr>
-      <w:r>
-        <w:tab/>
-        <w:t>Apparently, most of the facial recognition systems that have been developed ignore the fact that Africans and Black Americans need to be included in the development of such systems. This is a crucial point because developing facial recognition systems that include Africans and black Americans would add value to the field of facial recognition. As an evidence of this, Najibi (2020) reveals that the existing technologies are subject to racial bias especially against Black Americans. Moreover, Krishnapriya, et al., (2019) conducted a study on racial bias and facial recognition systems and concluded that there is a significant false match rate on faces from Black Americans. Vital to the debate is the reality that some media sources highlight the fact that racial bias in facial recognition is a problem in most facial recognition software. Specifically, Lohr (2018) posits that Google had to apologize because their facial recognition system identified black Americans as gorillas.  This indicates that the existing software on facial recognition should be revolutionized to include black faces when developing such software.</w:t>
+      <w:proofErr w:type="spellStart"/>
+      <w:r>
+        <w:t>Goel</w:t>
+      </w:r>
+      <w:proofErr w:type="spellEnd"/>
+      <w:r>
+        <w:t xml:space="preserve">, </w:t>
+      </w:r>
+      <w:proofErr w:type="spellStart"/>
+      <w:r>
+        <w:t>Mehmood</w:t>
+      </w:r>
+      <w:proofErr w:type="spellEnd"/>
+      <w:r>
+        <w:t xml:space="preserve">, </w:t>
+      </w:r>
+      <w:proofErr w:type="spellStart"/>
+      <w:r>
+        <w:t>Ugail</w:t>
+      </w:r>
+      <w:proofErr w:type="spellEnd"/>
+      <w:r>
+        <w:t xml:space="preserve"> (2021) mention solutions such as </w:t>
+      </w:r>
+      <w:proofErr w:type="spellStart"/>
+      <w:r>
+        <w:t>FaceNet</w:t>
+      </w:r>
+      <w:proofErr w:type="spellEnd"/>
+      <w:r>
+        <w:t xml:space="preserve">, VGGFACE, VGG16 and VGG19 that are used for facial recognition. In a different paper, Chandra and Reddy (2020) discuss </w:t>
+      </w:r>
+      <w:proofErr w:type="spellStart"/>
+      <w:r>
+        <w:t>FaceNet</w:t>
+      </w:r>
+      <w:proofErr w:type="spellEnd"/>
+      <w:r>
+        <w:t xml:space="preserve">, </w:t>
+      </w:r>
+      <w:proofErr w:type="spellStart"/>
+      <w:r>
+        <w:t>OpenFace</w:t>
+      </w:r>
+      <w:proofErr w:type="spellEnd"/>
+      <w:r>
+        <w:t xml:space="preserve">, and </w:t>
+      </w:r>
+      <w:proofErr w:type="spellStart"/>
+      <w:r>
+        <w:t>DeepFace</w:t>
+      </w:r>
+      <w:proofErr w:type="spellEnd"/>
+      <w:r>
+        <w:t xml:space="preserve"> as solutions that could be used for facial recognition. Critical to the discussion is the fact that the mentioned solutions are just but a fraction of solutions that could be used for facial recognition. This is because there at least thirty papers that have been published each with a different solution for facial recognition. It is imperative to mention that all the publications have been tested on databases that collect images from the west. For instance, the </w:t>
+      </w:r>
+      <w:proofErr w:type="spellStart"/>
+      <w:r>
+        <w:t>FaceNet</w:t>
+      </w:r>
+      <w:proofErr w:type="spellEnd"/>
+      <w:r>
+        <w:t xml:space="preserve"> algorithm was developed from the Labeled Faces in the Wild dataset which mostly comprises of faces from the West. Likewise, the VGGFACE algorithm was developed using the VGG Face Dataset, which the authors caution may not be representative of the global human population (</w:t>
+      </w:r>
+      <w:proofErr w:type="spellStart"/>
+      <w:r>
+        <w:t>Parkhi</w:t>
+      </w:r>
+      <w:proofErr w:type="spellEnd"/>
+      <w:r>
+        <w:t xml:space="preserve">, </w:t>
+      </w:r>
+      <w:proofErr w:type="spellStart"/>
+      <w:r>
+        <w:t>Vedaldi</w:t>
+      </w:r>
+      <w:proofErr w:type="spellEnd"/>
+      <w:r>
+        <w:t xml:space="preserve">, and </w:t>
+      </w:r>
+      <w:proofErr w:type="spellStart"/>
+      <w:r>
+        <w:t>Ziseerman</w:t>
+      </w:r>
+      <w:proofErr w:type="spellEnd"/>
+      <w:r>
+        <w:t>, 2015).</w:t>
+      </w:r>
+    </w:p>
+    <w:p>
+      <w:pPr>
+        <w:spacing w:line="480" w:lineRule="auto"/>
+      </w:pPr>
+      <w:r>
+        <w:tab/>
+        <w:t xml:space="preserve">Apparently, most of the facial recognition systems that have been developed ignore the fact that Africans and Black Americans need to be included in the development of such systems. This is a crucial point because developing facial recognition systems that include Africans and black Americans would add value to the field of facial recognition. As an evidence of this, </w:t>
+      </w:r>
+      <w:proofErr w:type="spellStart"/>
+      <w:r>
+        <w:t>Najibi</w:t>
+      </w:r>
+      <w:proofErr w:type="spellEnd"/>
+      <w:r>
+        <w:t xml:space="preserve"> (2020) reveals that the existing technologies are subject to racial bias especially against Black Americans. Moreover, </w:t>
+      </w:r>
+      <w:proofErr w:type="spellStart"/>
+      <w:r>
+        <w:t>Krishnapriya</w:t>
+      </w:r>
+      <w:proofErr w:type="spellEnd"/>
+      <w:r>
+        <w:t xml:space="preserve">, et al., (2019) conducted a study on racial bias and facial recognition systems and concluded that there is a significant false match rate on faces from Black Americans. Vital to the debate is the reality that some media sources highlight the fact that racial bias in facial recognition is a problem in most facial recognition software. Specifically, </w:t>
+      </w:r>
+      <w:proofErr w:type="spellStart"/>
+      <w:r>
+        <w:t>Lohr</w:t>
+      </w:r>
+      <w:proofErr w:type="spellEnd"/>
+      <w:r>
+        <w:t xml:space="preserve"> (2018) posits that Google had to apologize because their facial recognition system identified black Americans as gorillas.  This indicates that the existing software on facial recognition should be revolutionized to include black faces when developing such software.</w:t>
       </w:r>
     </w:p>
     <w:p>
@@ -2463,11 +2714,48 @@
         <w:tab/>
         <w:t xml:space="preserve">Clearly, most of the solutions that have been developed have focused of faces of people form the west but that is not all. This owes to the reality that none of the solutions that have been developed focused on images that have been extracted from smartphones. For example, the </w:t>
       </w:r>
-      <w:r>
-        <w:t>FaceNet was</w:t>
-      </w:r>
-      <w:r>
-        <w:t xml:space="preserve"> developed using the labeled faces in the wild dataset, whose images were collected from the internet (Schroff, Kalenichenko, and Phiblin, 2015). Similarly, the DeepFace algorithm was developed using three different datasets</w:t>
+      <w:proofErr w:type="spellStart"/>
+      <w:r>
+        <w:t>FaceNet</w:t>
+      </w:r>
+      <w:proofErr w:type="spellEnd"/>
+      <w:r>
+        <w:t xml:space="preserve"> was</w:t>
+      </w:r>
+      <w:r>
+        <w:t xml:space="preserve"> developed using the labeled faces in the wild dataset, whose images were collected from the internet (</w:t>
+      </w:r>
+      <w:proofErr w:type="spellStart"/>
+      <w:r>
+        <w:t>Schroff</w:t>
+      </w:r>
+      <w:proofErr w:type="spellEnd"/>
+      <w:r>
+        <w:t xml:space="preserve">, </w:t>
+      </w:r>
+      <w:proofErr w:type="spellStart"/>
+      <w:r>
+        <w:t>Kalenichenko</w:t>
+      </w:r>
+      <w:proofErr w:type="spellEnd"/>
+      <w:r>
+        <w:t xml:space="preserve">, and </w:t>
+      </w:r>
+      <w:proofErr w:type="spellStart"/>
+      <w:r>
+        <w:t>Phiblin</w:t>
+      </w:r>
+      <w:proofErr w:type="spellEnd"/>
+      <w:r>
+        <w:t xml:space="preserve">, 2015). Similarly, the </w:t>
+      </w:r>
+      <w:proofErr w:type="spellStart"/>
+      <w:r>
+        <w:t>DeepFace</w:t>
+      </w:r>
+      <w:proofErr w:type="spellEnd"/>
+      <w:r>
+        <w:t xml:space="preserve"> algorithm was developed using three different datasets</w:t>
       </w:r>
       <w:r>
         <w:t>: -</w:t>
@@ -2475,111 +2763,114 @@
       <w:r>
         <w:t xml:space="preserve"> the labeled faces in the wild dataset, the social face classification dataset (</w:t>
       </w:r>
+      <w:proofErr w:type="spellStart"/>
       <w:r>
         <w:rPr>
           <w:rStyle w:val="Quotation"/>
           <w:i w:val="0"/>
           <w:iCs w:val="0"/>
         </w:rPr>
-        <w:t>Balaban, 2019), and the YouTube faces dataset (Ferrari, Berretti, and Del Bimbo, 2018). Critical to the debate is the fact that the author did not find any facial recognition solution that was solely developed using smartphone images. In short, there is an array of publications on facial recognition but none of the papers based their solution on images that have been developed from Smartphone images.</w:t>
-      </w:r>
-    </w:p>
-    <w:p>
-      <w:pPr>
-        <w:pStyle w:val="Heading2"/>
-      </w:pPr>
-      <w:bookmarkStart w:id="11" w:name="_Toc123819409"/>
-      <w:r>
-        <w:t>1.3 Justification of the study</w:t>
-      </w:r>
-      <w:bookmarkEnd w:id="11"/>
-    </w:p>
-    <w:p>
-      <w:pPr>
-        <w:spacing w:line="480" w:lineRule="auto"/>
-      </w:pPr>
-      <w:r>
-        <w:tab/>
-        <w:t xml:space="preserve">A smartphone could be elucidated as a phone with advanced features such internet connectivity, software usage, and connection to a cellular network. It is imperative to mention that the advanced features on smartphones have made smartphones a household item today. </w:t>
-      </w:r>
-    </w:p>
-    <w:p>
-      <w:pPr>
-        <w:spacing w:line="480" w:lineRule="auto"/>
-      </w:pPr>
-      <w:r>
-        <w:t>It is because these features have smartphones applicable cases such as learning, interpersonal communication, entertainment</w:t>
-      </w:r>
-      <w:r>
-        <w:t>, and</w:t>
-      </w:r>
-      <w:r>
-        <w:t xml:space="preserve"> even business transactions. Unlike desktop computers </w:t>
-      </w:r>
-      <w:r>
-        <w:t>and laptops</w:t>
-      </w:r>
-      <w:r>
-        <w:t>, smartphones are portable, which makes them convenient to use. As a result, smartphones have penetrated the global market like no other device.  As evidenced, The United Nations (2021) argues that the current market for laptops is estimated at $102 billion and while that of smartphones is estimated at $522 billion. In a different, paper Liu and Ellis (2021) argue that an estimated 6.4 billion people in the entire globe own a smartphone. Finally, The United Nations (2021</w:t>
-      </w:r>
-      <w:r>
-        <w:t>) argues</w:t>
-      </w:r>
-      <w:r>
-        <w:t xml:space="preserve"> that the number of smartphone usage in Sub Saharan Africa rose by 28 percentage points between 2014 and 2018. </w:t>
-      </w:r>
-    </w:p>
-    <w:p>
-      <w:pPr>
-        <w:spacing w:line="480" w:lineRule="auto"/>
-      </w:pPr>
-      <w:r>
-        <w:lastRenderedPageBreak/>
-        <w:tab/>
-        <w:t xml:space="preserve">It is important to highlight that topical smartphones have cameras that are used by their consumers for photography. It is because a smartphone is more affordable and portable than a camera. It follows that smartphone users have the ability of taking pictures without a camera.    As evidenced, </w:t>
-      </w:r>
+        <w:t>Balaban</w:t>
+      </w:r>
+      <w:proofErr w:type="spellEnd"/>
       <w:r>
         <w:rPr>
           <w:rStyle w:val="Quotation"/>
           <w:i w:val="0"/>
           <w:iCs w:val="0"/>
         </w:rPr>
-        <w:t xml:space="preserve">Saraswathi (2017) conducted a study on smartphone usage among students and established that students like taking pictures using smartphones. Moreover, a study </w:t>
-      </w:r>
+        <w:t xml:space="preserve">, 2019), and the YouTube faces dataset (Ferrari, </w:t>
+      </w:r>
+      <w:proofErr w:type="spellStart"/>
       <w:r>
         <w:rPr>
           <w:rStyle w:val="Quotation"/>
           <w:i w:val="0"/>
           <w:iCs w:val="0"/>
         </w:rPr>
-        <w:t>conducted by</w:t>
-      </w:r>
+        <w:t>Berretti</w:t>
+      </w:r>
+      <w:proofErr w:type="spellEnd"/>
       <w:r>
         <w:rPr>
           <w:rStyle w:val="Quotation"/>
           <w:i w:val="0"/>
           <w:iCs w:val="0"/>
         </w:rPr>
-        <w:t xml:space="preserve"> Mother et al., (2013) reveals that the study population used smartphones mostly to send and receive</w:t>
-      </w:r>
-      <w:r>
-        <w:t xml:space="preserve"> </w:t>
-      </w:r>
+        <w:t>, and Del Bimbo, 2018). Critical to the debate is the fact that the author did not find any facial recognition solution that was solely developed using smartphone images. In short, there is an array of publications on facial recognition but none of the papers based their solution on images that have been developed from Smartphone images.</w:t>
+      </w:r>
+    </w:p>
+    <w:p>
+      <w:pPr>
+        <w:pStyle w:val="Heading2"/>
+      </w:pPr>
+      <w:bookmarkStart w:id="10" w:name="_Toc123819409"/>
+      <w:r>
+        <w:t>1.3 Justification of the study</w:t>
+      </w:r>
+      <w:bookmarkEnd w:id="10"/>
+    </w:p>
+    <w:p>
+      <w:pPr>
+        <w:spacing w:line="480" w:lineRule="auto"/>
+      </w:pPr>
+      <w:r>
+        <w:tab/>
+        <w:t xml:space="preserve">A smartphone could be elucidated as a phone with advanced features such internet connectivity, software usage, and connection to a cellular network. It is imperative to mention that the advanced features on smartphones have made smartphones a household item today. </w:t>
+      </w:r>
+    </w:p>
+    <w:p>
+      <w:pPr>
+        <w:spacing w:line="480" w:lineRule="auto"/>
+      </w:pPr>
+      <w:r>
+        <w:t>It is because these features have smartphones applicable cases such as learning, interpersonal communication, entertainment</w:t>
+      </w:r>
+      <w:r>
+        <w:t>, and</w:t>
+      </w:r>
+      <w:r>
+        <w:t xml:space="preserve"> even business transactions. Unlike desktop computers </w:t>
+      </w:r>
+      <w:r>
+        <w:t>and laptops</w:t>
+      </w:r>
+      <w:r>
+        <w:t>, smartphones are portable, which makes them convenient to use. As a result, smartphones have penetrated the global market like no other device.  As evidenced, The United Nations (2021) argues that the current market for laptops is estimated at $102 billion and while that of smartphones is estimated at $522 billion. In a different, paper Liu and Ellis (2021) argue that an estimated 6.4 billion people in the entire globe own a smartphone. Finally, The United Nations (2021</w:t>
+      </w:r>
+      <w:r>
+        <w:t>) argues</w:t>
+      </w:r>
+      <w:r>
+        <w:t xml:space="preserve"> that the number of smartphone usage in Sub Saharan Africa rose by 28 percentage points between 2014 and 2018. </w:t>
+      </w:r>
+    </w:p>
+    <w:p>
+      <w:pPr>
+        <w:spacing w:line="480" w:lineRule="auto"/>
+      </w:pPr>
+      <w:r>
+        <w:lastRenderedPageBreak/>
+        <w:tab/>
+        <w:t xml:space="preserve">It is important to highlight that topical smartphones have cameras that are used by their consumers for photography. It is because a smartphone is more affordable and portable than a camera. It follows that smartphone users have the ability of taking pictures without a camera.    As evidenced, </w:t>
+      </w:r>
+      <w:proofErr w:type="spellStart"/>
       <w:r>
         <w:rPr>
           <w:rStyle w:val="Quotation"/>
           <w:i w:val="0"/>
           <w:iCs w:val="0"/>
         </w:rPr>
-        <w:t xml:space="preserve">text messages (97.9%), take pictures (97.1%), play music (96.1%), setting the alarm (95.8%), referring to the calendar (94.5%), recording videos (92.5%), play games (91.9%), and exchanging pictures via </w:t>
-      </w:r>
+        <w:t>Saraswathi</w:t>
+      </w:r>
+      <w:proofErr w:type="spellEnd"/>
       <w:r>
         <w:rPr>
           <w:rStyle w:val="Quotation"/>
           <w:i w:val="0"/>
           <w:iCs w:val="0"/>
         </w:rPr>
-        <w:t>Bluetooth (</w:t>
+        <w:t xml:space="preserve"> (2017) conducted a study on smartphone usage among students and established that students like taking pictures using smartphones. Moreover, a study </w:t>
       </w:r>
       <w:r>
         <w:rPr>
@@ -2587,24 +2878,90 @@
           <w:i w:val="0"/>
           <w:iCs w:val="0"/>
         </w:rPr>
-        <w:t>91.7%). This indicates that there is an upsurge in the number of people who are relying on Smartphones to take pictures.</w:t>
-      </w:r>
-    </w:p>
-    <w:p>
-      <w:pPr>
-        <w:spacing w:line="480" w:lineRule="auto"/>
-      </w:pPr>
+        <w:t>conducted by</w:t>
+      </w:r>
       <w:r>
         <w:rPr>
           <w:rStyle w:val="Quotation"/>
           <w:i w:val="0"/>
           <w:iCs w:val="0"/>
         </w:rPr>
-        <w:tab/>
-        <w:t xml:space="preserve">Earlier studies already established that people rely smartphones for taking pictures but that is not all. This owes to the truth that recent studies also affirm the reality that human beings rely on smartphones for taking pictures. As an evidence of this, Dermawi and Tolle (2019) reveal that most downloaded applications from Google Play Store as of August 2018 were in the photography category. Imperative to the debate is the truth that the amount of data that is generated from smartphone pictures and videos is quickly increasing.  This is supported by </w:t>
-      </w:r>
-      <w:r>
-        <w:t xml:space="preserve">Blahnik and Schindelbeck (2021) who argue that some 2 trillion pictures will likely be taken every year, which is twice as much compared with five years ago and an upwards of 90% of them are taken using a smartphones. Clearly, smartphone photography is attracting attention from scholars and practitioners and should be examined with an aim of developing solutions that would add value to smartphone photography.  </w:t>
+        <w:t xml:space="preserve"> Mother et al., (2013) reveals that the study population used smartphones mostly to send and receive</w:t>
+      </w:r>
+      <w:r>
+        <w:t xml:space="preserve"> </w:t>
+      </w:r>
+      <w:r>
+        <w:rPr>
+          <w:rStyle w:val="Quotation"/>
+          <w:i w:val="0"/>
+          <w:iCs w:val="0"/>
+        </w:rPr>
+        <w:t xml:space="preserve">text messages (97.9%), take pictures (97.1%), play music (96.1%), setting the alarm (95.8%), referring to the calendar (94.5%), recording videos (92.5%), play games (91.9%), and exchanging pictures via </w:t>
+      </w:r>
+      <w:r>
+        <w:rPr>
+          <w:rStyle w:val="Quotation"/>
+          <w:i w:val="0"/>
+          <w:iCs w:val="0"/>
+        </w:rPr>
+        <w:t>Bluetooth (</w:t>
+      </w:r>
+      <w:r>
+        <w:rPr>
+          <w:rStyle w:val="Quotation"/>
+          <w:i w:val="0"/>
+          <w:iCs w:val="0"/>
+        </w:rPr>
+        <w:t>91.7%). This indicates that there is an upsurge in the number of people who are relying on Smartphones to take pictures.</w:t>
+      </w:r>
+    </w:p>
+    <w:p>
+      <w:pPr>
+        <w:spacing w:line="480" w:lineRule="auto"/>
+      </w:pPr>
+      <w:r>
+        <w:rPr>
+          <w:rStyle w:val="Quotation"/>
+          <w:i w:val="0"/>
+          <w:iCs w:val="0"/>
+        </w:rPr>
+        <w:tab/>
+        <w:t xml:space="preserve">Earlier studies already established that people rely smartphones for taking pictures but that is not all. This owes to the truth that recent studies also affirm the reality that human beings rely on smartphones for taking pictures. As an evidence of this, </w:t>
+      </w:r>
+      <w:proofErr w:type="spellStart"/>
+      <w:r>
+        <w:rPr>
+          <w:rStyle w:val="Quotation"/>
+          <w:i w:val="0"/>
+          <w:iCs w:val="0"/>
+        </w:rPr>
+        <w:t>Dermawi</w:t>
+      </w:r>
+      <w:proofErr w:type="spellEnd"/>
+      <w:r>
+        <w:rPr>
+          <w:rStyle w:val="Quotation"/>
+          <w:i w:val="0"/>
+          <w:iCs w:val="0"/>
+        </w:rPr>
+        <w:t xml:space="preserve"> and Tolle (2019) reveal that most downloaded applications from Google Play Store as of August 2018 were in the photography category. Imperative to the debate is the truth that the amount of data that is generated from smartphone pictures and videos is quickly increasing.  This is supported by </w:t>
+      </w:r>
+      <w:proofErr w:type="spellStart"/>
+      <w:r>
+        <w:t>Blahnik</w:t>
+      </w:r>
+      <w:proofErr w:type="spellEnd"/>
+      <w:r>
+        <w:t xml:space="preserve"> and </w:t>
+      </w:r>
+      <w:proofErr w:type="spellStart"/>
+      <w:r>
+        <w:t>Schindelbeck</w:t>
+      </w:r>
+      <w:proofErr w:type="spellEnd"/>
+      <w:r>
+        <w:t xml:space="preserve"> (2021) who argue that some 2 trillion pictures will likely be taken every year, which is twice as much compared with five years ago and an upwards of 90% of them are taken using a smartphones. Clearly, smartphone photography is attracting attention from scholars and practitioners and should be examined with an aim of developing solutions that would add value to smartphone photography.  </w:t>
       </w:r>
     </w:p>
     <w:p>
@@ -2624,7 +2981,7 @@
       <w:pPr>
         <w:pStyle w:val="Heading2"/>
       </w:pPr>
-      <w:bookmarkStart w:id="12" w:name="_Toc123819410"/>
+      <w:bookmarkStart w:id="11" w:name="_Toc123819410"/>
       <w:r>
         <w:rPr>
           <w:sz w:val="30"/>
@@ -2635,35 +2992,35 @@
       <w:r>
         <w:t>OBJECTIVES OF THE STUDY</w:t>
       </w:r>
+      <w:bookmarkEnd w:id="11"/>
+    </w:p>
+    <w:p>
+      <w:pPr>
+        <w:pStyle w:val="Heading3"/>
+      </w:pPr>
+      <w:bookmarkStart w:id="12" w:name="_Toc123819411"/>
+      <w:r>
+        <w:t>1.4.1 General Objective</w:t>
+      </w:r>
       <w:bookmarkEnd w:id="12"/>
     </w:p>
     <w:p>
       <w:pPr>
+        <w:spacing w:line="480" w:lineRule="auto"/>
+      </w:pPr>
+      <w:r>
+        <w:t>To create a deep learning model that can detect African faces using smartphone images</w:t>
+      </w:r>
+    </w:p>
+    <w:p>
+      <w:pPr>
         <w:pStyle w:val="Heading3"/>
       </w:pPr>
-      <w:bookmarkStart w:id="13" w:name="_Toc123819411"/>
-      <w:r>
-        <w:t>1.4.1 General Objective</w:t>
+      <w:bookmarkStart w:id="13" w:name="_Toc123819412"/>
+      <w:r>
+        <w:t>1.4.2 Specific Objectives</w:t>
       </w:r>
       <w:bookmarkEnd w:id="13"/>
-    </w:p>
-    <w:p>
-      <w:pPr>
-        <w:spacing w:line="480" w:lineRule="auto"/>
-      </w:pPr>
-      <w:r>
-        <w:t>To create a deep learning model that can detect African faces using smartphone images</w:t>
-      </w:r>
-    </w:p>
-    <w:p>
-      <w:pPr>
-        <w:pStyle w:val="Heading3"/>
-      </w:pPr>
-      <w:bookmarkStart w:id="14" w:name="_Toc123819412"/>
-      <w:r>
-        <w:t>1.4.2 Specific Objectives</w:t>
-      </w:r>
-      <w:bookmarkEnd w:id="14"/>
     </w:p>
     <w:p>
       <w:pPr>
@@ -2717,7 +3074,7 @@
       <w:pPr>
         <w:pStyle w:val="Heading2"/>
       </w:pPr>
-      <w:bookmarkStart w:id="15" w:name="_Toc123819413"/>
+      <w:bookmarkStart w:id="14" w:name="_Toc123819413"/>
       <w:r>
         <w:t xml:space="preserve">1.5 Significance </w:t>
       </w:r>
@@ -2733,7 +3090,7 @@
       <w:r>
         <w:t xml:space="preserve"> Study</w:t>
       </w:r>
-      <w:bookmarkEnd w:id="15"/>
+      <w:bookmarkEnd w:id="14"/>
     </w:p>
     <w:p>
       <w:pPr>
@@ -2775,30 +3132,61 @@
       <w:pPr>
         <w:pStyle w:val="Heading1"/>
       </w:pPr>
-      <w:bookmarkStart w:id="16" w:name="_Toc123819414"/>
+      <w:bookmarkStart w:id="15" w:name="_Toc123819414"/>
       <w:r>
         <w:lastRenderedPageBreak/>
         <w:t>Chapter Two</w:t>
       </w:r>
+      <w:bookmarkEnd w:id="15"/>
+    </w:p>
+    <w:p>
+      <w:pPr>
+        <w:pStyle w:val="Heading1"/>
+      </w:pPr>
+      <w:bookmarkStart w:id="16" w:name="_Toc123819415"/>
+      <w:r>
+        <w:t>Literature Review</w:t>
+      </w:r>
       <w:bookmarkEnd w:id="16"/>
     </w:p>
     <w:p>
       <w:pPr>
-        <w:pStyle w:val="Heading1"/>
-      </w:pPr>
-      <w:bookmarkStart w:id="17" w:name="_Toc123819415"/>
-      <w:r>
-        <w:t>Literature Review</w:t>
+        <w:pStyle w:val="Heading2"/>
+      </w:pPr>
+      <w:bookmarkStart w:id="17" w:name="_Toc123819416"/>
+      <w:r>
+        <w:t>2.1 Introduction</w:t>
       </w:r>
       <w:bookmarkEnd w:id="17"/>
     </w:p>
     <w:p>
       <w:pPr>
+        <w:spacing w:line="480" w:lineRule="auto"/>
+      </w:pPr>
+      <w:r>
+        <w:tab/>
+        <w:t xml:space="preserve">This section surveys previous works </w:t>
+      </w:r>
+      <w:r>
+        <w:t>done on</w:t>
+      </w:r>
+      <w:r>
+        <w:t xml:space="preserve"> facial recognition with a bias towards the objectives of this work. It begins with examining different types of methodologies that have been used for facial recognition before delving into how different types of neural networks have been used for facial recognition. Specifically, this proposal discusses how convolution neural networks</w:t>
+      </w:r>
+      <w:r>
+        <w:t>, recurrent</w:t>
+      </w:r>
+      <w:r>
+        <w:t xml:space="preserve"> neural networks, and long short term memory neural networks have been used for facial recognition. Finally, the proposal examines machine learning workflows from previous publications and how those workflows can be applied to facial recognition.</w:t>
+      </w:r>
+    </w:p>
+    <w:p>
+      <w:pPr>
         <w:pStyle w:val="Heading2"/>
       </w:pPr>
-      <w:bookmarkStart w:id="18" w:name="_Toc123819416"/>
-      <w:r>
-        <w:t>2.1 Introduction</w:t>
+      <w:bookmarkStart w:id="18" w:name="_Toc123819417"/>
+      <w:r>
+        <w:t>2.2 Facial Recognition</w:t>
       </w:r>
       <w:bookmarkEnd w:id="18"/>
     </w:p>
@@ -2808,37 +3196,6 @@
       </w:pPr>
       <w:r>
         <w:tab/>
-        <w:t xml:space="preserve">This section surveys previous works </w:t>
-      </w:r>
-      <w:r>
-        <w:t>done on</w:t>
-      </w:r>
-      <w:r>
-        <w:t xml:space="preserve"> facial recognition with a bias towards the objectives of this work. It begins with examining different types of methodologies that have been used for facial recognition before delving into how different types of neural networks have been used for facial recognition. Specifically, this proposal discusses how convolution neural networks</w:t>
-      </w:r>
-      <w:r>
-        <w:t>, recurrent</w:t>
-      </w:r>
-      <w:r>
-        <w:t xml:space="preserve"> neural networks, and long short term memory neural networks have been used for facial recognition. Finally, the proposal examines machine learning workflows from previous publications and how those workflows can be applied to facial recognition.</w:t>
-      </w:r>
-    </w:p>
-    <w:p>
-      <w:pPr>
-        <w:pStyle w:val="Heading2"/>
-      </w:pPr>
-      <w:bookmarkStart w:id="19" w:name="_Toc123819417"/>
-      <w:r>
-        <w:t>2.2 Facial Recognition</w:t>
-      </w:r>
-      <w:bookmarkEnd w:id="19"/>
-    </w:p>
-    <w:p>
-      <w:pPr>
-        <w:spacing w:line="480" w:lineRule="auto"/>
-      </w:pPr>
-      <w:r>
-        <w:tab/>
         <w:t>Facial recognition is a biometric technique used to identify faces and match those faces to a database of faces with an aim of identifying a human being from an image. From the definition, it is clear that face recognition is a two-step process with the first step being face detection and the second step being face identification. The first step of facial recognition (or the face detection step) is identifying and extracting human faces from an image. In this step, all objects in an image are extracted and checked to confirm if a picture contains a human face. If any human face is present in the image, the face is extracted from the image before step two begins. In the second step or the image identification step, an image is compared to faces stored in a database to identify if the face matches the face of a known person. In short, there is a difference between facial detection and facial recognition and that facial recognition begins with facial detection and finalizes with facial identification.</w:t>
       </w:r>
     </w:p>
@@ -2846,20 +3203,36 @@
       <w:pPr>
         <w:pStyle w:val="Heading3"/>
       </w:pPr>
-      <w:bookmarkStart w:id="20" w:name="_Toc123819418"/>
+      <w:bookmarkStart w:id="19" w:name="_Toc123819418"/>
       <w:r>
         <w:lastRenderedPageBreak/>
         <w:t>2.2.1 Face Detection</w:t>
       </w:r>
-      <w:bookmarkEnd w:id="20"/>
-    </w:p>
-    <w:p>
-      <w:pPr>
-        <w:spacing w:line="480" w:lineRule="auto"/>
-      </w:pPr>
-      <w:r>
-        <w:tab/>
-        <w:t>Given an arbitrary image, the objective of facial detection is to establish whether or not there are any faces in the image and if present, return the image location and extent of each face (Yang, Kriegman and Ahuja, 2002). It is important to highlight that there are several methods that could be used for detecting faces from images. These methods include knowledge based methods, feature invariant approaches, template matching methods, and appearance based methods. Indeed the mentioned methods are important when detecting faces from images, but all these methods are accompanied by several challenges. This owes to the reality that Yang, Kriegman and Ahuja (2002) list the following five challenges that are associated with facial detection</w:t>
+      <w:bookmarkEnd w:id="19"/>
+    </w:p>
+    <w:p>
+      <w:pPr>
+        <w:spacing w:line="480" w:lineRule="auto"/>
+      </w:pPr>
+      <w:r>
+        <w:tab/>
+        <w:t xml:space="preserve">Given an arbitrary image, the objective of facial detection is to establish whether or not there are any faces in the image and if present, return the image location and extent of each face (Yang, </w:t>
+      </w:r>
+      <w:proofErr w:type="spellStart"/>
+      <w:r>
+        <w:t>Kriegman</w:t>
+      </w:r>
+      <w:proofErr w:type="spellEnd"/>
+      <w:r>
+        <w:t xml:space="preserve"> and Ahuja, 2002). It is important to highlight that there are several methods that could be used for detecting faces from images. These methods include knowledge based methods, feature invariant approaches, template matching methods, and appearance based methods. Indeed the mentioned methods are important when detecting faces from images, but all these methods are accompanied by several challenges. This owes to the reality that Yang, </w:t>
+      </w:r>
+      <w:proofErr w:type="spellStart"/>
+      <w:r>
+        <w:t>Kriegman</w:t>
+      </w:r>
+      <w:proofErr w:type="spellEnd"/>
+      <w:r>
+        <w:t xml:space="preserve"> and Ahuja (2002) list the following five challenges that are associated with facial detection</w:t>
       </w:r>
       <w:r>
         <w:t>: -</w:t>
@@ -2968,7 +3341,12 @@
         <w:t xml:space="preserve">Imaging conditions and image orientation: </w:t>
       </w:r>
       <w:r>
-        <w:t>A huge chunk of solutions in computer vision make the assumption that there is a single illuminant lighting in an image. Regardless, that is not always the case. As evidenced, Finlayson and Fredembach (2007) reveal that images always contain shadows depending on the positions from different lights that affect an image. Important to the debate is the truth that Finlayson (2018) proposes a solution to the problems arising from illumination in computer vision.</w:t>
+        <w:t>A huge chunk of solutions in computer vision make the assumption that there is a single illuminant lighting in an image. Regardless, that is not always the case. As evidenced, Finlayson and Fredembach</w:t>
+      </w:r>
+      <w:bookmarkStart w:id="20" w:name="_GoBack"/>
+      <w:bookmarkEnd w:id="20"/>
+      <w:r>
+        <w:t xml:space="preserve"> (2007) reveal that images always contain shadows depending on the positions from different lights that affect an image. Important to the debate is the truth that Finlayson (2018) proposes a solution to the problems arising from illumination in computer vision.</w:t>
       </w:r>
     </w:p>
     <w:p>
@@ -3028,17 +3406,35 @@
       </w:pPr>
       <w:r>
         <w:tab/>
-        <w:t>The feature invariant method of face detection is a little bit different from the knowledge based method because it uses statistical methods on facial landmarks. Celiktutan, Ulukaya</w:t>
-      </w:r>
+        <w:t xml:space="preserve">The feature invariant method of face detection is a little bit different from the knowledge based method because it uses statistical methods on facial landmarks. </w:t>
+      </w:r>
+      <w:proofErr w:type="spellStart"/>
+      <w:r>
+        <w:t>Celiktutan</w:t>
+      </w:r>
+      <w:proofErr w:type="spellEnd"/>
+      <w:r>
+        <w:t xml:space="preserve">, </w:t>
+      </w:r>
+      <w:proofErr w:type="spellStart"/>
+      <w:r>
+        <w:t>Ulukaya</w:t>
+      </w:r>
+      <w:proofErr w:type="spellEnd"/>
       <w:r>
         <w:t>, and</w:t>
       </w:r>
       <w:r>
         <w:t xml:space="preserve"> </w:t>
       </w:r>
+      <w:proofErr w:type="spellStart"/>
       <w:r>
         <w:lastRenderedPageBreak/>
-        <w:t>Sankur (2013) define a face landmark as a prominent feature that can play a discriminative role or can serve as anchor points in face detection. Examples of such landmarks include the eye corners, the no</w:t>
+        <w:t>Sankur</w:t>
+      </w:r>
+      <w:proofErr w:type="spellEnd"/>
+      <w:r>
+        <w:t xml:space="preserve"> (2013) define a face landmark as a prominent feature that can play a discriminative role or can serve as anchor points in face detection. Examples of such landmarks include the eye corners, the no</w:t>
       </w:r>
       <w:r>
         <w:t xml:space="preserve">se tip, nostril corners, mouth corners, end points of </w:t>
@@ -3050,7 +3446,15 @@
         <w:t xml:space="preserve">the </w:t>
       </w:r>
       <w:r>
-        <w:t>chin. This approach works by detecting facial landmarks, texture and skin color before using a statistical model to identify the presence of a face in an image. Critical to the discussion is the reality that different authors have used the feature invariant approach for face detection. For instance, Kapil and Jain (2013) compared texture based to the structure and shape based feature invariant based methods and concluded that the texture based method is more accurate. However, the authors argue that feature invariant based methods are computationally expensive.</w:t>
+        <w:t xml:space="preserve">chin. This approach works by detecting facial landmarks, texture and skin color before using a statistical model to identify the presence of a face in an image. Critical to the discussion is the reality that different authors have used the feature invariant approach for face detection. For instance, </w:t>
+      </w:r>
+      <w:proofErr w:type="spellStart"/>
+      <w:r>
+        <w:t>Kapil</w:t>
+      </w:r>
+      <w:proofErr w:type="spellEnd"/>
+      <w:r>
+        <w:t xml:space="preserve"> and Jain (2013) compared texture based to the structure and shape based feature invariant based methods and concluded that the texture based method is more accurate. However, the authors argue that feature invariant based methods are computationally expensive.</w:t>
       </w:r>
     </w:p>
     <w:p>
@@ -3067,7 +3471,47 @@
       </w:pPr>
       <w:r>
         <w:tab/>
-        <w:t xml:space="preserve">This method functions to extract facial image features to gain the Euclidean distance value served as input face comparison value of the users’ faces stored in the database (Hidayat, Wibowo, Satria, Winursito, 2021). Simply put, the template based approach transforms an image into geometric primitives like curves and points. This is done by identifying distinctive features like the eye, the nose, the chin, and the mouth before measuring their relative positions, widths and other parameters of the distinctive features. Features extracted from an image are then compared to known features of a human face to check whether an image is that of a human face. For further elucidation the eye, nose, mouth and the chin are compared to that of a human face. If the features obtained from the image match those of a human face then the object in question is declared to be a human face. It is vital to note that Hidayat, et al., (2021) assert that the template approach of facial recognition is known to have a lighter computational load than other methods because it does not require features from the entire face. </w:t>
+        <w:t>This method functions to extract facial image features to gain the Euclidean distance value served as input face comparison value of the users’ faces stored in the database (</w:t>
+      </w:r>
+      <w:proofErr w:type="spellStart"/>
+      <w:r>
+        <w:t>Hidayat</w:t>
+      </w:r>
+      <w:proofErr w:type="spellEnd"/>
+      <w:r>
+        <w:t xml:space="preserve">, </w:t>
+      </w:r>
+      <w:proofErr w:type="spellStart"/>
+      <w:r>
+        <w:t>Wibowo</w:t>
+      </w:r>
+      <w:proofErr w:type="spellEnd"/>
+      <w:r>
+        <w:t xml:space="preserve">, </w:t>
+      </w:r>
+      <w:proofErr w:type="spellStart"/>
+      <w:r>
+        <w:t>Satria</w:t>
+      </w:r>
+      <w:proofErr w:type="spellEnd"/>
+      <w:r>
+        <w:t xml:space="preserve">, </w:t>
+      </w:r>
+      <w:proofErr w:type="spellStart"/>
+      <w:r>
+        <w:t>Winursito</w:t>
+      </w:r>
+      <w:proofErr w:type="spellEnd"/>
+      <w:r>
+        <w:t xml:space="preserve">, 2021). Simply put, the template based approach transforms an image into geometric primitives like curves and points. This is done by identifying distinctive features like the eye, the nose, the chin, and the mouth before measuring their relative positions, widths and other parameters of the distinctive features. Features extracted from an image are then compared to known features of a human face to check whether an image is that of a human face. For further elucidation the eye, nose, mouth and the chin are compared to that of a human face. If the features obtained from the image match those of a human face then the object in question is declared to be a human face. It is vital to note that </w:t>
+      </w:r>
+      <w:proofErr w:type="spellStart"/>
+      <w:r>
+        <w:t>Hidayat</w:t>
+      </w:r>
+      <w:proofErr w:type="spellEnd"/>
+      <w:r>
+        <w:t xml:space="preserve">, et al., (2021) assert that the template approach of facial recognition is known to have a lighter computational load than other methods because it does not require features from the entire face. </w:t>
       </w:r>
     </w:p>
     <w:p>
@@ -3189,6 +3633,7 @@
         <w:lastRenderedPageBreak/>
         <w:t xml:space="preserve">detection step is to identify whether an object in an image is a human face or not. Like in the face detection step, features like the eye, the nose, the chin, and the mouth are extracted from a human face before matching the features in question to a known face. Consider a face </w:t>
       </w:r>
+      <w:proofErr w:type="gramStart"/>
       <w:r>
         <w:rPr>
           <w:i/>
@@ -3196,6 +3641,7 @@
         </w:rPr>
         <w:t>A</w:t>
       </w:r>
+      <w:proofErr w:type="gramEnd"/>
       <w:r>
         <w:t xml:space="preserve"> belonging to a person B and a face C belonging to an unknown person. The template matching approach will collect facial characteristics from faces A and C. These characteristics from the unknown face C will be compared to characteristics from the known face A. If a match is found, then the decision will be that the unknown face C belongs to the person B.</w:t>
       </w:r>
@@ -3272,7 +3718,15 @@
       </w:pPr>
       <w:r>
         <w:tab/>
-        <w:t xml:space="preserve">It is imperative to mention that several authors have investigated the appearance based method for facial recognition. For instance, Struc and Pavesic (2009) examine the performance of appearance based methods subject to different environmental factors and conclude that the linear discriminant analysis produces the best results across different environmental conditions. Wu et al., (2018) also debate appearance based method of facial recognition by examining facial expressions using the technique in question. The authors controlled for lighting conditions using a histogram equalization technique and a brightness preserving technique and concluded that the brightness preserving technique performs better than the histogram equalization technique. Broti (2019) also examine appearance based method of facial recognition by discussing the principal components analysis, independent component analysis, linear discriminant analysis methods used in facial recognition. A drawback for this method is that it is challenging to find out an efficient combination of dimensionality reduction technique and classifier. </w:t>
+        <w:t xml:space="preserve">It is imperative to mention that several authors have investigated the appearance based method for facial recognition. For instance, Struc and Pavesic (2009) examine the performance of appearance based methods subject to different environmental factors and conclude that the linear discriminant analysis produces the best results across different environmental conditions. Wu et al., (2018) also debate appearance based method of facial recognition by examining facial expressions using the technique in question. The authors controlled for lighting conditions using a histogram equalization technique and a brightness preserving technique and concluded that the brightness preserving technique performs better than the histogram equalization technique. </w:t>
+      </w:r>
+      <w:proofErr w:type="spellStart"/>
+      <w:r>
+        <w:t>Broti</w:t>
+      </w:r>
+      <w:proofErr w:type="spellEnd"/>
+      <w:r>
+        <w:t xml:space="preserve"> (2019) also examine appearance based method of facial recognition by discussing the principal components analysis, independent component analysis, linear discriminant analysis methods used in facial recognition. A drawback for this method is that it is challenging to find out an efficient combination of dimensionality reduction technique and classifier. </w:t>
       </w:r>
     </w:p>
     <w:p>
@@ -3372,6 +3826,10 @@
         <w:jc w:val="center"/>
       </w:pPr>
       <w:r>
+        <w:rPr>
+          <w:noProof/>
+          <w:lang w:eastAsia="en-US" w:bidi="ar-SA"/>
+        </w:rPr>
         <w:lastRenderedPageBreak/>
         <w:drawing>
           <wp:inline distT="0" distB="0" distL="0" distR="0" wp14:anchorId="5B0FD793" wp14:editId="0F45A017">
@@ -3622,7 +4080,15 @@
         <w:spacing w:line="480" w:lineRule="auto"/>
       </w:pPr>
       <w:r>
-        <w:t xml:space="preserve">Ayo, F. M., Mustapha, M., Braimah, A. J., and Aina, A. D. (2021). Geometric Analysis and </w:t>
+        <w:t xml:space="preserve">Ayo, F. M., Mustapha, M., Braimah, A. J., and </w:t>
+      </w:r>
+      <w:proofErr w:type="spellStart"/>
+      <w:r>
+        <w:t>Aina</w:t>
+      </w:r>
+      <w:proofErr w:type="spellEnd"/>
+      <w:r>
+        <w:t xml:space="preserve">, A. D. (2021). Geometric Analysis and </w:t>
       </w:r>
     </w:p>
     <w:p>
@@ -3671,39 +4137,49 @@
       <w:pPr>
         <w:spacing w:line="480" w:lineRule="auto"/>
       </w:pPr>
+      <w:proofErr w:type="spellStart"/>
       <w:r>
         <w:rPr>
           <w:rStyle w:val="Quotation"/>
           <w:i w:val="0"/>
           <w:iCs w:val="0"/>
         </w:rPr>
-        <w:t>Balaban, S. (2019).</w:t>
-      </w:r>
-      <w:r>
-        <w:rPr>
-          <w:rStyle w:val="Quotation"/>
-        </w:rPr>
-        <w:t xml:space="preserve"> Deep learning and face recognition: the state of the art. </w:t>
-      </w:r>
+        <w:t>Balaban</w:t>
+      </w:r>
+      <w:proofErr w:type="spellEnd"/>
       <w:r>
         <w:rPr>
           <w:rStyle w:val="Quotation"/>
           <w:i w:val="0"/>
           <w:iCs w:val="0"/>
         </w:rPr>
-        <w:t xml:space="preserve">Retrieved from: </w:t>
-      </w:r>
-    </w:p>
-    <w:p>
-      <w:pPr>
-        <w:spacing w:line="480" w:lineRule="auto"/>
-      </w:pPr>
+        <w:t>, S. (2019).</w:t>
+      </w:r>
+      <w:r>
+        <w:rPr>
+          <w:rStyle w:val="Quotation"/>
+        </w:rPr>
+        <w:t xml:space="preserve"> Deep learning and face recognition: the state of the art. </w:t>
+      </w:r>
       <w:r>
         <w:rPr>
           <w:rStyle w:val="Quotation"/>
           <w:i w:val="0"/>
           <w:iCs w:val="0"/>
         </w:rPr>
+        <w:t xml:space="preserve">Retrieved from: </w:t>
+      </w:r>
+    </w:p>
+    <w:p>
+      <w:pPr>
+        <w:spacing w:line="480" w:lineRule="auto"/>
+      </w:pPr>
+      <w:r>
+        <w:rPr>
+          <w:rStyle w:val="Quotation"/>
+          <w:i w:val="0"/>
+          <w:iCs w:val="0"/>
+        </w:rPr>
         <w:tab/>
         <w:t>https://arxiv.org/pdf/1902.03524v1.pdf</w:t>
       </w:r>
@@ -3712,8 +4188,21 @@
       <w:pPr>
         <w:spacing w:line="480" w:lineRule="auto"/>
       </w:pPr>
-      <w:r>
-        <w:t xml:space="preserve">Blahnik, V. &amp; Schindelbeck, O. (2021). Smartphone Imaging Technology and its Applications. </w:t>
+      <w:proofErr w:type="spellStart"/>
+      <w:r>
+        <w:t>Blahnik</w:t>
+      </w:r>
+      <w:proofErr w:type="spellEnd"/>
+      <w:r>
+        <w:t xml:space="preserve">, V. &amp; </w:t>
+      </w:r>
+      <w:proofErr w:type="spellStart"/>
+      <w:r>
+        <w:t>Schindelbeck</w:t>
+      </w:r>
+      <w:proofErr w:type="spellEnd"/>
+      <w:r>
+        <w:t xml:space="preserve">, O. (2021). Smartphone Imaging Technology and its Applications. </w:t>
       </w:r>
     </w:p>
     <w:p>
@@ -3738,17 +4227,37 @@
       <w:pPr>
         <w:spacing w:line="480" w:lineRule="auto"/>
       </w:pPr>
-      <w:r>
-        <w:t xml:space="preserve">Brunelli, R., and Poggio, T. (2013). Face Recognition through Geometrical Features. Retrieved </w:t>
-      </w:r>
-    </w:p>
-    <w:p>
-      <w:pPr>
-        <w:spacing w:line="480" w:lineRule="auto"/>
-      </w:pPr>
-      <w:r>
-        <w:tab/>
-        <w:t>from: https://www.semanticscholar.org/paper/Face-Recognition-through-Geometrical-</w:t>
+      <w:proofErr w:type="spellStart"/>
+      <w:r>
+        <w:t>Brunelli</w:t>
+      </w:r>
+      <w:proofErr w:type="spellEnd"/>
+      <w:r>
+        <w:t xml:space="preserve">, R., and </w:t>
+      </w:r>
+      <w:proofErr w:type="spellStart"/>
+      <w:r>
+        <w:t>Poggio</w:t>
+      </w:r>
+      <w:proofErr w:type="spellEnd"/>
+      <w:r>
+        <w:t xml:space="preserve">, T. (2013). Face Recognition through Geometrical Features. Retrieved </w:t>
+      </w:r>
+    </w:p>
+    <w:p>
+      <w:pPr>
+        <w:spacing w:line="480" w:lineRule="auto"/>
+      </w:pPr>
+      <w:r>
+        <w:tab/>
+      </w:r>
+      <w:proofErr w:type="gramStart"/>
+      <w:r>
+        <w:t>from</w:t>
+      </w:r>
+      <w:proofErr w:type="gramEnd"/>
+      <w:r>
+        <w:t>: https://www.semanticscholar.org/paper/Face-Recognition-through-Geometrical-</w:t>
       </w:r>
       <w:hyperlink>
         <w:r>
@@ -3761,8 +4270,37 @@
       <w:pPr>
         <w:spacing w:line="480" w:lineRule="auto"/>
       </w:pPr>
-      <w:r>
-        <w:t xml:space="preserve">Celiktutan, O., Ulukaya, S., and Sankur, B. (2013). A Comparative Study of Face Landmarking </w:t>
+      <w:proofErr w:type="spellStart"/>
+      <w:r>
+        <w:t>Celiktutan</w:t>
+      </w:r>
+      <w:proofErr w:type="spellEnd"/>
+      <w:r>
+        <w:t xml:space="preserve">, O., </w:t>
+      </w:r>
+      <w:proofErr w:type="spellStart"/>
+      <w:r>
+        <w:t>Ulukaya</w:t>
+      </w:r>
+      <w:proofErr w:type="spellEnd"/>
+      <w:r>
+        <w:t xml:space="preserve">, S., and </w:t>
+      </w:r>
+      <w:proofErr w:type="spellStart"/>
+      <w:r>
+        <w:t>Sankur</w:t>
+      </w:r>
+      <w:proofErr w:type="spellEnd"/>
+      <w:r>
+        <w:t xml:space="preserve">, B. (2013). A Comparative Study of Face </w:t>
+      </w:r>
+      <w:proofErr w:type="spellStart"/>
+      <w:r>
+        <w:t>Landmarking</w:t>
+      </w:r>
+      <w:proofErr w:type="spellEnd"/>
+      <w:r>
+        <w:t xml:space="preserve"> </w:t>
       </w:r>
     </w:p>
     <w:p>
@@ -3888,7 +4426,15 @@
         <w:spacing w:line="480" w:lineRule="auto"/>
       </w:pPr>
       <w:r>
-        <w:t xml:space="preserve">Davenport, H. T., and Patil, J. D. (2012). Data </w:t>
+        <w:t xml:space="preserve">Davenport, H. T., and </w:t>
+      </w:r>
+      <w:proofErr w:type="spellStart"/>
+      <w:r>
+        <w:t>Patil</w:t>
+      </w:r>
+      <w:proofErr w:type="spellEnd"/>
+      <w:r>
+        <w:t xml:space="preserve">, J. D. (2012). Data </w:t>
       </w:r>
       <w:r>
         <w:t>Scientist: The</w:t>
@@ -3964,7 +4510,15 @@
         <w:spacing w:line="480" w:lineRule="auto"/>
       </w:pPr>
       <w:r>
-        <w:t xml:space="preserve">Ferrari, C., Berretti, S., &amp; Del Bimbo, A. (2018). </w:t>
+        <w:t xml:space="preserve">Ferrari, C., </w:t>
+      </w:r>
+      <w:proofErr w:type="spellStart"/>
+      <w:r>
+        <w:t>Berretti</w:t>
+      </w:r>
+      <w:proofErr w:type="spellEnd"/>
+      <w:r>
+        <w:t xml:space="preserve">, S., &amp; Del Bimbo, A. (2018). </w:t>
       </w:r>
       <w:r>
         <w:rPr>
@@ -3999,7 +4553,15 @@
         <w:spacing w:line="480" w:lineRule="auto"/>
       </w:pPr>
       <w:r>
-        <w:t xml:space="preserve">Finlayson G. D. (2018). Colour and illumination in computer vision. </w:t>
+        <w:t xml:space="preserve">Finlayson G. D. (2018). </w:t>
+      </w:r>
+      <w:proofErr w:type="spellStart"/>
+      <w:r>
+        <w:t>Colour</w:t>
+      </w:r>
+      <w:proofErr w:type="spellEnd"/>
+      <w:r>
+        <w:t xml:space="preserve"> and illumination in computer vision. </w:t>
       </w:r>
       <w:r>
         <w:rPr>
@@ -4134,9 +4696,30 @@
       <w:pPr>
         <w:spacing w:line="480" w:lineRule="auto"/>
       </w:pPr>
+      <w:proofErr w:type="spellStart"/>
       <w:r>
         <w:lastRenderedPageBreak/>
-        <w:t xml:space="preserve">Goel, R., Mehmood, I., Ugail, H. (2021). A Study of Deep Learning-Based Face Recognition </w:t>
+        <w:t>Goel</w:t>
+      </w:r>
+      <w:proofErr w:type="spellEnd"/>
+      <w:r>
+        <w:t xml:space="preserve">, R., </w:t>
+      </w:r>
+      <w:proofErr w:type="spellStart"/>
+      <w:r>
+        <w:t>Mehmood</w:t>
+      </w:r>
+      <w:proofErr w:type="spellEnd"/>
+      <w:r>
+        <w:t xml:space="preserve">, I., </w:t>
+      </w:r>
+      <w:proofErr w:type="spellStart"/>
+      <w:r>
+        <w:t>Ugail</w:t>
+      </w:r>
+      <w:proofErr w:type="spellEnd"/>
+      <w:r>
+        <w:t xml:space="preserve">, H. (2021). A Study of Deep Learning-Based Face Recognition </w:t>
       </w:r>
     </w:p>
     <w:p>
@@ -4155,15 +4738,54 @@
         <w:t>Sensors</w:t>
       </w:r>
       <w:r>
-        <w:t>, 21(5068): n.p. https://doi.org/10.3390/s21155068</w:t>
-      </w:r>
-    </w:p>
-    <w:p>
-      <w:pPr>
-        <w:spacing w:line="480" w:lineRule="auto"/>
-      </w:pPr>
-      <w:r>
-        <w:t xml:space="preserve">Hidayat, R., Wibowo, B, M., Satria, R. B., Winursito, A. (2021). Implementation of Face </w:t>
+        <w:t xml:space="preserve">, 21(5068): </w:t>
+      </w:r>
+      <w:proofErr w:type="spellStart"/>
+      <w:proofErr w:type="gramStart"/>
+      <w:r>
+        <w:t>n.p</w:t>
+      </w:r>
+      <w:proofErr w:type="spellEnd"/>
+      <w:proofErr w:type="gramEnd"/>
+      <w:r>
+        <w:t>. https://doi.org/10.3390/s21155068</w:t>
+      </w:r>
+    </w:p>
+    <w:p>
+      <w:pPr>
+        <w:spacing w:line="480" w:lineRule="auto"/>
+      </w:pPr>
+      <w:proofErr w:type="spellStart"/>
+      <w:r>
+        <w:t>Hidayat</w:t>
+      </w:r>
+      <w:proofErr w:type="spellEnd"/>
+      <w:r>
+        <w:t xml:space="preserve">, R., </w:t>
+      </w:r>
+      <w:proofErr w:type="spellStart"/>
+      <w:r>
+        <w:t>Wibowo</w:t>
+      </w:r>
+      <w:proofErr w:type="spellEnd"/>
+      <w:r>
+        <w:t xml:space="preserve">, B, M., </w:t>
+      </w:r>
+      <w:proofErr w:type="spellStart"/>
+      <w:r>
+        <w:t>Satria</w:t>
+      </w:r>
+      <w:proofErr w:type="spellEnd"/>
+      <w:r>
+        <w:t xml:space="preserve">, R. B., </w:t>
+      </w:r>
+      <w:proofErr w:type="spellStart"/>
+      <w:r>
+        <w:t>Winursito</w:t>
+      </w:r>
+      <w:proofErr w:type="spellEnd"/>
+      <w:r>
+        <w:t xml:space="preserve">, A. (2021). Implementation of Face </w:t>
       </w:r>
     </w:p>
     <w:p>
@@ -4174,429 +4796,409 @@
         <w:tab/>
         <w:t xml:space="preserve">Recognition Using Geometric Features Extraction. </w:t>
       </w:r>
+      <w:proofErr w:type="spellStart"/>
       <w:r>
         <w:rPr>
           <w:i/>
           <w:iCs/>
         </w:rPr>
-        <w:t>Jurnal Lmiah Kursor</w:t>
-      </w:r>
-      <w:r>
-        <w:t xml:space="preserve">, 11(2): 83-90. </w:t>
-      </w:r>
-      <w:r>
-        <w:tab/>
-        <w:t>https://doi.org/10.21107/kursor.v11i2.284</w:t>
-      </w:r>
-    </w:p>
-    <w:p>
-      <w:pPr>
-        <w:spacing w:line="480" w:lineRule="auto"/>
-      </w:pPr>
-      <w:r>
-        <w:t xml:space="preserve">Hinton, E. G., Osindero, O., and Teh, Y. (2006). A Fast Learning Algorithm for Deep Belief Nets. </w:t>
-      </w:r>
-    </w:p>
-    <w:p>
-      <w:pPr>
-        <w:spacing w:line="480" w:lineRule="auto"/>
-      </w:pPr>
-      <w:r>
-        <w:tab/>
-      </w:r>
+        <w:t>Jurnal</w:t>
+      </w:r>
+      <w:proofErr w:type="spellEnd"/>
       <w:r>
         <w:rPr>
           <w:i/>
           <w:iCs/>
         </w:rPr>
-        <w:t xml:space="preserve">Neural Computation, </w:t>
-      </w:r>
-      <w:r>
-        <w:t>18(7): 1527-54. https://doi:10.1162/neco.2006.18.7.1527</w:t>
-      </w:r>
-    </w:p>
-    <w:p>
-      <w:pPr>
-        <w:spacing w:line="480" w:lineRule="auto"/>
-      </w:pPr>
-      <w:r>
-        <w:t xml:space="preserve">Kapil, D., and Jain A. (2013). A Brief Review on Feature Based Approaches for Face Recognition. </w:t>
-      </w:r>
-    </w:p>
-    <w:p>
-      <w:pPr>
-        <w:spacing w:line="480" w:lineRule="auto"/>
-        <w:ind w:firstLine="709"/>
-      </w:pPr>
+        <w:t xml:space="preserve"> </w:t>
+      </w:r>
+      <w:proofErr w:type="spellStart"/>
       <w:r>
         <w:rPr>
           <w:i/>
           <w:iCs/>
         </w:rPr>
-        <w:t>International Journal of Science and Research</w:t>
-      </w:r>
-      <w:r>
-        <w:t>, 6(14): 273-27.</w:t>
-      </w:r>
-    </w:p>
-    <w:p>
-      <w:pPr>
-        <w:spacing w:line="480" w:lineRule="auto"/>
-      </w:pPr>
-      <w:r>
-        <w:t>Krishnapriya, K.</w:t>
-      </w:r>
-      <w:r>
-        <w:t xml:space="preserve"> S., Vangara, K., King, M.C., Albiero, V., &amp; Bowyer, K. (2019). </w:t>
-      </w:r>
+        <w:t>Lmiah</w:t>
+      </w:r>
+      <w:proofErr w:type="spellEnd"/>
       <w:r>
         <w:rPr>
           <w:i/>
           <w:iCs/>
         </w:rPr>
-        <w:t xml:space="preserve">Characterizing the </w:t>
-      </w:r>
-    </w:p>
-    <w:p>
-      <w:pPr>
-        <w:spacing w:line="480" w:lineRule="auto"/>
-      </w:pPr>
+        <w:t xml:space="preserve"> </w:t>
+      </w:r>
+      <w:proofErr w:type="spellStart"/>
       <w:r>
         <w:rPr>
           <w:i/>
           <w:iCs/>
         </w:rPr>
-        <w:tab/>
-        <w:t>Variability in Face Recognition Accuracy Relative to Race</w:t>
-      </w:r>
-      <w:r>
-        <w:t xml:space="preserve">. 2019 IEEE/CVF Conference on </w:t>
-      </w:r>
-      <w:r>
-        <w:tab/>
-        <w:t xml:space="preserve">Computer Vision and Pattern Recognition Workshops (CVPRW), 2278-2285. </w:t>
-      </w:r>
-      <w:r>
-        <w:tab/>
-        <w:t>https://arxiv.org/pdf/1904.07325.pdf</w:t>
-      </w:r>
-    </w:p>
-    <w:p>
-      <w:pPr>
-        <w:spacing w:line="480" w:lineRule="auto"/>
-      </w:pPr>
-      <w:r>
-        <w:t xml:space="preserve">Leslie, D. (2020). Understanding bias in facial recognition technologies: an explainer. </w:t>
+        <w:t>Kursor</w:t>
+      </w:r>
+      <w:proofErr w:type="spellEnd"/>
+      <w:r>
+        <w:t xml:space="preserve">, 11(2): 83-90. </w:t>
+      </w:r>
+      <w:r>
+        <w:tab/>
+        <w:t>https://doi.org/10.21107/kursor.v11i2.284</w:t>
+      </w:r>
+    </w:p>
+    <w:p>
+      <w:pPr>
+        <w:spacing w:line="480" w:lineRule="auto"/>
+      </w:pPr>
+      <w:r>
+        <w:t xml:space="preserve">Hinton, E. G., </w:t>
+      </w:r>
+      <w:proofErr w:type="spellStart"/>
+      <w:r>
+        <w:t>Osindero</w:t>
+      </w:r>
+      <w:proofErr w:type="spellEnd"/>
+      <w:r>
+        <w:t xml:space="preserve">, O., and </w:t>
+      </w:r>
+      <w:proofErr w:type="spellStart"/>
+      <w:r>
+        <w:t>Teh</w:t>
+      </w:r>
+      <w:proofErr w:type="spellEnd"/>
+      <w:r>
+        <w:t xml:space="preserve">, Y. (2006). A Fast Learning Algorithm for Deep Belief Nets. </w:t>
+      </w:r>
+    </w:p>
+    <w:p>
+      <w:pPr>
+        <w:spacing w:line="480" w:lineRule="auto"/>
+      </w:pPr>
+      <w:r>
+        <w:tab/>
       </w:r>
       <w:r>
         <w:rPr>
           <w:i/>
           <w:iCs/>
         </w:rPr>
-        <w:t xml:space="preserve">The Alan </w:t>
-      </w:r>
-    </w:p>
-    <w:p>
-      <w:pPr>
-        <w:spacing w:line="480" w:lineRule="auto"/>
+        <w:t xml:space="preserve">Neural Computation, </w:t>
+      </w:r>
+      <w:r>
+        <w:t>18(7): 1527-54. https://doi:10.1162/neco.2006.18.7.1527</w:t>
+      </w:r>
+    </w:p>
+    <w:p>
+      <w:pPr>
+        <w:spacing w:line="480" w:lineRule="auto"/>
+      </w:pPr>
+      <w:proofErr w:type="spellStart"/>
+      <w:r>
+        <w:t>Kapil</w:t>
+      </w:r>
+      <w:proofErr w:type="spellEnd"/>
+      <w:r>
+        <w:t xml:space="preserve">, D., and Jain A. (2013). A Brief Review on Feature Based Approaches for Face Recognition. </w:t>
+      </w:r>
+    </w:p>
+    <w:p>
+      <w:pPr>
+        <w:spacing w:line="480" w:lineRule="auto"/>
+        <w:ind w:firstLine="709"/>
       </w:pPr>
       <w:r>
         <w:rPr>
           <w:i/>
           <w:iCs/>
         </w:rPr>
-        <w:tab/>
-        <w:t>Turing Institute</w:t>
-      </w:r>
-      <w:r>
-        <w:t xml:space="preserve">. https://doi.org/10.5281/zenodo.4050457 </w:t>
-      </w:r>
-    </w:p>
-    <w:p>
-      <w:pPr>
-        <w:spacing w:line="480" w:lineRule="auto"/>
-      </w:pPr>
-      <w:r>
-        <w:t xml:space="preserve">Liu, C. J., and Ellisa, A. D. (2021). Editorial: Eating in the Age of Smartphones: The Good, the Bad, </w:t>
-      </w:r>
-    </w:p>
-    <w:p>
-      <w:pPr>
-        <w:spacing w:line="480" w:lineRule="auto"/>
-      </w:pPr>
-      <w:r>
-        <w:tab/>
-        <w:t xml:space="preserve">and the Neutral. </w:t>
+        <w:t>International Journal of Science and Research</w:t>
+      </w:r>
+      <w:r>
+        <w:t>, 6(14): 273-27.</w:t>
+      </w:r>
+    </w:p>
+    <w:p>
+      <w:pPr>
+        <w:spacing w:line="480" w:lineRule="auto"/>
+      </w:pPr>
+      <w:proofErr w:type="spellStart"/>
+      <w:r>
+        <w:t>Krishnapriya</w:t>
+      </w:r>
+      <w:proofErr w:type="spellEnd"/>
+      <w:r>
+        <w:t>, K.</w:t>
+      </w:r>
+      <w:r>
+        <w:t xml:space="preserve"> S., </w:t>
+      </w:r>
+      <w:proofErr w:type="spellStart"/>
+      <w:r>
+        <w:t>Vangara</w:t>
+      </w:r>
+      <w:proofErr w:type="spellEnd"/>
+      <w:r>
+        <w:t xml:space="preserve">, K., King, M.C., </w:t>
+      </w:r>
+      <w:proofErr w:type="spellStart"/>
+      <w:r>
+        <w:t>Albiero</w:t>
+      </w:r>
+      <w:proofErr w:type="spellEnd"/>
+      <w:r>
+        <w:t xml:space="preserve">, V., &amp; Bowyer, K. (2019). </w:t>
       </w:r>
       <w:r>
         <w:rPr>
           <w:i/>
           <w:iCs/>
         </w:rPr>
-        <w:t xml:space="preserve">Frontiers in Psychology, </w:t>
-      </w:r>
-      <w:r>
-        <w:t xml:space="preserve">12(796899): 1-2. https://doi: </w:t>
-      </w:r>
-      <w:r>
-        <w:tab/>
-        <w:t>10.3389/fpsyg.2021.796899</w:t>
-      </w:r>
-    </w:p>
-    <w:p>
-      <w:pPr>
-        <w:spacing w:line="480" w:lineRule="auto"/>
-      </w:pPr>
-      <w:r>
-        <w:t xml:space="preserve">Lu, D., and Yan, L. (2021). Face Detection and Recognition Algorithm in Digital Image Based on </w:t>
-      </w:r>
-    </w:p>
-    <w:p>
-      <w:pPr>
-        <w:spacing w:line="480" w:lineRule="auto"/>
-      </w:pPr>
-      <w:r>
-        <w:tab/>
-        <w:t xml:space="preserve">Computer Vision Sensor. </w:t>
-      </w:r>
+        <w:t xml:space="preserve">Characterizing the </w:t>
+      </w:r>
+    </w:p>
+    <w:p>
+      <w:pPr>
+        <w:spacing w:line="480" w:lineRule="auto"/>
+      </w:pPr>
       <w:r>
         <w:rPr>
           <w:i/>
           <w:iCs/>
         </w:rPr>
-        <w:t xml:space="preserve">Journal of Sensors, </w:t>
-      </w:r>
-      <w:r>
-        <w:t xml:space="preserve">2021(4796768), 1-16. </w:t>
-      </w:r>
-      <w:r>
-        <w:tab/>
-        <w:t>https://doi.org/10.1155/2021/4796768</w:t>
-      </w:r>
-    </w:p>
-    <w:p>
-      <w:pPr>
-        <w:spacing w:line="480" w:lineRule="auto"/>
-      </w:pPr>
-      <w:r>
-        <w:t>Marks, P. (2021).Can the Biases in Facial Recognition Be Fixed</w:t>
-      </w:r>
-      <w:r>
-        <w:t>; Also</w:t>
-      </w:r>
-      <w:r>
-        <w:t>, Should They?</w:t>
-      </w:r>
-    </w:p>
-    <w:p>
-      <w:pPr>
-        <w:spacing w:line="480" w:lineRule="auto"/>
-      </w:pPr>
-      <w:r>
-        <w:tab/>
+        <w:tab/>
+        <w:t>Variability in Face Recognition Accuracy Relative to Race</w:t>
+      </w:r>
+      <w:r>
+        <w:t xml:space="preserve">. 2019 IEEE/CVF Conference on </w:t>
+      </w:r>
+      <w:r>
+        <w:tab/>
+        <w:t xml:space="preserve">Computer Vision and Pattern Recognition Workshops (CVPRW), 2278-2285. </w:t>
+      </w:r>
+      <w:r>
+        <w:tab/>
+        <w:t>https://arxiv.org/pdf/1904.07325.pdf</w:t>
+      </w:r>
+    </w:p>
+    <w:p>
+      <w:pPr>
+        <w:spacing w:line="480" w:lineRule="auto"/>
+      </w:pPr>
+      <w:r>
+        <w:t xml:space="preserve">Leslie, D. (2020). Understanding bias in facial recognition technologies: an explainer. </w:t>
       </w:r>
       <w:r>
         <w:rPr>
           <w:i/>
           <w:iCs/>
         </w:rPr>
-        <w:t xml:space="preserve">Communications of </w:t>
-      </w:r>
+        <w:t xml:space="preserve">The Alan </w:t>
+      </w:r>
+    </w:p>
+    <w:p>
+      <w:pPr>
+        <w:spacing w:line="480" w:lineRule="auto"/>
+      </w:pPr>
       <w:r>
         <w:rPr>
           <w:i/>
           <w:iCs/>
         </w:rPr>
-        <w:t>the</w:t>
+        <w:tab/>
+        <w:t>Turing Institute</w:t>
+      </w:r>
+      <w:r>
+        <w:t xml:space="preserve">. https://doi.org/10.5281/zenodo.4050457 </w:t>
+      </w:r>
+    </w:p>
+    <w:p>
+      <w:pPr>
+        <w:spacing w:line="480" w:lineRule="auto"/>
+      </w:pPr>
+      <w:r>
+        <w:t xml:space="preserve">Liu, C. J., and </w:t>
+      </w:r>
+      <w:proofErr w:type="spellStart"/>
+      <w:r>
+        <w:t>Ellisa</w:t>
+      </w:r>
+      <w:proofErr w:type="spellEnd"/>
+      <w:r>
+        <w:t xml:space="preserve">, A. D. (2021). Editorial: Eating in the Age of Smartphones: The Good, the Bad, </w:t>
+      </w:r>
+    </w:p>
+    <w:p>
+      <w:pPr>
+        <w:spacing w:line="480" w:lineRule="auto"/>
+      </w:pPr>
+      <w:r>
+        <w:tab/>
+      </w:r>
+      <w:proofErr w:type="gramStart"/>
+      <w:r>
+        <w:t>and</w:t>
+      </w:r>
+      <w:proofErr w:type="gramEnd"/>
+      <w:r>
+        <w:t xml:space="preserve"> the Neutral. </w:t>
       </w:r>
       <w:r>
         <w:rPr>
           <w:i/>
           <w:iCs/>
         </w:rPr>
-        <w:t xml:space="preserve"> ACM,</w:t>
-      </w:r>
-      <w:r>
-        <w:t xml:space="preserve"> 64(3): 20-22. https://dx.doi.org/10.1145/3446877</w:t>
-      </w:r>
-    </w:p>
-    <w:p>
-      <w:pPr>
-        <w:spacing w:line="480" w:lineRule="auto"/>
-      </w:pPr>
-      <w:r>
-        <w:t xml:space="preserve">Mothar, M. N., Hassan, A. M., Hassan, H. S., and Osman, N. M. (2013). The Importance of </w:t>
-      </w:r>
-    </w:p>
-    <w:p>
-      <w:pPr>
-        <w:spacing w:line="480" w:lineRule="auto"/>
-      </w:pPr>
-      <w:r>
-        <w:lastRenderedPageBreak/>
-        <w:tab/>
-        <w:t xml:space="preserve">Smartphone’s </w:t>
-      </w:r>
-      <w:r>
-        <w:tab/>
-        <w:t xml:space="preserve">Usage </w:t>
-      </w:r>
-      <w:r>
-        <w:t>among</w:t>
-      </w:r>
-      <w:r>
-        <w:t xml:space="preserve"> Malaysian Undergraduates. </w:t>
+        <w:t xml:space="preserve">Frontiers in Psychology, </w:t>
+      </w:r>
+      <w:r>
+        <w:t xml:space="preserve">12(796899): 1-2. https://doi: </w:t>
+      </w:r>
+      <w:r>
+        <w:tab/>
+        <w:t>10.3389/fpsyg.2021.796899</w:t>
+      </w:r>
+    </w:p>
+    <w:p>
+      <w:pPr>
+        <w:spacing w:line="480" w:lineRule="auto"/>
+      </w:pPr>
+      <w:r>
+        <w:t xml:space="preserve">Lu, D., and Yan, L. (2021). Face Detection and Recognition Algorithm in Digital Image Based on </w:t>
+      </w:r>
+    </w:p>
+    <w:p>
+      <w:pPr>
+        <w:spacing w:line="480" w:lineRule="auto"/>
+      </w:pPr>
+      <w:r>
+        <w:tab/>
+        <w:t xml:space="preserve">Computer Vision Sensor. </w:t>
       </w:r>
       <w:r>
         <w:rPr>
           <w:i/>
           <w:iCs/>
         </w:rPr>
-        <w:t xml:space="preserve">Journal </w:t>
+        <w:t xml:space="preserve">Journal of Sensors, </w:t>
+      </w:r>
+      <w:r>
+        <w:t xml:space="preserve">2021(4796768), 1-16. </w:t>
+      </w:r>
+      <w:r>
+        <w:tab/>
+        <w:t>https://doi.org/10.1155/2021/4796768</w:t>
+      </w:r>
+    </w:p>
+    <w:p>
+      <w:pPr>
+        <w:spacing w:line="480" w:lineRule="auto"/>
+      </w:pPr>
+      <w:r>
+        <w:t>Marks, P. (2021).Can the Biases in Facial Recognition Be Fixed</w:t>
+      </w:r>
+      <w:r>
+        <w:t>; Also</w:t>
+      </w:r>
+      <w:r>
+        <w:t>, Should They?</w:t>
+      </w:r>
+    </w:p>
+    <w:p>
+      <w:pPr>
+        <w:spacing w:line="480" w:lineRule="auto"/>
+      </w:pPr>
+      <w:r>
+        <w:tab/>
       </w:r>
       <w:r>
         <w:rPr>
           <w:i/>
           <w:iCs/>
         </w:rPr>
-        <w:t>of</w:t>
+        <w:t xml:space="preserve">Communications of </w:t>
       </w:r>
       <w:r>
         <w:rPr>
           <w:i/>
           <w:iCs/>
         </w:rPr>
-        <w:t xml:space="preserve"> Humanities </w:t>
+        <w:t>the</w:t>
       </w:r>
       <w:r>
         <w:rPr>
           <w:i/>
           <w:iCs/>
         </w:rPr>
-        <w:t>and</w:t>
+        <w:t xml:space="preserve"> ACM,</w:t>
+      </w:r>
+      <w:r>
+        <w:t xml:space="preserve"> 64(3): 20-22. https://dx.doi.org/10.1145/3446877</w:t>
+      </w:r>
+    </w:p>
+    <w:p>
+      <w:pPr>
+        <w:spacing w:line="480" w:lineRule="auto"/>
+      </w:pPr>
+      <w:proofErr w:type="spellStart"/>
+      <w:r>
+        <w:t>Mothar</w:t>
+      </w:r>
+      <w:proofErr w:type="spellEnd"/>
+      <w:r>
+        <w:t xml:space="preserve">, M. N., Hassan, A. M., Hassan, H. S., and Osman, N. M. (2013). The Importance of </w:t>
+      </w:r>
+    </w:p>
+    <w:p>
+      <w:pPr>
+        <w:spacing w:line="480" w:lineRule="auto"/>
+      </w:pPr>
+      <w:r>
+        <w:lastRenderedPageBreak/>
+        <w:tab/>
+        <w:t xml:space="preserve">Smartphone’s </w:t>
+      </w:r>
+      <w:r>
+        <w:tab/>
+        <w:t xml:space="preserve">Usage </w:t>
+      </w:r>
+      <w:r>
+        <w:t>among</w:t>
+      </w:r>
+      <w:r>
+        <w:t xml:space="preserve"> Malaysian Undergraduates. </w:t>
       </w:r>
       <w:r>
         <w:rPr>
           <w:i/>
           <w:iCs/>
         </w:rPr>
-        <w:t xml:space="preserve"> Social </w:t>
+        <w:t xml:space="preserve">Journal </w:t>
       </w:r>
       <w:r>
         <w:rPr>
           <w:i/>
           <w:iCs/>
         </w:rPr>
-        <w:tab/>
-        <w:t>Science</w:t>
-      </w:r>
-      <w:r>
-        <w:t>, 1</w:t>
-      </w:r>
-      <w:r>
-        <w:t xml:space="preserve">4(3): 112-118. Retrieved from: </w:t>
-      </w:r>
-      <w:r>
-        <w:t>https://www.iosrjournals.org/iosr-jhss/papers/Vol14-issue3/S0143112118.pdf</w:t>
-      </w:r>
-    </w:p>
-    <w:p>
-      <w:pPr>
-        <w:spacing w:line="480" w:lineRule="auto"/>
-      </w:pPr>
-      <w:r>
-        <w:t xml:space="preserve">Najibi, A. (2020). </w:t>
+        <w:t>of</w:t>
       </w:r>
       <w:r>
         <w:rPr>
           <w:i/>
           <w:iCs/>
         </w:rPr>
-        <w:t>Racial Discrimination in Face Recognition Technology</w:t>
-      </w:r>
-      <w:r>
-        <w:t xml:space="preserve">. Retrieved from </w:t>
-      </w:r>
-      <w:r>
-        <w:tab/>
-        <w:t>https://sitn.hms.harvard.edu/flash/2020/racial-discrimination-in-face-recognition-</w:t>
-      </w:r>
-      <w:r>
-        <w:tab/>
-        <w:t>technology/</w:t>
-      </w:r>
-    </w:p>
-    <w:p>
-      <w:pPr>
-        <w:spacing w:line="480" w:lineRule="auto"/>
-      </w:pPr>
-      <w:r>
-        <w:t xml:space="preserve">Pankaj, S. D., and Wilscy, M. (2011). Face Recognition Using Fuzzy Neural Network Classifier. </w:t>
-      </w:r>
-    </w:p>
-    <w:p>
-      <w:pPr>
-        <w:spacing w:line="480" w:lineRule="auto"/>
-      </w:pPr>
-      <w:r>
-        <w:tab/>
-      </w:r>
-      <w:r>
-        <w:t>Retrieved</w:t>
-      </w:r>
-      <w:r>
-        <w:t xml:space="preserve"> from: https://sci-hub.se/10.1007/978-3-642-24037-9_6</w:t>
-      </w:r>
-    </w:p>
-    <w:p>
-      <w:pPr>
-        <w:spacing w:line="480" w:lineRule="auto"/>
-      </w:pPr>
-      <w:r>
-        <w:t xml:space="preserve">Parkhi, M. O., Vedaldi, A., and Ziseerman, A.  (2015). </w:t>
+        <w:t xml:space="preserve"> Humanities </w:t>
       </w:r>
       <w:r>
         <w:rPr>
           <w:i/>
           <w:iCs/>
         </w:rPr>
-        <w:t>VGG Face Dataset</w:t>
-      </w:r>
-      <w:r>
-        <w:t xml:space="preserve">. Retrieved from: </w:t>
-      </w:r>
-    </w:p>
-    <w:p>
-      <w:pPr>
-        <w:spacing w:line="480" w:lineRule="auto"/>
-      </w:pPr>
-      <w:r>
-        <w:tab/>
-        <w:t>https://www.robots.ox.ac.uk/~vgg/data/vgg_face/</w:t>
-      </w:r>
-    </w:p>
-    <w:p>
-      <w:pPr>
-        <w:spacing w:line="480" w:lineRule="auto"/>
-      </w:pPr>
-      <w:r>
-        <w:t xml:space="preserve">Priya, G. A., Rekha, P. A., Sarabya, K. R., and Thanuganesh, M. (2014). Face Recognition with </w:t>
-      </w:r>
-    </w:p>
-    <w:p>
-      <w:pPr>
-        <w:spacing w:line="480" w:lineRule="auto"/>
-      </w:pPr>
-      <w:r>
-        <w:tab/>
-        <w:t>Different Approaches: A Survey. I</w:t>
+        <w:t>and</w:t>
       </w:r>
       <w:r>
         <w:rPr>
           <w:i/>
           <w:iCs/>
         </w:rPr>
-        <w:t xml:space="preserve">nternational Journal of Emerging Engineering Research </w:t>
+        <w:t xml:space="preserve"> Social </w:t>
       </w:r>
       <w:r>
         <w:rPr>
@@ -4604,79 +5206,299 @@
           <w:iCs/>
         </w:rPr>
         <w:tab/>
-        <w:t>and Technology</w:t>
-      </w:r>
-      <w:r>
-        <w:t>, 2(7): 288-293. Retrieved from: http://www.ijeert.org/pdf/v2-i7/39.pdf</w:t>
-      </w:r>
-    </w:p>
-    <w:p>
-      <w:pPr>
-        <w:spacing w:line="480" w:lineRule="auto"/>
-      </w:pPr>
-      <w:r>
-        <w:t xml:space="preserve">Proyecto, F., C. (2010). Face Recognition Algorithms. University of the Basque Country. Retrieved </w:t>
-      </w:r>
-    </w:p>
-    <w:p>
-      <w:pPr>
-        <w:spacing w:line="480" w:lineRule="auto"/>
-      </w:pPr>
-      <w:r>
-        <w:tab/>
-        <w:t xml:space="preserve">from: </w:t>
-      </w:r>
-      <w:r>
-        <w:t>https://www.ehu.eus/ccwintco/uploads/e/eb/PFC-IonMarques.pdf</w:t>
-      </w:r>
-    </w:p>
-    <w:p>
-      <w:pPr>
-        <w:spacing w:line="480" w:lineRule="auto"/>
-      </w:pPr>
-      <w:r>
-        <w:t xml:space="preserve">Ranjan, A., Behera, N. J., and Reza. M. (2020). </w:t>
+        <w:t>Science</w:t>
+      </w:r>
+      <w:r>
+        <w:t>, 1</w:t>
+      </w:r>
+      <w:r>
+        <w:t xml:space="preserve">4(3): 112-118. Retrieved from: </w:t>
+      </w:r>
+      <w:r>
+        <w:t>https://www.iosrjournals.org/iosr-jhss/papers/Vol14-issue3/S0143112118.pdf</w:t>
+      </w:r>
+    </w:p>
+    <w:p>
+      <w:pPr>
+        <w:spacing w:line="480" w:lineRule="auto"/>
+      </w:pPr>
+      <w:proofErr w:type="spellStart"/>
+      <w:r>
+        <w:t>Najibi</w:t>
+      </w:r>
+      <w:proofErr w:type="spellEnd"/>
+      <w:r>
+        <w:t xml:space="preserve">, A. (2020). </w:t>
       </w:r>
       <w:r>
         <w:rPr>
           <w:i/>
           <w:iCs/>
         </w:rPr>
-        <w:t>A Parallel Approach for Real-Time Face</w:t>
-      </w:r>
-    </w:p>
-    <w:p>
-      <w:pPr>
-        <w:spacing w:line="480" w:lineRule="auto"/>
-      </w:pPr>
+        <w:t>Racial Discrimination in Face Recognition Technology</w:t>
+      </w:r>
+      <w:r>
+        <w:t xml:space="preserve">. Retrieved from </w:t>
+      </w:r>
+      <w:r>
+        <w:tab/>
+        <w:t>https://sitn.hms.harvard.edu/flash/2020/racial-discrimination-in-face-recognition-</w:t>
+      </w:r>
+      <w:r>
+        <w:tab/>
+        <w:t>technology/</w:t>
+      </w:r>
+    </w:p>
+    <w:p>
+      <w:pPr>
+        <w:spacing w:line="480" w:lineRule="auto"/>
+      </w:pPr>
+      <w:r>
+        <w:t xml:space="preserve">Pankaj, S. D., and Wilscy, M. (2011). Face Recognition Using Fuzzy Neural Network Classifier. </w:t>
+      </w:r>
+    </w:p>
+    <w:p>
+      <w:pPr>
+        <w:spacing w:line="480" w:lineRule="auto"/>
+      </w:pPr>
+      <w:r>
+        <w:tab/>
+      </w:r>
+      <w:r>
+        <w:t>Retrieved</w:t>
+      </w:r>
+      <w:r>
+        <w:t xml:space="preserve"> from: https://sci-hub.se/10.1007/978-3-642-24037-9_6</w:t>
+      </w:r>
+    </w:p>
+    <w:p>
+      <w:pPr>
+        <w:spacing w:line="480" w:lineRule="auto"/>
+      </w:pPr>
+      <w:proofErr w:type="spellStart"/>
+      <w:r>
+        <w:t>Parkhi</w:t>
+      </w:r>
+      <w:proofErr w:type="spellEnd"/>
+      <w:r>
+        <w:t xml:space="preserve">, M. O., </w:t>
+      </w:r>
+      <w:proofErr w:type="spellStart"/>
+      <w:r>
+        <w:t>Vedaldi</w:t>
+      </w:r>
+      <w:proofErr w:type="spellEnd"/>
+      <w:r>
+        <w:t xml:space="preserve">, A., and </w:t>
+      </w:r>
+      <w:proofErr w:type="spellStart"/>
+      <w:r>
+        <w:t>Ziseerman</w:t>
+      </w:r>
+      <w:proofErr w:type="spellEnd"/>
+      <w:r>
+        <w:t xml:space="preserve">, A.  (2015). </w:t>
+      </w:r>
       <w:r>
         <w:rPr>
           <w:i/>
           <w:iCs/>
         </w:rPr>
-        <w:tab/>
-        <w:t>Recognition from a Large Database</w:t>
-      </w:r>
-      <w:r>
-        <w:t>. Retrieved from: https://arxiv.org/pdf/2011.00443.pdf</w:t>
-      </w:r>
-    </w:p>
-    <w:p>
-      <w:pPr>
-        <w:spacing w:line="480" w:lineRule="auto"/>
-      </w:pPr>
-      <w:r>
-        <w:t xml:space="preserve">Rehman, H. M., Liew, S. C., Abbas, A., Jayaraman, P. P., Wah, Y. T., and Khan U. S. (2016). Big </w:t>
-      </w:r>
-      <w:r>
-        <w:tab/>
-        <w:t xml:space="preserve">Data Reduction Methods: A Survey. </w:t>
+        <w:t>VGG Face Dataset</w:t>
+      </w:r>
+      <w:r>
+        <w:t xml:space="preserve">. Retrieved from: </w:t>
+      </w:r>
+    </w:p>
+    <w:p>
+      <w:pPr>
+        <w:spacing w:line="480" w:lineRule="auto"/>
+      </w:pPr>
+      <w:r>
+        <w:tab/>
+        <w:t>https://www.robots.ox.ac.uk/~vgg/data/vgg_face/</w:t>
+      </w:r>
+    </w:p>
+    <w:p>
+      <w:pPr>
+        <w:spacing w:line="480" w:lineRule="auto"/>
+      </w:pPr>
+      <w:proofErr w:type="spellStart"/>
+      <w:r>
+        <w:t>Priya</w:t>
+      </w:r>
+      <w:proofErr w:type="spellEnd"/>
+      <w:r>
+        <w:t xml:space="preserve">, G. A., </w:t>
+      </w:r>
+      <w:proofErr w:type="spellStart"/>
+      <w:r>
+        <w:t>Rekha</w:t>
+      </w:r>
+      <w:proofErr w:type="spellEnd"/>
+      <w:r>
+        <w:t xml:space="preserve">, P. A., </w:t>
+      </w:r>
+      <w:proofErr w:type="spellStart"/>
+      <w:r>
+        <w:t>Sarabya</w:t>
+      </w:r>
+      <w:proofErr w:type="spellEnd"/>
+      <w:r>
+        <w:t xml:space="preserve">, K. R., and </w:t>
+      </w:r>
+      <w:proofErr w:type="spellStart"/>
+      <w:r>
+        <w:t>Thanuganesh</w:t>
+      </w:r>
+      <w:proofErr w:type="spellEnd"/>
+      <w:r>
+        <w:t xml:space="preserve">, M. (2014). Face Recognition with </w:t>
+      </w:r>
+    </w:p>
+    <w:p>
+      <w:pPr>
+        <w:spacing w:line="480" w:lineRule="auto"/>
+      </w:pPr>
+      <w:r>
+        <w:tab/>
+        <w:t>Different Approaches: A Survey. I</w:t>
       </w:r>
       <w:r>
         <w:rPr>
           <w:i/>
           <w:iCs/>
         </w:rPr>
+        <w:t xml:space="preserve">nternational Journal of Emerging Engineering Research </w:t>
+      </w:r>
+      <w:r>
+        <w:rPr>
+          <w:i/>
+          <w:iCs/>
+        </w:rPr>
+        <w:tab/>
+        <w:t>and Technology</w:t>
+      </w:r>
+      <w:r>
+        <w:t>, 2(7): 288-293. Retrieved from: http://www.ijeert.org/pdf/v2-i7/39.pdf</w:t>
+      </w:r>
+    </w:p>
+    <w:p>
+      <w:pPr>
+        <w:spacing w:line="480" w:lineRule="auto"/>
+      </w:pPr>
+      <w:r>
+        <w:t xml:space="preserve">Proyecto, F., C. (2010). Face Recognition Algorithms. University of the Basque Country. Retrieved </w:t>
+      </w:r>
+    </w:p>
+    <w:p>
+      <w:pPr>
+        <w:spacing w:line="480" w:lineRule="auto"/>
+      </w:pPr>
+      <w:r>
+        <w:tab/>
+      </w:r>
+      <w:proofErr w:type="gramStart"/>
+      <w:r>
+        <w:t>from</w:t>
+      </w:r>
+      <w:proofErr w:type="gramEnd"/>
+      <w:r>
+        <w:t xml:space="preserve">: </w:t>
+      </w:r>
+      <w:r>
+        <w:t>https://www.ehu.eus/ccwintco/uploads/e/eb/PFC-IonMarques.pdf</w:t>
+      </w:r>
+    </w:p>
+    <w:p>
+      <w:pPr>
+        <w:spacing w:line="480" w:lineRule="auto"/>
+      </w:pPr>
+      <w:proofErr w:type="spellStart"/>
+      <w:r>
+        <w:t>Ranjan</w:t>
+      </w:r>
+      <w:proofErr w:type="spellEnd"/>
+      <w:r>
+        <w:t xml:space="preserve">, A., </w:t>
+      </w:r>
+      <w:proofErr w:type="spellStart"/>
+      <w:r>
+        <w:t>Behera</w:t>
+      </w:r>
+      <w:proofErr w:type="spellEnd"/>
+      <w:r>
+        <w:t xml:space="preserve">, N. J., and Reza. M. (2020). </w:t>
+      </w:r>
+      <w:r>
+        <w:rPr>
+          <w:i/>
+          <w:iCs/>
+        </w:rPr>
+        <w:t>A Parallel Approach for Real-Time Face</w:t>
+      </w:r>
+    </w:p>
+    <w:p>
+      <w:pPr>
+        <w:spacing w:line="480" w:lineRule="auto"/>
+      </w:pPr>
+      <w:r>
+        <w:rPr>
+          <w:i/>
+          <w:iCs/>
+        </w:rPr>
+        <w:tab/>
+        <w:t>Recognition from a Large Database</w:t>
+      </w:r>
+      <w:r>
+        <w:t>. Retrieved from: https://arxiv.org/pdf/2011.00443.pdf</w:t>
+      </w:r>
+    </w:p>
+    <w:p>
+      <w:pPr>
+        <w:spacing w:line="480" w:lineRule="auto"/>
+      </w:pPr>
+      <w:proofErr w:type="spellStart"/>
+      <w:r>
+        <w:t>Rehman</w:t>
+      </w:r>
+      <w:proofErr w:type="spellEnd"/>
+      <w:r>
+        <w:t xml:space="preserve">, H. M., </w:t>
+      </w:r>
+      <w:proofErr w:type="spellStart"/>
+      <w:r>
+        <w:t>Liew</w:t>
+      </w:r>
+      <w:proofErr w:type="spellEnd"/>
+      <w:r>
+        <w:t xml:space="preserve">, S. C., Abbas, A., </w:t>
+      </w:r>
+      <w:proofErr w:type="spellStart"/>
+      <w:r>
+        <w:t>Jayaraman</w:t>
+      </w:r>
+      <w:proofErr w:type="spellEnd"/>
+      <w:r>
+        <w:t xml:space="preserve">, P. P., </w:t>
+      </w:r>
+      <w:proofErr w:type="spellStart"/>
+      <w:r>
+        <w:t>Wah</w:t>
+      </w:r>
+      <w:proofErr w:type="spellEnd"/>
+      <w:r>
+        <w:t xml:space="preserve">, Y. T., and Khan U. S. (2016). Big </w:t>
+      </w:r>
+      <w:r>
+        <w:tab/>
+        <w:t xml:space="preserve">Data Reduction Methods: A Survey. </w:t>
+      </w:r>
+      <w:r>
+        <w:rPr>
+          <w:i/>
+          <w:iCs/>
+        </w:rPr>
         <w:t>Data Science and Engineering</w:t>
       </w:r>
       <w:r>
@@ -4691,6 +5513,7 @@
       <w:pPr>
         <w:spacing w:line="480" w:lineRule="auto"/>
       </w:pPr>
+      <w:proofErr w:type="spellStart"/>
       <w:r>
         <w:rPr>
           <w:rStyle w:val="Quotation"/>
@@ -4699,6 +5522,7 @@
         </w:rPr>
         <w:t>Saraswathi</w:t>
       </w:r>
+      <w:proofErr w:type="spellEnd"/>
       <w:r>
         <w:rPr>
           <w:rStyle w:val="Quotation"/>
@@ -4778,7 +5602,23 @@
         <w:spacing w:line="480" w:lineRule="auto"/>
       </w:pPr>
       <w:r>
-        <w:t xml:space="preserve">Saxena, S., Alam, M., Jabarullah, M., and Yadav, R. (2018). Face Recognition Using Coupled the </w:t>
+        <w:t xml:space="preserve">Saxena, S., </w:t>
+      </w:r>
+      <w:proofErr w:type="spellStart"/>
+      <w:r>
+        <w:t>Alam</w:t>
+      </w:r>
+      <w:proofErr w:type="spellEnd"/>
+      <w:r>
+        <w:t xml:space="preserve">, M., </w:t>
+      </w:r>
+      <w:proofErr w:type="spellStart"/>
+      <w:r>
+        <w:t>Jabarullah</w:t>
+      </w:r>
+      <w:proofErr w:type="spellEnd"/>
+      <w:r>
+        <w:t xml:space="preserve">, M., and Yadav, R. (2018). Face Recognition Using Coupled the </w:t>
       </w:r>
     </w:p>
     <w:p>
@@ -4887,100 +5727,132 @@
           <w:iCs/>
         </w:rPr>
       </w:pPr>
-      <w:r>
-        <w:t xml:space="preserve">Schroff, F., Kalenichenko, D., and Phiblin, J. (2015-07-12). </w:t>
-      </w:r>
+      <w:proofErr w:type="spellStart"/>
+      <w:r>
+        <w:t>Schroff</w:t>
+      </w:r>
+      <w:proofErr w:type="spellEnd"/>
+      <w:r>
+        <w:t xml:space="preserve">, F., </w:t>
+      </w:r>
+      <w:proofErr w:type="spellStart"/>
+      <w:r>
+        <w:t>Kalenichenko</w:t>
+      </w:r>
+      <w:proofErr w:type="spellEnd"/>
+      <w:r>
+        <w:t xml:space="preserve">, D., and </w:t>
+      </w:r>
+      <w:proofErr w:type="spellStart"/>
+      <w:r>
+        <w:t>Phiblin</w:t>
+      </w:r>
+      <w:proofErr w:type="spellEnd"/>
+      <w:r>
+        <w:t xml:space="preserve">, J. (2015-07-12). </w:t>
+      </w:r>
+      <w:proofErr w:type="spellStart"/>
       <w:r>
         <w:rPr>
           <w:i/>
           <w:iCs/>
         </w:rPr>
-        <w:t xml:space="preserve">FaceNet: A unified embedding for face </w:t>
-      </w:r>
-    </w:p>
-    <w:p>
-      <w:pPr>
-        <w:spacing w:line="480" w:lineRule="auto"/>
-        <w:ind w:firstLine="709"/>
-      </w:pPr>
+        <w:t>FaceNet</w:t>
+      </w:r>
+      <w:proofErr w:type="spellEnd"/>
       <w:r>
         <w:rPr>
           <w:i/>
           <w:iCs/>
         </w:rPr>
-        <w:t>recognition and clustering</w:t>
-      </w:r>
-      <w:r>
-        <w:t xml:space="preserve">, 2015 IEEE Conference on Computer Vision and Pattern </w:t>
-      </w:r>
-      <w:r>
-        <w:tab/>
-        <w:t>Recognition</w:t>
-      </w:r>
-      <w:r>
-        <w:t>, Boston</w:t>
-      </w:r>
-      <w:r>
-        <w:t>, MA, USA. https://doi: 10.1109/CVPR.2015.7298682.</w:t>
-      </w:r>
-    </w:p>
-    <w:p>
-      <w:pPr>
-        <w:spacing w:line="480" w:lineRule="auto"/>
-      </w:pPr>
-      <w:r>
-        <w:t xml:space="preserve">Shahin, R. O., Ayedi, R., Rayan, A., Rasha, M., and Ahmed, A. (2021). Human Face Recognition </w:t>
-      </w:r>
-    </w:p>
-    <w:p>
-      <w:pPr>
-        <w:spacing w:line="480" w:lineRule="auto"/>
-      </w:pPr>
-      <w:r>
-        <w:tab/>
-        <w:t xml:space="preserve">from Part of a Facial Image based in Image Stitching. </w:t>
-      </w:r>
+        <w:t xml:space="preserve">: A unified embedding for face </w:t>
+      </w:r>
+    </w:p>
+    <w:p>
+      <w:pPr>
+        <w:spacing w:line="480" w:lineRule="auto"/>
+        <w:ind w:firstLine="709"/>
+      </w:pPr>
+      <w:proofErr w:type="gramStart"/>
       <w:r>
         <w:rPr>
           <w:i/>
           <w:iCs/>
         </w:rPr>
-        <w:t xml:space="preserve">International Journal of Advanced </w:t>
-      </w:r>
+        <w:t>recognition</w:t>
+      </w:r>
+      <w:proofErr w:type="gramEnd"/>
       <w:r>
         <w:rPr>
           <w:i/>
           <w:iCs/>
         </w:rPr>
-        <w:tab/>
-        <w:t>Computer Science and Applications</w:t>
-      </w:r>
-      <w:r>
-        <w:t>, 12(12) 256-463.</w:t>
-      </w:r>
-    </w:p>
-    <w:p>
-      <w:pPr>
-        <w:spacing w:line="480" w:lineRule="auto"/>
-      </w:pPr>
-      <w:r>
-        <w:t xml:space="preserve">Soni, M., and Shukla, S. (2020). Convolutional Neural Network and Hidden Markov Model Based </w:t>
-      </w:r>
-    </w:p>
-    <w:p>
-      <w:pPr>
-        <w:spacing w:line="480" w:lineRule="auto"/>
-      </w:pPr>
-      <w:r>
-        <w:tab/>
-        <w:t xml:space="preserve">Face Recognition. </w:t>
+        <w:t xml:space="preserve"> and clustering</w:t>
+      </w:r>
+      <w:r>
+        <w:t xml:space="preserve">, 2015 IEEE Conference on Computer Vision and Pattern </w:t>
+      </w:r>
+      <w:r>
+        <w:tab/>
+        <w:t>Recognition</w:t>
+      </w:r>
+      <w:r>
+        <w:t>, Boston</w:t>
+      </w:r>
+      <w:r>
+        <w:t>, MA, USA. https://doi: 10.1109/CVPR.2015.7298682.</w:t>
+      </w:r>
+    </w:p>
+    <w:p>
+      <w:pPr>
+        <w:spacing w:line="480" w:lineRule="auto"/>
+      </w:pPr>
+      <w:proofErr w:type="spellStart"/>
+      <w:r>
+        <w:t>Shahin</w:t>
+      </w:r>
+      <w:proofErr w:type="spellEnd"/>
+      <w:r>
+        <w:t xml:space="preserve">, R. O., </w:t>
+      </w:r>
+      <w:proofErr w:type="spellStart"/>
+      <w:r>
+        <w:t>Ayedi</w:t>
+      </w:r>
+      <w:proofErr w:type="spellEnd"/>
+      <w:r>
+        <w:t xml:space="preserve">, R., Rayan, A., </w:t>
+      </w:r>
+      <w:proofErr w:type="spellStart"/>
+      <w:r>
+        <w:t>Rasha</w:t>
+      </w:r>
+      <w:proofErr w:type="spellEnd"/>
+      <w:r>
+        <w:t xml:space="preserve">, M., and Ahmed, A. (2021). Human Face Recognition </w:t>
+      </w:r>
+    </w:p>
+    <w:p>
+      <w:pPr>
+        <w:spacing w:line="480" w:lineRule="auto"/>
+      </w:pPr>
+      <w:r>
+        <w:tab/>
+      </w:r>
+      <w:proofErr w:type="gramStart"/>
+      <w:r>
+        <w:t>from</w:t>
+      </w:r>
+      <w:proofErr w:type="gramEnd"/>
+      <w:r>
+        <w:t xml:space="preserve"> Part of a Facial Image based in Image Stitching. </w:t>
       </w:r>
       <w:r>
         <w:rPr>
           <w:i/>
           <w:iCs/>
         </w:rPr>
-        <w:t xml:space="preserve">International Journal of Electrical, Electronics and Data </w:t>
+        <w:t xml:space="preserve">International Journal of Advanced </w:t>
       </w:r>
       <w:r>
         <w:rPr>
@@ -4988,40 +5860,34 @@
           <w:iCs/>
         </w:rPr>
         <w:tab/>
-        <w:t>Communication</w:t>
-      </w:r>
-      <w:r>
-        <w:t>, 8(2): 26-30.</w:t>
-      </w:r>
-    </w:p>
-    <w:p>
-      <w:pPr>
-        <w:spacing w:line="480" w:lineRule="auto"/>
-      </w:pPr>
-      <w:r>
-        <w:t xml:space="preserve">Struc, v. and Pavesic, N. (2009). A Case Study on Appearance Based Feature Extraction Techniques </w:t>
-      </w:r>
-    </w:p>
-    <w:p>
-      <w:pPr>
-        <w:spacing w:line="480" w:lineRule="auto"/>
-      </w:pPr>
-      <w:r>
-        <w:tab/>
-        <w:t xml:space="preserve">and Their Susceptibility to Image Degradations for </w:t>
-      </w:r>
-      <w:r>
-        <w:t>the</w:t>
-      </w:r>
-      <w:r>
-        <w:t xml:space="preserve"> Task of Face Recognition. W</w:t>
+        <w:t>Computer Science and Applications</w:t>
+      </w:r>
+      <w:r>
+        <w:t>, 12(12) 256-463.</w:t>
+      </w:r>
+    </w:p>
+    <w:p>
+      <w:pPr>
+        <w:spacing w:line="480" w:lineRule="auto"/>
+      </w:pPr>
+      <w:r>
+        <w:t xml:space="preserve">Soni, M., and Shukla, S. (2020). Convolutional Neural Network and Hidden Markov Model Based </w:t>
+      </w:r>
+    </w:p>
+    <w:p>
+      <w:pPr>
+        <w:spacing w:line="480" w:lineRule="auto"/>
+      </w:pPr>
+      <w:r>
+        <w:tab/>
+        <w:t xml:space="preserve">Face Recognition. </w:t>
       </w:r>
       <w:r>
         <w:rPr>
           <w:i/>
           <w:iCs/>
         </w:rPr>
-        <w:t xml:space="preserve">orld </w:t>
+        <w:t xml:space="preserve">International Journal of Electrical, Electronics and Data </w:t>
       </w:r>
       <w:r>
         <w:rPr>
@@ -5029,99 +5895,186 @@
           <w:iCs/>
         </w:rPr>
         <w:tab/>
-        <w:t>Academy of Science, Engineering and Technology,</w:t>
-      </w:r>
-      <w:r>
-        <w:t xml:space="preserve"> 30(2009): 806-814.</w:t>
-      </w:r>
-    </w:p>
-    <w:p>
-      <w:pPr>
-        <w:spacing w:line="480" w:lineRule="auto"/>
-      </w:pPr>
-      <w:r>
-        <w:t xml:space="preserve">The United Nations. (2021). Technology and Innovation Report 2021. Retrieved from </w:t>
-      </w:r>
-    </w:p>
-    <w:p>
-      <w:pPr>
-        <w:spacing w:line="480" w:lineRule="auto"/>
-      </w:pPr>
-      <w:r>
-        <w:tab/>
-        <w:t>https://unctad.org/system/files/official-document/tir2020_en.pdf</w:t>
-      </w:r>
-    </w:p>
-    <w:p>
-      <w:pPr>
-        <w:spacing w:line="480" w:lineRule="auto"/>
-      </w:pPr>
-      <w:r>
-        <w:t xml:space="preserve">Vicario, G., and Coleman, S. (2018). A Review of Data Science in Business and Industry and a </w:t>
-      </w:r>
-    </w:p>
-    <w:p>
-      <w:pPr>
-        <w:spacing w:line="480" w:lineRule="auto"/>
-      </w:pPr>
-      <w:r>
-        <w:tab/>
-        <w:t xml:space="preserve">Future Review. </w:t>
+        <w:t>Communication</w:t>
+      </w:r>
+      <w:r>
+        <w:t>, 8(2): 26-30.</w:t>
+      </w:r>
+    </w:p>
+    <w:p>
+      <w:pPr>
+        <w:spacing w:line="480" w:lineRule="auto"/>
+      </w:pPr>
+      <w:r>
+        <w:t xml:space="preserve">Struc, v. and Pavesic, N. (2009). A Case Study on Appearance Based Feature Extraction Techniques </w:t>
+      </w:r>
+    </w:p>
+    <w:p>
+      <w:pPr>
+        <w:spacing w:line="480" w:lineRule="auto"/>
+      </w:pPr>
+      <w:r>
+        <w:tab/>
+      </w:r>
+      <w:proofErr w:type="gramStart"/>
+      <w:r>
+        <w:t>and</w:t>
+      </w:r>
+      <w:proofErr w:type="gramEnd"/>
+      <w:r>
+        <w:t xml:space="preserve"> Their Susceptibility to Image Degradations for </w:t>
+      </w:r>
+      <w:r>
+        <w:t>the</w:t>
+      </w:r>
+      <w:r>
+        <w:t xml:space="preserve"> Task of Face Recognition. W</w:t>
       </w:r>
       <w:r>
         <w:rPr>
           <w:i/>
           <w:iCs/>
         </w:rPr>
-        <w:t xml:space="preserve">Applied Stochastic Models in Business and Industry, </w:t>
-      </w:r>
-      <w:r>
-        <w:t>36(1), 6-18</w:t>
+        <w:t xml:space="preserve">orld </w:t>
       </w:r>
       <w:r>
         <w:rPr>
           <w:i/>
           <w:iCs/>
         </w:rPr>
-        <w:t xml:space="preserve">. </w:t>
-      </w:r>
-    </w:p>
-    <w:p>
-      <w:pPr>
-        <w:spacing w:line="480" w:lineRule="auto"/>
-      </w:pPr>
+        <w:tab/>
+        <w:t>Academy of Science, Engineering and Technology,</w:t>
+      </w:r>
+      <w:r>
+        <w:t xml:space="preserve"> 30(2009): 806-814.</w:t>
+      </w:r>
+    </w:p>
+    <w:p>
+      <w:pPr>
+        <w:spacing w:line="480" w:lineRule="auto"/>
+      </w:pPr>
+      <w:r>
+        <w:t xml:space="preserve">The United Nations. (2021). Technology and Innovation Report 2021. Retrieved from </w:t>
+      </w:r>
+    </w:p>
+    <w:p>
+      <w:pPr>
+        <w:spacing w:line="480" w:lineRule="auto"/>
+      </w:pPr>
+      <w:r>
+        <w:tab/>
+        <w:t>https://unctad.org/system/files/official-document/tir2020_en.pdf</w:t>
+      </w:r>
+    </w:p>
+    <w:p>
+      <w:pPr>
+        <w:spacing w:line="480" w:lineRule="auto"/>
+      </w:pPr>
+      <w:r>
+        <w:t xml:space="preserve">Vicario, G., and Coleman, S. (2018). A Review of Data Science in Business and Industry and a </w:t>
+      </w:r>
+    </w:p>
+    <w:p>
+      <w:pPr>
+        <w:spacing w:line="480" w:lineRule="auto"/>
+      </w:pPr>
+      <w:r>
+        <w:tab/>
+        <w:t xml:space="preserve">Future Review. </w:t>
+      </w:r>
       <w:r>
         <w:rPr>
           <w:i/>
           <w:iCs/>
         </w:rPr>
-        <w:tab/>
-      </w:r>
-      <w:r>
-        <w:t>https://doi:10.1002/asmb.2488</w:t>
-      </w:r>
-    </w:p>
-    <w:p>
-      <w:pPr>
-        <w:spacing w:line="480" w:lineRule="auto"/>
-      </w:pPr>
-      <w:r>
-        <w:t xml:space="preserve">Viegas, M. A., Simoes, R., Thanekar, N., Barnerjee, S., Dicholkar, R. (2019). Different Approaches </w:t>
-      </w:r>
-    </w:p>
-    <w:p>
-      <w:pPr>
-        <w:spacing w:line="480" w:lineRule="auto"/>
-      </w:pPr>
-      <w:r>
-        <w:tab/>
-        <w:t>of Face Recognition. I</w:t>
+        <w:t xml:space="preserve">Applied Stochastic Models in Business and Industry, </w:t>
+      </w:r>
+      <w:r>
+        <w:t>36(1), 6-18</w:t>
       </w:r>
       <w:r>
         <w:rPr>
           <w:i/>
           <w:iCs/>
         </w:rPr>
+        <w:t xml:space="preserve">. </w:t>
+      </w:r>
+    </w:p>
+    <w:p>
+      <w:pPr>
+        <w:spacing w:line="480" w:lineRule="auto"/>
+      </w:pPr>
+      <w:r>
+        <w:rPr>
+          <w:i/>
+          <w:iCs/>
+        </w:rPr>
+        <w:tab/>
+      </w:r>
+      <w:r>
+        <w:t>https://doi:10.1002/asmb.2488</w:t>
+      </w:r>
+    </w:p>
+    <w:p>
+      <w:pPr>
+        <w:spacing w:line="480" w:lineRule="auto"/>
+      </w:pPr>
+      <w:r>
+        <w:t xml:space="preserve">Viegas, M. A., </w:t>
+      </w:r>
+      <w:proofErr w:type="spellStart"/>
+      <w:r>
+        <w:t>Simoes</w:t>
+      </w:r>
+      <w:proofErr w:type="spellEnd"/>
+      <w:r>
+        <w:t xml:space="preserve">, R., </w:t>
+      </w:r>
+      <w:proofErr w:type="spellStart"/>
+      <w:r>
+        <w:t>Thanekar</w:t>
+      </w:r>
+      <w:proofErr w:type="spellEnd"/>
+      <w:r>
+        <w:t xml:space="preserve">, N., </w:t>
+      </w:r>
+      <w:proofErr w:type="spellStart"/>
+      <w:r>
+        <w:t>Barnerjee</w:t>
+      </w:r>
+      <w:proofErr w:type="spellEnd"/>
+      <w:r>
+        <w:t xml:space="preserve">, S., </w:t>
+      </w:r>
+      <w:proofErr w:type="spellStart"/>
+      <w:r>
+        <w:t>Dicholkar</w:t>
+      </w:r>
+      <w:proofErr w:type="spellEnd"/>
+      <w:r>
+        <w:t xml:space="preserve">, R. (2019). Different Approaches </w:t>
+      </w:r>
+    </w:p>
+    <w:p>
+      <w:pPr>
+        <w:spacing w:line="480" w:lineRule="auto"/>
+      </w:pPr>
+      <w:r>
+        <w:tab/>
+      </w:r>
+      <w:proofErr w:type="gramStart"/>
+      <w:r>
+        <w:t>of</w:t>
+      </w:r>
+      <w:proofErr w:type="gramEnd"/>
+      <w:r>
+        <w:t xml:space="preserve"> Face Recognition. I</w:t>
+      </w:r>
+      <w:r>
+        <w:rPr>
+          <w:i/>
+          <w:iCs/>
+        </w:rPr>
         <w:t xml:space="preserve">nternational Journal of Engineering Research &amp; Technology, </w:t>
       </w:r>
       <w:r>
@@ -5138,7 +6091,23 @@
       </w:pPr>
       <w:r>
         <w:lastRenderedPageBreak/>
-        <w:t xml:space="preserve">Wu, Z., Xiamixiding, R. Sjjanhar, A., Chen, J., and Wen, Q. (2018). Image Appearance-Based </w:t>
+        <w:t xml:space="preserve">Wu, Z., </w:t>
+      </w:r>
+      <w:proofErr w:type="spellStart"/>
+      <w:r>
+        <w:t>Xiamixiding</w:t>
+      </w:r>
+      <w:proofErr w:type="spellEnd"/>
+      <w:r>
+        <w:t xml:space="preserve">, R. </w:t>
+      </w:r>
+      <w:proofErr w:type="spellStart"/>
+      <w:r>
+        <w:t>Sjjanhar</w:t>
+      </w:r>
+      <w:proofErr w:type="spellEnd"/>
+      <w:r>
+        <w:t xml:space="preserve">, A., Chen, J., and Wen, Q. (2018). Image Appearance-Based </w:t>
       </w:r>
     </w:p>
     <w:p>
@@ -5208,7 +6177,15 @@
         <w:spacing w:line="480" w:lineRule="auto"/>
       </w:pPr>
       <w:r>
-        <w:t xml:space="preserve">Yang, M., Kriegman, D, J., Ahuja, N. (2002). Detecting Faces in Images: A Survey. IEEE </w:t>
+        <w:t xml:space="preserve">Yang, M., </w:t>
+      </w:r>
+      <w:proofErr w:type="spellStart"/>
+      <w:r>
+        <w:t>Kriegman</w:t>
+      </w:r>
+      <w:proofErr w:type="spellEnd"/>
+      <w:r>
+        <w:t xml:space="preserve">, D, J., Ahuja, N. (2002). Detecting Faces in Images: A Survey. IEEE </w:t>
       </w:r>
     </w:p>
     <w:p>
@@ -5289,7 +6266,7 @@
           <w:rPr>
             <w:noProof/>
           </w:rPr>
-          <w:t>22</w:t>
+          <w:t>10</w:t>
         </w:r>
         <w:r>
           <w:rPr>
@@ -6192,6 +7169,7 @@
   <w:style w:type="character" w:default="1" w:styleId="DefaultParagraphFont">
     <w:name w:val="Default Paragraph Font"/>
     <w:uiPriority w:val="1"/>
+    <w:semiHidden/>
     <w:unhideWhenUsed/>
   </w:style>
   <w:style w:type="table" w:default="1" w:styleId="TableNormal">
@@ -6744,7 +7722,7 @@
 </file>
 
 <file path=customXml/itemProps1.xml><?xml version="1.0" encoding="utf-8"?>
-<ds:datastoreItem xmlns:ds="http://schemas.openxmlformats.org/officeDocument/2006/customXml" ds:itemID="{CFF603EF-84FF-4AEE-80B4-2337D2721DB9}">
+<ds:datastoreItem xmlns:ds="http://schemas.openxmlformats.org/officeDocument/2006/customXml" ds:itemID="{37350049-0A0E-4B39-BEC8-95F1171789CD}">
   <ds:schemaRefs>
     <ds:schemaRef ds:uri="http://schemas.openxmlformats.org/officeDocument/2006/bibliography"/>
   </ds:schemaRefs>

</xml_diff>

<commit_message>
Start working on the loss function
</commit_message>
<xml_diff>
--- a/SikoliaThesis.docx
+++ b/SikoliaThesis.docx
@@ -325,7 +325,7 @@
     <w:p>
       <w:pPr>
         <w:pStyle w:val="Heading1"/>
-        <w:ind w:left="0" w:hanging="0"/>
+        <w:ind w:left="0" w:right="0" w:hanging="0"/>
         <w:rPr/>
       </w:pPr>
       <w:bookmarkStart w:id="0" w:name="_Toc123819399"/>
@@ -592,7 +592,7 @@
     <w:p>
       <w:pPr>
         <w:pStyle w:val="Heading1"/>
-        <w:ind w:left="0" w:hanging="0"/>
+        <w:ind w:left="0" w:right="0" w:hanging="0"/>
         <w:rPr/>
       </w:pPr>
       <w:bookmarkStart w:id="1" w:name="_Toc123819400"/>
@@ -759,7 +759,7 @@
     <w:p>
       <w:pPr>
         <w:pStyle w:val="Heading1"/>
-        <w:ind w:left="0" w:hanging="0"/>
+        <w:ind w:left="0" w:right="0" w:hanging="0"/>
         <w:rPr/>
       </w:pPr>
       <w:bookmarkStart w:id="2" w:name="_Toc123819401"/>
@@ -856,7 +856,7 @@
     <w:p>
       <w:pPr>
         <w:pStyle w:val="Heading1"/>
-        <w:ind w:left="0" w:hanging="0"/>
+        <w:ind w:left="0" w:right="0" w:hanging="0"/>
         <w:rPr/>
       </w:pPr>
       <w:bookmarkStart w:id="3" w:name="_Toc123819402"/>
@@ -957,7 +957,7 @@
         <w:p>
           <w:pPr>
             <w:pStyle w:val="ContentsHeading"/>
-            <w:ind w:left="0" w:hanging="0"/>
+            <w:ind w:left="0" w:right="0" w:hanging="0"/>
             <w:rPr>
               <w:rFonts w:ascii="Liberation Serif" w:hAnsi="Liberation Serif"/>
               <w:b/>
@@ -2035,7 +2035,7 @@
     <w:p>
       <w:pPr>
         <w:pStyle w:val="Heading1"/>
-        <w:ind w:left="0" w:hanging="0"/>
+        <w:ind w:left="0" w:right="0" w:hanging="0"/>
         <w:rPr/>
       </w:pPr>
       <w:bookmarkStart w:id="4" w:name="_Toc123819403"/>
@@ -2161,7 +2161,7 @@
     <w:p>
       <w:pPr>
         <w:pStyle w:val="Heading1"/>
-        <w:ind w:left="0" w:hanging="0"/>
+        <w:ind w:left="0" w:right="0" w:hanging="0"/>
         <w:rPr/>
       </w:pPr>
       <w:bookmarkStart w:id="5" w:name="_Toc123819404"/>
@@ -2170,26 +2170,6 @@
         <w:t>List of Figures</w:t>
       </w:r>
       <w:bookmarkEnd w:id="5"/>
-    </w:p>
-    <w:p>
-      <w:pPr>
-        <w:pStyle w:val="Normal"/>
-        <w:spacing w:lineRule="auto" w:line="480"/>
-        <w:rPr/>
-      </w:pPr>
-      <w:r>
-        <w:rPr/>
-      </w:r>
-    </w:p>
-    <w:p>
-      <w:pPr>
-        <w:pStyle w:val="Normal"/>
-        <w:spacing w:lineRule="auto" w:line="480"/>
-        <w:rPr/>
-      </w:pPr>
-      <w:r>
-        <w:rPr/>
-      </w:r>
     </w:p>
     <w:p>
       <w:pPr>
@@ -2214,7 +2194,7 @@
     <w:p>
       <w:pPr>
         <w:pStyle w:val="Heading1"/>
-        <w:ind w:left="0" w:hanging="0"/>
+        <w:ind w:left="0" w:right="0" w:hanging="0"/>
         <w:rPr/>
       </w:pPr>
       <w:bookmarkStart w:id="6" w:name="_Toc123819405"/>
@@ -2227,7 +2207,7 @@
     <w:p>
       <w:pPr>
         <w:pStyle w:val="Heading2"/>
-        <w:ind w:left="0" w:hanging="0"/>
+        <w:ind w:left="0" w:right="0" w:hanging="0"/>
         <w:rPr/>
       </w:pPr>
       <w:bookmarkStart w:id="7" w:name="_Toc123819406"/>
@@ -2240,7 +2220,7 @@
     <w:p>
       <w:pPr>
         <w:pStyle w:val="Heading2"/>
-        <w:ind w:left="0" w:hanging="0"/>
+        <w:ind w:left="0" w:right="0" w:hanging="0"/>
         <w:rPr/>
       </w:pPr>
       <w:bookmarkStart w:id="8" w:name="_Toc123819407"/>
@@ -2301,7 +2281,7 @@
     <w:p>
       <w:pPr>
         <w:pStyle w:val="Heading2"/>
-        <w:ind w:left="0" w:hanging="0"/>
+        <w:ind w:left="0" w:right="0" w:hanging="0"/>
         <w:rPr/>
       </w:pPr>
       <w:bookmarkStart w:id="9" w:name="_Toc123819408"/>
@@ -2358,7 +2338,7 @@
     <w:p>
       <w:pPr>
         <w:pStyle w:val="Heading2"/>
-        <w:ind w:left="0" w:hanging="0"/>
+        <w:ind w:left="0" w:right="0" w:hanging="0"/>
         <w:rPr/>
       </w:pPr>
       <w:bookmarkStart w:id="10" w:name="_Toc123819409"/>
@@ -2458,7 +2438,7 @@
     <w:p>
       <w:pPr>
         <w:pStyle w:val="Heading2"/>
-        <w:ind w:left="0" w:hanging="0"/>
+        <w:ind w:left="0" w:right="0" w:hanging="0"/>
         <w:rPr/>
       </w:pPr>
       <w:bookmarkStart w:id="11" w:name="_Toc123819410"/>
@@ -2478,7 +2458,7 @@
     <w:p>
       <w:pPr>
         <w:pStyle w:val="Heading3"/>
-        <w:ind w:left="0" w:hanging="0"/>
+        <w:ind w:left="0" w:right="0" w:hanging="0"/>
         <w:rPr/>
       </w:pPr>
       <w:bookmarkStart w:id="12" w:name="_Toc123819411"/>
@@ -2502,7 +2482,7 @@
     <w:p>
       <w:pPr>
         <w:pStyle w:val="Heading3"/>
-        <w:ind w:left="0" w:hanging="0"/>
+        <w:ind w:left="0" w:right="0" w:hanging="0"/>
         <w:rPr/>
       </w:pPr>
       <w:bookmarkStart w:id="13" w:name="_Toc123819412"/>
@@ -2511,430 +2491,6 @@
         <w:t>1.4.2 Specific Objectives</w:t>
       </w:r>
       <w:bookmarkEnd w:id="13"/>
-    </w:p>
-    <w:p>
-      <w:pPr>
-        <w:pStyle w:val="Normal"/>
-        <w:numPr>
-          <w:ilvl w:val="0"/>
-          <w:numId w:val="1"/>
-        </w:numPr>
-        <w:spacing w:lineRule="auto" w:line="480"/>
-        <w:rPr/>
-      </w:pPr>
-      <w:r>
-        <w:rPr/>
-        <w:t>To use convolution neural networks to build a model that can detect African faces given a list of smartphone images.</w:t>
-      </w:r>
-    </w:p>
-    <w:p>
-      <w:pPr>
-        <w:pStyle w:val="Normal"/>
-        <w:numPr>
-          <w:ilvl w:val="0"/>
-          <w:numId w:val="1"/>
-        </w:numPr>
-        <w:spacing w:lineRule="auto" w:line="480"/>
-        <w:rPr/>
-      </w:pPr>
-      <w:r>
-        <w:rPr/>
-        <w:t>To use recurrent neural networks to build a model that can detect African faces given a list of smartphone images.</w:t>
-      </w:r>
-    </w:p>
-    <w:p>
-      <w:pPr>
-        <w:pStyle w:val="Normal"/>
-        <w:numPr>
-          <w:ilvl w:val="0"/>
-          <w:numId w:val="1"/>
-        </w:numPr>
-        <w:spacing w:lineRule="auto" w:line="480"/>
-        <w:rPr/>
-      </w:pPr>
-      <w:r>
-        <w:rPr/>
-        <w:t>To use long short term memory neural networks to build a model that can detect African faces given a list of smartphone images.</w:t>
-      </w:r>
-    </w:p>
-    <w:p>
-      <w:pPr>
-        <w:pStyle w:val="Normal"/>
-        <w:numPr>
-          <w:ilvl w:val="0"/>
-          <w:numId w:val="1"/>
-        </w:numPr>
-        <w:spacing w:lineRule="auto" w:line="480"/>
-        <w:rPr/>
-      </w:pPr>
-      <w:r>
-        <w:rPr/>
-        <w:t>To compare the performance of convolution, recurrent, and long short term memory neural networks on African faces from smartphone pictures.</w:t>
-      </w:r>
-    </w:p>
-    <w:p>
-      <w:pPr>
-        <w:pStyle w:val="Heading2"/>
-        <w:ind w:left="0" w:hanging="0"/>
-        <w:rPr/>
-      </w:pPr>
-      <w:bookmarkStart w:id="14" w:name="_Toc123819413"/>
-      <w:r>
-        <w:rPr/>
-        <w:t>1.5 Significance of the Study</w:t>
-      </w:r>
-      <w:bookmarkEnd w:id="14"/>
-    </w:p>
-    <w:p>
-      <w:pPr>
-        <w:pStyle w:val="Normal"/>
-        <w:spacing w:lineRule="auto" w:line="480"/>
-        <w:rPr/>
-      </w:pPr>
-      <w:r>
-        <w:rPr/>
-        <w:tab/>
-        <w:t>Apparently, there is a lot of literature on the subject of facial recognition but that is not enough. This owes to the truth that Marks (2021) cites two cases where people of color were wrongfully arrested because of a racially biased facial recognition system. In a different study, Leslie (2020) argues that racial bias in photographs is a problem that began as early as the 19</w:t>
-      </w:r>
-      <w:r>
-        <w:rPr>
-          <w:vertAlign w:val="superscript"/>
-        </w:rPr>
-        <w:t>th</w:t>
-      </w:r>
-      <w:r>
-        <w:rPr/>
-        <w:t xml:space="preserve"> century. The same author further mentions that the topical facial recognition systems are still racially biased. It is also important to note that most of the current facial recognition systems were created from celebrity images but none of them dared to use images collected from Smartphones. It is notable that the current facial recognition systems were created using one hundred and twenty-eight variables. It follows that this proposal will contribute to the existing knowledge by creating a facial recognition system using forty-two variables, African faces, and images taken using smartphones.</w:t>
-      </w:r>
-    </w:p>
-    <w:p>
-      <w:pPr>
-        <w:pStyle w:val="Normal"/>
-        <w:spacing w:lineRule="auto" w:line="480"/>
-        <w:rPr/>
-      </w:pPr>
-      <w:r>
-        <w:rPr/>
-      </w:r>
-      <w:r>
-        <w:br w:type="page"/>
-      </w:r>
-    </w:p>
-    <w:p>
-      <w:pPr>
-        <w:pStyle w:val="Heading1"/>
-        <w:ind w:left="0" w:hanging="0"/>
-        <w:rPr/>
-      </w:pPr>
-      <w:bookmarkStart w:id="15" w:name="_Toc123819414"/>
-      <w:r>
-        <w:rPr/>
-        <w:t>Chapter Two</w:t>
-      </w:r>
-      <w:bookmarkEnd w:id="15"/>
-    </w:p>
-    <w:p>
-      <w:pPr>
-        <w:pStyle w:val="Heading1"/>
-        <w:ind w:left="0" w:hanging="0"/>
-        <w:rPr/>
-      </w:pPr>
-      <w:bookmarkStart w:id="16" w:name="_Toc123819415"/>
-      <w:r>
-        <w:rPr/>
-        <w:t>Literature Review</w:t>
-      </w:r>
-      <w:bookmarkEnd w:id="16"/>
-    </w:p>
-    <w:p>
-      <w:pPr>
-        <w:pStyle w:val="Heading2"/>
-        <w:ind w:left="0" w:hanging="0"/>
-        <w:rPr/>
-      </w:pPr>
-      <w:bookmarkStart w:id="17" w:name="_Toc123819416"/>
-      <w:r>
-        <w:rPr/>
-        <w:t>2.1 Introduction</w:t>
-      </w:r>
-      <w:bookmarkEnd w:id="17"/>
-    </w:p>
-    <w:p>
-      <w:pPr>
-        <w:pStyle w:val="Normal"/>
-        <w:spacing w:lineRule="auto" w:line="480"/>
-        <w:rPr/>
-      </w:pPr>
-      <w:r>
-        <w:rPr/>
-        <w:tab/>
-        <w:t>This section surveys previous works done on facial recognition with a bias towards the objectives of this work. It begins with examining different types of methodologies that have been used for facial recognition before delving into how different types of neural networks have been used for facial recognition. Specifically, this proposal discusses how convolution neural networks, recurrent neural networks, and long short term memory neural networks have been used for facial recognition. Finally, the proposal examines machine learning workflows from previous publications and how those workflows can be applied to facial recognition.</w:t>
-      </w:r>
-    </w:p>
-    <w:p>
-      <w:pPr>
-        <w:pStyle w:val="Heading2"/>
-        <w:ind w:left="0" w:hanging="0"/>
-        <w:rPr/>
-      </w:pPr>
-      <w:bookmarkStart w:id="18" w:name="_Toc123819417"/>
-      <w:r>
-        <w:rPr/>
-        <w:t>2.2 Facial Recognition</w:t>
-      </w:r>
-      <w:bookmarkEnd w:id="18"/>
-    </w:p>
-    <w:p>
-      <w:pPr>
-        <w:pStyle w:val="Normal"/>
-        <w:spacing w:lineRule="auto" w:line="480"/>
-        <w:rPr/>
-      </w:pPr>
-      <w:r>
-        <w:rPr/>
-        <w:tab/>
-        <w:t>Facial recognition is a biometric technique used to identify faces and match those faces to a database of faces with an aim of identifying a human being from an image. From the definition, it is clear that face recognition is a two-step process with the first step being face detection and the second step being face identification. The first step of facial recognition (or the face detection step) is identifying and extracting human faces from an image. In this step, all objects in an image are extracted and checked to confirm if a picture contains a human face. If any human face is present in the image, the face is extracted from the image before step two begins. In the second step or the image identification step, an image is compared to faces stored in a database to identify if the face matches the face of a known person. In short, there is a difference between facial detection and facial recognition and that facial recognition begins with facial detection and finalizes with facial identification.</w:t>
-      </w:r>
-    </w:p>
-    <w:p>
-      <w:pPr>
-        <w:pStyle w:val="Heading3"/>
-        <w:ind w:left="0" w:hanging="0"/>
-        <w:rPr/>
-      </w:pPr>
-      <w:bookmarkStart w:id="19" w:name="_Toc123819418"/>
-      <w:r>
-        <w:rPr/>
-        <w:t>2.2.1 Face Detection</w:t>
-      </w:r>
-      <w:bookmarkEnd w:id="19"/>
-    </w:p>
-    <w:p>
-      <w:pPr>
-        <w:pStyle w:val="Normal"/>
-        <w:spacing w:lineRule="auto" w:line="480"/>
-        <w:rPr/>
-      </w:pPr>
-      <w:r>
-        <w:rPr/>
-        <w:tab/>
-        <w:t>Given an arbitrary image, the objective of facial detection is to establish whether or not there are any faces in the image and if present, return the image location and extent of each face (Yang, Kriegman and Ahuja, 2002). It is important to highlight that there are several methods that could be used for detecting faces from images. These methods include knowledge based methods, feature invariant approaches, template matching methods, and appearance based methods. Indeed, the mentioned methods are important when detecting faces from images, but all these methods are accompanied by several challenges. This owes to the reality that Yang, Kriegman and Ahuja (2002) list the following five challenges that are associated with facial detection: - pose, occlusion, aging face expression, imaging conditions and image orientation. Moreover, face expression is not only a challenge in face detection but also in face recognition. It follows that researchers on facial recognition should identify methods of tackling the mentioned challenges associated with face detection.</w:t>
-      </w:r>
-    </w:p>
-    <w:p>
-      <w:pPr>
-        <w:pStyle w:val="Heading4"/>
-        <w:ind w:left="0" w:hanging="0"/>
-        <w:rPr/>
-      </w:pPr>
-      <w:r>
-        <w:rPr/>
-        <w:t>2.2.1.1 Challenges in Face Detection</w:t>
-      </w:r>
-    </w:p>
-    <w:p>
-      <w:pPr>
-        <w:pStyle w:val="Normal"/>
-        <w:spacing w:lineRule="auto" w:line="480"/>
-        <w:rPr/>
-      </w:pPr>
-      <w:r>
-        <w:rPr>
-          <w:b/>
-          <w:bCs/>
-        </w:rPr>
-        <w:t xml:space="preserve">Pose: </w:t>
-      </w:r>
-      <w:r>
-        <w:rPr/>
-        <w:t>A review of images databases will indicate that people like taking images in different posters. It follows that an image is likely to have a face that is twisted to the right, left, or even upside down. Moreover, some features such as the nose, eye, or ears maybe wholly or partially occluded which is an additional challenge in facial recognition.</w:t>
-      </w:r>
-      <w:r>
-        <w:rPr>
-          <w:b/>
-          <w:bCs/>
-        </w:rPr>
-        <w:t xml:space="preserve"> </w:t>
-      </w:r>
-      <w:r>
-        <w:rPr/>
-        <w:t>This problem is always solved by rotating images back to an upright position.</w:t>
-      </w:r>
-    </w:p>
-    <w:p>
-      <w:pPr>
-        <w:pStyle w:val="Normal"/>
-        <w:spacing w:lineRule="auto" w:line="480"/>
-        <w:rPr/>
-      </w:pPr>
-      <w:r>
-        <w:rPr>
-          <w:b/>
-          <w:bCs/>
-        </w:rPr>
-        <w:t xml:space="preserve">Occlusion: </w:t>
-      </w:r>
-      <w:r>
-        <w:rPr/>
-        <w:t xml:space="preserve">Human beings often have features that could affect image detection. For instance, men are known to have beards, which may or may not exist in images. It also important to highlight that people at times wear spectacles, which also affects face detection. Moreover, COVID 19 forced people to wear masks, which presents a unique challenge in facial recognition. </w:t>
-      </w:r>
-    </w:p>
-    <w:p>
-      <w:pPr>
-        <w:pStyle w:val="Normal"/>
-        <w:spacing w:lineRule="auto" w:line="480"/>
-        <w:rPr/>
-      </w:pPr>
-      <w:r>
-        <w:rPr>
-          <w:b/>
-          <w:bCs/>
-        </w:rPr>
-        <w:t>Aging</w:t>
-      </w:r>
-      <w:r>
-        <w:rPr/>
-        <w:t>: Human faces are known to change with age progression which presents a challenge in facial recognition. This implies that there would be significant difference in images if the time difference between the images is large. It is notable that aging will not be a challenge to this paper because people tend to change their smartphones for few years. It is notable however that Singh and Prasad (2018) propose the use of coupled auto-encoder networks and non-linear analysis as a solution to the aging problem in facial recognition.</w:t>
-      </w:r>
-    </w:p>
-    <w:p>
-      <w:pPr>
-        <w:pStyle w:val="Normal"/>
-        <w:spacing w:lineRule="auto" w:line="480"/>
-        <w:rPr/>
-      </w:pPr>
-      <w:r>
-        <w:rPr>
-          <w:b/>
-          <w:bCs/>
-        </w:rPr>
-        <w:t>Facial expressions</w:t>
-      </w:r>
-      <w:r>
-        <w:rPr/>
-        <w:t>: Images of human faces could also be affected by their emotions because people to change their faces based o emotions they are experiencing. Critical to the discussion is the reality that Singh and Prasad (2018) cite an expression invariant 3D face recognition as a solution to the problems of facial expressions in image recognition.</w:t>
-      </w:r>
-    </w:p>
-    <w:p>
-      <w:pPr>
-        <w:pStyle w:val="Normal"/>
-        <w:spacing w:lineRule="auto" w:line="480"/>
-        <w:rPr/>
-      </w:pPr>
-      <w:r>
-        <w:rPr>
-          <w:b/>
-          <w:bCs/>
-        </w:rPr>
-        <w:t xml:space="preserve">Imaging conditions and image orientation: </w:t>
-      </w:r>
-      <w:r>
-        <w:rPr/>
-        <w:t>A huge chunk of solutions in computer vision make the assumption that there is a single illuminant lighting in an image. Regardless, that is not always the case. As evidenced, Finlayson and Fredembach (2007) reveal that images always contain shadows depending on the positions from different lights that affect an image. Important to the debate is the truth that Finlayson (2018) proposes a solution to the problems arising from illumination in computer vision.</w:t>
-      </w:r>
-    </w:p>
-    <w:p>
-      <w:pPr>
-        <w:pStyle w:val="Heading4"/>
-        <w:ind w:left="0" w:hanging="0"/>
-        <w:rPr/>
-      </w:pPr>
-      <w:r>
-        <w:rPr/>
-        <w:t>2.2.2 Face Detection Approaches</w:t>
-      </w:r>
-    </w:p>
-    <w:p>
-      <w:pPr>
-        <w:pStyle w:val="Heading5"/>
-        <w:ind w:left="0" w:hanging="0"/>
-        <w:rPr/>
-      </w:pPr>
-      <w:r>
-        <w:rPr/>
-        <w:t>2.2.2.1 Knowledge Based Methods of Facial Detection</w:t>
-      </w:r>
-    </w:p>
-    <w:p>
-      <w:pPr>
-        <w:pStyle w:val="Normal"/>
-        <w:spacing w:lineRule="auto" w:line="480"/>
-        <w:rPr/>
-      </w:pPr>
-      <w:r>
-        <w:rPr/>
-        <w:tab/>
-        <w:t>This method relies on a set of rules to detect whether there is a human face in an image. The method captures the human knowledge of faces and interprets the knowledge into a set of rules. For instance, the face has two symmetric eyes, the eye areas are darker than the cheeks, the distance between eyes, and the difference in colors between the eyes and cheeks. It is notable that using the knowledge base method for face detection could be difficult because it is difficult to develop a set of rules that can correctly identify a human face. This owes to the fact that there could be very many false positives if the rules are to general. Likewise, there could be many false negatives if the rules are too strict. This drawback has hampered researcher from using this technique. However, Chen et al., (2001) used the knowledge based method to detect faces in an image with an accuracy of 94%. One disadvantage with this method is that it is not efficient.</w:t>
-      </w:r>
-    </w:p>
-    <w:p>
-      <w:pPr>
-        <w:pStyle w:val="Heading5"/>
-        <w:ind w:left="0" w:hanging="0"/>
-        <w:rPr/>
-      </w:pPr>
-      <w:r>
-        <w:rPr/>
-        <w:t>2.2.2.2 The Feature Invariant Approach of Face Detection</w:t>
-      </w:r>
-    </w:p>
-    <w:p>
-      <w:pPr>
-        <w:pStyle w:val="Normal"/>
-        <w:spacing w:lineRule="auto" w:line="480"/>
-        <w:rPr/>
-      </w:pPr>
-      <w:r>
-        <w:rPr/>
-        <w:tab/>
-        <w:t>The feature invariant method of face detection is a little bit different from the knowledge based method because it uses statistical methods on facial landmarks. Celiktutan, Ulukaya, and Sankur (2013) define a face landmark as a prominent feature that can play a discriminative role or can serve as anchor points in face detection. Examples of such landmarks include the eye corners, the nose tip, nostril corners, mouth corners, end points of eyebrow arcs, ear lobes, and the chin. This approach works by detecting facial landmarks, texture and skin color before using a statistical model to identify the presence of a face in an image. Critical to the discussion is the reality that different authors have used the feature invariant approach for face detection. For instance, Kapil and Jain (2013) compared texture based to the structure and shape based feature invariant based methods and concluded that the texture based method is more accurate. However, the authors argue that feature invariant based methods are computationally expensive.</w:t>
-      </w:r>
-    </w:p>
-    <w:p>
-      <w:pPr>
-        <w:pStyle w:val="Heading5"/>
-        <w:ind w:left="0" w:hanging="0"/>
-        <w:rPr/>
-      </w:pPr>
-      <w:r>
-        <w:rPr/>
-        <w:t>2.2.2.3 The Template Based Approach of Face Detection</w:t>
-      </w:r>
-    </w:p>
-    <w:p>
-      <w:pPr>
-        <w:pStyle w:val="Normal"/>
-        <w:spacing w:lineRule="auto" w:line="480"/>
-        <w:rPr/>
-      </w:pPr>
-      <w:r>
-        <w:rPr/>
-        <w:tab/>
-        <w:t xml:space="preserve">This method functions to extract facial image features to gain the Euclidean distance value served as input face comparison value of the users’ faces stored in the database (Hidayat, Wibowo, Satria, Winursito, 2021). Simply put, the template based approach transforms an image into geometric primitives like curves and points. This is done by identifying distinctive features like the eye, the nose, the chin, and the mouth before measuring their relative positions, widths and other parameters of the distinctive features. Features extracted from an image are then compared to known features of a human face to check whether an image is that of a human face. For further elucidation the eye, nose, mouth and the chin are compared to that of a human face. If the features obtained from the image match those of a human face, then the object in question is declared to be a human face. It is vital to note that Hidayat, et al., (2021) assert that the template approach of facial recognition is known to have a lighter computational load than other methods because it does not require features from the entire face. </w:t>
-      </w:r>
-    </w:p>
-    <w:p>
-      <w:pPr>
-        <w:pStyle w:val="Heading5"/>
-        <w:ind w:left="0" w:hanging="0"/>
-        <w:rPr/>
-      </w:pPr>
-      <w:r>
-        <w:rPr/>
-        <w:t>2.2.2.4 The Appearance Based Approach of Facial Detection</w:t>
-      </w:r>
-    </w:p>
-    <w:p>
-      <w:pPr>
-        <w:pStyle w:val="Normal"/>
-        <w:spacing w:lineRule="auto" w:line="480"/>
-        <w:rPr/>
-      </w:pPr>
-      <w:r>
-        <w:rPr/>
-        <w:tab/>
-        <w:t>The idea behind using Appearance methods for face detection relies on the linear algebra concept of subspaces. What is a subspace in linear algebra? A subspace of a vector space V is a subset H of V that has the following three properties:</w:t>
-      </w:r>
     </w:p>
     <w:p>
       <w:pPr>
@@ -2948,7 +2504,7 @@
       </w:pPr>
       <w:r>
         <w:rPr/>
-        <w:t>The zero vector of V is in H.</w:t>
+        <w:t>To use convolution neural networks to build a model that can detect African faces given a list of smartphone images.</w:t>
       </w:r>
     </w:p>
     <w:p>
@@ -2963,7 +2519,7 @@
       </w:pPr>
       <w:r>
         <w:rPr/>
-        <w:t>For each u and v are in H, u + v is in H. (In this case we say H is closed under vector addition.)</w:t>
+        <w:t>To use recurrent neural networks to build a model that can detect African faces given a list of smartphone images.</w:t>
       </w:r>
     </w:p>
     <w:p>
@@ -2978,6 +2534,446 @@
       </w:pPr>
       <w:r>
         <w:rPr/>
+        <w:t xml:space="preserve">To use </w:t>
+      </w:r>
+      <w:r>
+        <w:rPr/>
+        <w:t>artificial</w:t>
+      </w:r>
+      <w:r>
+        <w:rPr/>
+        <w:t xml:space="preserve"> neural networks to build a model that can detect African faces given a list of smartphone images.</w:t>
+      </w:r>
+    </w:p>
+    <w:p>
+      <w:pPr>
+        <w:pStyle w:val="Normal"/>
+        <w:numPr>
+          <w:ilvl w:val="0"/>
+          <w:numId w:val="2"/>
+        </w:numPr>
+        <w:spacing w:lineRule="auto" w:line="480"/>
+        <w:rPr/>
+      </w:pPr>
+      <w:r>
+        <w:rPr/>
+        <w:t xml:space="preserve">To compare the performance of convolution, recurrent, and </w:t>
+      </w:r>
+      <w:r>
+        <w:rPr/>
+        <w:t>artificial</w:t>
+      </w:r>
+      <w:r>
+        <w:rPr/>
+        <w:t xml:space="preserve"> neural networks on African faces from smartphone pictures.</w:t>
+      </w:r>
+    </w:p>
+    <w:p>
+      <w:pPr>
+        <w:pStyle w:val="Heading2"/>
+        <w:ind w:left="0" w:right="0" w:hanging="0"/>
+        <w:rPr/>
+      </w:pPr>
+      <w:bookmarkStart w:id="14" w:name="_Toc123819413"/>
+      <w:r>
+        <w:rPr/>
+        <w:t>1.5 Significance of the Study</w:t>
+      </w:r>
+      <w:bookmarkEnd w:id="14"/>
+    </w:p>
+    <w:p>
+      <w:pPr>
+        <w:pStyle w:val="Normal"/>
+        <w:spacing w:lineRule="auto" w:line="480"/>
+        <w:rPr/>
+      </w:pPr>
+      <w:r>
+        <w:rPr/>
+        <w:tab/>
+        <w:t>Apparently, there is a lot of literature on the subject of facial recognition but that is not enough. This owes to the truth that Marks (2021) cites two cases where people of color were wrongfully arrested because of a racially biased facial recognition system. In a different study, Leslie (2020) argues that racial bias in photographs is a problem that began as early as the 19</w:t>
+      </w:r>
+      <w:r>
+        <w:rPr>
+          <w:vertAlign w:val="superscript"/>
+        </w:rPr>
+        <w:t>th</w:t>
+      </w:r>
+      <w:r>
+        <w:rPr/>
+        <w:t xml:space="preserve"> century. The same author further mentions that the topical facial recognition systems are still racially biased. It is also important to note that most of the current facial recognition systems were created from celebrity images but none of them dared to use images collected from Smartphones. It is notable that the current facial recognition systems were created using one hundred and twenty-eight variables. It follows that this proposal will contribute to the existing knowledge by creating a facial recognition system using forty-two variables, African faces, and images taken using smartphones.</w:t>
+      </w:r>
+    </w:p>
+    <w:p>
+      <w:pPr>
+        <w:pStyle w:val="Normal"/>
+        <w:spacing w:lineRule="auto" w:line="480"/>
+        <w:rPr/>
+      </w:pPr>
+      <w:r>
+        <w:rPr/>
+      </w:r>
+      <w:r>
+        <w:br w:type="page"/>
+      </w:r>
+    </w:p>
+    <w:p>
+      <w:pPr>
+        <w:pStyle w:val="Heading1"/>
+        <w:ind w:left="0" w:right="0" w:hanging="0"/>
+        <w:rPr/>
+      </w:pPr>
+      <w:bookmarkStart w:id="15" w:name="_Toc123819414"/>
+      <w:r>
+        <w:rPr/>
+        <w:t>Chapter Two</w:t>
+      </w:r>
+      <w:bookmarkEnd w:id="15"/>
+    </w:p>
+    <w:p>
+      <w:pPr>
+        <w:pStyle w:val="Heading1"/>
+        <w:ind w:left="0" w:right="0" w:hanging="0"/>
+        <w:rPr/>
+      </w:pPr>
+      <w:bookmarkStart w:id="16" w:name="_Toc123819415"/>
+      <w:r>
+        <w:rPr/>
+        <w:t>Literature Review</w:t>
+      </w:r>
+      <w:bookmarkEnd w:id="16"/>
+    </w:p>
+    <w:p>
+      <w:pPr>
+        <w:pStyle w:val="Heading2"/>
+        <w:ind w:left="0" w:right="0" w:hanging="0"/>
+        <w:rPr/>
+      </w:pPr>
+      <w:bookmarkStart w:id="17" w:name="_Toc123819416"/>
+      <w:r>
+        <w:rPr/>
+        <w:t>2.1 Introduction</w:t>
+      </w:r>
+      <w:bookmarkEnd w:id="17"/>
+    </w:p>
+    <w:p>
+      <w:pPr>
+        <w:pStyle w:val="Normal"/>
+        <w:spacing w:lineRule="auto" w:line="480"/>
+        <w:rPr/>
+      </w:pPr>
+      <w:r>
+        <w:rPr/>
+        <w:tab/>
+        <w:t>This section surveys previous works done on facial recognition with a bias towards the objectives of this work. It begins with examining different types of methodologies that have been used for facial recognition before delving into how different types of neural networks have been used for facial recognition. Specifically, this proposal discusses how convolution neural networks, recurrent neural networks, and long short term memory neural networks have been used for facial recognition. Finally, the proposal examines machine learning workflows from previous publications and how those workflows can be applied to facial recognition.</w:t>
+      </w:r>
+    </w:p>
+    <w:p>
+      <w:pPr>
+        <w:pStyle w:val="Heading2"/>
+        <w:ind w:left="0" w:right="0" w:hanging="0"/>
+        <w:rPr/>
+      </w:pPr>
+      <w:bookmarkStart w:id="18" w:name="_Toc123819417"/>
+      <w:r>
+        <w:rPr/>
+        <w:t>2.2 Facial Recognition</w:t>
+      </w:r>
+      <w:bookmarkEnd w:id="18"/>
+    </w:p>
+    <w:p>
+      <w:pPr>
+        <w:pStyle w:val="Normal"/>
+        <w:spacing w:lineRule="auto" w:line="480"/>
+        <w:rPr/>
+      </w:pPr>
+      <w:r>
+        <w:rPr/>
+        <w:tab/>
+        <w:t>Facial recognition is a biometric technique used to identify faces and match those faces to a database of faces with an aim of identifying a human being from an image. From the definition, it is clear that face recognition is a two-step process with the first step being face detection and the second step being face identification. The first step of facial recognition (or the face detection step) is identifying and extracting human faces from an image. In this step, all objects in an image are extracted and checked to confirm if a picture contains a human face. If any human face is present in the image, the face is extracted from the image before step two begins. In the second step or the image identification step, an image is compared to faces stored in a database to identify if the face matches the face of a known person. In short, there is a difference between facial detection and facial recognition and that facial recognition begins with facial detection and finalizes with facial identification.</w:t>
+      </w:r>
+    </w:p>
+    <w:p>
+      <w:pPr>
+        <w:pStyle w:val="Heading3"/>
+        <w:ind w:left="0" w:right="0" w:hanging="0"/>
+        <w:rPr/>
+      </w:pPr>
+      <w:bookmarkStart w:id="19" w:name="_Toc123819418"/>
+      <w:r>
+        <w:rPr/>
+        <w:t>2.2.1 Face Detection</w:t>
+      </w:r>
+      <w:bookmarkEnd w:id="19"/>
+    </w:p>
+    <w:p>
+      <w:pPr>
+        <w:pStyle w:val="Normal"/>
+        <w:spacing w:lineRule="auto" w:line="480"/>
+        <w:rPr/>
+      </w:pPr>
+      <w:r>
+        <w:rPr/>
+        <w:tab/>
+        <w:t>Given an arbitrary image, the objective of facial detection is to establish whether or not there are any faces in the image and if present, return the image location and extent of each face (Yang, Kriegman and Ahuja, 2002). It is important to highlight that there are several methods that could be used for detecting faces from images. These methods include knowledge based methods, feature invariant approaches, template matching methods, and appearance based methods. Indeed, the mentioned methods are important when detecting faces from images, but all these methods are accompanied by several challenges. This owes to the reality that Yang, Kriegman and Ahuja (2002) list the following five challenges that are associated with facial detection: - pose, occlusion, aging face expression, imaging conditions and image orientation. Moreover, face expression is not only a challenge in face detection but also in face recognition. It follows that researchers on facial recognition should identify methods of tackling the mentioned challenges associated with face detection.</w:t>
+      </w:r>
+    </w:p>
+    <w:p>
+      <w:pPr>
+        <w:pStyle w:val="Heading4"/>
+        <w:ind w:left="0" w:right="0" w:hanging="0"/>
+        <w:rPr/>
+      </w:pPr>
+      <w:r>
+        <w:rPr/>
+        <w:t>2.2.1.1 Challenges in Face Detection</w:t>
+      </w:r>
+    </w:p>
+    <w:p>
+      <w:pPr>
+        <w:pStyle w:val="Normal"/>
+        <w:spacing w:lineRule="auto" w:line="480"/>
+        <w:rPr/>
+      </w:pPr>
+      <w:r>
+        <w:rPr>
+          <w:b/>
+          <w:bCs/>
+        </w:rPr>
+        <w:t xml:space="preserve">Pose: </w:t>
+      </w:r>
+      <w:r>
+        <w:rPr/>
+        <w:t>A review of images databases will indicate that people like taking images in different posters. It follows that an image is likely to have a face that is twisted to the right, left, or even upside down. Moreover, some features such as the nose, eye, or ears maybe wholly or partially occluded which is an additional challenge in facial recognition.</w:t>
+      </w:r>
+      <w:r>
+        <w:rPr>
+          <w:b/>
+          <w:bCs/>
+        </w:rPr>
+        <w:t xml:space="preserve"> </w:t>
+      </w:r>
+      <w:r>
+        <w:rPr/>
+        <w:t>This problem is always solved by rotating images back to an upright position.</w:t>
+      </w:r>
+    </w:p>
+    <w:p>
+      <w:pPr>
+        <w:pStyle w:val="Normal"/>
+        <w:spacing w:lineRule="auto" w:line="480"/>
+        <w:rPr/>
+      </w:pPr>
+      <w:r>
+        <w:rPr>
+          <w:b/>
+          <w:bCs/>
+        </w:rPr>
+        <w:t xml:space="preserve">Occlusion: </w:t>
+      </w:r>
+      <w:r>
+        <w:rPr/>
+        <w:t xml:space="preserve">Human beings often have features that could affect image detection. For instance, men are known to have beards, which may or may not exist in images. It also important to highlight that people at times wear spectacles, which also affects face detection. Moreover, COVID 19 forced people to wear masks, which presents a unique challenge in facial recognition. </w:t>
+      </w:r>
+    </w:p>
+    <w:p>
+      <w:pPr>
+        <w:pStyle w:val="Normal"/>
+        <w:spacing w:lineRule="auto" w:line="480"/>
+        <w:rPr/>
+      </w:pPr>
+      <w:r>
+        <w:rPr>
+          <w:b/>
+          <w:bCs/>
+        </w:rPr>
+        <w:t>Aging</w:t>
+      </w:r>
+      <w:r>
+        <w:rPr/>
+        <w:t>: Human faces are known to change with age progression which presents a challenge in facial recognition. This implies that there would be significant difference in images if the time difference between the images is large. It is notable that aging will not be a challenge to this paper because people tend to change their smartphones for few years. It is notable however that Singh and Prasad (2018) propose the use of coupled auto-encoder networks and non-linear analysis as a solution to the aging problem in facial recognition.</w:t>
+      </w:r>
+    </w:p>
+    <w:p>
+      <w:pPr>
+        <w:pStyle w:val="Normal"/>
+        <w:spacing w:lineRule="auto" w:line="480"/>
+        <w:rPr/>
+      </w:pPr>
+      <w:r>
+        <w:rPr>
+          <w:b/>
+          <w:bCs/>
+        </w:rPr>
+        <w:t>Facial expressions</w:t>
+      </w:r>
+      <w:r>
+        <w:rPr/>
+        <w:t>: Images of human faces could also be affected by their emotions because people to change their faces based o emotions they are experiencing. Critical to the discussion is the reality that Singh and Prasad (2018) cite an expression invariant 3D face recognition as a solution to the problems of facial expressions in image recognition.</w:t>
+      </w:r>
+    </w:p>
+    <w:p>
+      <w:pPr>
+        <w:pStyle w:val="Normal"/>
+        <w:spacing w:lineRule="auto" w:line="480"/>
+        <w:rPr/>
+      </w:pPr>
+      <w:r>
+        <w:rPr>
+          <w:b/>
+          <w:bCs/>
+        </w:rPr>
+        <w:t xml:space="preserve">Imaging conditions and image orientation: </w:t>
+      </w:r>
+      <w:r>
+        <w:rPr/>
+        <w:t>A huge chunk of solutions in computer vision make the assumption that there is a single illuminant lighting in an image. Regardless, that is not always the case. As evidenced, Finlayson and Fredembach (2007) reveal that images always contain shadows depending on the positions from different lights that affect an image. Important to the debate is the truth that Finlayson (2018) proposes a solution to the problems arising from illumination in computer vision.</w:t>
+      </w:r>
+    </w:p>
+    <w:p>
+      <w:pPr>
+        <w:pStyle w:val="Heading4"/>
+        <w:ind w:left="0" w:right="0" w:hanging="0"/>
+        <w:rPr/>
+      </w:pPr>
+      <w:r>
+        <w:rPr/>
+        <w:t>2.2.2 Face Detection Approaches</w:t>
+      </w:r>
+    </w:p>
+    <w:p>
+      <w:pPr>
+        <w:pStyle w:val="Heading5"/>
+        <w:ind w:left="0" w:right="0" w:hanging="0"/>
+        <w:rPr/>
+      </w:pPr>
+      <w:r>
+        <w:rPr/>
+        <w:t>2.2.2.1 Knowledge Based Methods of Facial Detection</w:t>
+      </w:r>
+    </w:p>
+    <w:p>
+      <w:pPr>
+        <w:pStyle w:val="Normal"/>
+        <w:spacing w:lineRule="auto" w:line="480"/>
+        <w:rPr/>
+      </w:pPr>
+      <w:r>
+        <w:rPr/>
+        <w:tab/>
+        <w:t>This method relies on a set of rules to detect whether there is a human face in an image. The method captures the human knowledge of faces and interprets the knowledge into a set of rules. For instance, the face has two symmetric eyes, the eye areas are darker than the cheeks, the distance between eyes, and the difference in colors between the eyes and cheeks. It is notable that using the knowledge base method for face detection could be difficult because it is difficult to develop a set of rules that can correctly identify a human face. This owes to the fact that there could be very many false positives if the rules are to general. Likewise, there could be many false negatives if the rules are too strict. This drawback has hampered researcher from using this technique. However, Chen et al., (2001) used the knowledge based method to detect faces in an image with an accuracy of 94%. One disadvantage with this method is that it is not efficient.</w:t>
+      </w:r>
+    </w:p>
+    <w:p>
+      <w:pPr>
+        <w:pStyle w:val="Heading5"/>
+        <w:ind w:left="0" w:right="0" w:hanging="0"/>
+        <w:rPr/>
+      </w:pPr>
+      <w:r>
+        <w:rPr/>
+        <w:t>2.2.2.2 The Feature Invariant Approach of Face Detection</w:t>
+      </w:r>
+    </w:p>
+    <w:p>
+      <w:pPr>
+        <w:pStyle w:val="Normal"/>
+        <w:spacing w:lineRule="auto" w:line="480"/>
+        <w:rPr/>
+      </w:pPr>
+      <w:r>
+        <w:rPr/>
+        <w:tab/>
+        <w:t>The feature invariant method of face detection is a little bit different from the knowledge based method because it uses statistical methods on facial landmarks. Celiktutan, Ulukaya, and Sankur (2013) define a face landmark as a prominent feature that can play a discriminative role or can serve as anchor points in face detection. Examples of such landmarks include the eye corners, the nose tip, nostril corners, mouth corners, end points of eyebrow arcs, ear lobes, and the chin. This approach works by detecting facial landmarks, texture and skin color before using a statistical model to identify the presence of a face in an image. Critical to the discussion is the reality that different authors have used the feature invariant approach for face detection. For instance, Kapil and Jain (2013) compared texture based to the structure and shape based feature invariant based methods and concluded that the texture based method is more accurate. However, the authors argue that feature invariant based methods are computationally expensive.</w:t>
+      </w:r>
+    </w:p>
+    <w:p>
+      <w:pPr>
+        <w:pStyle w:val="Heading5"/>
+        <w:ind w:left="0" w:right="0" w:hanging="0"/>
+        <w:rPr/>
+      </w:pPr>
+      <w:r>
+        <w:rPr/>
+        <w:t>2.2.2.3 The Template Based Approach of Face Detection</w:t>
+      </w:r>
+    </w:p>
+    <w:p>
+      <w:pPr>
+        <w:pStyle w:val="Normal"/>
+        <w:spacing w:lineRule="auto" w:line="480"/>
+        <w:rPr/>
+      </w:pPr>
+      <w:r>
+        <w:rPr/>
+        <w:tab/>
+        <w:t xml:space="preserve">This method functions to extract facial image features to gain the Euclidean distance value served as input face comparison value of the users’ faces stored in the database (Hidayat, Wibowo, Satria, Winursito, 2021). Simply put, the template based approach transforms an image into geometric primitives like curves and points. This is done by identifying distinctive features like the eye, the nose, the chin, and the mouth before measuring their relative positions, widths and other parameters of the distinctive features. Features extracted from an image are then compared to known features of a human face to check whether an image is that of a human face. For further elucidation the eye, nose, mouth and the chin are compared to that of a human face. If the features obtained from the image match those of a human face, then the object in question is declared to be a human face. It is vital to note that Hidayat, et al., (2021) assert that the template approach of facial recognition is known to have a lighter computational load than other methods because it does not require features from the entire face. </w:t>
+      </w:r>
+    </w:p>
+    <w:p>
+      <w:pPr>
+        <w:pStyle w:val="Heading5"/>
+        <w:ind w:left="0" w:right="0" w:hanging="0"/>
+        <w:rPr/>
+      </w:pPr>
+      <w:r>
+        <w:rPr/>
+        <w:t>2.2.2.4 The Appearance Based Approach of Facial Detection</w:t>
+      </w:r>
+    </w:p>
+    <w:p>
+      <w:pPr>
+        <w:pStyle w:val="Normal"/>
+        <w:spacing w:lineRule="auto" w:line="480"/>
+        <w:rPr/>
+      </w:pPr>
+      <w:r>
+        <w:rPr/>
+        <w:tab/>
+        <w:t>The idea behind using Appearance methods for face detection relies on the linear algebra concept of subspaces. What is a subspace in linear algebra? A subspace of a vector space V is a subset H of V that has the following three properties:</w:t>
+      </w:r>
+    </w:p>
+    <w:p>
+      <w:pPr>
+        <w:pStyle w:val="Normal"/>
+        <w:numPr>
+          <w:ilvl w:val="0"/>
+          <w:numId w:val="3"/>
+        </w:numPr>
+        <w:spacing w:lineRule="auto" w:line="480"/>
+        <w:rPr/>
+      </w:pPr>
+      <w:r>
+        <w:rPr/>
+        <w:t>The zero vector of V is in H.</w:t>
+      </w:r>
+    </w:p>
+    <w:p>
+      <w:pPr>
+        <w:pStyle w:val="Normal"/>
+        <w:numPr>
+          <w:ilvl w:val="0"/>
+          <w:numId w:val="3"/>
+        </w:numPr>
+        <w:spacing w:lineRule="auto" w:line="480"/>
+        <w:rPr/>
+      </w:pPr>
+      <w:r>
+        <w:rPr/>
+        <w:t>For each u and v are in H, u + v is in H. (In this case we say H is closed under vector addition.)</w:t>
+      </w:r>
+    </w:p>
+    <w:p>
+      <w:pPr>
+        <w:pStyle w:val="Normal"/>
+        <w:numPr>
+          <w:ilvl w:val="0"/>
+          <w:numId w:val="3"/>
+        </w:numPr>
+        <w:spacing w:lineRule="auto" w:line="480"/>
+        <w:rPr/>
+      </w:pPr>
+      <w:r>
+        <w:rPr/>
         <w:t>For each u in H and each scalar c, cu is in H. (In this case we say H is closed under scalar multiplication.)</w:t>
       </w:r>
     </w:p>
@@ -2995,7 +2991,7 @@
     <w:p>
       <w:pPr>
         <w:pStyle w:val="Heading3"/>
-        <w:ind w:left="0" w:hanging="0"/>
+        <w:ind w:left="0" w:right="0" w:hanging="0"/>
         <w:rPr/>
       </w:pPr>
       <w:bookmarkStart w:id="20" w:name="_Toc123819419"/>
@@ -3020,7 +3016,7 @@
     <w:p>
       <w:pPr>
         <w:pStyle w:val="Heading5"/>
-        <w:ind w:left="0" w:hanging="0"/>
+        <w:ind w:left="0" w:right="0" w:hanging="0"/>
         <w:rPr/>
       </w:pPr>
       <w:r>
@@ -3066,7 +3062,7 @@
     <w:p>
       <w:pPr>
         <w:pStyle w:val="Heading5"/>
-        <w:ind w:left="0" w:hanging="0"/>
+        <w:ind w:left="0" w:right="0" w:hanging="0"/>
         <w:rPr/>
       </w:pPr>
       <w:r>
@@ -3101,7 +3097,7 @@
     <w:p>
       <w:pPr>
         <w:pStyle w:val="Heading5"/>
-        <w:ind w:left="0" w:hanging="0"/>
+        <w:ind w:left="0" w:right="0" w:hanging="0"/>
         <w:rPr/>
       </w:pPr>
       <w:r>
@@ -3136,7 +3132,7 @@
     <w:p>
       <w:pPr>
         <w:pStyle w:val="Heading2"/>
-        <w:ind w:left="0" w:hanging="0"/>
+        <w:ind w:left="0" w:right="0" w:hanging="0"/>
         <w:rPr/>
       </w:pPr>
       <w:bookmarkStart w:id="21" w:name="_Toc123819420"/>
@@ -3492,7 +3488,15 @@
       <w:r>
         <w:rPr/>
         <w:tab/>
-        <w:t>While the above equation may work in a variety of settings, there are instances where we need to introduce a bias to a neural network for it to work accordingly. The mentioned bias could be compared to penalizing regression model. Basically, we introduce a bias neuron that shifts the line of fit to the right or left depending on the original position of the lien of fit. Another way to think about biases is simply by considering any linear function, y = mx + b. Let's say you are using y to approximate some linear function z. If z has a non-zero z-intercept, and you have no bias in the equation for y (i.e. y = mx), then y can never perfectly fit z. Similarly, if the neurons in your network have no bias terms, then it can be harder for your network to approximate some functions. The figure below show an example of a neural network architecture with a single bias neuron.</w:t>
+        <w:t>While the above equation may work in a variety of settings, there are instances where we need to introduce a bias to a neural network for it to work accordingly. The mentioned bias could be compared to penalizing regression model. Basically, we introduce a bias neuron that shifts the line of fit to the right or left depending on the original position of the li</w:t>
+      </w:r>
+      <w:r>
+        <w:rPr/>
+        <w:t>ne</w:t>
+      </w:r>
+      <w:r>
+        <w:rPr/>
+        <w:t xml:space="preserve"> of fit. Another way to think about biases is simply by considering any linear function, y = mx + b. Let's say you are using y to approximate some linear function z. If z has a non-zero z-intercept, and you have no bias in the equation for y (i.e. y = mx), then y can never perfectly fit z. Similarly, if the neurons in your network have no bias terms, then it can be harder for your network to approximate some functions. The figure below show an example of a neural network architecture with a single bias neuron.</w:t>
       </w:r>
     </w:p>
     <w:p>
@@ -3639,11 +3643,7 @@
       </w:pPr>
       <w:r>
         <w:rPr/>
-        <w:t xml:space="preserve">Thus, the perceptron of a single layer neural network is shown in the formula below. </w:t>
-      </w:r>
-      <w:r>
-        <w:rPr/>
-        <w:t xml:space="preserve">The output is represented by </w:t>
+        <w:t xml:space="preserve">Thus, the perceptron of a single layer neural network is shown in the formula below. The output is represented by </w:t>
       </w:r>
       <w:r>
         <w:rPr/>
@@ -3732,17 +3732,7 @@
       <w:pPr>
         <w:pStyle w:val="Normal"/>
         <w:overflowPunct w:val="false"/>
-        <w:rPr/>
-      </w:pPr>
-      <w:r>
-        <w:rPr/>
-      </w:r>
-    </w:p>
-    <w:p>
-      <w:pPr>
-        <w:pStyle w:val="Normal"/>
-        <w:overflowPunct w:val="false"/>
-        <w:jc w:val="left"/>
+        <w:jc w:val="center"/>
         <w:rPr/>
       </w:pPr>
       <w:r>
@@ -3750,7 +3740,7 @@
       </w:r>
       <m:oMathPara xmlns:m="http://schemas.openxmlformats.org/officeDocument/2006/math">
         <m:oMathParaPr>
-          <m:jc m:val="left"/>
+          <m:jc m:val="center"/>
         </m:oMathParaPr>
         <m:oMath>
           <m:acc>
@@ -3825,25 +3815,13 @@
               </m:sSub>
             </m:e>
           </m:nary>
-          <m:r>
-            <w:rPr>
-              <w:rFonts w:ascii="Cambria Math" w:hAnsi="Cambria Math"/>
-            </w:rPr>
-            <m:t xml:space="preserve">X</m:t>
-          </m:r>
-          <m:r>
-            <w:rPr>
-              <w:rFonts w:ascii="Cambria Math" w:hAnsi="Cambria Math"/>
-            </w:rPr>
-            <m:t xml:space="preserve">+</m:t>
-          </m:r>
           <m:sSub>
             <m:e>
               <m:r>
                 <w:rPr>
                   <w:rFonts w:ascii="Cambria Math" w:hAnsi="Cambria Math"/>
                 </w:rPr>
-                <m:t xml:space="preserve">b</m:t>
+                <m:t xml:space="preserve">X</m:t>
               </m:r>
             </m:e>
             <m:sub>
@@ -3855,6 +3833,18 @@
               </m:r>
             </m:sub>
           </m:sSub>
+          <m:r>
+            <w:rPr>
+              <w:rFonts w:ascii="Cambria Math" w:hAnsi="Cambria Math"/>
+            </w:rPr>
+            <m:t xml:space="preserve">+</m:t>
+          </m:r>
+          <m:r>
+            <w:rPr>
+              <w:rFonts w:ascii="Cambria Math" w:hAnsi="Cambria Math"/>
+            </w:rPr>
+            <m:t xml:space="preserve">b</m:t>
+          </m:r>
         </m:oMath>
       </m:oMathPara>
     </w:p>
@@ -3862,6 +3852,335 @@
       <w:pPr>
         <w:pStyle w:val="Normal"/>
         <w:overflowPunct w:val="false"/>
+        <w:jc w:val="left"/>
+        <w:rPr/>
+      </w:pPr>
+      <w:r>
+        <w:rPr/>
+      </w:r>
+    </w:p>
+    <w:p>
+      <w:pPr>
+        <w:pStyle w:val="Normal"/>
+        <w:overflowPunct w:val="false"/>
+        <w:spacing w:lineRule="auto" w:line="480"/>
+        <w:jc w:val="left"/>
+        <w:rPr/>
+      </w:pPr>
+      <w:r>
+        <w:rPr/>
+        <w:t xml:space="preserve">It is important to highlight that the role of neural networks, like in linear regression, is to minimize the number of errors in the model. It follows that </w:t>
+      </w:r>
+      <w:r>
+        <w:rPr/>
+        <w:t xml:space="preserve">the accuracy of artificial neural networks can be achieved by minimizing the objective function (also called the loss function) </w:t>
+      </w:r>
+      <w:r>
+        <w:rPr/>
+        <w:t>shown in</w:t>
+      </w:r>
+      <w:r>
+        <w:rPr/>
+        <w:t xml:space="preserve"> the equation</w:t>
+      </w:r>
+      <w:r>
+        <w:rPr/>
+        <w:t>s</w:t>
+      </w:r>
+      <w:r>
+        <w:rPr/>
+        <w:t xml:space="preserve"> shown below. </w:t>
+      </w:r>
+      <w:r>
+        <w:rPr/>
+        <w:t xml:space="preserve">It is worthy noting that </w:t>
+      </w:r>
+    </w:p>
+    <w:p>
+      <w:pPr>
+        <w:pStyle w:val="Normal"/>
+        <w:overflowPunct w:val="false"/>
+        <w:spacing w:lineRule="auto" w:line="480"/>
+        <w:jc w:val="center"/>
+        <w:rPr>
+          <w:rFonts w:ascii="Liberation Mono" w:hAnsi="Liberation Mono"/>
+          <w:b w:val="false"/>
+          <w:b w:val="false"/>
+          <w:i w:val="false"/>
+          <w:i w:val="false"/>
+          <w:sz w:val="22"/>
+        </w:rPr>
+      </w:pPr>
+      <w:r>
+        <w:rPr>
+          <w:rFonts w:ascii="Liberation Mono" w:hAnsi="Liberation Mono"/>
+          <w:b w:val="false"/>
+          <w:i w:val="false"/>
+          <w:sz w:val="22"/>
+        </w:rPr>
+      </w:r>
+      <m:oMathPara xmlns:m="http://schemas.openxmlformats.org/officeDocument/2006/math">
+        <m:oMathParaPr>
+          <m:jc m:val="center"/>
+        </m:oMathParaPr>
+        <m:oMath>
+          <m:nary>
+            <m:naryPr>
+              <m:chr m:val="∑"/>
+            </m:naryPr>
+            <m:sub>
+              <m:r>
+                <w:rPr>
+                  <w:rFonts w:ascii="Cambria Math" w:hAnsi="Cambria Math"/>
+                </w:rPr>
+                <m:t xml:space="preserve">i</m:t>
+              </m:r>
+              <m:r>
+                <w:rPr>
+                  <w:rFonts w:ascii="Cambria Math" w:hAnsi="Cambria Math"/>
+                </w:rPr>
+                <m:t xml:space="preserve">=</m:t>
+              </m:r>
+              <m:r>
+                <w:rPr>
+                  <w:rFonts w:ascii="Cambria Math" w:hAnsi="Cambria Math"/>
+                </w:rPr>
+                <m:t xml:space="preserve">1</m:t>
+              </m:r>
+            </m:sub>
+            <m:sup>
+              <m:r>
+                <w:rPr>
+                  <w:rFonts w:ascii="Cambria Math" w:hAnsi="Cambria Math"/>
+                </w:rPr>
+                <m:t xml:space="preserve">n</m:t>
+              </m:r>
+            </m:sup>
+            <m:e>
+              <m:sSup>
+                <m:e>
+                  <m:d>
+                    <m:dPr>
+                      <m:begChr m:val="("/>
+                      <m:endChr m:val=")"/>
+                    </m:dPr>
+                    <m:e>
+                      <m:r>
+                        <w:rPr>
+                          <w:rFonts w:ascii="Cambria Math" w:hAnsi="Cambria Math"/>
+                        </w:rPr>
+                        <m:t xml:space="preserve">y</m:t>
+                      </m:r>
+                      <m:r>
+                        <w:rPr>
+                          <w:rFonts w:ascii="Cambria Math" w:hAnsi="Cambria Math"/>
+                        </w:rPr>
+                        <m:t xml:space="preserve">−</m:t>
+                      </m:r>
+                      <m:acc>
+                        <m:accPr>
+                          <m:chr m:val="^"/>
+                        </m:accPr>
+                        <m:e>
+                          <m:r>
+                            <w:rPr>
+                              <w:rFonts w:ascii="Cambria Math" w:hAnsi="Cambria Math"/>
+                            </w:rPr>
+                            <m:t xml:space="preserve">y</m:t>
+                          </m:r>
+                        </m:e>
+                      </m:acc>
+                    </m:e>
+                  </m:d>
+                </m:e>
+                <m:sup>
+                  <m:r>
+                    <w:rPr>
+                      <w:rFonts w:ascii="Cambria Math" w:hAnsi="Cambria Math"/>
+                    </w:rPr>
+                    <m:t xml:space="preserve">2</m:t>
+                  </m:r>
+                </m:sup>
+              </m:sSup>
+            </m:e>
+          </m:nary>
+          <m:r>
+            <w:rPr>
+              <w:rFonts w:ascii="Cambria Math" w:hAnsi="Cambria Math"/>
+            </w:rPr>
+            <m:t xml:space="preserve">=</m:t>
+          </m:r>
+          <m:nary>
+            <m:naryPr>
+              <m:chr m:val="∑"/>
+            </m:naryPr>
+            <m:sub>
+              <m:r>
+                <w:rPr>
+                  <w:rFonts w:ascii="Cambria Math" w:hAnsi="Cambria Math"/>
+                </w:rPr>
+                <m:t xml:space="preserve">i</m:t>
+              </m:r>
+              <m:r>
+                <w:rPr>
+                  <w:rFonts w:ascii="Cambria Math" w:hAnsi="Cambria Math"/>
+                </w:rPr>
+                <m:t xml:space="preserve">=</m:t>
+              </m:r>
+              <m:r>
+                <w:rPr>
+                  <w:rFonts w:ascii="Cambria Math" w:hAnsi="Cambria Math"/>
+                </w:rPr>
+                <m:t xml:space="preserve">1</m:t>
+              </m:r>
+            </m:sub>
+            <m:sup>
+              <m:r>
+                <w:rPr>
+                  <w:rFonts w:ascii="Cambria Math" w:hAnsi="Cambria Math"/>
+                </w:rPr>
+                <m:t xml:space="preserve">n</m:t>
+              </m:r>
+            </m:sup>
+            <m:e>
+              <m:sSup>
+                <m:e>
+                  <m:d>
+                    <m:dPr>
+                      <m:begChr m:val="("/>
+                      <m:endChr m:val=")"/>
+                    </m:dPr>
+                    <m:e>
+                      <m:r>
+                        <w:rPr>
+                          <w:rFonts w:ascii="Cambria Math" w:hAnsi="Cambria Math"/>
+                        </w:rPr>
+                        <m:t xml:space="preserve">y</m:t>
+                      </m:r>
+                      <m:r>
+                        <w:rPr>
+                          <w:rFonts w:ascii="Cambria Math" w:hAnsi="Cambria Math"/>
+                        </w:rPr>
+                        <m:t xml:space="preserve">−</m:t>
+                      </m:r>
+                      <m:sSub>
+                        <m:e>
+                          <m:r>
+                            <w:rPr>
+                              <w:rFonts w:ascii="Cambria Math" w:hAnsi="Cambria Math"/>
+                            </w:rPr>
+                            <m:t xml:space="preserve">W</m:t>
+                          </m:r>
+                        </m:e>
+                        <m:sub>
+                          <m:r>
+                            <w:rPr>
+                              <w:rFonts w:ascii="Cambria Math" w:hAnsi="Cambria Math"/>
+                            </w:rPr>
+                            <m:t xml:space="preserve">i</m:t>
+                          </m:r>
+                        </m:sub>
+                      </m:sSub>
+                      <m:sSub>
+                        <m:e>
+                          <m:r>
+                            <w:rPr>
+                              <w:rFonts w:ascii="Cambria Math" w:hAnsi="Cambria Math"/>
+                            </w:rPr>
+                            <m:t xml:space="preserve">X</m:t>
+                          </m:r>
+                        </m:e>
+                        <m:sub>
+                          <m:r>
+                            <w:rPr>
+                              <w:rFonts w:ascii="Cambria Math" w:hAnsi="Cambria Math"/>
+                            </w:rPr>
+                            <m:t xml:space="preserve">i</m:t>
+                          </m:r>
+                        </m:sub>
+                      </m:sSub>
+                    </m:e>
+                  </m:d>
+                </m:e>
+                <m:sup>
+                  <m:r>
+                    <w:rPr>
+                      <w:rFonts w:ascii="Cambria Math" w:hAnsi="Cambria Math"/>
+                    </w:rPr>
+                    <m:t xml:space="preserve">2</m:t>
+                  </m:r>
+                </m:sup>
+              </m:sSup>
+            </m:e>
+          </m:nary>
+        </m:oMath>
+      </m:oMathPara>
+    </w:p>
+    <w:p>
+      <w:pPr>
+        <w:pStyle w:val="Normal"/>
+        <w:overflowPunct w:val="false"/>
+        <w:spacing w:lineRule="auto" w:line="480"/>
+        <w:jc w:val="left"/>
+        <w:rPr/>
+      </w:pPr>
+      <w:r>
+        <w:rPr/>
+      </w:r>
+    </w:p>
+    <w:p>
+      <w:pPr>
+        <w:pStyle w:val="Normal"/>
+        <w:overflowPunct w:val="false"/>
+        <w:spacing w:lineRule="auto" w:line="480"/>
+        <w:jc w:val="left"/>
+        <w:rPr/>
+      </w:pPr>
+      <w:r>
+        <w:rPr/>
+      </w:r>
+    </w:p>
+    <w:p>
+      <w:pPr>
+        <w:pStyle w:val="Normal"/>
+        <w:overflowPunct w:val="false"/>
+        <w:spacing w:lineRule="auto" w:line="480"/>
+        <w:jc w:val="left"/>
+        <w:rPr/>
+      </w:pPr>
+      <w:r>
+        <w:rPr/>
+      </w:r>
+    </w:p>
+    <w:p>
+      <w:pPr>
+        <w:pStyle w:val="Normal"/>
+        <w:overflowPunct w:val="false"/>
+        <w:spacing w:lineRule="auto" w:line="480"/>
+        <w:jc w:val="left"/>
+        <w:rPr/>
+      </w:pPr>
+      <w:r>
+        <w:rPr/>
+      </w:r>
+    </w:p>
+    <w:p>
+      <w:pPr>
+        <w:pStyle w:val="Normal"/>
+        <w:overflowPunct w:val="false"/>
+        <w:spacing w:lineRule="auto" w:line="480"/>
+        <w:jc w:val="left"/>
+        <w:rPr/>
+      </w:pPr>
+      <w:r>
+        <w:rPr/>
+      </w:r>
+    </w:p>
+    <w:p>
+      <w:pPr>
+        <w:pStyle w:val="Normal"/>
+        <w:overflowPunct w:val="false"/>
+        <w:spacing w:lineRule="auto" w:line="480"/>
         <w:jc w:val="left"/>
         <w:rPr/>
       </w:pPr>
@@ -5497,7 +5816,9 @@
       </w:r>
       <w:hyperlink r:id="rId5">
         <w:r>
-          <w:rPr/>
+          <w:rPr>
+            <w:rStyle w:val="NoCharacterStyle"/>
+          </w:rPr>
           <w:tab/>
           <w:t>https://doi.org/10.3390/sym8110130</w:t>
         </w:r>
@@ -5605,7 +5926,7 @@
     </w:r>
     <w:r>
       <w:rPr/>
-      <w:t>23</w:t>
+      <w:t>24</w:t>
     </w:r>
     <w:r>
       <w:rPr/>
@@ -5629,120 +5950,120 @@
   <w:abstractNum w:abstractNumId="1">
     <w:lvl w:ilvl="0">
       <w:start w:val="1"/>
-      <w:numFmt w:val="decimal"/>
-      <w:lvlText w:val="%1."/>
+      <w:numFmt w:val="none"/>
+      <w:suff w:val="nothing"/>
+      <w:lvlText w:val="%1"/>
       <w:lvlJc w:val="left"/>
       <w:pPr>
         <w:tabs>
-          <w:tab w:val="num" w:pos="720"/>
+          <w:tab w:val="num" w:pos="0"/>
         </w:tabs>
-        <w:ind w:left="720" w:hanging="360"/>
-      </w:pPr>
-      <w:rPr/>
+        <w:ind w:left="0" w:hanging="0"/>
+      </w:pPr>
     </w:lvl>
     <w:lvl w:ilvl="1">
       <w:start w:val="1"/>
-      <w:numFmt w:val="decimal"/>
-      <w:lvlText w:val="%2."/>
+      <w:numFmt w:val="none"/>
+      <w:suff w:val="nothing"/>
+      <w:lvlText w:val="%2"/>
       <w:lvlJc w:val="left"/>
       <w:pPr>
         <w:tabs>
-          <w:tab w:val="num" w:pos="1080"/>
+          <w:tab w:val="num" w:pos="0"/>
         </w:tabs>
-        <w:ind w:left="1080" w:hanging="360"/>
-      </w:pPr>
-      <w:rPr/>
+        <w:ind w:left="0" w:hanging="0"/>
+      </w:pPr>
     </w:lvl>
     <w:lvl w:ilvl="2">
       <w:start w:val="1"/>
-      <w:numFmt w:val="decimal"/>
-      <w:lvlText w:val="%3."/>
+      <w:numFmt w:val="none"/>
+      <w:suff w:val="nothing"/>
+      <w:lvlText w:val="%3"/>
       <w:lvlJc w:val="left"/>
       <w:pPr>
         <w:tabs>
-          <w:tab w:val="num" w:pos="1440"/>
+          <w:tab w:val="num" w:pos="0"/>
         </w:tabs>
-        <w:ind w:left="1440" w:hanging="360"/>
-      </w:pPr>
-      <w:rPr/>
+        <w:ind w:left="0" w:hanging="0"/>
+      </w:pPr>
     </w:lvl>
     <w:lvl w:ilvl="3">
       <w:start w:val="1"/>
-      <w:numFmt w:val="decimal"/>
-      <w:lvlText w:val="%4."/>
+      <w:numFmt w:val="none"/>
+      <w:suff w:val="nothing"/>
+      <w:lvlText w:val="%4"/>
       <w:lvlJc w:val="left"/>
       <w:pPr>
         <w:tabs>
-          <w:tab w:val="num" w:pos="1800"/>
+          <w:tab w:val="num" w:pos="0"/>
         </w:tabs>
-        <w:ind w:left="1800" w:hanging="360"/>
-      </w:pPr>
-      <w:rPr/>
+        <w:ind w:left="0" w:hanging="0"/>
+      </w:pPr>
     </w:lvl>
     <w:lvl w:ilvl="4">
       <w:start w:val="1"/>
-      <w:numFmt w:val="decimal"/>
-      <w:lvlText w:val="%5."/>
+      <w:numFmt w:val="none"/>
+      <w:suff w:val="nothing"/>
+      <w:lvlText w:val="%5"/>
       <w:lvlJc w:val="left"/>
       <w:pPr>
         <w:tabs>
-          <w:tab w:val="num" w:pos="2160"/>
+          <w:tab w:val="num" w:pos="0"/>
         </w:tabs>
-        <w:ind w:left="2160" w:hanging="360"/>
-      </w:pPr>
-      <w:rPr/>
+        <w:ind w:left="0" w:hanging="0"/>
+      </w:pPr>
     </w:lvl>
     <w:lvl w:ilvl="5">
       <w:start w:val="1"/>
-      <w:numFmt w:val="decimal"/>
-      <w:lvlText w:val="%6."/>
+      <w:numFmt w:val="none"/>
+      <w:suff w:val="nothing"/>
+      <w:lvlText w:val="%6"/>
       <w:lvlJc w:val="left"/>
       <w:pPr>
         <w:tabs>
-          <w:tab w:val="num" w:pos="2520"/>
+          <w:tab w:val="num" w:pos="0"/>
         </w:tabs>
-        <w:ind w:left="2520" w:hanging="360"/>
-      </w:pPr>
-      <w:rPr/>
+        <w:ind w:left="0" w:hanging="0"/>
+      </w:pPr>
     </w:lvl>
     <w:lvl w:ilvl="6">
       <w:start w:val="1"/>
-      <w:numFmt w:val="decimal"/>
-      <w:lvlText w:val="%7."/>
+      <w:numFmt w:val="none"/>
+      <w:suff w:val="nothing"/>
+      <w:lvlText w:val="%7"/>
       <w:lvlJc w:val="left"/>
       <w:pPr>
         <w:tabs>
-          <w:tab w:val="num" w:pos="2880"/>
+          <w:tab w:val="num" w:pos="0"/>
         </w:tabs>
-        <w:ind w:left="2880" w:hanging="360"/>
-      </w:pPr>
-      <w:rPr/>
+        <w:ind w:left="0" w:hanging="0"/>
+      </w:pPr>
     </w:lvl>
     <w:lvl w:ilvl="7">
       <w:start w:val="1"/>
-      <w:numFmt w:val="decimal"/>
-      <w:lvlText w:val="%8."/>
+      <w:numFmt w:val="none"/>
+      <w:suff w:val="nothing"/>
+      <w:lvlText w:val="%8"/>
       <w:lvlJc w:val="left"/>
       <w:pPr>
         <w:tabs>
-          <w:tab w:val="num" w:pos="3240"/>
+          <w:tab w:val="num" w:pos="0"/>
         </w:tabs>
-        <w:ind w:left="3240" w:hanging="360"/>
-      </w:pPr>
-      <w:rPr/>
+        <w:ind w:left="0" w:hanging="0"/>
+      </w:pPr>
     </w:lvl>
     <w:lvl w:ilvl="8">
       <w:start w:val="1"/>
-      <w:numFmt w:val="decimal"/>
-      <w:lvlText w:val="%9."/>
+      <w:numFmt w:val="none"/>
+      <w:suff w:val="nothing"/>
+      <w:lvlText w:val="%9"/>
       <w:lvlJc w:val="left"/>
       <w:pPr>
         <w:tabs>
-          <w:tab w:val="num" w:pos="3600"/>
+          <w:tab w:val="num" w:pos="0"/>
         </w:tabs>
-        <w:ind w:left="3600" w:hanging="360"/>
-      </w:pPr>
-      <w:rPr/>
+        <w:ind w:left="0" w:hanging="0"/>
+      </w:pPr>
     </w:lvl>
   </w:abstractNum>
   <w:abstractNum w:abstractNumId="2">
@@ -5867,120 +6188,120 @@
   <w:abstractNum w:abstractNumId="3">
     <w:lvl w:ilvl="0">
       <w:start w:val="1"/>
-      <w:numFmt w:val="none"/>
-      <w:suff w:val="nothing"/>
-      <w:lvlText w:val=""/>
+      <w:numFmt w:val="decimal"/>
+      <w:lvlText w:val="%1."/>
       <w:lvlJc w:val="left"/>
       <w:pPr>
         <w:tabs>
-          <w:tab w:val="num" w:pos="0"/>
+          <w:tab w:val="num" w:pos="720"/>
         </w:tabs>
-        <w:ind w:left="0" w:hanging="0"/>
-      </w:pPr>
+        <w:ind w:left="720" w:hanging="360"/>
+      </w:pPr>
+      <w:rPr/>
     </w:lvl>
     <w:lvl w:ilvl="1">
       <w:start w:val="1"/>
-      <w:numFmt w:val="none"/>
-      <w:suff w:val="nothing"/>
-      <w:lvlText w:val=""/>
+      <w:numFmt w:val="decimal"/>
+      <w:lvlText w:val="%2."/>
       <w:lvlJc w:val="left"/>
       <w:pPr>
         <w:tabs>
-          <w:tab w:val="num" w:pos="0"/>
+          <w:tab w:val="num" w:pos="1080"/>
         </w:tabs>
-        <w:ind w:left="0" w:hanging="0"/>
-      </w:pPr>
+        <w:ind w:left="1080" w:hanging="360"/>
+      </w:pPr>
+      <w:rPr/>
     </w:lvl>
     <w:lvl w:ilvl="2">
       <w:start w:val="1"/>
-      <w:numFmt w:val="none"/>
-      <w:suff w:val="nothing"/>
-      <w:lvlText w:val=""/>
+      <w:numFmt w:val="decimal"/>
+      <w:lvlText w:val="%3."/>
       <w:lvlJc w:val="left"/>
       <w:pPr>
         <w:tabs>
-          <w:tab w:val="num" w:pos="0"/>
+          <w:tab w:val="num" w:pos="1440"/>
         </w:tabs>
-        <w:ind w:left="0" w:hanging="0"/>
-      </w:pPr>
+        <w:ind w:left="1440" w:hanging="360"/>
+      </w:pPr>
+      <w:rPr/>
     </w:lvl>
     <w:lvl w:ilvl="3">
       <w:start w:val="1"/>
-      <w:numFmt w:val="none"/>
-      <w:suff w:val="nothing"/>
-      <w:lvlText w:val=""/>
+      <w:numFmt w:val="decimal"/>
+      <w:lvlText w:val="%4."/>
       <w:lvlJc w:val="left"/>
       <w:pPr>
         <w:tabs>
-          <w:tab w:val="num" w:pos="0"/>
+          <w:tab w:val="num" w:pos="1800"/>
         </w:tabs>
-        <w:ind w:left="0" w:hanging="0"/>
-      </w:pPr>
+        <w:ind w:left="1800" w:hanging="360"/>
+      </w:pPr>
+      <w:rPr/>
     </w:lvl>
     <w:lvl w:ilvl="4">
       <w:start w:val="1"/>
-      <w:numFmt w:val="none"/>
-      <w:suff w:val="nothing"/>
-      <w:lvlText w:val=""/>
+      <w:numFmt w:val="decimal"/>
+      <w:lvlText w:val="%5."/>
       <w:lvlJc w:val="left"/>
       <w:pPr>
         <w:tabs>
-          <w:tab w:val="num" w:pos="0"/>
+          <w:tab w:val="num" w:pos="2160"/>
         </w:tabs>
-        <w:ind w:left="0" w:hanging="0"/>
-      </w:pPr>
+        <w:ind w:left="2160" w:hanging="360"/>
+      </w:pPr>
+      <w:rPr/>
     </w:lvl>
     <w:lvl w:ilvl="5">
       <w:start w:val="1"/>
-      <w:numFmt w:val="none"/>
-      <w:suff w:val="nothing"/>
-      <w:lvlText w:val=""/>
+      <w:numFmt w:val="decimal"/>
+      <w:lvlText w:val="%6."/>
       <w:lvlJc w:val="left"/>
       <w:pPr>
         <w:tabs>
-          <w:tab w:val="num" w:pos="0"/>
+          <w:tab w:val="num" w:pos="2520"/>
         </w:tabs>
-        <w:ind w:left="0" w:hanging="0"/>
-      </w:pPr>
+        <w:ind w:left="2520" w:hanging="360"/>
+      </w:pPr>
+      <w:rPr/>
     </w:lvl>
     <w:lvl w:ilvl="6">
       <w:start w:val="1"/>
-      <w:numFmt w:val="none"/>
-      <w:suff w:val="nothing"/>
-      <w:lvlText w:val=""/>
+      <w:numFmt w:val="decimal"/>
+      <w:lvlText w:val="%7."/>
       <w:lvlJc w:val="left"/>
       <w:pPr>
         <w:tabs>
-          <w:tab w:val="num" w:pos="0"/>
+          <w:tab w:val="num" w:pos="2880"/>
         </w:tabs>
-        <w:ind w:left="0" w:hanging="0"/>
-      </w:pPr>
+        <w:ind w:left="2880" w:hanging="360"/>
+      </w:pPr>
+      <w:rPr/>
     </w:lvl>
     <w:lvl w:ilvl="7">
       <w:start w:val="1"/>
-      <w:numFmt w:val="none"/>
-      <w:suff w:val="nothing"/>
-      <w:lvlText w:val=""/>
+      <w:numFmt w:val="decimal"/>
+      <w:lvlText w:val="%8."/>
       <w:lvlJc w:val="left"/>
       <w:pPr>
         <w:tabs>
-          <w:tab w:val="num" w:pos="0"/>
+          <w:tab w:val="num" w:pos="3240"/>
         </w:tabs>
-        <w:ind w:left="0" w:hanging="0"/>
-      </w:pPr>
+        <w:ind w:left="3240" w:hanging="360"/>
+      </w:pPr>
+      <w:rPr/>
     </w:lvl>
     <w:lvl w:ilvl="8">
       <w:start w:val="1"/>
-      <w:numFmt w:val="none"/>
-      <w:suff w:val="nothing"/>
-      <w:lvlText w:val=""/>
+      <w:numFmt w:val="decimal"/>
+      <w:lvlText w:val="%9."/>
       <w:lvlJc w:val="left"/>
       <w:pPr>
         <w:tabs>
-          <w:tab w:val="num" w:pos="0"/>
+          <w:tab w:val="num" w:pos="3600"/>
         </w:tabs>
-        <w:ind w:left="0" w:hanging="0"/>
-      </w:pPr>
+        <w:ind w:left="3600" w:hanging="360"/>
+      </w:pPr>
+      <w:rPr/>
     </w:lvl>
   </w:abstractNum>
   <w:num w:numId="1">
@@ -6019,7 +6340,9 @@
     <w:pPr>
       <w:widowControl/>
       <w:suppressAutoHyphens w:val="true"/>
+      <w:kinsoku w:val="true"/>
       <w:overflowPunct w:val="true"/>
+      <w:autoSpaceDE w:val="true"/>
       <w:bidi w:val="0"/>
       <w:spacing w:before="0" w:after="0"/>
       <w:jc w:val="left"/>
@@ -6251,6 +6574,13 @@
       <w:color w:val="808080"/>
     </w:rPr>
   </w:style>
+  <w:style w:type="character" w:styleId="SourceText">
+    <w:name w:val="Source Text"/>
+    <w:qFormat/>
+    <w:rPr>
+      <w:rFonts w:ascii="Liberation Mono" w:hAnsi="Liberation Mono" w:eastAsia="Noto Sans Mono CJK SC" w:cs="Liberation Mono"/>
+    </w:rPr>
+  </w:style>
   <w:style w:type="paragraph" w:styleId="Heading">
     <w:name w:val="Heading"/>
     <w:basedOn w:val="Normal"/>
@@ -6443,6 +6773,19 @@
       <w:szCs w:val="21"/>
     </w:rPr>
   </w:style>
+  <w:style w:type="paragraph" w:styleId="PreformattedText">
+    <w:name w:val="Preformatted Text"/>
+    <w:basedOn w:val="Normal"/>
+    <w:qFormat/>
+    <w:pPr>
+      <w:spacing w:before="0" w:after="0"/>
+    </w:pPr>
+    <w:rPr>
+      <w:rFonts w:ascii="Liberation Mono" w:hAnsi="Liberation Mono" w:eastAsia="Noto Sans Mono CJK SC" w:cs="Liberation Mono"/>
+      <w:sz w:val="20"/>
+      <w:szCs w:val="20"/>
+    </w:rPr>
+  </w:style>
   <w:style w:type="numbering" w:styleId="NoList">
     <w:name w:val="No List"/>
     <w:qFormat/>

</xml_diff>

<commit_message>
First visit to wanjoya
</commit_message>
<xml_diff>
--- a/SikoliaThesis.docx
+++ b/SikoliaThesis.docx
@@ -135,7 +135,7 @@
         <w:jc w:val="center"/>
       </w:pPr>
       <w:r>
-        <w:t>2022</w:t>
+        <w:t>2023</w:t>
       </w:r>
     </w:p>
     <w:p/>
@@ -218,14 +218,12 @@
           <w:b/>
         </w:rPr>
       </w:pPr>
-      <w:proofErr w:type="gramStart"/>
       <w:r>
         <w:rPr>
           <w:b/>
         </w:rPr>
         <w:t>Declaration by supervisors.</w:t>
       </w:r>
-      <w:proofErr w:type="gramEnd"/>
     </w:p>
     <w:p>
       <w:pPr>
@@ -233,61 +231,6 @@
       </w:pPr>
       <w:r>
         <w:t>This research proposal has been submitted for examination with our approval as university supervisors.</w:t>
-      </w:r>
-    </w:p>
-    <w:p>
-      <w:pPr>
-        <w:spacing w:line="480" w:lineRule="auto"/>
-      </w:pPr>
-    </w:p>
-    <w:p>
-      <w:pPr>
-        <w:spacing w:line="480" w:lineRule="auto"/>
-      </w:pPr>
-      <w:r>
-        <w:t>Signature ...............................…………….                         Date .....................................……….</w:t>
-      </w:r>
-    </w:p>
-    <w:p>
-      <w:pPr>
-        <w:spacing w:line="480" w:lineRule="auto"/>
-      </w:pPr>
-      <w:r>
-        <w:t xml:space="preserve">Professor Anthony </w:t>
-      </w:r>
-      <w:proofErr w:type="spellStart"/>
-      <w:r>
-        <w:t>Gichuhi</w:t>
-      </w:r>
-      <w:proofErr w:type="spellEnd"/>
-      <w:r>
-        <w:t xml:space="preserve"> </w:t>
-      </w:r>
-      <w:proofErr w:type="spellStart"/>
-      <w:r>
-        <w:t>Waititu</w:t>
-      </w:r>
-      <w:proofErr w:type="spellEnd"/>
-    </w:p>
-    <w:p>
-      <w:pPr>
-        <w:spacing w:line="480" w:lineRule="auto"/>
-      </w:pPr>
-      <w:r>
-        <w:t>Department of Statistics and Actuarial Sciences</w:t>
-      </w:r>
-    </w:p>
-    <w:p>
-      <w:pPr>
-        <w:spacing w:line="480" w:lineRule="auto"/>
-      </w:pPr>
-      <w:proofErr w:type="spellStart"/>
-      <w:r>
-        <w:t>Jomo</w:t>
-      </w:r>
-      <w:proofErr w:type="spellEnd"/>
-      <w:r>
-        <w:t xml:space="preserve"> Kenyatta University of Agriculture and Technology</w:t>
       </w:r>
     </w:p>
     <w:p>
@@ -456,6 +399,8 @@
       <w:pPr>
         <w:spacing w:line="480" w:lineRule="auto"/>
       </w:pPr>
+      <w:bookmarkStart w:id="2" w:name="_GoBack"/>
+      <w:bookmarkEnd w:id="2"/>
     </w:p>
     <w:p>
       <w:pPr>
@@ -509,23 +454,29 @@
       <w:pPr>
         <w:pStyle w:val="Heading1"/>
       </w:pPr>
-      <w:bookmarkStart w:id="2" w:name="_Toc139099734"/>
+      <w:bookmarkStart w:id="3" w:name="_Toc139099734"/>
       <w:r>
         <w:lastRenderedPageBreak/>
         <w:t>ACKNOWLEDGMENT</w:t>
       </w:r>
-      <w:bookmarkEnd w:id="2"/>
-    </w:p>
-    <w:p>
-      <w:pPr>
-        <w:spacing w:line="480" w:lineRule="auto"/>
-      </w:pPr>
-      <w:r>
-        <w:t xml:space="preserve">Special regards to my supervisors professor Anthony </w:t>
+      <w:bookmarkEnd w:id="3"/>
+    </w:p>
+    <w:p>
+      <w:pPr>
+        <w:spacing w:line="480" w:lineRule="auto"/>
+      </w:pPr>
+      <w:r>
+        <w:t>Special rega</w:t>
+      </w:r>
+      <w:r>
+        <w:t xml:space="preserve">rds to my supervisors </w:t>
+      </w:r>
+      <w:r>
+        <w:t xml:space="preserve">Dr. Anthony </w:t>
       </w:r>
       <w:proofErr w:type="spellStart"/>
       <w:r>
-        <w:t>Gichuhi</w:t>
+        <w:t>Kibera</w:t>
       </w:r>
       <w:proofErr w:type="spellEnd"/>
       <w:r>
@@ -533,34 +484,29 @@
       </w:r>
       <w:proofErr w:type="spellStart"/>
       <w:r>
-        <w:t>Waititu</w:t>
+        <w:t>Wanjoya</w:t>
       </w:r>
       <w:proofErr w:type="spellEnd"/>
       <w:r>
-        <w:t xml:space="preserve"> and Dr. Anthony </w:t>
+        <w:t xml:space="preserve"> </w:t>
+      </w:r>
+      <w:proofErr w:type="gramStart"/>
+      <w:r>
+        <w:t>and  …</w:t>
+      </w:r>
+      <w:proofErr w:type="gramEnd"/>
+      <w:r>
+        <w:t xml:space="preserve">…… </w:t>
+      </w:r>
+      <w:r>
+        <w:t xml:space="preserve"> for believing in me. Their continuous support, insightful comments, and immense knowledge have played a crucial role in this work. Their demand for excellence drove me to give my best in this thesis. My friend Festus Were has also been instrumental because he kept on checking up on me and my work. Our social meetings with Festus gave me several ideas on possible research topics for this proposal. I would also like to thank members of the department of statistics and actuarial sciences from the </w:t>
       </w:r>
       <w:proofErr w:type="spellStart"/>
       <w:r>
-        <w:t>Kibera</w:t>
+        <w:t>Jomo</w:t>
       </w:r>
       <w:proofErr w:type="spellEnd"/>
       <w:r>
-        <w:t xml:space="preserve"> </w:t>
-      </w:r>
-      <w:proofErr w:type="spellStart"/>
-      <w:r>
-        <w:t>Wanjoya</w:t>
-      </w:r>
-      <w:proofErr w:type="spellEnd"/>
-      <w:r>
-        <w:t xml:space="preserve"> for believing in me. Their continuous support, insightful comments, and immense knowledge have played a crucial role in this work. Their demand for excellence drove me to give my best in this thesis. My friend Festus Were has also been instrumental because he kept on checking up on me and my work. Our social meetings with Festus gave me several ideas on possible research topics for this proposal. I would also like to thank members of the department of statistics and actuarial sciences from the </w:t>
-      </w:r>
-      <w:proofErr w:type="spellStart"/>
-      <w:r>
-        <w:t>Jomo</w:t>
-      </w:r>
-      <w:proofErr w:type="spellEnd"/>
-      <w:r>
         <w:t xml:space="preserve"> Kenyatta University of Agriculture and Technology for their support in my studies.</w:t>
       </w:r>
     </w:p>
@@ -606,12 +552,12 @@
       <w:pPr>
         <w:pStyle w:val="Heading1"/>
       </w:pPr>
-      <w:bookmarkStart w:id="3" w:name="_Toc139099735"/>
+      <w:bookmarkStart w:id="4" w:name="_Toc139099735"/>
       <w:r>
         <w:lastRenderedPageBreak/>
         <w:t>ABSTRACT</w:t>
       </w:r>
-      <w:bookmarkEnd w:id="3"/>
+      <w:bookmarkEnd w:id="4"/>
     </w:p>
     <w:p>
       <w:pPr>
@@ -697,6 +643,7 @@
           <w:docPartUnique/>
         </w:docPartObj>
       </w:sdtPr>
+      <w:sdtEndPr/>
       <w:sdtContent>
         <w:p>
           <w:pPr>
@@ -2156,7 +2103,7 @@
                 <w:noProof/>
                 <w:webHidden/>
               </w:rPr>
-              <w:t>9</w:t>
+              <w:t>8</w:t>
             </w:r>
             <w:r>
               <w:rPr>
@@ -2302,7 +2249,7 @@
                 <w:noProof/>
                 <w:webHidden/>
               </w:rPr>
-              <w:t>16</w:t>
+              <w:t>15</w:t>
             </w:r>
             <w:r>
               <w:rPr>
@@ -2375,7 +2322,7 @@
                 <w:noProof/>
                 <w:webHidden/>
               </w:rPr>
-              <w:t>18</w:t>
+              <w:t>17</w:t>
             </w:r>
             <w:r>
               <w:rPr>
@@ -2561,12 +2508,12 @@
       <w:pPr>
         <w:pStyle w:val="Heading1"/>
       </w:pPr>
-      <w:bookmarkStart w:id="4" w:name="_Toc139099736"/>
+      <w:bookmarkStart w:id="5" w:name="_Toc139099736"/>
       <w:r>
         <w:lastRenderedPageBreak/>
         <w:t>List of Tables</w:t>
       </w:r>
-      <w:bookmarkEnd w:id="4"/>
+      <w:bookmarkEnd w:id="5"/>
     </w:p>
     <w:p>
       <w:pPr>
@@ -2637,43 +2584,43 @@
           <w:cols w:space="720"/>
         </w:sectPr>
       </w:pPr>
-      <w:bookmarkStart w:id="5" w:name="_Toc139099737"/>
+      <w:bookmarkStart w:id="6" w:name="_Toc139099737"/>
       <w:r>
         <w:lastRenderedPageBreak/>
         <w:t>List of Figures</w:t>
       </w:r>
-      <w:bookmarkEnd w:id="5"/>
+      <w:bookmarkEnd w:id="6"/>
     </w:p>
     <w:p>
       <w:pPr>
         <w:pStyle w:val="Heading1"/>
       </w:pPr>
-      <w:bookmarkStart w:id="6" w:name="_Toc139099738"/>
+      <w:bookmarkStart w:id="7" w:name="_Toc139099738"/>
       <w:r>
         <w:lastRenderedPageBreak/>
         <w:t>Chapter One</w:t>
       </w:r>
-      <w:bookmarkEnd w:id="6"/>
+      <w:bookmarkEnd w:id="7"/>
     </w:p>
     <w:p>
       <w:pPr>
         <w:pStyle w:val="Heading2"/>
       </w:pPr>
-      <w:bookmarkStart w:id="7" w:name="_Toc139099739"/>
+      <w:bookmarkStart w:id="8" w:name="_Toc139099739"/>
       <w:r>
         <w:t>Introduction</w:t>
       </w:r>
-      <w:bookmarkEnd w:id="7"/>
+      <w:bookmarkEnd w:id="8"/>
     </w:p>
     <w:p>
       <w:pPr>
         <w:pStyle w:val="Heading2"/>
       </w:pPr>
-      <w:bookmarkStart w:id="8" w:name="_Toc139099740"/>
+      <w:bookmarkStart w:id="9" w:name="_Toc139099740"/>
       <w:r>
         <w:t>1.1 Background of Study</w:t>
       </w:r>
-      <w:bookmarkEnd w:id="8"/>
+      <w:bookmarkEnd w:id="9"/>
     </w:p>
     <w:p>
       <w:pPr>
@@ -2732,12 +2679,12 @@
       <w:pPr>
         <w:pStyle w:val="Heading2"/>
       </w:pPr>
-      <w:bookmarkStart w:id="9" w:name="_Toc139099741"/>
+      <w:bookmarkStart w:id="10" w:name="_Toc139099741"/>
       <w:r>
         <w:lastRenderedPageBreak/>
         <w:t>1.2 Problem Statement</w:t>
       </w:r>
-      <w:bookmarkEnd w:id="9"/>
+      <w:bookmarkEnd w:id="10"/>
     </w:p>
     <w:p>
       <w:pPr>
@@ -2771,11 +2718,11 @@
       <w:pPr>
         <w:pStyle w:val="Heading2"/>
       </w:pPr>
-      <w:bookmarkStart w:id="10" w:name="_Toc139099742"/>
+      <w:bookmarkStart w:id="11" w:name="_Toc139099742"/>
       <w:r>
         <w:t>1.3 Justification of the study</w:t>
       </w:r>
-      <w:bookmarkEnd w:id="10"/>
+      <w:bookmarkEnd w:id="11"/>
     </w:p>
     <w:p>
       <w:pPr>
@@ -2836,7 +2783,7 @@
       <w:pPr>
         <w:pStyle w:val="Heading2"/>
       </w:pPr>
-      <w:bookmarkStart w:id="11" w:name="_Toc139099743"/>
+      <w:bookmarkStart w:id="12" w:name="_Toc139099743"/>
       <w:r>
         <w:rPr>
           <w:sz w:val="30"/>
@@ -2847,17 +2794,17 @@
       <w:r>
         <w:t>OBJECTIVES OF THE STUDY</w:t>
       </w:r>
-      <w:bookmarkEnd w:id="11"/>
+      <w:bookmarkEnd w:id="12"/>
     </w:p>
     <w:p>
       <w:pPr>
         <w:pStyle w:val="Heading3"/>
       </w:pPr>
-      <w:bookmarkStart w:id="12" w:name="_Toc139099744"/>
+      <w:bookmarkStart w:id="13" w:name="_Toc139099744"/>
       <w:r>
         <w:t>1.4.1 General Objective</w:t>
       </w:r>
-      <w:bookmarkEnd w:id="12"/>
+      <w:bookmarkEnd w:id="13"/>
     </w:p>
     <w:p>
       <w:pPr>
@@ -2871,11 +2818,11 @@
       <w:pPr>
         <w:pStyle w:val="Heading3"/>
       </w:pPr>
-      <w:bookmarkStart w:id="13" w:name="_Toc139099745"/>
+      <w:bookmarkStart w:id="14" w:name="_Toc139099745"/>
       <w:r>
         <w:t>1.4.2 Specific Objectives</w:t>
       </w:r>
-      <w:bookmarkEnd w:id="13"/>
+      <w:bookmarkEnd w:id="14"/>
     </w:p>
     <w:p>
       <w:pPr>
@@ -2886,7 +2833,7 @@
         <w:spacing w:line="480" w:lineRule="auto"/>
       </w:pPr>
       <w:r>
-        <w:t>To use convolution neural networks to build a model that can detect African faces given a list of smartphone images.</w:t>
+        <w:t>To extract human faces from pictures taken by smartphones and prepare the faces for deep learning.</w:t>
       </w:r>
     </w:p>
     <w:p>
@@ -2898,7 +2845,7 @@
         <w:spacing w:line="480" w:lineRule="auto"/>
       </w:pPr>
       <w:r>
-        <w:t>To use recurrent neural networks to build a model that can detect African faces given a list of smartphone images.</w:t>
+        <w:t>To use convolution neural networks to build a model that can detect African faces given a list of smartphone images.</w:t>
       </w:r>
     </w:p>
     <w:p>
@@ -2922,18 +2869,24 @@
         <w:spacing w:line="480" w:lineRule="auto"/>
       </w:pPr>
       <w:r>
-        <w:t>To compare the performance of convolution, recurrent, and artificial neural networks on African faces from smartphone pictures.</w:t>
+        <w:t>To compare the performance of convolution</w:t>
+      </w:r>
+      <w:r>
+        <w:t xml:space="preserve"> </w:t>
+      </w:r>
+      <w:r>
+        <w:t>and artificial neural networks on African faces from smartphone pictures.</w:t>
       </w:r>
     </w:p>
     <w:p>
       <w:pPr>
         <w:pStyle w:val="Heading2"/>
       </w:pPr>
-      <w:bookmarkStart w:id="14" w:name="_Toc139099746"/>
+      <w:bookmarkStart w:id="15" w:name="_Toc139099746"/>
       <w:r>
         <w:t>1.5 Significance of the Study</w:t>
       </w:r>
-      <w:bookmarkEnd w:id="14"/>
+      <w:bookmarkEnd w:id="15"/>
     </w:p>
     <w:p>
       <w:pPr>
@@ -2954,7 +2907,19 @@
       </w:r>
       <w:r>
         <w:lastRenderedPageBreak/>
-        <w:t>racially biased. It is also important to note that most of the current facial recognition systems were created from celebrity images but none of them dared to use images collected from Smartphones. It is notable that the current facial recognition systems were created using one hundred and twenty-eight variables. It follows that this proposal will contribute to the existing knowledge by creating a facial recognition system using forty-two variables, African faces, and images taken using smartphones.</w:t>
+        <w:t>racially biased. It is also important to note that most of the current facial recognition systems were created from celebrity images but none of them dared to use images collected</w:t>
+      </w:r>
+      <w:r>
+        <w:t xml:space="preserve"> specifically</w:t>
+      </w:r>
+      <w:r>
+        <w:t xml:space="preserve"> from Smartphones. It follows that this proposal will contribute to the existing knowledge by creating a facial recognition system using African faces, and images taken </w:t>
+      </w:r>
+      <w:r>
+        <w:t xml:space="preserve">specifically by </w:t>
+      </w:r>
+      <w:r>
+        <w:t>smartphones.</w:t>
       </w:r>
     </w:p>
     <w:p>
@@ -2969,51 +2934,63 @@
       <w:pPr>
         <w:pStyle w:val="Heading1"/>
       </w:pPr>
-      <w:bookmarkStart w:id="15" w:name="_Toc139099747"/>
+      <w:bookmarkStart w:id="16" w:name="_Toc139099747"/>
       <w:r>
         <w:lastRenderedPageBreak/>
         <w:t>Chapter Two</w:t>
       </w:r>
-      <w:bookmarkEnd w:id="15"/>
+      <w:bookmarkEnd w:id="16"/>
     </w:p>
     <w:p>
       <w:pPr>
         <w:pStyle w:val="Heading1"/>
       </w:pPr>
-      <w:bookmarkStart w:id="16" w:name="_Toc139099748"/>
+      <w:bookmarkStart w:id="17" w:name="_Toc139099748"/>
       <w:r>
         <w:t>Literature Review</w:t>
       </w:r>
-      <w:bookmarkEnd w:id="16"/>
+      <w:bookmarkEnd w:id="17"/>
     </w:p>
     <w:p>
       <w:pPr>
         <w:pStyle w:val="Heading2"/>
       </w:pPr>
-      <w:bookmarkStart w:id="17" w:name="_Toc139099749"/>
+      <w:bookmarkStart w:id="18" w:name="_Toc139099749"/>
       <w:r>
         <w:t>2.1 Introduction</w:t>
       </w:r>
-      <w:bookmarkEnd w:id="17"/>
-    </w:p>
-    <w:p>
-      <w:pPr>
-        <w:spacing w:line="480" w:lineRule="auto"/>
-      </w:pPr>
-      <w:r>
-        <w:tab/>
-        <w:t>This section surveys previous works done on facial recognition with a bias towards the objectives of this work. It begins with examining different types of methodologies that have been used for facial recognition before delving into how different types of neural networks have been used for facial recognition. Specifically, this proposal discusses how convolution neural networks, recurrent neural networks, and long short term memory neural networks have been used for facial recognition. Finally, the proposal examines machine learning workflows from previous publications and how those workflows can be applied to facial recognition.</w:t>
+      <w:bookmarkEnd w:id="18"/>
+    </w:p>
+    <w:p>
+      <w:pPr>
+        <w:spacing w:line="480" w:lineRule="auto"/>
+      </w:pPr>
+      <w:r>
+        <w:tab/>
+        <w:t>This section surveys previous works done on facial recognition with a bias towards the objectives of this work. It begins with examining different types of methodologies that have been used for facial recognition before delving into how different types of neural networks have been used for facial recognition. Specifically, this proposal discusses ho</w:t>
+      </w:r>
+      <w:r>
+        <w:t>w convolution neural networks, artificial</w:t>
+      </w:r>
+      <w:r>
+        <w:t xml:space="preserve"> neural networks, and </w:t>
+      </w:r>
+      <w:r>
+        <w:t>how they</w:t>
+      </w:r>
+      <w:r>
+        <w:t xml:space="preserve"> have been used for facial recognition. </w:t>
       </w:r>
     </w:p>
     <w:p>
       <w:pPr>
         <w:pStyle w:val="Heading2"/>
       </w:pPr>
-      <w:bookmarkStart w:id="18" w:name="_Toc139099750"/>
+      <w:bookmarkStart w:id="19" w:name="_Toc139099750"/>
       <w:r>
         <w:t>2.2 Facial Recognition</w:t>
       </w:r>
-      <w:bookmarkEnd w:id="18"/>
+      <w:bookmarkEnd w:id="19"/>
     </w:p>
     <w:p>
       <w:pPr>
@@ -3028,20 +3005,23 @@
       <w:pPr>
         <w:pStyle w:val="Heading3"/>
       </w:pPr>
-      <w:bookmarkStart w:id="19" w:name="_Toc139099751"/>
+      <w:bookmarkStart w:id="20" w:name="_Toc139099751"/>
+      <w:r>
+        <w:t>2.2.1 Face Detection</w:t>
+      </w:r>
+      <w:bookmarkEnd w:id="20"/>
+    </w:p>
+    <w:p>
+      <w:pPr>
+        <w:spacing w:line="480" w:lineRule="auto"/>
+      </w:pPr>
+      <w:r>
+        <w:tab/>
+        <w:t xml:space="preserve">Given an arbitrary image, the objective of facial detection is to establish whether or not there are any faces in the image and if present, return the image location and extent of each face (Yang, Kriegman and Ahuja, 2002). It is important to highlight that there are several methods that could be </w:t>
+      </w:r>
       <w:r>
         <w:lastRenderedPageBreak/>
-        <w:t>2.2.1 Face Detection</w:t>
-      </w:r>
-      <w:bookmarkEnd w:id="19"/>
-    </w:p>
-    <w:p>
-      <w:pPr>
-        <w:spacing w:line="480" w:lineRule="auto"/>
-      </w:pPr>
-      <w:r>
-        <w:tab/>
-        <w:t>Given an arbitrary image, the objective of facial detection is to establish whether or not there are any faces in the image and if present, return the image location and extent of each face (Yang, Kriegman and Ahuja, 2002). It is important to highlight that there are several methods that could be used for detecting faces from images. These methods include knowledge based methods, feature invariant approaches, template matching methods, and appearance based methods. Indeed, the mentioned methods are important when detecting faces from images, but all these methods are accompanied by several challenges. This owes to the reality that Yang, Kriegman and Ahuja (2002) list the following five challenges that are associated with facial detection: - pose, occlusion, aging face expression, imaging conditions and image orientation. Moreover, face expression is not only a challenge in face detection but also in face recognition. It follows that researchers on facial recognition should identify methods of tackling the mentioned challenges associated with face detection.</w:t>
+        <w:t>used for detecting faces from images. These methods include knowledge based methods, feature invariant approaches, template matching methods, and appearance based methods. Indeed, the mentioned methods are important when detecting faces from images, but all these methods are accompanied by several challenges. This owes to the reality that Yang, Kriegman and Ahuja (2002) list the following five challenges that are associated with facial detection: - pose, occlusion, aging face expression, imaging conditions and image orientation. Moreover, face expression is not only a challenge in face detection but also in face recognition. It follows that researchers on facial recognition should identify methods of tackling the mentioned challenges associated with face detection.</w:t>
       </w:r>
     </w:p>
     <w:p>
@@ -3063,7 +3043,7 @@
         <w:t xml:space="preserve">Pose: </w:t>
       </w:r>
       <w:r>
-        <w:t>A review of images databases will indicate that people like taking images in different posters. It follows that an image is likely to have a face that is twisted to the right, left, or even upside down. Moreover, some features such as the nose, eye, or ears maybe wholly or partially occluded which is an additional challenge in facial recognition.</w:t>
+        <w:t>A review of images databases will indicate that people like taking images in different poses. It follows that an image is likely to have a face that is twisted to the right, left, or even upside down. Moreover, some features such as the nose, eye, or ears maybe wholly or partially occluded which is an additional challenge in facial recognition.</w:t>
       </w:r>
       <w:r>
         <w:rPr>
@@ -3106,11 +3086,7 @@
         <w:t>Aging</w:t>
       </w:r>
       <w:r>
-        <w:t xml:space="preserve">: Human faces are known to change with age progression which presents a challenge in facial recognition. This implies that there would be a significant difference in images if the time difference </w:t>
-      </w:r>
-      <w:r>
-        <w:lastRenderedPageBreak/>
-        <w:t>between the images is large. It is notable that aging will not be a challenge to this paper because people tend to change their smartphones for a few years. It is notable however that Singh and Prasad (2018) propose the use of coupled auto-encoder networks and non-linear analysis as a solution to the aging problem in facial recognition.</w:t>
+        <w:t>: Human faces are known to change with age progression which presents a challenge in facial recognition. This implies that there would be a significant difference in images if the time difference between the images is large. It is notable that aging will not be a challenge to this paper because people tend to change their smartphones for a few years. It is notable however that Singh and Prasad (2018) propose the use of coupled auto-encoder networks and non-linear analysis as a solution to the aging problem in facial recognition.</w:t>
       </w:r>
     </w:p>
     <w:p>
@@ -3121,6 +3097,7 @@
         <w:rPr>
           <w:b/>
         </w:rPr>
+        <w:lastRenderedPageBreak/>
         <w:t>Facial expressions</w:t>
       </w:r>
       <w:r>
@@ -3183,17 +3160,20 @@
         <w:pStyle w:val="Heading5"/>
       </w:pPr>
       <w:r>
+        <w:t>2.2.2.2 The Feature Invariant Approach of Face Detection</w:t>
+      </w:r>
+    </w:p>
+    <w:p>
+      <w:pPr>
+        <w:spacing w:line="480" w:lineRule="auto"/>
+      </w:pPr>
+      <w:r>
+        <w:tab/>
+        <w:t xml:space="preserve">The feature invariant method of face detection is a little bit different from the knowledge based method because it uses statistical methods on facial landmarks. Celiktutan, Ulukaya, and Sankur (2013) define a face landmark as a prominent feature that can play a discriminative role or </w:t>
+      </w:r>
+      <w:r>
         <w:lastRenderedPageBreak/>
-        <w:t>2.2.2.2 The Feature Invariant Approach of Face Detection</w:t>
-      </w:r>
-    </w:p>
-    <w:p>
-      <w:pPr>
-        <w:spacing w:line="480" w:lineRule="auto"/>
-      </w:pPr>
-      <w:r>
-        <w:tab/>
-        <w:t>The feature invariant method of face detection is a little bit different from the knowledge based method because it uses statistical methods on facial landmarks. Celiktutan, Ulukaya, and Sankur (2013) define a face landmark as a prominent feature that can play a discriminative role or can serve as anchor points in face detection. Examples of such landmarks include the eye corners, the nose tip, nostril corners, mouth corners, end points of eyebrow arcs, ear lobes, and the chin. This approach works by detecting facial landmarks, texture and skin color before using a statistical model to identify the presence of a face in an image. Critical to the discussion is the reality that different authors have used the feature invariant approach for face detection. For instance, Kapil and Jain (2013) compared texture based to the structure and shape based feature invariant based methods and concluded that the texture based method is more accurate. However, the authors argue that feature invariant based methods are computationally expensive.</w:t>
+        <w:t>can serve as anchor points in face detection. Examples of such landmarks include the eye corners, the nose tip, nostril corners, mouth corners, end points of eyebrow arcs, ear lobes, and the chin. This approach works by detecting facial landmarks, texture and skin color before using a statistical model to identify the presence of a face in an image. Critical to the discussion is the reality that different authors have used the feature invariant approach for face detection. For instance, Kapil and Jain (2013) compared texture based to the structure and shape based feature invariant based methods and concluded that the texture based method is more accurate. However, the authors argue that feature invariant based methods are computationally expensive.</w:t>
       </w:r>
     </w:p>
     <w:p>
@@ -3218,7 +3198,6 @@
         <w:pStyle w:val="Heading5"/>
       </w:pPr>
       <w:r>
-        <w:lastRenderedPageBreak/>
         <w:t>2.2.2.4 The Appearance Based Approach of Facial Detection</w:t>
       </w:r>
     </w:p>
@@ -3252,6 +3231,7 @@
         <w:spacing w:line="480" w:lineRule="auto"/>
       </w:pPr>
       <w:r>
+        <w:lastRenderedPageBreak/>
         <w:t>For each u and v are in H, u + v is in H. (In this case we say H is closed under vector addition.)</w:t>
       </w:r>
     </w:p>
@@ -3279,11 +3259,11 @@
       <w:pPr>
         <w:pStyle w:val="Heading3"/>
       </w:pPr>
-      <w:bookmarkStart w:id="20" w:name="_Toc139099752"/>
+      <w:bookmarkStart w:id="21" w:name="_Toc139099752"/>
       <w:r>
         <w:t>2.2.3 Face Identification Approaches</w:t>
       </w:r>
-      <w:bookmarkEnd w:id="20"/>
+      <w:bookmarkEnd w:id="21"/>
     </w:p>
     <w:p>
       <w:pPr>
@@ -3298,20 +3278,23 @@
       <w:pPr>
         <w:pStyle w:val="Heading4"/>
       </w:pPr>
-      <w:bookmarkStart w:id="21" w:name="_heading=h.xkn7eq5w1o4" w:colFirst="0" w:colLast="0"/>
-      <w:bookmarkEnd w:id="21"/>
+      <w:bookmarkStart w:id="22" w:name="_heading=h.xkn7eq5w1o4" w:colFirst="0" w:colLast="0"/>
+      <w:bookmarkEnd w:id="22"/>
+      <w:r>
+        <w:t>2.2.3.1 Template Matching/ Geometric Approaches</w:t>
+      </w:r>
+    </w:p>
+    <w:p>
+      <w:pPr>
+        <w:spacing w:line="480" w:lineRule="auto"/>
+      </w:pPr>
+      <w:r>
+        <w:tab/>
+        <w:t xml:space="preserve">The template matching or the geometric approach of facial recognition is similar to the template matching of the face detection step. However, the objective of the facial recognition step is different from the objective in the face identification step. This owes to the reality that the objective of the facial recognition step is to match a face to a known person while the objective in the face </w:t>
+      </w:r>
       <w:r>
         <w:lastRenderedPageBreak/>
-        <w:t>2.2.3.1 Template Matching/ Geometric Approaches</w:t>
-      </w:r>
-    </w:p>
-    <w:p>
-      <w:pPr>
-        <w:spacing w:line="480" w:lineRule="auto"/>
-      </w:pPr>
-      <w:r>
-        <w:tab/>
-        <w:t xml:space="preserve">The template matching or the geometric approach of facial recognition is similar to the template matching of the face detection step. However, the objective of the facial recognition step is different from the objective in the face identification step. This owes to the reality that the objective of the facial recognition step is to match a face to a known person while the objective in the face detection step is to identify whether an object in an image is a human face or not. Like in the face detection step, features like the eye, the nose, the chin, and the mouth are extracted from a human face before matching the features in question to a known face. Consider a face </w:t>
+        <w:t xml:space="preserve">detection step is to identify whether an object in an image is a human face or not. Like in the face detection step, features like the eye, the nose, the chin, and the mouth are extracted from a human face before matching the features in question to a known face. Consider a face </w:t>
       </w:r>
       <w:proofErr w:type="gramStart"/>
       <w:r>
@@ -3410,20 +3393,23 @@
       <w:pPr>
         <w:pStyle w:val="Heading4"/>
       </w:pPr>
-      <w:bookmarkStart w:id="22" w:name="_heading=h.603n9ogh56ag" w:colFirst="0" w:colLast="0"/>
-      <w:bookmarkEnd w:id="22"/>
+      <w:bookmarkStart w:id="23" w:name="_heading=h.603n9ogh56ag" w:colFirst="0" w:colLast="0"/>
+      <w:bookmarkEnd w:id="23"/>
+      <w:r>
+        <w:t>2.2.3.2 Appearance Based Methods</w:t>
+      </w:r>
+    </w:p>
+    <w:p>
+      <w:pPr>
+        <w:spacing w:line="480" w:lineRule="auto"/>
+      </w:pPr>
+      <w:r>
+        <w:tab/>
+        <w:t xml:space="preserve">Appearance based methods of face identification work the same way they work for face detection with the difference being the purpose of the method. This owes to the fact that the entire face is used to identify a face but with an aim of matching a face to that of a known person. It is important to highlight that this technique could be classified into linear and non-linear methods. Examples of linear methods include principal components analysis, independent component analysis, linear discriminant analysis, and linear regression classifier. Non-linear methods include </w:t>
+      </w:r>
       <w:r>
         <w:lastRenderedPageBreak/>
-        <w:t>2.2.3.2 Appearance Based Methods</w:t>
-      </w:r>
-    </w:p>
-    <w:p>
-      <w:pPr>
-        <w:spacing w:line="480" w:lineRule="auto"/>
-      </w:pPr>
-      <w:r>
-        <w:tab/>
-        <w:t xml:space="preserve">Appearance based methods of face identification work the same way they work for face detection with the difference being the purpose of the method. This owes to the fact that the entire face is used to identify a face but with an aim of matching a face to that of a known person. It is important to highlight that this technique could be classified into linear and non-linear methods. Examples of linear methods include principal components analysis, independent component analysis, linear discriminant analysis, and linear regression classifier. Non-linear methods include kernel principal component analysis, local linear embedding, and kernel linear discriminant analysis. In a nonlinear approach the input image is mapped into higher dimensional space in which the face is simplified and linear. In principal component analysis a number of images are taken using gray levels. Each image is mapped to a long vector of gray levels. Several views of each person are collected in the database during training. During recognition a vector corresponding to an unknown face is compared with all vectors in the database (Viegas et al., 2019). </w:t>
+        <w:t xml:space="preserve">kernel principal component analysis, local linear embedding, and kernel linear discriminant analysis. In a nonlinear approach the input image is mapped into higher dimensional space in which the face is simplified and linear. In principal component analysis a number of images are taken using gray levels. Each image is mapped to a long vector of gray levels. Several views of each person are collected in the database during training. During recognition a vector corresponding to an unknown face is compared with all vectors in the database (Viegas et al., 2019). </w:t>
       </w:r>
     </w:p>
     <w:p>
@@ -3440,20 +3426,23 @@
         <w:pStyle w:val="Heading4"/>
         <w:jc w:val="both"/>
       </w:pPr>
-      <w:bookmarkStart w:id="23" w:name="_heading=h.ljdder1spgws" w:colFirst="0" w:colLast="0"/>
-      <w:bookmarkEnd w:id="23"/>
+      <w:bookmarkStart w:id="24" w:name="_heading=h.ljdder1spgws" w:colFirst="0" w:colLast="0"/>
+      <w:bookmarkEnd w:id="24"/>
+      <w:r>
+        <w:t>2.2.3.3 Statistical Methods</w:t>
+      </w:r>
+    </w:p>
+    <w:p>
+      <w:pPr>
+        <w:spacing w:line="480" w:lineRule="auto"/>
+      </w:pPr>
+      <w:r>
+        <w:tab/>
+        <w:t xml:space="preserve">In this method, the objective is to create a model that would use a set of variables to predict whether or not a face belongs to a known person. This is done by converting an image into a set of features that are later used for building a statistical model. To further the debate, the number of features that are used for creating models is usually high. It follows that the right statistical tool should be used in order to control for the high number of variables. According to Proyecto (2010) a combination of different tools are at times used in order to create a good model for facial </w:t>
+      </w:r>
       <w:r>
         <w:lastRenderedPageBreak/>
-        <w:t>2.2.3.3 Statistical Methods</w:t>
-      </w:r>
-    </w:p>
-    <w:p>
-      <w:pPr>
-        <w:spacing w:line="480" w:lineRule="auto"/>
-      </w:pPr>
-      <w:r>
-        <w:tab/>
-        <w:t>In this method, the objective is to create a model that would use a set of variables to predict whether or not a face belongs to a known person. This is done by converting an image into a set of features that are later used for building a statistical model. To further the debate, the number of features that are used for creating models is usually high. It follows that the right statistical tool should be used in order to control for the high number of variables. According to Proyecto (2010) a combination of different tools are at times used in order to create a good model for facial recognition. It is notable that some of the existing solutions that are used to predict the faces include neural networks with Gabor filters, neural networks with hidden markov models, and fuzzy neural networks. That is not all. At times, principal components analysis, linear discriminant analysis, independent component analysis is used together with other tools in order to control for the number of features used to create a model.</w:t>
+        <w:t>recognition. It is notable that some of the existing solutions that are used to predict the faces include neural networks with Gabor filters, neural networks with hidden markov models, and fuzzy neural networks. That is not all. At times, principal components analysis, linear discriminant analysis, independent component analysis is used together with other tools in order to control for the number of features used to create a model.</w:t>
       </w:r>
     </w:p>
     <w:p>
@@ -3474,26 +3463,29 @@
       <w:pPr>
         <w:pStyle w:val="Heading2"/>
       </w:pPr>
-      <w:bookmarkStart w:id="24" w:name="_Toc139099753"/>
+      <w:bookmarkStart w:id="25" w:name="_Toc139099753"/>
+      <w:r>
+        <w:t>2.3 Artificial Neural Networks</w:t>
+      </w:r>
+      <w:bookmarkEnd w:id="25"/>
+    </w:p>
+    <w:p>
+      <w:pPr>
+        <w:spacing w:line="480" w:lineRule="auto"/>
+      </w:pPr>
+      <w:r>
+        <w:tab/>
+        <w:t xml:space="preserve">Artificial neural networks is a machine learning technique that tries to imitate the intelligence of a human brain. The human brain contains neurons that are connected to one another through axons and dendrites. The connecting region between axons and dendrites is called a synapse. The strength of synaptic connections often changes due to </w:t>
+      </w:r>
+      <w:r>
+        <w:t>changes in external stimuli, which in turn influence</w:t>
+      </w:r>
+      <w:r>
+        <w:t xml:space="preserve"> how learning occurs in the human brain. Like biological neurons, artificial neural networks contain computational units called neurons. These computational units are connected to one another through weights that perform the same role as synapses in biological neurons. An artificial neural network computes a function of the inputs by propagating the </w:t>
+      </w:r>
       <w:r>
         <w:lastRenderedPageBreak/>
-        <w:t>2.3 Artificial Neural Networks</w:t>
-      </w:r>
-      <w:bookmarkEnd w:id="24"/>
-    </w:p>
-    <w:p>
-      <w:pPr>
-        <w:spacing w:line="480" w:lineRule="auto"/>
-      </w:pPr>
-      <w:r>
-        <w:tab/>
-        <w:t xml:space="preserve">Artificial neural networks is a machine learning technique that tries to imitate the intelligence of a human brain. The human brain contains neurons that are connected to one another through axons and dendrites. The connecting region between axons and dendrites is called a synapse. The strength of synaptic connections often changes due to </w:t>
-      </w:r>
-      <w:r>
-        <w:t>changes in external stimuli, which in turn influence</w:t>
-      </w:r>
-      <w:r>
-        <w:t xml:space="preserve"> how learning occurs in the human brain. Like biological neurons, artificial neural networks contain computational units called neurons. These computational units are connected to one another through weights that perform the same role as synapses in biological neurons. An artificial neural network computes a function of the inputs by propagating the computed values from the input neurons to the output neuron(s) and using the weights as intermediate parameters. Learning occurs by changing the weights connecting the neurons. </w:t>
+        <w:t xml:space="preserve">computed values from the input neurons to the output neuron(s) and using the weights as intermediate parameters. Learning occurs by changing the weights connecting the neurons. </w:t>
       </w:r>
     </w:p>
     <w:p>
@@ -3660,11 +3652,7 @@
         <w:t xml:space="preserve">i </w:t>
       </w:r>
       <w:r>
-        <w:t xml:space="preserve">and produces a probability of the response variable being 1 or 0. The activation function </w:t>
-      </w:r>
-      <w:r>
-        <w:lastRenderedPageBreak/>
-        <w:t>then takes the predicted probability and produces an output 1 if the predicted probability is close to 1 and produces an output 0 if the predicted probability is close to 1. It follows that the perceptron neural network can be computed using the formula shown below.</w:t>
+        <w:t>and produces a probability of the response variable being 1 or 0. The activation function then takes the predicted probability and produces an output 1 if the predicted probability is close to 1 and produces an output 0 if the predicted probability is close to 1. It follows that the perceptron neural network can be computed using the formula shown below.</w:t>
       </w:r>
     </w:p>
     <w:p>
@@ -3788,7 +3776,11 @@
       </w:pPr>
       <w:r>
         <w:tab/>
-        <w:t xml:space="preserve">While the above equation may work in a variety of settings, there are instances where we need to introduce a bias to a neural network for it to work accordingly. The mentioned bias could be compared to penalizing a regression model. Basically, we introduce a bias neuron that shifts the line of fit to the right or left depending on the original position of the line of fit. Another way to think about biases is simply by considering any linear function, y = mx + b. Let's say you are using y to approximate some linear function z. If z has a non-zero z-intercept, and you have no bias in the equation for y (i.e. y = mx), then y can never perfectly fit z. Similarly, if the neurons in your network have no bias terms, then it can be harder for your network to approximate some functions. The figure below shows an example of </w:t>
+        <w:t xml:space="preserve">While the above equation may work in a variety of settings, there are instances where we need to introduce a bias to a neural network for it to work accordingly. The mentioned bias could be compared to penalizing a regression model. Basically, we introduce a bias neuron that shifts the line of fit to the right or left depending on the original position of the line of fit. Another way to think </w:t>
+      </w:r>
+      <w:r>
+        <w:lastRenderedPageBreak/>
+        <w:t xml:space="preserve">about biases is simply by considering any linear function, y = mx + b. Let's say you are using y to approximate some linear function z. If z has a non-zero z-intercept, and you have no bias in the equation for y (i.e. y = mx), then y can never perfectly fit z. Similarly, if the neurons in your network have no bias terms, then it can be harder for your network to approximate some functions. The figure below shows an example of </w:t>
       </w:r>
       <w:r>
         <w:t>neural</w:t>
@@ -4114,27 +4106,47 @@
         <w:pStyle w:val="Heading2"/>
         <w:spacing w:line="480" w:lineRule="auto"/>
       </w:pPr>
-      <w:bookmarkStart w:id="25" w:name="_heading=h.9gict8km0erz" w:colFirst="0" w:colLast="0"/>
-      <w:bookmarkStart w:id="26" w:name="_Toc139099754"/>
-      <w:bookmarkEnd w:id="25"/>
+      <w:bookmarkStart w:id="26" w:name="_heading=h.9gict8km0erz" w:colFirst="0" w:colLast="0"/>
+      <w:bookmarkStart w:id="27" w:name="_Toc139099754"/>
+      <w:bookmarkEnd w:id="26"/>
       <w:r>
         <w:t>2.3.1 Neural Network Architectures</w:t>
       </w:r>
-      <w:bookmarkEnd w:id="26"/>
-    </w:p>
-    <w:p>
-      <w:pPr>
-        <w:spacing w:line="480" w:lineRule="auto"/>
-      </w:pPr>
-      <w:r>
-        <w:tab/>
-        <w:t xml:space="preserve">The single layer neural network architecture is the basis of neural networks and has already been discussed in the introductory section of neural networks. Other neural network architectures include the multiple layer neural network, radial basis functions neural networks, restricted </w:t>
+      <w:bookmarkEnd w:id="27"/>
+    </w:p>
+    <w:p>
+      <w:pPr>
+        <w:spacing w:line="480" w:lineRule="auto"/>
+      </w:pPr>
+      <w:r>
+        <w:tab/>
+        <w:t xml:space="preserve">The single layer neural network architecture is the basis of neural networks and has already been discussed in the introductory section of neural networks. Other neural network architectures include the multiple layer neural </w:t>
+      </w:r>
+      <w:proofErr w:type="gramStart"/>
+      <w:r>
+        <w:t>network</w:t>
+      </w:r>
+      <w:proofErr w:type="gramEnd"/>
+      <w:r>
+        <w:t xml:space="preserve">, radial basis functions neural networks, restricted </w:t>
       </w:r>
       <w:r>
         <w:t>Boltzmann</w:t>
       </w:r>
       <w:r>
-        <w:t xml:space="preserve"> machines, the convolution neural network, and the recurrent neural network, However, the multilayer neural network (ANN), the convolution neural network, and the recurrent neural network will be discussed in this paper.</w:t>
+        <w:t xml:space="preserve"> machines, the convolution neural network, and the recurrent neural network, However, the multilayer neural network (ANN), </w:t>
+      </w:r>
+      <w:r>
+        <w:t xml:space="preserve">and the convolution neural network </w:t>
+      </w:r>
+      <w:r>
+        <w:t>will be discussed in this paper</w:t>
+      </w:r>
+      <w:r>
+        <w:t xml:space="preserve"> because those are some of the tools the researcher will be using in this study</w:t>
+      </w:r>
+      <w:r>
+        <w:t>.</w:t>
       </w:r>
     </w:p>
     <w:p>
@@ -4142,13 +4154,14 @@
         <w:pStyle w:val="Heading3"/>
         <w:spacing w:line="360" w:lineRule="auto"/>
       </w:pPr>
-      <w:bookmarkStart w:id="27" w:name="_heading=h.wgtdmttqie3v" w:colFirst="0" w:colLast="0"/>
-      <w:bookmarkStart w:id="28" w:name="_Toc139099755"/>
-      <w:bookmarkEnd w:id="27"/>
-      <w:r>
+      <w:bookmarkStart w:id="28" w:name="_heading=h.wgtdmttqie3v" w:colFirst="0" w:colLast="0"/>
+      <w:bookmarkStart w:id="29" w:name="_Toc139099755"/>
+      <w:bookmarkEnd w:id="28"/>
+      <w:r>
+        <w:lastRenderedPageBreak/>
         <w:t>2.3.1.0 Multiple Layer Neural Network</w:t>
       </w:r>
-      <w:bookmarkEnd w:id="28"/>
+      <w:bookmarkEnd w:id="29"/>
     </w:p>
     <w:p>
       <w:pPr>
@@ -4546,6 +4559,7 @@
           <w:noProof/>
           <w:lang w:eastAsia="en-US" w:bidi="ar-SA"/>
         </w:rPr>
+        <w:lastRenderedPageBreak/>
         <w:drawing>
           <wp:inline distT="0" distB="0" distL="0" distR="0" wp14:anchorId="5244E4C4" wp14:editId="380927CB">
             <wp:extent cx="4171950" cy="2581275"/>
@@ -6020,13 +6034,7 @@
           <w:rPr>
             <w:rFonts w:ascii="Cambria Math" w:hAnsi="Cambria Math"/>
           </w:rPr>
-          <m:t>=</m:t>
-        </m:r>
-        <m:r>
-          <w:rPr>
-            <w:rFonts w:ascii="Cambria Math" w:hAnsi="Cambria Math"/>
-          </w:rPr>
-          <m:t>g</m:t>
+          <m:t>=g</m:t>
         </m:r>
         <m:d>
           <m:dPr>
@@ -6153,13 +6161,7 @@
           <w:rPr>
             <w:rFonts w:ascii="Cambria Math" w:hAnsi="Cambria Math"/>
           </w:rPr>
-          <m:t>=</m:t>
-        </m:r>
-        <m:r>
-          <w:rPr>
-            <w:rFonts w:ascii="Cambria Math" w:hAnsi="Cambria Math"/>
-          </w:rPr>
-          <m:t>g</m:t>
+          <m:t>=g</m:t>
         </m:r>
         <m:d>
           <m:dPr>
@@ -6286,19 +6288,7 @@
           <w:rPr>
             <w:rFonts w:ascii="Cambria Math" w:hAnsi="Cambria Math"/>
           </w:rPr>
-          <m:t>=</m:t>
-        </m:r>
-        <m:r>
-          <w:rPr>
-            <w:rFonts w:ascii="Cambria Math" w:hAnsi="Cambria Math"/>
-          </w:rPr>
-          <m:t>g</m:t>
-        </m:r>
-        <m:r>
-          <w:rPr>
-            <w:rFonts w:ascii="Cambria Math" w:hAnsi="Cambria Math"/>
-          </w:rPr>
-          <m:t>(</m:t>
+          <m:t>=g(</m:t>
         </m:r>
         <m:sSubSup>
           <m:sSubSupPr>
@@ -6560,6 +6550,7 @@
           <w:rPr>
             <w:rFonts w:ascii="Cambria Math" w:hAnsi="Cambria Math"/>
           </w:rPr>
+          <w:lastRenderedPageBreak/>
           <m:t>E</m:t>
         </m:r>
         <m:d>
@@ -7332,7 +7323,6 @@
           <w:rPr>
             <w:rFonts w:ascii="Cambria Math" w:hAnsi="Cambria Math"/>
           </w:rPr>
-          <w:lastRenderedPageBreak/>
           <m:t>∇</m:t>
         </m:r>
         <m:sSup>
@@ -8355,6 +8345,7 @@
         <w:spacing w:line="480" w:lineRule="auto"/>
       </w:pPr>
       <w:r>
+        <w:lastRenderedPageBreak/>
         <w:t xml:space="preserve">Where </w:t>
       </w:r>
       <m:oMath>
@@ -9599,7 +9590,6 @@
         <w:spacing w:line="480" w:lineRule="auto"/>
       </w:pPr>
       <w:r>
-        <w:lastRenderedPageBreak/>
         <w:tab/>
         <w:t xml:space="preserve">In order to train the second neural layer we need to adjust the weight matrix </w:t>
       </w:r>
@@ -10553,19 +10543,7 @@
                   <w:rPr>
                     <w:rFonts w:ascii="Cambria Math" w:hAnsi="Cambria Math"/>
                   </w:rPr>
-                  <m:t>(</m:t>
-                </m:r>
-                <m:r>
-                  <w:rPr>
-                    <w:rFonts w:ascii="Cambria Math" w:hAnsi="Cambria Math"/>
-                  </w:rPr>
-                  <m:t>2</m:t>
-                </m:r>
-                <m:r>
-                  <w:rPr>
-                    <w:rFonts w:ascii="Cambria Math" w:hAnsi="Cambria Math"/>
-                  </w:rPr>
-                  <m:t>)</m:t>
+                  <m:t>(2)</m:t>
                 </m:r>
               </m:sup>
             </m:sSubSup>
@@ -10601,13 +10579,7 @@
               <w:rPr>
                 <w:rFonts w:ascii="Cambria Math" w:hAnsi="Cambria Math"/>
               </w:rPr>
-              <m:t>n</m:t>
-            </m:r>
-            <m:r>
-              <w:rPr>
-                <w:rFonts w:ascii="Cambria Math" w:hAnsi="Cambria Math"/>
-              </w:rPr>
-              <m:t>3</m:t>
+              <m:t>n3</m:t>
             </m:r>
           </m:sup>
           <m:e>
@@ -10665,19 +10637,7 @@
                       <w:rPr>
                         <w:rFonts w:ascii="Cambria Math" w:hAnsi="Cambria Math"/>
                       </w:rPr>
-                      <m:t>(</m:t>
-                    </m:r>
-                    <m:r>
-                      <w:rPr>
-                        <w:rFonts w:ascii="Cambria Math" w:hAnsi="Cambria Math"/>
-                      </w:rPr>
-                      <m:t>3</m:t>
-                    </m:r>
-                    <m:r>
-                      <w:rPr>
-                        <w:rFonts w:ascii="Cambria Math" w:hAnsi="Cambria Math"/>
-                      </w:rPr>
-                      <m:t>)</m:t>
+                      <m:t>(3)</m:t>
                     </m:r>
                   </m:sup>
                 </m:sSubSup>
@@ -12331,7 +12291,6 @@
         <w:spacing w:line="480" w:lineRule="auto"/>
       </w:pPr>
       <w:r>
-        <w:lastRenderedPageBreak/>
         <w:t xml:space="preserve">Da Silva et al., (2017) posit that the adjustment of the weight matrix </w:t>
       </w:r>
       <m:oMath>
@@ -13293,6 +13252,7 @@
         <w:spacing w:line="480" w:lineRule="auto"/>
       </w:pPr>
       <w:r>
+        <w:lastRenderedPageBreak/>
         <w:t>In short, we have shown that that equation 2.24 adjusts weights from neurons in the second hidden layer</w:t>
       </w:r>
       <w:r>
@@ -13832,19 +13792,7 @@
                   <w:rPr>
                     <w:rFonts w:ascii="Cambria Math" w:hAnsi="Cambria Math"/>
                   </w:rPr>
-                  <m:t>(</m:t>
-                </m:r>
-                <m:r>
-                  <w:rPr>
-                    <w:rFonts w:ascii="Cambria Math" w:hAnsi="Cambria Math"/>
-                  </w:rPr>
-                  <m:t>1</m:t>
-                </m:r>
-                <m:r>
-                  <w:rPr>
-                    <w:rFonts w:ascii="Cambria Math" w:hAnsi="Cambria Math"/>
-                  </w:rPr>
-                  <m:t>)</m:t>
+                  <m:t>(1)</m:t>
                 </m:r>
               </m:sup>
             </m:sSubSup>
@@ -13878,13 +13826,7 @@
                   <w:rPr>
                     <w:rFonts w:ascii="Cambria Math" w:hAnsi="Cambria Math"/>
                   </w:rPr>
-                  <m:t>j</m:t>
-                </m:r>
-                <m:r>
-                  <w:rPr>
-                    <w:rFonts w:ascii="Cambria Math" w:hAnsi="Cambria Math"/>
-                  </w:rPr>
-                  <m:t>i</m:t>
+                  <m:t>ji</m:t>
                 </m:r>
               </m:sub>
               <m:sup>
@@ -13892,19 +13834,7 @@
                   <w:rPr>
                     <w:rFonts w:ascii="Cambria Math" w:hAnsi="Cambria Math"/>
                   </w:rPr>
-                  <m:t>(</m:t>
-                </m:r>
-                <m:r>
-                  <w:rPr>
-                    <w:rFonts w:ascii="Cambria Math" w:hAnsi="Cambria Math"/>
-                  </w:rPr>
-                  <m:t>1</m:t>
-                </m:r>
-                <m:r>
-                  <w:rPr>
-                    <w:rFonts w:ascii="Cambria Math" w:hAnsi="Cambria Math"/>
-                  </w:rPr>
-                  <m:t>)</m:t>
+                  <m:t>(1)</m:t>
                 </m:r>
               </m:sup>
             </m:sSubSup>
@@ -14057,19 +13987,7 @@
                   <w:rPr>
                     <w:rFonts w:ascii="Cambria Math" w:hAnsi="Cambria Math"/>
                   </w:rPr>
-                  <m:t>(</m:t>
-                </m:r>
-                <m:r>
-                  <w:rPr>
-                    <w:rFonts w:ascii="Cambria Math" w:hAnsi="Cambria Math"/>
-                  </w:rPr>
-                  <m:t>1</m:t>
-                </m:r>
-                <m:r>
-                  <w:rPr>
-                    <w:rFonts w:ascii="Cambria Math" w:hAnsi="Cambria Math"/>
-                  </w:rPr>
-                  <m:t>)</m:t>
+                  <m:t>(1)</m:t>
                 </m:r>
               </m:sup>
             </m:sSubSup>
@@ -14305,19 +14223,7 @@
                   <w:rPr>
                     <w:rFonts w:ascii="Cambria Math" w:hAnsi="Cambria Math"/>
                   </w:rPr>
-                  <m:t>(</m:t>
-                </m:r>
-                <m:r>
-                  <w:rPr>
-                    <w:rFonts w:ascii="Cambria Math" w:hAnsi="Cambria Math"/>
-                  </w:rPr>
-                  <m:t>1</m:t>
-                </m:r>
-                <m:r>
-                  <w:rPr>
-                    <w:rFonts w:ascii="Cambria Math" w:hAnsi="Cambria Math"/>
-                  </w:rPr>
-                  <m:t>)</m:t>
+                  <m:t>(1)</m:t>
                 </m:r>
               </m:sup>
             </m:sSubSup>
@@ -14353,13 +14259,7 @@
               <w:rPr>
                 <w:rFonts w:ascii="Cambria Math" w:hAnsi="Cambria Math"/>
               </w:rPr>
-              <m:t>n</m:t>
-            </m:r>
-            <m:r>
-              <w:rPr>
-                <w:rFonts w:ascii="Cambria Math" w:hAnsi="Cambria Math"/>
-              </w:rPr>
-              <m:t>2</m:t>
+              <m:t>n2</m:t>
             </m:r>
           </m:sup>
           <m:e>
@@ -14417,19 +14317,7 @@
                       <w:rPr>
                         <w:rFonts w:ascii="Cambria Math" w:hAnsi="Cambria Math"/>
                       </w:rPr>
-                      <m:t>(</m:t>
-                    </m:r>
-                    <m:r>
-                      <w:rPr>
-                        <w:rFonts w:ascii="Cambria Math" w:hAnsi="Cambria Math"/>
-                      </w:rPr>
-                      <m:t>2</m:t>
-                    </m:r>
-                    <m:r>
-                      <w:rPr>
-                        <w:rFonts w:ascii="Cambria Math" w:hAnsi="Cambria Math"/>
-                      </w:rPr>
-                      <m:t>)</m:t>
+                      <m:t>(2)</m:t>
                     </m:r>
                   </m:sup>
                 </m:sSubSup>
@@ -14611,13 +14499,7 @@
                       <w:rPr>
                         <w:rFonts w:ascii="Cambria Math" w:hAnsi="Cambria Math"/>
                       </w:rPr>
-                      <m:t>n</m:t>
-                    </m:r>
-                    <m:r>
-                      <w:rPr>
-                        <w:rFonts w:ascii="Cambria Math" w:hAnsi="Cambria Math"/>
-                      </w:rPr>
-                      <m:t>2</m:t>
+                      <m:t>n2</m:t>
                     </m:r>
                   </m:sup>
                   <m:e>
@@ -14791,13 +14673,7 @@
                           <w:rPr>
                             <w:rFonts w:ascii="Cambria Math" w:hAnsi="Cambria Math"/>
                           </w:rPr>
-                          <m:t>n</m:t>
-                        </m:r>
-                        <m:r>
-                          <w:rPr>
-                            <w:rFonts w:ascii="Cambria Math" w:hAnsi="Cambria Math"/>
-                          </w:rPr>
-                          <m:t>2</m:t>
+                          <m:t>n2</m:t>
                         </m:r>
                       </m:sup>
                       <m:e>
@@ -14831,19 +14707,7 @@
                               <w:rPr>
                                 <w:rFonts w:ascii="Cambria Math" w:hAnsi="Cambria Math"/>
                               </w:rPr>
-                              <m:t>(</m:t>
-                            </m:r>
-                            <m:r>
-                              <w:rPr>
-                                <w:rFonts w:ascii="Cambria Math" w:hAnsi="Cambria Math"/>
-                              </w:rPr>
-                              <m:t>2</m:t>
-                            </m:r>
-                            <m:r>
-                              <w:rPr>
-                                <w:rFonts w:ascii="Cambria Math" w:hAnsi="Cambria Math"/>
-                              </w:rPr>
-                              <m:t>)</m:t>
+                              <m:t>(2)</m:t>
                             </m:r>
                           </m:sup>
                         </m:sSubSup>
@@ -14883,13 +14747,7 @@
                               <w:rPr>
                                 <w:rFonts w:ascii="Cambria Math" w:hAnsi="Cambria Math"/>
                               </w:rPr>
-                              <m:t>(1</m:t>
-                            </m:r>
-                            <m:r>
-                              <w:rPr>
-                                <w:rFonts w:ascii="Cambria Math" w:hAnsi="Cambria Math"/>
-                              </w:rPr>
-                              <m:t>)</m:t>
+                              <m:t>(1)</m:t>
                             </m:r>
                           </m:sup>
                         </m:sSubSup>
@@ -14933,19 +14791,7 @@
                           <w:rPr>
                             <w:rFonts w:ascii="Cambria Math" w:hAnsi="Cambria Math"/>
                           </w:rPr>
-                          <m:t>(</m:t>
-                        </m:r>
-                        <m:r>
-                          <w:rPr>
-                            <w:rFonts w:ascii="Cambria Math" w:hAnsi="Cambria Math"/>
-                          </w:rPr>
-                          <m:t>1</m:t>
-                        </m:r>
-                        <m:r>
-                          <w:rPr>
-                            <w:rFonts w:ascii="Cambria Math" w:hAnsi="Cambria Math"/>
-                          </w:rPr>
-                          <m:t>)</m:t>
+                          <m:t>(1)</m:t>
                         </m:r>
                       </m:sup>
                     </m:sSubSup>
@@ -15061,22 +14907,13 @@
               <w:rPr>
                 <w:rFonts w:ascii="Cambria Math" w:hAnsi="Cambria Math"/>
               </w:rPr>
-              <m:t>(2</m:t>
-            </m:r>
-            <m:r>
-              <w:rPr>
-                <w:rFonts w:ascii="Cambria Math" w:hAnsi="Cambria Math"/>
-              </w:rPr>
-              <m:t>)</m:t>
+              <m:t>(2)</m:t>
             </m:r>
           </m:sup>
         </m:sSubSup>
       </m:oMath>
       <w:r>
-        <w:t>. Thus</w:t>
-      </w:r>
-      <w:r>
-        <w:t>,</w:t>
+        <w:t>. Thus,</w:t>
       </w:r>
       <w:r>
         <w:t xml:space="preserve"> equation 2.29</w:t>
@@ -15145,19 +14982,7 @@
                   <w:rPr>
                     <w:rFonts w:ascii="Cambria Math" w:hAnsi="Cambria Math"/>
                   </w:rPr>
-                  <m:t>(</m:t>
-                </m:r>
-                <m:r>
-                  <w:rPr>
-                    <w:rFonts w:ascii="Cambria Math" w:hAnsi="Cambria Math"/>
-                  </w:rPr>
-                  <m:t>1</m:t>
-                </m:r>
-                <m:r>
-                  <w:rPr>
-                    <w:rFonts w:ascii="Cambria Math" w:hAnsi="Cambria Math"/>
-                  </w:rPr>
-                  <m:t>)</m:t>
+                  <m:t>(1)</m:t>
                 </m:r>
               </m:sup>
             </m:sSubSup>
@@ -15213,13 +15038,7 @@
                       <w:rPr>
                         <w:rFonts w:ascii="Cambria Math" w:hAnsi="Cambria Math"/>
                       </w:rPr>
-                      <m:t>n</m:t>
-                    </m:r>
-                    <m:r>
-                      <w:rPr>
-                        <w:rFonts w:ascii="Cambria Math" w:hAnsi="Cambria Math"/>
-                      </w:rPr>
-                      <m:t>2</m:t>
+                      <m:t>n2</m:t>
                     </m:r>
                   </m:sup>
                   <m:e>
@@ -15277,19 +15096,7 @@
                               <w:rPr>
                                 <w:rFonts w:ascii="Cambria Math" w:hAnsi="Cambria Math"/>
                               </w:rPr>
-                              <m:t>(</m:t>
-                            </m:r>
-                            <m:r>
-                              <w:rPr>
-                                <w:rFonts w:ascii="Cambria Math" w:hAnsi="Cambria Math"/>
-                              </w:rPr>
-                              <m:t>2</m:t>
-                            </m:r>
-                            <m:r>
-                              <w:rPr>
-                                <w:rFonts w:ascii="Cambria Math" w:hAnsi="Cambria Math"/>
-                              </w:rPr>
-                              <m:t>)</m:t>
+                              <m:t>(2)</m:t>
                             </m:r>
                           </m:sup>
                         </m:sSubSup>
@@ -15365,19 +15172,7 @@
                       <w:rPr>
                         <w:rFonts w:ascii="Cambria Math" w:hAnsi="Cambria Math"/>
                       </w:rPr>
-                      <m:t>(</m:t>
-                    </m:r>
-                    <m:r>
-                      <w:rPr>
-                        <w:rFonts w:ascii="Cambria Math" w:hAnsi="Cambria Math"/>
-                      </w:rPr>
-                      <m:t>2</m:t>
-                    </m:r>
-                    <m:r>
-                      <w:rPr>
-                        <w:rFonts w:ascii="Cambria Math" w:hAnsi="Cambria Math"/>
-                      </w:rPr>
-                      <m:t>)</m:t>
+                      <m:t>(2)</m:t>
                     </m:r>
                   </m:sup>
                 </m:sSubSup>
@@ -15432,10 +15227,7 @@
         <w:ind w:firstLine="720"/>
       </w:pPr>
       <w:r>
-        <w:t xml:space="preserve">The value of parcel (ii) in equation 2.30 relates to the synaptic weights of neurons from the second hidden layer. </w:t>
-      </w:r>
-      <w:r>
-        <w:t xml:space="preserve">It is important to emphasize that all the weights of </w:t>
+        <w:t xml:space="preserve">The value of parcel (ii) in equation 2.30 relates to the synaptic weights of neurons from the second hidden layer. It is important to emphasize that all the weights of </w:t>
       </w:r>
       <m:oMath>
         <m:sSubSup>
@@ -15474,22 +15266,7 @@
         </m:sSubSup>
       </m:oMath>
       <w:r>
-        <w:t xml:space="preserve"> </w:t>
-      </w:r>
-      <w:r>
-        <w:t>were adjusted in the</w:t>
-      </w:r>
-      <w:r>
-        <w:t xml:space="preserve"> </w:t>
-      </w:r>
-      <w:r>
-        <w:t>previous step based on the backpropagated errors from the adjustment of the</w:t>
-      </w:r>
-      <w:r>
-        <w:t xml:space="preserve"> </w:t>
-      </w:r>
-      <w:r>
-        <w:t xml:space="preserve">weights of </w:t>
+        <w:t xml:space="preserve"> were adjusted in the previous step based on the backpropagated errors from the adjustment of the weights of </w:t>
       </w:r>
       <m:oMath>
         <m:sSubSup>
@@ -15528,10 +15305,7 @@
         </m:sSubSup>
       </m:oMath>
       <w:r>
-        <w:t>, which in turn were adjusted based on the real values of the error.</w:t>
-      </w:r>
-      <w:r>
-        <w:t xml:space="preserve"> Parcel (i) in equation 2.30 can be obtained by multiplying</w:t>
+        <w:t>, which in turn were adjusted based on the real values of the error. Parcel (i) in equation 2.30 can be obtained by multiplying</w:t>
       </w:r>
       <w:r>
         <w:t xml:space="preserve"> equations 2.1</w:t>
@@ -15596,6 +15370,7 @@
         <w:spacing w:line="480" w:lineRule="auto"/>
       </w:pPr>
       <w:r>
+        <w:lastRenderedPageBreak/>
         <w:t>Making appropriate substitutions equation 2.29 becomes</w:t>
       </w:r>
     </w:p>
@@ -16410,19 +16185,7 @@
           <w:rPr>
             <w:rFonts w:ascii="Cambria Math" w:hAnsi="Cambria Math"/>
           </w:rPr>
-          <m:t xml:space="preserve">= </m:t>
-        </m:r>
-        <m:r>
-          <w:rPr>
-            <w:rFonts w:ascii="Cambria Math" w:hAnsi="Cambria Math"/>
-          </w:rPr>
-          <m:t>ŋ</m:t>
-        </m:r>
-        <m:r>
-          <w:rPr>
-            <w:rFonts w:ascii="Cambria Math" w:hAnsi="Cambria Math"/>
-          </w:rPr>
-          <m:t xml:space="preserve">* </m:t>
+          <m:t xml:space="preserve">= ŋ* </m:t>
         </m:r>
         <m:sSubSup>
           <m:sSubSupPr>
@@ -16631,13 +16394,7 @@
                   <w:rPr>
                     <w:rFonts w:ascii="Cambria Math" w:hAnsi="Cambria Math"/>
                   </w:rPr>
-                  <m:t>n</m:t>
-                </m:r>
-                <m:r>
-                  <w:rPr>
-                    <w:rFonts w:ascii="Cambria Math" w:hAnsi="Cambria Math"/>
-                  </w:rPr>
-                  <m:t>2</m:t>
+                  <m:t>n2</m:t>
                 </m:r>
               </m:sup>
               <m:e>
@@ -16922,7 +16679,7 @@
                   <w:rPr>
                     <w:rFonts w:ascii="Cambria Math" w:hAnsi="Cambria Math"/>
                   </w:rPr>
-                  <m:t>2</m:t>
+                  <m:t>1</m:t>
                 </m:r>
               </m:e>
             </m:d>
@@ -16992,7 +16749,7 @@
                   <w:rPr>
                     <w:rFonts w:ascii="Cambria Math" w:hAnsi="Cambria Math"/>
                   </w:rPr>
-                  <m:t>2</m:t>
+                  <m:t>1</m:t>
                 </m:r>
               </m:e>
             </m:d>
@@ -17062,7 +16819,7 @@
                   <w:rPr>
                     <w:rFonts w:ascii="Cambria Math" w:hAnsi="Cambria Math"/>
                   </w:rPr>
-                  <m:t>2</m:t>
+                  <m:t>1</m:t>
                 </m:r>
               </m:e>
             </m:d>
@@ -17088,7 +16845,7 @@
               <w:rPr>
                 <w:rFonts w:ascii="Cambria Math" w:hAnsi="Cambria Math"/>
               </w:rPr>
-              <m:t>Y</m:t>
+              <m:t>X</m:t>
             </m:r>
           </m:e>
           <m:sub>
@@ -17180,12 +16937,26 @@
       <w:pPr>
         <w:spacing w:line="480" w:lineRule="auto"/>
       </w:pPr>
-      <w:bookmarkStart w:id="29" w:name="_GoBack"/>
-      <w:bookmarkEnd w:id="29"/>
-    </w:p>
-    <w:p>
-      <w:pPr>
-        <w:spacing w:line="480" w:lineRule="auto"/>
+    </w:p>
+    <w:p>
+      <w:pPr>
+        <w:spacing w:line="480" w:lineRule="auto"/>
+      </w:pPr>
+    </w:p>
+    <w:p>
+      <w:pPr>
+        <w:spacing w:line="480" w:lineRule="auto"/>
+      </w:pPr>
+    </w:p>
+    <w:p>
+      <w:pPr>
+        <w:spacing w:line="480" w:lineRule="auto"/>
+      </w:pPr>
+    </w:p>
+    <w:p>
+      <w:pPr>
+        <w:suppressAutoHyphens w:val="0"/>
+        <w:overflowPunct/>
       </w:pPr>
       <w:r>
         <w:br w:type="page"/>
@@ -19528,6 +19299,7 @@
   <w:style w:type="character" w:default="1" w:styleId="DefaultParagraphFont">
     <w:name w:val="Default Paragraph Font"/>
     <w:uiPriority w:val="1"/>
+    <w:semiHidden/>
     <w:unhideWhenUsed/>
   </w:style>
   <w:style w:type="table" w:default="1" w:styleId="TableNormal">
@@ -20190,6 +19962,7 @@
   <w:style w:type="character" w:default="1" w:styleId="DefaultParagraphFont">
     <w:name w:val="Default Paragraph Font"/>
     <w:uiPriority w:val="1"/>
+    <w:semiHidden/>
     <w:unhideWhenUsed/>
   </w:style>
   <w:style w:type="table" w:default="1" w:styleId="TableNormal">
@@ -20573,582 +20346,6 @@
 </w:styles>
 </file>
 
-<file path=word/glossary/document.xml><?xml version="1.0" encoding="utf-8"?>
-<w:glossaryDocument xmlns:wpc="http://schemas.microsoft.com/office/word/2010/wordprocessingCanvas" xmlns:mc="http://schemas.openxmlformats.org/markup-compatibility/2006" xmlns:o="urn:schemas-microsoft-com:office:office" xmlns:r="http://schemas.openxmlformats.org/officeDocument/2006/relationships" xmlns:m="http://schemas.openxmlformats.org/officeDocument/2006/math" xmlns:v="urn:schemas-microsoft-com:vml" xmlns:wp14="http://schemas.microsoft.com/office/word/2010/wordprocessingDrawing" xmlns:wp="http://schemas.openxmlformats.org/drawingml/2006/wordprocessingDrawing" xmlns:w10="urn:schemas-microsoft-com:office:word" xmlns:w="http://schemas.openxmlformats.org/wordprocessingml/2006/main" xmlns:w14="http://schemas.microsoft.com/office/word/2010/wordml" xmlns:wpg="http://schemas.microsoft.com/office/word/2010/wordprocessingGroup" xmlns:wpi="http://schemas.microsoft.com/office/word/2010/wordprocessingInk" xmlns:wne="http://schemas.microsoft.com/office/word/2006/wordml" xmlns:wps="http://schemas.microsoft.com/office/word/2010/wordprocessingShape" mc:Ignorable="w14 wp14"/>
-</file>
-
-<file path=word/glossary/fontTable.xml><?xml version="1.0" encoding="utf-8"?>
-<w:fonts xmlns:mc="http://schemas.openxmlformats.org/markup-compatibility/2006" xmlns:r="http://schemas.openxmlformats.org/officeDocument/2006/relationships" xmlns:w="http://schemas.openxmlformats.org/wordprocessingml/2006/main" xmlns:w14="http://schemas.microsoft.com/office/word/2010/wordml" mc:Ignorable="w14">
-  <w:font w:name="Liberation Serif">
-    <w:altName w:val="Times New Roman"/>
-    <w:charset w:val="00"/>
-    <w:family w:val="auto"/>
-    <w:pitch w:val="default"/>
-  </w:font>
-  <w:font w:name="Noto Serif CJK SC">
-    <w:altName w:val="Times New Roman"/>
-    <w:panose1 w:val="00000000000000000000"/>
-    <w:charset w:val="00"/>
-    <w:family w:val="roman"/>
-    <w:notTrueType/>
-    <w:pitch w:val="default"/>
-  </w:font>
-  <w:font w:name="Lohit Devanagari">
-    <w:altName w:val="Times New Roman"/>
-    <w:panose1 w:val="00000000000000000000"/>
-    <w:charset w:val="00"/>
-    <w:family w:val="roman"/>
-    <w:notTrueType/>
-    <w:pitch w:val="default"/>
-  </w:font>
-  <w:font w:name="Mangal">
-    <w:altName w:val="Courier New"/>
-    <w:panose1 w:val="00000400000000000000"/>
-    <w:charset w:val="01"/>
-    <w:family w:val="roman"/>
-    <w:notTrueType/>
-    <w:pitch w:val="variable"/>
-    <w:sig w:usb0="00002000" w:usb1="00000000" w:usb2="00000000" w:usb3="00000000" w:csb0="00000000" w:csb1="00000000"/>
-  </w:font>
-  <w:font w:name="Times New Roman">
-    <w:panose1 w:val="02020603050405020304"/>
-    <w:charset w:val="00"/>
-    <w:family w:val="roman"/>
-    <w:pitch w:val="variable"/>
-    <w:sig w:usb0="E0002EFF" w:usb1="C000785B" w:usb2="00000009" w:usb3="00000000" w:csb0="000001FF" w:csb1="00000000"/>
-  </w:font>
-  <w:font w:name="OpenSymbol">
-    <w:altName w:val="Times New Roman"/>
-    <w:panose1 w:val="00000000000000000000"/>
-    <w:charset w:val="00"/>
-    <w:family w:val="roman"/>
-    <w:notTrueType/>
-    <w:pitch w:val="default"/>
-  </w:font>
-  <w:font w:name="Liberation Mono">
-    <w:altName w:val="Times New Roman"/>
-    <w:panose1 w:val="00000000000000000000"/>
-    <w:charset w:val="00"/>
-    <w:family w:val="roman"/>
-    <w:notTrueType/>
-    <w:pitch w:val="default"/>
-  </w:font>
-  <w:font w:name="Noto Sans Mono CJK SC">
-    <w:panose1 w:val="00000000000000000000"/>
-    <w:charset w:val="00"/>
-    <w:family w:val="roman"/>
-    <w:notTrueType/>
-    <w:pitch w:val="default"/>
-  </w:font>
-  <w:font w:name="Liberation Sans">
-    <w:altName w:val="Times New Roman"/>
-    <w:panose1 w:val="00000000000000000000"/>
-    <w:charset w:val="00"/>
-    <w:family w:val="roman"/>
-    <w:notTrueType/>
-    <w:pitch w:val="default"/>
-  </w:font>
-  <w:font w:name="Noto Sans CJK SC">
-    <w:panose1 w:val="00000000000000000000"/>
-    <w:charset w:val="00"/>
-    <w:family w:val="roman"/>
-    <w:notTrueType/>
-    <w:pitch w:val="default"/>
-  </w:font>
-  <w:font w:name="Calibri Light">
-    <w:panose1 w:val="020F0302020204030204"/>
-    <w:charset w:val="00"/>
-    <w:family w:val="swiss"/>
-    <w:pitch w:val="variable"/>
-    <w:sig w:usb0="E4002EFF" w:usb1="C000247B" w:usb2="00000009" w:usb3="00000000" w:csb0="000001FF" w:csb1="00000000"/>
-  </w:font>
-  <w:font w:name="Georgia">
-    <w:panose1 w:val="02040502050405020303"/>
-    <w:charset w:val="00"/>
-    <w:family w:val="roman"/>
-    <w:pitch w:val="variable"/>
-    <w:sig w:usb0="00000287" w:usb1="00000000" w:usb2="00000000" w:usb3="00000000" w:csb0="0000009F" w:csb1="00000000"/>
-  </w:font>
-  <w:font w:name="Tahoma">
-    <w:panose1 w:val="020B0604030504040204"/>
-    <w:charset w:val="00"/>
-    <w:family w:val="swiss"/>
-    <w:pitch w:val="variable"/>
-    <w:sig w:usb0="E1002EFF" w:usb1="C000605B" w:usb2="00000029" w:usb3="00000000" w:csb0="000101FF" w:csb1="00000000"/>
-  </w:font>
-  <w:font w:name="Cambria">
-    <w:panose1 w:val="02040503050406030204"/>
-    <w:charset w:val="00"/>
-    <w:family w:val="roman"/>
-    <w:pitch w:val="variable"/>
-    <w:sig w:usb0="E00006FF" w:usb1="420024FF" w:usb2="02000000" w:usb3="00000000" w:csb0="0000019F" w:csb1="00000000"/>
-  </w:font>
-  <w:font w:name="Cambria Math">
-    <w:panose1 w:val="02040503050406030204"/>
-    <w:charset w:val="00"/>
-    <w:family w:val="roman"/>
-    <w:pitch w:val="variable"/>
-    <w:sig w:usb0="E00006FF" w:usb1="420024FF" w:usb2="02000000" w:usb3="00000000" w:csb0="0000019F" w:csb1="00000000"/>
-  </w:font>
-  <w:font w:name="sans-serif">
-    <w:altName w:val="Times New Roman"/>
-    <w:charset w:val="00"/>
-    <w:family w:val="auto"/>
-    <w:pitch w:val="default"/>
-  </w:font>
-  <w:font w:name="Calibri">
-    <w:panose1 w:val="020F0502020204030204"/>
-    <w:charset w:val="00"/>
-    <w:family w:val="swiss"/>
-    <w:pitch w:val="variable"/>
-    <w:sig w:usb0="E4002EFF" w:usb1="C000247B" w:usb2="00000009" w:usb3="00000000" w:csb0="000001FF" w:csb1="00000000"/>
-  </w:font>
-</w:fonts>
-</file>
-
-<file path=word/glossary/settings.xml><?xml version="1.0" encoding="utf-8"?>
-<w:settings xmlns:mc="http://schemas.openxmlformats.org/markup-compatibility/2006" xmlns:o="urn:schemas-microsoft-com:office:office" xmlns:r="http://schemas.openxmlformats.org/officeDocument/2006/relationships" xmlns:m="http://schemas.openxmlformats.org/officeDocument/2006/math" xmlns:v="urn:schemas-microsoft-com:vml" xmlns:w10="urn:schemas-microsoft-com:office:word" xmlns:w="http://schemas.openxmlformats.org/wordprocessingml/2006/main" xmlns:w14="http://schemas.microsoft.com/office/word/2010/wordml" xmlns:sl="http://schemas.openxmlformats.org/schemaLibrary/2006/main" mc:Ignorable="w14">
-  <w:view w:val="normal"/>
-  <w:defaultTabStop w:val="720"/>
-  <w:characterSpacingControl w:val="doNotCompress"/>
-  <w:compat>
-    <w:useFELayout/>
-    <w:compatSetting w:name="compatibilityMode" w:uri="http://schemas.microsoft.com/office/word" w:val="14"/>
-    <w:compatSetting w:name="overrideTableStyleFontSizeAndJustification" w:uri="http://schemas.microsoft.com/office/word" w:val="1"/>
-    <w:compatSetting w:name="enableOpenTypeFeatures" w:uri="http://schemas.microsoft.com/office/word" w:val="1"/>
-    <w:compatSetting w:name="doNotFlipMirrorIndents" w:uri="http://schemas.microsoft.com/office/word" w:val="1"/>
-  </w:compat>
-  <w:rsids>
-    <w:rsidRoot w:val="002A0D72"/>
-    <w:rsid w:val="000B2B95"/>
-    <w:rsid w:val="002A0D72"/>
-    <w:rsid w:val="00FA5D44"/>
-  </w:rsids>
-  <m:mathPr>
-    <m:mathFont m:val="Cambria Math"/>
-    <m:brkBin m:val="before"/>
-    <m:brkBinSub m:val="--"/>
-    <m:smallFrac m:val="0"/>
-    <m:dispDef/>
-    <m:lMargin m:val="0"/>
-    <m:rMargin m:val="0"/>
-    <m:defJc m:val="centerGroup"/>
-    <m:wrapIndent m:val="1440"/>
-    <m:intLim m:val="subSup"/>
-    <m:naryLim m:val="undOvr"/>
-  </m:mathPr>
-  <w:themeFontLang w:val="en-US"/>
-  <w:clrSchemeMapping w:bg1="light1" w:t1="dark1" w:bg2="light2" w:t2="dark2" w:accent1="accent1" w:accent2="accent2" w:accent3="accent3" w:accent4="accent4" w:accent5="accent5" w:accent6="accent6" w:hyperlink="hyperlink" w:followedHyperlink="followedHyperlink"/>
-  <w:decimalSymbol w:val="."/>
-  <w:listSeparator w:val=","/>
-</w:settings>
-</file>
-
-<file path=word/glossary/styles.xml><?xml version="1.0" encoding="utf-8"?>
-<w:styles xmlns:mc="http://schemas.openxmlformats.org/markup-compatibility/2006" xmlns:r="http://schemas.openxmlformats.org/officeDocument/2006/relationships" xmlns:w="http://schemas.openxmlformats.org/wordprocessingml/2006/main" xmlns:w14="http://schemas.microsoft.com/office/word/2010/wordml" mc:Ignorable="w14">
-  <w:docDefaults>
-    <w:rPrDefault>
-      <w:rPr>
-        <w:rFonts w:asciiTheme="minorHAnsi" w:eastAsiaTheme="minorEastAsia" w:hAnsiTheme="minorHAnsi" w:cstheme="minorBidi"/>
-        <w:sz w:val="22"/>
-        <w:szCs w:val="22"/>
-        <w:lang w:val="en-US" w:eastAsia="en-US" w:bidi="ar-SA"/>
-      </w:rPr>
-    </w:rPrDefault>
-    <w:pPrDefault>
-      <w:pPr>
-        <w:spacing w:after="200" w:line="276" w:lineRule="auto"/>
-      </w:pPr>
-    </w:pPrDefault>
-  </w:docDefaults>
-  <w:latentStyles w:defLockedState="0" w:defUIPriority="99" w:defSemiHidden="1" w:defUnhideWhenUsed="1" w:defQFormat="0" w:count="267">
-    <w:lsdException w:name="Normal" w:semiHidden="0" w:uiPriority="0" w:unhideWhenUsed="0" w:qFormat="1"/>
-    <w:lsdException w:name="heading 1" w:semiHidden="0" w:uiPriority="9" w:unhideWhenUsed="0" w:qFormat="1"/>
-    <w:lsdException w:name="heading 2" w:uiPriority="9" w:qFormat="1"/>
-    <w:lsdException w:name="heading 3" w:uiPriority="9" w:qFormat="1"/>
-    <w:lsdException w:name="heading 4" w:uiPriority="9" w:qFormat="1"/>
-    <w:lsdException w:name="heading 5" w:uiPriority="9" w:qFormat="1"/>
-    <w:lsdException w:name="heading 6" w:uiPriority="9" w:qFormat="1"/>
-    <w:lsdException w:name="heading 7" w:uiPriority="9" w:qFormat="1"/>
-    <w:lsdException w:name="heading 8" w:uiPriority="9" w:qFormat="1"/>
-    <w:lsdException w:name="heading 9" w:uiPriority="9" w:qFormat="1"/>
-    <w:lsdException w:name="toc 1" w:uiPriority="39"/>
-    <w:lsdException w:name="toc 2" w:uiPriority="39"/>
-    <w:lsdException w:name="toc 3" w:uiPriority="39"/>
-    <w:lsdException w:name="toc 4" w:uiPriority="39"/>
-    <w:lsdException w:name="toc 5" w:uiPriority="39"/>
-    <w:lsdException w:name="toc 6" w:uiPriority="39"/>
-    <w:lsdException w:name="toc 7" w:uiPriority="39"/>
-    <w:lsdException w:name="toc 8" w:uiPriority="39"/>
-    <w:lsdException w:name="toc 9" w:uiPriority="39"/>
-    <w:lsdException w:name="caption" w:uiPriority="35" w:qFormat="1"/>
-    <w:lsdException w:name="Title" w:semiHidden="0" w:uiPriority="10" w:unhideWhenUsed="0" w:qFormat="1"/>
-    <w:lsdException w:name="Default Paragraph Font" w:uiPriority="1"/>
-    <w:lsdException w:name="Subtitle" w:semiHidden="0" w:uiPriority="11" w:unhideWhenUsed="0" w:qFormat="1"/>
-    <w:lsdException w:name="Strong" w:semiHidden="0" w:uiPriority="22" w:unhideWhenUsed="0" w:qFormat="1"/>
-    <w:lsdException w:name="Emphasis" w:semiHidden="0" w:uiPriority="20" w:unhideWhenUsed="0" w:qFormat="1"/>
-    <w:lsdException w:name="Table Grid" w:semiHidden="0" w:uiPriority="59" w:unhideWhenUsed="0"/>
-    <w:lsdException w:name="Placeholder Text" w:uiPriority="0" w:unhideWhenUsed="0" w:qFormat="1"/>
-    <w:lsdException w:name="No Spacing" w:semiHidden="0" w:uiPriority="1" w:unhideWhenUsed="0" w:qFormat="1"/>
-    <w:lsdException w:name="Light Shading" w:semiHidden="0" w:uiPriority="60" w:unhideWhenUsed="0"/>
-    <w:lsdException w:name="Light List" w:semiHidden="0" w:uiPriority="61" w:unhideWhenUsed="0"/>
-    <w:lsdException w:name="Light Grid" w:semiHidden="0" w:uiPriority="62" w:unhideWhenUsed="0"/>
-    <w:lsdException w:name="Medium Shading 1" w:semiHidden="0" w:uiPriority="63" w:unhideWhenUsed="0"/>
-    <w:lsdException w:name="Medium Shading 2" w:semiHidden="0" w:uiPriority="64" w:unhideWhenUsed="0"/>
-    <w:lsdException w:name="Medium List 1" w:semiHidden="0" w:uiPriority="65" w:unhideWhenUsed="0"/>
-    <w:lsdException w:name="Medium List 2" w:semiHidden="0" w:uiPriority="66" w:unhideWhenUsed="0"/>
-    <w:lsdException w:name="Medium Grid 1" w:semiHidden="0" w:uiPriority="67" w:unhideWhenUsed="0"/>
-    <w:lsdException w:name="Medium Grid 2" w:semiHidden="0" w:uiPriority="68" w:unhideWhenUsed="0"/>
-    <w:lsdException w:name="Medium Grid 3" w:semiHidden="0" w:uiPriority="69" w:unhideWhenUsed="0"/>
-    <w:lsdException w:name="Dark List" w:semiHidden="0" w:uiPriority="70" w:unhideWhenUsed="0"/>
-    <w:lsdException w:name="Colorful Shading" w:semiHidden="0" w:uiPriority="71" w:unhideWhenUsed="0"/>
-    <w:lsdException w:name="Colorful List" w:semiHidden="0" w:uiPriority="72" w:unhideWhenUsed="0"/>
-    <w:lsdException w:name="Colorful Grid" w:semiHidden="0" w:uiPriority="73" w:unhideWhenUsed="0"/>
-    <w:lsdException w:name="Light Shading Accent 1" w:semiHidden="0" w:uiPriority="60" w:unhideWhenUsed="0"/>
-    <w:lsdException w:name="Light List Accent 1" w:semiHidden="0" w:uiPriority="61" w:unhideWhenUsed="0"/>
-    <w:lsdException w:name="Light Grid Accent 1" w:semiHidden="0" w:uiPriority="62" w:unhideWhenUsed="0"/>
-    <w:lsdException w:name="Medium Shading 1 Accent 1" w:semiHidden="0" w:uiPriority="63" w:unhideWhenUsed="0"/>
-    <w:lsdException w:name="Medium Shading 2 Accent 1" w:semiHidden="0" w:uiPriority="64" w:unhideWhenUsed="0"/>
-    <w:lsdException w:name="Medium List 1 Accent 1" w:semiHidden="0" w:uiPriority="65" w:unhideWhenUsed="0"/>
-    <w:lsdException w:name="Revision" w:unhideWhenUsed="0"/>
-    <w:lsdException w:name="List Paragraph" w:semiHidden="0" w:uiPriority="34" w:unhideWhenUsed="0" w:qFormat="1"/>
-    <w:lsdException w:name="Quote" w:semiHidden="0" w:uiPriority="29" w:unhideWhenUsed="0" w:qFormat="1"/>
-    <w:lsdException w:name="Intense Quote" w:semiHidden="0" w:uiPriority="30" w:unhideWhenUsed="0" w:qFormat="1"/>
-    <w:lsdException w:name="Medium List 2 Accent 1" w:semiHidden="0" w:uiPriority="66" w:unhideWhenUsed="0"/>
-    <w:lsdException w:name="Medium Grid 1 Accent 1" w:semiHidden="0" w:uiPriority="67" w:unhideWhenUsed="0"/>
-    <w:lsdException w:name="Medium Grid 2 Accent 1" w:semiHidden="0" w:uiPriority="68" w:unhideWhenUsed="0"/>
-    <w:lsdException w:name="Medium Grid 3 Accent 1" w:semiHidden="0" w:uiPriority="69" w:unhideWhenUsed="0"/>
-    <w:lsdException w:name="Dark List Accent 1" w:semiHidden="0" w:uiPriority="70" w:unhideWhenUsed="0"/>
-    <w:lsdException w:name="Colorful Shading Accent 1" w:semiHidden="0" w:uiPriority="71" w:unhideWhenUsed="0"/>
-    <w:lsdException w:name="Colorful List Accent 1" w:semiHidden="0" w:uiPriority="72" w:unhideWhenUsed="0"/>
-    <w:lsdException w:name="Colorful Grid Accent 1" w:semiHidden="0" w:uiPriority="73" w:unhideWhenUsed="0"/>
-    <w:lsdException w:name="Light Shading Accent 2" w:semiHidden="0" w:uiPriority="60" w:unhideWhenUsed="0"/>
-    <w:lsdException w:name="Light List Accent 2" w:semiHidden="0" w:uiPriority="61" w:unhideWhenUsed="0"/>
-    <w:lsdException w:name="Light Grid Accent 2" w:semiHidden="0" w:uiPriority="62" w:unhideWhenUsed="0"/>
-    <w:lsdException w:name="Medium Shading 1 Accent 2" w:semiHidden="0" w:uiPriority="63" w:unhideWhenUsed="0"/>
-    <w:lsdException w:name="Medium Shading 2 Accent 2" w:semiHidden="0" w:uiPriority="64" w:unhideWhenUsed="0"/>
-    <w:lsdException w:name="Medium List 1 Accent 2" w:semiHidden="0" w:uiPriority="65" w:unhideWhenUsed="0"/>
-    <w:lsdException w:name="Medium List 2 Accent 2" w:semiHidden="0" w:uiPriority="66" w:unhideWhenUsed="0"/>
-    <w:lsdException w:name="Medium Grid 1 Accent 2" w:semiHidden="0" w:uiPriority="67" w:unhideWhenUsed="0"/>
-    <w:lsdException w:name="Medium Grid 2 Accent 2" w:semiHidden="0" w:uiPriority="68" w:unhideWhenUsed="0"/>
-    <w:lsdException w:name="Medium Grid 3 Accent 2" w:semiHidden="0" w:uiPriority="69" w:unhideWhenUsed="0"/>
-    <w:lsdException w:name="Dark List Accent 2" w:semiHidden="0" w:uiPriority="70" w:unhideWhenUsed="0"/>
-    <w:lsdException w:name="Colorful Shading Accent 2" w:semiHidden="0" w:uiPriority="71" w:unhideWhenUsed="0"/>
-    <w:lsdException w:name="Colorful List Accent 2" w:semiHidden="0" w:uiPriority="72" w:unhideWhenUsed="0"/>
-    <w:lsdException w:name="Colorful Grid Accent 2" w:semiHidden="0" w:uiPriority="73" w:unhideWhenUsed="0"/>
-    <w:lsdException w:name="Light Shading Accent 3" w:semiHidden="0" w:uiPriority="60" w:unhideWhenUsed="0"/>
-    <w:lsdException w:name="Light List Accent 3" w:semiHidden="0" w:uiPriority="61" w:unhideWhenUsed="0"/>
-    <w:lsdException w:name="Light Grid Accent 3" w:semiHidden="0" w:uiPriority="62" w:unhideWhenUsed="0"/>
-    <w:lsdException w:name="Medium Shading 1 Accent 3" w:semiHidden="0" w:uiPriority="63" w:unhideWhenUsed="0"/>
-    <w:lsdException w:name="Medium Shading 2 Accent 3" w:semiHidden="0" w:uiPriority="64" w:unhideWhenUsed="0"/>
-    <w:lsdException w:name="Medium List 1 Accent 3" w:semiHidden="0" w:uiPriority="65" w:unhideWhenUsed="0"/>
-    <w:lsdException w:name="Medium List 2 Accent 3" w:semiHidden="0" w:uiPriority="66" w:unhideWhenUsed="0"/>
-    <w:lsdException w:name="Medium Grid 1 Accent 3" w:semiHidden="0" w:uiPriority="67" w:unhideWhenUsed="0"/>
-    <w:lsdException w:name="Medium Grid 2 Accent 3" w:semiHidden="0" w:uiPriority="68" w:unhideWhenUsed="0"/>
-    <w:lsdException w:name="Medium Grid 3 Accent 3" w:semiHidden="0" w:uiPriority="69" w:unhideWhenUsed="0"/>
-    <w:lsdException w:name="Dark List Accent 3" w:semiHidden="0" w:uiPriority="70" w:unhideWhenUsed="0"/>
-    <w:lsdException w:name="Colorful Shading Accent 3" w:semiHidden="0" w:uiPriority="71" w:unhideWhenUsed="0"/>
-    <w:lsdException w:name="Colorful List Accent 3" w:semiHidden="0" w:uiPriority="72" w:unhideWhenUsed="0"/>
-    <w:lsdException w:name="Colorful Grid Accent 3" w:semiHidden="0" w:uiPriority="73" w:unhideWhenUsed="0"/>
-    <w:lsdException w:name="Light Shading Accent 4" w:semiHidden="0" w:uiPriority="60" w:unhideWhenUsed="0"/>
-    <w:lsdException w:name="Light List Accent 4" w:semiHidden="0" w:uiPriority="61" w:unhideWhenUsed="0"/>
-    <w:lsdException w:name="Light Grid Accent 4" w:semiHidden="0" w:uiPriority="62" w:unhideWhenUsed="0"/>
-    <w:lsdException w:name="Medium Shading 1 Accent 4" w:semiHidden="0" w:uiPriority="63" w:unhideWhenUsed="0"/>
-    <w:lsdException w:name="Medium Shading 2 Accent 4" w:semiHidden="0" w:uiPriority="64" w:unhideWhenUsed="0"/>
-    <w:lsdException w:name="Medium List 1 Accent 4" w:semiHidden="0" w:uiPriority="65" w:unhideWhenUsed="0"/>
-    <w:lsdException w:name="Medium List 2 Accent 4" w:semiHidden="0" w:uiPriority="66" w:unhideWhenUsed="0"/>
-    <w:lsdException w:name="Medium Grid 1 Accent 4" w:semiHidden="0" w:uiPriority="67" w:unhideWhenUsed="0"/>
-    <w:lsdException w:name="Medium Grid 2 Accent 4" w:semiHidden="0" w:uiPriority="68" w:unhideWhenUsed="0"/>
-    <w:lsdException w:name="Medium Grid 3 Accent 4" w:semiHidden="0" w:uiPriority="69" w:unhideWhenUsed="0"/>
-    <w:lsdException w:name="Dark List Accent 4" w:semiHidden="0" w:uiPriority="70" w:unhideWhenUsed="0"/>
-    <w:lsdException w:name="Colorful Shading Accent 4" w:semiHidden="0" w:uiPriority="71" w:unhideWhenUsed="0"/>
-    <w:lsdException w:name="Colorful List Accent 4" w:semiHidden="0" w:uiPriority="72" w:unhideWhenUsed="0"/>
-    <w:lsdException w:name="Colorful Grid Accent 4" w:semiHidden="0" w:uiPriority="73" w:unhideWhenUsed="0"/>
-    <w:lsdException w:name="Light Shading Accent 5" w:semiHidden="0" w:uiPriority="60" w:unhideWhenUsed="0"/>
-    <w:lsdException w:name="Light List Accent 5" w:semiHidden="0" w:uiPriority="61" w:unhideWhenUsed="0"/>
-    <w:lsdException w:name="Light Grid Accent 5" w:semiHidden="0" w:uiPriority="62" w:unhideWhenUsed="0"/>
-    <w:lsdException w:name="Medium Shading 1 Accent 5" w:semiHidden="0" w:uiPriority="63" w:unhideWhenUsed="0"/>
-    <w:lsdException w:name="Medium Shading 2 Accent 5" w:semiHidden="0" w:uiPriority="64" w:unhideWhenUsed="0"/>
-    <w:lsdException w:name="Medium List 1 Accent 5" w:semiHidden="0" w:uiPriority="65" w:unhideWhenUsed="0"/>
-    <w:lsdException w:name="Medium List 2 Accent 5" w:semiHidden="0" w:uiPriority="66" w:unhideWhenUsed="0"/>
-    <w:lsdException w:name="Medium Grid 1 Accent 5" w:semiHidden="0" w:uiPriority="67" w:unhideWhenUsed="0"/>
-    <w:lsdException w:name="Medium Grid 2 Accent 5" w:semiHidden="0" w:uiPriority="68" w:unhideWhenUsed="0"/>
-    <w:lsdException w:name="Medium Grid 3 Accent 5" w:semiHidden="0" w:uiPriority="69" w:unhideWhenUsed="0"/>
-    <w:lsdException w:name="Dark List Accent 5" w:semiHidden="0" w:uiPriority="70" w:unhideWhenUsed="0"/>
-    <w:lsdException w:name="Colorful Shading Accent 5" w:semiHidden="0" w:uiPriority="71" w:unhideWhenUsed="0"/>
-    <w:lsdException w:name="Colorful List Accent 5" w:semiHidden="0" w:uiPriority="72" w:unhideWhenUsed="0"/>
-    <w:lsdException w:name="Colorful Grid Accent 5" w:semiHidden="0" w:uiPriority="73" w:unhideWhenUsed="0"/>
-    <w:lsdException w:name="Light Shading Accent 6" w:semiHidden="0" w:uiPriority="60" w:unhideWhenUsed="0"/>
-    <w:lsdException w:name="Light List Accent 6" w:semiHidden="0" w:uiPriority="61" w:unhideWhenUsed="0"/>
-    <w:lsdException w:name="Light Grid Accent 6" w:semiHidden="0" w:uiPriority="62" w:unhideWhenUsed="0"/>
-    <w:lsdException w:name="Medium Shading 1 Accent 6" w:semiHidden="0" w:uiPriority="63" w:unhideWhenUsed="0"/>
-    <w:lsdException w:name="Medium Shading 2 Accent 6" w:semiHidden="0" w:uiPriority="64" w:unhideWhenUsed="0"/>
-    <w:lsdException w:name="Medium List 1 Accent 6" w:semiHidden="0" w:uiPriority="65" w:unhideWhenUsed="0"/>
-    <w:lsdException w:name="Medium List 2 Accent 6" w:semiHidden="0" w:uiPriority="66" w:unhideWhenUsed="0"/>
-    <w:lsdException w:name="Medium Grid 1 Accent 6" w:semiHidden="0" w:uiPriority="67" w:unhideWhenUsed="0"/>
-    <w:lsdException w:name="Medium Grid 2 Accent 6" w:semiHidden="0" w:uiPriority="68" w:unhideWhenUsed="0"/>
-    <w:lsdException w:name="Medium Grid 3 Accent 6" w:semiHidden="0" w:uiPriority="69" w:unhideWhenUsed="0"/>
-    <w:lsdException w:name="Dark List Accent 6" w:semiHidden="0" w:uiPriority="70" w:unhideWhenUsed="0"/>
-    <w:lsdException w:name="Colorful Shading Accent 6" w:semiHidden="0" w:uiPriority="71" w:unhideWhenUsed="0"/>
-    <w:lsdException w:name="Colorful List Accent 6" w:semiHidden="0" w:uiPriority="72" w:unhideWhenUsed="0"/>
-    <w:lsdException w:name="Colorful Grid Accent 6" w:semiHidden="0" w:uiPriority="73" w:unhideWhenUsed="0"/>
-    <w:lsdException w:name="Subtle Emphasis" w:semiHidden="0" w:uiPriority="19" w:unhideWhenUsed="0" w:qFormat="1"/>
-    <w:lsdException w:name="Intense Emphasis" w:semiHidden="0" w:uiPriority="21" w:unhideWhenUsed="0" w:qFormat="1"/>
-    <w:lsdException w:name="Subtle Reference" w:semiHidden="0" w:uiPriority="31" w:unhideWhenUsed="0" w:qFormat="1"/>
-    <w:lsdException w:name="Intense Reference" w:semiHidden="0" w:uiPriority="32" w:unhideWhenUsed="0" w:qFormat="1"/>
-    <w:lsdException w:name="Book Title" w:semiHidden="0" w:uiPriority="33" w:unhideWhenUsed="0" w:qFormat="1"/>
-    <w:lsdException w:name="Bibliography" w:uiPriority="37"/>
-    <w:lsdException w:name="TOC Heading" w:uiPriority="39" w:qFormat="1"/>
-  </w:latentStyles>
-  <w:style w:type="paragraph" w:default="1" w:styleId="Normal">
-    <w:name w:val="Normal"/>
-    <w:qFormat/>
-  </w:style>
-  <w:style w:type="character" w:default="1" w:styleId="DefaultParagraphFont">
-    <w:name w:val="Default Paragraph Font"/>
-    <w:uiPriority w:val="1"/>
-    <w:semiHidden/>
-    <w:unhideWhenUsed/>
-  </w:style>
-  <w:style w:type="table" w:default="1" w:styleId="TableNormal">
-    <w:name w:val="Normal Table"/>
-    <w:uiPriority w:val="99"/>
-    <w:semiHidden/>
-    <w:unhideWhenUsed/>
-    <w:tblPr>
-      <w:tblInd w:w="0" w:type="dxa"/>
-      <w:tblCellMar>
-        <w:top w:w="0" w:type="dxa"/>
-        <w:left w:w="108" w:type="dxa"/>
-        <w:bottom w:w="0" w:type="dxa"/>
-        <w:right w:w="108" w:type="dxa"/>
-      </w:tblCellMar>
-    </w:tblPr>
-  </w:style>
-  <w:style w:type="numbering" w:default="1" w:styleId="NoList">
-    <w:name w:val="No List"/>
-    <w:uiPriority w:val="99"/>
-    <w:semiHidden/>
-    <w:unhideWhenUsed/>
-  </w:style>
-  <w:style w:type="character" w:styleId="PlaceholderText">
-    <w:name w:val="Placeholder Text"/>
-    <w:basedOn w:val="DefaultParagraphFont"/>
-    <w:qFormat/>
-    <w:rsid w:val="00FA5D44"/>
-    <w:rPr>
-      <w:color w:val="808080"/>
-    </w:rPr>
-  </w:style>
-</w:styles>
-</file>
-
-<file path=word/glossary/stylesWithEffects.xml><?xml version="1.0" encoding="utf-8"?>
-<w:styles xmlns:wpc="http://schemas.microsoft.com/office/word/2010/wordprocessingCanvas" xmlns:mc="http://schemas.openxmlformats.org/markup-compatibility/2006" xmlns:o="urn:schemas-microsoft-com:office:office" xmlns:r="http://schemas.openxmlformats.org/officeDocument/2006/relationships" xmlns:m="http://schemas.openxmlformats.org/officeDocument/2006/math" xmlns:v="urn:schemas-microsoft-com:vml" xmlns:wp14="http://schemas.microsoft.com/office/word/2010/wordprocessingDrawing" xmlns:wp="http://schemas.openxmlformats.org/drawingml/2006/wordprocessingDrawing" xmlns:w10="urn:schemas-microsoft-com:office:word" xmlns:w="http://schemas.openxmlformats.org/wordprocessingml/2006/main" xmlns:w14="http://schemas.microsoft.com/office/word/2010/wordml" xmlns:wpg="http://schemas.microsoft.com/office/word/2010/wordprocessingGroup" xmlns:wpi="http://schemas.microsoft.com/office/word/2010/wordprocessingInk" xmlns:wne="http://schemas.microsoft.com/office/word/2006/wordml" xmlns:wps="http://schemas.microsoft.com/office/word/2010/wordprocessingShape" mc:Ignorable="w14 wp14">
-  <w:docDefaults>
-    <w:rPrDefault>
-      <w:rPr>
-        <w:rFonts w:asciiTheme="minorHAnsi" w:eastAsiaTheme="minorEastAsia" w:hAnsiTheme="minorHAnsi" w:cstheme="minorBidi"/>
-        <w:sz w:val="22"/>
-        <w:szCs w:val="22"/>
-        <w:lang w:val="en-US" w:eastAsia="en-US" w:bidi="ar-SA"/>
-      </w:rPr>
-    </w:rPrDefault>
-    <w:pPrDefault>
-      <w:pPr>
-        <w:spacing w:after="200" w:line="276" w:lineRule="auto"/>
-      </w:pPr>
-    </w:pPrDefault>
-  </w:docDefaults>
-  <w:latentStyles w:defLockedState="0" w:defUIPriority="99" w:defSemiHidden="1" w:defUnhideWhenUsed="1" w:defQFormat="0" w:count="267">
-    <w:lsdException w:name="Normal" w:semiHidden="0" w:uiPriority="0" w:unhideWhenUsed="0" w:qFormat="1"/>
-    <w:lsdException w:name="heading 1" w:semiHidden="0" w:uiPriority="9" w:unhideWhenUsed="0" w:qFormat="1"/>
-    <w:lsdException w:name="heading 2" w:uiPriority="9" w:qFormat="1"/>
-    <w:lsdException w:name="heading 3" w:uiPriority="9" w:qFormat="1"/>
-    <w:lsdException w:name="heading 4" w:uiPriority="9" w:qFormat="1"/>
-    <w:lsdException w:name="heading 5" w:uiPriority="9" w:qFormat="1"/>
-    <w:lsdException w:name="heading 6" w:uiPriority="9" w:qFormat="1"/>
-    <w:lsdException w:name="heading 7" w:uiPriority="9" w:qFormat="1"/>
-    <w:lsdException w:name="heading 8" w:uiPriority="9" w:qFormat="1"/>
-    <w:lsdException w:name="heading 9" w:uiPriority="9" w:qFormat="1"/>
-    <w:lsdException w:name="toc 1" w:uiPriority="39"/>
-    <w:lsdException w:name="toc 2" w:uiPriority="39"/>
-    <w:lsdException w:name="toc 3" w:uiPriority="39"/>
-    <w:lsdException w:name="toc 4" w:uiPriority="39"/>
-    <w:lsdException w:name="toc 5" w:uiPriority="39"/>
-    <w:lsdException w:name="toc 6" w:uiPriority="39"/>
-    <w:lsdException w:name="toc 7" w:uiPriority="39"/>
-    <w:lsdException w:name="toc 8" w:uiPriority="39"/>
-    <w:lsdException w:name="toc 9" w:uiPriority="39"/>
-    <w:lsdException w:name="caption" w:uiPriority="35" w:qFormat="1"/>
-    <w:lsdException w:name="Title" w:semiHidden="0" w:uiPriority="10" w:unhideWhenUsed="0" w:qFormat="1"/>
-    <w:lsdException w:name="Default Paragraph Font" w:uiPriority="1"/>
-    <w:lsdException w:name="Subtitle" w:semiHidden="0" w:uiPriority="11" w:unhideWhenUsed="0" w:qFormat="1"/>
-    <w:lsdException w:name="Strong" w:semiHidden="0" w:uiPriority="22" w:unhideWhenUsed="0" w:qFormat="1"/>
-    <w:lsdException w:name="Emphasis" w:semiHidden="0" w:uiPriority="20" w:unhideWhenUsed="0" w:qFormat="1"/>
-    <w:lsdException w:name="Table Grid" w:semiHidden="0" w:uiPriority="59" w:unhideWhenUsed="0"/>
-    <w:lsdException w:name="Placeholder Text" w:uiPriority="0" w:unhideWhenUsed="0" w:qFormat="1"/>
-    <w:lsdException w:name="No Spacing" w:semiHidden="0" w:uiPriority="1" w:unhideWhenUsed="0" w:qFormat="1"/>
-    <w:lsdException w:name="Light Shading" w:semiHidden="0" w:uiPriority="60" w:unhideWhenUsed="0"/>
-    <w:lsdException w:name="Light List" w:semiHidden="0" w:uiPriority="61" w:unhideWhenUsed="0"/>
-    <w:lsdException w:name="Light Grid" w:semiHidden="0" w:uiPriority="62" w:unhideWhenUsed="0"/>
-    <w:lsdException w:name="Medium Shading 1" w:semiHidden="0" w:uiPriority="63" w:unhideWhenUsed="0"/>
-    <w:lsdException w:name="Medium Shading 2" w:semiHidden="0" w:uiPriority="64" w:unhideWhenUsed="0"/>
-    <w:lsdException w:name="Medium List 1" w:semiHidden="0" w:uiPriority="65" w:unhideWhenUsed="0"/>
-    <w:lsdException w:name="Medium List 2" w:semiHidden="0" w:uiPriority="66" w:unhideWhenUsed="0"/>
-    <w:lsdException w:name="Medium Grid 1" w:semiHidden="0" w:uiPriority="67" w:unhideWhenUsed="0"/>
-    <w:lsdException w:name="Medium Grid 2" w:semiHidden="0" w:uiPriority="68" w:unhideWhenUsed="0"/>
-    <w:lsdException w:name="Medium Grid 3" w:semiHidden="0" w:uiPriority="69" w:unhideWhenUsed="0"/>
-    <w:lsdException w:name="Dark List" w:semiHidden="0" w:uiPriority="70" w:unhideWhenUsed="0"/>
-    <w:lsdException w:name="Colorful Shading" w:semiHidden="0" w:uiPriority="71" w:unhideWhenUsed="0"/>
-    <w:lsdException w:name="Colorful List" w:semiHidden="0" w:uiPriority="72" w:unhideWhenUsed="0"/>
-    <w:lsdException w:name="Colorful Grid" w:semiHidden="0" w:uiPriority="73" w:unhideWhenUsed="0"/>
-    <w:lsdException w:name="Light Shading Accent 1" w:semiHidden="0" w:uiPriority="60" w:unhideWhenUsed="0"/>
-    <w:lsdException w:name="Light List Accent 1" w:semiHidden="0" w:uiPriority="61" w:unhideWhenUsed="0"/>
-    <w:lsdException w:name="Light Grid Accent 1" w:semiHidden="0" w:uiPriority="62" w:unhideWhenUsed="0"/>
-    <w:lsdException w:name="Medium Shading 1 Accent 1" w:semiHidden="0" w:uiPriority="63" w:unhideWhenUsed="0"/>
-    <w:lsdException w:name="Medium Shading 2 Accent 1" w:semiHidden="0" w:uiPriority="64" w:unhideWhenUsed="0"/>
-    <w:lsdException w:name="Medium List 1 Accent 1" w:semiHidden="0" w:uiPriority="65" w:unhideWhenUsed="0"/>
-    <w:lsdException w:name="Revision" w:unhideWhenUsed="0"/>
-    <w:lsdException w:name="List Paragraph" w:semiHidden="0" w:uiPriority="34" w:unhideWhenUsed="0" w:qFormat="1"/>
-    <w:lsdException w:name="Quote" w:semiHidden="0" w:uiPriority="29" w:unhideWhenUsed="0" w:qFormat="1"/>
-    <w:lsdException w:name="Intense Quote" w:semiHidden="0" w:uiPriority="30" w:unhideWhenUsed="0" w:qFormat="1"/>
-    <w:lsdException w:name="Medium List 2 Accent 1" w:semiHidden="0" w:uiPriority="66" w:unhideWhenUsed="0"/>
-    <w:lsdException w:name="Medium Grid 1 Accent 1" w:semiHidden="0" w:uiPriority="67" w:unhideWhenUsed="0"/>
-    <w:lsdException w:name="Medium Grid 2 Accent 1" w:semiHidden="0" w:uiPriority="68" w:unhideWhenUsed="0"/>
-    <w:lsdException w:name="Medium Grid 3 Accent 1" w:semiHidden="0" w:uiPriority="69" w:unhideWhenUsed="0"/>
-    <w:lsdException w:name="Dark List Accent 1" w:semiHidden="0" w:uiPriority="70" w:unhideWhenUsed="0"/>
-    <w:lsdException w:name="Colorful Shading Accent 1" w:semiHidden="0" w:uiPriority="71" w:unhideWhenUsed="0"/>
-    <w:lsdException w:name="Colorful List Accent 1" w:semiHidden="0" w:uiPriority="72" w:unhideWhenUsed="0"/>
-    <w:lsdException w:name="Colorful Grid Accent 1" w:semiHidden="0" w:uiPriority="73" w:unhideWhenUsed="0"/>
-    <w:lsdException w:name="Light Shading Accent 2" w:semiHidden="0" w:uiPriority="60" w:unhideWhenUsed="0"/>
-    <w:lsdException w:name="Light List Accent 2" w:semiHidden="0" w:uiPriority="61" w:unhideWhenUsed="0"/>
-    <w:lsdException w:name="Light Grid Accent 2" w:semiHidden="0" w:uiPriority="62" w:unhideWhenUsed="0"/>
-    <w:lsdException w:name="Medium Shading 1 Accent 2" w:semiHidden="0" w:uiPriority="63" w:unhideWhenUsed="0"/>
-    <w:lsdException w:name="Medium Shading 2 Accent 2" w:semiHidden="0" w:uiPriority="64" w:unhideWhenUsed="0"/>
-    <w:lsdException w:name="Medium List 1 Accent 2" w:semiHidden="0" w:uiPriority="65" w:unhideWhenUsed="0"/>
-    <w:lsdException w:name="Medium List 2 Accent 2" w:semiHidden="0" w:uiPriority="66" w:unhideWhenUsed="0"/>
-    <w:lsdException w:name="Medium Grid 1 Accent 2" w:semiHidden="0" w:uiPriority="67" w:unhideWhenUsed="0"/>
-    <w:lsdException w:name="Medium Grid 2 Accent 2" w:semiHidden="0" w:uiPriority="68" w:unhideWhenUsed="0"/>
-    <w:lsdException w:name="Medium Grid 3 Accent 2" w:semiHidden="0" w:uiPriority="69" w:unhideWhenUsed="0"/>
-    <w:lsdException w:name="Dark List Accent 2" w:semiHidden="0" w:uiPriority="70" w:unhideWhenUsed="0"/>
-    <w:lsdException w:name="Colorful Shading Accent 2" w:semiHidden="0" w:uiPriority="71" w:unhideWhenUsed="0"/>
-    <w:lsdException w:name="Colorful List Accent 2" w:semiHidden="0" w:uiPriority="72" w:unhideWhenUsed="0"/>
-    <w:lsdException w:name="Colorful Grid Accent 2" w:semiHidden="0" w:uiPriority="73" w:unhideWhenUsed="0"/>
-    <w:lsdException w:name="Light Shading Accent 3" w:semiHidden="0" w:uiPriority="60" w:unhideWhenUsed="0"/>
-    <w:lsdException w:name="Light List Accent 3" w:semiHidden="0" w:uiPriority="61" w:unhideWhenUsed="0"/>
-    <w:lsdException w:name="Light Grid Accent 3" w:semiHidden="0" w:uiPriority="62" w:unhideWhenUsed="0"/>
-    <w:lsdException w:name="Medium Shading 1 Accent 3" w:semiHidden="0" w:uiPriority="63" w:unhideWhenUsed="0"/>
-    <w:lsdException w:name="Medium Shading 2 Accent 3" w:semiHidden="0" w:uiPriority="64" w:unhideWhenUsed="0"/>
-    <w:lsdException w:name="Medium List 1 Accent 3" w:semiHidden="0" w:uiPriority="65" w:unhideWhenUsed="0"/>
-    <w:lsdException w:name="Medium List 2 Accent 3" w:semiHidden="0" w:uiPriority="66" w:unhideWhenUsed="0"/>
-    <w:lsdException w:name="Medium Grid 1 Accent 3" w:semiHidden="0" w:uiPriority="67" w:unhideWhenUsed="0"/>
-    <w:lsdException w:name="Medium Grid 2 Accent 3" w:semiHidden="0" w:uiPriority="68" w:unhideWhenUsed="0"/>
-    <w:lsdException w:name="Medium Grid 3 Accent 3" w:semiHidden="0" w:uiPriority="69" w:unhideWhenUsed="0"/>
-    <w:lsdException w:name="Dark List Accent 3" w:semiHidden="0" w:uiPriority="70" w:unhideWhenUsed="0"/>
-    <w:lsdException w:name="Colorful Shading Accent 3" w:semiHidden="0" w:uiPriority="71" w:unhideWhenUsed="0"/>
-    <w:lsdException w:name="Colorful List Accent 3" w:semiHidden="0" w:uiPriority="72" w:unhideWhenUsed="0"/>
-    <w:lsdException w:name="Colorful Grid Accent 3" w:semiHidden="0" w:uiPriority="73" w:unhideWhenUsed="0"/>
-    <w:lsdException w:name="Light Shading Accent 4" w:semiHidden="0" w:uiPriority="60" w:unhideWhenUsed="0"/>
-    <w:lsdException w:name="Light List Accent 4" w:semiHidden="0" w:uiPriority="61" w:unhideWhenUsed="0"/>
-    <w:lsdException w:name="Light Grid Accent 4" w:semiHidden="0" w:uiPriority="62" w:unhideWhenUsed="0"/>
-    <w:lsdException w:name="Medium Shading 1 Accent 4" w:semiHidden="0" w:uiPriority="63" w:unhideWhenUsed="0"/>
-    <w:lsdException w:name="Medium Shading 2 Accent 4" w:semiHidden="0" w:uiPriority="64" w:unhideWhenUsed="0"/>
-    <w:lsdException w:name="Medium List 1 Accent 4" w:semiHidden="0" w:uiPriority="65" w:unhideWhenUsed="0"/>
-    <w:lsdException w:name="Medium List 2 Accent 4" w:semiHidden="0" w:uiPriority="66" w:unhideWhenUsed="0"/>
-    <w:lsdException w:name="Medium Grid 1 Accent 4" w:semiHidden="0" w:uiPriority="67" w:unhideWhenUsed="0"/>
-    <w:lsdException w:name="Medium Grid 2 Accent 4" w:semiHidden="0" w:uiPriority="68" w:unhideWhenUsed="0"/>
-    <w:lsdException w:name="Medium Grid 3 Accent 4" w:semiHidden="0" w:uiPriority="69" w:unhideWhenUsed="0"/>
-    <w:lsdException w:name="Dark List Accent 4" w:semiHidden="0" w:uiPriority="70" w:unhideWhenUsed="0"/>
-    <w:lsdException w:name="Colorful Shading Accent 4" w:semiHidden="0" w:uiPriority="71" w:unhideWhenUsed="0"/>
-    <w:lsdException w:name="Colorful List Accent 4" w:semiHidden="0" w:uiPriority="72" w:unhideWhenUsed="0"/>
-    <w:lsdException w:name="Colorful Grid Accent 4" w:semiHidden="0" w:uiPriority="73" w:unhideWhenUsed="0"/>
-    <w:lsdException w:name="Light Shading Accent 5" w:semiHidden="0" w:uiPriority="60" w:unhideWhenUsed="0"/>
-    <w:lsdException w:name="Light List Accent 5" w:semiHidden="0" w:uiPriority="61" w:unhideWhenUsed="0"/>
-    <w:lsdException w:name="Light Grid Accent 5" w:semiHidden="0" w:uiPriority="62" w:unhideWhenUsed="0"/>
-    <w:lsdException w:name="Medium Shading 1 Accent 5" w:semiHidden="0" w:uiPriority="63" w:unhideWhenUsed="0"/>
-    <w:lsdException w:name="Medium Shading 2 Accent 5" w:semiHidden="0" w:uiPriority="64" w:unhideWhenUsed="0"/>
-    <w:lsdException w:name="Medium List 1 Accent 5" w:semiHidden="0" w:uiPriority="65" w:unhideWhenUsed="0"/>
-    <w:lsdException w:name="Medium List 2 Accent 5" w:semiHidden="0" w:uiPriority="66" w:unhideWhenUsed="0"/>
-    <w:lsdException w:name="Medium Grid 1 Accent 5" w:semiHidden="0" w:uiPriority="67" w:unhideWhenUsed="0"/>
-    <w:lsdException w:name="Medium Grid 2 Accent 5" w:semiHidden="0" w:uiPriority="68" w:unhideWhenUsed="0"/>
-    <w:lsdException w:name="Medium Grid 3 Accent 5" w:semiHidden="0" w:uiPriority="69" w:unhideWhenUsed="0"/>
-    <w:lsdException w:name="Dark List Accent 5" w:semiHidden="0" w:uiPriority="70" w:unhideWhenUsed="0"/>
-    <w:lsdException w:name="Colorful Shading Accent 5" w:semiHidden="0" w:uiPriority="71" w:unhideWhenUsed="0"/>
-    <w:lsdException w:name="Colorful List Accent 5" w:semiHidden="0" w:uiPriority="72" w:unhideWhenUsed="0"/>
-    <w:lsdException w:name="Colorful Grid Accent 5" w:semiHidden="0" w:uiPriority="73" w:unhideWhenUsed="0"/>
-    <w:lsdException w:name="Light Shading Accent 6" w:semiHidden="0" w:uiPriority="60" w:unhideWhenUsed="0"/>
-    <w:lsdException w:name="Light List Accent 6" w:semiHidden="0" w:uiPriority="61" w:unhideWhenUsed="0"/>
-    <w:lsdException w:name="Light Grid Accent 6" w:semiHidden="0" w:uiPriority="62" w:unhideWhenUsed="0"/>
-    <w:lsdException w:name="Medium Shading 1 Accent 6" w:semiHidden="0" w:uiPriority="63" w:unhideWhenUsed="0"/>
-    <w:lsdException w:name="Medium Shading 2 Accent 6" w:semiHidden="0" w:uiPriority="64" w:unhideWhenUsed="0"/>
-    <w:lsdException w:name="Medium List 1 Accent 6" w:semiHidden="0" w:uiPriority="65" w:unhideWhenUsed="0"/>
-    <w:lsdException w:name="Medium List 2 Accent 6" w:semiHidden="0" w:uiPriority="66" w:unhideWhenUsed="0"/>
-    <w:lsdException w:name="Medium Grid 1 Accent 6" w:semiHidden="0" w:uiPriority="67" w:unhideWhenUsed="0"/>
-    <w:lsdException w:name="Medium Grid 2 Accent 6" w:semiHidden="0" w:uiPriority="68" w:unhideWhenUsed="0"/>
-    <w:lsdException w:name="Medium Grid 3 Accent 6" w:semiHidden="0" w:uiPriority="69" w:unhideWhenUsed="0"/>
-    <w:lsdException w:name="Dark List Accent 6" w:semiHidden="0" w:uiPriority="70" w:unhideWhenUsed="0"/>
-    <w:lsdException w:name="Colorful Shading Accent 6" w:semiHidden="0" w:uiPriority="71" w:unhideWhenUsed="0"/>
-    <w:lsdException w:name="Colorful List Accent 6" w:semiHidden="0" w:uiPriority="72" w:unhideWhenUsed="0"/>
-    <w:lsdException w:name="Colorful Grid Accent 6" w:semiHidden="0" w:uiPriority="73" w:unhideWhenUsed="0"/>
-    <w:lsdException w:name="Subtle Emphasis" w:semiHidden="0" w:uiPriority="19" w:unhideWhenUsed="0" w:qFormat="1"/>
-    <w:lsdException w:name="Intense Emphasis" w:semiHidden="0" w:uiPriority="21" w:unhideWhenUsed="0" w:qFormat="1"/>
-    <w:lsdException w:name="Subtle Reference" w:semiHidden="0" w:uiPriority="31" w:unhideWhenUsed="0" w:qFormat="1"/>
-    <w:lsdException w:name="Intense Reference" w:semiHidden="0" w:uiPriority="32" w:unhideWhenUsed="0" w:qFormat="1"/>
-    <w:lsdException w:name="Book Title" w:semiHidden="0" w:uiPriority="33" w:unhideWhenUsed="0" w:qFormat="1"/>
-    <w:lsdException w:name="Bibliography" w:uiPriority="37"/>
-    <w:lsdException w:name="TOC Heading" w:uiPriority="39" w:qFormat="1"/>
-  </w:latentStyles>
-  <w:style w:type="paragraph" w:default="1" w:styleId="Normal">
-    <w:name w:val="Normal"/>
-    <w:qFormat/>
-  </w:style>
-  <w:style w:type="character" w:default="1" w:styleId="DefaultParagraphFont">
-    <w:name w:val="Default Paragraph Font"/>
-    <w:uiPriority w:val="1"/>
-    <w:semiHidden/>
-    <w:unhideWhenUsed/>
-  </w:style>
-  <w:style w:type="table" w:default="1" w:styleId="TableNormal">
-    <w:name w:val="Normal Table"/>
-    <w:uiPriority w:val="99"/>
-    <w:semiHidden/>
-    <w:unhideWhenUsed/>
-    <w:tblPr>
-      <w:tblInd w:w="0" w:type="dxa"/>
-      <w:tblCellMar>
-        <w:top w:w="0" w:type="dxa"/>
-        <w:left w:w="108" w:type="dxa"/>
-        <w:bottom w:w="0" w:type="dxa"/>
-        <w:right w:w="108" w:type="dxa"/>
-      </w:tblCellMar>
-    </w:tblPr>
-  </w:style>
-  <w:style w:type="numbering" w:default="1" w:styleId="NoList">
-    <w:name w:val="No List"/>
-    <w:uiPriority w:val="99"/>
-    <w:semiHidden/>
-    <w:unhideWhenUsed/>
-  </w:style>
-  <w:style w:type="character" w:styleId="PlaceholderText">
-    <w:name w:val="Placeholder Text"/>
-    <w:basedOn w:val="DefaultParagraphFont"/>
-    <w:qFormat/>
-    <w:rsid w:val="00FA5D44"/>
-    <w:rPr>
-      <w:color w:val="808080"/>
-    </w:rPr>
-  </w:style>
-</w:styles>
-</file>
-
-<file path=word/glossary/webSettings.xml><?xml version="1.0" encoding="utf-8"?>
-<w:webSettings xmlns:mc="http://schemas.openxmlformats.org/markup-compatibility/2006" xmlns:r="http://schemas.openxmlformats.org/officeDocument/2006/relationships" xmlns:w="http://schemas.openxmlformats.org/wordprocessingml/2006/main" xmlns:w14="http://schemas.microsoft.com/office/word/2010/wordml" mc:Ignorable="w14">
-  <w:optimizeForBrowser/>
-  <w:allowPNG/>
-</w:webSettings>
-</file>
-
 <file path=word/theme/theme1.xml><?xml version="1.0" encoding="utf-8"?>
 <a:theme xmlns:a="http://schemas.openxmlformats.org/drawingml/2006/main" name="Office Theme">
   <a:themeElements>
@@ -21489,7 +20686,7 @@
 </file>
 
 <file path=customXml/itemProps2.xml><?xml version="1.0" encoding="utf-8"?>
-<ds:datastoreItem xmlns:ds="http://schemas.openxmlformats.org/officeDocument/2006/customXml" ds:itemID="{61ADFAF2-F7CF-4F06-B96B-C432749020FE}">
+<ds:datastoreItem xmlns:ds="http://schemas.openxmlformats.org/officeDocument/2006/customXml" ds:itemID="{E6587BFE-7684-43D8-BB49-35D4928388B5}">
   <ds:schemaRefs>
     <ds:schemaRef ds:uri="http://schemas.openxmlformats.org/officeDocument/2006/bibliography"/>
   </ds:schemaRefs>

</xml_diff>